<commit_message>
Sync - 2026-09-13 17:18
</commit_message>
<xml_diff>
--- a/files/Daily_Helicopter_Schedule.docx
+++ b/files/Daily_Helicopter_Schedule.docx
@@ -1327,7 +1327,15 @@
                 <w:sz w:val="26"/>
                 <w:szCs w:val="26"/>
               </w:rPr>
-              <w:t>08:15</w:t>
+              <w:t>08:4</w:t>
+            </w:r>
+            <w:r>
+              <w:rPr>
+                <w:rFonts w:ascii="Calibri" w:eastAsia="Calibri" w:hAnsi="Calibri" w:cs="Calibri"/>
+                <w:sz w:val="26"/>
+                <w:szCs w:val="26"/>
+              </w:rPr>
+              <w:t>5</w:t>
             </w:r>
           </w:p>
         </w:tc>
@@ -1434,10 +1442,8 @@
                 <w:sz w:val="26"/>
                 <w:szCs w:val="26"/>
               </w:rPr>
-              <w:t>RRJ</w:t>
-            </w:r>
-            <w:bookmarkStart w:id="0" w:name="_GoBack"/>
-            <w:bookmarkEnd w:id="0"/>
+              <w:t>GVT</w:t>
+            </w:r>
           </w:p>
         </w:tc>
         <w:tc>
@@ -3088,7 +3094,7 @@
                 <w:sz w:val="26"/>
                 <w:szCs w:val="26"/>
               </w:rPr>
-              <w:t>ABN4</w:t>
+              <w:t>NA</w:t>
             </w:r>
           </w:p>
         </w:tc>
@@ -3566,7 +3572,7 @@
                 <w:sz w:val="26"/>
                 <w:szCs w:val="26"/>
               </w:rPr>
-              <w:t>ABN8</w:t>
+              <w:t>NA</w:t>
             </w:r>
           </w:p>
         </w:tc>
@@ -4542,7 +4548,7 @@
                 <w:sz w:val="26"/>
                 <w:szCs w:val="26"/>
               </w:rPr>
-              <w:t>SGAV</w:t>
+              <w:t>BPA</w:t>
             </w:r>
           </w:p>
         </w:tc>
@@ -4997,7 +5003,7 @@
                 <w:sz w:val="26"/>
                 <w:szCs w:val="26"/>
               </w:rPr>
-              <w:t>PANNA</w:t>
+              <w:t>AS2</w:t>
             </w:r>
           </w:p>
         </w:tc>
@@ -5514,7 +5520,7 @@
                 <w:sz w:val="26"/>
                 <w:szCs w:val="26"/>
               </w:rPr>
-              <w:t>AS1</w:t>
+              <w:t>SUDA</w:t>
             </w:r>
           </w:p>
         </w:tc>
@@ -5741,7 +5747,7 @@
                 <w:sz w:val="26"/>
                 <w:szCs w:val="26"/>
               </w:rPr>
-              <w:t>VND1</w:t>
+              <w:t>VIR-1</w:t>
             </w:r>
           </w:p>
         </w:tc>
@@ -5968,7 +5974,7 @@
                 <w:sz w:val="26"/>
                 <w:szCs w:val="26"/>
               </w:rPr>
-              <w:t>JTAN</w:t>
+              <w:t>ADM10</w:t>
             </w:r>
           </w:p>
         </w:tc>
@@ -6195,7 +6201,7 @@
                 <w:sz w:val="26"/>
                 <w:szCs w:val="26"/>
               </w:rPr>
-              <w:t>AD11</w:t>
+              <w:t>SRAT</w:t>
             </w:r>
           </w:p>
         </w:tc>
@@ -6422,7 +6428,7 @@
                 <w:sz w:val="26"/>
                 <w:szCs w:val="26"/>
               </w:rPr>
-              <w:t>CHTR</w:t>
+              <w:t>VND2(L/O)</w:t>
             </w:r>
           </w:p>
         </w:tc>
@@ -6649,7 +6655,7 @@
                 <w:sz w:val="26"/>
                 <w:szCs w:val="26"/>
               </w:rPr>
-              <w:t>VND2</w:t>
+              <w:t>ABN8(B/L)</w:t>
             </w:r>
           </w:p>
         </w:tc>
@@ -6799,38 +6805,6 @@
           <w:sz w:val="24"/>
         </w:rPr>
       </w:pPr>
-      <w:r>
-        <w:rPr>
-          <w:rFonts w:ascii="Calibri" w:eastAsia="Calibri" w:hAnsi="Calibri" w:cs="Calibri"/>
-          <w:b/>
-          <w:sz w:val="24"/>
-        </w:rPr>
-        <w:t>NO</w:t>
-      </w:r>
-      <w:r>
-        <w:rPr>
-          <w:rFonts w:ascii="Calibri" w:eastAsia="Calibri" w:hAnsi="Calibri" w:cs="Calibri"/>
-          <w:b/>
-          <w:sz w:val="24"/>
-        </w:rPr>
-        <w:t xml:space="preserve">TE:   ALL PRIVATE CC DELAY BY </w:t>
-      </w:r>
-      <w:r>
-        <w:rPr>
-          <w:rFonts w:ascii="Calibri" w:eastAsia="Calibri" w:hAnsi="Calibri" w:cs="Calibri"/>
-          <w:b/>
-          <w:sz w:val="24"/>
-        </w:rPr>
-        <w:t>O</w:t>
-      </w:r>
-      <w:r>
-        <w:rPr>
-          <w:rFonts w:ascii="Calibri" w:eastAsia="Calibri" w:hAnsi="Calibri" w:cs="Calibri"/>
-          <w:b/>
-          <w:sz w:val="24"/>
-        </w:rPr>
-        <w:t>NE DAY</w:t>
-      </w:r>
     </w:p>
     <w:p>
       <w:pPr>
@@ -7457,7 +7431,17 @@
                 <w:sz w:val="26"/>
                 <w:szCs w:val="26"/>
               </w:rPr>
-              <w:t>JIND</w:t>
+              <w:t>TC</w:t>
+            </w:r>
+            <w:bookmarkStart w:id="0" w:name="_GoBack"/>
+            <w:bookmarkEnd w:id="0"/>
+            <w:r>
+              <w:rPr>
+                <w:rFonts w:ascii="Calibri" w:eastAsia="Calibri" w:hAnsi="Calibri" w:cs="Calibri"/>
+                <w:sz w:val="26"/>
+                <w:szCs w:val="26"/>
+              </w:rPr>
+              <w:t>PP CC+PROD</w:t>
             </w:r>
           </w:p>
         </w:tc>
@@ -7687,7 +7671,7 @@
                 <w:sz w:val="26"/>
                 <w:szCs w:val="26"/>
               </w:rPr>
-              <w:t>TCPP CC+PROD</w:t>
+              <w:t>JIND</w:t>
             </w:r>
           </w:p>
         </w:tc>
@@ -8359,12 +8343,7 @@
       </w:pPr>
     </w:p>
     <w:sectPr>
-      <w:headerReference w:type="even" r:id="rId6"/>
-      <w:headerReference w:type="default" r:id="rId7"/>
-      <w:footerReference w:type="even" r:id="rId8"/>
-      <w:footerReference w:type="default" r:id="rId9"/>
-      <w:headerReference w:type="first" r:id="rId10"/>
-      <w:footerReference w:type="first" r:id="rId11"/>
+      <w:headerReference w:type="default" r:id="rId6"/>
       <w:pgSz w:w="11906" w:h="16838"/>
       <w:pgMar w:top="568" w:right="1440" w:bottom="1134" w:left="1276" w:header="708" w:footer="708" w:gutter="0"/>
       <w:cols w:space="708"/>
@@ -8399,36 +8378,6 @@
 </w:endnotes>
 </file>
 
-<file path=word/footer1.xml><?xml version="1.0" encoding="utf-8"?>
-<w:ftr xmlns:wpc="http://schemas.microsoft.com/office/word/2010/wordprocessingCanvas" xmlns:mc="http://schemas.openxmlformats.org/markup-compatibility/2006" xmlns:o="urn:schemas-microsoft-com:office:office" xmlns:r="http://schemas.openxmlformats.org/officeDocument/2006/relationships" xmlns:m="http://schemas.openxmlformats.org/officeDocument/2006/math" xmlns:v="urn:schemas-microsoft-com:vml" xmlns:wp14="http://schemas.microsoft.com/office/word/2010/wordprocessingDrawing" xmlns:wp="http://schemas.openxmlformats.org/drawingml/2006/wordprocessingDrawing" xmlns:w10="urn:schemas-microsoft-com:office:word" xmlns:w="http://schemas.openxmlformats.org/wordprocessingml/2006/main" xmlns:w14="http://schemas.microsoft.com/office/word/2010/wordml" xmlns:w15="http://schemas.microsoft.com/office/word/2012/wordml" xmlns:wpg="http://schemas.microsoft.com/office/word/2010/wordprocessingGroup" xmlns:wpi="http://schemas.microsoft.com/office/word/2010/wordprocessingInk" xmlns:wne="http://schemas.microsoft.com/office/word/2006/wordml" xmlns:wps="http://schemas.microsoft.com/office/word/2010/wordprocessingShape" mc:Ignorable="w14 w15 wp14">
-  <w:p>
-    <w:pPr>
-      <w:pStyle w:val="Footer"/>
-    </w:pPr>
-  </w:p>
-</w:ftr>
-</file>
-
-<file path=word/footer2.xml><?xml version="1.0" encoding="utf-8"?>
-<w:ftr xmlns:wpc="http://schemas.microsoft.com/office/word/2010/wordprocessingCanvas" xmlns:mc="http://schemas.openxmlformats.org/markup-compatibility/2006" xmlns:o="urn:schemas-microsoft-com:office:office" xmlns:r="http://schemas.openxmlformats.org/officeDocument/2006/relationships" xmlns:m="http://schemas.openxmlformats.org/officeDocument/2006/math" xmlns:v="urn:schemas-microsoft-com:vml" xmlns:wp14="http://schemas.microsoft.com/office/word/2010/wordprocessingDrawing" xmlns:wp="http://schemas.openxmlformats.org/drawingml/2006/wordprocessingDrawing" xmlns:w10="urn:schemas-microsoft-com:office:word" xmlns:w="http://schemas.openxmlformats.org/wordprocessingml/2006/main" xmlns:w14="http://schemas.microsoft.com/office/word/2010/wordml" xmlns:w15="http://schemas.microsoft.com/office/word/2012/wordml" xmlns:wpg="http://schemas.microsoft.com/office/word/2010/wordprocessingGroup" xmlns:wpi="http://schemas.microsoft.com/office/word/2010/wordprocessingInk" xmlns:wne="http://schemas.microsoft.com/office/word/2006/wordml" xmlns:wps="http://schemas.microsoft.com/office/word/2010/wordprocessingShape" mc:Ignorable="w14 w15 wp14">
-  <w:p>
-    <w:pPr>
-      <w:pStyle w:val="Footer"/>
-    </w:pPr>
-  </w:p>
-</w:ftr>
-</file>
-
-<file path=word/footer3.xml><?xml version="1.0" encoding="utf-8"?>
-<w:ftr xmlns:wpc="http://schemas.microsoft.com/office/word/2010/wordprocessingCanvas" xmlns:mc="http://schemas.openxmlformats.org/markup-compatibility/2006" xmlns:o="urn:schemas-microsoft-com:office:office" xmlns:r="http://schemas.openxmlformats.org/officeDocument/2006/relationships" xmlns:m="http://schemas.openxmlformats.org/officeDocument/2006/math" xmlns:v="urn:schemas-microsoft-com:vml" xmlns:wp14="http://schemas.microsoft.com/office/word/2010/wordprocessingDrawing" xmlns:wp="http://schemas.openxmlformats.org/drawingml/2006/wordprocessingDrawing" xmlns:w10="urn:schemas-microsoft-com:office:word" xmlns:w="http://schemas.openxmlformats.org/wordprocessingml/2006/main" xmlns:w14="http://schemas.microsoft.com/office/word/2010/wordml" xmlns:w15="http://schemas.microsoft.com/office/word/2012/wordml" xmlns:wpg="http://schemas.microsoft.com/office/word/2010/wordprocessingGroup" xmlns:wpi="http://schemas.microsoft.com/office/word/2010/wordprocessingInk" xmlns:wne="http://schemas.microsoft.com/office/word/2006/wordml" xmlns:wps="http://schemas.microsoft.com/office/word/2010/wordprocessingShape" mc:Ignorable="w14 w15 wp14">
-  <w:p>
-    <w:pPr>
-      <w:pStyle w:val="Footer"/>
-    </w:pPr>
-  </w:p>
-</w:ftr>
-</file>
-
 <file path=word/footnotes.xml><?xml version="1.0" encoding="utf-8"?>
 <w:footnotes xmlns:wpc="http://schemas.microsoft.com/office/word/2010/wordprocessingCanvas" xmlns:mc="http://schemas.openxmlformats.org/markup-compatibility/2006" xmlns:o="urn:schemas-microsoft-com:office:office" xmlns:r="http://schemas.openxmlformats.org/officeDocument/2006/relationships" xmlns:m="http://schemas.openxmlformats.org/officeDocument/2006/math" xmlns:v="urn:schemas-microsoft-com:vml" xmlns:wp14="http://schemas.microsoft.com/office/word/2010/wordprocessingDrawing" xmlns:wp="http://schemas.openxmlformats.org/drawingml/2006/wordprocessingDrawing" xmlns:w10="urn:schemas-microsoft-com:office:word" xmlns:w="http://schemas.openxmlformats.org/wordprocessingml/2006/main" xmlns:w14="http://schemas.microsoft.com/office/word/2010/wordml" xmlns:w15="http://schemas.microsoft.com/office/word/2012/wordml" xmlns:wpg="http://schemas.microsoft.com/office/word/2010/wordprocessingGroup" xmlns:wpi="http://schemas.microsoft.com/office/word/2010/wordprocessingInk" xmlns:wne="http://schemas.microsoft.com/office/word/2006/wordml" xmlns:wps="http://schemas.microsoft.com/office/word/2010/wordprocessingShape" mc:Ignorable="w14 w15 wp14">
   <w:footnote w:type="separator" w:id="-1">
@@ -8459,16 +8408,6 @@
   <w:p>
     <w:pPr>
       <w:pStyle w:val="Header"/>
-    </w:pPr>
-  </w:p>
-</w:hdr>
-</file>
-
-<file path=word/header2.xml><?xml version="1.0" encoding="utf-8"?>
-<w:hdr xmlns:wpc="http://schemas.microsoft.com/office/word/2010/wordprocessingCanvas" xmlns:mc="http://schemas.openxmlformats.org/markup-compatibility/2006" xmlns:o="urn:schemas-microsoft-com:office:office" xmlns:r="http://schemas.openxmlformats.org/officeDocument/2006/relationships" xmlns:m="http://schemas.openxmlformats.org/officeDocument/2006/math" xmlns:v="urn:schemas-microsoft-com:vml" xmlns:wp14="http://schemas.microsoft.com/office/word/2010/wordprocessingDrawing" xmlns:wp="http://schemas.openxmlformats.org/drawingml/2006/wordprocessingDrawing" xmlns:w10="urn:schemas-microsoft-com:office:word" xmlns:w="http://schemas.openxmlformats.org/wordprocessingml/2006/main" xmlns:w14="http://schemas.microsoft.com/office/word/2010/wordml" xmlns:w15="http://schemas.microsoft.com/office/word/2012/wordml" xmlns:wpg="http://schemas.microsoft.com/office/word/2010/wordprocessingGroup" xmlns:wpi="http://schemas.microsoft.com/office/word/2010/wordprocessingInk" xmlns:wne="http://schemas.microsoft.com/office/word/2006/wordml" xmlns:wps="http://schemas.microsoft.com/office/word/2010/wordprocessingShape" mc:Ignorable="w14 w15 wp14">
-  <w:p>
-    <w:pPr>
-      <w:pStyle w:val="Header"/>
       <w:ind w:left="-851"/>
       <w:jc w:val="center"/>
       <w:rPr>
@@ -8481,10 +8420,10 @@
     </w:pPr>
     <w:r>
       <w:object w:dxaOrig="1188" w:dyaOrig="900">
-        <v:rect id="_x0000_i1025" style="width:54.4pt;height:39.35pt" o:ole="" o:preferrelative="t" stroked="f">
+        <v:rect id="_x0000_i1025" style="width:54.75pt;height:39pt" o:ole="" o:preferrelative="t" stroked="f">
           <v:imagedata r:id="rId1" o:title=""/>
         </v:rect>
-        <o:OLEObject Type="Embed" ProgID="StaticMetafile" ShapeID="_x0000_i1025" DrawAspect="Content" ObjectID="_1850734524" r:id="rId2"/>
+        <o:OLEObject Type="Embed" ProgID="StaticMetafile" ShapeID="_x0000_i1025" DrawAspect="Content" ObjectID="_1850824079" r:id="rId2"/>
       </w:object>
     </w:r>
     <w:r>
@@ -8518,7 +8457,7 @@
         <w:sz w:val="26"/>
         <w:szCs w:val="26"/>
       </w:rPr>
-      <w:t>13</w:t>
+      <w:t>14</w:t>
     </w:r>
     <w:r>
       <w:rPr>
@@ -8538,7 +8477,7 @@
         <w:sz w:val="26"/>
         <w:szCs w:val="26"/>
       </w:rPr>
-      <w:t>S</w:t>
+      <w:t>MO</w:t>
     </w:r>
     <w:r>
       <w:rPr>
@@ -8548,7 +8487,7 @@
         <w:sz w:val="26"/>
         <w:szCs w:val="26"/>
       </w:rPr>
-      <w:t>UN</w:t>
+      <w:t>N</w:t>
     </w:r>
     <w:r>
       <w:rPr>
@@ -8571,16 +8510,6 @@
       <w:t>)</w:t>
     </w:r>
   </w:p>
-  <w:p>
-    <w:pPr>
-      <w:pStyle w:val="Header"/>
-    </w:pPr>
-  </w:p>
-</w:hdr>
-</file>
-
-<file path=word/header3.xml><?xml version="1.0" encoding="utf-8"?>
-<w:hdr xmlns:wpc="http://schemas.microsoft.com/office/word/2010/wordprocessingCanvas" xmlns:mc="http://schemas.openxmlformats.org/markup-compatibility/2006" xmlns:o="urn:schemas-microsoft-com:office:office" xmlns:r="http://schemas.openxmlformats.org/officeDocument/2006/relationships" xmlns:m="http://schemas.openxmlformats.org/officeDocument/2006/math" xmlns:v="urn:schemas-microsoft-com:vml" xmlns:wp14="http://schemas.microsoft.com/office/word/2010/wordprocessingDrawing" xmlns:wp="http://schemas.openxmlformats.org/drawingml/2006/wordprocessingDrawing" xmlns:w10="urn:schemas-microsoft-com:office:word" xmlns:w="http://schemas.openxmlformats.org/wordprocessingml/2006/main" xmlns:w14="http://schemas.microsoft.com/office/word/2010/wordml" xmlns:w15="http://schemas.microsoft.com/office/word/2012/wordml" xmlns:wpg="http://schemas.microsoft.com/office/word/2010/wordprocessingGroup" xmlns:wpi="http://schemas.microsoft.com/office/word/2010/wordprocessingInk" xmlns:wne="http://schemas.microsoft.com/office/word/2006/wordml" xmlns:wps="http://schemas.microsoft.com/office/word/2010/wordprocessingShape" mc:Ignorable="w14 w15 wp14">
   <w:p>
     <w:pPr>
       <w:pStyle w:val="Header"/>

</xml_diff>

<commit_message>
Sync - 2026-09-14 16:52
</commit_message>
<xml_diff>
--- a/files/Daily_Helicopter_Schedule.docx
+++ b/files/Daily_Helicopter_Schedule.docx
@@ -674,7 +674,7 @@
                 <w:sz w:val="26"/>
                 <w:szCs w:val="26"/>
               </w:rPr>
-              <w:t>HLW</w:t>
+              <w:t>HLY</w:t>
             </w:r>
           </w:p>
         </w:tc>
@@ -1327,7 +1327,7 @@
                 <w:sz w:val="26"/>
                 <w:szCs w:val="26"/>
               </w:rPr>
-              <w:t>08:4</w:t>
+              <w:t>08:1</w:t>
             </w:r>
             <w:r>
               <w:rPr>
@@ -1442,7 +1442,7 @@
                 <w:sz w:val="26"/>
                 <w:szCs w:val="26"/>
               </w:rPr>
-              <w:t>GVT</w:t>
+              <w:t>RRJ</w:t>
             </w:r>
           </w:p>
         </w:tc>
@@ -2036,7 +2036,7 @@
                 <w:sz w:val="26"/>
                 <w:szCs w:val="26"/>
               </w:rPr>
-              <w:t>HLY</w:t>
+              <w:t>HLW</w:t>
             </w:r>
           </w:p>
         </w:tc>
@@ -4322,7 +4322,7 @@
                 <w:sz w:val="26"/>
                 <w:szCs w:val="26"/>
               </w:rPr>
-              <w:t>NA</w:t>
+              <w:t>KSPR</w:t>
             </w:r>
           </w:p>
         </w:tc>
@@ -4548,7 +4548,7 @@
                 <w:sz w:val="26"/>
                 <w:szCs w:val="26"/>
               </w:rPr>
-              <w:t>BPA</w:t>
+              <w:t>PANNA</w:t>
             </w:r>
           </w:p>
         </w:tc>
@@ -5003,7 +5003,7 @@
                 <w:sz w:val="26"/>
                 <w:szCs w:val="26"/>
               </w:rPr>
-              <w:t>AS2</w:t>
+              <w:t>R12A</w:t>
             </w:r>
           </w:p>
         </w:tc>
@@ -5520,7 +5520,7 @@
                 <w:sz w:val="26"/>
                 <w:szCs w:val="26"/>
               </w:rPr>
-              <w:t>SUDA</w:t>
+              <w:t>BPA</w:t>
             </w:r>
           </w:p>
         </w:tc>
@@ -5576,6 +5576,8 @@
                 <w:szCs w:val="26"/>
               </w:rPr>
             </w:pPr>
+            <w:bookmarkStart w:id="0" w:name="_GoBack"/>
+            <w:bookmarkEnd w:id="0"/>
           </w:p>
         </w:tc>
         <w:tc>
@@ -5747,7 +5749,7 @@
                 <w:sz w:val="26"/>
                 <w:szCs w:val="26"/>
               </w:rPr>
-              <w:t>VIR-1</w:t>
+              <w:t>HERA/NLM</w:t>
             </w:r>
           </w:p>
         </w:tc>
@@ -5974,7 +5976,7 @@
                 <w:sz w:val="26"/>
                 <w:szCs w:val="26"/>
               </w:rPr>
-              <w:t>ADM10</w:t>
+              <w:t>SJOT</w:t>
             </w:r>
           </w:p>
         </w:tc>
@@ -6201,7 +6203,7 @@
                 <w:sz w:val="26"/>
                 <w:szCs w:val="26"/>
               </w:rPr>
-              <w:t>SRAT</w:t>
+              <w:t>SGAV</w:t>
             </w:r>
           </w:p>
         </w:tc>
@@ -6428,7 +6430,7 @@
                 <w:sz w:val="26"/>
                 <w:szCs w:val="26"/>
               </w:rPr>
-              <w:t>VND2(L/O)</w:t>
+              <w:t>SF (SPCL)</w:t>
             </w:r>
           </w:p>
         </w:tc>
@@ -6655,7 +6657,7 @@
                 <w:sz w:val="26"/>
                 <w:szCs w:val="26"/>
               </w:rPr>
-              <w:t>ABN8(B/L)</w:t>
+              <w:t>KSPR</w:t>
             </w:r>
           </w:p>
         </w:tc>
@@ -7431,17 +7433,7 @@
                 <w:sz w:val="26"/>
                 <w:szCs w:val="26"/>
               </w:rPr>
-              <w:t>TC</w:t>
-            </w:r>
-            <w:bookmarkStart w:id="0" w:name="_GoBack"/>
-            <w:bookmarkEnd w:id="0"/>
-            <w:r>
-              <w:rPr>
-                <w:rFonts w:ascii="Calibri" w:eastAsia="Calibri" w:hAnsi="Calibri" w:cs="Calibri"/>
-                <w:sz w:val="26"/>
-                <w:szCs w:val="26"/>
-              </w:rPr>
-              <w:t>PP CC+PROD</w:t>
+              <w:t>TCPP CC+PROD</w:t>
             </w:r>
           </w:p>
         </w:tc>
@@ -8423,7 +8415,7 @@
         <v:rect id="_x0000_i1025" style="width:54.75pt;height:39pt" o:ole="" o:preferrelative="t" stroked="f">
           <v:imagedata r:id="rId1" o:title=""/>
         </v:rect>
-        <o:OLEObject Type="Embed" ProgID="StaticMetafile" ShapeID="_x0000_i1025" DrawAspect="Content" ObjectID="_1850824079" r:id="rId2"/>
+        <o:OLEObject Type="Embed" ProgID="StaticMetafile" ShapeID="_x0000_i1025" DrawAspect="Content" ObjectID="_1850909371" r:id="rId2"/>
       </w:object>
     </w:r>
     <w:r>
@@ -8457,7 +8449,7 @@
         <w:sz w:val="26"/>
         <w:szCs w:val="26"/>
       </w:rPr>
-      <w:t>14</w:t>
+      <w:t>15</w:t>
     </w:r>
     <w:r>
       <w:rPr>
@@ -8477,17 +8469,7 @@
         <w:sz w:val="26"/>
         <w:szCs w:val="26"/>
       </w:rPr>
-      <w:t>MO</w:t>
-    </w:r>
-    <w:r>
-      <w:rPr>
-        <w:rFonts w:ascii="Times New Roman" w:hAnsi="Times New Roman" w:cs="Times New Roman"/>
-        <w:b/>
-        <w:color w:val="000000" w:themeColor="text1"/>
-        <w:sz w:val="26"/>
-        <w:szCs w:val="26"/>
-      </w:rPr>
-      <w:t>N</w:t>
+      <w:t>TUES</w:t>
     </w:r>
     <w:r>
       <w:rPr>

</xml_diff>

<commit_message>
Sync - 2026-09-14 17:52
</commit_message>
<xml_diff>
--- a/files/Daily_Helicopter_Schedule.docx
+++ b/files/Daily_Helicopter_Schedule.docx
@@ -4285,7 +4285,7 @@
                 <w:sz w:val="26"/>
                 <w:szCs w:val="26"/>
               </w:rPr>
-              <w:t>08:55</w:t>
+              <w:t>10:00</w:t>
             </w:r>
           </w:p>
         </w:tc>
@@ -5576,8 +5576,6 @@
                 <w:szCs w:val="26"/>
               </w:rPr>
             </w:pPr>
-            <w:bookmarkStart w:id="0" w:name="_GoBack"/>
-            <w:bookmarkEnd w:id="0"/>
           </w:p>
         </w:tc>
         <w:tc>
@@ -6915,7 +6913,7 @@
     </w:p>
     <w:tbl>
       <w:tblPr>
-        <w:tblpPr w:leftFromText="180" w:rightFromText="180" w:vertAnchor="text" w:horzAnchor="margin" w:tblpY="137"/>
+        <w:tblpPr w:leftFromText="180" w:rightFromText="180" w:vertAnchor="text" w:horzAnchor="margin" w:tblpXSpec="center" w:tblpY="407"/>
         <w:tblW w:w="0" w:type="auto"/>
         <w:tblCellMar>
           <w:left w:w="10" w:type="dxa"/>
@@ -6935,27 +6933,28 @@
       <w:tr>
         <w:tc>
           <w:tcPr>
-            <w:tcW w:w="657" w:type="dxa"/>
-            <w:tcBorders>
-              <w:top w:val="single" w:sz="4" w:space="0" w:color="000000"/>
-              <w:left w:val="single" w:sz="4" w:space="0" w:color="000000"/>
-              <w:bottom w:val="single" w:sz="4" w:space="0" w:color="000000"/>
-              <w:right w:val="single" w:sz="4" w:space="0" w:color="000000"/>
-            </w:tcBorders>
-            <w:shd w:val="clear" w:color="000000" w:fill="FFFFFF"/>
-            <w:tcMar>
-              <w:left w:w="108" w:type="dxa"/>
-              <w:right w:w="108" w:type="dxa"/>
-            </w:tcMar>
-          </w:tcPr>
-          <w:p>
-            <w:pPr>
-              <w:spacing w:after="0" w:line="240" w:lineRule="auto"/>
-              <w:jc w:val="center"/>
-              <w:rPr>
-                <w:rFonts w:ascii="Calibri" w:eastAsia="Calibri" w:hAnsi="Calibri" w:cs="Calibri"/>
-              </w:rPr>
-            </w:pPr>
+            <w:tcW w:w="671" w:type="dxa"/>
+            <w:tcBorders>
+              <w:top w:val="single" w:sz="4" w:space="0" w:color="000000"/>
+              <w:left w:val="single" w:sz="4" w:space="0" w:color="000000"/>
+              <w:bottom w:val="single" w:sz="4" w:space="0" w:color="000000"/>
+              <w:right w:val="single" w:sz="4" w:space="0" w:color="000000"/>
+            </w:tcBorders>
+            <w:shd w:val="clear" w:color="000000" w:fill="FFFFFF"/>
+            <w:tcMar>
+              <w:left w:w="108" w:type="dxa"/>
+              <w:right w:w="108" w:type="dxa"/>
+            </w:tcMar>
+          </w:tcPr>
+          <w:p>
+            <w:pPr>
+              <w:spacing w:after="0" w:line="240" w:lineRule="auto"/>
+              <w:jc w:val="center"/>
+              <w:rPr>
+                <w:rFonts w:ascii="Calibri" w:eastAsia="Calibri" w:hAnsi="Calibri" w:cs="Calibri"/>
+              </w:rPr>
+            </w:pPr>
+            <w:bookmarkStart w:id="0" w:name="_GoBack"/>
             <w:r>
               <w:rPr>
                 <w:rFonts w:ascii="Calibri" w:eastAsia="Calibri" w:hAnsi="Calibri" w:cs="Calibri"/>
@@ -6969,7 +6968,7 @@
         </w:tc>
         <w:tc>
           <w:tcPr>
-            <w:tcW w:w="1557" w:type="dxa"/>
+            <w:tcW w:w="1604" w:type="dxa"/>
             <w:tcBorders>
               <w:top w:val="single" w:sz="4" w:space="0" w:color="000000"/>
               <w:left w:val="single" w:sz="4" w:space="0" w:color="000000"/>
@@ -7024,7 +7023,7 @@
         </w:tc>
         <w:tc>
           <w:tcPr>
-            <w:tcW w:w="1402" w:type="dxa"/>
+            <w:tcW w:w="1444" w:type="dxa"/>
             <w:tcBorders>
               <w:top w:val="single" w:sz="4" w:space="0" w:color="000000"/>
               <w:left w:val="single" w:sz="4" w:space="0" w:color="000000"/>
@@ -7058,7 +7057,7 @@
         </w:tc>
         <w:tc>
           <w:tcPr>
-            <w:tcW w:w="1786" w:type="dxa"/>
+            <w:tcW w:w="1842" w:type="dxa"/>
             <w:tcBorders>
               <w:top w:val="single" w:sz="4" w:space="0" w:color="000000"/>
               <w:left w:val="single" w:sz="4" w:space="0" w:color="000000"/>
@@ -7104,7 +7103,7 @@
         </w:tc>
         <w:tc>
           <w:tcPr>
-            <w:tcW w:w="1479" w:type="dxa"/>
+            <w:tcW w:w="1524" w:type="dxa"/>
             <w:tcBorders>
               <w:top w:val="single" w:sz="4" w:space="0" w:color="000000"/>
               <w:left w:val="single" w:sz="4" w:space="0" w:color="000000"/>
@@ -7138,7 +7137,7 @@
         </w:tc>
         <w:tc>
           <w:tcPr>
-            <w:tcW w:w="775" w:type="dxa"/>
+            <w:tcW w:w="795" w:type="dxa"/>
             <w:tcBorders>
               <w:top w:val="single" w:sz="4" w:space="0" w:color="000000"/>
               <w:left w:val="single" w:sz="4" w:space="0" w:color="000000"/>
@@ -7172,7 +7171,7 @@
         </w:tc>
         <w:tc>
           <w:tcPr>
-            <w:tcW w:w="1262" w:type="dxa"/>
+            <w:tcW w:w="1300" w:type="dxa"/>
             <w:tcBorders>
               <w:top w:val="single" w:sz="4" w:space="0" w:color="000000"/>
               <w:left w:val="single" w:sz="4" w:space="0" w:color="000000"/>
@@ -7240,7 +7239,7 @@
       <w:tr>
         <w:tc>
           <w:tcPr>
-            <w:tcW w:w="8918" w:type="dxa"/>
+            <w:tcW w:w="9180" w:type="dxa"/>
             <w:gridSpan w:val="7"/>
             <w:tcBorders>
               <w:top w:val="single" w:sz="4" w:space="0" w:color="000000"/>
@@ -7299,7 +7298,7 @@
       <w:tr>
         <w:tc>
           <w:tcPr>
-            <w:tcW w:w="657" w:type="dxa"/>
+            <w:tcW w:w="671" w:type="dxa"/>
             <w:tcBorders>
               <w:top w:val="single" w:sz="4" w:space="0" w:color="000000"/>
               <w:left w:val="single" w:sz="4" w:space="0" w:color="000000"/>
@@ -7334,7 +7333,7 @@
         </w:tc>
         <w:tc>
           <w:tcPr>
-            <w:tcW w:w="1557" w:type="dxa"/>
+            <w:tcW w:w="1604" w:type="dxa"/>
             <w:tcBorders>
               <w:top w:val="single" w:sz="4" w:space="0" w:color="000000"/>
               <w:left w:val="single" w:sz="4" w:space="0" w:color="000000"/>
@@ -7369,7 +7368,7 @@
         </w:tc>
         <w:tc>
           <w:tcPr>
-            <w:tcW w:w="1402" w:type="dxa"/>
+            <w:tcW w:w="1444" w:type="dxa"/>
             <w:tcBorders>
               <w:top w:val="single" w:sz="4" w:space="0" w:color="000000"/>
               <w:left w:val="single" w:sz="4" w:space="0" w:color="000000"/>
@@ -7404,7 +7403,7 @@
         </w:tc>
         <w:tc>
           <w:tcPr>
-            <w:tcW w:w="1786" w:type="dxa"/>
+            <w:tcW w:w="1842" w:type="dxa"/>
             <w:tcBorders>
               <w:top w:val="single" w:sz="4" w:space="0" w:color="000000"/>
               <w:left w:val="single" w:sz="4" w:space="0" w:color="000000"/>
@@ -7439,68 +7438,68 @@
         </w:tc>
         <w:tc>
           <w:tcPr>
-            <w:tcW w:w="1479" w:type="dxa"/>
-            <w:tcBorders>
-              <w:top w:val="single" w:sz="4" w:space="0" w:color="000000"/>
-              <w:left w:val="single" w:sz="4" w:space="0" w:color="000000"/>
-              <w:bottom w:val="single" w:sz="4" w:space="0" w:color="000000"/>
-              <w:right w:val="single" w:sz="4" w:space="0" w:color="000000"/>
-            </w:tcBorders>
-            <w:shd w:val="clear" w:color="000000" w:fill="FFFFFF"/>
-            <w:tcMar>
-              <w:left w:w="108" w:type="dxa"/>
-              <w:right w:w="108" w:type="dxa"/>
-            </w:tcMar>
-          </w:tcPr>
-          <w:p>
-            <w:pPr>
-              <w:spacing w:after="0" w:line="240" w:lineRule="auto"/>
-              <w:rPr>
-                <w:rFonts w:ascii="Calibri" w:eastAsia="Calibri" w:hAnsi="Calibri" w:cs="Calibri"/>
-                <w:sz w:val="26"/>
-                <w:szCs w:val="26"/>
-              </w:rPr>
-            </w:pPr>
-          </w:p>
-        </w:tc>
-        <w:tc>
-          <w:tcPr>
-            <w:tcW w:w="775" w:type="dxa"/>
-            <w:tcBorders>
-              <w:top w:val="single" w:sz="4" w:space="0" w:color="000000"/>
-              <w:left w:val="single" w:sz="4" w:space="0" w:color="000000"/>
-              <w:bottom w:val="single" w:sz="4" w:space="0" w:color="000000"/>
-              <w:right w:val="single" w:sz="4" w:space="0" w:color="000000"/>
-            </w:tcBorders>
-            <w:shd w:val="clear" w:color="000000" w:fill="FFFFFF"/>
-            <w:tcMar>
-              <w:left w:w="108" w:type="dxa"/>
-              <w:right w:w="108" w:type="dxa"/>
-            </w:tcMar>
-          </w:tcPr>
-          <w:p>
-            <w:pPr>
-              <w:spacing w:after="0" w:line="240" w:lineRule="auto"/>
-              <w:jc w:val="center"/>
-              <w:rPr>
-                <w:rFonts w:ascii="Calibri" w:eastAsia="Calibri" w:hAnsi="Calibri" w:cs="Calibri"/>
-                <w:sz w:val="26"/>
-                <w:szCs w:val="26"/>
-              </w:rPr>
-            </w:pPr>
-            <w:r>
-              <w:rPr>
-                <w:rFonts w:ascii="Calibri" w:eastAsia="Calibri" w:hAnsi="Calibri" w:cs="Calibri"/>
-                <w:sz w:val="26"/>
-                <w:szCs w:val="26"/>
-              </w:rPr>
-              <w:t>GVX</w:t>
-            </w:r>
-          </w:p>
-        </w:tc>
-        <w:tc>
-          <w:tcPr>
-            <w:tcW w:w="1262" w:type="dxa"/>
+            <w:tcW w:w="1524" w:type="dxa"/>
+            <w:tcBorders>
+              <w:top w:val="single" w:sz="4" w:space="0" w:color="000000"/>
+              <w:left w:val="single" w:sz="4" w:space="0" w:color="000000"/>
+              <w:bottom w:val="single" w:sz="4" w:space="0" w:color="000000"/>
+              <w:right w:val="single" w:sz="4" w:space="0" w:color="000000"/>
+            </w:tcBorders>
+            <w:shd w:val="clear" w:color="000000" w:fill="FFFFFF"/>
+            <w:tcMar>
+              <w:left w:w="108" w:type="dxa"/>
+              <w:right w:w="108" w:type="dxa"/>
+            </w:tcMar>
+          </w:tcPr>
+          <w:p>
+            <w:pPr>
+              <w:spacing w:after="0" w:line="240" w:lineRule="auto"/>
+              <w:rPr>
+                <w:rFonts w:ascii="Calibri" w:eastAsia="Calibri" w:hAnsi="Calibri" w:cs="Calibri"/>
+                <w:sz w:val="26"/>
+                <w:szCs w:val="26"/>
+              </w:rPr>
+            </w:pPr>
+          </w:p>
+        </w:tc>
+        <w:tc>
+          <w:tcPr>
+            <w:tcW w:w="795" w:type="dxa"/>
+            <w:tcBorders>
+              <w:top w:val="single" w:sz="4" w:space="0" w:color="000000"/>
+              <w:left w:val="single" w:sz="4" w:space="0" w:color="000000"/>
+              <w:bottom w:val="single" w:sz="4" w:space="0" w:color="000000"/>
+              <w:right w:val="single" w:sz="4" w:space="0" w:color="000000"/>
+            </w:tcBorders>
+            <w:shd w:val="clear" w:color="000000" w:fill="FFFFFF"/>
+            <w:tcMar>
+              <w:left w:w="108" w:type="dxa"/>
+              <w:right w:w="108" w:type="dxa"/>
+            </w:tcMar>
+          </w:tcPr>
+          <w:p>
+            <w:pPr>
+              <w:spacing w:after="0" w:line="240" w:lineRule="auto"/>
+              <w:jc w:val="center"/>
+              <w:rPr>
+                <w:rFonts w:ascii="Calibri" w:eastAsia="Calibri" w:hAnsi="Calibri" w:cs="Calibri"/>
+                <w:sz w:val="26"/>
+                <w:szCs w:val="26"/>
+              </w:rPr>
+            </w:pPr>
+            <w:r>
+              <w:rPr>
+                <w:rFonts w:ascii="Calibri" w:eastAsia="Calibri" w:hAnsi="Calibri" w:cs="Calibri"/>
+                <w:sz w:val="26"/>
+                <w:szCs w:val="26"/>
+              </w:rPr>
+              <w:t>GVT</w:t>
+            </w:r>
+          </w:p>
+        </w:tc>
+        <w:tc>
+          <w:tcPr>
+            <w:tcW w:w="1300" w:type="dxa"/>
             <w:tcBorders>
               <w:top w:val="single" w:sz="4" w:space="0" w:color="000000"/>
               <w:left w:val="single" w:sz="4" w:space="0" w:color="000000"/>
@@ -7529,7 +7528,7 @@
       <w:tr>
         <w:tc>
           <w:tcPr>
-            <w:tcW w:w="657" w:type="dxa"/>
+            <w:tcW w:w="671" w:type="dxa"/>
             <w:tcBorders>
               <w:top w:val="single" w:sz="4" w:space="0" w:color="000000"/>
               <w:left w:val="single" w:sz="4" w:space="0" w:color="000000"/>
@@ -7564,7 +7563,7 @@
         </w:tc>
         <w:tc>
           <w:tcPr>
-            <w:tcW w:w="1557" w:type="dxa"/>
+            <w:tcW w:w="1604" w:type="dxa"/>
             <w:tcBorders>
               <w:top w:val="single" w:sz="4" w:space="0" w:color="000000"/>
               <w:left w:val="single" w:sz="4" w:space="0" w:color="000000"/>
@@ -7599,7 +7598,7 @@
         </w:tc>
         <w:tc>
           <w:tcPr>
-            <w:tcW w:w="1402" w:type="dxa"/>
+            <w:tcW w:w="1444" w:type="dxa"/>
             <w:tcBorders>
               <w:top w:val="single" w:sz="4" w:space="0" w:color="000000"/>
               <w:left w:val="single" w:sz="4" w:space="0" w:color="000000"/>
@@ -7634,104 +7633,96 @@
         </w:tc>
         <w:tc>
           <w:tcPr>
-            <w:tcW w:w="1786" w:type="dxa"/>
-            <w:tcBorders>
-              <w:top w:val="single" w:sz="4" w:space="0" w:color="000000"/>
-              <w:left w:val="single" w:sz="4" w:space="0" w:color="000000"/>
-              <w:bottom w:val="single" w:sz="4" w:space="0" w:color="000000"/>
-              <w:right w:val="single" w:sz="4" w:space="0" w:color="000000"/>
-            </w:tcBorders>
-            <w:shd w:val="clear" w:color="000000" w:fill="FFFFFF"/>
-            <w:tcMar>
-              <w:left w:w="108" w:type="dxa"/>
-              <w:right w:w="108" w:type="dxa"/>
-            </w:tcMar>
-          </w:tcPr>
-          <w:p>
-            <w:pPr>
-              <w:spacing w:after="0" w:line="240" w:lineRule="auto"/>
-              <w:jc w:val="center"/>
-              <w:rPr>
-                <w:rFonts w:ascii="Calibri" w:eastAsia="Calibri" w:hAnsi="Calibri" w:cs="Calibri"/>
-                <w:sz w:val="26"/>
-                <w:szCs w:val="26"/>
-              </w:rPr>
-            </w:pPr>
-            <w:r>
-              <w:rPr>
-                <w:rFonts w:ascii="Calibri" w:eastAsia="Calibri" w:hAnsi="Calibri" w:cs="Calibri"/>
-                <w:sz w:val="26"/>
-                <w:szCs w:val="26"/>
-              </w:rPr>
-              <w:t>JIND</w:t>
-            </w:r>
-          </w:p>
-        </w:tc>
-        <w:tc>
-          <w:tcPr>
-            <w:tcW w:w="1479" w:type="dxa"/>
-            <w:tcBorders>
-              <w:top w:val="single" w:sz="4" w:space="0" w:color="000000"/>
-              <w:left w:val="single" w:sz="4" w:space="0" w:color="000000"/>
-              <w:bottom w:val="single" w:sz="4" w:space="0" w:color="000000"/>
-              <w:right w:val="single" w:sz="4" w:space="0" w:color="000000"/>
-            </w:tcBorders>
-            <w:shd w:val="clear" w:color="000000" w:fill="FFFFFF"/>
-            <w:tcMar>
-              <w:left w:w="108" w:type="dxa"/>
-              <w:right w:w="108" w:type="dxa"/>
-            </w:tcMar>
-          </w:tcPr>
-          <w:p>
-            <w:pPr>
-              <w:spacing w:after="0" w:line="240" w:lineRule="auto"/>
-              <w:jc w:val="center"/>
-              <w:rPr>
-                <w:rFonts w:ascii="Calibri" w:eastAsia="Calibri" w:hAnsi="Calibri" w:cs="Calibri"/>
-                <w:sz w:val="26"/>
-                <w:szCs w:val="26"/>
-              </w:rPr>
-            </w:pPr>
-          </w:p>
-        </w:tc>
-        <w:tc>
-          <w:tcPr>
-            <w:tcW w:w="775" w:type="dxa"/>
-            <w:tcBorders>
-              <w:top w:val="single" w:sz="4" w:space="0" w:color="000000"/>
-              <w:left w:val="single" w:sz="4" w:space="0" w:color="000000"/>
-              <w:bottom w:val="single" w:sz="4" w:space="0" w:color="000000"/>
-              <w:right w:val="single" w:sz="4" w:space="0" w:color="000000"/>
-            </w:tcBorders>
-            <w:shd w:val="clear" w:color="000000" w:fill="FFFFFF"/>
-            <w:tcMar>
-              <w:left w:w="108" w:type="dxa"/>
-              <w:right w:w="108" w:type="dxa"/>
-            </w:tcMar>
-          </w:tcPr>
-          <w:p>
-            <w:pPr>
-              <w:spacing w:after="0" w:line="240" w:lineRule="auto"/>
-              <w:jc w:val="center"/>
-              <w:rPr>
-                <w:rFonts w:ascii="Calibri" w:eastAsia="Calibri" w:hAnsi="Calibri" w:cs="Calibri"/>
-                <w:sz w:val="26"/>
-                <w:szCs w:val="26"/>
-              </w:rPr>
-            </w:pPr>
-            <w:r>
-              <w:rPr>
-                <w:rFonts w:ascii="Calibri" w:eastAsia="Calibri" w:hAnsi="Calibri" w:cs="Calibri"/>
-                <w:sz w:val="26"/>
-                <w:szCs w:val="26"/>
-              </w:rPr>
-              <w:t>GVX</w:t>
-            </w:r>
-          </w:p>
-        </w:tc>
-        <w:tc>
-          <w:tcPr>
-            <w:tcW w:w="1262" w:type="dxa"/>
+            <w:tcW w:w="1842" w:type="dxa"/>
+            <w:tcBorders>
+              <w:top w:val="single" w:sz="4" w:space="0" w:color="000000"/>
+              <w:left w:val="single" w:sz="4" w:space="0" w:color="000000"/>
+              <w:bottom w:val="single" w:sz="4" w:space="0" w:color="000000"/>
+              <w:right w:val="single" w:sz="4" w:space="0" w:color="000000"/>
+            </w:tcBorders>
+            <w:shd w:val="clear" w:color="000000" w:fill="FFFFFF"/>
+            <w:tcMar>
+              <w:left w:w="108" w:type="dxa"/>
+              <w:right w:w="108" w:type="dxa"/>
+            </w:tcMar>
+          </w:tcPr>
+          <w:p>
+            <w:pPr>
+              <w:spacing w:after="0" w:line="240" w:lineRule="auto"/>
+              <w:jc w:val="center"/>
+              <w:rPr>
+                <w:rFonts w:ascii="Calibri" w:eastAsia="Calibri" w:hAnsi="Calibri" w:cs="Calibri"/>
+                <w:sz w:val="26"/>
+                <w:szCs w:val="26"/>
+              </w:rPr>
+            </w:pPr>
+          </w:p>
+        </w:tc>
+        <w:tc>
+          <w:tcPr>
+            <w:tcW w:w="1524" w:type="dxa"/>
+            <w:tcBorders>
+              <w:top w:val="single" w:sz="4" w:space="0" w:color="000000"/>
+              <w:left w:val="single" w:sz="4" w:space="0" w:color="000000"/>
+              <w:bottom w:val="single" w:sz="4" w:space="0" w:color="000000"/>
+              <w:right w:val="single" w:sz="4" w:space="0" w:color="000000"/>
+            </w:tcBorders>
+            <w:shd w:val="clear" w:color="000000" w:fill="FFFFFF"/>
+            <w:tcMar>
+              <w:left w:w="108" w:type="dxa"/>
+              <w:right w:w="108" w:type="dxa"/>
+            </w:tcMar>
+          </w:tcPr>
+          <w:p>
+            <w:pPr>
+              <w:spacing w:after="0" w:line="240" w:lineRule="auto"/>
+              <w:jc w:val="center"/>
+              <w:rPr>
+                <w:rFonts w:ascii="Calibri" w:eastAsia="Calibri" w:hAnsi="Calibri" w:cs="Calibri"/>
+                <w:sz w:val="26"/>
+                <w:szCs w:val="26"/>
+              </w:rPr>
+            </w:pPr>
+          </w:p>
+        </w:tc>
+        <w:tc>
+          <w:tcPr>
+            <w:tcW w:w="795" w:type="dxa"/>
+            <w:tcBorders>
+              <w:top w:val="single" w:sz="4" w:space="0" w:color="000000"/>
+              <w:left w:val="single" w:sz="4" w:space="0" w:color="000000"/>
+              <w:bottom w:val="single" w:sz="4" w:space="0" w:color="000000"/>
+              <w:right w:val="single" w:sz="4" w:space="0" w:color="000000"/>
+            </w:tcBorders>
+            <w:shd w:val="clear" w:color="000000" w:fill="FFFFFF"/>
+            <w:tcMar>
+              <w:left w:w="108" w:type="dxa"/>
+              <w:right w:w="108" w:type="dxa"/>
+            </w:tcMar>
+          </w:tcPr>
+          <w:p>
+            <w:pPr>
+              <w:spacing w:after="0" w:line="240" w:lineRule="auto"/>
+              <w:jc w:val="center"/>
+              <w:rPr>
+                <w:rFonts w:ascii="Calibri" w:eastAsia="Calibri" w:hAnsi="Calibri" w:cs="Calibri"/>
+                <w:sz w:val="26"/>
+                <w:szCs w:val="26"/>
+              </w:rPr>
+            </w:pPr>
+            <w:r>
+              <w:rPr>
+                <w:rFonts w:ascii="Calibri" w:eastAsia="Calibri" w:hAnsi="Calibri" w:cs="Calibri"/>
+                <w:sz w:val="26"/>
+                <w:szCs w:val="26"/>
+              </w:rPr>
+              <w:t>GVT</w:t>
+            </w:r>
+          </w:p>
+        </w:tc>
+        <w:tc>
+          <w:tcPr>
+            <w:tcW w:w="1300" w:type="dxa"/>
             <w:tcBorders>
               <w:top w:val="single" w:sz="4" w:space="0" w:color="000000"/>
               <w:left w:val="single" w:sz="4" w:space="0" w:color="000000"/>
@@ -7760,7 +7751,7 @@
       <w:tr>
         <w:tc>
           <w:tcPr>
-            <w:tcW w:w="657" w:type="dxa"/>
+            <w:tcW w:w="671" w:type="dxa"/>
             <w:tcBorders>
               <w:top w:val="single" w:sz="4" w:space="0" w:color="000000"/>
               <w:left w:val="single" w:sz="4" w:space="0" w:color="000000"/>
@@ -7795,7 +7786,7 @@
         </w:tc>
         <w:tc>
           <w:tcPr>
-            <w:tcW w:w="1557" w:type="dxa"/>
+            <w:tcW w:w="1604" w:type="dxa"/>
             <w:tcBorders>
               <w:top w:val="single" w:sz="4" w:space="0" w:color="000000"/>
               <w:left w:val="single" w:sz="4" w:space="0" w:color="000000"/>
@@ -7830,7 +7821,7 @@
         </w:tc>
         <w:tc>
           <w:tcPr>
-            <w:tcW w:w="1402" w:type="dxa"/>
+            <w:tcW w:w="1444" w:type="dxa"/>
             <w:tcBorders>
               <w:top w:val="single" w:sz="4" w:space="0" w:color="000000"/>
               <w:left w:val="single" w:sz="4" w:space="0" w:color="000000"/>
@@ -7865,96 +7856,96 @@
         </w:tc>
         <w:tc>
           <w:tcPr>
-            <w:tcW w:w="1786" w:type="dxa"/>
-            <w:tcBorders>
-              <w:top w:val="single" w:sz="4" w:space="0" w:color="000000"/>
-              <w:left w:val="single" w:sz="4" w:space="0" w:color="000000"/>
-              <w:bottom w:val="single" w:sz="4" w:space="0" w:color="000000"/>
-              <w:right w:val="single" w:sz="4" w:space="0" w:color="000000"/>
-            </w:tcBorders>
-            <w:shd w:val="clear" w:color="000000" w:fill="FFFFFF"/>
-            <w:tcMar>
-              <w:left w:w="108" w:type="dxa"/>
-              <w:right w:w="108" w:type="dxa"/>
-            </w:tcMar>
-          </w:tcPr>
-          <w:p>
-            <w:pPr>
-              <w:spacing w:after="0" w:line="240" w:lineRule="auto"/>
-              <w:jc w:val="center"/>
-              <w:rPr>
-                <w:rFonts w:ascii="Calibri" w:eastAsia="Calibri" w:hAnsi="Calibri" w:cs="Calibri"/>
-                <w:sz w:val="26"/>
-                <w:szCs w:val="26"/>
-              </w:rPr>
-            </w:pPr>
-          </w:p>
-        </w:tc>
-        <w:tc>
-          <w:tcPr>
-            <w:tcW w:w="1479" w:type="dxa"/>
-            <w:tcBorders>
-              <w:top w:val="single" w:sz="4" w:space="0" w:color="000000"/>
-              <w:left w:val="single" w:sz="4" w:space="0" w:color="000000"/>
-              <w:bottom w:val="single" w:sz="4" w:space="0" w:color="000000"/>
-              <w:right w:val="single" w:sz="4" w:space="0" w:color="000000"/>
-            </w:tcBorders>
-            <w:shd w:val="clear" w:color="000000" w:fill="FFFFFF"/>
-            <w:tcMar>
-              <w:left w:w="108" w:type="dxa"/>
-              <w:right w:w="108" w:type="dxa"/>
-            </w:tcMar>
-          </w:tcPr>
-          <w:p>
-            <w:pPr>
-              <w:spacing w:after="0" w:line="240" w:lineRule="auto"/>
-              <w:jc w:val="center"/>
-              <w:rPr>
-                <w:rFonts w:ascii="Calibri" w:eastAsia="Calibri" w:hAnsi="Calibri" w:cs="Calibri"/>
-                <w:sz w:val="26"/>
-                <w:szCs w:val="26"/>
-              </w:rPr>
-            </w:pPr>
-          </w:p>
-        </w:tc>
-        <w:tc>
-          <w:tcPr>
-            <w:tcW w:w="775" w:type="dxa"/>
-            <w:tcBorders>
-              <w:top w:val="single" w:sz="4" w:space="0" w:color="000000"/>
-              <w:left w:val="single" w:sz="4" w:space="0" w:color="000000"/>
-              <w:bottom w:val="single" w:sz="4" w:space="0" w:color="000000"/>
-              <w:right w:val="single" w:sz="4" w:space="0" w:color="000000"/>
-            </w:tcBorders>
-            <w:shd w:val="clear" w:color="000000" w:fill="FFFFFF"/>
-            <w:tcMar>
-              <w:left w:w="108" w:type="dxa"/>
-              <w:right w:w="108" w:type="dxa"/>
-            </w:tcMar>
-          </w:tcPr>
-          <w:p>
-            <w:pPr>
-              <w:spacing w:after="0" w:line="240" w:lineRule="auto"/>
-              <w:jc w:val="center"/>
-              <w:rPr>
-                <w:rFonts w:ascii="Calibri" w:eastAsia="Calibri" w:hAnsi="Calibri" w:cs="Calibri"/>
-                <w:sz w:val="26"/>
-                <w:szCs w:val="26"/>
-              </w:rPr>
-            </w:pPr>
-            <w:r>
-              <w:rPr>
-                <w:rFonts w:ascii="Calibri" w:eastAsia="Calibri" w:hAnsi="Calibri" w:cs="Calibri"/>
-                <w:sz w:val="26"/>
-                <w:szCs w:val="26"/>
-              </w:rPr>
-              <w:t>GVX</w:t>
-            </w:r>
-          </w:p>
-        </w:tc>
-        <w:tc>
-          <w:tcPr>
-            <w:tcW w:w="1262" w:type="dxa"/>
+            <w:tcW w:w="1842" w:type="dxa"/>
+            <w:tcBorders>
+              <w:top w:val="single" w:sz="4" w:space="0" w:color="000000"/>
+              <w:left w:val="single" w:sz="4" w:space="0" w:color="000000"/>
+              <w:bottom w:val="single" w:sz="4" w:space="0" w:color="000000"/>
+              <w:right w:val="single" w:sz="4" w:space="0" w:color="000000"/>
+            </w:tcBorders>
+            <w:shd w:val="clear" w:color="000000" w:fill="FFFFFF"/>
+            <w:tcMar>
+              <w:left w:w="108" w:type="dxa"/>
+              <w:right w:w="108" w:type="dxa"/>
+            </w:tcMar>
+          </w:tcPr>
+          <w:p>
+            <w:pPr>
+              <w:spacing w:after="0" w:line="240" w:lineRule="auto"/>
+              <w:jc w:val="center"/>
+              <w:rPr>
+                <w:rFonts w:ascii="Calibri" w:eastAsia="Calibri" w:hAnsi="Calibri" w:cs="Calibri"/>
+                <w:sz w:val="26"/>
+                <w:szCs w:val="26"/>
+              </w:rPr>
+            </w:pPr>
+          </w:p>
+        </w:tc>
+        <w:tc>
+          <w:tcPr>
+            <w:tcW w:w="1524" w:type="dxa"/>
+            <w:tcBorders>
+              <w:top w:val="single" w:sz="4" w:space="0" w:color="000000"/>
+              <w:left w:val="single" w:sz="4" w:space="0" w:color="000000"/>
+              <w:bottom w:val="single" w:sz="4" w:space="0" w:color="000000"/>
+              <w:right w:val="single" w:sz="4" w:space="0" w:color="000000"/>
+            </w:tcBorders>
+            <w:shd w:val="clear" w:color="000000" w:fill="FFFFFF"/>
+            <w:tcMar>
+              <w:left w:w="108" w:type="dxa"/>
+              <w:right w:w="108" w:type="dxa"/>
+            </w:tcMar>
+          </w:tcPr>
+          <w:p>
+            <w:pPr>
+              <w:spacing w:after="0" w:line="240" w:lineRule="auto"/>
+              <w:jc w:val="center"/>
+              <w:rPr>
+                <w:rFonts w:ascii="Calibri" w:eastAsia="Calibri" w:hAnsi="Calibri" w:cs="Calibri"/>
+                <w:sz w:val="26"/>
+                <w:szCs w:val="26"/>
+              </w:rPr>
+            </w:pPr>
+          </w:p>
+        </w:tc>
+        <w:tc>
+          <w:tcPr>
+            <w:tcW w:w="795" w:type="dxa"/>
+            <w:tcBorders>
+              <w:top w:val="single" w:sz="4" w:space="0" w:color="000000"/>
+              <w:left w:val="single" w:sz="4" w:space="0" w:color="000000"/>
+              <w:bottom w:val="single" w:sz="4" w:space="0" w:color="000000"/>
+              <w:right w:val="single" w:sz="4" w:space="0" w:color="000000"/>
+            </w:tcBorders>
+            <w:shd w:val="clear" w:color="000000" w:fill="FFFFFF"/>
+            <w:tcMar>
+              <w:left w:w="108" w:type="dxa"/>
+              <w:right w:w="108" w:type="dxa"/>
+            </w:tcMar>
+          </w:tcPr>
+          <w:p>
+            <w:pPr>
+              <w:spacing w:after="0" w:line="240" w:lineRule="auto"/>
+              <w:jc w:val="center"/>
+              <w:rPr>
+                <w:rFonts w:ascii="Calibri" w:eastAsia="Calibri" w:hAnsi="Calibri" w:cs="Calibri"/>
+                <w:sz w:val="26"/>
+                <w:szCs w:val="26"/>
+              </w:rPr>
+            </w:pPr>
+            <w:r>
+              <w:rPr>
+                <w:rFonts w:ascii="Calibri" w:eastAsia="Calibri" w:hAnsi="Calibri" w:cs="Calibri"/>
+                <w:sz w:val="26"/>
+                <w:szCs w:val="26"/>
+              </w:rPr>
+              <w:t>GVT</w:t>
+            </w:r>
+          </w:p>
+        </w:tc>
+        <w:tc>
+          <w:tcPr>
+            <w:tcW w:w="1300" w:type="dxa"/>
             <w:tcBorders>
               <w:top w:val="single" w:sz="4" w:space="0" w:color="000000"/>
               <w:left w:val="single" w:sz="4" w:space="0" w:color="000000"/>
@@ -7983,7 +7974,7 @@
       <w:tr>
         <w:tc>
           <w:tcPr>
-            <w:tcW w:w="657" w:type="dxa"/>
+            <w:tcW w:w="671" w:type="dxa"/>
             <w:tcBorders>
               <w:top w:val="single" w:sz="4" w:space="0" w:color="000000"/>
               <w:left w:val="single" w:sz="4" w:space="0" w:color="000000"/>
@@ -8018,7 +8009,7 @@
         </w:tc>
         <w:tc>
           <w:tcPr>
-            <w:tcW w:w="1557" w:type="dxa"/>
+            <w:tcW w:w="1604" w:type="dxa"/>
             <w:tcBorders>
               <w:top w:val="single" w:sz="4" w:space="0" w:color="000000"/>
               <w:left w:val="single" w:sz="4" w:space="0" w:color="000000"/>
@@ -8053,7 +8044,7 @@
         </w:tc>
         <w:tc>
           <w:tcPr>
-            <w:tcW w:w="1402" w:type="dxa"/>
+            <w:tcW w:w="1444" w:type="dxa"/>
             <w:tcBorders>
               <w:top w:val="single" w:sz="4" w:space="0" w:color="000000"/>
               <w:left w:val="single" w:sz="4" w:space="0" w:color="000000"/>
@@ -8088,96 +8079,96 @@
         </w:tc>
         <w:tc>
           <w:tcPr>
-            <w:tcW w:w="1786" w:type="dxa"/>
-            <w:tcBorders>
-              <w:top w:val="single" w:sz="4" w:space="0" w:color="000000"/>
-              <w:left w:val="single" w:sz="4" w:space="0" w:color="000000"/>
-              <w:bottom w:val="single" w:sz="4" w:space="0" w:color="000000"/>
-              <w:right w:val="single" w:sz="4" w:space="0" w:color="000000"/>
-            </w:tcBorders>
-            <w:shd w:val="clear" w:color="000000" w:fill="FFFFFF"/>
-            <w:tcMar>
-              <w:left w:w="108" w:type="dxa"/>
-              <w:right w:w="108" w:type="dxa"/>
-            </w:tcMar>
-          </w:tcPr>
-          <w:p>
-            <w:pPr>
-              <w:spacing w:after="0" w:line="240" w:lineRule="auto"/>
-              <w:jc w:val="center"/>
-              <w:rPr>
-                <w:rFonts w:ascii="Calibri" w:eastAsia="Calibri" w:hAnsi="Calibri" w:cs="Calibri"/>
-                <w:sz w:val="26"/>
-                <w:szCs w:val="26"/>
-              </w:rPr>
-            </w:pPr>
-          </w:p>
-        </w:tc>
-        <w:tc>
-          <w:tcPr>
-            <w:tcW w:w="1479" w:type="dxa"/>
-            <w:tcBorders>
-              <w:top w:val="single" w:sz="4" w:space="0" w:color="000000"/>
-              <w:left w:val="single" w:sz="4" w:space="0" w:color="000000"/>
-              <w:bottom w:val="single" w:sz="4" w:space="0" w:color="000000"/>
-              <w:right w:val="single" w:sz="4" w:space="0" w:color="000000"/>
-            </w:tcBorders>
-            <w:shd w:val="clear" w:color="000000" w:fill="FFFFFF"/>
-            <w:tcMar>
-              <w:left w:w="108" w:type="dxa"/>
-              <w:right w:w="108" w:type="dxa"/>
-            </w:tcMar>
-          </w:tcPr>
-          <w:p>
-            <w:pPr>
-              <w:spacing w:after="0" w:line="240" w:lineRule="auto"/>
-              <w:jc w:val="center"/>
-              <w:rPr>
-                <w:rFonts w:ascii="Calibri" w:eastAsia="Calibri" w:hAnsi="Calibri" w:cs="Calibri"/>
-                <w:sz w:val="26"/>
-                <w:szCs w:val="26"/>
-              </w:rPr>
-            </w:pPr>
-          </w:p>
-        </w:tc>
-        <w:tc>
-          <w:tcPr>
-            <w:tcW w:w="775" w:type="dxa"/>
-            <w:tcBorders>
-              <w:top w:val="single" w:sz="4" w:space="0" w:color="000000"/>
-              <w:left w:val="single" w:sz="4" w:space="0" w:color="000000"/>
-              <w:bottom w:val="single" w:sz="4" w:space="0" w:color="000000"/>
-              <w:right w:val="single" w:sz="4" w:space="0" w:color="000000"/>
-            </w:tcBorders>
-            <w:shd w:val="clear" w:color="000000" w:fill="FFFFFF"/>
-            <w:tcMar>
-              <w:left w:w="108" w:type="dxa"/>
-              <w:right w:w="108" w:type="dxa"/>
-            </w:tcMar>
-          </w:tcPr>
-          <w:p>
-            <w:pPr>
-              <w:spacing w:after="0" w:line="240" w:lineRule="auto"/>
-              <w:jc w:val="center"/>
-              <w:rPr>
-                <w:rFonts w:ascii="Calibri" w:eastAsia="Calibri" w:hAnsi="Calibri" w:cs="Calibri"/>
-                <w:sz w:val="26"/>
-                <w:szCs w:val="26"/>
-              </w:rPr>
-            </w:pPr>
-            <w:r>
-              <w:rPr>
-                <w:rFonts w:ascii="Calibri" w:eastAsia="Calibri" w:hAnsi="Calibri" w:cs="Calibri"/>
-                <w:sz w:val="26"/>
-                <w:szCs w:val="26"/>
-              </w:rPr>
-              <w:t>GVX</w:t>
-            </w:r>
-          </w:p>
-        </w:tc>
-        <w:tc>
-          <w:tcPr>
-            <w:tcW w:w="1262" w:type="dxa"/>
+            <w:tcW w:w="1842" w:type="dxa"/>
+            <w:tcBorders>
+              <w:top w:val="single" w:sz="4" w:space="0" w:color="000000"/>
+              <w:left w:val="single" w:sz="4" w:space="0" w:color="000000"/>
+              <w:bottom w:val="single" w:sz="4" w:space="0" w:color="000000"/>
+              <w:right w:val="single" w:sz="4" w:space="0" w:color="000000"/>
+            </w:tcBorders>
+            <w:shd w:val="clear" w:color="000000" w:fill="FFFFFF"/>
+            <w:tcMar>
+              <w:left w:w="108" w:type="dxa"/>
+              <w:right w:w="108" w:type="dxa"/>
+            </w:tcMar>
+          </w:tcPr>
+          <w:p>
+            <w:pPr>
+              <w:spacing w:after="0" w:line="240" w:lineRule="auto"/>
+              <w:jc w:val="center"/>
+              <w:rPr>
+                <w:rFonts w:ascii="Calibri" w:eastAsia="Calibri" w:hAnsi="Calibri" w:cs="Calibri"/>
+                <w:sz w:val="26"/>
+                <w:szCs w:val="26"/>
+              </w:rPr>
+            </w:pPr>
+          </w:p>
+        </w:tc>
+        <w:tc>
+          <w:tcPr>
+            <w:tcW w:w="1524" w:type="dxa"/>
+            <w:tcBorders>
+              <w:top w:val="single" w:sz="4" w:space="0" w:color="000000"/>
+              <w:left w:val="single" w:sz="4" w:space="0" w:color="000000"/>
+              <w:bottom w:val="single" w:sz="4" w:space="0" w:color="000000"/>
+              <w:right w:val="single" w:sz="4" w:space="0" w:color="000000"/>
+            </w:tcBorders>
+            <w:shd w:val="clear" w:color="000000" w:fill="FFFFFF"/>
+            <w:tcMar>
+              <w:left w:w="108" w:type="dxa"/>
+              <w:right w:w="108" w:type="dxa"/>
+            </w:tcMar>
+          </w:tcPr>
+          <w:p>
+            <w:pPr>
+              <w:spacing w:after="0" w:line="240" w:lineRule="auto"/>
+              <w:jc w:val="center"/>
+              <w:rPr>
+                <w:rFonts w:ascii="Calibri" w:eastAsia="Calibri" w:hAnsi="Calibri" w:cs="Calibri"/>
+                <w:sz w:val="26"/>
+                <w:szCs w:val="26"/>
+              </w:rPr>
+            </w:pPr>
+          </w:p>
+        </w:tc>
+        <w:tc>
+          <w:tcPr>
+            <w:tcW w:w="795" w:type="dxa"/>
+            <w:tcBorders>
+              <w:top w:val="single" w:sz="4" w:space="0" w:color="000000"/>
+              <w:left w:val="single" w:sz="4" w:space="0" w:color="000000"/>
+              <w:bottom w:val="single" w:sz="4" w:space="0" w:color="000000"/>
+              <w:right w:val="single" w:sz="4" w:space="0" w:color="000000"/>
+            </w:tcBorders>
+            <w:shd w:val="clear" w:color="000000" w:fill="FFFFFF"/>
+            <w:tcMar>
+              <w:left w:w="108" w:type="dxa"/>
+              <w:right w:w="108" w:type="dxa"/>
+            </w:tcMar>
+          </w:tcPr>
+          <w:p>
+            <w:pPr>
+              <w:spacing w:after="0" w:line="240" w:lineRule="auto"/>
+              <w:jc w:val="center"/>
+              <w:rPr>
+                <w:rFonts w:ascii="Calibri" w:eastAsia="Calibri" w:hAnsi="Calibri" w:cs="Calibri"/>
+                <w:sz w:val="26"/>
+                <w:szCs w:val="26"/>
+              </w:rPr>
+            </w:pPr>
+            <w:r>
+              <w:rPr>
+                <w:rFonts w:ascii="Calibri" w:eastAsia="Calibri" w:hAnsi="Calibri" w:cs="Calibri"/>
+                <w:sz w:val="26"/>
+                <w:szCs w:val="26"/>
+              </w:rPr>
+              <w:t>GVT</w:t>
+            </w:r>
+          </w:p>
+        </w:tc>
+        <w:tc>
+          <w:tcPr>
+            <w:tcW w:w="1300" w:type="dxa"/>
             <w:tcBorders>
               <w:top w:val="single" w:sz="4" w:space="0" w:color="000000"/>
               <w:left w:val="single" w:sz="4" w:space="0" w:color="000000"/>
@@ -8203,6 +8194,7 @@
           </w:p>
         </w:tc>
       </w:tr>
+      <w:bookmarkEnd w:id="0"/>
     </w:tbl>
     <w:p>
       <w:pPr>
@@ -8415,7 +8407,7 @@
         <v:rect id="_x0000_i1025" style="width:54.75pt;height:39pt" o:ole="" o:preferrelative="t" stroked="f">
           <v:imagedata r:id="rId1" o:title=""/>
         </v:rect>
-        <o:OLEObject Type="Embed" ProgID="StaticMetafile" ShapeID="_x0000_i1025" DrawAspect="Content" ObjectID="_1850909371" r:id="rId2"/>
+        <o:OLEObject Type="Embed" ProgID="StaticMetafile" ShapeID="_x0000_i1025" DrawAspect="Content" ObjectID="_1850910516" r:id="rId2"/>
       </w:object>
     </w:r>
     <w:r>

</xml_diff>

<commit_message>
Sync - 2026-09-15 16:25
</commit_message>
<xml_diff>
--- a/files/Daily_Helicopter_Schedule.docx
+++ b/files/Daily_Helicopter_Schedule.docx
@@ -1711,15 +1711,7 @@
                 <w:sz w:val="26"/>
                 <w:szCs w:val="26"/>
               </w:rPr>
-              <w:t xml:space="preserve">GVHL </w:t>
-            </w:r>
-            <w:r>
-              <w:rPr>
-                <w:rFonts w:ascii="Calibri" w:eastAsia="Calibri" w:hAnsi="Calibri" w:cs="Calibri"/>
-                <w:sz w:val="26"/>
-                <w:szCs w:val="26"/>
-              </w:rPr>
-              <w:t>169</w:t>
+              <w:t>HELIGO 412</w:t>
             </w:r>
           </w:p>
         </w:tc>
@@ -1754,7 +1746,7 @@
                 <w:sz w:val="26"/>
                 <w:szCs w:val="26"/>
               </w:rPr>
-              <w:t>RRO</w:t>
+              <w:t>HLV</w:t>
             </w:r>
           </w:p>
         </w:tc>
@@ -3334,7 +3326,7 @@
                 <w:sz w:val="26"/>
                 <w:szCs w:val="26"/>
               </w:rPr>
-              <w:t>NA</w:t>
+              <w:t>B193</w:t>
             </w:r>
           </w:p>
         </w:tc>
@@ -3390,6 +3382,14 @@
                 <w:szCs w:val="26"/>
               </w:rPr>
             </w:pPr>
+            <w:r>
+              <w:rPr>
+                <w:rFonts w:ascii="Calibri" w:eastAsia="Calibri" w:hAnsi="Calibri" w:cs="Calibri"/>
+                <w:sz w:val="26"/>
+                <w:szCs w:val="26"/>
+              </w:rPr>
+              <w:t>RRO</w:t>
+            </w:r>
           </w:p>
         </w:tc>
         <w:tc>
@@ -3804,7 +3804,7 @@
                 <w:sz w:val="26"/>
                 <w:szCs w:val="26"/>
               </w:rPr>
-              <w:t>NA</w:t>
+              <w:t>B193</w:t>
             </w:r>
           </w:p>
         </w:tc>
@@ -3860,6 +3860,14 @@
                 <w:szCs w:val="26"/>
               </w:rPr>
             </w:pPr>
+            <w:r>
+              <w:rPr>
+                <w:rFonts w:ascii="Calibri" w:eastAsia="Calibri" w:hAnsi="Calibri" w:cs="Calibri"/>
+                <w:sz w:val="26"/>
+                <w:szCs w:val="26"/>
+              </w:rPr>
+              <w:t>RRO</w:t>
+            </w:r>
           </w:p>
         </w:tc>
         <w:tc>
@@ -4322,7 +4330,7 @@
                 <w:sz w:val="26"/>
                 <w:szCs w:val="26"/>
               </w:rPr>
-              <w:t>KSPR</w:t>
+              <w:t>NA</w:t>
             </w:r>
           </w:p>
         </w:tc>
@@ -4542,14 +4550,6 @@
                 <w:szCs w:val="26"/>
               </w:rPr>
             </w:pPr>
-            <w:r>
-              <w:rPr>
-                <w:rFonts w:ascii="Calibri" w:eastAsia="Calibri" w:hAnsi="Calibri" w:cs="Calibri"/>
-                <w:sz w:val="26"/>
-                <w:szCs w:val="26"/>
-              </w:rPr>
-              <w:t>PANNA</w:t>
-            </w:r>
           </w:p>
         </w:tc>
         <w:tc>
@@ -4997,14 +4997,6 @@
                 <w:szCs w:val="26"/>
               </w:rPr>
             </w:pPr>
-            <w:r>
-              <w:rPr>
-                <w:rFonts w:ascii="Calibri" w:eastAsia="Calibri" w:hAnsi="Calibri" w:cs="Calibri"/>
-                <w:sz w:val="26"/>
-                <w:szCs w:val="26"/>
-              </w:rPr>
-              <w:t>R12A</w:t>
-            </w:r>
           </w:p>
         </w:tc>
         <w:tc>
@@ -5747,7 +5739,15 @@
                 <w:sz w:val="26"/>
                 <w:szCs w:val="26"/>
               </w:rPr>
-              <w:t>HERA/NLM</w:t>
+              <w:t>SRAT</w:t>
+            </w:r>
+            <w:r>
+              <w:rPr>
+                <w:rFonts w:ascii="Calibri" w:eastAsia="Calibri" w:hAnsi="Calibri" w:cs="Calibri"/>
+                <w:sz w:val="26"/>
+                <w:szCs w:val="26"/>
+              </w:rPr>
+              <w:t>/SMRT</w:t>
             </w:r>
           </w:p>
         </w:tc>
@@ -5974,7 +5974,7 @@
                 <w:sz w:val="26"/>
                 <w:szCs w:val="26"/>
               </w:rPr>
-              <w:t>SJOT</w:t>
+              <w:t>FPSO1</w:t>
             </w:r>
           </w:p>
         </w:tc>
@@ -6201,7 +6201,7 @@
                 <w:sz w:val="26"/>
                 <w:szCs w:val="26"/>
               </w:rPr>
-              <w:t>SGAV</w:t>
+              <w:t>SSAK</w:t>
             </w:r>
           </w:p>
         </w:tc>
@@ -6223,13 +6223,20 @@
           <w:p>
             <w:pPr>
               <w:spacing w:after="0" w:line="240" w:lineRule="auto"/>
-              <w:jc w:val="center"/>
-              <w:rPr>
-                <w:rFonts w:ascii="Calibri" w:eastAsia="Calibri" w:hAnsi="Calibri" w:cs="Calibri"/>
-                <w:sz w:val="26"/>
-                <w:szCs w:val="26"/>
-              </w:rPr>
-            </w:pPr>
+              <w:rPr>
+                <w:rFonts w:ascii="Calibri" w:eastAsia="Calibri" w:hAnsi="Calibri" w:cs="Calibri"/>
+                <w:sz w:val="26"/>
+                <w:szCs w:val="26"/>
+              </w:rPr>
+            </w:pPr>
+            <w:r>
+              <w:rPr>
+                <w:rFonts w:ascii="Calibri" w:eastAsia="Calibri" w:hAnsi="Calibri" w:cs="Calibri"/>
+                <w:sz w:val="26"/>
+                <w:szCs w:val="26"/>
+              </w:rPr>
+              <w:t xml:space="preserve">        </w:t>
+            </w:r>
           </w:p>
         </w:tc>
         <w:tc>
@@ -6430,6 +6437,8 @@
               </w:rPr>
               <w:t>SF (SPCL)</w:t>
             </w:r>
+            <w:bookmarkStart w:id="0" w:name="_GoBack"/>
+            <w:bookmarkEnd w:id="0"/>
           </w:p>
         </w:tc>
         <w:tc>
@@ -6655,7 +6664,7 @@
                 <w:sz w:val="26"/>
                 <w:szCs w:val="26"/>
               </w:rPr>
-              <w:t>KSPR</w:t>
+              <w:t>TRI2</w:t>
             </w:r>
           </w:p>
         </w:tc>
@@ -6954,7 +6963,6 @@
                 <w:rFonts w:ascii="Calibri" w:eastAsia="Calibri" w:hAnsi="Calibri" w:cs="Calibri"/>
               </w:rPr>
             </w:pPr>
-            <w:bookmarkStart w:id="0" w:name="_GoBack"/>
             <w:r>
               <w:rPr>
                 <w:rFonts w:ascii="Calibri" w:eastAsia="Calibri" w:hAnsi="Calibri" w:cs="Calibri"/>
@@ -8194,7 +8202,6 @@
           </w:p>
         </w:tc>
       </w:tr>
-      <w:bookmarkEnd w:id="0"/>
     </w:tbl>
     <w:p>
       <w:pPr>
@@ -8404,10 +8411,10 @@
     </w:pPr>
     <w:r>
       <w:object w:dxaOrig="1188" w:dyaOrig="900">
-        <v:rect id="_x0000_i1025" style="width:54.75pt;height:39pt" o:ole="" o:preferrelative="t" stroked="f">
+        <v:rect id="_x0000_i1025" style="width:55pt;height:39.1pt" o:ole="" o:preferrelative="t" stroked="f">
           <v:imagedata r:id="rId1" o:title=""/>
         </v:rect>
-        <o:OLEObject Type="Embed" ProgID="StaticMetafile" ShapeID="_x0000_i1025" DrawAspect="Content" ObjectID="_1850910516" r:id="rId2"/>
+        <o:OLEObject Type="Embed" ProgID="StaticMetafile" ShapeID="_x0000_i1025" DrawAspect="Content" ObjectID="_1850994583" r:id="rId2"/>
       </w:object>
     </w:r>
     <w:r>
@@ -8441,7 +8448,7 @@
         <w:sz w:val="26"/>
         <w:szCs w:val="26"/>
       </w:rPr>
-      <w:t>15</w:t>
+      <w:t>16</w:t>
     </w:r>
     <w:r>
       <w:rPr>
@@ -8461,7 +8468,7 @@
         <w:sz w:val="26"/>
         <w:szCs w:val="26"/>
       </w:rPr>
-      <w:t>TUES</w:t>
+      <w:t>WEDNES</w:t>
     </w:r>
     <w:r>
       <w:rPr>

</xml_diff>

<commit_message>
Sync - 2026-09-16 17:58
</commit_message>
<xml_diff>
--- a/files/Daily_Helicopter_Schedule.docx
+++ b/files/Daily_Helicopter_Schedule.docx
@@ -1147,7 +1147,7 @@
                 <w:sz w:val="26"/>
                 <w:szCs w:val="26"/>
               </w:rPr>
-              <w:t>GVHL 169</w:t>
+              <w:t>GVHL 412</w:t>
             </w:r>
           </w:p>
         </w:tc>
@@ -1182,7 +1182,7 @@
                 <w:sz w:val="26"/>
                 <w:szCs w:val="26"/>
               </w:rPr>
-              <w:t>RRL</w:t>
+              <w:t>RRJ</w:t>
             </w:r>
           </w:p>
         </w:tc>
@@ -1407,7 +1407,7 @@
                 <w:sz w:val="26"/>
                 <w:szCs w:val="26"/>
               </w:rPr>
-              <w:t>GVHL 412</w:t>
+              <w:t>GVHL 169</w:t>
             </w:r>
           </w:p>
         </w:tc>
@@ -1442,7 +1442,7 @@
                 <w:sz w:val="26"/>
                 <w:szCs w:val="26"/>
               </w:rPr>
-              <w:t>RRJ</w:t>
+              <w:t>RRL</w:t>
             </w:r>
           </w:p>
         </w:tc>
@@ -1711,7 +1711,7 @@
                 <w:sz w:val="26"/>
                 <w:szCs w:val="26"/>
               </w:rPr>
-              <w:t>HELIGO 412</w:t>
+              <w:t>NA</w:t>
             </w:r>
           </w:p>
         </w:tc>
@@ -1746,7 +1746,7 @@
                 <w:sz w:val="26"/>
                 <w:szCs w:val="26"/>
               </w:rPr>
-              <w:t>HLV</w:t>
+              <w:t>NA</w:t>
             </w:r>
           </w:p>
         </w:tc>
@@ -3086,7 +3086,7 @@
                 <w:sz w:val="26"/>
                 <w:szCs w:val="26"/>
               </w:rPr>
-              <w:t>NA</w:t>
+              <w:t>HERA</w:t>
             </w:r>
           </w:p>
         </w:tc>
@@ -3326,7 +3326,7 @@
                 <w:sz w:val="26"/>
                 <w:szCs w:val="26"/>
               </w:rPr>
-              <w:t>B193</w:t>
+              <w:t>NA</w:t>
             </w:r>
           </w:p>
         </w:tc>
@@ -3382,14 +3382,6 @@
                 <w:szCs w:val="26"/>
               </w:rPr>
             </w:pPr>
-            <w:r>
-              <w:rPr>
-                <w:rFonts w:ascii="Calibri" w:eastAsia="Calibri" w:hAnsi="Calibri" w:cs="Calibri"/>
-                <w:sz w:val="26"/>
-                <w:szCs w:val="26"/>
-              </w:rPr>
-              <w:t>RRO</w:t>
-            </w:r>
           </w:p>
         </w:tc>
         <w:tc>
@@ -3572,7 +3564,7 @@
                 <w:sz w:val="26"/>
                 <w:szCs w:val="26"/>
               </w:rPr>
-              <w:t>NA</w:t>
+              <w:t>DSFN</w:t>
             </w:r>
           </w:p>
         </w:tc>
@@ -3804,7 +3796,7 @@
                 <w:sz w:val="26"/>
                 <w:szCs w:val="26"/>
               </w:rPr>
-              <w:t>B193</w:t>
+              <w:t>NA</w:t>
             </w:r>
           </w:p>
         </w:tc>
@@ -3860,14 +3852,6 @@
                 <w:szCs w:val="26"/>
               </w:rPr>
             </w:pPr>
-            <w:r>
-              <w:rPr>
-                <w:rFonts w:ascii="Calibri" w:eastAsia="Calibri" w:hAnsi="Calibri" w:cs="Calibri"/>
-                <w:sz w:val="26"/>
-                <w:szCs w:val="26"/>
-              </w:rPr>
-              <w:t>RRO</w:t>
-            </w:r>
           </w:p>
         </w:tc>
         <w:tc>
@@ -4007,7 +3991,7 @@
                 <w:sz w:val="26"/>
                 <w:szCs w:val="26"/>
               </w:rPr>
-              <w:t>13:05</w:t>
+              <w:t>13:00</w:t>
             </w:r>
           </w:p>
         </w:tc>
@@ -4043,11 +4027,10 @@
             <w:r>
               <w:rPr>
                 <w:rFonts w:ascii="Calibri" w:eastAsia="Calibri" w:hAnsi="Calibri" w:cs="Calibri"/>
-                <w:b/>
-                <w:sz w:val="26"/>
-                <w:szCs w:val="26"/>
-              </w:rPr>
-              <w:t>NA</w:t>
+                <w:sz w:val="26"/>
+                <w:szCs w:val="26"/>
+              </w:rPr>
+              <w:t>SUDA</w:t>
             </w:r>
           </w:p>
         </w:tc>
@@ -4550,6 +4533,14 @@
                 <w:szCs w:val="26"/>
               </w:rPr>
             </w:pPr>
+            <w:r>
+              <w:rPr>
+                <w:rFonts w:ascii="Calibri" w:eastAsia="Calibri" w:hAnsi="Calibri" w:cs="Calibri"/>
+                <w:sz w:val="26"/>
+                <w:szCs w:val="26"/>
+              </w:rPr>
+              <w:t>HERA</w:t>
+            </w:r>
           </w:p>
         </w:tc>
         <w:tc>
@@ -4997,6 +4988,14 @@
                 <w:szCs w:val="26"/>
               </w:rPr>
             </w:pPr>
+            <w:r>
+              <w:rPr>
+                <w:rFonts w:ascii="Calibri" w:eastAsia="Calibri" w:hAnsi="Calibri" w:cs="Calibri"/>
+                <w:sz w:val="26"/>
+                <w:szCs w:val="26"/>
+              </w:rPr>
+              <w:t>SUDA</w:t>
+            </w:r>
           </w:p>
         </w:tc>
         <w:tc>
@@ -5226,11 +5225,10 @@
             <w:r>
               <w:rPr>
                 <w:rFonts w:ascii="Calibri" w:eastAsia="Calibri" w:hAnsi="Calibri" w:cs="Calibri"/>
-                <w:b/>
-                <w:sz w:val="26"/>
-                <w:szCs w:val="26"/>
-              </w:rPr>
-              <w:t>NA</w:t>
+                <w:sz w:val="26"/>
+                <w:szCs w:val="26"/>
+              </w:rPr>
+              <w:t>BPB</w:t>
             </w:r>
           </w:p>
         </w:tc>
@@ -5512,7 +5510,7 @@
                 <w:sz w:val="26"/>
                 <w:szCs w:val="26"/>
               </w:rPr>
-              <w:t>BPA</w:t>
+              <w:t>BPB</w:t>
             </w:r>
           </w:p>
         </w:tc>
@@ -5739,15 +5737,7 @@
                 <w:sz w:val="26"/>
                 <w:szCs w:val="26"/>
               </w:rPr>
-              <w:t>SRAT</w:t>
-            </w:r>
-            <w:r>
-              <w:rPr>
-                <w:rFonts w:ascii="Calibri" w:eastAsia="Calibri" w:hAnsi="Calibri" w:cs="Calibri"/>
-                <w:sz w:val="26"/>
-                <w:szCs w:val="26"/>
-              </w:rPr>
-              <w:t>/SMRT</w:t>
+              <w:t>JSUP</w:t>
             </w:r>
           </w:p>
         </w:tc>
@@ -5974,7 +5964,7 @@
                 <w:sz w:val="26"/>
                 <w:szCs w:val="26"/>
               </w:rPr>
-              <w:t>FPSO1</w:t>
+              <w:t>FDIX+AD11</w:t>
             </w:r>
           </w:p>
         </w:tc>
@@ -6201,7 +6191,7 @@
                 <w:sz w:val="26"/>
                 <w:szCs w:val="26"/>
               </w:rPr>
-              <w:t>SSAK</w:t>
+              <w:t>JXLR</w:t>
             </w:r>
           </w:p>
         </w:tc>
@@ -6435,10 +6425,8 @@
                 <w:sz w:val="26"/>
                 <w:szCs w:val="26"/>
               </w:rPr>
-              <w:t>SF (SPCL)</w:t>
-            </w:r>
-            <w:bookmarkStart w:id="0" w:name="_GoBack"/>
-            <w:bookmarkEnd w:id="0"/>
+              <w:t>JSUP</w:t>
+            </w:r>
           </w:p>
         </w:tc>
         <w:tc>
@@ -6658,14 +6646,8 @@
                 <w:szCs w:val="26"/>
               </w:rPr>
             </w:pPr>
-            <w:r>
-              <w:rPr>
-                <w:rFonts w:ascii="Calibri" w:eastAsia="Calibri" w:hAnsi="Calibri" w:cs="Calibri"/>
-                <w:sz w:val="26"/>
-                <w:szCs w:val="26"/>
-              </w:rPr>
-              <w:t>TRI2</w:t>
-            </w:r>
+            <w:bookmarkStart w:id="0" w:name="_GoBack"/>
+            <w:bookmarkEnd w:id="0"/>
           </w:p>
         </w:tc>
         <w:tc>
@@ -6793,13 +6775,6 @@
                 <w:sz w:val="24"/>
               </w:rPr>
               <w:t xml:space="preserve"> </w:t>
-            </w:r>
-            <w:r>
-              <w:rPr>
-                <w:rFonts w:ascii="Calibri" w:eastAsia="Calibri" w:hAnsi="Calibri" w:cs="Calibri"/>
-                <w:sz w:val="24"/>
-              </w:rPr>
-              <w:t>.</w:t>
             </w:r>
           </w:p>
         </w:tc>
@@ -7434,14 +7409,6 @@
                 <w:szCs w:val="26"/>
               </w:rPr>
             </w:pPr>
-            <w:r>
-              <w:rPr>
-                <w:rFonts w:ascii="Calibri" w:eastAsia="Calibri" w:hAnsi="Calibri" w:cs="Calibri"/>
-                <w:sz w:val="26"/>
-                <w:szCs w:val="26"/>
-              </w:rPr>
-              <w:t>TCPP CC+PROD</w:t>
-            </w:r>
           </w:p>
         </w:tc>
         <w:tc>
@@ -8411,10 +8378,10 @@
     </w:pPr>
     <w:r>
       <w:object w:dxaOrig="1188" w:dyaOrig="900">
-        <v:rect id="_x0000_i1025" style="width:55pt;height:39.1pt" o:ole="" o:preferrelative="t" stroked="f">
+        <v:rect id="_x0000_i1025" style="width:55.5pt;height:39pt" o:ole="" o:preferrelative="t" stroked="f">
           <v:imagedata r:id="rId1" o:title=""/>
         </v:rect>
-        <o:OLEObject Type="Embed" ProgID="StaticMetafile" ShapeID="_x0000_i1025" DrawAspect="Content" ObjectID="_1850994583" r:id="rId2"/>
+        <o:OLEObject Type="Embed" ProgID="StaticMetafile" ShapeID="_x0000_i1025" DrawAspect="Content" ObjectID="_1851085043" r:id="rId2"/>
       </w:object>
     </w:r>
     <w:r>
@@ -8448,7 +8415,7 @@
         <w:sz w:val="26"/>
         <w:szCs w:val="26"/>
       </w:rPr>
-      <w:t>16</w:t>
+      <w:t>17</w:t>
     </w:r>
     <w:r>
       <w:rPr>
@@ -8468,7 +8435,17 @@
         <w:sz w:val="26"/>
         <w:szCs w:val="26"/>
       </w:rPr>
-      <w:t>WEDNES</w:t>
+      <w:t>THUR</w:t>
+    </w:r>
+    <w:r>
+      <w:rPr>
+        <w:rFonts w:ascii="Times New Roman" w:hAnsi="Times New Roman" w:cs="Times New Roman"/>
+        <w:b/>
+        <w:color w:val="000000" w:themeColor="text1"/>
+        <w:sz w:val="26"/>
+        <w:szCs w:val="26"/>
+      </w:rPr>
+      <w:t>S</w:t>
     </w:r>
     <w:r>
       <w:rPr>

</xml_diff>

<commit_message>
Sync - 2026-09-18 16:34
</commit_message>
<xml_diff>
--- a/files/Daily_Helicopter_Schedule.docx
+++ b/files/Daily_Helicopter_Schedule.docx
@@ -926,16 +926,14 @@
                 <w:szCs w:val="26"/>
               </w:rPr>
             </w:pPr>
-            <w:bookmarkStart w:id="0" w:name="_GoBack"/>
-            <w:r>
-              <w:rPr>
-                <w:rFonts w:ascii="Calibri" w:eastAsia="Calibri" w:hAnsi="Calibri" w:cs="Calibri"/>
-                <w:sz w:val="26"/>
-                <w:szCs w:val="26"/>
-              </w:rPr>
-              <w:t>RRJ</w:t>
-            </w:r>
-            <w:bookmarkEnd w:id="0"/>
+            <w:r>
+              <w:rPr>
+                <w:rFonts w:ascii="Calibri" w:eastAsia="Calibri" w:hAnsi="Calibri" w:cs="Calibri"/>
+                <w:sz w:val="26"/>
+                <w:szCs w:val="26"/>
+              </w:rPr>
+              <w:t>RRO</w:t>
+            </w:r>
           </w:p>
         </w:tc>
         <w:tc>
@@ -1451,13 +1449,15 @@
               <w:jc w:val="center"/>
               <w:rPr>
                 <w:rFonts w:ascii="Calibri" w:eastAsia="Calibri" w:hAnsi="Calibri" w:cs="Calibri"/>
-                <w:sz w:val="26"/>
-                <w:szCs w:val="26"/>
-              </w:rPr>
-            </w:pPr>
-            <w:r>
-              <w:rPr>
-                <w:rFonts w:ascii="Calibri" w:eastAsia="Calibri" w:hAnsi="Calibri" w:cs="Calibri"/>
+                <w:b/>
+                <w:sz w:val="26"/>
+                <w:szCs w:val="26"/>
+              </w:rPr>
+            </w:pPr>
+            <w:r>
+              <w:rPr>
+                <w:rFonts w:ascii="Calibri" w:eastAsia="Calibri" w:hAnsi="Calibri" w:cs="Calibri"/>
+                <w:b/>
                 <w:sz w:val="26"/>
                 <w:szCs w:val="26"/>
               </w:rPr>
@@ -1486,13 +1486,15 @@
               <w:jc w:val="center"/>
               <w:rPr>
                 <w:rFonts w:ascii="Calibri" w:eastAsia="Calibri" w:hAnsi="Calibri" w:cs="Calibri"/>
-                <w:sz w:val="26"/>
-                <w:szCs w:val="26"/>
-              </w:rPr>
-            </w:pPr>
-            <w:r>
-              <w:rPr>
-                <w:rFonts w:ascii="Calibri" w:eastAsia="Calibri" w:hAnsi="Calibri" w:cs="Calibri"/>
+                <w:b/>
+                <w:sz w:val="26"/>
+                <w:szCs w:val="26"/>
+              </w:rPr>
+            </w:pPr>
+            <w:r>
+              <w:rPr>
+                <w:rFonts w:ascii="Calibri" w:eastAsia="Calibri" w:hAnsi="Calibri" w:cs="Calibri"/>
+                <w:b/>
                 <w:sz w:val="26"/>
                 <w:szCs w:val="26"/>
               </w:rPr>
@@ -1539,7 +1541,7 @@
                 <w:sz w:val="26"/>
                 <w:szCs w:val="26"/>
               </w:rPr>
-              <w:t>7</w:t>
+              <w:t>0</w:t>
             </w:r>
           </w:p>
         </w:tc>
@@ -2292,7 +2294,7 @@
                 <w:sz w:val="26"/>
                 <w:szCs w:val="26"/>
               </w:rPr>
-              <w:t>RRI</w:t>
+              <w:t>RRJ</w:t>
             </w:r>
           </w:p>
         </w:tc>
@@ -2836,7 +2838,7 @@
                 <w:sz w:val="26"/>
                 <w:szCs w:val="26"/>
               </w:rPr>
-              <w:t>B193</w:t>
+              <w:t>DISC1</w:t>
             </w:r>
           </w:p>
         </w:tc>
@@ -3065,17 +3067,19 @@
               <w:jc w:val="center"/>
               <w:rPr>
                 <w:rFonts w:ascii="Calibri" w:eastAsia="Calibri" w:hAnsi="Calibri" w:cs="Calibri"/>
-                <w:sz w:val="26"/>
-                <w:szCs w:val="26"/>
-              </w:rPr>
-            </w:pPr>
-            <w:r>
-              <w:rPr>
-                <w:rFonts w:ascii="Calibri" w:eastAsia="Calibri" w:hAnsi="Calibri" w:cs="Calibri"/>
-                <w:sz w:val="26"/>
-                <w:szCs w:val="26"/>
-              </w:rPr>
-              <w:t>SGAV</w:t>
+                <w:b/>
+                <w:sz w:val="26"/>
+                <w:szCs w:val="26"/>
+              </w:rPr>
+            </w:pPr>
+            <w:r>
+              <w:rPr>
+                <w:rFonts w:ascii="Calibri" w:eastAsia="Calibri" w:hAnsi="Calibri" w:cs="Calibri"/>
+                <w:b/>
+                <w:sz w:val="26"/>
+                <w:szCs w:val="26"/>
+              </w:rPr>
+              <w:t>NA</w:t>
             </w:r>
           </w:p>
         </w:tc>
@@ -3100,6 +3104,7 @@
               <w:jc w:val="center"/>
               <w:rPr>
                 <w:rFonts w:ascii="Calibri" w:eastAsia="Calibri" w:hAnsi="Calibri" w:cs="Calibri"/>
+                <w:b/>
                 <w:sz w:val="26"/>
                 <w:szCs w:val="26"/>
               </w:rPr>
@@ -3127,10 +3132,20 @@
               <w:jc w:val="center"/>
               <w:rPr>
                 <w:rFonts w:ascii="Calibri" w:eastAsia="Calibri" w:hAnsi="Calibri" w:cs="Calibri"/>
-                <w:sz w:val="26"/>
-                <w:szCs w:val="26"/>
-              </w:rPr>
-            </w:pPr>
+                <w:b/>
+                <w:sz w:val="26"/>
+                <w:szCs w:val="26"/>
+              </w:rPr>
+            </w:pPr>
+            <w:r>
+              <w:rPr>
+                <w:rFonts w:ascii="Calibri" w:eastAsia="Calibri" w:hAnsi="Calibri" w:cs="Calibri"/>
+                <w:b/>
+                <w:sz w:val="26"/>
+                <w:szCs w:val="26"/>
+              </w:rPr>
+              <w:t>NA</w:t>
+            </w:r>
           </w:p>
         </w:tc>
         <w:tc>
@@ -3313,7 +3328,7 @@
                 <w:sz w:val="26"/>
                 <w:szCs w:val="26"/>
               </w:rPr>
-              <w:t>BPB</w:t>
+              <w:t>FOSSIL</w:t>
             </w:r>
           </w:p>
         </w:tc>
@@ -3370,6 +3385,8 @@
                 <w:szCs w:val="26"/>
               </w:rPr>
             </w:pPr>
+            <w:bookmarkStart w:id="0" w:name="_GoBack"/>
+            <w:bookmarkEnd w:id="0"/>
           </w:p>
         </w:tc>
         <w:tc>
@@ -3534,17 +3551,18 @@
               <w:jc w:val="center"/>
               <w:rPr>
                 <w:rFonts w:ascii="Calibri" w:eastAsia="Calibri" w:hAnsi="Calibri" w:cs="Calibri"/>
-                <w:sz w:val="26"/>
-                <w:szCs w:val="26"/>
-              </w:rPr>
-            </w:pPr>
-            <w:r>
-              <w:rPr>
-                <w:rFonts w:ascii="Calibri" w:eastAsia="Calibri" w:hAnsi="Calibri" w:cs="Calibri"/>
                 <w:b/>
                 <w:sz w:val="26"/>
                 <w:szCs w:val="26"/>
               </w:rPr>
+            </w:pPr>
+            <w:r>
+              <w:rPr>
+                <w:rFonts w:ascii="Calibri" w:eastAsia="Calibri" w:hAnsi="Calibri" w:cs="Calibri"/>
+                <w:b/>
+                <w:sz w:val="26"/>
+                <w:szCs w:val="26"/>
+              </w:rPr>
               <w:t>NA</w:t>
             </w:r>
           </w:p>
@@ -3570,6 +3588,7 @@
               <w:jc w:val="center"/>
               <w:rPr>
                 <w:rFonts w:ascii="Calibri" w:eastAsia="Calibri" w:hAnsi="Calibri" w:cs="Calibri"/>
+                <w:b/>
                 <w:sz w:val="26"/>
                 <w:szCs w:val="26"/>
               </w:rPr>
@@ -3597,10 +3616,20 @@
               <w:jc w:val="center"/>
               <w:rPr>
                 <w:rFonts w:ascii="Calibri" w:eastAsia="Calibri" w:hAnsi="Calibri" w:cs="Calibri"/>
-                <w:sz w:val="26"/>
-                <w:szCs w:val="26"/>
-              </w:rPr>
-            </w:pPr>
+                <w:b/>
+                <w:sz w:val="26"/>
+                <w:szCs w:val="26"/>
+              </w:rPr>
+            </w:pPr>
+            <w:r>
+              <w:rPr>
+                <w:rFonts w:ascii="Calibri" w:eastAsia="Calibri" w:hAnsi="Calibri" w:cs="Calibri"/>
+                <w:b/>
+                <w:sz w:val="26"/>
+                <w:szCs w:val="26"/>
+              </w:rPr>
+              <w:t>NA</w:t>
+            </w:r>
           </w:p>
         </w:tc>
         <w:tc>
@@ -3769,17 +3798,19 @@
               <w:jc w:val="center"/>
               <w:rPr>
                 <w:rFonts w:ascii="Calibri" w:eastAsia="Calibri" w:hAnsi="Calibri" w:cs="Calibri"/>
-                <w:sz w:val="26"/>
-                <w:szCs w:val="26"/>
-              </w:rPr>
-            </w:pPr>
-            <w:r>
-              <w:rPr>
-                <w:rFonts w:ascii="Calibri" w:eastAsia="Calibri" w:hAnsi="Calibri" w:cs="Calibri"/>
-                <w:sz w:val="26"/>
-                <w:szCs w:val="26"/>
-              </w:rPr>
-              <w:t>BPB</w:t>
+                <w:b/>
+                <w:sz w:val="26"/>
+                <w:szCs w:val="26"/>
+              </w:rPr>
+            </w:pPr>
+            <w:r>
+              <w:rPr>
+                <w:rFonts w:ascii="Calibri" w:eastAsia="Calibri" w:hAnsi="Calibri" w:cs="Calibri"/>
+                <w:b/>
+                <w:sz w:val="26"/>
+                <w:szCs w:val="26"/>
+              </w:rPr>
+              <w:t>NA</w:t>
             </w:r>
           </w:p>
         </w:tc>
@@ -3804,6 +3835,7 @@
               <w:jc w:val="center"/>
               <w:rPr>
                 <w:rFonts w:ascii="Calibri" w:eastAsia="Calibri" w:hAnsi="Calibri" w:cs="Calibri"/>
+                <w:b/>
                 <w:sz w:val="26"/>
                 <w:szCs w:val="26"/>
               </w:rPr>
@@ -3831,10 +3863,20 @@
               <w:jc w:val="center"/>
               <w:rPr>
                 <w:rFonts w:ascii="Calibri" w:eastAsia="Calibri" w:hAnsi="Calibri" w:cs="Calibri"/>
-                <w:sz w:val="26"/>
-                <w:szCs w:val="26"/>
-              </w:rPr>
-            </w:pPr>
+                <w:b/>
+                <w:sz w:val="26"/>
+                <w:szCs w:val="26"/>
+              </w:rPr>
+            </w:pPr>
+            <w:r>
+              <w:rPr>
+                <w:rFonts w:ascii="Calibri" w:eastAsia="Calibri" w:hAnsi="Calibri" w:cs="Calibri"/>
+                <w:b/>
+                <w:sz w:val="26"/>
+                <w:szCs w:val="26"/>
+              </w:rPr>
+              <w:t>NA</w:t>
+            </w:r>
           </w:p>
         </w:tc>
         <w:tc>
@@ -5262,7 +5304,7 @@
                 <w:sz w:val="26"/>
                 <w:szCs w:val="26"/>
               </w:rPr>
-              <w:t>ICP</w:t>
+              <w:t>UDAY</w:t>
             </w:r>
           </w:p>
         </w:tc>
@@ -5489,7 +5531,7 @@
                 <w:sz w:val="26"/>
                 <w:szCs w:val="26"/>
               </w:rPr>
-              <w:t>SHP</w:t>
+              <w:t>SHAKTI</w:t>
             </w:r>
           </w:p>
         </w:tc>
@@ -5716,7 +5758,7 @@
                 <w:sz w:val="26"/>
                 <w:szCs w:val="26"/>
               </w:rPr>
-              <w:t>SLQ</w:t>
+              <w:t>RATNA</w:t>
             </w:r>
           </w:p>
         </w:tc>
@@ -5943,7 +5985,15 @@
                 <w:sz w:val="26"/>
                 <w:szCs w:val="26"/>
               </w:rPr>
-              <w:t>MNW</w:t>
+              <w:t>FD9</w:t>
+            </w:r>
+            <w:r>
+              <w:rPr>
+                <w:rFonts w:ascii="Calibri" w:eastAsia="Calibri" w:hAnsi="Calibri" w:cs="Calibri"/>
+                <w:sz w:val="26"/>
+                <w:szCs w:val="26"/>
+              </w:rPr>
+              <w:t xml:space="preserve"> </w:t>
             </w:r>
           </w:p>
         </w:tc>
@@ -6177,7 +6227,7 @@
                 <w:sz w:val="26"/>
                 <w:szCs w:val="26"/>
               </w:rPr>
-              <w:t>NQO</w:t>
+              <w:t>ADM11</w:t>
             </w:r>
           </w:p>
         </w:tc>
@@ -6404,7 +6454,7 @@
                 <w:sz w:val="26"/>
                 <w:szCs w:val="26"/>
               </w:rPr>
-              <w:t>SJOT</w:t>
+              <w:t>DVDR</w:t>
             </w:r>
           </w:p>
         </w:tc>
@@ -6524,22 +6574,30 @@
                 <w:b/>
                 <w:sz w:val="24"/>
               </w:rPr>
-              <w:t>WAITING:</w:t>
-            </w:r>
-            <w:r>
-              <w:rPr>
-                <w:rFonts w:ascii="Calibri" w:eastAsia="Calibri" w:hAnsi="Calibri" w:cs="Calibri"/>
-                <w:b/>
+              <w:t xml:space="preserve">WAITING: </w:t>
+            </w:r>
+            <w:r>
+              <w:rPr>
+                <w:rFonts w:ascii="Calibri" w:eastAsia="Calibri" w:hAnsi="Calibri" w:cs="Calibri"/>
                 <w:sz w:val="24"/>
               </w:rPr>
-              <w:t xml:space="preserve"> </w:t>
-            </w:r>
+              <w:t>AS2</w:t>
+            </w:r>
+            <w:proofErr w:type="gramStart"/>
             <w:r>
               <w:rPr>
                 <w:rFonts w:ascii="Calibri" w:eastAsia="Calibri" w:hAnsi="Calibri" w:cs="Calibri"/>
                 <w:sz w:val="24"/>
               </w:rPr>
-              <w:t>AD9</w:t>
+              <w:t>,SMRT</w:t>
+            </w:r>
+            <w:proofErr w:type="gramEnd"/>
+            <w:r>
+              <w:rPr>
+                <w:rFonts w:ascii="Calibri" w:eastAsia="Calibri" w:hAnsi="Calibri" w:cs="Calibri"/>
+                <w:sz w:val="24"/>
+              </w:rPr>
+              <w:t>.</w:t>
             </w:r>
           </w:p>
         </w:tc>
@@ -7174,6 +7232,14 @@
                 <w:szCs w:val="26"/>
               </w:rPr>
             </w:pPr>
+            <w:r>
+              <w:rPr>
+                <w:rFonts w:ascii="Calibri" w:eastAsia="Calibri" w:hAnsi="Calibri" w:cs="Calibri"/>
+                <w:sz w:val="26"/>
+                <w:szCs w:val="26"/>
+              </w:rPr>
+              <w:t>JYOTI</w:t>
+            </w:r>
           </w:p>
         </w:tc>
         <w:tc>
@@ -7396,6 +7462,14 @@
                 <w:szCs w:val="26"/>
               </w:rPr>
             </w:pPr>
+            <w:r>
+              <w:rPr>
+                <w:rFonts w:ascii="Calibri" w:eastAsia="Calibri" w:hAnsi="Calibri" w:cs="Calibri"/>
+                <w:sz w:val="26"/>
+                <w:szCs w:val="26"/>
+              </w:rPr>
+              <w:t>CHARU</w:t>
+            </w:r>
           </w:p>
         </w:tc>
         <w:tc>
@@ -7619,6 +7693,14 @@
                 <w:szCs w:val="26"/>
               </w:rPr>
             </w:pPr>
+            <w:r>
+              <w:rPr>
+                <w:rFonts w:ascii="Calibri" w:eastAsia="Calibri" w:hAnsi="Calibri" w:cs="Calibri"/>
+                <w:sz w:val="26"/>
+                <w:szCs w:val="26"/>
+              </w:rPr>
+              <w:t>L/O</w:t>
+            </w:r>
           </w:p>
         </w:tc>
         <w:tc>
@@ -8143,10 +8225,10 @@
     </w:pPr>
     <w:r>
       <w:object w:dxaOrig="1188" w:dyaOrig="900">
-        <v:rect id="_x0000_i1025" style="width:55.5pt;height:39pt" o:ole="" o:preferrelative="t" stroked="f">
+        <v:rect id="_x0000_i1025" style="width:55.1pt;height:39.1pt" o:ole="" o:preferrelative="t" stroked="f">
           <v:imagedata r:id="rId1" o:title=""/>
         </v:rect>
-        <o:OLEObject Type="Embed" ProgID="StaticMetafile" ShapeID="_x0000_i1025" DrawAspect="Content" ObjectID="_1851170533" r:id="rId2"/>
+        <o:OLEObject Type="Embed" ProgID="StaticMetafile" ShapeID="_x0000_i1025" DrawAspect="Content" ObjectID="_1851254244" r:id="rId2"/>
       </w:object>
     </w:r>
     <w:r>
@@ -8190,7 +8272,7 @@
         <w:sz w:val="26"/>
         <w:szCs w:val="26"/>
       </w:rPr>
-      <w:t>8</w:t>
+      <w:t>9</w:t>
     </w:r>
     <w:r>
       <w:rPr>
@@ -8210,7 +8292,7 @@
         <w:sz w:val="26"/>
         <w:szCs w:val="26"/>
       </w:rPr>
-      <w:t>FRI</w:t>
+      <w:t>SATUR</w:t>
     </w:r>
     <w:r>
       <w:rPr>

</xml_diff>

<commit_message>
Sync - 2026-09-18 17:04
</commit_message>
<xml_diff>
--- a/files/Daily_Helicopter_Schedule.docx
+++ b/files/Daily_Helicopter_Schedule.docx
@@ -1114,14 +1114,6 @@
               </w:rPr>
               <w:t xml:space="preserve">SF (D) </w:t>
             </w:r>
-            <w:r>
-              <w:rPr>
-                <w:rFonts w:ascii="Calibri" w:eastAsia="Calibri" w:hAnsi="Calibri" w:cs="Calibri"/>
-                <w:sz w:val="26"/>
-                <w:szCs w:val="26"/>
-              </w:rPr>
-              <w:t>+ NF (D)</w:t>
-            </w:r>
           </w:p>
         </w:tc>
         <w:tc>
@@ -1155,7 +1147,7 @@
                 <w:sz w:val="26"/>
                 <w:szCs w:val="26"/>
               </w:rPr>
-              <w:t>GVHL 412</w:t>
+              <w:t>GVHL 169</w:t>
             </w:r>
           </w:p>
         </w:tc>
@@ -1227,6 +1219,258 @@
               </w:rPr>
               <w:t>05</w:t>
             </w:r>
+          </w:p>
+        </w:tc>
+      </w:tr>
+      <w:tr>
+        <w:trPr>
+          <w:trHeight w:val="321"/>
+        </w:trPr>
+        <w:tc>
+          <w:tcPr>
+            <w:tcW w:w="706" w:type="dxa"/>
+            <w:tcBorders>
+              <w:top w:val="single" w:sz="4" w:space="0" w:color="000000"/>
+              <w:left w:val="single" w:sz="4" w:space="0" w:color="000000"/>
+              <w:bottom w:val="single" w:sz="4" w:space="0" w:color="000000"/>
+              <w:right w:val="single" w:sz="4" w:space="0" w:color="000000"/>
+            </w:tcBorders>
+            <w:shd w:val="clear" w:color="auto" w:fill="auto"/>
+            <w:tcMar>
+              <w:left w:w="108" w:type="dxa"/>
+              <w:right w:w="108" w:type="dxa"/>
+            </w:tcMar>
+          </w:tcPr>
+          <w:p>
+            <w:pPr>
+              <w:spacing w:after="0" w:line="240" w:lineRule="auto"/>
+              <w:jc w:val="center"/>
+              <w:rPr>
+                <w:rFonts w:ascii="Calibri" w:eastAsia="Calibri" w:hAnsi="Calibri" w:cs="Calibri"/>
+                <w:sz w:val="26"/>
+                <w:szCs w:val="26"/>
+              </w:rPr>
+            </w:pPr>
+            <w:r>
+              <w:rPr>
+                <w:rFonts w:ascii="Calibri" w:eastAsia="Calibri" w:hAnsi="Calibri" w:cs="Calibri"/>
+                <w:sz w:val="26"/>
+                <w:szCs w:val="26"/>
+              </w:rPr>
+              <w:t>4</w:t>
+            </w:r>
+          </w:p>
+        </w:tc>
+        <w:tc>
+          <w:tcPr>
+            <w:tcW w:w="1555" w:type="dxa"/>
+            <w:tcBorders>
+              <w:top w:val="single" w:sz="4" w:space="0" w:color="000000"/>
+              <w:left w:val="single" w:sz="4" w:space="0" w:color="000000"/>
+              <w:bottom w:val="single" w:sz="4" w:space="0" w:color="000000"/>
+              <w:right w:val="single" w:sz="4" w:space="0" w:color="000000"/>
+            </w:tcBorders>
+            <w:shd w:val="clear" w:color="auto" w:fill="auto"/>
+            <w:tcMar>
+              <w:left w:w="108" w:type="dxa"/>
+              <w:right w:w="108" w:type="dxa"/>
+            </w:tcMar>
+          </w:tcPr>
+          <w:p>
+            <w:pPr>
+              <w:spacing w:after="0" w:line="240" w:lineRule="auto"/>
+              <w:jc w:val="center"/>
+              <w:rPr>
+                <w:rFonts w:ascii="Calibri" w:eastAsia="Calibri" w:hAnsi="Calibri" w:cs="Calibri"/>
+                <w:sz w:val="26"/>
+                <w:szCs w:val="26"/>
+              </w:rPr>
+            </w:pPr>
+            <w:r>
+              <w:rPr>
+                <w:rFonts w:ascii="Calibri" w:eastAsia="Calibri" w:hAnsi="Calibri" w:cs="Calibri"/>
+                <w:sz w:val="26"/>
+                <w:szCs w:val="26"/>
+              </w:rPr>
+              <w:t>06:30</w:t>
+            </w:r>
+          </w:p>
+        </w:tc>
+        <w:tc>
+          <w:tcPr>
+            <w:tcW w:w="1413" w:type="dxa"/>
+            <w:tcBorders>
+              <w:top w:val="single" w:sz="4" w:space="0" w:color="000000"/>
+              <w:left w:val="single" w:sz="4" w:space="0" w:color="000000"/>
+              <w:bottom w:val="single" w:sz="4" w:space="0" w:color="000000"/>
+              <w:right w:val="single" w:sz="4" w:space="0" w:color="000000"/>
+            </w:tcBorders>
+            <w:shd w:val="clear" w:color="auto" w:fill="auto"/>
+            <w:tcMar>
+              <w:left w:w="108" w:type="dxa"/>
+              <w:right w:w="108" w:type="dxa"/>
+            </w:tcMar>
+          </w:tcPr>
+          <w:p>
+            <w:pPr>
+              <w:spacing w:after="0" w:line="240" w:lineRule="auto"/>
+              <w:jc w:val="center"/>
+              <w:rPr>
+                <w:rFonts w:ascii="Calibri" w:eastAsia="Calibri" w:hAnsi="Calibri" w:cs="Calibri"/>
+                <w:sz w:val="26"/>
+                <w:szCs w:val="26"/>
+              </w:rPr>
+            </w:pPr>
+            <w:r>
+              <w:rPr>
+                <w:rFonts w:ascii="Calibri" w:eastAsia="Calibri" w:hAnsi="Calibri" w:cs="Calibri"/>
+                <w:sz w:val="26"/>
+                <w:szCs w:val="26"/>
+              </w:rPr>
+              <w:t>08:15</w:t>
+            </w:r>
+          </w:p>
+        </w:tc>
+        <w:tc>
+          <w:tcPr>
+            <w:tcW w:w="2442" w:type="dxa"/>
+            <w:tcBorders>
+              <w:top w:val="single" w:sz="4" w:space="0" w:color="000000"/>
+              <w:left w:val="single" w:sz="4" w:space="0" w:color="000000"/>
+              <w:bottom w:val="single" w:sz="4" w:space="0" w:color="000000"/>
+              <w:right w:val="single" w:sz="4" w:space="0" w:color="000000"/>
+            </w:tcBorders>
+            <w:shd w:val="clear" w:color="auto" w:fill="auto"/>
+            <w:tcMar>
+              <w:left w:w="108" w:type="dxa"/>
+              <w:right w:w="108" w:type="dxa"/>
+            </w:tcMar>
+          </w:tcPr>
+          <w:p>
+            <w:pPr>
+              <w:spacing w:after="0" w:line="240" w:lineRule="auto"/>
+              <w:jc w:val="center"/>
+              <w:rPr>
+                <w:rFonts w:ascii="Calibri" w:eastAsia="Calibri" w:hAnsi="Calibri" w:cs="Calibri"/>
+                <w:sz w:val="26"/>
+                <w:szCs w:val="26"/>
+              </w:rPr>
+            </w:pPr>
+            <w:r>
+              <w:rPr>
+                <w:rFonts w:ascii="Calibri" w:eastAsia="Calibri" w:hAnsi="Calibri" w:cs="Calibri"/>
+                <w:sz w:val="26"/>
+                <w:szCs w:val="26"/>
+              </w:rPr>
+              <w:t>NF[D]</w:t>
+            </w:r>
+          </w:p>
+        </w:tc>
+        <w:tc>
+          <w:tcPr>
+            <w:tcW w:w="1504" w:type="dxa"/>
+            <w:tcBorders>
+              <w:top w:val="single" w:sz="4" w:space="0" w:color="000000"/>
+              <w:left w:val="single" w:sz="4" w:space="0" w:color="000000"/>
+              <w:bottom w:val="single" w:sz="4" w:space="0" w:color="000000"/>
+              <w:right w:val="single" w:sz="4" w:space="0" w:color="000000"/>
+            </w:tcBorders>
+            <w:shd w:val="clear" w:color="000000" w:fill="FFFFFF"/>
+            <w:tcMar>
+              <w:left w:w="108" w:type="dxa"/>
+              <w:right w:w="108" w:type="dxa"/>
+            </w:tcMar>
+          </w:tcPr>
+          <w:p>
+            <w:pPr>
+              <w:spacing w:after="0" w:line="240" w:lineRule="auto"/>
+              <w:jc w:val="center"/>
+              <w:rPr>
+                <w:rFonts w:ascii="Calibri" w:eastAsia="Calibri" w:hAnsi="Calibri" w:cs="Calibri"/>
+                <w:sz w:val="26"/>
+                <w:szCs w:val="26"/>
+              </w:rPr>
+            </w:pPr>
+            <w:r>
+              <w:rPr>
+                <w:rFonts w:ascii="Calibri" w:eastAsia="Calibri" w:hAnsi="Calibri" w:cs="Calibri"/>
+                <w:sz w:val="26"/>
+                <w:szCs w:val="26"/>
+              </w:rPr>
+              <w:t>GVHL 169</w:t>
+            </w:r>
+          </w:p>
+        </w:tc>
+        <w:tc>
+          <w:tcPr>
+            <w:tcW w:w="1261" w:type="dxa"/>
+            <w:tcBorders>
+              <w:top w:val="single" w:sz="4" w:space="0" w:color="000000"/>
+              <w:left w:val="single" w:sz="4" w:space="0" w:color="000000"/>
+              <w:bottom w:val="single" w:sz="4" w:space="0" w:color="000000"/>
+              <w:right w:val="single" w:sz="4" w:space="0" w:color="000000"/>
+            </w:tcBorders>
+            <w:shd w:val="clear" w:color="000000" w:fill="FFFFFF"/>
+            <w:tcMar>
+              <w:left w:w="108" w:type="dxa"/>
+              <w:right w:w="108" w:type="dxa"/>
+            </w:tcMar>
+          </w:tcPr>
+          <w:p>
+            <w:pPr>
+              <w:spacing w:after="0" w:line="240" w:lineRule="auto"/>
+              <w:jc w:val="center"/>
+              <w:rPr>
+                <w:rFonts w:ascii="Calibri" w:eastAsia="Calibri" w:hAnsi="Calibri" w:cs="Calibri"/>
+                <w:sz w:val="26"/>
+                <w:szCs w:val="26"/>
+              </w:rPr>
+            </w:pPr>
+            <w:r>
+              <w:rPr>
+                <w:rFonts w:ascii="Calibri" w:eastAsia="Calibri" w:hAnsi="Calibri" w:cs="Calibri"/>
+                <w:sz w:val="26"/>
+                <w:szCs w:val="26"/>
+              </w:rPr>
+              <w:t>RRN</w:t>
+            </w:r>
+          </w:p>
+        </w:tc>
+        <w:tc>
+          <w:tcPr>
+            <w:tcW w:w="1270" w:type="dxa"/>
+            <w:tcBorders>
+              <w:top w:val="single" w:sz="4" w:space="0" w:color="000000"/>
+              <w:left w:val="single" w:sz="4" w:space="0" w:color="000000"/>
+              <w:bottom w:val="single" w:sz="4" w:space="0" w:color="000000"/>
+              <w:right w:val="single" w:sz="4" w:space="0" w:color="000000"/>
+            </w:tcBorders>
+            <w:shd w:val="clear" w:color="auto" w:fill="auto"/>
+            <w:tcMar>
+              <w:left w:w="108" w:type="dxa"/>
+              <w:right w:w="108" w:type="dxa"/>
+            </w:tcMar>
+          </w:tcPr>
+          <w:p>
+            <w:pPr>
+              <w:spacing w:after="0" w:line="240" w:lineRule="auto"/>
+              <w:jc w:val="center"/>
+              <w:rPr>
+                <w:rFonts w:ascii="Calibri" w:eastAsia="Calibri" w:hAnsi="Calibri" w:cs="Calibri"/>
+                <w:sz w:val="26"/>
+                <w:szCs w:val="26"/>
+              </w:rPr>
+            </w:pPr>
+            <w:r>
+              <w:rPr>
+                <w:rFonts w:ascii="Calibri" w:eastAsia="Calibri" w:hAnsi="Calibri" w:cs="Calibri"/>
+                <w:sz w:val="26"/>
+                <w:szCs w:val="26"/>
+              </w:rPr>
+              <w:t>05</w:t>
+            </w:r>
+            <w:bookmarkStart w:id="0" w:name="_GoBack"/>
+            <w:bookmarkEnd w:id="0"/>
           </w:p>
         </w:tc>
       </w:tr>
@@ -3385,8 +3629,6 @@
                 <w:szCs w:val="26"/>
               </w:rPr>
             </w:pPr>
-            <w:bookmarkStart w:id="0" w:name="_GoBack"/>
-            <w:bookmarkEnd w:id="0"/>
           </w:p>
         </w:tc>
         <w:tc>
@@ -5985,15 +6227,7 @@
                 <w:sz w:val="26"/>
                 <w:szCs w:val="26"/>
               </w:rPr>
-              <w:t>FD9</w:t>
-            </w:r>
-            <w:r>
-              <w:rPr>
-                <w:rFonts w:ascii="Calibri" w:eastAsia="Calibri" w:hAnsi="Calibri" w:cs="Calibri"/>
-                <w:sz w:val="26"/>
-                <w:szCs w:val="26"/>
-              </w:rPr>
-              <w:t xml:space="preserve"> </w:t>
+              <w:t xml:space="preserve">FD9 </w:t>
             </w:r>
           </w:p>
         </w:tc>
@@ -8225,10 +8459,10 @@
     </w:pPr>
     <w:r>
       <w:object w:dxaOrig="1188" w:dyaOrig="900">
-        <v:rect id="_x0000_i1025" style="width:55.1pt;height:39.1pt" o:ole="" o:preferrelative="t" stroked="f">
+        <v:rect id="_x0000_i1025" style="width:55.4pt;height:38.75pt" o:ole="" o:preferrelative="t" stroked="f">
           <v:imagedata r:id="rId1" o:title=""/>
         </v:rect>
-        <o:OLEObject Type="Embed" ProgID="StaticMetafile" ShapeID="_x0000_i1025" DrawAspect="Content" ObjectID="_1851254244" r:id="rId2"/>
+        <o:OLEObject Type="Embed" ProgID="StaticMetafile" ShapeID="_x0000_i1025" DrawAspect="Content" ObjectID="_1851255355" r:id="rId2"/>
       </w:object>
     </w:r>
     <w:r>

</xml_diff>

<commit_message>
Sync - 2026-09-20 17:40
</commit_message>
<xml_diff>
--- a/files/Daily_Helicopter_Schedule.docx
+++ b/files/Daily_Helicopter_Schedule.docx
@@ -1112,7 +1112,39 @@
                 <w:sz w:val="26"/>
                 <w:szCs w:val="26"/>
               </w:rPr>
-              <w:t>+NF[D]</w:t>
+              <w:t>+NF</w:t>
+            </w:r>
+            <w:r>
+              <w:rPr>
+                <w:rFonts w:ascii="Calibri" w:eastAsia="Calibri" w:hAnsi="Calibri" w:cs="Calibri"/>
+                <w:sz w:val="26"/>
+                <w:szCs w:val="26"/>
+              </w:rPr>
+              <w:t xml:space="preserve"> </w:t>
+            </w:r>
+            <w:r>
+              <w:rPr>
+                <w:rFonts w:ascii="Calibri" w:eastAsia="Calibri" w:hAnsi="Calibri" w:cs="Calibri"/>
+                <w:sz w:val="26"/>
+                <w:szCs w:val="26"/>
+              </w:rPr>
+              <w:t>(</w:t>
+            </w:r>
+            <w:r>
+              <w:rPr>
+                <w:rFonts w:ascii="Calibri" w:eastAsia="Calibri" w:hAnsi="Calibri" w:cs="Calibri"/>
+                <w:sz w:val="26"/>
+                <w:szCs w:val="26"/>
+              </w:rPr>
+              <w:t>D</w:t>
+            </w:r>
+            <w:r>
+              <w:rPr>
+                <w:rFonts w:ascii="Calibri" w:eastAsia="Calibri" w:hAnsi="Calibri" w:cs="Calibri"/>
+                <w:sz w:val="26"/>
+                <w:szCs w:val="26"/>
+              </w:rPr>
+              <w:t>)</w:t>
             </w:r>
           </w:p>
         </w:tc>
@@ -2830,7 +2862,7 @@
                 <w:sz w:val="26"/>
                 <w:szCs w:val="26"/>
               </w:rPr>
-              <w:t xml:space="preserve"> SMRT</w:t>
+              <w:t>SGAV B\L</w:t>
             </w:r>
           </w:p>
         </w:tc>
@@ -3311,7 +3343,7 @@
                 <w:sz w:val="26"/>
                 <w:szCs w:val="26"/>
               </w:rPr>
-              <w:t xml:space="preserve">ADM9 </w:t>
+              <w:t>BPA</w:t>
             </w:r>
           </w:p>
         </w:tc>
@@ -3780,7 +3812,7 @@
                 <w:sz w:val="26"/>
                 <w:szCs w:val="26"/>
               </w:rPr>
-              <w:t>GAURAV</w:t>
+              <w:t>BPA</w:t>
             </w:r>
           </w:p>
         </w:tc>
@@ -4298,7 +4330,7 @@
                 <w:sz w:val="26"/>
                 <w:szCs w:val="26"/>
               </w:rPr>
-              <w:t>FOSSIL</w:t>
+              <w:t>SUDA</w:t>
             </w:r>
           </w:p>
         </w:tc>
@@ -4761,7 +4793,7 @@
                 <w:sz w:val="26"/>
                 <w:szCs w:val="26"/>
               </w:rPr>
-              <w:t>VKDN1</w:t>
+              <w:t>WIN</w:t>
             </w:r>
           </w:p>
         </w:tc>
@@ -4995,8 +5027,10 @@
                 <w:sz w:val="26"/>
                 <w:szCs w:val="26"/>
               </w:rPr>
-              <w:t>ADM10</w:t>
-            </w:r>
+              <w:t>AD10</w:t>
+            </w:r>
+            <w:bookmarkStart w:id="0" w:name="_GoBack"/>
+            <w:bookmarkEnd w:id="0"/>
           </w:p>
         </w:tc>
         <w:tc>
@@ -5277,7 +5311,7 @@
                 <w:sz w:val="26"/>
                 <w:szCs w:val="26"/>
               </w:rPr>
-              <w:t>ARMADA1</w:t>
+              <w:t>SRAT</w:t>
             </w:r>
           </w:p>
         </w:tc>
@@ -5333,8 +5367,6 @@
                 <w:szCs w:val="26"/>
               </w:rPr>
             </w:pPr>
-            <w:bookmarkStart w:id="0" w:name="_GoBack"/>
-            <w:bookmarkEnd w:id="0"/>
           </w:p>
         </w:tc>
         <w:tc>
@@ -5506,7 +5538,7 @@
                 <w:sz w:val="26"/>
                 <w:szCs w:val="26"/>
               </w:rPr>
-              <w:t>CHITRA</w:t>
+              <w:t>SLQ</w:t>
             </w:r>
           </w:p>
         </w:tc>
@@ -5733,7 +5765,7 @@
                 <w:sz w:val="26"/>
                 <w:szCs w:val="26"/>
               </w:rPr>
-              <w:t>ABAN4</w:t>
+              <w:t>AS2</w:t>
             </w:r>
           </w:p>
         </w:tc>
@@ -5960,7 +5992,7 @@
                 <w:sz w:val="26"/>
                 <w:szCs w:val="26"/>
               </w:rPr>
-              <w:t>JTA</w:t>
+              <w:t>MNW</w:t>
             </w:r>
           </w:p>
         </w:tc>
@@ -6194,7 +6226,7 @@
                 <w:sz w:val="26"/>
                 <w:szCs w:val="26"/>
               </w:rPr>
-              <w:t>TRI-2</w:t>
+              <w:t>NQO</w:t>
             </w:r>
           </w:p>
         </w:tc>
@@ -6421,7 +6453,7 @@
                 <w:sz w:val="26"/>
                 <w:szCs w:val="26"/>
               </w:rPr>
-              <w:t>VKDN2</w:t>
+              <w:t>SSAK</w:t>
             </w:r>
           </w:p>
         </w:tc>
@@ -6542,22 +6574,6 @@
                 <w:sz w:val="24"/>
               </w:rPr>
               <w:t xml:space="preserve">WAITING: </w:t>
-            </w:r>
-            <w:proofErr w:type="gramStart"/>
-            <w:r>
-              <w:rPr>
-                <w:rFonts w:ascii="Calibri" w:eastAsia="Calibri" w:hAnsi="Calibri" w:cs="Calibri"/>
-                <w:sz w:val="24"/>
-              </w:rPr>
-              <w:t>DISC1 ,ABN8,FD9</w:t>
-            </w:r>
-            <w:proofErr w:type="gramEnd"/>
-            <w:r>
-              <w:rPr>
-                <w:rFonts w:ascii="Calibri" w:eastAsia="Calibri" w:hAnsi="Calibri" w:cs="Calibri"/>
-                <w:sz w:val="24"/>
-              </w:rPr>
-              <w:t>.</w:t>
             </w:r>
           </w:p>
         </w:tc>
@@ -7192,14 +7208,6 @@
                 <w:szCs w:val="26"/>
               </w:rPr>
             </w:pPr>
-            <w:r>
-              <w:rPr>
-                <w:rFonts w:ascii="Calibri" w:eastAsia="Calibri" w:hAnsi="Calibri" w:cs="Calibri"/>
-                <w:sz w:val="26"/>
-                <w:szCs w:val="26"/>
-              </w:rPr>
-              <w:t>TAPTI[D]</w:t>
-            </w:r>
           </w:p>
         </w:tc>
         <w:tc>
@@ -8169,10 +8177,10 @@
     </w:pPr>
     <w:r>
       <w:object w:dxaOrig="1188" w:dyaOrig="900">
-        <v:rect id="_x0000_i1025" style="width:55.9pt;height:39.05pt" o:ole="" o:preferrelative="t" stroked="f">
+        <v:rect id="_x0000_i1025" style="width:56.25pt;height:39pt" o:ole="" o:preferrelative="t" stroked="f">
           <v:imagedata r:id="rId1" o:title=""/>
         </v:rect>
-        <o:OLEObject Type="Embed" ProgID="StaticMetafile" ShapeID="_x0000_i1025" DrawAspect="Content" ObjectID="_1851341613" r:id="rId2"/>
+        <o:OLEObject Type="Embed" ProgID="StaticMetafile" ShapeID="_x0000_i1025" DrawAspect="Content" ObjectID="_1851429325" r:id="rId2"/>
       </w:object>
     </w:r>
     <w:r>
@@ -8206,7 +8214,17 @@
         <w:sz w:val="26"/>
         <w:szCs w:val="26"/>
       </w:rPr>
-      <w:t>20</w:t>
+      <w:t>2</w:t>
+    </w:r>
+    <w:r>
+      <w:rPr>
+        <w:rFonts w:ascii="Times New Roman" w:hAnsi="Times New Roman" w:cs="Times New Roman"/>
+        <w:b/>
+        <w:color w:val="000000" w:themeColor="text1"/>
+        <w:sz w:val="26"/>
+        <w:szCs w:val="26"/>
+      </w:rPr>
+      <w:t>1</w:t>
     </w:r>
     <w:r>
       <w:rPr>
@@ -8226,7 +8244,7 @@
         <w:sz w:val="26"/>
         <w:szCs w:val="26"/>
       </w:rPr>
-      <w:t>SUN</w:t>
+      <w:t>MON</w:t>
     </w:r>
     <w:r>
       <w:rPr>

</xml_diff>

<commit_message>
Sync - 2026-09-20 18:10
</commit_message>
<xml_diff>
--- a/files/Daily_Helicopter_Schedule.docx
+++ b/files/Daily_Helicopter_Schedule.docx
@@ -5029,8 +5029,6 @@
               </w:rPr>
               <w:t>AD10</w:t>
             </w:r>
-            <w:bookmarkStart w:id="0" w:name="_GoBack"/>
-            <w:bookmarkEnd w:id="0"/>
           </w:p>
         </w:tc>
         <w:tc>
@@ -7208,6 +7206,14 @@
                 <w:szCs w:val="26"/>
               </w:rPr>
             </w:pPr>
+            <w:r>
+              <w:rPr>
+                <w:rFonts w:ascii="Calibri" w:eastAsia="Calibri" w:hAnsi="Calibri" w:cs="Calibri"/>
+                <w:sz w:val="26"/>
+                <w:szCs w:val="26"/>
+              </w:rPr>
+              <w:t>JIND</w:t>
+            </w:r>
           </w:p>
         </w:tc>
         <w:tc>
@@ -7430,6 +7436,16 @@
                 <w:szCs w:val="26"/>
               </w:rPr>
             </w:pPr>
+            <w:r>
+              <w:rPr>
+                <w:rFonts w:ascii="Calibri" w:eastAsia="Calibri" w:hAnsi="Calibri" w:cs="Calibri"/>
+                <w:sz w:val="26"/>
+                <w:szCs w:val="26"/>
+              </w:rPr>
+              <w:t>TCPP CC+ PROD</w:t>
+            </w:r>
+            <w:bookmarkStart w:id="0" w:name="_GoBack"/>
+            <w:bookmarkEnd w:id="0"/>
           </w:p>
         </w:tc>
         <w:tc>
@@ -8180,7 +8196,7 @@
         <v:rect id="_x0000_i1025" style="width:56.25pt;height:39pt" o:ole="" o:preferrelative="t" stroked="f">
           <v:imagedata r:id="rId1" o:title=""/>
         </v:rect>
-        <o:OLEObject Type="Embed" ProgID="StaticMetafile" ShapeID="_x0000_i1025" DrawAspect="Content" ObjectID="_1851429325" r:id="rId2"/>
+        <o:OLEObject Type="Embed" ProgID="StaticMetafile" ShapeID="_x0000_i1025" DrawAspect="Content" ObjectID="_1851431307" r:id="rId2"/>
       </w:object>
     </w:r>
     <w:r>

</xml_diff>

<commit_message>
Sync - 2026-09-21 17:12
</commit_message>
<xml_diff>
--- a/files/Daily_Helicopter_Schedule.docx
+++ b/files/Daily_Helicopter_Schedule.docx
@@ -1214,7 +1214,15 @@
                 <w:sz w:val="26"/>
                 <w:szCs w:val="26"/>
               </w:rPr>
-              <w:t>RRL</w:t>
+              <w:t>RR</w:t>
+            </w:r>
+            <w:r>
+              <w:rPr>
+                <w:rFonts w:ascii="Calibri" w:eastAsia="Calibri" w:hAnsi="Calibri" w:cs="Calibri"/>
+                <w:sz w:val="26"/>
+                <w:szCs w:val="26"/>
+              </w:rPr>
+              <w:t>O</w:t>
             </w:r>
           </w:p>
         </w:tc>
@@ -2859,10 +2867,11 @@
             <w:r>
               <w:rPr>
                 <w:rFonts w:ascii="Calibri" w:eastAsia="Calibri" w:hAnsi="Calibri" w:cs="Calibri"/>
-                <w:sz w:val="26"/>
-                <w:szCs w:val="26"/>
-              </w:rPr>
-              <w:t>SGAV B\L</w:t>
+                <w:b/>
+                <w:sz w:val="26"/>
+                <w:szCs w:val="26"/>
+              </w:rPr>
+              <w:t>NA</w:t>
             </w:r>
           </w:p>
         </w:tc>
@@ -3091,19 +3100,16 @@
               <w:jc w:val="center"/>
               <w:rPr>
                 <w:rFonts w:ascii="Calibri" w:eastAsia="Calibri" w:hAnsi="Calibri" w:cs="Calibri"/>
-                <w:b/>
-                <w:sz w:val="26"/>
-                <w:szCs w:val="26"/>
-              </w:rPr>
-            </w:pPr>
-            <w:r>
-              <w:rPr>
-                <w:rFonts w:ascii="Calibri" w:eastAsia="Calibri" w:hAnsi="Calibri" w:cs="Calibri"/>
-                <w:b/>
-                <w:sz w:val="26"/>
-                <w:szCs w:val="26"/>
-              </w:rPr>
-              <w:t>NA</w:t>
+                <w:sz w:val="26"/>
+                <w:szCs w:val="26"/>
+              </w:rPr>
+            </w:pPr>
+            <w:r>
+              <w:rPr>
+                <w:rFonts w:ascii="Calibri" w:eastAsia="Calibri" w:hAnsi="Calibri" w:cs="Calibri"/>
+                <w:sz w:val="24"/>
+              </w:rPr>
+              <w:t>PANNA</w:t>
             </w:r>
           </w:p>
         </w:tc>
@@ -3340,10 +3346,11 @@
             <w:r>
               <w:rPr>
                 <w:rFonts w:ascii="Calibri" w:eastAsia="Calibri" w:hAnsi="Calibri" w:cs="Calibri"/>
-                <w:sz w:val="26"/>
-                <w:szCs w:val="26"/>
-              </w:rPr>
-              <w:t>BPA</w:t>
+                <w:b/>
+                <w:sz w:val="26"/>
+                <w:szCs w:val="26"/>
+              </w:rPr>
+              <w:t>NA</w:t>
             </w:r>
           </w:p>
         </w:tc>
@@ -3539,7 +3546,17 @@
                 <w:sz w:val="26"/>
                 <w:szCs w:val="26"/>
               </w:rPr>
-              <w:t>11:05</w:t>
+              <w:t>11:0</w:t>
+            </w:r>
+            <w:bookmarkStart w:id="0" w:name="_GoBack"/>
+            <w:bookmarkEnd w:id="0"/>
+            <w:r>
+              <w:rPr>
+                <w:rFonts w:ascii="Calibri" w:eastAsia="Calibri" w:hAnsi="Calibri" w:cs="Calibri"/>
+                <w:sz w:val="26"/>
+                <w:szCs w:val="26"/>
+              </w:rPr>
+              <w:t>5</w:t>
             </w:r>
           </w:p>
         </w:tc>
@@ -3809,10 +3826,11 @@
             <w:r>
               <w:rPr>
                 <w:rFonts w:ascii="Calibri" w:eastAsia="Calibri" w:hAnsi="Calibri" w:cs="Calibri"/>
-                <w:sz w:val="26"/>
-                <w:szCs w:val="26"/>
-              </w:rPr>
-              <w:t>BPA</w:t>
+                <w:b/>
+                <w:sz w:val="26"/>
+                <w:szCs w:val="26"/>
+              </w:rPr>
+              <w:t>NA</w:t>
             </w:r>
           </w:p>
         </w:tc>
@@ -4330,7 +4348,7 @@
                 <w:sz w:val="26"/>
                 <w:szCs w:val="26"/>
               </w:rPr>
-              <w:t>SUDA</w:t>
+              <w:t>SGAV</w:t>
             </w:r>
           </w:p>
         </w:tc>
@@ -4793,7 +4811,7 @@
                 <w:sz w:val="26"/>
                 <w:szCs w:val="26"/>
               </w:rPr>
-              <w:t>WIN</w:t>
+              <w:t>R12A+R13A+HERA</w:t>
             </w:r>
           </w:p>
         </w:tc>
@@ -5027,7 +5045,7 @@
                 <w:sz w:val="26"/>
                 <w:szCs w:val="26"/>
               </w:rPr>
-              <w:t>AD10</w:t>
+              <w:t>BPA</w:t>
             </w:r>
           </w:p>
         </w:tc>
@@ -5309,7 +5327,7 @@
                 <w:sz w:val="26"/>
                 <w:szCs w:val="26"/>
               </w:rPr>
-              <w:t>SRAT</w:t>
+              <w:t>SHP</w:t>
             </w:r>
           </w:p>
         </w:tc>
@@ -5536,7 +5554,7 @@
                 <w:sz w:val="26"/>
                 <w:szCs w:val="26"/>
               </w:rPr>
-              <w:t>SLQ</w:t>
+              <w:t>HRA+NLM</w:t>
             </w:r>
           </w:p>
         </w:tc>
@@ -5763,7 +5781,7 @@
                 <w:sz w:val="26"/>
                 <w:szCs w:val="26"/>
               </w:rPr>
-              <w:t>AS2</w:t>
+              <w:t>SLQ</w:t>
             </w:r>
           </w:p>
         </w:tc>
@@ -5990,7 +6008,7 @@
                 <w:sz w:val="26"/>
                 <w:szCs w:val="26"/>
               </w:rPr>
-              <w:t>MNW</w:t>
+              <w:t>ICP</w:t>
             </w:r>
           </w:p>
         </w:tc>
@@ -6451,7 +6469,7 @@
                 <w:sz w:val="26"/>
                 <w:szCs w:val="26"/>
               </w:rPr>
-              <w:t>SSAK</w:t>
+              <w:t>SJOT</w:t>
             </w:r>
           </w:p>
         </w:tc>
@@ -7206,14 +7224,6 @@
                 <w:szCs w:val="26"/>
               </w:rPr>
             </w:pPr>
-            <w:r>
-              <w:rPr>
-                <w:rFonts w:ascii="Calibri" w:eastAsia="Calibri" w:hAnsi="Calibri" w:cs="Calibri"/>
-                <w:sz w:val="26"/>
-                <w:szCs w:val="26"/>
-              </w:rPr>
-              <w:t>JIND</w:t>
-            </w:r>
           </w:p>
         </w:tc>
         <w:tc>
@@ -7436,16 +7446,6 @@
                 <w:szCs w:val="26"/>
               </w:rPr>
             </w:pPr>
-            <w:r>
-              <w:rPr>
-                <w:rFonts w:ascii="Calibri" w:eastAsia="Calibri" w:hAnsi="Calibri" w:cs="Calibri"/>
-                <w:sz w:val="26"/>
-                <w:szCs w:val="26"/>
-              </w:rPr>
-              <w:t>TCPP CC+ PROD</w:t>
-            </w:r>
-            <w:bookmarkStart w:id="0" w:name="_GoBack"/>
-            <w:bookmarkEnd w:id="0"/>
           </w:p>
         </w:tc>
         <w:tc>
@@ -8116,7 +8116,12 @@
       </w:pPr>
     </w:p>
     <w:sectPr>
-      <w:headerReference w:type="default" r:id="rId6"/>
+      <w:headerReference w:type="even" r:id="rId6"/>
+      <w:headerReference w:type="default" r:id="rId7"/>
+      <w:footerReference w:type="even" r:id="rId8"/>
+      <w:footerReference w:type="default" r:id="rId9"/>
+      <w:headerReference w:type="first" r:id="rId10"/>
+      <w:footerReference w:type="first" r:id="rId11"/>
       <w:pgSz w:w="11906" w:h="16838"/>
       <w:pgMar w:top="568" w:right="1440" w:bottom="1134" w:left="1276" w:header="708" w:footer="708" w:gutter="0"/>
       <w:cols w:space="708"/>
@@ -8151,6 +8156,36 @@
 </w:endnotes>
 </file>
 
+<file path=word/footer1.xml><?xml version="1.0" encoding="utf-8"?>
+<w:ftr xmlns:wpc="http://schemas.microsoft.com/office/word/2010/wordprocessingCanvas" xmlns:mc="http://schemas.openxmlformats.org/markup-compatibility/2006" xmlns:o="urn:schemas-microsoft-com:office:office" xmlns:r="http://schemas.openxmlformats.org/officeDocument/2006/relationships" xmlns:m="http://schemas.openxmlformats.org/officeDocument/2006/math" xmlns:v="urn:schemas-microsoft-com:vml" xmlns:wp14="http://schemas.microsoft.com/office/word/2010/wordprocessingDrawing" xmlns:wp="http://schemas.openxmlformats.org/drawingml/2006/wordprocessingDrawing" xmlns:w10="urn:schemas-microsoft-com:office:word" xmlns:w="http://schemas.openxmlformats.org/wordprocessingml/2006/main" xmlns:w14="http://schemas.microsoft.com/office/word/2010/wordml" xmlns:w15="http://schemas.microsoft.com/office/word/2012/wordml" xmlns:wpg="http://schemas.microsoft.com/office/word/2010/wordprocessingGroup" xmlns:wpi="http://schemas.microsoft.com/office/word/2010/wordprocessingInk" xmlns:wne="http://schemas.microsoft.com/office/word/2006/wordml" xmlns:wps="http://schemas.microsoft.com/office/word/2010/wordprocessingShape" mc:Ignorable="w14 w15 wp14">
+  <w:p>
+    <w:pPr>
+      <w:pStyle w:val="Footer"/>
+    </w:pPr>
+  </w:p>
+</w:ftr>
+</file>
+
+<file path=word/footer2.xml><?xml version="1.0" encoding="utf-8"?>
+<w:ftr xmlns:wpc="http://schemas.microsoft.com/office/word/2010/wordprocessingCanvas" xmlns:mc="http://schemas.openxmlformats.org/markup-compatibility/2006" xmlns:o="urn:schemas-microsoft-com:office:office" xmlns:r="http://schemas.openxmlformats.org/officeDocument/2006/relationships" xmlns:m="http://schemas.openxmlformats.org/officeDocument/2006/math" xmlns:v="urn:schemas-microsoft-com:vml" xmlns:wp14="http://schemas.microsoft.com/office/word/2010/wordprocessingDrawing" xmlns:wp="http://schemas.openxmlformats.org/drawingml/2006/wordprocessingDrawing" xmlns:w10="urn:schemas-microsoft-com:office:word" xmlns:w="http://schemas.openxmlformats.org/wordprocessingml/2006/main" xmlns:w14="http://schemas.microsoft.com/office/word/2010/wordml" xmlns:w15="http://schemas.microsoft.com/office/word/2012/wordml" xmlns:wpg="http://schemas.microsoft.com/office/word/2010/wordprocessingGroup" xmlns:wpi="http://schemas.microsoft.com/office/word/2010/wordprocessingInk" xmlns:wne="http://schemas.microsoft.com/office/word/2006/wordml" xmlns:wps="http://schemas.microsoft.com/office/word/2010/wordprocessingShape" mc:Ignorable="w14 w15 wp14">
+  <w:p>
+    <w:pPr>
+      <w:pStyle w:val="Footer"/>
+    </w:pPr>
+  </w:p>
+</w:ftr>
+</file>
+
+<file path=word/footer3.xml><?xml version="1.0" encoding="utf-8"?>
+<w:ftr xmlns:wpc="http://schemas.microsoft.com/office/word/2010/wordprocessingCanvas" xmlns:mc="http://schemas.openxmlformats.org/markup-compatibility/2006" xmlns:o="urn:schemas-microsoft-com:office:office" xmlns:r="http://schemas.openxmlformats.org/officeDocument/2006/relationships" xmlns:m="http://schemas.openxmlformats.org/officeDocument/2006/math" xmlns:v="urn:schemas-microsoft-com:vml" xmlns:wp14="http://schemas.microsoft.com/office/word/2010/wordprocessingDrawing" xmlns:wp="http://schemas.openxmlformats.org/drawingml/2006/wordprocessingDrawing" xmlns:w10="urn:schemas-microsoft-com:office:word" xmlns:w="http://schemas.openxmlformats.org/wordprocessingml/2006/main" xmlns:w14="http://schemas.microsoft.com/office/word/2010/wordml" xmlns:w15="http://schemas.microsoft.com/office/word/2012/wordml" xmlns:wpg="http://schemas.microsoft.com/office/word/2010/wordprocessingGroup" xmlns:wpi="http://schemas.microsoft.com/office/word/2010/wordprocessingInk" xmlns:wne="http://schemas.microsoft.com/office/word/2006/wordml" xmlns:wps="http://schemas.microsoft.com/office/word/2010/wordprocessingShape" mc:Ignorable="w14 w15 wp14">
+  <w:p>
+    <w:pPr>
+      <w:pStyle w:val="Footer"/>
+    </w:pPr>
+  </w:p>
+</w:ftr>
+</file>
+
 <file path=word/footnotes.xml><?xml version="1.0" encoding="utf-8"?>
 <w:footnotes xmlns:wpc="http://schemas.microsoft.com/office/word/2010/wordprocessingCanvas" xmlns:mc="http://schemas.openxmlformats.org/markup-compatibility/2006" xmlns:o="urn:schemas-microsoft-com:office:office" xmlns:r="http://schemas.openxmlformats.org/officeDocument/2006/relationships" xmlns:m="http://schemas.openxmlformats.org/officeDocument/2006/math" xmlns:v="urn:schemas-microsoft-com:vml" xmlns:wp14="http://schemas.microsoft.com/office/word/2010/wordprocessingDrawing" xmlns:wp="http://schemas.openxmlformats.org/drawingml/2006/wordprocessingDrawing" xmlns:w10="urn:schemas-microsoft-com:office:word" xmlns:w="http://schemas.openxmlformats.org/wordprocessingml/2006/main" xmlns:w14="http://schemas.microsoft.com/office/word/2010/wordml" xmlns:w15="http://schemas.microsoft.com/office/word/2012/wordml" xmlns:wpg="http://schemas.microsoft.com/office/word/2010/wordprocessingGroup" xmlns:wpi="http://schemas.microsoft.com/office/word/2010/wordprocessingInk" xmlns:wne="http://schemas.microsoft.com/office/word/2006/wordml" xmlns:wps="http://schemas.microsoft.com/office/word/2010/wordprocessingShape" mc:Ignorable="w14 w15 wp14">
   <w:footnote w:type="separator" w:id="-1">
@@ -8181,6 +8216,16 @@
   <w:p>
     <w:pPr>
       <w:pStyle w:val="Header"/>
+    </w:pPr>
+  </w:p>
+</w:hdr>
+</file>
+
+<file path=word/header2.xml><?xml version="1.0" encoding="utf-8"?>
+<w:hdr xmlns:wpc="http://schemas.microsoft.com/office/word/2010/wordprocessingCanvas" xmlns:mc="http://schemas.openxmlformats.org/markup-compatibility/2006" xmlns:o="urn:schemas-microsoft-com:office:office" xmlns:r="http://schemas.openxmlformats.org/officeDocument/2006/relationships" xmlns:m="http://schemas.openxmlformats.org/officeDocument/2006/math" xmlns:v="urn:schemas-microsoft-com:vml" xmlns:wp14="http://schemas.microsoft.com/office/word/2010/wordprocessingDrawing" xmlns:wp="http://schemas.openxmlformats.org/drawingml/2006/wordprocessingDrawing" xmlns:w10="urn:schemas-microsoft-com:office:word" xmlns:w="http://schemas.openxmlformats.org/wordprocessingml/2006/main" xmlns:w14="http://schemas.microsoft.com/office/word/2010/wordml" xmlns:w15="http://schemas.microsoft.com/office/word/2012/wordml" xmlns:wpg="http://schemas.microsoft.com/office/word/2010/wordprocessingGroup" xmlns:wpi="http://schemas.microsoft.com/office/word/2010/wordprocessingInk" xmlns:wne="http://schemas.microsoft.com/office/word/2006/wordml" xmlns:wps="http://schemas.microsoft.com/office/word/2010/wordprocessingShape" mc:Ignorable="w14 w15 wp14">
+  <w:p>
+    <w:pPr>
+      <w:pStyle w:val="Header"/>
       <w:ind w:left="-851"/>
       <w:jc w:val="center"/>
       <w:rPr>
@@ -8196,7 +8241,7 @@
         <v:rect id="_x0000_i1025" style="width:56.25pt;height:39pt" o:ole="" o:preferrelative="t" stroked="f">
           <v:imagedata r:id="rId1" o:title=""/>
         </v:rect>
-        <o:OLEObject Type="Embed" ProgID="StaticMetafile" ShapeID="_x0000_i1025" DrawAspect="Content" ObjectID="_1851431307" r:id="rId2"/>
+        <o:OLEObject Type="Embed" ProgID="StaticMetafile" ShapeID="_x0000_i1025" DrawAspect="Content" ObjectID="_1851513533" r:id="rId2"/>
       </w:object>
     </w:r>
     <w:r>
@@ -8240,7 +8285,7 @@
         <w:sz w:val="26"/>
         <w:szCs w:val="26"/>
       </w:rPr>
-      <w:t>1</w:t>
+      <w:t>2</w:t>
     </w:r>
     <w:r>
       <w:rPr>
@@ -8260,7 +8305,7 @@
         <w:sz w:val="26"/>
         <w:szCs w:val="26"/>
       </w:rPr>
-      <w:t>MON</w:t>
+      <w:t>TUES</w:t>
     </w:r>
     <w:r>
       <w:rPr>
@@ -8283,6 +8328,16 @@
       <w:t>)</w:t>
     </w:r>
   </w:p>
+  <w:p>
+    <w:pPr>
+      <w:pStyle w:val="Header"/>
+    </w:pPr>
+  </w:p>
+</w:hdr>
+</file>
+
+<file path=word/header3.xml><?xml version="1.0" encoding="utf-8"?>
+<w:hdr xmlns:wpc="http://schemas.microsoft.com/office/word/2010/wordprocessingCanvas" xmlns:mc="http://schemas.openxmlformats.org/markup-compatibility/2006" xmlns:o="urn:schemas-microsoft-com:office:office" xmlns:r="http://schemas.openxmlformats.org/officeDocument/2006/relationships" xmlns:m="http://schemas.openxmlformats.org/officeDocument/2006/math" xmlns:v="urn:schemas-microsoft-com:vml" xmlns:wp14="http://schemas.microsoft.com/office/word/2010/wordprocessingDrawing" xmlns:wp="http://schemas.openxmlformats.org/drawingml/2006/wordprocessingDrawing" xmlns:w10="urn:schemas-microsoft-com:office:word" xmlns:w="http://schemas.openxmlformats.org/wordprocessingml/2006/main" xmlns:w14="http://schemas.microsoft.com/office/word/2010/wordml" xmlns:w15="http://schemas.microsoft.com/office/word/2012/wordml" xmlns:wpg="http://schemas.microsoft.com/office/word/2010/wordprocessingGroup" xmlns:wpi="http://schemas.microsoft.com/office/word/2010/wordprocessingInk" xmlns:wne="http://schemas.microsoft.com/office/word/2006/wordml" xmlns:wps="http://schemas.microsoft.com/office/word/2010/wordprocessingShape" mc:Ignorable="w14 w15 wp14">
   <w:p>
     <w:pPr>
       <w:pStyle w:val="Header"/>

</xml_diff>

<commit_message>
Sync - 2026-09-22 16:15
</commit_message>
<xml_diff>
--- a/files/Daily_Helicopter_Schedule.docx
+++ b/files/Daily_Helicopter_Schedule.docx
@@ -3107,9 +3107,10 @@
             <w:r>
               <w:rPr>
                 <w:rFonts w:ascii="Calibri" w:eastAsia="Calibri" w:hAnsi="Calibri" w:cs="Calibri"/>
-                <w:sz w:val="24"/>
-              </w:rPr>
-              <w:t>PANNA</w:t>
+                <w:sz w:val="26"/>
+                <w:szCs w:val="26"/>
+              </w:rPr>
+              <w:t xml:space="preserve"> NA</w:t>
             </w:r>
           </w:p>
         </w:tc>
@@ -3546,17 +3547,7 @@
                 <w:sz w:val="26"/>
                 <w:szCs w:val="26"/>
               </w:rPr>
-              <w:t>11:0</w:t>
-            </w:r>
-            <w:bookmarkStart w:id="0" w:name="_GoBack"/>
-            <w:bookmarkEnd w:id="0"/>
-            <w:r>
-              <w:rPr>
-                <w:rFonts w:ascii="Calibri" w:eastAsia="Calibri" w:hAnsi="Calibri" w:cs="Calibri"/>
-                <w:sz w:val="26"/>
-                <w:szCs w:val="26"/>
-              </w:rPr>
-              <w:t>5</w:t>
+              <w:t>11:05</w:t>
             </w:r>
           </w:p>
         </w:tc>
@@ -4348,7 +4339,7 @@
                 <w:sz w:val="26"/>
                 <w:szCs w:val="26"/>
               </w:rPr>
-              <w:t>SGAV</w:t>
+              <w:t>RATNA</w:t>
             </w:r>
           </w:p>
         </w:tc>
@@ -4811,7 +4802,7 @@
                 <w:sz w:val="26"/>
                 <w:szCs w:val="26"/>
               </w:rPr>
-              <w:t>R12A+R13A+HERA</w:t>
+              <w:t>PANNA</w:t>
             </w:r>
           </w:p>
         </w:tc>
@@ -5045,7 +5036,15 @@
                 <w:sz w:val="26"/>
                 <w:szCs w:val="26"/>
               </w:rPr>
-              <w:t>BPA</w:t>
+              <w:t>SMRT</w:t>
+            </w:r>
+            <w:r>
+              <w:rPr>
+                <w:rFonts w:ascii="Calibri" w:eastAsia="Calibri" w:hAnsi="Calibri" w:cs="Calibri"/>
+                <w:sz w:val="26"/>
+                <w:szCs w:val="26"/>
+              </w:rPr>
+              <w:t>[B/L]</w:t>
             </w:r>
           </w:p>
         </w:tc>
@@ -5327,7 +5326,7 @@
                 <w:sz w:val="26"/>
                 <w:szCs w:val="26"/>
               </w:rPr>
-              <w:t>SHP</w:t>
+              <w:t>SCA</w:t>
             </w:r>
           </w:p>
         </w:tc>
@@ -5554,7 +5553,7 @@
                 <w:sz w:val="26"/>
                 <w:szCs w:val="26"/>
               </w:rPr>
-              <w:t>HRA+NLM</w:t>
+              <w:t>MNW</w:t>
             </w:r>
           </w:p>
         </w:tc>
@@ -5781,7 +5780,7 @@
                 <w:sz w:val="26"/>
                 <w:szCs w:val="26"/>
               </w:rPr>
-              <w:t>SLQ</w:t>
+              <w:t>NLM</w:t>
             </w:r>
           </w:p>
         </w:tc>
@@ -6008,7 +6007,7 @@
                 <w:sz w:val="26"/>
                 <w:szCs w:val="26"/>
               </w:rPr>
-              <w:t>ICP</w:t>
+              <w:t>BLQ1</w:t>
             </w:r>
           </w:p>
         </w:tc>
@@ -6242,7 +6241,7 @@
                 <w:sz w:val="26"/>
                 <w:szCs w:val="26"/>
               </w:rPr>
-              <w:t>NQO</w:t>
+              <w:t>SHAKTI</w:t>
             </w:r>
           </w:p>
         </w:tc>
@@ -6469,7 +6468,7 @@
                 <w:sz w:val="26"/>
                 <w:szCs w:val="26"/>
               </w:rPr>
-              <w:t>SJOT</w:t>
+              <w:t>B193</w:t>
             </w:r>
           </w:p>
         </w:tc>
@@ -7224,6 +7223,14 @@
                 <w:szCs w:val="26"/>
               </w:rPr>
             </w:pPr>
+            <w:r>
+              <w:rPr>
+                <w:rFonts w:ascii="Calibri" w:eastAsia="Calibri" w:hAnsi="Calibri" w:cs="Calibri"/>
+                <w:sz w:val="26"/>
+                <w:szCs w:val="26"/>
+              </w:rPr>
+              <w:t>CHARU</w:t>
+            </w:r>
           </w:p>
         </w:tc>
         <w:tc>
@@ -7446,6 +7453,14 @@
                 <w:szCs w:val="26"/>
               </w:rPr>
             </w:pPr>
+            <w:r>
+              <w:rPr>
+                <w:rFonts w:ascii="Calibri" w:eastAsia="Calibri" w:hAnsi="Calibri" w:cs="Calibri"/>
+                <w:sz w:val="26"/>
+                <w:szCs w:val="26"/>
+              </w:rPr>
+              <w:t>J STAR</w:t>
+            </w:r>
           </w:p>
         </w:tc>
         <w:tc>
@@ -7669,6 +7684,14 @@
                 <w:szCs w:val="26"/>
               </w:rPr>
             </w:pPr>
+            <w:r>
+              <w:rPr>
+                <w:rFonts w:ascii="Calibri" w:eastAsia="Calibri" w:hAnsi="Calibri" w:cs="Calibri"/>
+                <w:sz w:val="26"/>
+                <w:szCs w:val="26"/>
+              </w:rPr>
+              <w:t>L/O</w:t>
+            </w:r>
           </w:p>
         </w:tc>
         <w:tc>
@@ -7892,6 +7915,16 @@
                 <w:szCs w:val="26"/>
               </w:rPr>
             </w:pPr>
+            <w:r>
+              <w:rPr>
+                <w:rFonts w:ascii="Calibri" w:eastAsia="Calibri" w:hAnsi="Calibri" w:cs="Calibri"/>
+                <w:sz w:val="26"/>
+                <w:szCs w:val="26"/>
+              </w:rPr>
+              <w:t>L/O</w:t>
+            </w:r>
+            <w:bookmarkStart w:id="0" w:name="_GoBack"/>
+            <w:bookmarkEnd w:id="0"/>
           </w:p>
         </w:tc>
         <w:tc>
@@ -8116,12 +8149,7 @@
       </w:pPr>
     </w:p>
     <w:sectPr>
-      <w:headerReference w:type="even" r:id="rId6"/>
-      <w:headerReference w:type="default" r:id="rId7"/>
-      <w:footerReference w:type="even" r:id="rId8"/>
-      <w:footerReference w:type="default" r:id="rId9"/>
-      <w:headerReference w:type="first" r:id="rId10"/>
-      <w:footerReference w:type="first" r:id="rId11"/>
+      <w:headerReference w:type="default" r:id="rId6"/>
       <w:pgSz w:w="11906" w:h="16838"/>
       <w:pgMar w:top="568" w:right="1440" w:bottom="1134" w:left="1276" w:header="708" w:footer="708" w:gutter="0"/>
       <w:cols w:space="708"/>
@@ -8156,36 +8184,6 @@
 </w:endnotes>
 </file>
 
-<file path=word/footer1.xml><?xml version="1.0" encoding="utf-8"?>
-<w:ftr xmlns:wpc="http://schemas.microsoft.com/office/word/2010/wordprocessingCanvas" xmlns:mc="http://schemas.openxmlformats.org/markup-compatibility/2006" xmlns:o="urn:schemas-microsoft-com:office:office" xmlns:r="http://schemas.openxmlformats.org/officeDocument/2006/relationships" xmlns:m="http://schemas.openxmlformats.org/officeDocument/2006/math" xmlns:v="urn:schemas-microsoft-com:vml" xmlns:wp14="http://schemas.microsoft.com/office/word/2010/wordprocessingDrawing" xmlns:wp="http://schemas.openxmlformats.org/drawingml/2006/wordprocessingDrawing" xmlns:w10="urn:schemas-microsoft-com:office:word" xmlns:w="http://schemas.openxmlformats.org/wordprocessingml/2006/main" xmlns:w14="http://schemas.microsoft.com/office/word/2010/wordml" xmlns:w15="http://schemas.microsoft.com/office/word/2012/wordml" xmlns:wpg="http://schemas.microsoft.com/office/word/2010/wordprocessingGroup" xmlns:wpi="http://schemas.microsoft.com/office/word/2010/wordprocessingInk" xmlns:wne="http://schemas.microsoft.com/office/word/2006/wordml" xmlns:wps="http://schemas.microsoft.com/office/word/2010/wordprocessingShape" mc:Ignorable="w14 w15 wp14">
-  <w:p>
-    <w:pPr>
-      <w:pStyle w:val="Footer"/>
-    </w:pPr>
-  </w:p>
-</w:ftr>
-</file>
-
-<file path=word/footer2.xml><?xml version="1.0" encoding="utf-8"?>
-<w:ftr xmlns:wpc="http://schemas.microsoft.com/office/word/2010/wordprocessingCanvas" xmlns:mc="http://schemas.openxmlformats.org/markup-compatibility/2006" xmlns:o="urn:schemas-microsoft-com:office:office" xmlns:r="http://schemas.openxmlformats.org/officeDocument/2006/relationships" xmlns:m="http://schemas.openxmlformats.org/officeDocument/2006/math" xmlns:v="urn:schemas-microsoft-com:vml" xmlns:wp14="http://schemas.microsoft.com/office/word/2010/wordprocessingDrawing" xmlns:wp="http://schemas.openxmlformats.org/drawingml/2006/wordprocessingDrawing" xmlns:w10="urn:schemas-microsoft-com:office:word" xmlns:w="http://schemas.openxmlformats.org/wordprocessingml/2006/main" xmlns:w14="http://schemas.microsoft.com/office/word/2010/wordml" xmlns:w15="http://schemas.microsoft.com/office/word/2012/wordml" xmlns:wpg="http://schemas.microsoft.com/office/word/2010/wordprocessingGroup" xmlns:wpi="http://schemas.microsoft.com/office/word/2010/wordprocessingInk" xmlns:wne="http://schemas.microsoft.com/office/word/2006/wordml" xmlns:wps="http://schemas.microsoft.com/office/word/2010/wordprocessingShape" mc:Ignorable="w14 w15 wp14">
-  <w:p>
-    <w:pPr>
-      <w:pStyle w:val="Footer"/>
-    </w:pPr>
-  </w:p>
-</w:ftr>
-</file>
-
-<file path=word/footer3.xml><?xml version="1.0" encoding="utf-8"?>
-<w:ftr xmlns:wpc="http://schemas.microsoft.com/office/word/2010/wordprocessingCanvas" xmlns:mc="http://schemas.openxmlformats.org/markup-compatibility/2006" xmlns:o="urn:schemas-microsoft-com:office:office" xmlns:r="http://schemas.openxmlformats.org/officeDocument/2006/relationships" xmlns:m="http://schemas.openxmlformats.org/officeDocument/2006/math" xmlns:v="urn:schemas-microsoft-com:vml" xmlns:wp14="http://schemas.microsoft.com/office/word/2010/wordprocessingDrawing" xmlns:wp="http://schemas.openxmlformats.org/drawingml/2006/wordprocessingDrawing" xmlns:w10="urn:schemas-microsoft-com:office:word" xmlns:w="http://schemas.openxmlformats.org/wordprocessingml/2006/main" xmlns:w14="http://schemas.microsoft.com/office/word/2010/wordml" xmlns:w15="http://schemas.microsoft.com/office/word/2012/wordml" xmlns:wpg="http://schemas.microsoft.com/office/word/2010/wordprocessingGroup" xmlns:wpi="http://schemas.microsoft.com/office/word/2010/wordprocessingInk" xmlns:wne="http://schemas.microsoft.com/office/word/2006/wordml" xmlns:wps="http://schemas.microsoft.com/office/word/2010/wordprocessingShape" mc:Ignorable="w14 w15 wp14">
-  <w:p>
-    <w:pPr>
-      <w:pStyle w:val="Footer"/>
-    </w:pPr>
-  </w:p>
-</w:ftr>
-</file>
-
 <file path=word/footnotes.xml><?xml version="1.0" encoding="utf-8"?>
 <w:footnotes xmlns:wpc="http://schemas.microsoft.com/office/word/2010/wordprocessingCanvas" xmlns:mc="http://schemas.openxmlformats.org/markup-compatibility/2006" xmlns:o="urn:schemas-microsoft-com:office:office" xmlns:r="http://schemas.openxmlformats.org/officeDocument/2006/relationships" xmlns:m="http://schemas.openxmlformats.org/officeDocument/2006/math" xmlns:v="urn:schemas-microsoft-com:vml" xmlns:wp14="http://schemas.microsoft.com/office/word/2010/wordprocessingDrawing" xmlns:wp="http://schemas.openxmlformats.org/drawingml/2006/wordprocessingDrawing" xmlns:w10="urn:schemas-microsoft-com:office:word" xmlns:w="http://schemas.openxmlformats.org/wordprocessingml/2006/main" xmlns:w14="http://schemas.microsoft.com/office/word/2010/wordml" xmlns:w15="http://schemas.microsoft.com/office/word/2012/wordml" xmlns:wpg="http://schemas.microsoft.com/office/word/2010/wordprocessingGroup" xmlns:wpi="http://schemas.microsoft.com/office/word/2010/wordprocessingInk" xmlns:wne="http://schemas.microsoft.com/office/word/2006/wordml" xmlns:wps="http://schemas.microsoft.com/office/word/2010/wordprocessingShape" mc:Ignorable="w14 w15 wp14">
   <w:footnote w:type="separator" w:id="-1">
@@ -8216,16 +8214,6 @@
   <w:p>
     <w:pPr>
       <w:pStyle w:val="Header"/>
-    </w:pPr>
-  </w:p>
-</w:hdr>
-</file>
-
-<file path=word/header2.xml><?xml version="1.0" encoding="utf-8"?>
-<w:hdr xmlns:wpc="http://schemas.microsoft.com/office/word/2010/wordprocessingCanvas" xmlns:mc="http://schemas.openxmlformats.org/markup-compatibility/2006" xmlns:o="urn:schemas-microsoft-com:office:office" xmlns:r="http://schemas.openxmlformats.org/officeDocument/2006/relationships" xmlns:m="http://schemas.openxmlformats.org/officeDocument/2006/math" xmlns:v="urn:schemas-microsoft-com:vml" xmlns:wp14="http://schemas.microsoft.com/office/word/2010/wordprocessingDrawing" xmlns:wp="http://schemas.openxmlformats.org/drawingml/2006/wordprocessingDrawing" xmlns:w10="urn:schemas-microsoft-com:office:word" xmlns:w="http://schemas.openxmlformats.org/wordprocessingml/2006/main" xmlns:w14="http://schemas.microsoft.com/office/word/2010/wordml" xmlns:w15="http://schemas.microsoft.com/office/word/2012/wordml" xmlns:wpg="http://schemas.microsoft.com/office/word/2010/wordprocessingGroup" xmlns:wpi="http://schemas.microsoft.com/office/word/2010/wordprocessingInk" xmlns:wne="http://schemas.microsoft.com/office/word/2006/wordml" xmlns:wps="http://schemas.microsoft.com/office/word/2010/wordprocessingShape" mc:Ignorable="w14 w15 wp14">
-  <w:p>
-    <w:pPr>
-      <w:pStyle w:val="Header"/>
       <w:ind w:left="-851"/>
       <w:jc w:val="center"/>
       <w:rPr>
@@ -8241,7 +8229,7 @@
         <v:rect id="_x0000_i1025" style="width:56.25pt;height:39pt" o:ole="" o:preferrelative="t" stroked="f">
           <v:imagedata r:id="rId1" o:title=""/>
         </v:rect>
-        <o:OLEObject Type="Embed" ProgID="StaticMetafile" ShapeID="_x0000_i1025" DrawAspect="Content" ObjectID="_1851513533" r:id="rId2"/>
+        <o:OLEObject Type="Embed" ProgID="StaticMetafile" ShapeID="_x0000_i1025" DrawAspect="Content" ObjectID="_1851597623" r:id="rId2"/>
       </w:object>
     </w:r>
     <w:r>
@@ -8285,7 +8273,7 @@
         <w:sz w:val="26"/>
         <w:szCs w:val="26"/>
       </w:rPr>
-      <w:t>2</w:t>
+      <w:t>3</w:t>
     </w:r>
     <w:r>
       <w:rPr>
@@ -8305,7 +8293,17 @@
         <w:sz w:val="26"/>
         <w:szCs w:val="26"/>
       </w:rPr>
-      <w:t>TUES</w:t>
+      <w:t>WEDN</w:t>
+    </w:r>
+    <w:r>
+      <w:rPr>
+        <w:rFonts w:ascii="Times New Roman" w:hAnsi="Times New Roman" w:cs="Times New Roman"/>
+        <w:b/>
+        <w:color w:val="000000" w:themeColor="text1"/>
+        <w:sz w:val="26"/>
+        <w:szCs w:val="26"/>
+      </w:rPr>
+      <w:t>ES</w:t>
     </w:r>
     <w:r>
       <w:rPr>
@@ -8328,16 +8326,6 @@
       <w:t>)</w:t>
     </w:r>
   </w:p>
-  <w:p>
-    <w:pPr>
-      <w:pStyle w:val="Header"/>
-    </w:pPr>
-  </w:p>
-</w:hdr>
-</file>
-
-<file path=word/header3.xml><?xml version="1.0" encoding="utf-8"?>
-<w:hdr xmlns:wpc="http://schemas.microsoft.com/office/word/2010/wordprocessingCanvas" xmlns:mc="http://schemas.openxmlformats.org/markup-compatibility/2006" xmlns:o="urn:schemas-microsoft-com:office:office" xmlns:r="http://schemas.openxmlformats.org/officeDocument/2006/relationships" xmlns:m="http://schemas.openxmlformats.org/officeDocument/2006/math" xmlns:v="urn:schemas-microsoft-com:vml" xmlns:wp14="http://schemas.microsoft.com/office/word/2010/wordprocessingDrawing" xmlns:wp="http://schemas.openxmlformats.org/drawingml/2006/wordprocessingDrawing" xmlns:w10="urn:schemas-microsoft-com:office:word" xmlns:w="http://schemas.openxmlformats.org/wordprocessingml/2006/main" xmlns:w14="http://schemas.microsoft.com/office/word/2010/wordml" xmlns:w15="http://schemas.microsoft.com/office/word/2012/wordml" xmlns:wpg="http://schemas.microsoft.com/office/word/2010/wordprocessingGroup" xmlns:wpi="http://schemas.microsoft.com/office/word/2010/wordprocessingInk" xmlns:wne="http://schemas.microsoft.com/office/word/2006/wordml" xmlns:wps="http://schemas.microsoft.com/office/word/2010/wordprocessingShape" mc:Ignorable="w14 w15 wp14">
   <w:p>
     <w:pPr>
       <w:pStyle w:val="Header"/>

</xml_diff>

<commit_message>
Sync - 2026-09-23 17:18
</commit_message>
<xml_diff>
--- a/files/Daily_Helicopter_Schedule.docx
+++ b/files/Daily_Helicopter_Schedule.docx
@@ -4339,7 +4339,10 @@
                 <w:sz w:val="26"/>
                 <w:szCs w:val="26"/>
               </w:rPr>
-              <w:t>RATNA</w:t>
+              <w:t>J SUP</w:t>
+            </w:r>
+            <w:r>
+              <w:t xml:space="preserve">       </w:t>
             </w:r>
           </w:p>
         </w:tc>
@@ -4792,17 +4795,23 @@
               <w:jc w:val="center"/>
               <w:rPr>
                 <w:rFonts w:ascii="Calibri" w:eastAsia="Calibri" w:hAnsi="Calibri" w:cs="Calibri"/>
-                <w:sz w:val="26"/>
-                <w:szCs w:val="26"/>
-              </w:rPr>
-            </w:pPr>
-            <w:r>
-              <w:rPr>
-                <w:rFonts w:ascii="Calibri" w:eastAsia="Calibri" w:hAnsi="Calibri" w:cs="Calibri"/>
-                <w:sz w:val="26"/>
-                <w:szCs w:val="26"/>
-              </w:rPr>
-              <w:t>PANNA</w:t>
+                <w:sz w:val="28"/>
+                <w:szCs w:val="28"/>
+              </w:rPr>
+            </w:pPr>
+            <w:r>
+              <w:rPr>
+                <w:sz w:val="28"/>
+                <w:szCs w:val="28"/>
+              </w:rPr>
+              <w:t>RATNA</w:t>
+            </w:r>
+            <w:r>
+              <w:rPr>
+                <w:sz w:val="28"/>
+                <w:szCs w:val="28"/>
+              </w:rPr>
+              <w:t xml:space="preserve">         </w:t>
             </w:r>
           </w:p>
         </w:tc>
@@ -5036,15 +5045,7 @@
                 <w:sz w:val="26"/>
                 <w:szCs w:val="26"/>
               </w:rPr>
-              <w:t>SMRT</w:t>
-            </w:r>
-            <w:r>
-              <w:rPr>
-                <w:rFonts w:ascii="Calibri" w:eastAsia="Calibri" w:hAnsi="Calibri" w:cs="Calibri"/>
-                <w:sz w:val="26"/>
-                <w:szCs w:val="26"/>
-              </w:rPr>
-              <w:t>[B/L]</w:t>
+              <w:t>BLQ2</w:t>
             </w:r>
           </w:p>
         </w:tc>
@@ -5326,7 +5327,7 @@
                 <w:sz w:val="26"/>
                 <w:szCs w:val="26"/>
               </w:rPr>
-              <w:t>SCA</w:t>
+              <w:t>ICW</w:t>
             </w:r>
           </w:p>
         </w:tc>
@@ -5553,7 +5554,7 @@
                 <w:sz w:val="26"/>
                 <w:szCs w:val="26"/>
               </w:rPr>
-              <w:t>MNW</w:t>
+              <w:t>HRA</w:t>
             </w:r>
           </w:p>
         </w:tc>
@@ -5780,7 +5781,7 @@
                 <w:sz w:val="26"/>
                 <w:szCs w:val="26"/>
               </w:rPr>
-              <w:t>NLM</w:t>
+              <w:t>SHQ</w:t>
             </w:r>
           </w:p>
         </w:tc>
@@ -6007,7 +6008,7 @@
                 <w:sz w:val="26"/>
                 <w:szCs w:val="26"/>
               </w:rPr>
-              <w:t>BLQ1</w:t>
+              <w:t>WIN</w:t>
             </w:r>
           </w:p>
         </w:tc>
@@ -6227,21 +6228,18 @@
           </w:tcPr>
           <w:p>
             <w:pPr>
-              <w:spacing w:after="0" w:line="240" w:lineRule="auto"/>
-              <w:jc w:val="center"/>
-              <w:rPr>
-                <w:rFonts w:ascii="Calibri" w:eastAsia="Calibri" w:hAnsi="Calibri" w:cs="Calibri"/>
-                <w:sz w:val="26"/>
-                <w:szCs w:val="26"/>
-              </w:rPr>
-            </w:pPr>
-            <w:r>
-              <w:rPr>
-                <w:rFonts w:ascii="Calibri" w:eastAsia="Calibri" w:hAnsi="Calibri" w:cs="Calibri"/>
-                <w:sz w:val="26"/>
-                <w:szCs w:val="26"/>
-              </w:rPr>
-              <w:t>SHAKTI</w:t>
+              <w:jc w:val="center"/>
+              <w:rPr>
+                <w:sz w:val="28"/>
+                <w:szCs w:val="28"/>
+              </w:rPr>
+            </w:pPr>
+            <w:r>
+              <w:rPr>
+                <w:sz w:val="28"/>
+                <w:szCs w:val="28"/>
+              </w:rPr>
+              <w:t>MNW</w:t>
             </w:r>
           </w:p>
         </w:tc>
@@ -6454,21 +6452,18 @@
           </w:tcPr>
           <w:p>
             <w:pPr>
-              <w:spacing w:after="0" w:line="240" w:lineRule="auto"/>
-              <w:jc w:val="center"/>
-              <w:rPr>
-                <w:rFonts w:ascii="Calibri" w:eastAsia="Calibri" w:hAnsi="Calibri" w:cs="Calibri"/>
-                <w:sz w:val="26"/>
-                <w:szCs w:val="26"/>
-              </w:rPr>
-            </w:pPr>
-            <w:r>
-              <w:rPr>
-                <w:rFonts w:ascii="Calibri" w:eastAsia="Calibri" w:hAnsi="Calibri" w:cs="Calibri"/>
-                <w:sz w:val="26"/>
-                <w:szCs w:val="26"/>
-              </w:rPr>
-              <w:t>B193</w:t>
+              <w:jc w:val="center"/>
+              <w:rPr>
+                <w:sz w:val="28"/>
+                <w:szCs w:val="28"/>
+              </w:rPr>
+            </w:pPr>
+            <w:r>
+              <w:rPr>
+                <w:sz w:val="28"/>
+                <w:szCs w:val="28"/>
+              </w:rPr>
+              <w:t>UDAY</w:t>
             </w:r>
           </w:p>
         </w:tc>
@@ -6589,6 +6584,14 @@
                 <w:sz w:val="24"/>
               </w:rPr>
               <w:t xml:space="preserve">WAITING: </w:t>
+            </w:r>
+            <w:r>
+              <w:rPr>
+                <w:rFonts w:ascii="Calibri" w:eastAsia="Calibri" w:hAnsi="Calibri" w:cs="Calibri"/>
+                <w:b/>
+                <w:sz w:val="24"/>
+              </w:rPr>
+              <w:t>SMRT,AS1</w:t>
             </w:r>
           </w:p>
         </w:tc>
@@ -7229,7 +7232,7 @@
                 <w:sz w:val="26"/>
                 <w:szCs w:val="26"/>
               </w:rPr>
-              <w:t>CHARU</w:t>
+              <w:t>TAPTI</w:t>
             </w:r>
           </w:p>
         </w:tc>
@@ -7459,8 +7462,10 @@
                 <w:sz w:val="26"/>
                 <w:szCs w:val="26"/>
               </w:rPr>
-              <w:t>J STAR</w:t>
-            </w:r>
+              <w:t>L/O</w:t>
+            </w:r>
+            <w:bookmarkStart w:id="0" w:name="_GoBack"/>
+            <w:bookmarkEnd w:id="0"/>
           </w:p>
         </w:tc>
         <w:tc>
@@ -7923,8 +7928,6 @@
               </w:rPr>
               <w:t>L/O</w:t>
             </w:r>
-            <w:bookmarkStart w:id="0" w:name="_GoBack"/>
-            <w:bookmarkEnd w:id="0"/>
           </w:p>
         </w:tc>
         <w:tc>
@@ -8226,10 +8229,10 @@
     </w:pPr>
     <w:r>
       <w:object w:dxaOrig="1188" w:dyaOrig="900">
-        <v:rect id="_x0000_i1025" style="width:56.25pt;height:39pt" o:ole="" o:preferrelative="t" stroked="f">
+        <v:rect id="_x0000_i1025" style="width:56.3pt;height:38.9pt" o:ole="" o:preferrelative="t" stroked="f">
           <v:imagedata r:id="rId1" o:title=""/>
         </v:rect>
-        <o:OLEObject Type="Embed" ProgID="StaticMetafile" ShapeID="_x0000_i1025" DrawAspect="Content" ObjectID="_1851597623" r:id="rId2"/>
+        <o:OLEObject Type="Embed" ProgID="StaticMetafile" ShapeID="_x0000_i1025" DrawAspect="Content" ObjectID="_1851687512" r:id="rId2"/>
       </w:object>
     </w:r>
     <w:r>
@@ -8273,7 +8276,7 @@
         <w:sz w:val="26"/>
         <w:szCs w:val="26"/>
       </w:rPr>
-      <w:t>3</w:t>
+      <w:t>4</w:t>
     </w:r>
     <w:r>
       <w:rPr>
@@ -8293,7 +8296,7 @@
         <w:sz w:val="26"/>
         <w:szCs w:val="26"/>
       </w:rPr>
-      <w:t>WEDN</w:t>
+      <w:t>THUR</w:t>
     </w:r>
     <w:r>
       <w:rPr>
@@ -8303,7 +8306,7 @@
         <w:sz w:val="26"/>
         <w:szCs w:val="26"/>
       </w:rPr>
-      <w:t>ES</w:t>
+      <w:t>S</w:t>
     </w:r>
     <w:r>
       <w:rPr>

</xml_diff>

<commit_message>
Sync - 2026-09-24 07:50
</commit_message>
<xml_diff>
--- a/files/Daily_Helicopter_Schedule.docx
+++ b/files/Daily_Helicopter_Schedule.docx
@@ -674,8 +674,10 @@
                 <w:sz w:val="26"/>
                 <w:szCs w:val="26"/>
               </w:rPr>
-              <w:t>RRI</w:t>
-            </w:r>
+              <w:t>NA</w:t>
+            </w:r>
+            <w:bookmarkStart w:id="0" w:name="_GoBack"/>
+            <w:bookmarkEnd w:id="0"/>
           </w:p>
         </w:tc>
         <w:tc>
@@ -4804,14 +4806,7 @@
                 <w:sz w:val="28"/>
                 <w:szCs w:val="28"/>
               </w:rPr>
-              <w:t>RATNA</w:t>
-            </w:r>
-            <w:r>
-              <w:rPr>
-                <w:sz w:val="28"/>
-                <w:szCs w:val="28"/>
-              </w:rPr>
-              <w:t xml:space="preserve">         </w:t>
+              <w:t xml:space="preserve">RATNA         </w:t>
             </w:r>
           </w:p>
         </w:tc>
@@ -7464,8 +7459,6 @@
               </w:rPr>
               <w:t>L/O</w:t>
             </w:r>
-            <w:bookmarkStart w:id="0" w:name="_GoBack"/>
-            <w:bookmarkEnd w:id="0"/>
           </w:p>
         </w:tc>
         <w:tc>
@@ -8229,10 +8222,10 @@
     </w:pPr>
     <w:r>
       <w:object w:dxaOrig="1188" w:dyaOrig="900">
-        <v:rect id="_x0000_i1025" style="width:56.3pt;height:38.9pt" o:ole="" o:preferrelative="t" stroked="f">
+        <v:rect id="_x0000_i1025" style="width:56.25pt;height:39pt" o:ole="" o:preferrelative="t" stroked="f">
           <v:imagedata r:id="rId1" o:title=""/>
         </v:rect>
-        <o:OLEObject Type="Embed" ProgID="StaticMetafile" ShapeID="_x0000_i1025" DrawAspect="Content" ObjectID="_1851687512" r:id="rId2"/>
+        <o:OLEObject Type="Embed" ProgID="StaticMetafile" ShapeID="_x0000_i1025" DrawAspect="Content" ObjectID="_1851741084" r:id="rId2"/>
       </w:object>
     </w:r>
     <w:r>

</xml_diff>

<commit_message>
Sync - 2026-09-24 16:21
</commit_message>
<xml_diff>
--- a/files/Daily_Helicopter_Schedule.docx
+++ b/files/Daily_Helicopter_Schedule.docx
@@ -19,7 +19,7 @@
     </w:p>
     <w:tbl>
       <w:tblPr>
-        <w:tblW w:w="10151" w:type="dxa"/>
+        <w:tblW w:w="10488" w:type="dxa"/>
         <w:tblInd w:w="-431" w:type="dxa"/>
         <w:tblCellMar>
           <w:left w:w="10" w:type="dxa"/>
@@ -28,21 +28,21 @@
         <w:tblLook w:val="04A0" w:firstRow="1" w:lastRow="0" w:firstColumn="1" w:lastColumn="0" w:noHBand="0" w:noVBand="1"/>
       </w:tblPr>
       <w:tblGrid>
-        <w:gridCol w:w="706"/>
-        <w:gridCol w:w="1555"/>
-        <w:gridCol w:w="1413"/>
-        <w:gridCol w:w="2442"/>
-        <w:gridCol w:w="1504"/>
-        <w:gridCol w:w="1261"/>
-        <w:gridCol w:w="1270"/>
+        <w:gridCol w:w="729"/>
+        <w:gridCol w:w="1606"/>
+        <w:gridCol w:w="1460"/>
+        <w:gridCol w:w="2523"/>
+        <w:gridCol w:w="1554"/>
+        <w:gridCol w:w="1302"/>
+        <w:gridCol w:w="1314"/>
       </w:tblGrid>
       <w:tr>
         <w:trPr>
-          <w:trHeight w:val="1439"/>
+          <w:trHeight w:val="1510"/>
         </w:trPr>
         <w:tc>
           <w:tcPr>
-            <w:tcW w:w="706" w:type="dxa"/>
+            <w:tcW w:w="729" w:type="dxa"/>
             <w:tcBorders>
               <w:top w:val="single" w:sz="4" w:space="0" w:color="000000"/>
               <w:left w:val="single" w:sz="4" w:space="0" w:color="000000"/>
@@ -76,7 +76,7 @@
         </w:tc>
         <w:tc>
           <w:tcPr>
-            <w:tcW w:w="1555" w:type="dxa"/>
+            <w:tcW w:w="1606" w:type="dxa"/>
             <w:tcBorders>
               <w:top w:val="single" w:sz="4" w:space="0" w:color="000000"/>
               <w:left w:val="single" w:sz="4" w:space="0" w:color="000000"/>
@@ -136,7 +136,7 @@
         </w:tc>
         <w:tc>
           <w:tcPr>
-            <w:tcW w:w="1413" w:type="dxa"/>
+            <w:tcW w:w="1460" w:type="dxa"/>
             <w:tcBorders>
               <w:top w:val="single" w:sz="4" w:space="0" w:color="000000"/>
               <w:left w:val="single" w:sz="4" w:space="0" w:color="000000"/>
@@ -173,7 +173,7 @@
         </w:tc>
         <w:tc>
           <w:tcPr>
-            <w:tcW w:w="2442" w:type="dxa"/>
+            <w:tcW w:w="2523" w:type="dxa"/>
             <w:tcBorders>
               <w:top w:val="single" w:sz="4" w:space="0" w:color="000000"/>
               <w:left w:val="single" w:sz="4" w:space="0" w:color="000000"/>
@@ -253,7 +253,7 @@
         </w:tc>
         <w:tc>
           <w:tcPr>
-            <w:tcW w:w="1504" w:type="dxa"/>
+            <w:tcW w:w="1554" w:type="dxa"/>
             <w:tcBorders>
               <w:top w:val="single" w:sz="4" w:space="0" w:color="000000"/>
               <w:left w:val="single" w:sz="4" w:space="0" w:color="000000"/>
@@ -302,7 +302,7 @@
         </w:tc>
         <w:tc>
           <w:tcPr>
-            <w:tcW w:w="1261" w:type="dxa"/>
+            <w:tcW w:w="1302" w:type="dxa"/>
             <w:tcBorders>
               <w:top w:val="single" w:sz="4" w:space="0" w:color="000000"/>
               <w:left w:val="single" w:sz="4" w:space="0" w:color="000000"/>
@@ -338,7 +338,7 @@
         </w:tc>
         <w:tc>
           <w:tcPr>
-            <w:tcW w:w="1270" w:type="dxa"/>
+            <w:tcW w:w="1314" w:type="dxa"/>
             <w:tcBorders>
               <w:top w:val="single" w:sz="4" w:space="0" w:color="000000"/>
               <w:left w:val="single" w:sz="4" w:space="0" w:color="000000"/>
@@ -411,11 +411,11 @@
       </w:tr>
       <w:tr>
         <w:trPr>
-          <w:trHeight w:val="359"/>
+          <w:trHeight w:val="376"/>
         </w:trPr>
         <w:tc>
           <w:tcPr>
-            <w:tcW w:w="10151" w:type="dxa"/>
+            <w:tcW w:w="10488" w:type="dxa"/>
             <w:gridSpan w:val="7"/>
             <w:tcBorders>
               <w:top w:val="single" w:sz="4" w:space="0" w:color="000000"/>
@@ -466,11 +466,11 @@
       </w:tr>
       <w:tr>
         <w:trPr>
-          <w:trHeight w:val="340"/>
+          <w:trHeight w:val="357"/>
         </w:trPr>
         <w:tc>
           <w:tcPr>
-            <w:tcW w:w="706" w:type="dxa"/>
+            <w:tcW w:w="729" w:type="dxa"/>
             <w:tcBorders>
               <w:top w:val="single" w:sz="4" w:space="0" w:color="000000"/>
               <w:left w:val="single" w:sz="4" w:space="0" w:color="000000"/>
@@ -505,7 +505,7 @@
         </w:tc>
         <w:tc>
           <w:tcPr>
-            <w:tcW w:w="1555" w:type="dxa"/>
+            <w:tcW w:w="1606" w:type="dxa"/>
             <w:tcBorders>
               <w:top w:val="single" w:sz="4" w:space="0" w:color="000000"/>
               <w:left w:val="single" w:sz="4" w:space="0" w:color="000000"/>
@@ -540,7 +540,7 @@
         </w:tc>
         <w:tc>
           <w:tcPr>
-            <w:tcW w:w="1413" w:type="dxa"/>
+            <w:tcW w:w="1460" w:type="dxa"/>
             <w:tcBorders>
               <w:top w:val="single" w:sz="4" w:space="0" w:color="000000"/>
               <w:left w:val="single" w:sz="4" w:space="0" w:color="000000"/>
@@ -575,7 +575,7 @@
         </w:tc>
         <w:tc>
           <w:tcPr>
-            <w:tcW w:w="2442" w:type="dxa"/>
+            <w:tcW w:w="2523" w:type="dxa"/>
             <w:tcBorders>
               <w:top w:val="single" w:sz="4" w:space="0" w:color="000000"/>
               <w:left w:val="single" w:sz="4" w:space="0" w:color="000000"/>
@@ -610,7 +610,7 @@
         </w:tc>
         <w:tc>
           <w:tcPr>
-            <w:tcW w:w="1504" w:type="dxa"/>
+            <w:tcW w:w="1554" w:type="dxa"/>
             <w:tcBorders>
               <w:top w:val="single" w:sz="4" w:space="0" w:color="000000"/>
               <w:left w:val="single" w:sz="4" w:space="0" w:color="000000"/>
@@ -645,36 +645,36 @@
         </w:tc>
         <w:tc>
           <w:tcPr>
-            <w:tcW w:w="1261" w:type="dxa"/>
-            <w:tcBorders>
-              <w:top w:val="single" w:sz="4" w:space="0" w:color="000000"/>
-              <w:left w:val="single" w:sz="4" w:space="0" w:color="000000"/>
-              <w:bottom w:val="single" w:sz="4" w:space="0" w:color="000000"/>
-              <w:right w:val="single" w:sz="4" w:space="0" w:color="000000"/>
-            </w:tcBorders>
-            <w:shd w:val="clear" w:color="000000" w:fill="FFFFFF"/>
-            <w:tcMar>
-              <w:left w:w="108" w:type="dxa"/>
-              <w:right w:w="108" w:type="dxa"/>
-            </w:tcMar>
-          </w:tcPr>
-          <w:p>
-            <w:pPr>
-              <w:spacing w:after="0" w:line="240" w:lineRule="auto"/>
-              <w:jc w:val="center"/>
-              <w:rPr>
-                <w:rFonts w:ascii="Calibri" w:eastAsia="Calibri" w:hAnsi="Calibri" w:cs="Calibri"/>
-                <w:sz w:val="26"/>
-                <w:szCs w:val="26"/>
-              </w:rPr>
-            </w:pPr>
-            <w:r>
-              <w:rPr>
-                <w:rFonts w:ascii="Calibri" w:eastAsia="Calibri" w:hAnsi="Calibri" w:cs="Calibri"/>
-                <w:sz w:val="26"/>
-                <w:szCs w:val="26"/>
-              </w:rPr>
-              <w:t>NA</w:t>
+            <w:tcW w:w="1302" w:type="dxa"/>
+            <w:tcBorders>
+              <w:top w:val="single" w:sz="4" w:space="0" w:color="000000"/>
+              <w:left w:val="single" w:sz="4" w:space="0" w:color="000000"/>
+              <w:bottom w:val="single" w:sz="4" w:space="0" w:color="000000"/>
+              <w:right w:val="single" w:sz="4" w:space="0" w:color="000000"/>
+            </w:tcBorders>
+            <w:shd w:val="clear" w:color="000000" w:fill="FFFFFF"/>
+            <w:tcMar>
+              <w:left w:w="108" w:type="dxa"/>
+              <w:right w:w="108" w:type="dxa"/>
+            </w:tcMar>
+          </w:tcPr>
+          <w:p>
+            <w:pPr>
+              <w:spacing w:after="0" w:line="240" w:lineRule="auto"/>
+              <w:jc w:val="center"/>
+              <w:rPr>
+                <w:rFonts w:ascii="Calibri" w:eastAsia="Calibri" w:hAnsi="Calibri" w:cs="Calibri"/>
+                <w:sz w:val="26"/>
+                <w:szCs w:val="26"/>
+              </w:rPr>
+            </w:pPr>
+            <w:r>
+              <w:rPr>
+                <w:rFonts w:ascii="Calibri" w:eastAsia="Calibri" w:hAnsi="Calibri" w:cs="Calibri"/>
+                <w:sz w:val="26"/>
+                <w:szCs w:val="26"/>
+              </w:rPr>
+              <w:t>RRI</w:t>
             </w:r>
             <w:bookmarkStart w:id="0" w:name="_GoBack"/>
             <w:bookmarkEnd w:id="0"/>
@@ -682,7 +682,7 @@
         </w:tc>
         <w:tc>
           <w:tcPr>
-            <w:tcW w:w="1270" w:type="dxa"/>
+            <w:tcW w:w="1314" w:type="dxa"/>
             <w:tcBorders>
               <w:top w:val="single" w:sz="4" w:space="0" w:color="000000"/>
               <w:left w:val="single" w:sz="4" w:space="0" w:color="000000"/>
@@ -718,11 +718,11 @@
       </w:tr>
       <w:tr>
         <w:trPr>
-          <w:trHeight w:val="340"/>
+          <w:trHeight w:val="357"/>
         </w:trPr>
         <w:tc>
           <w:tcPr>
-            <w:tcW w:w="706" w:type="dxa"/>
+            <w:tcW w:w="729" w:type="dxa"/>
             <w:tcBorders>
               <w:top w:val="single" w:sz="4" w:space="0" w:color="000000"/>
               <w:left w:val="single" w:sz="4" w:space="0" w:color="000000"/>
@@ -757,7 +757,7 @@
         </w:tc>
         <w:tc>
           <w:tcPr>
-            <w:tcW w:w="1555" w:type="dxa"/>
+            <w:tcW w:w="1606" w:type="dxa"/>
             <w:tcBorders>
               <w:top w:val="single" w:sz="4" w:space="0" w:color="000000"/>
               <w:left w:val="single" w:sz="4" w:space="0" w:color="000000"/>
@@ -792,7 +792,7 @@
         </w:tc>
         <w:tc>
           <w:tcPr>
-            <w:tcW w:w="1413" w:type="dxa"/>
+            <w:tcW w:w="1460" w:type="dxa"/>
             <w:tcBorders>
               <w:top w:val="single" w:sz="4" w:space="0" w:color="000000"/>
               <w:left w:val="single" w:sz="4" w:space="0" w:color="000000"/>
@@ -827,7 +827,7 @@
         </w:tc>
         <w:tc>
           <w:tcPr>
-            <w:tcW w:w="2442" w:type="dxa"/>
+            <w:tcW w:w="2523" w:type="dxa"/>
             <w:tcBorders>
               <w:top w:val="single" w:sz="4" w:space="0" w:color="000000"/>
               <w:left w:val="single" w:sz="4" w:space="0" w:color="000000"/>
@@ -862,7 +862,7 @@
         </w:tc>
         <w:tc>
           <w:tcPr>
-            <w:tcW w:w="1504" w:type="dxa"/>
+            <w:tcW w:w="1554" w:type="dxa"/>
             <w:tcBorders>
               <w:top w:val="single" w:sz="4" w:space="0" w:color="000000"/>
               <w:left w:val="single" w:sz="4" w:space="0" w:color="000000"/>
@@ -897,7 +897,7 @@
         </w:tc>
         <w:tc>
           <w:tcPr>
-            <w:tcW w:w="1261" w:type="dxa"/>
+            <w:tcW w:w="1302" w:type="dxa"/>
             <w:tcBorders>
               <w:top w:val="single" w:sz="4" w:space="0" w:color="000000"/>
               <w:left w:val="single" w:sz="4" w:space="0" w:color="000000"/>
@@ -932,7 +932,7 @@
         </w:tc>
         <w:tc>
           <w:tcPr>
-            <w:tcW w:w="1270" w:type="dxa"/>
+            <w:tcW w:w="1314" w:type="dxa"/>
             <w:tcBorders>
               <w:top w:val="single" w:sz="4" w:space="0" w:color="000000"/>
               <w:left w:val="single" w:sz="4" w:space="0" w:color="000000"/>
@@ -968,11 +968,11 @@
       </w:tr>
       <w:tr>
         <w:trPr>
-          <w:trHeight w:val="321"/>
+          <w:trHeight w:val="337"/>
         </w:trPr>
         <w:tc>
           <w:tcPr>
-            <w:tcW w:w="706" w:type="dxa"/>
+            <w:tcW w:w="729" w:type="dxa"/>
             <w:tcBorders>
               <w:top w:val="single" w:sz="4" w:space="0" w:color="000000"/>
               <w:left w:val="single" w:sz="4" w:space="0" w:color="000000"/>
@@ -1007,7 +1007,7 @@
         </w:tc>
         <w:tc>
           <w:tcPr>
-            <w:tcW w:w="1555" w:type="dxa"/>
+            <w:tcW w:w="1606" w:type="dxa"/>
             <w:tcBorders>
               <w:top w:val="single" w:sz="4" w:space="0" w:color="000000"/>
               <w:left w:val="single" w:sz="4" w:space="0" w:color="000000"/>
@@ -1042,7 +1042,7 @@
         </w:tc>
         <w:tc>
           <w:tcPr>
-            <w:tcW w:w="1413" w:type="dxa"/>
+            <w:tcW w:w="1460" w:type="dxa"/>
             <w:tcBorders>
               <w:top w:val="single" w:sz="4" w:space="0" w:color="000000"/>
               <w:left w:val="single" w:sz="4" w:space="0" w:color="000000"/>
@@ -1077,7 +1077,7 @@
         </w:tc>
         <w:tc>
           <w:tcPr>
-            <w:tcW w:w="2442" w:type="dxa"/>
+            <w:tcW w:w="2523" w:type="dxa"/>
             <w:tcBorders>
               <w:top w:val="single" w:sz="4" w:space="0" w:color="000000"/>
               <w:left w:val="single" w:sz="4" w:space="0" w:color="000000"/>
@@ -1152,7 +1152,7 @@
         </w:tc>
         <w:tc>
           <w:tcPr>
-            <w:tcW w:w="1504" w:type="dxa"/>
+            <w:tcW w:w="1554" w:type="dxa"/>
             <w:tcBorders>
               <w:top w:val="single" w:sz="4" w:space="0" w:color="000000"/>
               <w:left w:val="single" w:sz="4" w:space="0" w:color="000000"/>
@@ -1187,7 +1187,7 @@
         </w:tc>
         <w:tc>
           <w:tcPr>
-            <w:tcW w:w="1261" w:type="dxa"/>
+            <w:tcW w:w="1302" w:type="dxa"/>
             <w:tcBorders>
               <w:top w:val="single" w:sz="4" w:space="0" w:color="000000"/>
               <w:left w:val="single" w:sz="4" w:space="0" w:color="000000"/>
@@ -1230,7 +1230,7 @@
         </w:tc>
         <w:tc>
           <w:tcPr>
-            <w:tcW w:w="1270" w:type="dxa"/>
+            <w:tcW w:w="1314" w:type="dxa"/>
             <w:tcBorders>
               <w:top w:val="single" w:sz="4" w:space="0" w:color="000000"/>
               <w:left w:val="single" w:sz="4" w:space="0" w:color="000000"/>
@@ -1266,11 +1266,11 @@
       </w:tr>
       <w:tr>
         <w:trPr>
-          <w:trHeight w:val="359"/>
+          <w:trHeight w:val="376"/>
         </w:trPr>
         <w:tc>
           <w:tcPr>
-            <w:tcW w:w="10151" w:type="dxa"/>
+            <w:tcW w:w="10488" w:type="dxa"/>
             <w:gridSpan w:val="7"/>
             <w:tcBorders>
               <w:top w:val="single" w:sz="4" w:space="0" w:color="000000"/>
@@ -1316,11 +1316,11 @@
       </w:tr>
       <w:tr>
         <w:trPr>
-          <w:trHeight w:val="321"/>
+          <w:trHeight w:val="337"/>
         </w:trPr>
         <w:tc>
           <w:tcPr>
-            <w:tcW w:w="706" w:type="dxa"/>
+            <w:tcW w:w="729" w:type="dxa"/>
             <w:tcBorders>
               <w:top w:val="single" w:sz="4" w:space="0" w:color="000000"/>
               <w:left w:val="single" w:sz="4" w:space="0" w:color="000000"/>
@@ -1355,7 +1355,7 @@
         </w:tc>
         <w:tc>
           <w:tcPr>
-            <w:tcW w:w="1555" w:type="dxa"/>
+            <w:tcW w:w="1606" w:type="dxa"/>
             <w:tcBorders>
               <w:top w:val="single" w:sz="4" w:space="0" w:color="000000"/>
               <w:left w:val="single" w:sz="4" w:space="0" w:color="000000"/>
@@ -1390,7 +1390,7 @@
         </w:tc>
         <w:tc>
           <w:tcPr>
-            <w:tcW w:w="1413" w:type="dxa"/>
+            <w:tcW w:w="1460" w:type="dxa"/>
             <w:tcBorders>
               <w:top w:val="single" w:sz="4" w:space="0" w:color="000000"/>
               <w:left w:val="single" w:sz="4" w:space="0" w:color="000000"/>
@@ -1429,7 +1429,7 @@
         </w:tc>
         <w:tc>
           <w:tcPr>
-            <w:tcW w:w="2442" w:type="dxa"/>
+            <w:tcW w:w="2523" w:type="dxa"/>
             <w:tcBorders>
               <w:top w:val="single" w:sz="4" w:space="0" w:color="000000"/>
               <w:left w:val="single" w:sz="4" w:space="0" w:color="000000"/>
@@ -1464,7 +1464,7 @@
         </w:tc>
         <w:tc>
           <w:tcPr>
-            <w:tcW w:w="1504" w:type="dxa"/>
+            <w:tcW w:w="1554" w:type="dxa"/>
             <w:tcBorders>
               <w:top w:val="single" w:sz="4" w:space="0" w:color="000000"/>
               <w:left w:val="single" w:sz="4" w:space="0" w:color="000000"/>
@@ -1501,7 +1501,7 @@
         </w:tc>
         <w:tc>
           <w:tcPr>
-            <w:tcW w:w="1261" w:type="dxa"/>
+            <w:tcW w:w="1302" w:type="dxa"/>
             <w:tcBorders>
               <w:top w:val="single" w:sz="4" w:space="0" w:color="000000"/>
               <w:left w:val="single" w:sz="4" w:space="0" w:color="000000"/>
@@ -1538,7 +1538,7 @@
         </w:tc>
         <w:tc>
           <w:tcPr>
-            <w:tcW w:w="1270" w:type="dxa"/>
+            <w:tcW w:w="1314" w:type="dxa"/>
             <w:tcBorders>
               <w:top w:val="single" w:sz="4" w:space="0" w:color="000000"/>
               <w:left w:val="single" w:sz="4" w:space="0" w:color="000000"/>
@@ -1582,11 +1582,11 @@
       </w:tr>
       <w:tr>
         <w:trPr>
-          <w:trHeight w:val="340"/>
+          <w:trHeight w:val="357"/>
         </w:trPr>
         <w:tc>
           <w:tcPr>
-            <w:tcW w:w="706" w:type="dxa"/>
+            <w:tcW w:w="729" w:type="dxa"/>
             <w:tcBorders>
               <w:top w:val="single" w:sz="4" w:space="0" w:color="000000"/>
               <w:left w:val="single" w:sz="4" w:space="0" w:color="000000"/>
@@ -1621,7 +1621,7 @@
         </w:tc>
         <w:tc>
           <w:tcPr>
-            <w:tcW w:w="1555" w:type="dxa"/>
+            <w:tcW w:w="1606" w:type="dxa"/>
             <w:tcBorders>
               <w:top w:val="single" w:sz="4" w:space="0" w:color="000000"/>
               <w:left w:val="single" w:sz="4" w:space="0" w:color="000000"/>
@@ -1656,7 +1656,7 @@
         </w:tc>
         <w:tc>
           <w:tcPr>
-            <w:tcW w:w="1413" w:type="dxa"/>
+            <w:tcW w:w="1460" w:type="dxa"/>
             <w:tcBorders>
               <w:top w:val="single" w:sz="4" w:space="0" w:color="000000"/>
               <w:left w:val="single" w:sz="4" w:space="0" w:color="000000"/>
@@ -1703,7 +1703,7 @@
         </w:tc>
         <w:tc>
           <w:tcPr>
-            <w:tcW w:w="2442" w:type="dxa"/>
+            <w:tcW w:w="2523" w:type="dxa"/>
             <w:tcBorders>
               <w:top w:val="single" w:sz="4" w:space="0" w:color="000000"/>
               <w:left w:val="single" w:sz="4" w:space="0" w:color="000000"/>
@@ -1750,7 +1750,7 @@
         </w:tc>
         <w:tc>
           <w:tcPr>
-            <w:tcW w:w="1504" w:type="dxa"/>
+            <w:tcW w:w="1554" w:type="dxa"/>
             <w:tcBorders>
               <w:top w:val="single" w:sz="4" w:space="0" w:color="000000"/>
               <w:left w:val="single" w:sz="4" w:space="0" w:color="000000"/>
@@ -1785,7 +1785,7 @@
         </w:tc>
         <w:tc>
           <w:tcPr>
-            <w:tcW w:w="1261" w:type="dxa"/>
+            <w:tcW w:w="1302" w:type="dxa"/>
             <w:tcBorders>
               <w:top w:val="single" w:sz="4" w:space="0" w:color="000000"/>
               <w:left w:val="single" w:sz="4" w:space="0" w:color="000000"/>
@@ -1820,7 +1820,7 @@
         </w:tc>
         <w:tc>
           <w:tcPr>
-            <w:tcW w:w="1270" w:type="dxa"/>
+            <w:tcW w:w="1314" w:type="dxa"/>
             <w:tcBorders>
               <w:top w:val="single" w:sz="4" w:space="0" w:color="000000"/>
               <w:left w:val="single" w:sz="4" w:space="0" w:color="000000"/>
@@ -1856,11 +1856,11 @@
       </w:tr>
       <w:tr>
         <w:trPr>
-          <w:trHeight w:val="340"/>
+          <w:trHeight w:val="357"/>
         </w:trPr>
         <w:tc>
           <w:tcPr>
-            <w:tcW w:w="706" w:type="dxa"/>
+            <w:tcW w:w="729" w:type="dxa"/>
             <w:tcBorders>
               <w:top w:val="single" w:sz="4" w:space="0" w:color="000000"/>
               <w:left w:val="single" w:sz="4" w:space="0" w:color="000000"/>
@@ -1895,7 +1895,7 @@
         </w:tc>
         <w:tc>
           <w:tcPr>
-            <w:tcW w:w="1555" w:type="dxa"/>
+            <w:tcW w:w="1606" w:type="dxa"/>
             <w:tcBorders>
               <w:top w:val="single" w:sz="4" w:space="0" w:color="000000"/>
               <w:left w:val="single" w:sz="4" w:space="0" w:color="000000"/>
@@ -1930,7 +1930,7 @@
         </w:tc>
         <w:tc>
           <w:tcPr>
-            <w:tcW w:w="1413" w:type="dxa"/>
+            <w:tcW w:w="1460" w:type="dxa"/>
             <w:tcBorders>
               <w:top w:val="single" w:sz="4" w:space="0" w:color="000000"/>
               <w:left w:val="single" w:sz="4" w:space="0" w:color="000000"/>
@@ -1969,7 +1969,7 @@
         </w:tc>
         <w:tc>
           <w:tcPr>
-            <w:tcW w:w="2442" w:type="dxa"/>
+            <w:tcW w:w="2523" w:type="dxa"/>
             <w:tcBorders>
               <w:top w:val="single" w:sz="4" w:space="0" w:color="000000"/>
               <w:left w:val="single" w:sz="4" w:space="0" w:color="000000"/>
@@ -2004,7 +2004,7 @@
         </w:tc>
         <w:tc>
           <w:tcPr>
-            <w:tcW w:w="1504" w:type="dxa"/>
+            <w:tcW w:w="1554" w:type="dxa"/>
             <w:tcBorders>
               <w:top w:val="single" w:sz="4" w:space="0" w:color="000000"/>
               <w:left w:val="single" w:sz="4" w:space="0" w:color="000000"/>
@@ -2042,7 +2042,7 @@
         </w:tc>
         <w:tc>
           <w:tcPr>
-            <w:tcW w:w="1261" w:type="dxa"/>
+            <w:tcW w:w="1302" w:type="dxa"/>
             <w:tcBorders>
               <w:top w:val="single" w:sz="4" w:space="0" w:color="000000"/>
               <w:left w:val="single" w:sz="4" w:space="0" w:color="000000"/>
@@ -2077,7 +2077,7 @@
         </w:tc>
         <w:tc>
           <w:tcPr>
-            <w:tcW w:w="1270" w:type="dxa"/>
+            <w:tcW w:w="1314" w:type="dxa"/>
             <w:tcBorders>
               <w:top w:val="single" w:sz="4" w:space="0" w:color="000000"/>
               <w:left w:val="single" w:sz="4" w:space="0" w:color="000000"/>
@@ -2113,11 +2113,11 @@
       </w:tr>
       <w:tr>
         <w:trPr>
-          <w:trHeight w:val="321"/>
+          <w:trHeight w:val="337"/>
         </w:trPr>
         <w:tc>
           <w:tcPr>
-            <w:tcW w:w="706" w:type="dxa"/>
+            <w:tcW w:w="729" w:type="dxa"/>
             <w:tcBorders>
               <w:top w:val="single" w:sz="4" w:space="0" w:color="000000"/>
               <w:left w:val="single" w:sz="4" w:space="0" w:color="000000"/>
@@ -2152,7 +2152,7 @@
         </w:tc>
         <w:tc>
           <w:tcPr>
-            <w:tcW w:w="1555" w:type="dxa"/>
+            <w:tcW w:w="1606" w:type="dxa"/>
             <w:tcBorders>
               <w:top w:val="single" w:sz="4" w:space="0" w:color="000000"/>
               <w:left w:val="single" w:sz="4" w:space="0" w:color="000000"/>
@@ -2187,7 +2187,7 @@
         </w:tc>
         <w:tc>
           <w:tcPr>
-            <w:tcW w:w="1413" w:type="dxa"/>
+            <w:tcW w:w="1460" w:type="dxa"/>
             <w:tcBorders>
               <w:top w:val="single" w:sz="4" w:space="0" w:color="000000"/>
               <w:left w:val="single" w:sz="4" w:space="0" w:color="000000"/>
@@ -2226,7 +2226,7 @@
         </w:tc>
         <w:tc>
           <w:tcPr>
-            <w:tcW w:w="2442" w:type="dxa"/>
+            <w:tcW w:w="2523" w:type="dxa"/>
             <w:tcBorders>
               <w:top w:val="single" w:sz="4" w:space="0" w:color="000000"/>
               <w:left w:val="single" w:sz="4" w:space="0" w:color="000000"/>
@@ -2261,7 +2261,7 @@
         </w:tc>
         <w:tc>
           <w:tcPr>
-            <w:tcW w:w="1504" w:type="dxa"/>
+            <w:tcW w:w="1554" w:type="dxa"/>
             <w:tcBorders>
               <w:top w:val="single" w:sz="4" w:space="0" w:color="000000"/>
               <w:left w:val="single" w:sz="4" w:space="0" w:color="000000"/>
@@ -2299,7 +2299,7 @@
         </w:tc>
         <w:tc>
           <w:tcPr>
-            <w:tcW w:w="1261" w:type="dxa"/>
+            <w:tcW w:w="1302" w:type="dxa"/>
             <w:tcBorders>
               <w:top w:val="single" w:sz="4" w:space="0" w:color="000000"/>
               <w:left w:val="single" w:sz="4" w:space="0" w:color="000000"/>
@@ -2334,7 +2334,7 @@
         </w:tc>
         <w:tc>
           <w:tcPr>
-            <w:tcW w:w="1270" w:type="dxa"/>
+            <w:tcW w:w="1314" w:type="dxa"/>
             <w:tcBorders>
               <w:top w:val="single" w:sz="4" w:space="0" w:color="000000"/>
               <w:left w:val="single" w:sz="4" w:space="0" w:color="000000"/>
@@ -2370,11 +2370,11 @@
       </w:tr>
       <w:tr>
         <w:trPr>
-          <w:trHeight w:val="359"/>
+          <w:trHeight w:val="376"/>
         </w:trPr>
         <w:tc>
           <w:tcPr>
-            <w:tcW w:w="10151" w:type="dxa"/>
+            <w:tcW w:w="10488" w:type="dxa"/>
             <w:gridSpan w:val="7"/>
             <w:tcBorders>
               <w:top w:val="single" w:sz="4" w:space="0" w:color="000000"/>
@@ -2420,11 +2420,11 @@
       </w:tr>
       <w:tr>
         <w:trPr>
-          <w:trHeight w:val="340"/>
+          <w:trHeight w:val="357"/>
         </w:trPr>
         <w:tc>
           <w:tcPr>
-            <w:tcW w:w="706" w:type="dxa"/>
+            <w:tcW w:w="729" w:type="dxa"/>
             <w:tcBorders>
               <w:top w:val="single" w:sz="4" w:space="0" w:color="000000"/>
               <w:left w:val="single" w:sz="4" w:space="0" w:color="000000"/>
@@ -2459,7 +2459,7 @@
         </w:tc>
         <w:tc>
           <w:tcPr>
-            <w:tcW w:w="1555" w:type="dxa"/>
+            <w:tcW w:w="1606" w:type="dxa"/>
             <w:tcBorders>
               <w:top w:val="single" w:sz="4" w:space="0" w:color="000000"/>
               <w:left w:val="single" w:sz="4" w:space="0" w:color="000000"/>
@@ -2494,7 +2494,7 @@
         </w:tc>
         <w:tc>
           <w:tcPr>
-            <w:tcW w:w="1413" w:type="dxa"/>
+            <w:tcW w:w="1460" w:type="dxa"/>
             <w:tcBorders>
               <w:top w:val="single" w:sz="4" w:space="0" w:color="000000"/>
               <w:left w:val="single" w:sz="4" w:space="0" w:color="000000"/>
@@ -2529,7 +2529,7 @@
         </w:tc>
         <w:tc>
           <w:tcPr>
-            <w:tcW w:w="2442" w:type="dxa"/>
+            <w:tcW w:w="2523" w:type="dxa"/>
             <w:tcBorders>
               <w:top w:val="single" w:sz="4" w:space="0" w:color="000000"/>
               <w:left w:val="single" w:sz="4" w:space="0" w:color="000000"/>
@@ -2564,7 +2564,7 @@
         </w:tc>
         <w:tc>
           <w:tcPr>
-            <w:tcW w:w="1504" w:type="dxa"/>
+            <w:tcW w:w="1554" w:type="dxa"/>
             <w:tcBorders>
               <w:top w:val="single" w:sz="4" w:space="0" w:color="000000"/>
               <w:left w:val="single" w:sz="4" w:space="0" w:color="000000"/>
@@ -2599,7 +2599,7 @@
         </w:tc>
         <w:tc>
           <w:tcPr>
-            <w:tcW w:w="1261" w:type="dxa"/>
+            <w:tcW w:w="1302" w:type="dxa"/>
             <w:tcBorders>
               <w:top w:val="single" w:sz="4" w:space="0" w:color="000000"/>
               <w:left w:val="single" w:sz="4" w:space="0" w:color="000000"/>
@@ -2634,7 +2634,7 @@
         </w:tc>
         <w:tc>
           <w:tcPr>
-            <w:tcW w:w="1270" w:type="dxa"/>
+            <w:tcW w:w="1314" w:type="dxa"/>
             <w:tcBorders>
               <w:top w:val="single" w:sz="4" w:space="0" w:color="000000"/>
               <w:left w:val="single" w:sz="4" w:space="0" w:color="000000"/>
@@ -2670,11 +2670,11 @@
       </w:tr>
       <w:tr>
         <w:trPr>
-          <w:trHeight w:val="359"/>
+          <w:trHeight w:val="376"/>
         </w:trPr>
         <w:tc>
           <w:tcPr>
-            <w:tcW w:w="10151" w:type="dxa"/>
+            <w:tcW w:w="10488" w:type="dxa"/>
             <w:gridSpan w:val="7"/>
             <w:tcBorders>
               <w:top w:val="single" w:sz="4" w:space="0" w:color="000000"/>
@@ -2730,11 +2730,11 @@
       </w:tr>
       <w:tr>
         <w:trPr>
-          <w:trHeight w:val="340"/>
+          <w:trHeight w:val="357"/>
         </w:trPr>
         <w:tc>
           <w:tcPr>
-            <w:tcW w:w="706" w:type="dxa"/>
+            <w:tcW w:w="729" w:type="dxa"/>
             <w:tcBorders>
               <w:top w:val="single" w:sz="4" w:space="0" w:color="000000"/>
               <w:left w:val="single" w:sz="4" w:space="0" w:color="000000"/>
@@ -2769,7 +2769,7 @@
         </w:tc>
         <w:tc>
           <w:tcPr>
-            <w:tcW w:w="1555" w:type="dxa"/>
+            <w:tcW w:w="1606" w:type="dxa"/>
             <w:tcBorders>
               <w:top w:val="single" w:sz="4" w:space="0" w:color="000000"/>
               <w:left w:val="single" w:sz="4" w:space="0" w:color="000000"/>
@@ -2804,7 +2804,7 @@
         </w:tc>
         <w:tc>
           <w:tcPr>
-            <w:tcW w:w="1413" w:type="dxa"/>
+            <w:tcW w:w="1460" w:type="dxa"/>
             <w:tcBorders>
               <w:top w:val="single" w:sz="4" w:space="0" w:color="000000"/>
               <w:left w:val="single" w:sz="4" w:space="0" w:color="000000"/>
@@ -2843,7 +2843,7 @@
         </w:tc>
         <w:tc>
           <w:tcPr>
-            <w:tcW w:w="2442" w:type="dxa"/>
+            <w:tcW w:w="2523" w:type="dxa"/>
             <w:tcBorders>
               <w:top w:val="single" w:sz="4" w:space="0" w:color="000000"/>
               <w:left w:val="single" w:sz="4" w:space="0" w:color="000000"/>
@@ -2879,7 +2879,7 @@
         </w:tc>
         <w:tc>
           <w:tcPr>
-            <w:tcW w:w="1504" w:type="dxa"/>
+            <w:tcW w:w="1554" w:type="dxa"/>
             <w:tcBorders>
               <w:top w:val="single" w:sz="4" w:space="0" w:color="000000"/>
               <w:left w:val="single" w:sz="4" w:space="0" w:color="000000"/>
@@ -2907,34 +2907,34 @@
         </w:tc>
         <w:tc>
           <w:tcPr>
-            <w:tcW w:w="1261" w:type="dxa"/>
-            <w:tcBorders>
-              <w:top w:val="single" w:sz="4" w:space="0" w:color="000000"/>
-              <w:left w:val="single" w:sz="4" w:space="0" w:color="000000"/>
-              <w:bottom w:val="single" w:sz="4" w:space="0" w:color="000000"/>
-              <w:right w:val="single" w:sz="4" w:space="0" w:color="000000"/>
-            </w:tcBorders>
-            <w:shd w:val="clear" w:color="000000" w:fill="FFFFFF"/>
-            <w:tcMar>
-              <w:left w:w="108" w:type="dxa"/>
-              <w:right w:w="108" w:type="dxa"/>
-            </w:tcMar>
-          </w:tcPr>
-          <w:p>
-            <w:pPr>
-              <w:spacing w:after="0" w:line="240" w:lineRule="auto"/>
-              <w:jc w:val="center"/>
-              <w:rPr>
-                <w:rFonts w:ascii="Calibri" w:eastAsia="Calibri" w:hAnsi="Calibri" w:cs="Calibri"/>
-                <w:sz w:val="26"/>
-                <w:szCs w:val="26"/>
-              </w:rPr>
-            </w:pPr>
-          </w:p>
-        </w:tc>
-        <w:tc>
-          <w:tcPr>
-            <w:tcW w:w="1270" w:type="dxa"/>
+            <w:tcW w:w="1302" w:type="dxa"/>
+            <w:tcBorders>
+              <w:top w:val="single" w:sz="4" w:space="0" w:color="000000"/>
+              <w:left w:val="single" w:sz="4" w:space="0" w:color="000000"/>
+              <w:bottom w:val="single" w:sz="4" w:space="0" w:color="000000"/>
+              <w:right w:val="single" w:sz="4" w:space="0" w:color="000000"/>
+            </w:tcBorders>
+            <w:shd w:val="clear" w:color="000000" w:fill="FFFFFF"/>
+            <w:tcMar>
+              <w:left w:w="108" w:type="dxa"/>
+              <w:right w:w="108" w:type="dxa"/>
+            </w:tcMar>
+          </w:tcPr>
+          <w:p>
+            <w:pPr>
+              <w:spacing w:after="0" w:line="240" w:lineRule="auto"/>
+              <w:jc w:val="center"/>
+              <w:rPr>
+                <w:rFonts w:ascii="Calibri" w:eastAsia="Calibri" w:hAnsi="Calibri" w:cs="Calibri"/>
+                <w:sz w:val="26"/>
+                <w:szCs w:val="26"/>
+              </w:rPr>
+            </w:pPr>
+          </w:p>
+        </w:tc>
+        <w:tc>
+          <w:tcPr>
+            <w:tcW w:w="1314" w:type="dxa"/>
             <w:tcBorders>
               <w:top w:val="single" w:sz="4" w:space="0" w:color="000000"/>
               <w:left w:val="single" w:sz="4" w:space="0" w:color="000000"/>
@@ -2962,11 +2962,11 @@
       </w:tr>
       <w:tr>
         <w:trPr>
-          <w:trHeight w:val="321"/>
+          <w:trHeight w:val="337"/>
         </w:trPr>
         <w:tc>
           <w:tcPr>
-            <w:tcW w:w="706" w:type="dxa"/>
+            <w:tcW w:w="729" w:type="dxa"/>
             <w:tcBorders>
               <w:top w:val="single" w:sz="4" w:space="0" w:color="000000"/>
               <w:left w:val="single" w:sz="4" w:space="0" w:color="000000"/>
@@ -3001,7 +3001,7 @@
         </w:tc>
         <w:tc>
           <w:tcPr>
-            <w:tcW w:w="1555" w:type="dxa"/>
+            <w:tcW w:w="1606" w:type="dxa"/>
             <w:tcBorders>
               <w:top w:val="single" w:sz="4" w:space="0" w:color="000000"/>
               <w:left w:val="single" w:sz="4" w:space="0" w:color="000000"/>
@@ -3036,7 +3036,7 @@
         </w:tc>
         <w:tc>
           <w:tcPr>
-            <w:tcW w:w="1413" w:type="dxa"/>
+            <w:tcW w:w="1460" w:type="dxa"/>
             <w:tcBorders>
               <w:top w:val="single" w:sz="4" w:space="0" w:color="000000"/>
               <w:left w:val="single" w:sz="4" w:space="0" w:color="000000"/>
@@ -3083,42 +3083,7 @@
         </w:tc>
         <w:tc>
           <w:tcPr>
-            <w:tcW w:w="2442" w:type="dxa"/>
-            <w:tcBorders>
-              <w:top w:val="single" w:sz="4" w:space="0" w:color="000000"/>
-              <w:left w:val="single" w:sz="4" w:space="0" w:color="000000"/>
-              <w:bottom w:val="single" w:sz="4" w:space="0" w:color="000000"/>
-              <w:right w:val="single" w:sz="4" w:space="0" w:color="000000"/>
-            </w:tcBorders>
-            <w:shd w:val="clear" w:color="000000" w:fill="FFFFFF"/>
-            <w:tcMar>
-              <w:left w:w="108" w:type="dxa"/>
-              <w:right w:w="108" w:type="dxa"/>
-            </w:tcMar>
-          </w:tcPr>
-          <w:p>
-            <w:pPr>
-              <w:spacing w:after="0" w:line="240" w:lineRule="auto"/>
-              <w:jc w:val="center"/>
-              <w:rPr>
-                <w:rFonts w:ascii="Calibri" w:eastAsia="Calibri" w:hAnsi="Calibri" w:cs="Calibri"/>
-                <w:sz w:val="26"/>
-                <w:szCs w:val="26"/>
-              </w:rPr>
-            </w:pPr>
-            <w:r>
-              <w:rPr>
-                <w:rFonts w:ascii="Calibri" w:eastAsia="Calibri" w:hAnsi="Calibri" w:cs="Calibri"/>
-                <w:sz w:val="26"/>
-                <w:szCs w:val="26"/>
-              </w:rPr>
-              <w:t xml:space="preserve"> NA</w:t>
-            </w:r>
-          </w:p>
-        </w:tc>
-        <w:tc>
-          <w:tcPr>
-            <w:tcW w:w="1504" w:type="dxa"/>
+            <w:tcW w:w="2523" w:type="dxa"/>
             <w:tcBorders>
               <w:top w:val="single" w:sz="4" w:space="0" w:color="000000"/>
               <w:left w:val="single" w:sz="4" w:space="0" w:color="000000"/>
@@ -3142,39 +3107,76 @@
                 <w:szCs w:val="26"/>
               </w:rPr>
             </w:pPr>
-          </w:p>
-        </w:tc>
-        <w:tc>
-          <w:tcPr>
-            <w:tcW w:w="1261" w:type="dxa"/>
-            <w:tcBorders>
-              <w:top w:val="single" w:sz="4" w:space="0" w:color="000000"/>
-              <w:left w:val="single" w:sz="4" w:space="0" w:color="000000"/>
-              <w:bottom w:val="single" w:sz="4" w:space="0" w:color="000000"/>
-              <w:right w:val="single" w:sz="4" w:space="0" w:color="000000"/>
-            </w:tcBorders>
-            <w:shd w:val="clear" w:color="000000" w:fill="FFFFFF"/>
-            <w:tcMar>
-              <w:left w:w="108" w:type="dxa"/>
-              <w:right w:w="108" w:type="dxa"/>
-            </w:tcMar>
-          </w:tcPr>
-          <w:p>
-            <w:pPr>
-              <w:spacing w:after="0" w:line="240" w:lineRule="auto"/>
-              <w:jc w:val="center"/>
+            <w:r>
               <w:rPr>
                 <w:rFonts w:ascii="Calibri" w:eastAsia="Calibri" w:hAnsi="Calibri" w:cs="Calibri"/>
                 <w:b/>
                 <w:sz w:val="26"/>
                 <w:szCs w:val="26"/>
               </w:rPr>
-            </w:pPr>
-          </w:p>
-        </w:tc>
-        <w:tc>
-          <w:tcPr>
-            <w:tcW w:w="1270" w:type="dxa"/>
+              <w:t>NA</w:t>
+            </w:r>
+          </w:p>
+        </w:tc>
+        <w:tc>
+          <w:tcPr>
+            <w:tcW w:w="1554" w:type="dxa"/>
+            <w:tcBorders>
+              <w:top w:val="single" w:sz="4" w:space="0" w:color="000000"/>
+              <w:left w:val="single" w:sz="4" w:space="0" w:color="000000"/>
+              <w:bottom w:val="single" w:sz="4" w:space="0" w:color="000000"/>
+              <w:right w:val="single" w:sz="4" w:space="0" w:color="000000"/>
+            </w:tcBorders>
+            <w:shd w:val="clear" w:color="000000" w:fill="FFFFFF"/>
+            <w:tcMar>
+              <w:left w:w="108" w:type="dxa"/>
+              <w:right w:w="108" w:type="dxa"/>
+            </w:tcMar>
+          </w:tcPr>
+          <w:p>
+            <w:pPr>
+              <w:spacing w:after="0" w:line="240" w:lineRule="auto"/>
+              <w:jc w:val="center"/>
+              <w:rPr>
+                <w:rFonts w:ascii="Calibri" w:eastAsia="Calibri" w:hAnsi="Calibri" w:cs="Calibri"/>
+                <w:b/>
+                <w:sz w:val="26"/>
+                <w:szCs w:val="26"/>
+              </w:rPr>
+            </w:pPr>
+          </w:p>
+        </w:tc>
+        <w:tc>
+          <w:tcPr>
+            <w:tcW w:w="1302" w:type="dxa"/>
+            <w:tcBorders>
+              <w:top w:val="single" w:sz="4" w:space="0" w:color="000000"/>
+              <w:left w:val="single" w:sz="4" w:space="0" w:color="000000"/>
+              <w:bottom w:val="single" w:sz="4" w:space="0" w:color="000000"/>
+              <w:right w:val="single" w:sz="4" w:space="0" w:color="000000"/>
+            </w:tcBorders>
+            <w:shd w:val="clear" w:color="000000" w:fill="FFFFFF"/>
+            <w:tcMar>
+              <w:left w:w="108" w:type="dxa"/>
+              <w:right w:w="108" w:type="dxa"/>
+            </w:tcMar>
+          </w:tcPr>
+          <w:p>
+            <w:pPr>
+              <w:spacing w:after="0" w:line="240" w:lineRule="auto"/>
+              <w:jc w:val="center"/>
+              <w:rPr>
+                <w:rFonts w:ascii="Calibri" w:eastAsia="Calibri" w:hAnsi="Calibri" w:cs="Calibri"/>
+                <w:b/>
+                <w:sz w:val="26"/>
+                <w:szCs w:val="26"/>
+              </w:rPr>
+            </w:pPr>
+          </w:p>
+        </w:tc>
+        <w:tc>
+          <w:tcPr>
+            <w:tcW w:w="1314" w:type="dxa"/>
             <w:tcBorders>
               <w:top w:val="single" w:sz="4" w:space="0" w:color="000000"/>
               <w:left w:val="single" w:sz="4" w:space="0" w:color="000000"/>
@@ -3202,11 +3204,11 @@
       </w:tr>
       <w:tr>
         <w:trPr>
-          <w:trHeight w:val="340"/>
+          <w:trHeight w:val="357"/>
         </w:trPr>
         <w:tc>
           <w:tcPr>
-            <w:tcW w:w="706" w:type="dxa"/>
+            <w:tcW w:w="729" w:type="dxa"/>
             <w:tcBorders>
               <w:top w:val="single" w:sz="4" w:space="0" w:color="000000"/>
               <w:left w:val="single" w:sz="4" w:space="0" w:color="000000"/>
@@ -3241,7 +3243,7 @@
         </w:tc>
         <w:tc>
           <w:tcPr>
-            <w:tcW w:w="1555" w:type="dxa"/>
+            <w:tcW w:w="1606" w:type="dxa"/>
             <w:tcBorders>
               <w:top w:val="single" w:sz="4" w:space="0" w:color="000000"/>
               <w:left w:val="single" w:sz="4" w:space="0" w:color="000000"/>
@@ -3276,7 +3278,7 @@
         </w:tc>
         <w:tc>
           <w:tcPr>
-            <w:tcW w:w="1413" w:type="dxa"/>
+            <w:tcW w:w="1460" w:type="dxa"/>
             <w:tcBorders>
               <w:top w:val="single" w:sz="4" w:space="0" w:color="000000"/>
               <w:left w:val="single" w:sz="4" w:space="0" w:color="000000"/>
@@ -3323,7 +3325,7 @@
         </w:tc>
         <w:tc>
           <w:tcPr>
-            <w:tcW w:w="2442" w:type="dxa"/>
+            <w:tcW w:w="2523" w:type="dxa"/>
             <w:tcBorders>
               <w:top w:val="single" w:sz="4" w:space="0" w:color="000000"/>
               <w:left w:val="single" w:sz="4" w:space="0" w:color="000000"/>
@@ -3359,7 +3361,7 @@
         </w:tc>
         <w:tc>
           <w:tcPr>
-            <w:tcW w:w="1504" w:type="dxa"/>
+            <w:tcW w:w="1554" w:type="dxa"/>
             <w:tcBorders>
               <w:top w:val="single" w:sz="4" w:space="0" w:color="000000"/>
               <w:left w:val="single" w:sz="4" w:space="0" w:color="000000"/>
@@ -3387,34 +3389,34 @@
         </w:tc>
         <w:tc>
           <w:tcPr>
-            <w:tcW w:w="1261" w:type="dxa"/>
-            <w:tcBorders>
-              <w:top w:val="single" w:sz="4" w:space="0" w:color="000000"/>
-              <w:left w:val="single" w:sz="4" w:space="0" w:color="000000"/>
-              <w:bottom w:val="single" w:sz="4" w:space="0" w:color="000000"/>
-              <w:right w:val="single" w:sz="4" w:space="0" w:color="000000"/>
-            </w:tcBorders>
-            <w:shd w:val="clear" w:color="000000" w:fill="FFFFFF"/>
-            <w:tcMar>
-              <w:left w:w="108" w:type="dxa"/>
-              <w:right w:w="108" w:type="dxa"/>
-            </w:tcMar>
-          </w:tcPr>
-          <w:p>
-            <w:pPr>
-              <w:spacing w:after="0" w:line="240" w:lineRule="auto"/>
-              <w:jc w:val="center"/>
-              <w:rPr>
-                <w:rFonts w:ascii="Calibri" w:eastAsia="Calibri" w:hAnsi="Calibri" w:cs="Calibri"/>
-                <w:sz w:val="26"/>
-                <w:szCs w:val="26"/>
-              </w:rPr>
-            </w:pPr>
-          </w:p>
-        </w:tc>
-        <w:tc>
-          <w:tcPr>
-            <w:tcW w:w="1270" w:type="dxa"/>
+            <w:tcW w:w="1302" w:type="dxa"/>
+            <w:tcBorders>
+              <w:top w:val="single" w:sz="4" w:space="0" w:color="000000"/>
+              <w:left w:val="single" w:sz="4" w:space="0" w:color="000000"/>
+              <w:bottom w:val="single" w:sz="4" w:space="0" w:color="000000"/>
+              <w:right w:val="single" w:sz="4" w:space="0" w:color="000000"/>
+            </w:tcBorders>
+            <w:shd w:val="clear" w:color="000000" w:fill="FFFFFF"/>
+            <w:tcMar>
+              <w:left w:w="108" w:type="dxa"/>
+              <w:right w:w="108" w:type="dxa"/>
+            </w:tcMar>
+          </w:tcPr>
+          <w:p>
+            <w:pPr>
+              <w:spacing w:after="0" w:line="240" w:lineRule="auto"/>
+              <w:jc w:val="center"/>
+              <w:rPr>
+                <w:rFonts w:ascii="Calibri" w:eastAsia="Calibri" w:hAnsi="Calibri" w:cs="Calibri"/>
+                <w:sz w:val="26"/>
+                <w:szCs w:val="26"/>
+              </w:rPr>
+            </w:pPr>
+          </w:p>
+        </w:tc>
+        <w:tc>
+          <w:tcPr>
+            <w:tcW w:w="1314" w:type="dxa"/>
             <w:tcBorders>
               <w:top w:val="single" w:sz="4" w:space="0" w:color="000000"/>
               <w:left w:val="single" w:sz="4" w:space="0" w:color="000000"/>
@@ -3442,11 +3444,11 @@
       </w:tr>
       <w:tr>
         <w:trPr>
-          <w:trHeight w:val="321"/>
+          <w:trHeight w:val="337"/>
         </w:trPr>
         <w:tc>
           <w:tcPr>
-            <w:tcW w:w="706" w:type="dxa"/>
+            <w:tcW w:w="729" w:type="dxa"/>
             <w:tcBorders>
               <w:top w:val="single" w:sz="4" w:space="0" w:color="000000"/>
               <w:left w:val="single" w:sz="4" w:space="0" w:color="000000"/>
@@ -3481,7 +3483,7 @@
         </w:tc>
         <w:tc>
           <w:tcPr>
-            <w:tcW w:w="1555" w:type="dxa"/>
+            <w:tcW w:w="1606" w:type="dxa"/>
             <w:tcBorders>
               <w:top w:val="single" w:sz="4" w:space="0" w:color="000000"/>
               <w:left w:val="single" w:sz="4" w:space="0" w:color="000000"/>
@@ -3516,7 +3518,7 @@
         </w:tc>
         <w:tc>
           <w:tcPr>
-            <w:tcW w:w="1413" w:type="dxa"/>
+            <w:tcW w:w="1460" w:type="dxa"/>
             <w:tcBorders>
               <w:top w:val="single" w:sz="4" w:space="0" w:color="000000"/>
               <w:left w:val="single" w:sz="4" w:space="0" w:color="000000"/>
@@ -3555,7 +3557,7 @@
         </w:tc>
         <w:tc>
           <w:tcPr>
-            <w:tcW w:w="2442" w:type="dxa"/>
+            <w:tcW w:w="2523" w:type="dxa"/>
             <w:tcBorders>
               <w:top w:val="single" w:sz="4" w:space="0" w:color="000000"/>
               <w:left w:val="single" w:sz="4" w:space="0" w:color="000000"/>
@@ -3592,7 +3594,7 @@
         </w:tc>
         <w:tc>
           <w:tcPr>
-            <w:tcW w:w="1504" w:type="dxa"/>
+            <w:tcW w:w="1554" w:type="dxa"/>
             <w:tcBorders>
               <w:top w:val="single" w:sz="4" w:space="0" w:color="000000"/>
               <w:left w:val="single" w:sz="4" w:space="0" w:color="000000"/>
@@ -3620,7 +3622,7 @@
         </w:tc>
         <w:tc>
           <w:tcPr>
-            <w:tcW w:w="1261" w:type="dxa"/>
+            <w:tcW w:w="1302" w:type="dxa"/>
             <w:tcBorders>
               <w:top w:val="single" w:sz="4" w:space="0" w:color="000000"/>
               <w:left w:val="single" w:sz="4" w:space="0" w:color="000000"/>
@@ -3648,7 +3650,7 @@
         </w:tc>
         <w:tc>
           <w:tcPr>
-            <w:tcW w:w="1270" w:type="dxa"/>
+            <w:tcW w:w="1314" w:type="dxa"/>
             <w:tcBorders>
               <w:top w:val="single" w:sz="4" w:space="0" w:color="000000"/>
               <w:left w:val="single" w:sz="4" w:space="0" w:color="000000"/>
@@ -3676,11 +3678,11 @@
       </w:tr>
       <w:tr>
         <w:trPr>
-          <w:trHeight w:val="340"/>
+          <w:trHeight w:val="357"/>
         </w:trPr>
         <w:tc>
           <w:tcPr>
-            <w:tcW w:w="706" w:type="dxa"/>
+            <w:tcW w:w="729" w:type="dxa"/>
             <w:tcBorders>
               <w:top w:val="single" w:sz="4" w:space="0" w:color="000000"/>
               <w:left w:val="single" w:sz="4" w:space="0" w:color="000000"/>
@@ -3715,7 +3717,7 @@
         </w:tc>
         <w:tc>
           <w:tcPr>
-            <w:tcW w:w="1555" w:type="dxa"/>
+            <w:tcW w:w="1606" w:type="dxa"/>
             <w:tcBorders>
               <w:top w:val="single" w:sz="4" w:space="0" w:color="000000"/>
               <w:left w:val="single" w:sz="4" w:space="0" w:color="000000"/>
@@ -3750,7 +3752,7 @@
         </w:tc>
         <w:tc>
           <w:tcPr>
-            <w:tcW w:w="1413" w:type="dxa"/>
+            <w:tcW w:w="1460" w:type="dxa"/>
             <w:tcBorders>
               <w:top w:val="single" w:sz="4" w:space="0" w:color="000000"/>
               <w:left w:val="single" w:sz="4" w:space="0" w:color="000000"/>
@@ -3789,7 +3791,7 @@
         </w:tc>
         <w:tc>
           <w:tcPr>
-            <w:tcW w:w="2442" w:type="dxa"/>
+            <w:tcW w:w="2523" w:type="dxa"/>
             <w:tcBorders>
               <w:top w:val="single" w:sz="4" w:space="0" w:color="000000"/>
               <w:left w:val="single" w:sz="4" w:space="0" w:color="000000"/>
@@ -3829,7 +3831,7 @@
         </w:tc>
         <w:tc>
           <w:tcPr>
-            <w:tcW w:w="1504" w:type="dxa"/>
+            <w:tcW w:w="1554" w:type="dxa"/>
             <w:tcBorders>
               <w:top w:val="single" w:sz="4" w:space="0" w:color="000000"/>
               <w:left w:val="single" w:sz="4" w:space="0" w:color="000000"/>
@@ -3857,34 +3859,34 @@
         </w:tc>
         <w:tc>
           <w:tcPr>
-            <w:tcW w:w="1261" w:type="dxa"/>
-            <w:tcBorders>
-              <w:top w:val="single" w:sz="4" w:space="0" w:color="000000"/>
-              <w:left w:val="single" w:sz="4" w:space="0" w:color="000000"/>
-              <w:bottom w:val="single" w:sz="4" w:space="0" w:color="000000"/>
-              <w:right w:val="single" w:sz="4" w:space="0" w:color="000000"/>
-            </w:tcBorders>
-            <w:shd w:val="clear" w:color="000000" w:fill="FFFFFF"/>
-            <w:tcMar>
-              <w:left w:w="108" w:type="dxa"/>
-              <w:right w:w="108" w:type="dxa"/>
-            </w:tcMar>
-          </w:tcPr>
-          <w:p>
-            <w:pPr>
-              <w:spacing w:after="0" w:line="240" w:lineRule="auto"/>
-              <w:jc w:val="center"/>
-              <w:rPr>
-                <w:rFonts w:ascii="Calibri" w:eastAsia="Calibri" w:hAnsi="Calibri" w:cs="Calibri"/>
-                <w:sz w:val="26"/>
-                <w:szCs w:val="26"/>
-              </w:rPr>
-            </w:pPr>
-          </w:p>
-        </w:tc>
-        <w:tc>
-          <w:tcPr>
-            <w:tcW w:w="1270" w:type="dxa"/>
+            <w:tcW w:w="1302" w:type="dxa"/>
+            <w:tcBorders>
+              <w:top w:val="single" w:sz="4" w:space="0" w:color="000000"/>
+              <w:left w:val="single" w:sz="4" w:space="0" w:color="000000"/>
+              <w:bottom w:val="single" w:sz="4" w:space="0" w:color="000000"/>
+              <w:right w:val="single" w:sz="4" w:space="0" w:color="000000"/>
+            </w:tcBorders>
+            <w:shd w:val="clear" w:color="000000" w:fill="FFFFFF"/>
+            <w:tcMar>
+              <w:left w:w="108" w:type="dxa"/>
+              <w:right w:w="108" w:type="dxa"/>
+            </w:tcMar>
+          </w:tcPr>
+          <w:p>
+            <w:pPr>
+              <w:spacing w:after="0" w:line="240" w:lineRule="auto"/>
+              <w:jc w:val="center"/>
+              <w:rPr>
+                <w:rFonts w:ascii="Calibri" w:eastAsia="Calibri" w:hAnsi="Calibri" w:cs="Calibri"/>
+                <w:sz w:val="26"/>
+                <w:szCs w:val="26"/>
+              </w:rPr>
+            </w:pPr>
+          </w:p>
+        </w:tc>
+        <w:tc>
+          <w:tcPr>
+            <w:tcW w:w="1314" w:type="dxa"/>
             <w:tcBorders>
               <w:top w:val="single" w:sz="4" w:space="0" w:color="000000"/>
               <w:left w:val="single" w:sz="4" w:space="0" w:color="000000"/>
@@ -3912,11 +3914,11 @@
       </w:tr>
       <w:tr>
         <w:trPr>
-          <w:trHeight w:val="359"/>
+          <w:trHeight w:val="376"/>
         </w:trPr>
         <w:tc>
           <w:tcPr>
-            <w:tcW w:w="10151" w:type="dxa"/>
+            <w:tcW w:w="10488" w:type="dxa"/>
             <w:gridSpan w:val="7"/>
             <w:tcBorders>
               <w:top w:val="single" w:sz="4" w:space="0" w:color="000000"/>
@@ -3967,11 +3969,11 @@
       </w:tr>
       <w:tr>
         <w:trPr>
-          <w:trHeight w:val="340"/>
+          <w:trHeight w:val="357"/>
         </w:trPr>
         <w:tc>
           <w:tcPr>
-            <w:tcW w:w="706" w:type="dxa"/>
+            <w:tcW w:w="729" w:type="dxa"/>
             <w:tcBorders>
               <w:top w:val="single" w:sz="4" w:space="0" w:color="000000"/>
               <w:left w:val="single" w:sz="4" w:space="0" w:color="000000"/>
@@ -4006,7 +4008,7 @@
         </w:tc>
         <w:tc>
           <w:tcPr>
-            <w:tcW w:w="1555" w:type="dxa"/>
+            <w:tcW w:w="1606" w:type="dxa"/>
             <w:tcBorders>
               <w:top w:val="single" w:sz="4" w:space="0" w:color="000000"/>
               <w:left w:val="single" w:sz="4" w:space="0" w:color="000000"/>
@@ -4041,7 +4043,7 @@
         </w:tc>
         <w:tc>
           <w:tcPr>
-            <w:tcW w:w="1413" w:type="dxa"/>
+            <w:tcW w:w="1460" w:type="dxa"/>
             <w:tcBorders>
               <w:top w:val="single" w:sz="4" w:space="0" w:color="000000"/>
               <w:left w:val="single" w:sz="4" w:space="0" w:color="000000"/>
@@ -4084,7 +4086,7 @@
         </w:tc>
         <w:tc>
           <w:tcPr>
-            <w:tcW w:w="2442" w:type="dxa"/>
+            <w:tcW w:w="2523" w:type="dxa"/>
             <w:tcBorders>
               <w:top w:val="single" w:sz="4" w:space="0" w:color="000000"/>
               <w:left w:val="single" w:sz="4" w:space="0" w:color="000000"/>
@@ -4121,61 +4123,61 @@
         </w:tc>
         <w:tc>
           <w:tcPr>
-            <w:tcW w:w="1504" w:type="dxa"/>
-            <w:tcBorders>
-              <w:top w:val="single" w:sz="4" w:space="0" w:color="000000"/>
-              <w:left w:val="single" w:sz="4" w:space="0" w:color="000000"/>
-              <w:bottom w:val="single" w:sz="4" w:space="0" w:color="000000"/>
-              <w:right w:val="single" w:sz="4" w:space="0" w:color="000000"/>
-            </w:tcBorders>
-            <w:shd w:val="clear" w:color="000000" w:fill="FFFFFF"/>
-            <w:tcMar>
-              <w:left w:w="108" w:type="dxa"/>
-              <w:right w:w="108" w:type="dxa"/>
-            </w:tcMar>
-          </w:tcPr>
-          <w:p>
-            <w:pPr>
-              <w:spacing w:after="0" w:line="240" w:lineRule="auto"/>
-              <w:jc w:val="center"/>
-              <w:rPr>
-                <w:rFonts w:ascii="Calibri" w:eastAsia="Calibri" w:hAnsi="Calibri" w:cs="Calibri"/>
-                <w:sz w:val="26"/>
-                <w:szCs w:val="26"/>
-              </w:rPr>
-            </w:pPr>
-          </w:p>
-        </w:tc>
-        <w:tc>
-          <w:tcPr>
-            <w:tcW w:w="1261" w:type="dxa"/>
-            <w:tcBorders>
-              <w:top w:val="single" w:sz="4" w:space="0" w:color="000000"/>
-              <w:left w:val="single" w:sz="4" w:space="0" w:color="000000"/>
-              <w:bottom w:val="single" w:sz="4" w:space="0" w:color="000000"/>
-              <w:right w:val="single" w:sz="4" w:space="0" w:color="000000"/>
-            </w:tcBorders>
-            <w:shd w:val="clear" w:color="000000" w:fill="FFFFFF"/>
-            <w:tcMar>
-              <w:left w:w="108" w:type="dxa"/>
-              <w:right w:w="108" w:type="dxa"/>
-            </w:tcMar>
-          </w:tcPr>
-          <w:p>
-            <w:pPr>
-              <w:spacing w:after="0" w:line="240" w:lineRule="auto"/>
-              <w:jc w:val="center"/>
-              <w:rPr>
-                <w:rFonts w:ascii="Calibri" w:eastAsia="Calibri" w:hAnsi="Calibri" w:cs="Calibri"/>
-                <w:sz w:val="26"/>
-                <w:szCs w:val="26"/>
-              </w:rPr>
-            </w:pPr>
-          </w:p>
-        </w:tc>
-        <w:tc>
-          <w:tcPr>
-            <w:tcW w:w="1270" w:type="dxa"/>
+            <w:tcW w:w="1554" w:type="dxa"/>
+            <w:tcBorders>
+              <w:top w:val="single" w:sz="4" w:space="0" w:color="000000"/>
+              <w:left w:val="single" w:sz="4" w:space="0" w:color="000000"/>
+              <w:bottom w:val="single" w:sz="4" w:space="0" w:color="000000"/>
+              <w:right w:val="single" w:sz="4" w:space="0" w:color="000000"/>
+            </w:tcBorders>
+            <w:shd w:val="clear" w:color="000000" w:fill="FFFFFF"/>
+            <w:tcMar>
+              <w:left w:w="108" w:type="dxa"/>
+              <w:right w:w="108" w:type="dxa"/>
+            </w:tcMar>
+          </w:tcPr>
+          <w:p>
+            <w:pPr>
+              <w:spacing w:after="0" w:line="240" w:lineRule="auto"/>
+              <w:jc w:val="center"/>
+              <w:rPr>
+                <w:rFonts w:ascii="Calibri" w:eastAsia="Calibri" w:hAnsi="Calibri" w:cs="Calibri"/>
+                <w:sz w:val="26"/>
+                <w:szCs w:val="26"/>
+              </w:rPr>
+            </w:pPr>
+          </w:p>
+        </w:tc>
+        <w:tc>
+          <w:tcPr>
+            <w:tcW w:w="1302" w:type="dxa"/>
+            <w:tcBorders>
+              <w:top w:val="single" w:sz="4" w:space="0" w:color="000000"/>
+              <w:left w:val="single" w:sz="4" w:space="0" w:color="000000"/>
+              <w:bottom w:val="single" w:sz="4" w:space="0" w:color="000000"/>
+              <w:right w:val="single" w:sz="4" w:space="0" w:color="000000"/>
+            </w:tcBorders>
+            <w:shd w:val="clear" w:color="000000" w:fill="FFFFFF"/>
+            <w:tcMar>
+              <w:left w:w="108" w:type="dxa"/>
+              <w:right w:w="108" w:type="dxa"/>
+            </w:tcMar>
+          </w:tcPr>
+          <w:p>
+            <w:pPr>
+              <w:spacing w:after="0" w:line="240" w:lineRule="auto"/>
+              <w:jc w:val="center"/>
+              <w:rPr>
+                <w:rFonts w:ascii="Calibri" w:eastAsia="Calibri" w:hAnsi="Calibri" w:cs="Calibri"/>
+                <w:sz w:val="26"/>
+                <w:szCs w:val="26"/>
+              </w:rPr>
+            </w:pPr>
+          </w:p>
+        </w:tc>
+        <w:tc>
+          <w:tcPr>
+            <w:tcW w:w="1314" w:type="dxa"/>
             <w:tcBorders>
               <w:top w:val="single" w:sz="4" w:space="0" w:color="000000"/>
               <w:left w:val="single" w:sz="4" w:space="0" w:color="000000"/>
@@ -4203,11 +4205,11 @@
       </w:tr>
       <w:tr>
         <w:trPr>
-          <w:trHeight w:val="321"/>
+          <w:trHeight w:val="337"/>
         </w:trPr>
         <w:tc>
           <w:tcPr>
-            <w:tcW w:w="706" w:type="dxa"/>
+            <w:tcW w:w="729" w:type="dxa"/>
             <w:tcBorders>
               <w:top w:val="single" w:sz="4" w:space="0" w:color="000000"/>
               <w:left w:val="single" w:sz="4" w:space="0" w:color="000000"/>
@@ -4242,7 +4244,7 @@
         </w:tc>
         <w:tc>
           <w:tcPr>
-            <w:tcW w:w="1555" w:type="dxa"/>
+            <w:tcW w:w="1606" w:type="dxa"/>
             <w:tcBorders>
               <w:top w:val="single" w:sz="4" w:space="0" w:color="000000"/>
               <w:left w:val="single" w:sz="4" w:space="0" w:color="000000"/>
@@ -4277,7 +4279,7 @@
         </w:tc>
         <w:tc>
           <w:tcPr>
-            <w:tcW w:w="1413" w:type="dxa"/>
+            <w:tcW w:w="1460" w:type="dxa"/>
             <w:tcBorders>
               <w:top w:val="single" w:sz="4" w:space="0" w:color="000000"/>
               <w:left w:val="single" w:sz="4" w:space="0" w:color="000000"/>
@@ -4312,99 +4314,96 @@
         </w:tc>
         <w:tc>
           <w:tcPr>
-            <w:tcW w:w="2442" w:type="dxa"/>
-            <w:tcBorders>
-              <w:top w:val="single" w:sz="4" w:space="0" w:color="000000"/>
-              <w:left w:val="single" w:sz="4" w:space="0" w:color="000000"/>
-              <w:bottom w:val="single" w:sz="4" w:space="0" w:color="000000"/>
-              <w:right w:val="single" w:sz="4" w:space="0" w:color="000000"/>
-            </w:tcBorders>
-            <w:shd w:val="clear" w:color="000000" w:fill="FFFFFF"/>
-            <w:tcMar>
-              <w:left w:w="108" w:type="dxa"/>
-              <w:right w:w="108" w:type="dxa"/>
-            </w:tcMar>
-          </w:tcPr>
-          <w:p>
-            <w:pPr>
-              <w:spacing w:after="0" w:line="240" w:lineRule="auto"/>
-              <w:jc w:val="center"/>
-              <w:rPr>
-                <w:rFonts w:ascii="Calibri" w:eastAsia="Calibri" w:hAnsi="Calibri" w:cs="Calibri"/>
-                <w:sz w:val="26"/>
-                <w:szCs w:val="26"/>
-              </w:rPr>
-            </w:pPr>
-            <w:r>
-              <w:rPr>
-                <w:rFonts w:ascii="Calibri" w:eastAsia="Calibri" w:hAnsi="Calibri" w:cs="Calibri"/>
-                <w:sz w:val="26"/>
-                <w:szCs w:val="26"/>
-              </w:rPr>
-              <w:t>J SUP</w:t>
-            </w:r>
-            <w:r>
-              <w:t xml:space="preserve">       </w:t>
-            </w:r>
-          </w:p>
-        </w:tc>
-        <w:tc>
-          <w:tcPr>
-            <w:tcW w:w="1504" w:type="dxa"/>
-            <w:tcBorders>
-              <w:top w:val="single" w:sz="4" w:space="0" w:color="000000"/>
-              <w:left w:val="single" w:sz="4" w:space="0" w:color="000000"/>
-              <w:bottom w:val="single" w:sz="4" w:space="0" w:color="000000"/>
-              <w:right w:val="single" w:sz="4" w:space="0" w:color="000000"/>
-            </w:tcBorders>
-            <w:shd w:val="clear" w:color="000000" w:fill="FFFFFF"/>
-            <w:tcMar>
-              <w:left w:w="108" w:type="dxa"/>
-              <w:right w:w="108" w:type="dxa"/>
-            </w:tcMar>
-          </w:tcPr>
-          <w:p>
-            <w:pPr>
-              <w:spacing w:after="0" w:line="240" w:lineRule="auto"/>
-              <w:jc w:val="center"/>
-              <w:rPr>
-                <w:rFonts w:ascii="Calibri" w:eastAsia="Calibri" w:hAnsi="Calibri" w:cs="Calibri"/>
-                <w:sz w:val="26"/>
-                <w:szCs w:val="26"/>
-              </w:rPr>
-            </w:pPr>
-          </w:p>
-        </w:tc>
-        <w:tc>
-          <w:tcPr>
-            <w:tcW w:w="1261" w:type="dxa"/>
-            <w:tcBorders>
-              <w:top w:val="single" w:sz="4" w:space="0" w:color="000000"/>
-              <w:left w:val="single" w:sz="4" w:space="0" w:color="000000"/>
-              <w:bottom w:val="single" w:sz="4" w:space="0" w:color="000000"/>
-              <w:right w:val="single" w:sz="4" w:space="0" w:color="000000"/>
-            </w:tcBorders>
-            <w:shd w:val="clear" w:color="000000" w:fill="FFFFFF"/>
-            <w:tcMar>
-              <w:left w:w="108" w:type="dxa"/>
-              <w:right w:w="108" w:type="dxa"/>
-            </w:tcMar>
-          </w:tcPr>
-          <w:p>
-            <w:pPr>
-              <w:spacing w:after="0" w:line="240" w:lineRule="auto"/>
-              <w:jc w:val="center"/>
-              <w:rPr>
-                <w:rFonts w:ascii="Calibri" w:eastAsia="Calibri" w:hAnsi="Calibri" w:cs="Calibri"/>
-                <w:sz w:val="26"/>
-                <w:szCs w:val="26"/>
-              </w:rPr>
-            </w:pPr>
-          </w:p>
-        </w:tc>
-        <w:tc>
-          <w:tcPr>
-            <w:tcW w:w="1270" w:type="dxa"/>
+            <w:tcW w:w="2523" w:type="dxa"/>
+            <w:tcBorders>
+              <w:top w:val="single" w:sz="4" w:space="0" w:color="000000"/>
+              <w:left w:val="single" w:sz="4" w:space="0" w:color="000000"/>
+              <w:bottom w:val="single" w:sz="4" w:space="0" w:color="000000"/>
+              <w:right w:val="single" w:sz="4" w:space="0" w:color="000000"/>
+            </w:tcBorders>
+            <w:shd w:val="clear" w:color="000000" w:fill="FFFFFF"/>
+            <w:tcMar>
+              <w:left w:w="108" w:type="dxa"/>
+              <w:right w:w="108" w:type="dxa"/>
+            </w:tcMar>
+          </w:tcPr>
+          <w:p>
+            <w:pPr>
+              <w:spacing w:after="0" w:line="240" w:lineRule="auto"/>
+              <w:jc w:val="center"/>
+              <w:rPr>
+                <w:rFonts w:ascii="Calibri" w:eastAsia="Calibri" w:hAnsi="Calibri" w:cs="Calibri"/>
+                <w:sz w:val="26"/>
+                <w:szCs w:val="26"/>
+              </w:rPr>
+            </w:pPr>
+            <w:r>
+              <w:rPr>
+                <w:rFonts w:ascii="Calibri" w:eastAsia="Calibri" w:hAnsi="Calibri" w:cs="Calibri"/>
+                <w:sz w:val="26"/>
+                <w:szCs w:val="26"/>
+              </w:rPr>
+              <w:t>BPB</w:t>
+            </w:r>
+          </w:p>
+        </w:tc>
+        <w:tc>
+          <w:tcPr>
+            <w:tcW w:w="1554" w:type="dxa"/>
+            <w:tcBorders>
+              <w:top w:val="single" w:sz="4" w:space="0" w:color="000000"/>
+              <w:left w:val="single" w:sz="4" w:space="0" w:color="000000"/>
+              <w:bottom w:val="single" w:sz="4" w:space="0" w:color="000000"/>
+              <w:right w:val="single" w:sz="4" w:space="0" w:color="000000"/>
+            </w:tcBorders>
+            <w:shd w:val="clear" w:color="000000" w:fill="FFFFFF"/>
+            <w:tcMar>
+              <w:left w:w="108" w:type="dxa"/>
+              <w:right w:w="108" w:type="dxa"/>
+            </w:tcMar>
+          </w:tcPr>
+          <w:p>
+            <w:pPr>
+              <w:spacing w:after="0" w:line="240" w:lineRule="auto"/>
+              <w:jc w:val="center"/>
+              <w:rPr>
+                <w:rFonts w:ascii="Calibri" w:eastAsia="Calibri" w:hAnsi="Calibri" w:cs="Calibri"/>
+                <w:sz w:val="26"/>
+                <w:szCs w:val="26"/>
+              </w:rPr>
+            </w:pPr>
+          </w:p>
+        </w:tc>
+        <w:tc>
+          <w:tcPr>
+            <w:tcW w:w="1302" w:type="dxa"/>
+            <w:tcBorders>
+              <w:top w:val="single" w:sz="4" w:space="0" w:color="000000"/>
+              <w:left w:val="single" w:sz="4" w:space="0" w:color="000000"/>
+              <w:bottom w:val="single" w:sz="4" w:space="0" w:color="000000"/>
+              <w:right w:val="single" w:sz="4" w:space="0" w:color="000000"/>
+            </w:tcBorders>
+            <w:shd w:val="clear" w:color="000000" w:fill="FFFFFF"/>
+            <w:tcMar>
+              <w:left w:w="108" w:type="dxa"/>
+              <w:right w:w="108" w:type="dxa"/>
+            </w:tcMar>
+          </w:tcPr>
+          <w:p>
+            <w:pPr>
+              <w:spacing w:after="0" w:line="240" w:lineRule="auto"/>
+              <w:jc w:val="center"/>
+              <w:rPr>
+                <w:rFonts w:ascii="Calibri" w:eastAsia="Calibri" w:hAnsi="Calibri" w:cs="Calibri"/>
+                <w:sz w:val="26"/>
+                <w:szCs w:val="26"/>
+              </w:rPr>
+            </w:pPr>
+          </w:p>
+        </w:tc>
+        <w:tc>
+          <w:tcPr>
+            <w:tcW w:w="1314" w:type="dxa"/>
             <w:tcBorders>
               <w:top w:val="single" w:sz="4" w:space="0" w:color="000000"/>
               <w:left w:val="single" w:sz="4" w:space="0" w:color="000000"/>
@@ -4432,11 +4431,11 @@
       </w:tr>
       <w:tr>
         <w:trPr>
-          <w:trHeight w:val="340"/>
+          <w:trHeight w:val="357"/>
         </w:trPr>
         <w:tc>
           <w:tcPr>
-            <w:tcW w:w="706" w:type="dxa"/>
+            <w:tcW w:w="729" w:type="dxa"/>
             <w:tcBorders>
               <w:top w:val="single" w:sz="4" w:space="0" w:color="000000"/>
               <w:left w:val="single" w:sz="4" w:space="0" w:color="000000"/>
@@ -4471,7 +4470,7 @@
         </w:tc>
         <w:tc>
           <w:tcPr>
-            <w:tcW w:w="1555" w:type="dxa"/>
+            <w:tcW w:w="1606" w:type="dxa"/>
             <w:tcBorders>
               <w:top w:val="single" w:sz="4" w:space="0" w:color="000000"/>
               <w:left w:val="single" w:sz="4" w:space="0" w:color="000000"/>
@@ -4506,7 +4505,7 @@
         </w:tc>
         <w:tc>
           <w:tcPr>
-            <w:tcW w:w="1413" w:type="dxa"/>
+            <w:tcW w:w="1460" w:type="dxa"/>
             <w:tcBorders>
               <w:top w:val="single" w:sz="4" w:space="0" w:color="000000"/>
               <w:left w:val="single" w:sz="4" w:space="0" w:color="000000"/>
@@ -4541,7 +4540,7 @@
         </w:tc>
         <w:tc>
           <w:tcPr>
-            <w:tcW w:w="2442" w:type="dxa"/>
+            <w:tcW w:w="2523" w:type="dxa"/>
             <w:tcBorders>
               <w:top w:val="single" w:sz="4" w:space="0" w:color="000000"/>
               <w:left w:val="single" w:sz="4" w:space="0" w:color="000000"/>
@@ -4578,34 +4577,34 @@
         </w:tc>
         <w:tc>
           <w:tcPr>
-            <w:tcW w:w="1504" w:type="dxa"/>
-            <w:tcBorders>
-              <w:top w:val="single" w:sz="4" w:space="0" w:color="000000"/>
-              <w:left w:val="single" w:sz="4" w:space="0" w:color="000000"/>
-              <w:bottom w:val="single" w:sz="4" w:space="0" w:color="000000"/>
-              <w:right w:val="single" w:sz="4" w:space="0" w:color="000000"/>
-            </w:tcBorders>
-            <w:shd w:val="clear" w:color="000000" w:fill="FFFFFF"/>
-            <w:tcMar>
-              <w:left w:w="108" w:type="dxa"/>
-              <w:right w:w="108" w:type="dxa"/>
-            </w:tcMar>
-          </w:tcPr>
-          <w:p>
-            <w:pPr>
-              <w:spacing w:after="0" w:line="240" w:lineRule="auto"/>
-              <w:jc w:val="center"/>
-              <w:rPr>
-                <w:rFonts w:ascii="Calibri" w:eastAsia="Calibri" w:hAnsi="Calibri" w:cs="Calibri"/>
-                <w:sz w:val="26"/>
-                <w:szCs w:val="26"/>
-              </w:rPr>
-            </w:pPr>
-          </w:p>
-        </w:tc>
-        <w:tc>
-          <w:tcPr>
-            <w:tcW w:w="1261" w:type="dxa"/>
+            <w:tcW w:w="1554" w:type="dxa"/>
+            <w:tcBorders>
+              <w:top w:val="single" w:sz="4" w:space="0" w:color="000000"/>
+              <w:left w:val="single" w:sz="4" w:space="0" w:color="000000"/>
+              <w:bottom w:val="single" w:sz="4" w:space="0" w:color="000000"/>
+              <w:right w:val="single" w:sz="4" w:space="0" w:color="000000"/>
+            </w:tcBorders>
+            <w:shd w:val="clear" w:color="000000" w:fill="FFFFFF"/>
+            <w:tcMar>
+              <w:left w:w="108" w:type="dxa"/>
+              <w:right w:w="108" w:type="dxa"/>
+            </w:tcMar>
+          </w:tcPr>
+          <w:p>
+            <w:pPr>
+              <w:spacing w:after="0" w:line="240" w:lineRule="auto"/>
+              <w:jc w:val="center"/>
+              <w:rPr>
+                <w:rFonts w:ascii="Calibri" w:eastAsia="Calibri" w:hAnsi="Calibri" w:cs="Calibri"/>
+                <w:sz w:val="26"/>
+                <w:szCs w:val="26"/>
+              </w:rPr>
+            </w:pPr>
+          </w:p>
+        </w:tc>
+        <w:tc>
+          <w:tcPr>
+            <w:tcW w:w="1302" w:type="dxa"/>
             <w:tcBorders>
               <w:top w:val="single" w:sz="4" w:space="0" w:color="000000"/>
               <w:left w:val="single" w:sz="4" w:space="0" w:color="000000"/>
@@ -4633,7 +4632,7 @@
         </w:tc>
         <w:tc>
           <w:tcPr>
-            <w:tcW w:w="1270" w:type="dxa"/>
+            <w:tcW w:w="1314" w:type="dxa"/>
             <w:tcBorders>
               <w:top w:val="single" w:sz="4" w:space="0" w:color="000000"/>
               <w:left w:val="single" w:sz="4" w:space="0" w:color="000000"/>
@@ -4661,11 +4660,11 @@
       </w:tr>
       <w:tr>
         <w:trPr>
-          <w:trHeight w:val="321"/>
+          <w:trHeight w:val="337"/>
         </w:trPr>
         <w:tc>
           <w:tcPr>
-            <w:tcW w:w="706" w:type="dxa"/>
+            <w:tcW w:w="729" w:type="dxa"/>
             <w:tcBorders>
               <w:top w:val="single" w:sz="4" w:space="0" w:color="000000"/>
               <w:left w:val="single" w:sz="4" w:space="0" w:color="000000"/>
@@ -4700,7 +4699,7 @@
         </w:tc>
         <w:tc>
           <w:tcPr>
-            <w:tcW w:w="1555" w:type="dxa"/>
+            <w:tcW w:w="1606" w:type="dxa"/>
             <w:tcBorders>
               <w:top w:val="single" w:sz="4" w:space="0" w:color="000000"/>
               <w:left w:val="single" w:sz="4" w:space="0" w:color="000000"/>
@@ -4735,7 +4734,7 @@
         </w:tc>
         <w:tc>
           <w:tcPr>
-            <w:tcW w:w="1413" w:type="dxa"/>
+            <w:tcW w:w="1460" w:type="dxa"/>
             <w:tcBorders>
               <w:top w:val="single" w:sz="4" w:space="0" w:color="000000"/>
               <w:left w:val="single" w:sz="4" w:space="0" w:color="000000"/>
@@ -4778,7 +4777,7 @@
         </w:tc>
         <w:tc>
           <w:tcPr>
-            <w:tcW w:w="2442" w:type="dxa"/>
+            <w:tcW w:w="2523" w:type="dxa"/>
             <w:tcBorders>
               <w:top w:val="single" w:sz="4" w:space="0" w:color="000000"/>
               <w:left w:val="single" w:sz="4" w:space="0" w:color="000000"/>
@@ -4806,67 +4805,74 @@
                 <w:sz w:val="28"/>
                 <w:szCs w:val="28"/>
               </w:rPr>
-              <w:t xml:space="preserve">RATNA         </w:t>
-            </w:r>
-          </w:p>
-        </w:tc>
-        <w:tc>
-          <w:tcPr>
-            <w:tcW w:w="1504" w:type="dxa"/>
-            <w:tcBorders>
-              <w:top w:val="single" w:sz="4" w:space="0" w:color="000000"/>
-              <w:left w:val="single" w:sz="4" w:space="0" w:color="000000"/>
-              <w:bottom w:val="single" w:sz="4" w:space="0" w:color="000000"/>
-              <w:right w:val="single" w:sz="4" w:space="0" w:color="000000"/>
-            </w:tcBorders>
-            <w:shd w:val="clear" w:color="000000" w:fill="FFFFFF"/>
-            <w:tcMar>
-              <w:left w:w="108" w:type="dxa"/>
-              <w:right w:w="108" w:type="dxa"/>
-            </w:tcMar>
-          </w:tcPr>
-          <w:p>
-            <w:pPr>
-              <w:spacing w:after="0" w:line="240" w:lineRule="auto"/>
-              <w:jc w:val="center"/>
-              <w:rPr>
-                <w:rFonts w:ascii="Calibri" w:eastAsia="Calibri" w:hAnsi="Calibri" w:cs="Calibri"/>
-                <w:sz w:val="26"/>
-                <w:szCs w:val="26"/>
-              </w:rPr>
-            </w:pPr>
-          </w:p>
-        </w:tc>
-        <w:tc>
-          <w:tcPr>
-            <w:tcW w:w="1261" w:type="dxa"/>
-            <w:tcBorders>
-              <w:top w:val="single" w:sz="4" w:space="0" w:color="000000"/>
-              <w:left w:val="single" w:sz="4" w:space="0" w:color="000000"/>
-              <w:bottom w:val="single" w:sz="4" w:space="0" w:color="000000"/>
-              <w:right w:val="single" w:sz="4" w:space="0" w:color="000000"/>
-            </w:tcBorders>
-            <w:shd w:val="clear" w:color="000000" w:fill="FFFFFF"/>
-            <w:tcMar>
-              <w:left w:w="108" w:type="dxa"/>
-              <w:right w:w="108" w:type="dxa"/>
-            </w:tcMar>
-          </w:tcPr>
-          <w:p>
-            <w:pPr>
-              <w:spacing w:after="0" w:line="240" w:lineRule="auto"/>
-              <w:jc w:val="center"/>
-              <w:rPr>
-                <w:rFonts w:ascii="Calibri" w:eastAsia="Calibri" w:hAnsi="Calibri" w:cs="Calibri"/>
-                <w:sz w:val="26"/>
-                <w:szCs w:val="26"/>
-              </w:rPr>
-            </w:pPr>
-          </w:p>
-        </w:tc>
-        <w:tc>
-          <w:tcPr>
-            <w:tcW w:w="1270" w:type="dxa"/>
+              <w:t>B193</w:t>
+            </w:r>
+            <w:r>
+              <w:rPr>
+                <w:sz w:val="28"/>
+                <w:szCs w:val="28"/>
+              </w:rPr>
+              <w:t xml:space="preserve">      </w:t>
+            </w:r>
+          </w:p>
+        </w:tc>
+        <w:tc>
+          <w:tcPr>
+            <w:tcW w:w="1554" w:type="dxa"/>
+            <w:tcBorders>
+              <w:top w:val="single" w:sz="4" w:space="0" w:color="000000"/>
+              <w:left w:val="single" w:sz="4" w:space="0" w:color="000000"/>
+              <w:bottom w:val="single" w:sz="4" w:space="0" w:color="000000"/>
+              <w:right w:val="single" w:sz="4" w:space="0" w:color="000000"/>
+            </w:tcBorders>
+            <w:shd w:val="clear" w:color="000000" w:fill="FFFFFF"/>
+            <w:tcMar>
+              <w:left w:w="108" w:type="dxa"/>
+              <w:right w:w="108" w:type="dxa"/>
+            </w:tcMar>
+          </w:tcPr>
+          <w:p>
+            <w:pPr>
+              <w:spacing w:after="0" w:line="240" w:lineRule="auto"/>
+              <w:jc w:val="center"/>
+              <w:rPr>
+                <w:rFonts w:ascii="Calibri" w:eastAsia="Calibri" w:hAnsi="Calibri" w:cs="Calibri"/>
+                <w:sz w:val="26"/>
+                <w:szCs w:val="26"/>
+              </w:rPr>
+            </w:pPr>
+          </w:p>
+        </w:tc>
+        <w:tc>
+          <w:tcPr>
+            <w:tcW w:w="1302" w:type="dxa"/>
+            <w:tcBorders>
+              <w:top w:val="single" w:sz="4" w:space="0" w:color="000000"/>
+              <w:left w:val="single" w:sz="4" w:space="0" w:color="000000"/>
+              <w:bottom w:val="single" w:sz="4" w:space="0" w:color="000000"/>
+              <w:right w:val="single" w:sz="4" w:space="0" w:color="000000"/>
+            </w:tcBorders>
+            <w:shd w:val="clear" w:color="000000" w:fill="FFFFFF"/>
+            <w:tcMar>
+              <w:left w:w="108" w:type="dxa"/>
+              <w:right w:w="108" w:type="dxa"/>
+            </w:tcMar>
+          </w:tcPr>
+          <w:p>
+            <w:pPr>
+              <w:spacing w:after="0" w:line="240" w:lineRule="auto"/>
+              <w:jc w:val="center"/>
+              <w:rPr>
+                <w:rFonts w:ascii="Calibri" w:eastAsia="Calibri" w:hAnsi="Calibri" w:cs="Calibri"/>
+                <w:sz w:val="26"/>
+                <w:szCs w:val="26"/>
+              </w:rPr>
+            </w:pPr>
+          </w:p>
+        </w:tc>
+        <w:tc>
+          <w:tcPr>
+            <w:tcW w:w="1314" w:type="dxa"/>
             <w:tcBorders>
               <w:top w:val="single" w:sz="4" w:space="0" w:color="000000"/>
               <w:left w:val="single" w:sz="4" w:space="0" w:color="000000"/>
@@ -4894,11 +4900,11 @@
       </w:tr>
       <w:tr>
         <w:trPr>
-          <w:trHeight w:val="340"/>
+          <w:trHeight w:val="357"/>
         </w:trPr>
         <w:tc>
           <w:tcPr>
-            <w:tcW w:w="706" w:type="dxa"/>
+            <w:tcW w:w="729" w:type="dxa"/>
             <w:tcBorders>
               <w:top w:val="single" w:sz="4" w:space="0" w:color="000000"/>
               <w:left w:val="single" w:sz="4" w:space="0" w:color="000000"/>
@@ -4933,7 +4939,7 @@
         </w:tc>
         <w:tc>
           <w:tcPr>
-            <w:tcW w:w="1555" w:type="dxa"/>
+            <w:tcW w:w="1606" w:type="dxa"/>
             <w:tcBorders>
               <w:top w:val="single" w:sz="4" w:space="0" w:color="000000"/>
               <w:left w:val="single" w:sz="4" w:space="0" w:color="000000"/>
@@ -4968,7 +4974,7 @@
         </w:tc>
         <w:tc>
           <w:tcPr>
-            <w:tcW w:w="1413" w:type="dxa"/>
+            <w:tcW w:w="1460" w:type="dxa"/>
             <w:tcBorders>
               <w:top w:val="single" w:sz="4" w:space="0" w:color="000000"/>
               <w:left w:val="single" w:sz="4" w:space="0" w:color="000000"/>
@@ -5011,96 +5017,96 @@
         </w:tc>
         <w:tc>
           <w:tcPr>
-            <w:tcW w:w="2442" w:type="dxa"/>
-            <w:tcBorders>
-              <w:top w:val="single" w:sz="4" w:space="0" w:color="000000"/>
-              <w:left w:val="single" w:sz="4" w:space="0" w:color="000000"/>
-              <w:bottom w:val="single" w:sz="4" w:space="0" w:color="000000"/>
-              <w:right w:val="single" w:sz="4" w:space="0" w:color="000000"/>
-            </w:tcBorders>
-            <w:shd w:val="clear" w:color="000000" w:fill="FFFFFF"/>
-            <w:tcMar>
-              <w:left w:w="108" w:type="dxa"/>
-              <w:right w:w="108" w:type="dxa"/>
-            </w:tcMar>
-          </w:tcPr>
-          <w:p>
-            <w:pPr>
-              <w:spacing w:after="0" w:line="240" w:lineRule="auto"/>
-              <w:jc w:val="center"/>
-              <w:rPr>
-                <w:rFonts w:ascii="Calibri" w:eastAsia="Calibri" w:hAnsi="Calibri" w:cs="Calibri"/>
-                <w:sz w:val="26"/>
-                <w:szCs w:val="26"/>
-              </w:rPr>
-            </w:pPr>
-            <w:r>
-              <w:rPr>
-                <w:rFonts w:ascii="Calibri" w:eastAsia="Calibri" w:hAnsi="Calibri" w:cs="Calibri"/>
-                <w:sz w:val="26"/>
-                <w:szCs w:val="26"/>
-              </w:rPr>
-              <w:t>BLQ2</w:t>
-            </w:r>
-          </w:p>
-        </w:tc>
-        <w:tc>
-          <w:tcPr>
-            <w:tcW w:w="1504" w:type="dxa"/>
-            <w:tcBorders>
-              <w:top w:val="single" w:sz="4" w:space="0" w:color="000000"/>
-              <w:left w:val="single" w:sz="4" w:space="0" w:color="000000"/>
-              <w:bottom w:val="single" w:sz="4" w:space="0" w:color="000000"/>
-              <w:right w:val="single" w:sz="4" w:space="0" w:color="000000"/>
-            </w:tcBorders>
-            <w:shd w:val="clear" w:color="000000" w:fill="FFFFFF"/>
-            <w:tcMar>
-              <w:left w:w="108" w:type="dxa"/>
-              <w:right w:w="108" w:type="dxa"/>
-            </w:tcMar>
-          </w:tcPr>
-          <w:p>
-            <w:pPr>
-              <w:spacing w:after="0" w:line="240" w:lineRule="auto"/>
-              <w:jc w:val="center"/>
-              <w:rPr>
-                <w:rFonts w:ascii="Calibri" w:eastAsia="Calibri" w:hAnsi="Calibri" w:cs="Calibri"/>
-                <w:sz w:val="26"/>
-                <w:szCs w:val="26"/>
-              </w:rPr>
-            </w:pPr>
-          </w:p>
-        </w:tc>
-        <w:tc>
-          <w:tcPr>
-            <w:tcW w:w="1261" w:type="dxa"/>
-            <w:tcBorders>
-              <w:top w:val="single" w:sz="4" w:space="0" w:color="000000"/>
-              <w:left w:val="single" w:sz="4" w:space="0" w:color="000000"/>
-              <w:bottom w:val="single" w:sz="4" w:space="0" w:color="000000"/>
-              <w:right w:val="single" w:sz="4" w:space="0" w:color="000000"/>
-            </w:tcBorders>
-            <w:shd w:val="clear" w:color="000000" w:fill="FFFFFF"/>
-            <w:tcMar>
-              <w:left w:w="108" w:type="dxa"/>
-              <w:right w:w="108" w:type="dxa"/>
-            </w:tcMar>
-          </w:tcPr>
-          <w:p>
-            <w:pPr>
-              <w:spacing w:after="0" w:line="240" w:lineRule="auto"/>
-              <w:jc w:val="center"/>
-              <w:rPr>
-                <w:rFonts w:ascii="Calibri" w:eastAsia="Calibri" w:hAnsi="Calibri" w:cs="Calibri"/>
-                <w:sz w:val="26"/>
-                <w:szCs w:val="26"/>
-              </w:rPr>
-            </w:pPr>
-          </w:p>
-        </w:tc>
-        <w:tc>
-          <w:tcPr>
-            <w:tcW w:w="1270" w:type="dxa"/>
+            <w:tcW w:w="2523" w:type="dxa"/>
+            <w:tcBorders>
+              <w:top w:val="single" w:sz="4" w:space="0" w:color="000000"/>
+              <w:left w:val="single" w:sz="4" w:space="0" w:color="000000"/>
+              <w:bottom w:val="single" w:sz="4" w:space="0" w:color="000000"/>
+              <w:right w:val="single" w:sz="4" w:space="0" w:color="000000"/>
+            </w:tcBorders>
+            <w:shd w:val="clear" w:color="000000" w:fill="FFFFFF"/>
+            <w:tcMar>
+              <w:left w:w="108" w:type="dxa"/>
+              <w:right w:w="108" w:type="dxa"/>
+            </w:tcMar>
+          </w:tcPr>
+          <w:p>
+            <w:pPr>
+              <w:spacing w:after="0" w:line="240" w:lineRule="auto"/>
+              <w:jc w:val="center"/>
+              <w:rPr>
+                <w:rFonts w:ascii="Calibri" w:eastAsia="Calibri" w:hAnsi="Calibri" w:cs="Calibri"/>
+                <w:sz w:val="26"/>
+                <w:szCs w:val="26"/>
+              </w:rPr>
+            </w:pPr>
+            <w:r>
+              <w:rPr>
+                <w:rFonts w:ascii="Calibri" w:eastAsia="Calibri" w:hAnsi="Calibri" w:cs="Calibri"/>
+                <w:sz w:val="26"/>
+                <w:szCs w:val="26"/>
+              </w:rPr>
+              <w:t>SGAV</w:t>
+            </w:r>
+          </w:p>
+        </w:tc>
+        <w:tc>
+          <w:tcPr>
+            <w:tcW w:w="1554" w:type="dxa"/>
+            <w:tcBorders>
+              <w:top w:val="single" w:sz="4" w:space="0" w:color="000000"/>
+              <w:left w:val="single" w:sz="4" w:space="0" w:color="000000"/>
+              <w:bottom w:val="single" w:sz="4" w:space="0" w:color="000000"/>
+              <w:right w:val="single" w:sz="4" w:space="0" w:color="000000"/>
+            </w:tcBorders>
+            <w:shd w:val="clear" w:color="000000" w:fill="FFFFFF"/>
+            <w:tcMar>
+              <w:left w:w="108" w:type="dxa"/>
+              <w:right w:w="108" w:type="dxa"/>
+            </w:tcMar>
+          </w:tcPr>
+          <w:p>
+            <w:pPr>
+              <w:spacing w:after="0" w:line="240" w:lineRule="auto"/>
+              <w:jc w:val="center"/>
+              <w:rPr>
+                <w:rFonts w:ascii="Calibri" w:eastAsia="Calibri" w:hAnsi="Calibri" w:cs="Calibri"/>
+                <w:sz w:val="26"/>
+                <w:szCs w:val="26"/>
+              </w:rPr>
+            </w:pPr>
+          </w:p>
+        </w:tc>
+        <w:tc>
+          <w:tcPr>
+            <w:tcW w:w="1302" w:type="dxa"/>
+            <w:tcBorders>
+              <w:top w:val="single" w:sz="4" w:space="0" w:color="000000"/>
+              <w:left w:val="single" w:sz="4" w:space="0" w:color="000000"/>
+              <w:bottom w:val="single" w:sz="4" w:space="0" w:color="000000"/>
+              <w:right w:val="single" w:sz="4" w:space="0" w:color="000000"/>
+            </w:tcBorders>
+            <w:shd w:val="clear" w:color="000000" w:fill="FFFFFF"/>
+            <w:tcMar>
+              <w:left w:w="108" w:type="dxa"/>
+              <w:right w:w="108" w:type="dxa"/>
+            </w:tcMar>
+          </w:tcPr>
+          <w:p>
+            <w:pPr>
+              <w:spacing w:after="0" w:line="240" w:lineRule="auto"/>
+              <w:jc w:val="center"/>
+              <w:rPr>
+                <w:rFonts w:ascii="Calibri" w:eastAsia="Calibri" w:hAnsi="Calibri" w:cs="Calibri"/>
+                <w:sz w:val="26"/>
+                <w:szCs w:val="26"/>
+              </w:rPr>
+            </w:pPr>
+          </w:p>
+        </w:tc>
+        <w:tc>
+          <w:tcPr>
+            <w:tcW w:w="1314" w:type="dxa"/>
             <w:tcBorders>
               <w:top w:val="single" w:sz="4" w:space="0" w:color="000000"/>
               <w:left w:val="single" w:sz="4" w:space="0" w:color="000000"/>
@@ -5128,11 +5134,11 @@
       </w:tr>
       <w:tr>
         <w:trPr>
-          <w:trHeight w:val="260"/>
+          <w:trHeight w:val="273"/>
         </w:trPr>
         <w:tc>
           <w:tcPr>
-            <w:tcW w:w="10151" w:type="dxa"/>
+            <w:tcW w:w="10488" w:type="dxa"/>
             <w:gridSpan w:val="7"/>
             <w:tcBorders>
               <w:top w:val="single" w:sz="4" w:space="0" w:color="000000"/>
@@ -5179,11 +5185,11 @@
       </w:tr>
       <w:tr>
         <w:trPr>
-          <w:trHeight w:val="340"/>
+          <w:trHeight w:val="357"/>
         </w:trPr>
         <w:tc>
           <w:tcPr>
-            <w:tcW w:w="706" w:type="dxa"/>
+            <w:tcW w:w="729" w:type="dxa"/>
             <w:tcBorders>
               <w:top w:val="single" w:sz="4" w:space="0" w:color="000000"/>
               <w:left w:val="single" w:sz="4" w:space="0" w:color="000000"/>
@@ -5219,7 +5225,7 @@
         </w:tc>
         <w:tc>
           <w:tcPr>
-            <w:tcW w:w="1555" w:type="dxa"/>
+            <w:tcW w:w="1606" w:type="dxa"/>
             <w:tcBorders>
               <w:top w:val="single" w:sz="4" w:space="0" w:color="000000"/>
               <w:left w:val="single" w:sz="4" w:space="0" w:color="000000"/>
@@ -5254,7 +5260,7 @@
         </w:tc>
         <w:tc>
           <w:tcPr>
-            <w:tcW w:w="1413" w:type="dxa"/>
+            <w:tcW w:w="1460" w:type="dxa"/>
             <w:tcBorders>
               <w:top w:val="single" w:sz="4" w:space="0" w:color="000000"/>
               <w:left w:val="single" w:sz="4" w:space="0" w:color="000000"/>
@@ -5289,7 +5295,7 @@
         </w:tc>
         <w:tc>
           <w:tcPr>
-            <w:tcW w:w="2442" w:type="dxa"/>
+            <w:tcW w:w="2523" w:type="dxa"/>
             <w:tcBorders>
               <w:top w:val="single" w:sz="4" w:space="0" w:color="000000"/>
               <w:left w:val="single" w:sz="4" w:space="0" w:color="000000"/>
@@ -5322,67 +5328,67 @@
                 <w:sz w:val="26"/>
                 <w:szCs w:val="26"/>
               </w:rPr>
-              <w:t>ICW</w:t>
-            </w:r>
-          </w:p>
-        </w:tc>
-        <w:tc>
-          <w:tcPr>
-            <w:tcW w:w="1504" w:type="dxa"/>
-            <w:tcBorders>
-              <w:top w:val="single" w:sz="4" w:space="0" w:color="000000"/>
-              <w:left w:val="single" w:sz="4" w:space="0" w:color="000000"/>
-              <w:bottom w:val="single" w:sz="4" w:space="0" w:color="000000"/>
-              <w:right w:val="single" w:sz="4" w:space="0" w:color="000000"/>
-            </w:tcBorders>
-            <w:shd w:val="clear" w:color="000000" w:fill="FFFFFF"/>
-            <w:tcMar>
-              <w:left w:w="108" w:type="dxa"/>
-              <w:right w:w="108" w:type="dxa"/>
-            </w:tcMar>
-          </w:tcPr>
-          <w:p>
-            <w:pPr>
-              <w:spacing w:after="0" w:line="240" w:lineRule="auto"/>
-              <w:jc w:val="center"/>
-              <w:rPr>
-                <w:rFonts w:ascii="Calibri" w:eastAsia="Calibri" w:hAnsi="Calibri" w:cs="Calibri"/>
-                <w:sz w:val="26"/>
-                <w:szCs w:val="26"/>
-              </w:rPr>
-            </w:pPr>
-          </w:p>
-        </w:tc>
-        <w:tc>
-          <w:tcPr>
-            <w:tcW w:w="1261" w:type="dxa"/>
-            <w:tcBorders>
-              <w:top w:val="single" w:sz="4" w:space="0" w:color="000000"/>
-              <w:left w:val="single" w:sz="4" w:space="0" w:color="000000"/>
-              <w:bottom w:val="single" w:sz="4" w:space="0" w:color="000000"/>
-              <w:right w:val="single" w:sz="4" w:space="0" w:color="000000"/>
-            </w:tcBorders>
-            <w:shd w:val="clear" w:color="000000" w:fill="FFFFFF"/>
-            <w:tcMar>
-              <w:left w:w="108" w:type="dxa"/>
-              <w:right w:w="108" w:type="dxa"/>
-            </w:tcMar>
-          </w:tcPr>
-          <w:p>
-            <w:pPr>
-              <w:spacing w:after="0" w:line="240" w:lineRule="auto"/>
-              <w:jc w:val="center"/>
-              <w:rPr>
-                <w:rFonts w:ascii="Calibri" w:eastAsia="Calibri" w:hAnsi="Calibri" w:cs="Calibri"/>
-                <w:sz w:val="26"/>
-                <w:szCs w:val="26"/>
-              </w:rPr>
-            </w:pPr>
-          </w:p>
-        </w:tc>
-        <w:tc>
-          <w:tcPr>
-            <w:tcW w:w="1270" w:type="dxa"/>
+              <w:t>ICP</w:t>
+            </w:r>
+          </w:p>
+        </w:tc>
+        <w:tc>
+          <w:tcPr>
+            <w:tcW w:w="1554" w:type="dxa"/>
+            <w:tcBorders>
+              <w:top w:val="single" w:sz="4" w:space="0" w:color="000000"/>
+              <w:left w:val="single" w:sz="4" w:space="0" w:color="000000"/>
+              <w:bottom w:val="single" w:sz="4" w:space="0" w:color="000000"/>
+              <w:right w:val="single" w:sz="4" w:space="0" w:color="000000"/>
+            </w:tcBorders>
+            <w:shd w:val="clear" w:color="000000" w:fill="FFFFFF"/>
+            <w:tcMar>
+              <w:left w:w="108" w:type="dxa"/>
+              <w:right w:w="108" w:type="dxa"/>
+            </w:tcMar>
+          </w:tcPr>
+          <w:p>
+            <w:pPr>
+              <w:spacing w:after="0" w:line="240" w:lineRule="auto"/>
+              <w:jc w:val="center"/>
+              <w:rPr>
+                <w:rFonts w:ascii="Calibri" w:eastAsia="Calibri" w:hAnsi="Calibri" w:cs="Calibri"/>
+                <w:sz w:val="26"/>
+                <w:szCs w:val="26"/>
+              </w:rPr>
+            </w:pPr>
+          </w:p>
+        </w:tc>
+        <w:tc>
+          <w:tcPr>
+            <w:tcW w:w="1302" w:type="dxa"/>
+            <w:tcBorders>
+              <w:top w:val="single" w:sz="4" w:space="0" w:color="000000"/>
+              <w:left w:val="single" w:sz="4" w:space="0" w:color="000000"/>
+              <w:bottom w:val="single" w:sz="4" w:space="0" w:color="000000"/>
+              <w:right w:val="single" w:sz="4" w:space="0" w:color="000000"/>
+            </w:tcBorders>
+            <w:shd w:val="clear" w:color="000000" w:fill="FFFFFF"/>
+            <w:tcMar>
+              <w:left w:w="108" w:type="dxa"/>
+              <w:right w:w="108" w:type="dxa"/>
+            </w:tcMar>
+          </w:tcPr>
+          <w:p>
+            <w:pPr>
+              <w:spacing w:after="0" w:line="240" w:lineRule="auto"/>
+              <w:jc w:val="center"/>
+              <w:rPr>
+                <w:rFonts w:ascii="Calibri" w:eastAsia="Calibri" w:hAnsi="Calibri" w:cs="Calibri"/>
+                <w:sz w:val="26"/>
+                <w:szCs w:val="26"/>
+              </w:rPr>
+            </w:pPr>
+          </w:p>
+        </w:tc>
+        <w:tc>
+          <w:tcPr>
+            <w:tcW w:w="1314" w:type="dxa"/>
             <w:tcBorders>
               <w:top w:val="single" w:sz="4" w:space="0" w:color="000000"/>
               <w:left w:val="single" w:sz="4" w:space="0" w:color="000000"/>
@@ -5410,11 +5416,11 @@
       </w:tr>
       <w:tr>
         <w:trPr>
-          <w:trHeight w:val="321"/>
+          <w:trHeight w:val="337"/>
         </w:trPr>
         <w:tc>
           <w:tcPr>
-            <w:tcW w:w="706" w:type="dxa"/>
+            <w:tcW w:w="729" w:type="dxa"/>
             <w:tcBorders>
               <w:top w:val="single" w:sz="4" w:space="0" w:color="000000"/>
               <w:left w:val="single" w:sz="4" w:space="0" w:color="000000"/>
@@ -5450,7 +5456,7 @@
         </w:tc>
         <w:tc>
           <w:tcPr>
-            <w:tcW w:w="1555" w:type="dxa"/>
+            <w:tcW w:w="1606" w:type="dxa"/>
             <w:tcBorders>
               <w:top w:val="single" w:sz="4" w:space="0" w:color="000000"/>
               <w:left w:val="single" w:sz="4" w:space="0" w:color="000000"/>
@@ -5485,7 +5491,7 @@
         </w:tc>
         <w:tc>
           <w:tcPr>
-            <w:tcW w:w="1413" w:type="dxa"/>
+            <w:tcW w:w="1460" w:type="dxa"/>
             <w:tcBorders>
               <w:top w:val="single" w:sz="4" w:space="0" w:color="000000"/>
               <w:left w:val="single" w:sz="4" w:space="0" w:color="000000"/>
@@ -5520,96 +5526,96 @@
         </w:tc>
         <w:tc>
           <w:tcPr>
-            <w:tcW w:w="2442" w:type="dxa"/>
-            <w:tcBorders>
-              <w:top w:val="single" w:sz="4" w:space="0" w:color="000000"/>
-              <w:left w:val="single" w:sz="4" w:space="0" w:color="000000"/>
-              <w:bottom w:val="single" w:sz="4" w:space="0" w:color="000000"/>
-              <w:right w:val="single" w:sz="4" w:space="0" w:color="000000"/>
-            </w:tcBorders>
-            <w:shd w:val="clear" w:color="000000" w:fill="FFFFFF"/>
-            <w:tcMar>
-              <w:left w:w="108" w:type="dxa"/>
-              <w:right w:w="108" w:type="dxa"/>
-            </w:tcMar>
-          </w:tcPr>
-          <w:p>
-            <w:pPr>
-              <w:spacing w:after="0" w:line="240" w:lineRule="auto"/>
-              <w:jc w:val="center"/>
-              <w:rPr>
-                <w:rFonts w:ascii="Calibri" w:eastAsia="Calibri" w:hAnsi="Calibri" w:cs="Calibri"/>
-                <w:sz w:val="26"/>
-                <w:szCs w:val="26"/>
-              </w:rPr>
-            </w:pPr>
-            <w:r>
-              <w:rPr>
-                <w:rFonts w:ascii="Calibri" w:eastAsia="Calibri" w:hAnsi="Calibri" w:cs="Calibri"/>
-                <w:sz w:val="26"/>
-                <w:szCs w:val="26"/>
-              </w:rPr>
-              <w:t>HRA</w:t>
-            </w:r>
-          </w:p>
-        </w:tc>
-        <w:tc>
-          <w:tcPr>
-            <w:tcW w:w="1504" w:type="dxa"/>
-            <w:tcBorders>
-              <w:top w:val="single" w:sz="4" w:space="0" w:color="000000"/>
-              <w:left w:val="single" w:sz="4" w:space="0" w:color="000000"/>
-              <w:bottom w:val="single" w:sz="4" w:space="0" w:color="000000"/>
-              <w:right w:val="single" w:sz="4" w:space="0" w:color="000000"/>
-            </w:tcBorders>
-            <w:shd w:val="clear" w:color="000000" w:fill="FFFFFF"/>
-            <w:tcMar>
-              <w:left w:w="108" w:type="dxa"/>
-              <w:right w:w="108" w:type="dxa"/>
-            </w:tcMar>
-          </w:tcPr>
-          <w:p>
-            <w:pPr>
-              <w:spacing w:after="0" w:line="240" w:lineRule="auto"/>
-              <w:jc w:val="center"/>
-              <w:rPr>
-                <w:rFonts w:ascii="Calibri" w:eastAsia="Calibri" w:hAnsi="Calibri" w:cs="Calibri"/>
-                <w:sz w:val="26"/>
-                <w:szCs w:val="26"/>
-              </w:rPr>
-            </w:pPr>
-          </w:p>
-        </w:tc>
-        <w:tc>
-          <w:tcPr>
-            <w:tcW w:w="1261" w:type="dxa"/>
-            <w:tcBorders>
-              <w:top w:val="single" w:sz="4" w:space="0" w:color="000000"/>
-              <w:left w:val="single" w:sz="4" w:space="0" w:color="000000"/>
-              <w:bottom w:val="single" w:sz="4" w:space="0" w:color="000000"/>
-              <w:right w:val="single" w:sz="4" w:space="0" w:color="000000"/>
-            </w:tcBorders>
-            <w:shd w:val="clear" w:color="000000" w:fill="FFFFFF"/>
-            <w:tcMar>
-              <w:left w:w="108" w:type="dxa"/>
-              <w:right w:w="108" w:type="dxa"/>
-            </w:tcMar>
-          </w:tcPr>
-          <w:p>
-            <w:pPr>
-              <w:spacing w:after="0" w:line="240" w:lineRule="auto"/>
-              <w:jc w:val="center"/>
-              <w:rPr>
-                <w:rFonts w:ascii="Calibri" w:eastAsia="Calibri" w:hAnsi="Calibri" w:cs="Calibri"/>
-                <w:sz w:val="26"/>
-                <w:szCs w:val="26"/>
-              </w:rPr>
-            </w:pPr>
-          </w:p>
-        </w:tc>
-        <w:tc>
-          <w:tcPr>
-            <w:tcW w:w="1270" w:type="dxa"/>
+            <w:tcW w:w="2523" w:type="dxa"/>
+            <w:tcBorders>
+              <w:top w:val="single" w:sz="4" w:space="0" w:color="000000"/>
+              <w:left w:val="single" w:sz="4" w:space="0" w:color="000000"/>
+              <w:bottom w:val="single" w:sz="4" w:space="0" w:color="000000"/>
+              <w:right w:val="single" w:sz="4" w:space="0" w:color="000000"/>
+            </w:tcBorders>
+            <w:shd w:val="clear" w:color="000000" w:fill="FFFFFF"/>
+            <w:tcMar>
+              <w:left w:w="108" w:type="dxa"/>
+              <w:right w:w="108" w:type="dxa"/>
+            </w:tcMar>
+          </w:tcPr>
+          <w:p>
+            <w:pPr>
+              <w:spacing w:after="0" w:line="240" w:lineRule="auto"/>
+              <w:jc w:val="center"/>
+              <w:rPr>
+                <w:rFonts w:ascii="Calibri" w:eastAsia="Calibri" w:hAnsi="Calibri" w:cs="Calibri"/>
+                <w:sz w:val="26"/>
+                <w:szCs w:val="26"/>
+              </w:rPr>
+            </w:pPr>
+            <w:r>
+              <w:rPr>
+                <w:rFonts w:ascii="Calibri" w:eastAsia="Calibri" w:hAnsi="Calibri" w:cs="Calibri"/>
+                <w:sz w:val="26"/>
+                <w:szCs w:val="26"/>
+              </w:rPr>
+              <w:t>SLQ</w:t>
+            </w:r>
+          </w:p>
+        </w:tc>
+        <w:tc>
+          <w:tcPr>
+            <w:tcW w:w="1554" w:type="dxa"/>
+            <w:tcBorders>
+              <w:top w:val="single" w:sz="4" w:space="0" w:color="000000"/>
+              <w:left w:val="single" w:sz="4" w:space="0" w:color="000000"/>
+              <w:bottom w:val="single" w:sz="4" w:space="0" w:color="000000"/>
+              <w:right w:val="single" w:sz="4" w:space="0" w:color="000000"/>
+            </w:tcBorders>
+            <w:shd w:val="clear" w:color="000000" w:fill="FFFFFF"/>
+            <w:tcMar>
+              <w:left w:w="108" w:type="dxa"/>
+              <w:right w:w="108" w:type="dxa"/>
+            </w:tcMar>
+          </w:tcPr>
+          <w:p>
+            <w:pPr>
+              <w:spacing w:after="0" w:line="240" w:lineRule="auto"/>
+              <w:jc w:val="center"/>
+              <w:rPr>
+                <w:rFonts w:ascii="Calibri" w:eastAsia="Calibri" w:hAnsi="Calibri" w:cs="Calibri"/>
+                <w:sz w:val="26"/>
+                <w:szCs w:val="26"/>
+              </w:rPr>
+            </w:pPr>
+          </w:p>
+        </w:tc>
+        <w:tc>
+          <w:tcPr>
+            <w:tcW w:w="1302" w:type="dxa"/>
+            <w:tcBorders>
+              <w:top w:val="single" w:sz="4" w:space="0" w:color="000000"/>
+              <w:left w:val="single" w:sz="4" w:space="0" w:color="000000"/>
+              <w:bottom w:val="single" w:sz="4" w:space="0" w:color="000000"/>
+              <w:right w:val="single" w:sz="4" w:space="0" w:color="000000"/>
+            </w:tcBorders>
+            <w:shd w:val="clear" w:color="000000" w:fill="FFFFFF"/>
+            <w:tcMar>
+              <w:left w:w="108" w:type="dxa"/>
+              <w:right w:w="108" w:type="dxa"/>
+            </w:tcMar>
+          </w:tcPr>
+          <w:p>
+            <w:pPr>
+              <w:spacing w:after="0" w:line="240" w:lineRule="auto"/>
+              <w:jc w:val="center"/>
+              <w:rPr>
+                <w:rFonts w:ascii="Calibri" w:eastAsia="Calibri" w:hAnsi="Calibri" w:cs="Calibri"/>
+                <w:sz w:val="26"/>
+                <w:szCs w:val="26"/>
+              </w:rPr>
+            </w:pPr>
+          </w:p>
+        </w:tc>
+        <w:tc>
+          <w:tcPr>
+            <w:tcW w:w="1314" w:type="dxa"/>
             <w:tcBorders>
               <w:top w:val="single" w:sz="4" w:space="0" w:color="000000"/>
               <w:left w:val="single" w:sz="4" w:space="0" w:color="000000"/>
@@ -5637,11 +5643,11 @@
       </w:tr>
       <w:tr>
         <w:trPr>
-          <w:trHeight w:val="340"/>
+          <w:trHeight w:val="357"/>
         </w:trPr>
         <w:tc>
           <w:tcPr>
-            <w:tcW w:w="706" w:type="dxa"/>
+            <w:tcW w:w="729" w:type="dxa"/>
             <w:tcBorders>
               <w:top w:val="single" w:sz="4" w:space="0" w:color="000000"/>
               <w:left w:val="single" w:sz="4" w:space="0" w:color="000000"/>
@@ -5677,7 +5683,7 @@
         </w:tc>
         <w:tc>
           <w:tcPr>
-            <w:tcW w:w="1555" w:type="dxa"/>
+            <w:tcW w:w="1606" w:type="dxa"/>
             <w:tcBorders>
               <w:top w:val="single" w:sz="4" w:space="0" w:color="000000"/>
               <w:left w:val="single" w:sz="4" w:space="0" w:color="000000"/>
@@ -5712,7 +5718,7 @@
         </w:tc>
         <w:tc>
           <w:tcPr>
-            <w:tcW w:w="1413" w:type="dxa"/>
+            <w:tcW w:w="1460" w:type="dxa"/>
             <w:tcBorders>
               <w:top w:val="single" w:sz="4" w:space="0" w:color="000000"/>
               <w:left w:val="single" w:sz="4" w:space="0" w:color="000000"/>
@@ -5747,7 +5753,7 @@
         </w:tc>
         <w:tc>
           <w:tcPr>
-            <w:tcW w:w="2442" w:type="dxa"/>
+            <w:tcW w:w="2523" w:type="dxa"/>
             <w:tcBorders>
               <w:top w:val="single" w:sz="4" w:space="0" w:color="000000"/>
               <w:left w:val="single" w:sz="4" w:space="0" w:color="000000"/>
@@ -5782,61 +5788,61 @@
         </w:tc>
         <w:tc>
           <w:tcPr>
-            <w:tcW w:w="1504" w:type="dxa"/>
-            <w:tcBorders>
-              <w:top w:val="single" w:sz="4" w:space="0" w:color="000000"/>
-              <w:left w:val="single" w:sz="4" w:space="0" w:color="000000"/>
-              <w:bottom w:val="single" w:sz="4" w:space="0" w:color="000000"/>
-              <w:right w:val="single" w:sz="4" w:space="0" w:color="000000"/>
-            </w:tcBorders>
-            <w:shd w:val="clear" w:color="000000" w:fill="FFFFFF"/>
-            <w:tcMar>
-              <w:left w:w="108" w:type="dxa"/>
-              <w:right w:w="108" w:type="dxa"/>
-            </w:tcMar>
-          </w:tcPr>
-          <w:p>
-            <w:pPr>
-              <w:spacing w:after="0" w:line="240" w:lineRule="auto"/>
-              <w:jc w:val="center"/>
-              <w:rPr>
-                <w:rFonts w:ascii="Calibri" w:eastAsia="Calibri" w:hAnsi="Calibri" w:cs="Calibri"/>
-                <w:sz w:val="26"/>
-                <w:szCs w:val="26"/>
-              </w:rPr>
-            </w:pPr>
-          </w:p>
-        </w:tc>
-        <w:tc>
-          <w:tcPr>
-            <w:tcW w:w="1261" w:type="dxa"/>
-            <w:tcBorders>
-              <w:top w:val="single" w:sz="4" w:space="0" w:color="000000"/>
-              <w:left w:val="single" w:sz="4" w:space="0" w:color="000000"/>
-              <w:bottom w:val="single" w:sz="4" w:space="0" w:color="000000"/>
-              <w:right w:val="single" w:sz="4" w:space="0" w:color="000000"/>
-            </w:tcBorders>
-            <w:shd w:val="clear" w:color="000000" w:fill="FFFFFF"/>
-            <w:tcMar>
-              <w:left w:w="108" w:type="dxa"/>
-              <w:right w:w="108" w:type="dxa"/>
-            </w:tcMar>
-          </w:tcPr>
-          <w:p>
-            <w:pPr>
-              <w:spacing w:after="0" w:line="240" w:lineRule="auto"/>
-              <w:jc w:val="center"/>
-              <w:rPr>
-                <w:rFonts w:ascii="Calibri" w:eastAsia="Calibri" w:hAnsi="Calibri" w:cs="Calibri"/>
-                <w:sz w:val="26"/>
-                <w:szCs w:val="26"/>
-              </w:rPr>
-            </w:pPr>
-          </w:p>
-        </w:tc>
-        <w:tc>
-          <w:tcPr>
-            <w:tcW w:w="1270" w:type="dxa"/>
+            <w:tcW w:w="1554" w:type="dxa"/>
+            <w:tcBorders>
+              <w:top w:val="single" w:sz="4" w:space="0" w:color="000000"/>
+              <w:left w:val="single" w:sz="4" w:space="0" w:color="000000"/>
+              <w:bottom w:val="single" w:sz="4" w:space="0" w:color="000000"/>
+              <w:right w:val="single" w:sz="4" w:space="0" w:color="000000"/>
+            </w:tcBorders>
+            <w:shd w:val="clear" w:color="000000" w:fill="FFFFFF"/>
+            <w:tcMar>
+              <w:left w:w="108" w:type="dxa"/>
+              <w:right w:w="108" w:type="dxa"/>
+            </w:tcMar>
+          </w:tcPr>
+          <w:p>
+            <w:pPr>
+              <w:spacing w:after="0" w:line="240" w:lineRule="auto"/>
+              <w:jc w:val="center"/>
+              <w:rPr>
+                <w:rFonts w:ascii="Calibri" w:eastAsia="Calibri" w:hAnsi="Calibri" w:cs="Calibri"/>
+                <w:sz w:val="26"/>
+                <w:szCs w:val="26"/>
+              </w:rPr>
+            </w:pPr>
+          </w:p>
+        </w:tc>
+        <w:tc>
+          <w:tcPr>
+            <w:tcW w:w="1302" w:type="dxa"/>
+            <w:tcBorders>
+              <w:top w:val="single" w:sz="4" w:space="0" w:color="000000"/>
+              <w:left w:val="single" w:sz="4" w:space="0" w:color="000000"/>
+              <w:bottom w:val="single" w:sz="4" w:space="0" w:color="000000"/>
+              <w:right w:val="single" w:sz="4" w:space="0" w:color="000000"/>
+            </w:tcBorders>
+            <w:shd w:val="clear" w:color="000000" w:fill="FFFFFF"/>
+            <w:tcMar>
+              <w:left w:w="108" w:type="dxa"/>
+              <w:right w:w="108" w:type="dxa"/>
+            </w:tcMar>
+          </w:tcPr>
+          <w:p>
+            <w:pPr>
+              <w:spacing w:after="0" w:line="240" w:lineRule="auto"/>
+              <w:jc w:val="center"/>
+              <w:rPr>
+                <w:rFonts w:ascii="Calibri" w:eastAsia="Calibri" w:hAnsi="Calibri" w:cs="Calibri"/>
+                <w:sz w:val="26"/>
+                <w:szCs w:val="26"/>
+              </w:rPr>
+            </w:pPr>
+          </w:p>
+        </w:tc>
+        <w:tc>
+          <w:tcPr>
+            <w:tcW w:w="1314" w:type="dxa"/>
             <w:tcBorders>
               <w:top w:val="single" w:sz="4" w:space="0" w:color="000000"/>
               <w:left w:val="single" w:sz="4" w:space="0" w:color="000000"/>
@@ -5864,11 +5870,11 @@
       </w:tr>
       <w:tr>
         <w:trPr>
-          <w:trHeight w:val="321"/>
+          <w:trHeight w:val="337"/>
         </w:trPr>
         <w:tc>
           <w:tcPr>
-            <w:tcW w:w="706" w:type="dxa"/>
+            <w:tcW w:w="729" w:type="dxa"/>
             <w:tcBorders>
               <w:top w:val="single" w:sz="4" w:space="0" w:color="000000"/>
               <w:left w:val="single" w:sz="4" w:space="0" w:color="000000"/>
@@ -5904,7 +5910,7 @@
         </w:tc>
         <w:tc>
           <w:tcPr>
-            <w:tcW w:w="1555" w:type="dxa"/>
+            <w:tcW w:w="1606" w:type="dxa"/>
             <w:tcBorders>
               <w:top w:val="single" w:sz="4" w:space="0" w:color="000000"/>
               <w:left w:val="single" w:sz="4" w:space="0" w:color="000000"/>
@@ -5939,7 +5945,7 @@
         </w:tc>
         <w:tc>
           <w:tcPr>
-            <w:tcW w:w="1413" w:type="dxa"/>
+            <w:tcW w:w="1460" w:type="dxa"/>
             <w:tcBorders>
               <w:top w:val="single" w:sz="4" w:space="0" w:color="000000"/>
               <w:left w:val="single" w:sz="4" w:space="0" w:color="000000"/>
@@ -5974,42 +5980,42 @@
         </w:tc>
         <w:tc>
           <w:tcPr>
-            <w:tcW w:w="2442" w:type="dxa"/>
-            <w:tcBorders>
-              <w:top w:val="single" w:sz="4" w:space="0" w:color="000000"/>
-              <w:left w:val="single" w:sz="4" w:space="0" w:color="000000"/>
-              <w:bottom w:val="single" w:sz="4" w:space="0" w:color="000000"/>
-              <w:right w:val="single" w:sz="4" w:space="0" w:color="000000"/>
-            </w:tcBorders>
-            <w:shd w:val="clear" w:color="000000" w:fill="FFFFFF"/>
-            <w:tcMar>
-              <w:left w:w="108" w:type="dxa"/>
-              <w:right w:w="108" w:type="dxa"/>
-            </w:tcMar>
-          </w:tcPr>
-          <w:p>
-            <w:pPr>
-              <w:spacing w:after="0" w:line="240" w:lineRule="auto"/>
-              <w:jc w:val="center"/>
-              <w:rPr>
-                <w:rFonts w:ascii="Calibri" w:eastAsia="Calibri" w:hAnsi="Calibri" w:cs="Calibri"/>
-                <w:sz w:val="26"/>
-                <w:szCs w:val="26"/>
-              </w:rPr>
-            </w:pPr>
-            <w:r>
-              <w:rPr>
-                <w:rFonts w:ascii="Calibri" w:eastAsia="Calibri" w:hAnsi="Calibri" w:cs="Calibri"/>
-                <w:sz w:val="26"/>
-                <w:szCs w:val="26"/>
-              </w:rPr>
-              <w:t>WIN</w:t>
-            </w:r>
-          </w:p>
-        </w:tc>
-        <w:tc>
-          <w:tcPr>
-            <w:tcW w:w="1504" w:type="dxa"/>
+            <w:tcW w:w="2523" w:type="dxa"/>
+            <w:tcBorders>
+              <w:top w:val="single" w:sz="4" w:space="0" w:color="000000"/>
+              <w:left w:val="single" w:sz="4" w:space="0" w:color="000000"/>
+              <w:bottom w:val="single" w:sz="4" w:space="0" w:color="000000"/>
+              <w:right w:val="single" w:sz="4" w:space="0" w:color="000000"/>
+            </w:tcBorders>
+            <w:shd w:val="clear" w:color="000000" w:fill="FFFFFF"/>
+            <w:tcMar>
+              <w:left w:w="108" w:type="dxa"/>
+              <w:right w:w="108" w:type="dxa"/>
+            </w:tcMar>
+          </w:tcPr>
+          <w:p>
+            <w:pPr>
+              <w:spacing w:after="0" w:line="240" w:lineRule="auto"/>
+              <w:jc w:val="center"/>
+              <w:rPr>
+                <w:rFonts w:ascii="Calibri" w:eastAsia="Calibri" w:hAnsi="Calibri" w:cs="Calibri"/>
+                <w:sz w:val="26"/>
+                <w:szCs w:val="26"/>
+              </w:rPr>
+            </w:pPr>
+            <w:r>
+              <w:rPr>
+                <w:rFonts w:ascii="Calibri" w:eastAsia="Calibri" w:hAnsi="Calibri" w:cs="Calibri"/>
+                <w:sz w:val="26"/>
+                <w:szCs w:val="26"/>
+              </w:rPr>
+              <w:t>AS1 B\L</w:t>
+            </w:r>
+          </w:p>
+        </w:tc>
+        <w:tc>
+          <w:tcPr>
+            <w:tcW w:w="1554" w:type="dxa"/>
             <w:tcBorders>
               <w:top w:val="single" w:sz="4" w:space="0" w:color="000000"/>
               <w:left w:val="single" w:sz="4" w:space="0" w:color="000000"/>
@@ -6043,34 +6049,34 @@
         </w:tc>
         <w:tc>
           <w:tcPr>
-            <w:tcW w:w="1261" w:type="dxa"/>
-            <w:tcBorders>
-              <w:top w:val="single" w:sz="4" w:space="0" w:color="000000"/>
-              <w:left w:val="single" w:sz="4" w:space="0" w:color="000000"/>
-              <w:bottom w:val="single" w:sz="4" w:space="0" w:color="000000"/>
-              <w:right w:val="single" w:sz="4" w:space="0" w:color="000000"/>
-            </w:tcBorders>
-            <w:shd w:val="clear" w:color="000000" w:fill="FFFFFF"/>
-            <w:tcMar>
-              <w:left w:w="108" w:type="dxa"/>
-              <w:right w:w="108" w:type="dxa"/>
-            </w:tcMar>
-          </w:tcPr>
-          <w:p>
-            <w:pPr>
-              <w:spacing w:after="0" w:line="240" w:lineRule="auto"/>
-              <w:jc w:val="center"/>
-              <w:rPr>
-                <w:rFonts w:ascii="Calibri" w:eastAsia="Calibri" w:hAnsi="Calibri" w:cs="Calibri"/>
-                <w:sz w:val="26"/>
-                <w:szCs w:val="26"/>
-              </w:rPr>
-            </w:pPr>
-          </w:p>
-        </w:tc>
-        <w:tc>
-          <w:tcPr>
-            <w:tcW w:w="1270" w:type="dxa"/>
+            <w:tcW w:w="1302" w:type="dxa"/>
+            <w:tcBorders>
+              <w:top w:val="single" w:sz="4" w:space="0" w:color="000000"/>
+              <w:left w:val="single" w:sz="4" w:space="0" w:color="000000"/>
+              <w:bottom w:val="single" w:sz="4" w:space="0" w:color="000000"/>
+              <w:right w:val="single" w:sz="4" w:space="0" w:color="000000"/>
+            </w:tcBorders>
+            <w:shd w:val="clear" w:color="000000" w:fill="FFFFFF"/>
+            <w:tcMar>
+              <w:left w:w="108" w:type="dxa"/>
+              <w:right w:w="108" w:type="dxa"/>
+            </w:tcMar>
+          </w:tcPr>
+          <w:p>
+            <w:pPr>
+              <w:spacing w:after="0" w:line="240" w:lineRule="auto"/>
+              <w:jc w:val="center"/>
+              <w:rPr>
+                <w:rFonts w:ascii="Calibri" w:eastAsia="Calibri" w:hAnsi="Calibri" w:cs="Calibri"/>
+                <w:sz w:val="26"/>
+                <w:szCs w:val="26"/>
+              </w:rPr>
+            </w:pPr>
+          </w:p>
+        </w:tc>
+        <w:tc>
+          <w:tcPr>
+            <w:tcW w:w="1314" w:type="dxa"/>
             <w:tcBorders>
               <w:top w:val="single" w:sz="4" w:space="0" w:color="000000"/>
               <w:left w:val="single" w:sz="4" w:space="0" w:color="000000"/>
@@ -6098,11 +6104,11 @@
       </w:tr>
       <w:tr>
         <w:trPr>
-          <w:trHeight w:val="340"/>
+          <w:trHeight w:val="337"/>
         </w:trPr>
         <w:tc>
           <w:tcPr>
-            <w:tcW w:w="706" w:type="dxa"/>
+            <w:tcW w:w="729" w:type="dxa"/>
             <w:tcBorders>
               <w:top w:val="single" w:sz="4" w:space="0" w:color="000000"/>
               <w:left w:val="single" w:sz="4" w:space="0" w:color="000000"/>
@@ -6138,7 +6144,7 @@
         </w:tc>
         <w:tc>
           <w:tcPr>
-            <w:tcW w:w="1555" w:type="dxa"/>
+            <w:tcW w:w="1606" w:type="dxa"/>
             <w:tcBorders>
               <w:top w:val="single" w:sz="4" w:space="0" w:color="000000"/>
               <w:left w:val="single" w:sz="4" w:space="0" w:color="000000"/>
@@ -6173,7 +6179,7 @@
         </w:tc>
         <w:tc>
           <w:tcPr>
-            <w:tcW w:w="1413" w:type="dxa"/>
+            <w:tcW w:w="1460" w:type="dxa"/>
             <w:tcBorders>
               <w:top w:val="single" w:sz="4" w:space="0" w:color="000000"/>
               <w:left w:val="single" w:sz="4" w:space="0" w:color="000000"/>
@@ -6208,93 +6214,95 @@
         </w:tc>
         <w:tc>
           <w:tcPr>
-            <w:tcW w:w="2442" w:type="dxa"/>
-            <w:tcBorders>
-              <w:top w:val="single" w:sz="4" w:space="0" w:color="000000"/>
-              <w:left w:val="single" w:sz="4" w:space="0" w:color="000000"/>
-              <w:bottom w:val="single" w:sz="4" w:space="0" w:color="000000"/>
-              <w:right w:val="single" w:sz="4" w:space="0" w:color="000000"/>
-            </w:tcBorders>
-            <w:shd w:val="clear" w:color="000000" w:fill="FFFFFF"/>
-            <w:tcMar>
-              <w:left w:w="108" w:type="dxa"/>
-              <w:right w:w="108" w:type="dxa"/>
-            </w:tcMar>
-          </w:tcPr>
-          <w:p>
-            <w:pPr>
-              <w:jc w:val="center"/>
-              <w:rPr>
-                <w:sz w:val="28"/>
-                <w:szCs w:val="28"/>
-              </w:rPr>
-            </w:pPr>
-            <w:r>
-              <w:rPr>
-                <w:sz w:val="28"/>
-                <w:szCs w:val="28"/>
-              </w:rPr>
-              <w:t>MNW</w:t>
-            </w:r>
-          </w:p>
-        </w:tc>
-        <w:tc>
-          <w:tcPr>
-            <w:tcW w:w="1504" w:type="dxa"/>
-            <w:tcBorders>
-              <w:top w:val="single" w:sz="4" w:space="0" w:color="000000"/>
-              <w:left w:val="single" w:sz="4" w:space="0" w:color="000000"/>
-              <w:bottom w:val="single" w:sz="4" w:space="0" w:color="000000"/>
-              <w:right w:val="single" w:sz="4" w:space="0" w:color="000000"/>
-            </w:tcBorders>
-            <w:shd w:val="clear" w:color="000000" w:fill="FFFFFF"/>
-            <w:tcMar>
-              <w:left w:w="108" w:type="dxa"/>
-              <w:right w:w="108" w:type="dxa"/>
-            </w:tcMar>
-          </w:tcPr>
-          <w:p>
-            <w:pPr>
-              <w:spacing w:after="0" w:line="240" w:lineRule="auto"/>
-              <w:jc w:val="center"/>
-              <w:rPr>
-                <w:rFonts w:ascii="Calibri" w:eastAsia="Calibri" w:hAnsi="Calibri" w:cs="Calibri"/>
-                <w:sz w:val="26"/>
-                <w:szCs w:val="26"/>
-              </w:rPr>
-            </w:pPr>
-          </w:p>
-        </w:tc>
-        <w:tc>
-          <w:tcPr>
-            <w:tcW w:w="1261" w:type="dxa"/>
-            <w:tcBorders>
-              <w:top w:val="single" w:sz="4" w:space="0" w:color="000000"/>
-              <w:left w:val="single" w:sz="4" w:space="0" w:color="000000"/>
-              <w:bottom w:val="single" w:sz="4" w:space="0" w:color="000000"/>
-              <w:right w:val="single" w:sz="4" w:space="0" w:color="000000"/>
-            </w:tcBorders>
-            <w:shd w:val="clear" w:color="000000" w:fill="FFFFFF"/>
-            <w:tcMar>
-              <w:left w:w="108" w:type="dxa"/>
-              <w:right w:w="108" w:type="dxa"/>
-            </w:tcMar>
-          </w:tcPr>
-          <w:p>
-            <w:pPr>
-              <w:spacing w:after="0" w:line="240" w:lineRule="auto"/>
-              <w:jc w:val="center"/>
-              <w:rPr>
-                <w:rFonts w:ascii="Calibri" w:eastAsia="Calibri" w:hAnsi="Calibri" w:cs="Calibri"/>
-                <w:sz w:val="26"/>
-                <w:szCs w:val="26"/>
-              </w:rPr>
-            </w:pPr>
-          </w:p>
-        </w:tc>
-        <w:tc>
-          <w:tcPr>
-            <w:tcW w:w="1270" w:type="dxa"/>
+            <w:tcW w:w="2523" w:type="dxa"/>
+            <w:tcBorders>
+              <w:top w:val="single" w:sz="4" w:space="0" w:color="000000"/>
+              <w:left w:val="single" w:sz="4" w:space="0" w:color="000000"/>
+              <w:bottom w:val="single" w:sz="4" w:space="0" w:color="000000"/>
+              <w:right w:val="single" w:sz="4" w:space="0" w:color="000000"/>
+            </w:tcBorders>
+            <w:shd w:val="clear" w:color="000000" w:fill="FFFFFF"/>
+            <w:tcMar>
+              <w:left w:w="108" w:type="dxa"/>
+              <w:right w:w="108" w:type="dxa"/>
+            </w:tcMar>
+          </w:tcPr>
+          <w:p>
+            <w:pPr>
+              <w:spacing w:after="0" w:line="240" w:lineRule="auto"/>
+              <w:jc w:val="center"/>
+              <w:rPr>
+                <w:rFonts w:ascii="Calibri" w:eastAsia="Calibri" w:hAnsi="Calibri" w:cs="Calibri"/>
+                <w:sz w:val="26"/>
+                <w:szCs w:val="26"/>
+              </w:rPr>
+            </w:pPr>
+            <w:r>
+              <w:rPr>
+                <w:rFonts w:ascii="Calibri" w:eastAsia="Calibri" w:hAnsi="Calibri" w:cs="Calibri"/>
+                <w:sz w:val="26"/>
+                <w:szCs w:val="26"/>
+              </w:rPr>
+              <w:t>NQO</w:t>
+            </w:r>
+          </w:p>
+        </w:tc>
+        <w:tc>
+          <w:tcPr>
+            <w:tcW w:w="1554" w:type="dxa"/>
+            <w:tcBorders>
+              <w:top w:val="single" w:sz="4" w:space="0" w:color="000000"/>
+              <w:left w:val="single" w:sz="4" w:space="0" w:color="000000"/>
+              <w:bottom w:val="single" w:sz="4" w:space="0" w:color="000000"/>
+              <w:right w:val="single" w:sz="4" w:space="0" w:color="000000"/>
+            </w:tcBorders>
+            <w:shd w:val="clear" w:color="000000" w:fill="FFFFFF"/>
+            <w:tcMar>
+              <w:left w:w="108" w:type="dxa"/>
+              <w:right w:w="108" w:type="dxa"/>
+            </w:tcMar>
+          </w:tcPr>
+          <w:p>
+            <w:pPr>
+              <w:spacing w:after="0" w:line="240" w:lineRule="auto"/>
+              <w:rPr>
+                <w:rFonts w:ascii="Calibri" w:eastAsia="Calibri" w:hAnsi="Calibri" w:cs="Calibri"/>
+                <w:sz w:val="26"/>
+                <w:szCs w:val="26"/>
+              </w:rPr>
+            </w:pPr>
+          </w:p>
+        </w:tc>
+        <w:tc>
+          <w:tcPr>
+            <w:tcW w:w="1302" w:type="dxa"/>
+            <w:tcBorders>
+              <w:top w:val="single" w:sz="4" w:space="0" w:color="000000"/>
+              <w:left w:val="single" w:sz="4" w:space="0" w:color="000000"/>
+              <w:bottom w:val="single" w:sz="4" w:space="0" w:color="000000"/>
+              <w:right w:val="single" w:sz="4" w:space="0" w:color="000000"/>
+            </w:tcBorders>
+            <w:shd w:val="clear" w:color="000000" w:fill="FFFFFF"/>
+            <w:tcMar>
+              <w:left w:w="108" w:type="dxa"/>
+              <w:right w:w="108" w:type="dxa"/>
+            </w:tcMar>
+          </w:tcPr>
+          <w:p>
+            <w:pPr>
+              <w:spacing w:after="0" w:line="240" w:lineRule="auto"/>
+              <w:jc w:val="center"/>
+              <w:rPr>
+                <w:rFonts w:ascii="Calibri" w:eastAsia="Calibri" w:hAnsi="Calibri" w:cs="Calibri"/>
+                <w:sz w:val="26"/>
+                <w:szCs w:val="26"/>
+              </w:rPr>
+            </w:pPr>
+          </w:p>
+        </w:tc>
+        <w:tc>
+          <w:tcPr>
+            <w:tcW w:w="1314" w:type="dxa"/>
             <w:tcBorders>
               <w:top w:val="single" w:sz="4" w:space="0" w:color="000000"/>
               <w:left w:val="single" w:sz="4" w:space="0" w:color="000000"/>
@@ -6322,11 +6330,11 @@
       </w:tr>
       <w:tr>
         <w:trPr>
-          <w:trHeight w:val="340"/>
+          <w:trHeight w:val="337"/>
         </w:trPr>
         <w:tc>
           <w:tcPr>
-            <w:tcW w:w="706" w:type="dxa"/>
+            <w:tcW w:w="729" w:type="dxa"/>
             <w:tcBorders>
               <w:top w:val="single" w:sz="4" w:space="0" w:color="000000"/>
               <w:left w:val="single" w:sz="4" w:space="0" w:color="000000"/>
@@ -6362,7 +6370,7 @@
         </w:tc>
         <w:tc>
           <w:tcPr>
-            <w:tcW w:w="1555" w:type="dxa"/>
+            <w:tcW w:w="1606" w:type="dxa"/>
             <w:tcBorders>
               <w:top w:val="single" w:sz="4" w:space="0" w:color="000000"/>
               <w:left w:val="single" w:sz="4" w:space="0" w:color="000000"/>
@@ -6397,7 +6405,7 @@
         </w:tc>
         <w:tc>
           <w:tcPr>
-            <w:tcW w:w="1413" w:type="dxa"/>
+            <w:tcW w:w="1460" w:type="dxa"/>
             <w:tcBorders>
               <w:top w:val="single" w:sz="4" w:space="0" w:color="000000"/>
               <w:left w:val="single" w:sz="4" w:space="0" w:color="000000"/>
@@ -6432,93 +6440,95 @@
         </w:tc>
         <w:tc>
           <w:tcPr>
-            <w:tcW w:w="2442" w:type="dxa"/>
-            <w:tcBorders>
-              <w:top w:val="single" w:sz="4" w:space="0" w:color="000000"/>
-              <w:left w:val="single" w:sz="4" w:space="0" w:color="000000"/>
-              <w:bottom w:val="single" w:sz="4" w:space="0" w:color="000000"/>
-              <w:right w:val="single" w:sz="4" w:space="0" w:color="000000"/>
-            </w:tcBorders>
-            <w:shd w:val="clear" w:color="000000" w:fill="FFFFFF"/>
-            <w:tcMar>
-              <w:left w:w="108" w:type="dxa"/>
-              <w:right w:w="108" w:type="dxa"/>
-            </w:tcMar>
-          </w:tcPr>
-          <w:p>
-            <w:pPr>
-              <w:jc w:val="center"/>
-              <w:rPr>
-                <w:sz w:val="28"/>
-                <w:szCs w:val="28"/>
-              </w:rPr>
-            </w:pPr>
-            <w:r>
-              <w:rPr>
-                <w:sz w:val="28"/>
-                <w:szCs w:val="28"/>
-              </w:rPr>
-              <w:t>UDAY</w:t>
-            </w:r>
-          </w:p>
-        </w:tc>
-        <w:tc>
-          <w:tcPr>
-            <w:tcW w:w="1504" w:type="dxa"/>
-            <w:tcBorders>
-              <w:top w:val="single" w:sz="4" w:space="0" w:color="000000"/>
-              <w:left w:val="single" w:sz="4" w:space="0" w:color="000000"/>
-              <w:bottom w:val="single" w:sz="4" w:space="0" w:color="000000"/>
-              <w:right w:val="single" w:sz="4" w:space="0" w:color="000000"/>
-            </w:tcBorders>
-            <w:shd w:val="clear" w:color="000000" w:fill="FFFFFF"/>
-            <w:tcMar>
-              <w:left w:w="108" w:type="dxa"/>
-              <w:right w:w="108" w:type="dxa"/>
-            </w:tcMar>
-          </w:tcPr>
-          <w:p>
-            <w:pPr>
-              <w:spacing w:after="0" w:line="240" w:lineRule="auto"/>
-              <w:jc w:val="center"/>
-              <w:rPr>
-                <w:rFonts w:ascii="Calibri" w:eastAsia="Calibri" w:hAnsi="Calibri" w:cs="Calibri"/>
-                <w:sz w:val="26"/>
-                <w:szCs w:val="26"/>
-              </w:rPr>
-            </w:pPr>
-          </w:p>
-        </w:tc>
-        <w:tc>
-          <w:tcPr>
-            <w:tcW w:w="1261" w:type="dxa"/>
-            <w:tcBorders>
-              <w:top w:val="single" w:sz="4" w:space="0" w:color="000000"/>
-              <w:left w:val="single" w:sz="4" w:space="0" w:color="000000"/>
-              <w:bottom w:val="single" w:sz="4" w:space="0" w:color="000000"/>
-              <w:right w:val="single" w:sz="4" w:space="0" w:color="000000"/>
-            </w:tcBorders>
-            <w:shd w:val="clear" w:color="000000" w:fill="FFFFFF"/>
-            <w:tcMar>
-              <w:left w:w="108" w:type="dxa"/>
-              <w:right w:w="108" w:type="dxa"/>
-            </w:tcMar>
-          </w:tcPr>
-          <w:p>
-            <w:pPr>
-              <w:spacing w:after="0" w:line="240" w:lineRule="auto"/>
-              <w:jc w:val="center"/>
-              <w:rPr>
-                <w:rFonts w:ascii="Calibri" w:eastAsia="Calibri" w:hAnsi="Calibri" w:cs="Calibri"/>
-                <w:sz w:val="26"/>
-                <w:szCs w:val="26"/>
-              </w:rPr>
-            </w:pPr>
-          </w:p>
-        </w:tc>
-        <w:tc>
-          <w:tcPr>
-            <w:tcW w:w="1270" w:type="dxa"/>
+            <w:tcW w:w="2523" w:type="dxa"/>
+            <w:tcBorders>
+              <w:top w:val="single" w:sz="4" w:space="0" w:color="000000"/>
+              <w:left w:val="single" w:sz="4" w:space="0" w:color="000000"/>
+              <w:bottom w:val="single" w:sz="4" w:space="0" w:color="000000"/>
+              <w:right w:val="single" w:sz="4" w:space="0" w:color="000000"/>
+            </w:tcBorders>
+            <w:shd w:val="clear" w:color="000000" w:fill="FFFFFF"/>
+            <w:tcMar>
+              <w:left w:w="108" w:type="dxa"/>
+              <w:right w:w="108" w:type="dxa"/>
+            </w:tcMar>
+          </w:tcPr>
+          <w:p>
+            <w:pPr>
+              <w:spacing w:after="0" w:line="240" w:lineRule="auto"/>
+              <w:jc w:val="center"/>
+              <w:rPr>
+                <w:rFonts w:ascii="Calibri" w:eastAsia="Calibri" w:hAnsi="Calibri" w:cs="Calibri"/>
+                <w:sz w:val="26"/>
+                <w:szCs w:val="26"/>
+              </w:rPr>
+            </w:pPr>
+            <w:r>
+              <w:rPr>
+                <w:rFonts w:ascii="Calibri" w:eastAsia="Calibri" w:hAnsi="Calibri" w:cs="Calibri"/>
+                <w:sz w:val="26"/>
+                <w:szCs w:val="26"/>
+              </w:rPr>
+              <w:t>SJOT</w:t>
+            </w:r>
+          </w:p>
+        </w:tc>
+        <w:tc>
+          <w:tcPr>
+            <w:tcW w:w="1554" w:type="dxa"/>
+            <w:tcBorders>
+              <w:top w:val="single" w:sz="4" w:space="0" w:color="000000"/>
+              <w:left w:val="single" w:sz="4" w:space="0" w:color="000000"/>
+              <w:bottom w:val="single" w:sz="4" w:space="0" w:color="000000"/>
+              <w:right w:val="single" w:sz="4" w:space="0" w:color="000000"/>
+            </w:tcBorders>
+            <w:shd w:val="clear" w:color="000000" w:fill="FFFFFF"/>
+            <w:tcMar>
+              <w:left w:w="108" w:type="dxa"/>
+              <w:right w:w="108" w:type="dxa"/>
+            </w:tcMar>
+          </w:tcPr>
+          <w:p>
+            <w:pPr>
+              <w:spacing w:after="0" w:line="240" w:lineRule="auto"/>
+              <w:rPr>
+                <w:rFonts w:ascii="Calibri" w:eastAsia="Calibri" w:hAnsi="Calibri" w:cs="Calibri"/>
+                <w:sz w:val="26"/>
+                <w:szCs w:val="26"/>
+              </w:rPr>
+            </w:pPr>
+          </w:p>
+        </w:tc>
+        <w:tc>
+          <w:tcPr>
+            <w:tcW w:w="1302" w:type="dxa"/>
+            <w:tcBorders>
+              <w:top w:val="single" w:sz="4" w:space="0" w:color="000000"/>
+              <w:left w:val="single" w:sz="4" w:space="0" w:color="000000"/>
+              <w:bottom w:val="single" w:sz="4" w:space="0" w:color="000000"/>
+              <w:right w:val="single" w:sz="4" w:space="0" w:color="000000"/>
+            </w:tcBorders>
+            <w:shd w:val="clear" w:color="000000" w:fill="FFFFFF"/>
+            <w:tcMar>
+              <w:left w:w="108" w:type="dxa"/>
+              <w:right w:w="108" w:type="dxa"/>
+            </w:tcMar>
+          </w:tcPr>
+          <w:p>
+            <w:pPr>
+              <w:spacing w:after="0" w:line="240" w:lineRule="auto"/>
+              <w:jc w:val="center"/>
+              <w:rPr>
+                <w:rFonts w:ascii="Calibri" w:eastAsia="Calibri" w:hAnsi="Calibri" w:cs="Calibri"/>
+                <w:sz w:val="26"/>
+                <w:szCs w:val="26"/>
+              </w:rPr>
+            </w:pPr>
+          </w:p>
+        </w:tc>
+        <w:tc>
+          <w:tcPr>
+            <w:tcW w:w="1314" w:type="dxa"/>
             <w:tcBorders>
               <w:top w:val="single" w:sz="4" w:space="0" w:color="000000"/>
               <w:left w:val="single" w:sz="4" w:space="0" w:color="000000"/>
@@ -6546,14 +6556,13 @@
       </w:tr>
       <w:tr>
         <w:trPr>
-          <w:trHeight w:val="70"/>
+          <w:trHeight w:val="73"/>
         </w:trPr>
         <w:tc>
           <w:tcPr>
-            <w:tcW w:w="10151" w:type="dxa"/>
+            <w:tcW w:w="10488" w:type="dxa"/>
             <w:gridSpan w:val="7"/>
             <w:tcBorders>
-              <w:top w:val="single" w:sz="4" w:space="0" w:color="000000"/>
               <w:left w:val="single" w:sz="4" w:space="0" w:color="000000"/>
               <w:bottom w:val="single" w:sz="4" w:space="0" w:color="000000"/>
               <w:right w:val="single" w:sz="4" w:space="0" w:color="000000"/>
@@ -6586,7 +6595,14 @@
                 <w:b/>
                 <w:sz w:val="24"/>
               </w:rPr>
-              <w:t>SMRT,AS1</w:t>
+              <w:t xml:space="preserve"> </w:t>
+            </w:r>
+            <w:r>
+              <w:rPr>
+                <w:rFonts w:ascii="Calibri" w:eastAsia="Calibri" w:hAnsi="Calibri" w:cs="Calibri"/>
+                <w:sz w:val="24"/>
+              </w:rPr>
+              <w:t>MNW</w:t>
             </w:r>
           </w:p>
         </w:tc>
@@ -8225,7 +8241,7 @@
         <v:rect id="_x0000_i1025" style="width:56.25pt;height:39pt" o:ole="" o:preferrelative="t" stroked="f">
           <v:imagedata r:id="rId1" o:title=""/>
         </v:rect>
-        <o:OLEObject Type="Embed" ProgID="StaticMetafile" ShapeID="_x0000_i1025" DrawAspect="Content" ObjectID="_1851741084" r:id="rId2"/>
+        <o:OLEObject Type="Embed" ProgID="StaticMetafile" ShapeID="_x0000_i1025" DrawAspect="Content" ObjectID="_1851771012" r:id="rId2"/>
       </w:object>
     </w:r>
     <w:r>
@@ -8269,7 +8285,7 @@
         <w:sz w:val="26"/>
         <w:szCs w:val="26"/>
       </w:rPr>
-      <w:t>4</w:t>
+      <w:t>5</w:t>
     </w:r>
     <w:r>
       <w:rPr>
@@ -8289,17 +8305,7 @@
         <w:sz w:val="26"/>
         <w:szCs w:val="26"/>
       </w:rPr>
-      <w:t>THUR</w:t>
-    </w:r>
-    <w:r>
-      <w:rPr>
-        <w:rFonts w:ascii="Times New Roman" w:hAnsi="Times New Roman" w:cs="Times New Roman"/>
-        <w:b/>
-        <w:color w:val="000000" w:themeColor="text1"/>
-        <w:sz w:val="26"/>
-        <w:szCs w:val="26"/>
-      </w:rPr>
-      <w:t>S</w:t>
+      <w:t>FRI</w:t>
     </w:r>
     <w:r>
       <w:rPr>

</xml_diff>

<commit_message>
Sync - 2026-09-25 17:54
</commit_message>
<xml_diff>
--- a/files/Daily_Helicopter_Schedule.docx
+++ b/files/Daily_Helicopter_Schedule.docx
@@ -674,10 +674,8 @@
                 <w:sz w:val="26"/>
                 <w:szCs w:val="26"/>
               </w:rPr>
-              <w:t>RRI</w:t>
-            </w:r>
-            <w:bookmarkStart w:id="0" w:name="_GoBack"/>
-            <w:bookmarkEnd w:id="0"/>
+              <w:t>NA</w:t>
+            </w:r>
           </w:p>
         </w:tc>
         <w:tc>
@@ -1423,7 +1421,39 @@
                 <w:sz w:val="26"/>
                 <w:szCs w:val="26"/>
               </w:rPr>
-              <w:t>10:30</w:t>
+              <w:t>1</w:t>
+            </w:r>
+            <w:r>
+              <w:rPr>
+                <w:rFonts w:ascii="Calibri" w:eastAsia="Calibri" w:hAnsi="Calibri" w:cs="Calibri"/>
+                <w:sz w:val="26"/>
+                <w:szCs w:val="26"/>
+              </w:rPr>
+              <w:t>2</w:t>
+            </w:r>
+            <w:r>
+              <w:rPr>
+                <w:rFonts w:ascii="Calibri" w:eastAsia="Calibri" w:hAnsi="Calibri" w:cs="Calibri"/>
+                <w:sz w:val="26"/>
+                <w:szCs w:val="26"/>
+              </w:rPr>
+              <w:t>:</w:t>
+            </w:r>
+            <w:r>
+              <w:rPr>
+                <w:rFonts w:ascii="Calibri" w:eastAsia="Calibri" w:hAnsi="Calibri" w:cs="Calibri"/>
+                <w:sz w:val="26"/>
+                <w:szCs w:val="26"/>
+              </w:rPr>
+              <w:t>0</w:t>
+            </w:r>
+            <w:r>
+              <w:rPr>
+                <w:rFonts w:ascii="Calibri" w:eastAsia="Calibri" w:hAnsi="Calibri" w:cs="Calibri"/>
+                <w:sz w:val="26"/>
+                <w:szCs w:val="26"/>
+              </w:rPr>
+              <w:t>0</w:t>
             </w:r>
           </w:p>
         </w:tc>
@@ -1458,7 +1488,15 @@
                 <w:sz w:val="26"/>
                 <w:szCs w:val="26"/>
               </w:rPr>
-              <w:t>HF (PM)</w:t>
+              <w:t>BLQ</w:t>
+            </w:r>
+            <w:r>
+              <w:rPr>
+                <w:rFonts w:ascii="Calibri" w:eastAsia="Calibri" w:hAnsi="Calibri" w:cs="Calibri"/>
+                <w:sz w:val="26"/>
+                <w:szCs w:val="26"/>
+              </w:rPr>
+              <w:t xml:space="preserve"> (PM)</w:t>
             </w:r>
           </w:p>
         </w:tc>
@@ -1491,11 +1529,10 @@
             <w:r>
               <w:rPr>
                 <w:rFonts w:ascii="Calibri" w:eastAsia="Calibri" w:hAnsi="Calibri" w:cs="Calibri"/>
-                <w:b/>
-                <w:sz w:val="26"/>
-                <w:szCs w:val="26"/>
-              </w:rPr>
-              <w:t>NA</w:t>
+                <w:sz w:val="26"/>
+                <w:szCs w:val="26"/>
+              </w:rPr>
+              <w:t>GVHL 412</w:t>
             </w:r>
           </w:p>
         </w:tc>
@@ -1520,19 +1557,17 @@
               <w:jc w:val="center"/>
               <w:rPr>
                 <w:rFonts w:ascii="Calibri" w:eastAsia="Calibri" w:hAnsi="Calibri" w:cs="Calibri"/>
-                <w:b/>
-                <w:sz w:val="26"/>
-                <w:szCs w:val="26"/>
-              </w:rPr>
-            </w:pPr>
-            <w:r>
-              <w:rPr>
-                <w:rFonts w:ascii="Calibri" w:eastAsia="Calibri" w:hAnsi="Calibri" w:cs="Calibri"/>
-                <w:b/>
-                <w:sz w:val="26"/>
-                <w:szCs w:val="26"/>
-              </w:rPr>
-              <w:t>NA</w:t>
+                <w:sz w:val="26"/>
+                <w:szCs w:val="26"/>
+              </w:rPr>
+            </w:pPr>
+            <w:r>
+              <w:rPr>
+                <w:rFonts w:ascii="Calibri" w:eastAsia="Calibri" w:hAnsi="Calibri" w:cs="Calibri"/>
+                <w:sz w:val="26"/>
+                <w:szCs w:val="26"/>
+              </w:rPr>
+              <w:t>RRJ</w:t>
             </w:r>
           </w:p>
         </w:tc>
@@ -1575,7 +1610,7 @@
                 <w:sz w:val="26"/>
                 <w:szCs w:val="26"/>
               </w:rPr>
-              <w:t>0</w:t>
+              <w:t>5</w:t>
             </w:r>
           </w:p>
         </w:tc>
@@ -2328,7 +2363,7 @@
                 <w:sz w:val="26"/>
                 <w:szCs w:val="26"/>
               </w:rPr>
-              <w:t>RRJ</w:t>
+              <w:t>RRI</w:t>
             </w:r>
           </w:p>
         </w:tc>
@@ -3102,19 +3137,17 @@
               <w:jc w:val="center"/>
               <w:rPr>
                 <w:rFonts w:ascii="Calibri" w:eastAsia="Calibri" w:hAnsi="Calibri" w:cs="Calibri"/>
-                <w:b/>
-                <w:sz w:val="26"/>
-                <w:szCs w:val="26"/>
-              </w:rPr>
-            </w:pPr>
-            <w:r>
-              <w:rPr>
-                <w:rFonts w:ascii="Calibri" w:eastAsia="Calibri" w:hAnsi="Calibri" w:cs="Calibri"/>
-                <w:b/>
-                <w:sz w:val="26"/>
-                <w:szCs w:val="26"/>
-              </w:rPr>
-              <w:t>NA</w:t>
+                <w:sz w:val="26"/>
+                <w:szCs w:val="26"/>
+              </w:rPr>
+            </w:pPr>
+            <w:r>
+              <w:rPr>
+                <w:rFonts w:ascii="Calibri" w:eastAsia="Calibri" w:hAnsi="Calibri" w:cs="Calibri"/>
+                <w:sz w:val="26"/>
+                <w:szCs w:val="26"/>
+              </w:rPr>
+              <w:t>AD9</w:t>
             </w:r>
           </w:p>
         </w:tc>
@@ -4343,7 +4376,7 @@
                 <w:sz w:val="26"/>
                 <w:szCs w:val="26"/>
               </w:rPr>
-              <w:t>BPB</w:t>
+              <w:t>SUDA</w:t>
             </w:r>
           </w:p>
         </w:tc>
@@ -4802,17 +4835,11 @@
             </w:pPr>
             <w:r>
               <w:rPr>
+                <w:rFonts w:ascii="Calibri" w:eastAsia="Calibri" w:hAnsi="Calibri" w:cs="Calibri"/>
                 <w:sz w:val="28"/>
                 <w:szCs w:val="28"/>
               </w:rPr>
-              <w:t>B193</w:t>
-            </w:r>
-            <w:r>
-              <w:rPr>
-                <w:sz w:val="28"/>
-                <w:szCs w:val="28"/>
-              </w:rPr>
-              <w:t xml:space="preserve">      </w:t>
+              <w:t>SRAT</w:t>
             </w:r>
           </w:p>
         </w:tc>
@@ -5046,7 +5073,7 @@
                 <w:sz w:val="26"/>
                 <w:szCs w:val="26"/>
               </w:rPr>
-              <w:t>SGAV</w:t>
+              <w:t>KSPR</w:t>
             </w:r>
           </w:p>
         </w:tc>
@@ -5328,7 +5355,7 @@
                 <w:sz w:val="26"/>
                 <w:szCs w:val="26"/>
               </w:rPr>
-              <w:t>ICP</w:t>
+              <w:t>JSUP</w:t>
             </w:r>
           </w:p>
         </w:tc>
@@ -5555,7 +5582,7 @@
                 <w:sz w:val="26"/>
                 <w:szCs w:val="26"/>
               </w:rPr>
-              <w:t>SLQ</w:t>
+              <w:t>DEFOS</w:t>
             </w:r>
           </w:p>
         </w:tc>
@@ -5782,7 +5809,7 @@
                 <w:sz w:val="26"/>
                 <w:szCs w:val="26"/>
               </w:rPr>
-              <w:t>SHQ</w:t>
+              <w:t>SSAK</w:t>
             </w:r>
           </w:p>
         </w:tc>
@@ -6009,7 +6036,7 @@
                 <w:sz w:val="26"/>
                 <w:szCs w:val="26"/>
               </w:rPr>
-              <w:t>AS1 B\L</w:t>
+              <w:t>DVDR</w:t>
             </w:r>
           </w:p>
         </w:tc>
@@ -6243,7 +6270,7 @@
                 <w:sz w:val="26"/>
                 <w:szCs w:val="26"/>
               </w:rPr>
-              <w:t>NQO</w:t>
+              <w:t>ABN8</w:t>
             </w:r>
           </w:p>
         </w:tc>
@@ -6469,7 +6496,7 @@
                 <w:sz w:val="26"/>
                 <w:szCs w:val="26"/>
               </w:rPr>
-              <w:t>SJOT</w:t>
+              <w:t>CHTR</w:t>
             </w:r>
           </w:p>
         </w:tc>
@@ -6596,13 +6623,6 @@
                 <w:sz w:val="24"/>
               </w:rPr>
               <w:t xml:space="preserve"> </w:t>
-            </w:r>
-            <w:r>
-              <w:rPr>
-                <w:rFonts w:ascii="Calibri" w:eastAsia="Calibri" w:hAnsi="Calibri" w:cs="Calibri"/>
-                <w:sz w:val="24"/>
-              </w:rPr>
-              <w:t>MNW</w:t>
             </w:r>
           </w:p>
         </w:tc>
@@ -7243,7 +7263,7 @@
                 <w:sz w:val="26"/>
                 <w:szCs w:val="26"/>
               </w:rPr>
-              <w:t>TAPTI</w:t>
+              <w:t>CHRU</w:t>
             </w:r>
           </w:p>
         </w:tc>
@@ -7473,7 +7493,7 @@
                 <w:sz w:val="26"/>
                 <w:szCs w:val="26"/>
               </w:rPr>
-              <w:t>L/O</w:t>
+              <w:t>SJOT</w:t>
             </w:r>
           </w:p>
         </w:tc>
@@ -7704,8 +7724,10 @@
                 <w:sz w:val="26"/>
                 <w:szCs w:val="26"/>
               </w:rPr>
-              <w:t>L/O</w:t>
-            </w:r>
+              <w:t>CHRU+CET</w:t>
+            </w:r>
+            <w:bookmarkStart w:id="0" w:name="_GoBack"/>
+            <w:bookmarkEnd w:id="0"/>
           </w:p>
         </w:tc>
         <w:tc>
@@ -7929,14 +7951,6 @@
                 <w:szCs w:val="26"/>
               </w:rPr>
             </w:pPr>
-            <w:r>
-              <w:rPr>
-                <w:rFonts w:ascii="Calibri" w:eastAsia="Calibri" w:hAnsi="Calibri" w:cs="Calibri"/>
-                <w:sz w:val="26"/>
-                <w:szCs w:val="26"/>
-              </w:rPr>
-              <w:t>L/O</w:t>
-            </w:r>
           </w:p>
         </w:tc>
         <w:tc>
@@ -8241,7 +8255,7 @@
         <v:rect id="_x0000_i1025" style="width:56.25pt;height:39pt" o:ole="" o:preferrelative="t" stroked="f">
           <v:imagedata r:id="rId1" o:title=""/>
         </v:rect>
-        <o:OLEObject Type="Embed" ProgID="StaticMetafile" ShapeID="_x0000_i1025" DrawAspect="Content" ObjectID="_1851771012" r:id="rId2"/>
+        <o:OLEObject Type="Embed" ProgID="StaticMetafile" ShapeID="_x0000_i1025" DrawAspect="Content" ObjectID="_1851861530" r:id="rId2"/>
       </w:object>
     </w:r>
     <w:r>
@@ -8285,7 +8299,7 @@
         <w:sz w:val="26"/>
         <w:szCs w:val="26"/>
       </w:rPr>
-      <w:t>5</w:t>
+      <w:t>6</w:t>
     </w:r>
     <w:r>
       <w:rPr>
@@ -8305,7 +8319,7 @@
         <w:sz w:val="26"/>
         <w:szCs w:val="26"/>
       </w:rPr>
-      <w:t>FRI</w:t>
+      <w:t>SATUR</w:t>
     </w:r>
     <w:r>
       <w:rPr>

</xml_diff>

<commit_message>
Sync - 2026-09-26 16:56
</commit_message>
<xml_diff>
--- a/files/Daily_Helicopter_Schedule.docx
+++ b/files/Daily_Helicopter_Schedule.docx
@@ -674,7 +674,7 @@
                 <w:sz w:val="26"/>
                 <w:szCs w:val="26"/>
               </w:rPr>
-              <w:t>NA</w:t>
+              <w:t>GVT</w:t>
             </w:r>
           </w:p>
         </w:tc>
@@ -1429,32 +1429,10 @@
                 <w:sz w:val="26"/>
                 <w:szCs w:val="26"/>
               </w:rPr>
-              <w:t>2</w:t>
-            </w:r>
-            <w:r>
-              <w:rPr>
-                <w:rFonts w:ascii="Calibri" w:eastAsia="Calibri" w:hAnsi="Calibri" w:cs="Calibri"/>
-                <w:sz w:val="26"/>
-                <w:szCs w:val="26"/>
-              </w:rPr>
-              <w:t>:</w:t>
-            </w:r>
-            <w:r>
-              <w:rPr>
-                <w:rFonts w:ascii="Calibri" w:eastAsia="Calibri" w:hAnsi="Calibri" w:cs="Calibri"/>
-                <w:sz w:val="26"/>
-                <w:szCs w:val="26"/>
-              </w:rPr>
-              <w:t>0</w:t>
-            </w:r>
-            <w:r>
-              <w:rPr>
-                <w:rFonts w:ascii="Calibri" w:eastAsia="Calibri" w:hAnsi="Calibri" w:cs="Calibri"/>
-                <w:sz w:val="26"/>
-                <w:szCs w:val="26"/>
-              </w:rPr>
-              <w:t>0</w:t>
-            </w:r>
+              <w:t>1:00</w:t>
+            </w:r>
+            <w:bookmarkStart w:id="0" w:name="_GoBack"/>
+            <w:bookmarkEnd w:id="0"/>
           </w:p>
         </w:tc>
         <w:tc>
@@ -1488,15 +1466,7 @@
                 <w:sz w:val="26"/>
                 <w:szCs w:val="26"/>
               </w:rPr>
-              <w:t>BLQ</w:t>
-            </w:r>
-            <w:r>
-              <w:rPr>
-                <w:rFonts w:ascii="Calibri" w:eastAsia="Calibri" w:hAnsi="Calibri" w:cs="Calibri"/>
-                <w:sz w:val="26"/>
-                <w:szCs w:val="26"/>
-              </w:rPr>
-              <w:t xml:space="preserve"> (PM)</w:t>
+              <w:t>HF[PM]</w:t>
             </w:r>
           </w:p>
         </w:tc>
@@ -1521,7 +1491,6 @@
               <w:jc w:val="center"/>
               <w:rPr>
                 <w:rFonts w:ascii="Calibri" w:eastAsia="Calibri" w:hAnsi="Calibri" w:cs="Calibri"/>
-                <w:b/>
                 <w:sz w:val="26"/>
                 <w:szCs w:val="26"/>
               </w:rPr>
@@ -1602,15 +1571,7 @@
                 <w:sz w:val="26"/>
                 <w:szCs w:val="26"/>
               </w:rPr>
-              <w:t>0</w:t>
-            </w:r>
-            <w:r>
-              <w:rPr>
-                <w:rFonts w:ascii="Calibri" w:eastAsia="Calibri" w:hAnsi="Calibri" w:cs="Calibri"/>
-                <w:sz w:val="26"/>
-                <w:szCs w:val="26"/>
-              </w:rPr>
-              <w:t>5</w:t>
+              <w:t>07</w:t>
             </w:r>
           </w:p>
         </w:tc>
@@ -3147,7 +3108,7 @@
                 <w:sz w:val="26"/>
                 <w:szCs w:val="26"/>
               </w:rPr>
-              <w:t>AD9</w:t>
+              <w:t xml:space="preserve"> VIR-1</w:t>
             </w:r>
           </w:p>
         </w:tc>
@@ -3200,11 +3161,18 @@
               <w:jc w:val="center"/>
               <w:rPr>
                 <w:rFonts w:ascii="Calibri" w:eastAsia="Calibri" w:hAnsi="Calibri" w:cs="Calibri"/>
-                <w:b/>
-                <w:sz w:val="26"/>
-                <w:szCs w:val="26"/>
-              </w:rPr>
-            </w:pPr>
+                <w:sz w:val="26"/>
+                <w:szCs w:val="26"/>
+              </w:rPr>
+            </w:pPr>
+            <w:r>
+              <w:rPr>
+                <w:rFonts w:ascii="Calibri" w:eastAsia="Calibri" w:hAnsi="Calibri" w:cs="Calibri"/>
+                <w:sz w:val="26"/>
+                <w:szCs w:val="26"/>
+              </w:rPr>
+              <w:t>RRJ</w:t>
+            </w:r>
           </w:p>
         </w:tc>
         <w:tc>
@@ -4376,7 +4344,7 @@
                 <w:sz w:val="26"/>
                 <w:szCs w:val="26"/>
               </w:rPr>
-              <w:t>SUDA</w:t>
+              <w:t>VKDN1</w:t>
             </w:r>
           </w:p>
         </w:tc>
@@ -4432,6 +4400,14 @@
                 <w:szCs w:val="26"/>
               </w:rPr>
             </w:pPr>
+            <w:r>
+              <w:rPr>
+                <w:rFonts w:ascii="Calibri" w:eastAsia="Calibri" w:hAnsi="Calibri" w:cs="Calibri"/>
+                <w:sz w:val="26"/>
+                <w:szCs w:val="26"/>
+              </w:rPr>
+              <w:t>HLV</w:t>
+            </w:r>
           </w:p>
         </w:tc>
         <w:tc>
@@ -4567,7 +4543,7 @@
                 <w:sz w:val="26"/>
                 <w:szCs w:val="26"/>
               </w:rPr>
-              <w:t>10:00</w:t>
+              <w:t>09:30</w:t>
             </w:r>
           </w:p>
         </w:tc>
@@ -4592,19 +4568,17 @@
               <w:jc w:val="center"/>
               <w:rPr>
                 <w:rFonts w:ascii="Calibri" w:eastAsia="Calibri" w:hAnsi="Calibri" w:cs="Calibri"/>
-                <w:b/>
-                <w:sz w:val="26"/>
-                <w:szCs w:val="26"/>
-              </w:rPr>
-            </w:pPr>
-            <w:r>
-              <w:rPr>
-                <w:rFonts w:ascii="Calibri" w:eastAsia="Calibri" w:hAnsi="Calibri" w:cs="Calibri"/>
-                <w:b/>
-                <w:sz w:val="26"/>
-                <w:szCs w:val="26"/>
-              </w:rPr>
-              <w:t>NA</w:t>
+                <w:sz w:val="26"/>
+                <w:szCs w:val="26"/>
+              </w:rPr>
+            </w:pPr>
+            <w:r>
+              <w:rPr>
+                <w:rFonts w:ascii="Calibri" w:eastAsia="Calibri" w:hAnsi="Calibri" w:cs="Calibri"/>
+                <w:sz w:val="26"/>
+                <w:szCs w:val="26"/>
+              </w:rPr>
+              <w:t>UDAY[L/O]</w:t>
             </w:r>
           </w:p>
         </w:tc>
@@ -4656,11 +4630,18 @@
               <w:jc w:val="center"/>
               <w:rPr>
                 <w:rFonts w:ascii="Calibri" w:eastAsia="Calibri" w:hAnsi="Calibri" w:cs="Calibri"/>
-                <w:b/>
-                <w:sz w:val="26"/>
-                <w:szCs w:val="26"/>
-              </w:rPr>
-            </w:pPr>
+                <w:sz w:val="26"/>
+                <w:szCs w:val="26"/>
+              </w:rPr>
+            </w:pPr>
+            <w:r>
+              <w:rPr>
+                <w:rFonts w:ascii="Calibri" w:eastAsia="Calibri" w:hAnsi="Calibri" w:cs="Calibri"/>
+                <w:sz w:val="26"/>
+                <w:szCs w:val="26"/>
+              </w:rPr>
+              <w:t>HLW</w:t>
+            </w:r>
           </w:p>
         </w:tc>
         <w:tc>
@@ -4836,10 +4817,10 @@
             <w:r>
               <w:rPr>
                 <w:rFonts w:ascii="Calibri" w:eastAsia="Calibri" w:hAnsi="Calibri" w:cs="Calibri"/>
-                <w:sz w:val="28"/>
-                <w:szCs w:val="28"/>
-              </w:rPr>
-              <w:t>SRAT</w:t>
+                <w:sz w:val="26"/>
+                <w:szCs w:val="26"/>
+              </w:rPr>
+              <w:t>J EXPLR</w:t>
             </w:r>
           </w:p>
         </w:tc>
@@ -4895,6 +4876,14 @@
                 <w:szCs w:val="26"/>
               </w:rPr>
             </w:pPr>
+            <w:r>
+              <w:rPr>
+                <w:rFonts w:ascii="Calibri" w:eastAsia="Calibri" w:hAnsi="Calibri" w:cs="Calibri"/>
+                <w:sz w:val="26"/>
+                <w:szCs w:val="26"/>
+              </w:rPr>
+              <w:t>HLV</w:t>
+            </w:r>
           </w:p>
         </w:tc>
         <w:tc>
@@ -5073,7 +5062,7 @@
                 <w:sz w:val="26"/>
                 <w:szCs w:val="26"/>
               </w:rPr>
-              <w:t>KSPR</w:t>
+              <w:t>ABAN8</w:t>
             </w:r>
           </w:p>
         </w:tc>
@@ -5129,6 +5118,14 @@
                 <w:szCs w:val="26"/>
               </w:rPr>
             </w:pPr>
+            <w:r>
+              <w:rPr>
+                <w:rFonts w:ascii="Calibri" w:eastAsia="Calibri" w:hAnsi="Calibri" w:cs="Calibri"/>
+                <w:sz w:val="26"/>
+                <w:szCs w:val="26"/>
+              </w:rPr>
+              <w:t>HLV</w:t>
+            </w:r>
           </w:p>
         </w:tc>
         <w:tc>
@@ -5355,7 +5352,7 @@
                 <w:sz w:val="26"/>
                 <w:szCs w:val="26"/>
               </w:rPr>
-              <w:t>JSUP</w:t>
+              <w:t>TRI-2</w:t>
             </w:r>
           </w:p>
         </w:tc>
@@ -5582,7 +5579,7 @@
                 <w:sz w:val="26"/>
                 <w:szCs w:val="26"/>
               </w:rPr>
-              <w:t>DEFOS</w:t>
+              <w:t>DISC1</w:t>
             </w:r>
           </w:p>
         </w:tc>
@@ -5809,7 +5806,7 @@
                 <w:sz w:val="26"/>
                 <w:szCs w:val="26"/>
               </w:rPr>
-              <w:t>SSAK</w:t>
+              <w:t>VKDN2</w:t>
             </w:r>
           </w:p>
         </w:tc>
@@ -6036,7 +6033,7 @@
                 <w:sz w:val="26"/>
                 <w:szCs w:val="26"/>
               </w:rPr>
-              <w:t>DVDR</w:t>
+              <w:t>ARMADA2</w:t>
             </w:r>
           </w:p>
         </w:tc>
@@ -6270,7 +6267,7 @@
                 <w:sz w:val="26"/>
                 <w:szCs w:val="26"/>
               </w:rPr>
-              <w:t>ABN8</w:t>
+              <w:t>KSPR</w:t>
             </w:r>
           </w:p>
         </w:tc>
@@ -6496,7 +6493,7 @@
                 <w:sz w:val="26"/>
                 <w:szCs w:val="26"/>
               </w:rPr>
-              <w:t>CHTR</w:t>
+              <w:t>VIR-1</w:t>
             </w:r>
           </w:p>
         </w:tc>
@@ -6614,15 +6611,7 @@
                 <w:b/>
                 <w:sz w:val="24"/>
               </w:rPr>
-              <w:t xml:space="preserve">WAITING: </w:t>
-            </w:r>
-            <w:r>
-              <w:rPr>
-                <w:rFonts w:ascii="Calibri" w:eastAsia="Calibri" w:hAnsi="Calibri" w:cs="Calibri"/>
-                <w:b/>
-                <w:sz w:val="24"/>
-              </w:rPr>
-              <w:t xml:space="preserve"> </w:t>
+              <w:t xml:space="preserve">WAITING:  </w:t>
             </w:r>
           </w:p>
         </w:tc>
@@ -6637,6 +6626,60 @@
           <w:sz w:val="24"/>
         </w:rPr>
       </w:pPr>
+      <w:r>
+        <w:rPr>
+          <w:rFonts w:ascii="Calibri" w:eastAsia="Calibri" w:hAnsi="Calibri" w:cs="Calibri"/>
+          <w:b/>
+          <w:sz w:val="24"/>
+        </w:rPr>
+        <w:t xml:space="preserve">NOTE: No Schedule for Crew Change of Private Rigs, </w:t>
+      </w:r>
+      <w:proofErr w:type="spellStart"/>
+      <w:proofErr w:type="gramStart"/>
+      <w:r>
+        <w:rPr>
+          <w:rFonts w:ascii="Calibri" w:eastAsia="Calibri" w:hAnsi="Calibri" w:cs="Calibri"/>
+          <w:b/>
+          <w:sz w:val="24"/>
+        </w:rPr>
+        <w:t>Samrat</w:t>
+      </w:r>
+      <w:proofErr w:type="spellEnd"/>
+      <w:r>
+        <w:rPr>
+          <w:rFonts w:ascii="Calibri" w:eastAsia="Calibri" w:hAnsi="Calibri" w:cs="Calibri"/>
+          <w:b/>
+          <w:sz w:val="24"/>
+        </w:rPr>
+        <w:t xml:space="preserve"> ,</w:t>
+      </w:r>
+      <w:proofErr w:type="gramEnd"/>
+      <w:r>
+        <w:rPr>
+          <w:rFonts w:ascii="Calibri" w:eastAsia="Calibri" w:hAnsi="Calibri" w:cs="Calibri"/>
+          <w:b/>
+          <w:sz w:val="24"/>
+        </w:rPr>
+        <w:t xml:space="preserve"> AS1,AS2.</w:t>
+      </w:r>
+    </w:p>
+    <w:p>
+      <w:pPr>
+        <w:spacing w:after="0" w:line="240" w:lineRule="auto"/>
+        <w:rPr>
+          <w:rFonts w:ascii="Calibri" w:eastAsia="Calibri" w:hAnsi="Calibri" w:cs="Calibri"/>
+          <w:b/>
+          <w:sz w:val="24"/>
+        </w:rPr>
+      </w:pPr>
+      <w:r>
+        <w:rPr>
+          <w:rFonts w:ascii="Calibri" w:eastAsia="Calibri" w:hAnsi="Calibri" w:cs="Calibri"/>
+          <w:b/>
+          <w:sz w:val="24"/>
+        </w:rPr>
+        <w:t>Crew Boat Schedule will be informed.</w:t>
+      </w:r>
     </w:p>
     <w:p>
       <w:pPr>
@@ -7263,7 +7306,7 @@
                 <w:sz w:val="26"/>
                 <w:szCs w:val="26"/>
               </w:rPr>
-              <w:t>CHRU</w:t>
+              <w:t>BLQ[D]</w:t>
             </w:r>
           </w:p>
         </w:tc>
@@ -7487,14 +7530,6 @@
                 <w:szCs w:val="26"/>
               </w:rPr>
             </w:pPr>
-            <w:r>
-              <w:rPr>
-                <w:rFonts w:ascii="Calibri" w:eastAsia="Calibri" w:hAnsi="Calibri" w:cs="Calibri"/>
-                <w:sz w:val="26"/>
-                <w:szCs w:val="26"/>
-              </w:rPr>
-              <w:t>SJOT</w:t>
-            </w:r>
           </w:p>
         </w:tc>
         <w:tc>
@@ -7718,16 +7753,6 @@
                 <w:szCs w:val="26"/>
               </w:rPr>
             </w:pPr>
-            <w:r>
-              <w:rPr>
-                <w:rFonts w:ascii="Calibri" w:eastAsia="Calibri" w:hAnsi="Calibri" w:cs="Calibri"/>
-                <w:sz w:val="26"/>
-                <w:szCs w:val="26"/>
-              </w:rPr>
-              <w:t>CHRU+CET</w:t>
-            </w:r>
-            <w:bookmarkStart w:id="0" w:name="_GoBack"/>
-            <w:bookmarkEnd w:id="0"/>
           </w:p>
         </w:tc>
         <w:tc>
@@ -8252,10 +8277,10 @@
     </w:pPr>
     <w:r>
       <w:object w:dxaOrig="1188" w:dyaOrig="900">
-        <v:rect id="_x0000_i1025" style="width:56.25pt;height:39pt" o:ole="" o:preferrelative="t" stroked="f">
+        <v:rect id="_x0000_i1025" style="width:56.25pt;height:38.7pt" o:ole="" o:preferrelative="t" stroked="f">
           <v:imagedata r:id="rId1" o:title=""/>
         </v:rect>
-        <o:OLEObject Type="Embed" ProgID="StaticMetafile" ShapeID="_x0000_i1025" DrawAspect="Content" ObjectID="_1851861530" r:id="rId2"/>
+        <o:OLEObject Type="Embed" ProgID="StaticMetafile" ShapeID="_x0000_i1025" DrawAspect="Content" ObjectID="_1851946592" r:id="rId2"/>
       </w:object>
     </w:r>
     <w:r>
@@ -8299,7 +8324,7 @@
         <w:sz w:val="26"/>
         <w:szCs w:val="26"/>
       </w:rPr>
-      <w:t>6</w:t>
+      <w:t>7</w:t>
     </w:r>
     <w:r>
       <w:rPr>
@@ -8319,7 +8344,7 @@
         <w:sz w:val="26"/>
         <w:szCs w:val="26"/>
       </w:rPr>
-      <w:t>SATUR</w:t>
+      <w:t>SUN</w:t>
     </w:r>
     <w:r>
       <w:rPr>

</xml_diff>

<commit_message>
Sync - 2026-09-26 17:26
</commit_message>
<xml_diff>
--- a/files/Daily_Helicopter_Schedule.docx
+++ b/files/Daily_Helicopter_Schedule.docx
@@ -1431,8 +1431,6 @@
               </w:rPr>
               <w:t>1:00</w:t>
             </w:r>
-            <w:bookmarkStart w:id="0" w:name="_GoBack"/>
-            <w:bookmarkEnd w:id="0"/>
           </w:p>
         </w:tc>
         <w:tc>
@@ -3165,14 +3163,6 @@
                 <w:szCs w:val="26"/>
               </w:rPr>
             </w:pPr>
-            <w:r>
-              <w:rPr>
-                <w:rFonts w:ascii="Calibri" w:eastAsia="Calibri" w:hAnsi="Calibri" w:cs="Calibri"/>
-                <w:sz w:val="26"/>
-                <w:szCs w:val="26"/>
-              </w:rPr>
-              <w:t>RRJ</w:t>
-            </w:r>
           </w:p>
         </w:tc>
         <w:tc>
@@ -4400,14 +4390,8 @@
                 <w:szCs w:val="26"/>
               </w:rPr>
             </w:pPr>
-            <w:r>
-              <w:rPr>
-                <w:rFonts w:ascii="Calibri" w:eastAsia="Calibri" w:hAnsi="Calibri" w:cs="Calibri"/>
-                <w:sz w:val="26"/>
-                <w:szCs w:val="26"/>
-              </w:rPr>
-              <w:t>HLV</w:t>
-            </w:r>
+            <w:bookmarkStart w:id="0" w:name="_GoBack"/>
+            <w:bookmarkEnd w:id="0"/>
           </w:p>
         </w:tc>
         <w:tc>
@@ -4634,14 +4618,6 @@
                 <w:szCs w:val="26"/>
               </w:rPr>
             </w:pPr>
-            <w:r>
-              <w:rPr>
-                <w:rFonts w:ascii="Calibri" w:eastAsia="Calibri" w:hAnsi="Calibri" w:cs="Calibri"/>
-                <w:sz w:val="26"/>
-                <w:szCs w:val="26"/>
-              </w:rPr>
-              <w:t>HLW</w:t>
-            </w:r>
           </w:p>
         </w:tc>
         <w:tc>
@@ -4876,14 +4852,6 @@
                 <w:szCs w:val="26"/>
               </w:rPr>
             </w:pPr>
-            <w:r>
-              <w:rPr>
-                <w:rFonts w:ascii="Calibri" w:eastAsia="Calibri" w:hAnsi="Calibri" w:cs="Calibri"/>
-                <w:sz w:val="26"/>
-                <w:szCs w:val="26"/>
-              </w:rPr>
-              <w:t>HLV</w:t>
-            </w:r>
           </w:p>
         </w:tc>
         <w:tc>
@@ -5118,14 +5086,6 @@
                 <w:szCs w:val="26"/>
               </w:rPr>
             </w:pPr>
-            <w:r>
-              <w:rPr>
-                <w:rFonts w:ascii="Calibri" w:eastAsia="Calibri" w:hAnsi="Calibri" w:cs="Calibri"/>
-                <w:sz w:val="26"/>
-                <w:szCs w:val="26"/>
-              </w:rPr>
-              <w:t>HLV</w:t>
-            </w:r>
           </w:p>
         </w:tc>
         <w:tc>
@@ -8280,7 +8240,7 @@
         <v:rect id="_x0000_i1025" style="width:56.25pt;height:38.7pt" o:ole="" o:preferrelative="t" stroked="f">
           <v:imagedata r:id="rId1" o:title=""/>
         </v:rect>
-        <o:OLEObject Type="Embed" ProgID="StaticMetafile" ShapeID="_x0000_i1025" DrawAspect="Content" ObjectID="_1851946592" r:id="rId2"/>
+        <o:OLEObject Type="Embed" ProgID="StaticMetafile" ShapeID="_x0000_i1025" DrawAspect="Content" ObjectID="_1851948606" r:id="rId2"/>
       </w:object>
     </w:r>
     <w:r>

</xml_diff>

<commit_message>
Sync - 2026-09-27 16:59
</commit_message>
<xml_diff>
--- a/files/Daily_Helicopter_Schedule.docx
+++ b/files/Daily_Helicopter_Schedule.docx
@@ -639,7 +639,7 @@
                 <w:sz w:val="26"/>
                 <w:szCs w:val="26"/>
               </w:rPr>
-              <w:t>GVHL 412</w:t>
+              <w:t>HELIGO 145</w:t>
             </w:r>
           </w:p>
         </w:tc>
@@ -674,7 +674,7 @@
                 <w:sz w:val="26"/>
                 <w:szCs w:val="26"/>
               </w:rPr>
-              <w:t>GVT</w:t>
+              <w:t>HLW</w:t>
             </w:r>
           </w:p>
         </w:tc>
@@ -703,14 +703,6 @@
                 <w:szCs w:val="26"/>
               </w:rPr>
             </w:pPr>
-            <w:r>
-              <w:rPr>
-                <w:rFonts w:ascii="Calibri" w:eastAsia="Calibri" w:hAnsi="Calibri" w:cs="Calibri"/>
-                <w:sz w:val="26"/>
-                <w:szCs w:val="26"/>
-              </w:rPr>
-              <w:t>08</w:t>
-            </w:r>
           </w:p>
         </w:tc>
       </w:tr>
@@ -1106,46 +1098,6 @@
               </w:rPr>
               <w:t xml:space="preserve">SF (D) </w:t>
             </w:r>
-            <w:r>
-              <w:rPr>
-                <w:rFonts w:ascii="Calibri" w:eastAsia="Calibri" w:hAnsi="Calibri" w:cs="Calibri"/>
-                <w:sz w:val="26"/>
-                <w:szCs w:val="26"/>
-              </w:rPr>
-              <w:t>+NF</w:t>
-            </w:r>
-            <w:r>
-              <w:rPr>
-                <w:rFonts w:ascii="Calibri" w:eastAsia="Calibri" w:hAnsi="Calibri" w:cs="Calibri"/>
-                <w:sz w:val="26"/>
-                <w:szCs w:val="26"/>
-              </w:rPr>
-              <w:t xml:space="preserve"> </w:t>
-            </w:r>
-            <w:r>
-              <w:rPr>
-                <w:rFonts w:ascii="Calibri" w:eastAsia="Calibri" w:hAnsi="Calibri" w:cs="Calibri"/>
-                <w:sz w:val="26"/>
-                <w:szCs w:val="26"/>
-              </w:rPr>
-              <w:t>(</w:t>
-            </w:r>
-            <w:r>
-              <w:rPr>
-                <w:rFonts w:ascii="Calibri" w:eastAsia="Calibri" w:hAnsi="Calibri" w:cs="Calibri"/>
-                <w:sz w:val="26"/>
-                <w:szCs w:val="26"/>
-              </w:rPr>
-              <w:t>D</w:t>
-            </w:r>
-            <w:r>
-              <w:rPr>
-                <w:rFonts w:ascii="Calibri" w:eastAsia="Calibri" w:hAnsi="Calibri" w:cs="Calibri"/>
-                <w:sz w:val="26"/>
-                <w:szCs w:val="26"/>
-              </w:rPr>
-              <w:t>)</w:t>
-            </w:r>
           </w:p>
         </w:tc>
         <w:tc>
@@ -1258,6 +1210,256 @@
                 <w:szCs w:val="26"/>
               </w:rPr>
               <w:t>05</w:t>
+            </w:r>
+          </w:p>
+        </w:tc>
+      </w:tr>
+      <w:tr>
+        <w:trPr>
+          <w:trHeight w:val="337"/>
+        </w:trPr>
+        <w:tc>
+          <w:tcPr>
+            <w:tcW w:w="729" w:type="dxa"/>
+            <w:tcBorders>
+              <w:top w:val="single" w:sz="4" w:space="0" w:color="000000"/>
+              <w:left w:val="single" w:sz="4" w:space="0" w:color="000000"/>
+              <w:bottom w:val="single" w:sz="4" w:space="0" w:color="000000"/>
+              <w:right w:val="single" w:sz="4" w:space="0" w:color="000000"/>
+            </w:tcBorders>
+            <w:shd w:val="clear" w:color="auto" w:fill="auto"/>
+            <w:tcMar>
+              <w:left w:w="108" w:type="dxa"/>
+              <w:right w:w="108" w:type="dxa"/>
+            </w:tcMar>
+          </w:tcPr>
+          <w:p>
+            <w:pPr>
+              <w:spacing w:after="0" w:line="240" w:lineRule="auto"/>
+              <w:jc w:val="center"/>
+              <w:rPr>
+                <w:rFonts w:ascii="Calibri" w:eastAsia="Calibri" w:hAnsi="Calibri" w:cs="Calibri"/>
+                <w:sz w:val="26"/>
+                <w:szCs w:val="26"/>
+              </w:rPr>
+            </w:pPr>
+            <w:r>
+              <w:rPr>
+                <w:rFonts w:ascii="Calibri" w:eastAsia="Calibri" w:hAnsi="Calibri" w:cs="Calibri"/>
+                <w:sz w:val="26"/>
+                <w:szCs w:val="26"/>
+              </w:rPr>
+              <w:t>4</w:t>
+            </w:r>
+          </w:p>
+        </w:tc>
+        <w:tc>
+          <w:tcPr>
+            <w:tcW w:w="1606" w:type="dxa"/>
+            <w:tcBorders>
+              <w:top w:val="single" w:sz="4" w:space="0" w:color="000000"/>
+              <w:left w:val="single" w:sz="4" w:space="0" w:color="000000"/>
+              <w:bottom w:val="single" w:sz="4" w:space="0" w:color="000000"/>
+              <w:right w:val="single" w:sz="4" w:space="0" w:color="000000"/>
+            </w:tcBorders>
+            <w:shd w:val="clear" w:color="auto" w:fill="auto"/>
+            <w:tcMar>
+              <w:left w:w="108" w:type="dxa"/>
+              <w:right w:w="108" w:type="dxa"/>
+            </w:tcMar>
+          </w:tcPr>
+          <w:p>
+            <w:pPr>
+              <w:spacing w:after="0" w:line="240" w:lineRule="auto"/>
+              <w:jc w:val="center"/>
+              <w:rPr>
+                <w:rFonts w:ascii="Calibri" w:eastAsia="Calibri" w:hAnsi="Calibri" w:cs="Calibri"/>
+                <w:sz w:val="26"/>
+                <w:szCs w:val="26"/>
+              </w:rPr>
+            </w:pPr>
+            <w:r>
+              <w:rPr>
+                <w:rFonts w:ascii="Calibri" w:eastAsia="Calibri" w:hAnsi="Calibri" w:cs="Calibri"/>
+                <w:sz w:val="26"/>
+                <w:szCs w:val="26"/>
+              </w:rPr>
+              <w:t>06:30</w:t>
+            </w:r>
+          </w:p>
+        </w:tc>
+        <w:tc>
+          <w:tcPr>
+            <w:tcW w:w="1460" w:type="dxa"/>
+            <w:tcBorders>
+              <w:top w:val="single" w:sz="4" w:space="0" w:color="000000"/>
+              <w:left w:val="single" w:sz="4" w:space="0" w:color="000000"/>
+              <w:bottom w:val="single" w:sz="4" w:space="0" w:color="000000"/>
+              <w:right w:val="single" w:sz="4" w:space="0" w:color="000000"/>
+            </w:tcBorders>
+            <w:shd w:val="clear" w:color="auto" w:fill="auto"/>
+            <w:tcMar>
+              <w:left w:w="108" w:type="dxa"/>
+              <w:right w:w="108" w:type="dxa"/>
+            </w:tcMar>
+          </w:tcPr>
+          <w:p>
+            <w:pPr>
+              <w:spacing w:after="0" w:line="240" w:lineRule="auto"/>
+              <w:jc w:val="center"/>
+              <w:rPr>
+                <w:rFonts w:ascii="Calibri" w:eastAsia="Calibri" w:hAnsi="Calibri" w:cs="Calibri"/>
+                <w:sz w:val="26"/>
+                <w:szCs w:val="26"/>
+              </w:rPr>
+            </w:pPr>
+            <w:r>
+              <w:rPr>
+                <w:rFonts w:ascii="Calibri" w:eastAsia="Calibri" w:hAnsi="Calibri" w:cs="Calibri"/>
+                <w:sz w:val="26"/>
+                <w:szCs w:val="26"/>
+              </w:rPr>
+              <w:t>08:15</w:t>
+            </w:r>
+          </w:p>
+        </w:tc>
+        <w:tc>
+          <w:tcPr>
+            <w:tcW w:w="2523" w:type="dxa"/>
+            <w:tcBorders>
+              <w:top w:val="single" w:sz="4" w:space="0" w:color="000000"/>
+              <w:left w:val="single" w:sz="4" w:space="0" w:color="000000"/>
+              <w:bottom w:val="single" w:sz="4" w:space="0" w:color="000000"/>
+              <w:right w:val="single" w:sz="4" w:space="0" w:color="000000"/>
+            </w:tcBorders>
+            <w:shd w:val="clear" w:color="auto" w:fill="auto"/>
+            <w:tcMar>
+              <w:left w:w="108" w:type="dxa"/>
+              <w:right w:w="108" w:type="dxa"/>
+            </w:tcMar>
+          </w:tcPr>
+          <w:p>
+            <w:pPr>
+              <w:spacing w:after="0" w:line="240" w:lineRule="auto"/>
+              <w:jc w:val="center"/>
+              <w:rPr>
+                <w:rFonts w:ascii="Calibri" w:eastAsia="Calibri" w:hAnsi="Calibri" w:cs="Calibri"/>
+                <w:sz w:val="26"/>
+                <w:szCs w:val="26"/>
+              </w:rPr>
+            </w:pPr>
+            <w:r>
+              <w:rPr>
+                <w:rFonts w:ascii="Calibri" w:eastAsia="Calibri" w:hAnsi="Calibri" w:cs="Calibri"/>
+                <w:sz w:val="26"/>
+                <w:szCs w:val="26"/>
+              </w:rPr>
+              <w:t>NF (D)</w:t>
+            </w:r>
+          </w:p>
+        </w:tc>
+        <w:tc>
+          <w:tcPr>
+            <w:tcW w:w="1554" w:type="dxa"/>
+            <w:tcBorders>
+              <w:top w:val="single" w:sz="4" w:space="0" w:color="000000"/>
+              <w:left w:val="single" w:sz="4" w:space="0" w:color="000000"/>
+              <w:bottom w:val="single" w:sz="4" w:space="0" w:color="000000"/>
+              <w:right w:val="single" w:sz="4" w:space="0" w:color="000000"/>
+            </w:tcBorders>
+            <w:shd w:val="clear" w:color="auto" w:fill="auto"/>
+            <w:tcMar>
+              <w:left w:w="108" w:type="dxa"/>
+              <w:right w:w="108" w:type="dxa"/>
+            </w:tcMar>
+          </w:tcPr>
+          <w:p>
+            <w:pPr>
+              <w:spacing w:after="0" w:line="240" w:lineRule="auto"/>
+              <w:jc w:val="center"/>
+              <w:rPr>
+                <w:rFonts w:ascii="Calibri" w:eastAsia="Calibri" w:hAnsi="Calibri" w:cs="Calibri"/>
+                <w:sz w:val="26"/>
+                <w:szCs w:val="26"/>
+              </w:rPr>
+            </w:pPr>
+            <w:r>
+              <w:rPr>
+                <w:rFonts w:ascii="Calibri" w:eastAsia="Calibri" w:hAnsi="Calibri" w:cs="Calibri"/>
+                <w:sz w:val="26"/>
+                <w:szCs w:val="26"/>
+              </w:rPr>
+              <w:t>GVHL 412</w:t>
+            </w:r>
+          </w:p>
+        </w:tc>
+        <w:tc>
+          <w:tcPr>
+            <w:tcW w:w="1302" w:type="dxa"/>
+            <w:tcBorders>
+              <w:top w:val="single" w:sz="4" w:space="0" w:color="000000"/>
+              <w:left w:val="single" w:sz="4" w:space="0" w:color="000000"/>
+              <w:bottom w:val="single" w:sz="4" w:space="0" w:color="000000"/>
+              <w:right w:val="single" w:sz="4" w:space="0" w:color="000000"/>
+            </w:tcBorders>
+            <w:shd w:val="clear" w:color="auto" w:fill="auto"/>
+            <w:tcMar>
+              <w:left w:w="108" w:type="dxa"/>
+              <w:right w:w="108" w:type="dxa"/>
+            </w:tcMar>
+          </w:tcPr>
+          <w:p>
+            <w:pPr>
+              <w:spacing w:after="0" w:line="240" w:lineRule="auto"/>
+              <w:jc w:val="center"/>
+              <w:rPr>
+                <w:rFonts w:ascii="Calibri" w:eastAsia="Calibri" w:hAnsi="Calibri" w:cs="Calibri"/>
+                <w:sz w:val="26"/>
+                <w:szCs w:val="26"/>
+              </w:rPr>
+            </w:pPr>
+            <w:r>
+              <w:rPr>
+                <w:rFonts w:ascii="Calibri" w:eastAsia="Calibri" w:hAnsi="Calibri" w:cs="Calibri"/>
+                <w:sz w:val="26"/>
+                <w:szCs w:val="26"/>
+              </w:rPr>
+              <w:t>RRJ</w:t>
+            </w:r>
+          </w:p>
+        </w:tc>
+        <w:tc>
+          <w:tcPr>
+            <w:tcW w:w="1314" w:type="dxa"/>
+            <w:tcBorders>
+              <w:top w:val="single" w:sz="4" w:space="0" w:color="000000"/>
+              <w:left w:val="single" w:sz="4" w:space="0" w:color="000000"/>
+              <w:bottom w:val="single" w:sz="4" w:space="0" w:color="000000"/>
+              <w:right w:val="single" w:sz="4" w:space="0" w:color="000000"/>
+            </w:tcBorders>
+            <w:shd w:val="clear" w:color="000000" w:fill="FFFFFF"/>
+            <w:tcMar>
+              <w:left w:w="108" w:type="dxa"/>
+              <w:right w:w="108" w:type="dxa"/>
+            </w:tcMar>
+          </w:tcPr>
+          <w:p>
+            <w:pPr>
+              <w:spacing w:after="0" w:line="240" w:lineRule="auto"/>
+              <w:jc w:val="center"/>
+              <w:rPr>
+                <w:rFonts w:ascii="Calibri" w:eastAsia="Calibri" w:hAnsi="Calibri" w:cs="Calibri"/>
+                <w:sz w:val="26"/>
+                <w:szCs w:val="26"/>
+              </w:rPr>
+            </w:pPr>
+            <w:r>
+              <w:rPr>
+                <w:rFonts w:ascii="Calibri" w:eastAsia="Calibri" w:hAnsi="Calibri" w:cs="Calibri"/>
+                <w:sz w:val="26"/>
+                <w:szCs w:val="26"/>
+              </w:rPr>
+              <w:t>06</w:t>
             </w:r>
           </w:p>
         </w:tc>
@@ -1499,7 +1701,7 @@
                 <w:sz w:val="26"/>
                 <w:szCs w:val="26"/>
               </w:rPr>
-              <w:t>GVHL 412</w:t>
+              <w:t>NA</w:t>
             </w:r>
           </w:p>
         </w:tc>
@@ -1534,7 +1736,7 @@
                 <w:sz w:val="26"/>
                 <w:szCs w:val="26"/>
               </w:rPr>
-              <w:t>RRJ</w:t>
+              <w:t>NA</w:t>
             </w:r>
           </w:p>
         </w:tc>
@@ -1569,7 +1771,7 @@
                 <w:sz w:val="26"/>
                 <w:szCs w:val="26"/>
               </w:rPr>
-              <w:t>07</w:t>
+              <w:t>00</w:t>
             </w:r>
           </w:p>
         </w:tc>
@@ -2867,7 +3069,7 @@
                 <w:sz w:val="26"/>
                 <w:szCs w:val="26"/>
               </w:rPr>
-              <w:t>NA</w:t>
+              <w:t xml:space="preserve"> TBD</w:t>
             </w:r>
           </w:p>
         </w:tc>
@@ -2924,6 +3126,14 @@
                 <w:szCs w:val="26"/>
               </w:rPr>
             </w:pPr>
+            <w:r>
+              <w:rPr>
+                <w:rFonts w:ascii="Calibri" w:eastAsia="Calibri" w:hAnsi="Calibri" w:cs="Calibri"/>
+                <w:sz w:val="26"/>
+                <w:szCs w:val="26"/>
+              </w:rPr>
+              <w:t>RRI</w:t>
+            </w:r>
           </w:p>
         </w:tc>
         <w:tc>
@@ -3106,7 +3316,7 @@
                 <w:sz w:val="26"/>
                 <w:szCs w:val="26"/>
               </w:rPr>
-              <w:t xml:space="preserve"> VIR-1</w:t>
+              <w:t xml:space="preserve">  NA</w:t>
             </w:r>
           </w:p>
         </w:tc>
@@ -3302,15 +3512,7 @@
                 <w:sz w:val="26"/>
                 <w:szCs w:val="26"/>
               </w:rPr>
-              <w:t>11:0</w:t>
-            </w:r>
-            <w:r>
-              <w:rPr>
-                <w:rFonts w:ascii="Calibri" w:eastAsia="Calibri" w:hAnsi="Calibri" w:cs="Calibri"/>
-                <w:sz w:val="26"/>
-                <w:szCs w:val="26"/>
-              </w:rPr>
-              <w:t>0</w:t>
+              <w:t>11:00</w:t>
             </w:r>
           </w:p>
         </w:tc>
@@ -3567,48 +3769,48 @@
               <w:jc w:val="center"/>
               <w:rPr>
                 <w:rFonts w:ascii="Calibri" w:eastAsia="Calibri" w:hAnsi="Calibri" w:cs="Calibri"/>
+                <w:sz w:val="26"/>
+                <w:szCs w:val="26"/>
+              </w:rPr>
+            </w:pPr>
+            <w:r>
+              <w:rPr>
+                <w:rFonts w:ascii="Calibri" w:eastAsia="Calibri" w:hAnsi="Calibri" w:cs="Calibri"/>
+                <w:sz w:val="26"/>
+                <w:szCs w:val="26"/>
+              </w:rPr>
+              <w:t>BLQ[PM]</w:t>
+            </w:r>
+            <w:bookmarkStart w:id="0" w:name="_GoBack"/>
+            <w:bookmarkEnd w:id="0"/>
+          </w:p>
+        </w:tc>
+        <w:tc>
+          <w:tcPr>
+            <w:tcW w:w="1554" w:type="dxa"/>
+            <w:tcBorders>
+              <w:top w:val="single" w:sz="4" w:space="0" w:color="000000"/>
+              <w:left w:val="single" w:sz="4" w:space="0" w:color="000000"/>
+              <w:bottom w:val="single" w:sz="4" w:space="0" w:color="000000"/>
+              <w:right w:val="single" w:sz="4" w:space="0" w:color="000000"/>
+            </w:tcBorders>
+            <w:shd w:val="clear" w:color="000000" w:fill="FFFFFF"/>
+            <w:tcMar>
+              <w:left w:w="108" w:type="dxa"/>
+              <w:right w:w="108" w:type="dxa"/>
+            </w:tcMar>
+          </w:tcPr>
+          <w:p>
+            <w:pPr>
+              <w:spacing w:after="0" w:line="240" w:lineRule="auto"/>
+              <w:jc w:val="center"/>
+              <w:rPr>
+                <w:rFonts w:ascii="Calibri" w:eastAsia="Calibri" w:hAnsi="Calibri" w:cs="Calibri"/>
                 <w:b/>
                 <w:sz w:val="26"/>
                 <w:szCs w:val="26"/>
               </w:rPr>
             </w:pPr>
-            <w:r>
-              <w:rPr>
-                <w:rFonts w:ascii="Calibri" w:eastAsia="Calibri" w:hAnsi="Calibri" w:cs="Calibri"/>
-                <w:b/>
-                <w:sz w:val="26"/>
-                <w:szCs w:val="26"/>
-              </w:rPr>
-              <w:t>NA</w:t>
-            </w:r>
-          </w:p>
-        </w:tc>
-        <w:tc>
-          <w:tcPr>
-            <w:tcW w:w="1554" w:type="dxa"/>
-            <w:tcBorders>
-              <w:top w:val="single" w:sz="4" w:space="0" w:color="000000"/>
-              <w:left w:val="single" w:sz="4" w:space="0" w:color="000000"/>
-              <w:bottom w:val="single" w:sz="4" w:space="0" w:color="000000"/>
-              <w:right w:val="single" w:sz="4" w:space="0" w:color="000000"/>
-            </w:tcBorders>
-            <w:shd w:val="clear" w:color="000000" w:fill="FFFFFF"/>
-            <w:tcMar>
-              <w:left w:w="108" w:type="dxa"/>
-              <w:right w:w="108" w:type="dxa"/>
-            </w:tcMar>
-          </w:tcPr>
-          <w:p>
-            <w:pPr>
-              <w:spacing w:after="0" w:line="240" w:lineRule="auto"/>
-              <w:jc w:val="center"/>
-              <w:rPr>
-                <w:rFonts w:ascii="Calibri" w:eastAsia="Calibri" w:hAnsi="Calibri" w:cs="Calibri"/>
-                <w:b/>
-                <w:sz w:val="26"/>
-                <w:szCs w:val="26"/>
-              </w:rPr>
-            </w:pPr>
           </w:p>
         </w:tc>
         <w:tc>
@@ -3632,11 +3834,18 @@
               <w:jc w:val="center"/>
               <w:rPr>
                 <w:rFonts w:ascii="Calibri" w:eastAsia="Calibri" w:hAnsi="Calibri" w:cs="Calibri"/>
-                <w:b/>
-                <w:sz w:val="26"/>
-                <w:szCs w:val="26"/>
-              </w:rPr>
-            </w:pPr>
+                <w:sz w:val="26"/>
+                <w:szCs w:val="26"/>
+              </w:rPr>
+            </w:pPr>
+            <w:r>
+              <w:rPr>
+                <w:rFonts w:ascii="Calibri" w:eastAsia="Calibri" w:hAnsi="Calibri" w:cs="Calibri"/>
+                <w:sz w:val="26"/>
+                <w:szCs w:val="26"/>
+              </w:rPr>
+              <w:t>GVT</w:t>
+            </w:r>
           </w:p>
         </w:tc>
         <w:tc>
@@ -4096,15 +4305,13 @@
               <w:jc w:val="center"/>
               <w:rPr>
                 <w:rFonts w:ascii="Calibri" w:eastAsia="Calibri" w:hAnsi="Calibri" w:cs="Calibri"/>
-                <w:b/>
-                <w:sz w:val="26"/>
-                <w:szCs w:val="26"/>
-              </w:rPr>
-            </w:pPr>
-            <w:r>
-              <w:rPr>
-                <w:rFonts w:ascii="Calibri" w:eastAsia="Calibri" w:hAnsi="Calibri" w:cs="Calibri"/>
-                <w:b/>
+                <w:sz w:val="26"/>
+                <w:szCs w:val="26"/>
+              </w:rPr>
+            </w:pPr>
+            <w:r>
+              <w:rPr>
+                <w:rFonts w:ascii="Calibri" w:eastAsia="Calibri" w:hAnsi="Calibri" w:cs="Calibri"/>
                 <w:sz w:val="26"/>
                 <w:szCs w:val="26"/>
               </w:rPr>
@@ -4137,6 +4344,14 @@
                 <w:szCs w:val="26"/>
               </w:rPr>
             </w:pPr>
+            <w:r>
+              <w:rPr>
+                <w:rFonts w:ascii="Calibri" w:eastAsia="Calibri" w:hAnsi="Calibri" w:cs="Calibri"/>
+                <w:sz w:val="26"/>
+                <w:szCs w:val="26"/>
+              </w:rPr>
+              <w:t>NA</w:t>
+            </w:r>
           </w:p>
         </w:tc>
         <w:tc>
@@ -4164,6 +4379,14 @@
                 <w:szCs w:val="26"/>
               </w:rPr>
             </w:pPr>
+            <w:r>
+              <w:rPr>
+                <w:rFonts w:ascii="Calibri" w:eastAsia="Calibri" w:hAnsi="Calibri" w:cs="Calibri"/>
+                <w:sz w:val="26"/>
+                <w:szCs w:val="26"/>
+              </w:rPr>
+              <w:t>NA</w:t>
+            </w:r>
           </w:p>
         </w:tc>
         <w:tc>
@@ -4334,7 +4557,7 @@
                 <w:sz w:val="26"/>
                 <w:szCs w:val="26"/>
               </w:rPr>
-              <w:t>VKDN1</w:t>
+              <w:t>SHAKTI</w:t>
             </w:r>
           </w:p>
         </w:tc>
@@ -4390,8 +4613,14 @@
                 <w:szCs w:val="26"/>
               </w:rPr>
             </w:pPr>
-            <w:bookmarkStart w:id="0" w:name="_GoBack"/>
-            <w:bookmarkEnd w:id="0"/>
+            <w:r>
+              <w:rPr>
+                <w:rFonts w:ascii="Calibri" w:eastAsia="Calibri" w:hAnsi="Calibri" w:cs="Calibri"/>
+                <w:sz w:val="26"/>
+                <w:szCs w:val="26"/>
+              </w:rPr>
+              <w:t>HLV</w:t>
+            </w:r>
           </w:p>
         </w:tc>
         <w:tc>
@@ -4552,17 +4781,19 @@
               <w:jc w:val="center"/>
               <w:rPr>
                 <w:rFonts w:ascii="Calibri" w:eastAsia="Calibri" w:hAnsi="Calibri" w:cs="Calibri"/>
-                <w:sz w:val="26"/>
-                <w:szCs w:val="26"/>
-              </w:rPr>
-            </w:pPr>
-            <w:r>
-              <w:rPr>
-                <w:rFonts w:ascii="Calibri" w:eastAsia="Calibri" w:hAnsi="Calibri" w:cs="Calibri"/>
-                <w:sz w:val="26"/>
-                <w:szCs w:val="26"/>
-              </w:rPr>
-              <w:t>UDAY[L/O]</w:t>
+                <w:b/>
+                <w:sz w:val="26"/>
+                <w:szCs w:val="26"/>
+              </w:rPr>
+            </w:pPr>
+            <w:r>
+              <w:rPr>
+                <w:rFonts w:ascii="Calibri" w:eastAsia="Calibri" w:hAnsi="Calibri" w:cs="Calibri"/>
+                <w:b/>
+                <w:sz w:val="26"/>
+                <w:szCs w:val="26"/>
+              </w:rPr>
+              <w:t>NA</w:t>
             </w:r>
           </w:p>
         </w:tc>
@@ -4587,10 +4818,20 @@
               <w:jc w:val="center"/>
               <w:rPr>
                 <w:rFonts w:ascii="Calibri" w:eastAsia="Calibri" w:hAnsi="Calibri" w:cs="Calibri"/>
-                <w:sz w:val="26"/>
-                <w:szCs w:val="26"/>
-              </w:rPr>
-            </w:pPr>
+                <w:b/>
+                <w:sz w:val="26"/>
+                <w:szCs w:val="26"/>
+              </w:rPr>
+            </w:pPr>
+            <w:r>
+              <w:rPr>
+                <w:rFonts w:ascii="Calibri" w:eastAsia="Calibri" w:hAnsi="Calibri" w:cs="Calibri"/>
+                <w:b/>
+                <w:sz w:val="26"/>
+                <w:szCs w:val="26"/>
+              </w:rPr>
+              <w:t>NA</w:t>
+            </w:r>
           </w:p>
         </w:tc>
         <w:tc>
@@ -4614,10 +4855,20 @@
               <w:jc w:val="center"/>
               <w:rPr>
                 <w:rFonts w:ascii="Calibri" w:eastAsia="Calibri" w:hAnsi="Calibri" w:cs="Calibri"/>
-                <w:sz w:val="26"/>
-                <w:szCs w:val="26"/>
-              </w:rPr>
-            </w:pPr>
+                <w:b/>
+                <w:sz w:val="26"/>
+                <w:szCs w:val="26"/>
+              </w:rPr>
+            </w:pPr>
+            <w:r>
+              <w:rPr>
+                <w:rFonts w:ascii="Calibri" w:eastAsia="Calibri" w:hAnsi="Calibri" w:cs="Calibri"/>
+                <w:b/>
+                <w:sz w:val="26"/>
+                <w:szCs w:val="26"/>
+              </w:rPr>
+              <w:t>NA</w:t>
+            </w:r>
           </w:p>
         </w:tc>
         <w:tc>
@@ -4793,10 +5044,10 @@
             <w:r>
               <w:rPr>
                 <w:rFonts w:ascii="Calibri" w:eastAsia="Calibri" w:hAnsi="Calibri" w:cs="Calibri"/>
-                <w:sz w:val="26"/>
-                <w:szCs w:val="26"/>
-              </w:rPr>
-              <w:t>J EXPLR</w:t>
+                <w:sz w:val="28"/>
+                <w:szCs w:val="28"/>
+              </w:rPr>
+              <w:t>ARMADA2</w:t>
             </w:r>
           </w:p>
         </w:tc>
@@ -4852,6 +5103,14 @@
                 <w:szCs w:val="26"/>
               </w:rPr>
             </w:pPr>
+            <w:r>
+              <w:rPr>
+                <w:rFonts w:ascii="Calibri" w:eastAsia="Calibri" w:hAnsi="Calibri" w:cs="Calibri"/>
+                <w:sz w:val="26"/>
+                <w:szCs w:val="26"/>
+              </w:rPr>
+              <w:t>HLV</w:t>
+            </w:r>
           </w:p>
         </w:tc>
         <w:tc>
@@ -4987,15 +5246,7 @@
                 <w:sz w:val="26"/>
                 <w:szCs w:val="26"/>
               </w:rPr>
-              <w:t>13</w:t>
-            </w:r>
-            <w:r>
-              <w:rPr>
-                <w:rFonts w:ascii="Calibri" w:eastAsia="Calibri" w:hAnsi="Calibri" w:cs="Calibri"/>
-                <w:sz w:val="26"/>
-                <w:szCs w:val="26"/>
-              </w:rPr>
-              <w:t>:15</w:t>
+              <w:t>13:15</w:t>
             </w:r>
           </w:p>
         </w:tc>
@@ -5020,17 +5271,19 @@
               <w:jc w:val="center"/>
               <w:rPr>
                 <w:rFonts w:ascii="Calibri" w:eastAsia="Calibri" w:hAnsi="Calibri" w:cs="Calibri"/>
-                <w:sz w:val="26"/>
-                <w:szCs w:val="26"/>
-              </w:rPr>
-            </w:pPr>
-            <w:r>
-              <w:rPr>
-                <w:rFonts w:ascii="Calibri" w:eastAsia="Calibri" w:hAnsi="Calibri" w:cs="Calibri"/>
-                <w:sz w:val="26"/>
-                <w:szCs w:val="26"/>
-              </w:rPr>
-              <w:t>ABAN8</w:t>
+                <w:b/>
+                <w:sz w:val="26"/>
+                <w:szCs w:val="26"/>
+              </w:rPr>
+            </w:pPr>
+            <w:r>
+              <w:rPr>
+                <w:rFonts w:ascii="Calibri" w:eastAsia="Calibri" w:hAnsi="Calibri" w:cs="Calibri"/>
+                <w:b/>
+                <w:sz w:val="26"/>
+                <w:szCs w:val="26"/>
+              </w:rPr>
+              <w:t>NA</w:t>
             </w:r>
           </w:p>
         </w:tc>
@@ -5055,6 +5308,7 @@
               <w:jc w:val="center"/>
               <w:rPr>
                 <w:rFonts w:ascii="Calibri" w:eastAsia="Calibri" w:hAnsi="Calibri" w:cs="Calibri"/>
+                <w:b/>
                 <w:sz w:val="26"/>
                 <w:szCs w:val="26"/>
               </w:rPr>
@@ -5082,10 +5336,20 @@
               <w:jc w:val="center"/>
               <w:rPr>
                 <w:rFonts w:ascii="Calibri" w:eastAsia="Calibri" w:hAnsi="Calibri" w:cs="Calibri"/>
-                <w:sz w:val="26"/>
-                <w:szCs w:val="26"/>
-              </w:rPr>
-            </w:pPr>
+                <w:b/>
+                <w:sz w:val="26"/>
+                <w:szCs w:val="26"/>
+              </w:rPr>
+            </w:pPr>
+            <w:r>
+              <w:rPr>
+                <w:rFonts w:ascii="Calibri" w:eastAsia="Calibri" w:hAnsi="Calibri" w:cs="Calibri"/>
+                <w:b/>
+                <w:sz w:val="26"/>
+                <w:szCs w:val="26"/>
+              </w:rPr>
+              <w:t>NA</w:t>
+            </w:r>
           </w:p>
         </w:tc>
         <w:tc>
@@ -5312,7 +5576,7 @@
                 <w:sz w:val="26"/>
                 <w:szCs w:val="26"/>
               </w:rPr>
-              <w:t>TRI-2</w:t>
+              <w:t>BLQ1</w:t>
             </w:r>
           </w:p>
         </w:tc>
@@ -5539,7 +5803,7 @@
                 <w:sz w:val="26"/>
                 <w:szCs w:val="26"/>
               </w:rPr>
-              <w:t>DISC1</w:t>
+              <w:t>RATNA</w:t>
             </w:r>
           </w:p>
         </w:tc>
@@ -5766,7 +6030,7 @@
                 <w:sz w:val="26"/>
                 <w:szCs w:val="26"/>
               </w:rPr>
-              <w:t>VKDN2</w:t>
+              <w:t>SLQ</w:t>
             </w:r>
           </w:p>
         </w:tc>
@@ -5993,7 +6257,7 @@
                 <w:sz w:val="26"/>
                 <w:szCs w:val="26"/>
               </w:rPr>
-              <w:t>ARMADA2</w:t>
+              <w:t>UDAY</w:t>
             </w:r>
           </w:p>
         </w:tc>
@@ -6227,7 +6491,7 @@
                 <w:sz w:val="26"/>
                 <w:szCs w:val="26"/>
               </w:rPr>
-              <w:t>KSPR</w:t>
+              <w:t>NQO</w:t>
             </w:r>
           </w:p>
         </w:tc>
@@ -6453,7 +6717,7 @@
                 <w:sz w:val="26"/>
                 <w:szCs w:val="26"/>
               </w:rPr>
-              <w:t>VIR-1</w:t>
+              <w:t>WIN/MNW</w:t>
             </w:r>
           </w:p>
         </w:tc>
@@ -7266,7 +7530,7 @@
                 <w:sz w:val="26"/>
                 <w:szCs w:val="26"/>
               </w:rPr>
-              <w:t>BLQ[D]</w:t>
+              <w:t>J STAR</w:t>
             </w:r>
           </w:p>
         </w:tc>
@@ -7327,7 +7591,7 @@
                 <w:sz w:val="26"/>
                 <w:szCs w:val="26"/>
               </w:rPr>
-              <w:t>GVT</w:t>
+              <w:t>GVX</w:t>
             </w:r>
           </w:p>
         </w:tc>
@@ -7490,6 +7754,14 @@
                 <w:szCs w:val="26"/>
               </w:rPr>
             </w:pPr>
+            <w:r>
+              <w:rPr>
+                <w:rFonts w:ascii="Calibri" w:eastAsia="Calibri" w:hAnsi="Calibri" w:cs="Calibri"/>
+                <w:sz w:val="26"/>
+                <w:szCs w:val="26"/>
+              </w:rPr>
+              <w:t>TAPTI</w:t>
+            </w:r>
           </w:p>
         </w:tc>
         <w:tc>
@@ -7550,7 +7822,7 @@
                 <w:sz w:val="26"/>
                 <w:szCs w:val="26"/>
               </w:rPr>
-              <w:t>GVT</w:t>
+              <w:t>GVX</w:t>
             </w:r>
           </w:p>
         </w:tc>
@@ -7713,6 +7985,14 @@
                 <w:szCs w:val="26"/>
               </w:rPr>
             </w:pPr>
+            <w:r>
+              <w:rPr>
+                <w:rFonts w:ascii="Calibri" w:eastAsia="Calibri" w:hAnsi="Calibri" w:cs="Calibri"/>
+                <w:sz w:val="26"/>
+                <w:szCs w:val="26"/>
+              </w:rPr>
+              <w:t>L/O</w:t>
+            </w:r>
           </w:p>
         </w:tc>
         <w:tc>
@@ -7773,7 +8053,7 @@
                 <w:sz w:val="26"/>
                 <w:szCs w:val="26"/>
               </w:rPr>
-              <w:t>GVT</w:t>
+              <w:t>GVX</w:t>
             </w:r>
           </w:p>
         </w:tc>
@@ -7996,7 +8276,7 @@
                 <w:sz w:val="26"/>
                 <w:szCs w:val="26"/>
               </w:rPr>
-              <w:t>GVT</w:t>
+              <w:t>GVX</w:t>
             </w:r>
           </w:p>
         </w:tc>
@@ -8237,10 +8517,10 @@
     </w:pPr>
     <w:r>
       <w:object w:dxaOrig="1188" w:dyaOrig="900">
-        <v:rect id="_x0000_i1025" style="width:56.25pt;height:38.7pt" o:ole="" o:preferrelative="t" stroked="f">
+        <v:rect id="_x0000_i1025" style="width:56.1pt;height:39.2pt" o:ole="" o:preferrelative="t" stroked="f">
           <v:imagedata r:id="rId1" o:title=""/>
         </v:rect>
-        <o:OLEObject Type="Embed" ProgID="StaticMetafile" ShapeID="_x0000_i1025" DrawAspect="Content" ObjectID="_1851948606" r:id="rId2"/>
+        <o:OLEObject Type="Embed" ProgID="StaticMetafile" ShapeID="_x0000_i1025" DrawAspect="Content" ObjectID="_1852032491" r:id="rId2"/>
       </w:object>
     </w:r>
     <w:r>
@@ -8284,7 +8564,7 @@
         <w:sz w:val="26"/>
         <w:szCs w:val="26"/>
       </w:rPr>
-      <w:t>7</w:t>
+      <w:t>8</w:t>
     </w:r>
     <w:r>
       <w:rPr>
@@ -8304,7 +8584,17 @@
         <w:sz w:val="26"/>
         <w:szCs w:val="26"/>
       </w:rPr>
-      <w:t>SUN</w:t>
+      <w:t>MO</w:t>
+    </w:r>
+    <w:r>
+      <w:rPr>
+        <w:rFonts w:ascii="Times New Roman" w:hAnsi="Times New Roman" w:cs="Times New Roman"/>
+        <w:b/>
+        <w:color w:val="000000" w:themeColor="text1"/>
+        <w:sz w:val="26"/>
+        <w:szCs w:val="26"/>
+      </w:rPr>
+      <w:t>N</w:t>
     </w:r>
     <w:r>
       <w:rPr>

</xml_diff>

<commit_message>
Sync - 2026-09-27 17:29
</commit_message>
<xml_diff>
--- a/files/Daily_Helicopter_Schedule.docx
+++ b/files/Daily_Helicopter_Schedule.docx
@@ -703,6 +703,14 @@
                 <w:szCs w:val="26"/>
               </w:rPr>
             </w:pPr>
+            <w:r>
+              <w:rPr>
+                <w:rFonts w:ascii="Calibri" w:eastAsia="Calibri" w:hAnsi="Calibri" w:cs="Calibri"/>
+                <w:sz w:val="26"/>
+                <w:szCs w:val="26"/>
+              </w:rPr>
+              <w:t>07</w:t>
+            </w:r>
           </w:p>
         </w:tc>
       </w:tr>
@@ -3781,8 +3789,6 @@
               </w:rPr>
               <w:t>BLQ[PM]</w:t>
             </w:r>
-            <w:bookmarkStart w:id="0" w:name="_GoBack"/>
-            <w:bookmarkEnd w:id="0"/>
           </w:p>
         </w:tc>
         <w:tc>
@@ -6841,129 +6847,6 @@
         </w:tc>
       </w:tr>
     </w:tbl>
-    <w:p>
-      <w:pPr>
-        <w:spacing w:after="0" w:line="240" w:lineRule="auto"/>
-        <w:rPr>
-          <w:rFonts w:ascii="Calibri" w:eastAsia="Calibri" w:hAnsi="Calibri" w:cs="Calibri"/>
-          <w:b/>
-          <w:sz w:val="24"/>
-        </w:rPr>
-      </w:pPr>
-      <w:r>
-        <w:rPr>
-          <w:rFonts w:ascii="Calibri" w:eastAsia="Calibri" w:hAnsi="Calibri" w:cs="Calibri"/>
-          <w:b/>
-          <w:sz w:val="24"/>
-        </w:rPr>
-        <w:t xml:space="preserve">NOTE: No Schedule for Crew Change of Private Rigs, </w:t>
-      </w:r>
-      <w:proofErr w:type="spellStart"/>
-      <w:proofErr w:type="gramStart"/>
-      <w:r>
-        <w:rPr>
-          <w:rFonts w:ascii="Calibri" w:eastAsia="Calibri" w:hAnsi="Calibri" w:cs="Calibri"/>
-          <w:b/>
-          <w:sz w:val="24"/>
-        </w:rPr>
-        <w:t>Samrat</w:t>
-      </w:r>
-      <w:proofErr w:type="spellEnd"/>
-      <w:r>
-        <w:rPr>
-          <w:rFonts w:ascii="Calibri" w:eastAsia="Calibri" w:hAnsi="Calibri" w:cs="Calibri"/>
-          <w:b/>
-          <w:sz w:val="24"/>
-        </w:rPr>
-        <w:t xml:space="preserve"> ,</w:t>
-      </w:r>
-      <w:proofErr w:type="gramEnd"/>
-      <w:r>
-        <w:rPr>
-          <w:rFonts w:ascii="Calibri" w:eastAsia="Calibri" w:hAnsi="Calibri" w:cs="Calibri"/>
-          <w:b/>
-          <w:sz w:val="24"/>
-        </w:rPr>
-        <w:t xml:space="preserve"> AS1,AS2.</w:t>
-      </w:r>
-    </w:p>
-    <w:p>
-      <w:pPr>
-        <w:spacing w:after="0" w:line="240" w:lineRule="auto"/>
-        <w:rPr>
-          <w:rFonts w:ascii="Calibri" w:eastAsia="Calibri" w:hAnsi="Calibri" w:cs="Calibri"/>
-          <w:b/>
-          <w:sz w:val="24"/>
-        </w:rPr>
-      </w:pPr>
-      <w:r>
-        <w:rPr>
-          <w:rFonts w:ascii="Calibri" w:eastAsia="Calibri" w:hAnsi="Calibri" w:cs="Calibri"/>
-          <w:b/>
-          <w:sz w:val="24"/>
-        </w:rPr>
-        <w:t>Crew Boat Schedule will be informed.</w:t>
-      </w:r>
-    </w:p>
-    <w:p>
-      <w:pPr>
-        <w:spacing w:after="0" w:line="240" w:lineRule="auto"/>
-        <w:rPr>
-          <w:rFonts w:ascii="Calibri" w:eastAsia="Calibri" w:hAnsi="Calibri" w:cs="Calibri"/>
-          <w:b/>
-          <w:sz w:val="40"/>
-          <w:u w:val="single"/>
-        </w:rPr>
-      </w:pPr>
-    </w:p>
-    <w:p>
-      <w:pPr>
-        <w:spacing w:after="0" w:line="240" w:lineRule="auto"/>
-        <w:jc w:val="center"/>
-        <w:rPr>
-          <w:rFonts w:ascii="Calibri" w:eastAsia="Calibri" w:hAnsi="Calibri" w:cs="Calibri"/>
-          <w:b/>
-          <w:sz w:val="40"/>
-          <w:u w:val="single"/>
-        </w:rPr>
-      </w:pPr>
-    </w:p>
-    <w:p>
-      <w:pPr>
-        <w:spacing w:after="0" w:line="240" w:lineRule="auto"/>
-        <w:jc w:val="center"/>
-        <w:rPr>
-          <w:rFonts w:ascii="Calibri" w:eastAsia="Calibri" w:hAnsi="Calibri" w:cs="Calibri"/>
-          <w:b/>
-          <w:sz w:val="40"/>
-          <w:u w:val="single"/>
-        </w:rPr>
-      </w:pPr>
-    </w:p>
-    <w:p>
-      <w:pPr>
-        <w:spacing w:after="0" w:line="240" w:lineRule="auto"/>
-        <w:ind w:right="-613"/>
-        <w:jc w:val="center"/>
-        <w:rPr>
-          <w:rFonts w:ascii="Calibri" w:eastAsia="Calibri" w:hAnsi="Calibri" w:cs="Calibri"/>
-          <w:b/>
-          <w:sz w:val="40"/>
-          <w:u w:val="single"/>
-        </w:rPr>
-      </w:pPr>
-    </w:p>
-    <w:p>
-      <w:pPr>
-        <w:spacing w:after="0" w:line="240" w:lineRule="auto"/>
-        <w:rPr>
-          <w:rFonts w:ascii="Calibri" w:eastAsia="Calibri" w:hAnsi="Calibri" w:cs="Calibri"/>
-          <w:b/>
-          <w:sz w:val="40"/>
-          <w:u w:val="single"/>
-        </w:rPr>
-      </w:pPr>
-    </w:p>
     <w:p>
       <w:pPr>
         <w:spacing w:after="0" w:line="240" w:lineRule="auto"/>
@@ -7524,14 +7407,6 @@
                 <w:szCs w:val="26"/>
               </w:rPr>
             </w:pPr>
-            <w:r>
-              <w:rPr>
-                <w:rFonts w:ascii="Calibri" w:eastAsia="Calibri" w:hAnsi="Calibri" w:cs="Calibri"/>
-                <w:sz w:val="26"/>
-                <w:szCs w:val="26"/>
-              </w:rPr>
-              <w:t>J STAR</w:t>
-            </w:r>
           </w:p>
         </w:tc>
         <w:tc>
@@ -7585,14 +7460,6 @@
                 <w:szCs w:val="26"/>
               </w:rPr>
             </w:pPr>
-            <w:r>
-              <w:rPr>
-                <w:rFonts w:ascii="Calibri" w:eastAsia="Calibri" w:hAnsi="Calibri" w:cs="Calibri"/>
-                <w:sz w:val="26"/>
-                <w:szCs w:val="26"/>
-              </w:rPr>
-              <w:t>GVX</w:t>
-            </w:r>
           </w:p>
         </w:tc>
         <w:tc>
@@ -7754,14 +7621,6 @@
                 <w:szCs w:val="26"/>
               </w:rPr>
             </w:pPr>
-            <w:r>
-              <w:rPr>
-                <w:rFonts w:ascii="Calibri" w:eastAsia="Calibri" w:hAnsi="Calibri" w:cs="Calibri"/>
-                <w:sz w:val="26"/>
-                <w:szCs w:val="26"/>
-              </w:rPr>
-              <w:t>TAPTI</w:t>
-            </w:r>
           </w:p>
         </w:tc>
         <w:tc>
@@ -7816,14 +7675,6 @@
                 <w:szCs w:val="26"/>
               </w:rPr>
             </w:pPr>
-            <w:r>
-              <w:rPr>
-                <w:rFonts w:ascii="Calibri" w:eastAsia="Calibri" w:hAnsi="Calibri" w:cs="Calibri"/>
-                <w:sz w:val="26"/>
-                <w:szCs w:val="26"/>
-              </w:rPr>
-              <w:t>GVX</w:t>
-            </w:r>
           </w:p>
         </w:tc>
         <w:tc>
@@ -7985,14 +7836,6 @@
                 <w:szCs w:val="26"/>
               </w:rPr>
             </w:pPr>
-            <w:r>
-              <w:rPr>
-                <w:rFonts w:ascii="Calibri" w:eastAsia="Calibri" w:hAnsi="Calibri" w:cs="Calibri"/>
-                <w:sz w:val="26"/>
-                <w:szCs w:val="26"/>
-              </w:rPr>
-              <w:t>L/O</w:t>
-            </w:r>
           </w:p>
         </w:tc>
         <w:tc>
@@ -8047,14 +7890,6 @@
                 <w:szCs w:val="26"/>
               </w:rPr>
             </w:pPr>
-            <w:r>
-              <w:rPr>
-                <w:rFonts w:ascii="Calibri" w:eastAsia="Calibri" w:hAnsi="Calibri" w:cs="Calibri"/>
-                <w:sz w:val="26"/>
-                <w:szCs w:val="26"/>
-              </w:rPr>
-              <w:t>GVX</w:t>
-            </w:r>
           </w:p>
         </w:tc>
         <w:tc>
@@ -8270,14 +8105,6 @@
                 <w:szCs w:val="26"/>
               </w:rPr>
             </w:pPr>
-            <w:r>
-              <w:rPr>
-                <w:rFonts w:ascii="Calibri" w:eastAsia="Calibri" w:hAnsi="Calibri" w:cs="Calibri"/>
-                <w:sz w:val="26"/>
-                <w:szCs w:val="26"/>
-              </w:rPr>
-              <w:t>GVX</w:t>
-            </w:r>
           </w:p>
         </w:tc>
         <w:tc>
@@ -8320,6 +8147,110 @@
           <w:u w:val="single"/>
         </w:rPr>
       </w:pPr>
+    </w:p>
+    <w:p>
+      <w:pPr>
+        <w:spacing w:after="0" w:line="240" w:lineRule="auto"/>
+        <w:rPr>
+          <w:rFonts w:ascii="Calibri" w:eastAsia="Calibri" w:hAnsi="Calibri" w:cs="Calibri"/>
+          <w:b/>
+          <w:sz w:val="24"/>
+        </w:rPr>
+      </w:pPr>
+      <w:r>
+        <w:rPr>
+          <w:rFonts w:ascii="Calibri" w:eastAsia="Calibri" w:hAnsi="Calibri" w:cs="Calibri"/>
+          <w:b/>
+          <w:sz w:val="24"/>
+        </w:rPr>
+        <w:t xml:space="preserve"> </w:t>
+      </w:r>
+      <w:r>
+        <w:rPr>
+          <w:rFonts w:ascii="Calibri" w:eastAsia="Calibri" w:hAnsi="Calibri" w:cs="Calibri"/>
+          <w:b/>
+          <w:sz w:val="24"/>
+        </w:rPr>
+        <w:t>NOTE: No Schedule for Crew Change of</w:t>
+      </w:r>
+      <w:r>
+        <w:rPr>
+          <w:rFonts w:ascii="Calibri" w:eastAsia="Calibri" w:hAnsi="Calibri" w:cs="Calibri"/>
+          <w:b/>
+          <w:sz w:val="24"/>
+        </w:rPr>
+        <w:t xml:space="preserve"> Private Rigs.</w:t>
+      </w:r>
+    </w:p>
+    <w:p>
+      <w:pPr>
+        <w:spacing w:after="0" w:line="240" w:lineRule="auto"/>
+        <w:rPr>
+          <w:rFonts w:ascii="Calibri" w:eastAsia="Calibri" w:hAnsi="Calibri" w:cs="Calibri"/>
+          <w:b/>
+          <w:sz w:val="24"/>
+        </w:rPr>
+      </w:pPr>
+      <w:r>
+        <w:rPr>
+          <w:rFonts w:ascii="Calibri" w:eastAsia="Calibri" w:hAnsi="Calibri" w:cs="Calibri"/>
+          <w:b/>
+          <w:sz w:val="24"/>
+        </w:rPr>
+        <w:t xml:space="preserve"> Samrat,</w:t>
+      </w:r>
+      <w:bookmarkStart w:id="0" w:name="_GoBack"/>
+      <w:bookmarkEnd w:id="0"/>
+      <w:r>
+        <w:rPr>
+          <w:rFonts w:ascii="Calibri" w:eastAsia="Calibri" w:hAnsi="Calibri" w:cs="Calibri"/>
+          <w:b/>
+          <w:sz w:val="24"/>
+        </w:rPr>
+        <w:t xml:space="preserve">AS1,AS2 </w:t>
+      </w:r>
+      <w:r>
+        <w:rPr>
+          <w:rFonts w:ascii="Calibri" w:eastAsia="Calibri" w:hAnsi="Calibri" w:cs="Calibri"/>
+          <w:b/>
+          <w:sz w:val="24"/>
+        </w:rPr>
+        <w:t xml:space="preserve"> CC </w:t>
+      </w:r>
+      <w:r>
+        <w:rPr>
+          <w:rFonts w:ascii="Calibri" w:eastAsia="Calibri" w:hAnsi="Calibri" w:cs="Calibri"/>
+          <w:b/>
+          <w:sz w:val="24"/>
+        </w:rPr>
+        <w:t>under review</w:t>
+      </w:r>
+      <w:r>
+        <w:rPr>
+          <w:rFonts w:ascii="Calibri" w:eastAsia="Calibri" w:hAnsi="Calibri" w:cs="Calibri"/>
+          <w:b/>
+          <w:sz w:val="24"/>
+        </w:rPr>
+        <w:t>.</w:t>
+      </w:r>
+    </w:p>
+    <w:p>
+      <w:pPr>
+        <w:spacing w:after="0" w:line="240" w:lineRule="auto"/>
+        <w:rPr>
+          <w:rFonts w:ascii="Calibri" w:eastAsia="Calibri" w:hAnsi="Calibri" w:cs="Calibri"/>
+          <w:b/>
+          <w:sz w:val="24"/>
+        </w:rPr>
+      </w:pPr>
+      <w:r>
+        <w:rPr>
+          <w:rFonts w:ascii="Calibri" w:eastAsia="Calibri" w:hAnsi="Calibri" w:cs="Calibri"/>
+          <w:b/>
+          <w:sz w:val="24"/>
+        </w:rPr>
+        <w:t>Also please check Crew boat schedule for Contract crew.</w:t>
+      </w:r>
     </w:p>
     <w:p>
       <w:pPr>
@@ -8337,15 +8268,6 @@
           <w:sz w:val="20"/>
         </w:rPr>
       </w:pPr>
-      <w:r>
-        <w:rPr>
-          <w:rFonts w:ascii="Calibri" w:eastAsia="Calibri" w:hAnsi="Calibri" w:cs="Calibri"/>
-          <w:b/>
-          <w:color w:val="2E74B5"/>
-          <w:sz w:val="20"/>
-        </w:rPr>
-        <w:tab/>
-      </w:r>
       <w:r>
         <w:rPr>
           <w:rFonts w:ascii="Calibri" w:eastAsia="Calibri" w:hAnsi="Calibri" w:cs="Calibri"/>
@@ -8517,10 +8439,10 @@
     </w:pPr>
     <w:r>
       <w:object w:dxaOrig="1188" w:dyaOrig="900">
-        <v:rect id="_x0000_i1025" style="width:56.1pt;height:39.2pt" o:ole="" o:preferrelative="t" stroked="f">
+        <v:rect id="_x0000_i1025" style="width:56.25pt;height:39pt" o:ole="" o:preferrelative="t" stroked="f">
           <v:imagedata r:id="rId1" o:title=""/>
         </v:rect>
-        <o:OLEObject Type="Embed" ProgID="StaticMetafile" ShapeID="_x0000_i1025" DrawAspect="Content" ObjectID="_1852032491" r:id="rId2"/>
+        <o:OLEObject Type="Embed" ProgID="StaticMetafile" ShapeID="_x0000_i1025" DrawAspect="Content" ObjectID="_1852035148" r:id="rId2"/>
       </w:object>
     </w:r>
     <w:r>

</xml_diff>

<commit_message>
Sync - 2026-09-28 18:01
</commit_message>
<xml_diff>
--- a/files/Daily_Helicopter_Schedule.docx
+++ b/files/Daily_Helicopter_Schedule.docx
@@ -639,7 +639,7 @@
                 <w:sz w:val="26"/>
                 <w:szCs w:val="26"/>
               </w:rPr>
-              <w:t>HELIGO 145</w:t>
+              <w:t>GVHL 412</w:t>
             </w:r>
           </w:p>
         </w:tc>
@@ -674,7 +674,7 @@
                 <w:sz w:val="26"/>
                 <w:szCs w:val="26"/>
               </w:rPr>
-              <w:t>HLW</w:t>
+              <w:t>RRJ</w:t>
             </w:r>
           </w:p>
         </w:tc>
@@ -1432,7 +1432,7 @@
                 <w:sz w:val="26"/>
                 <w:szCs w:val="26"/>
               </w:rPr>
-              <w:t>RRJ</w:t>
+              <w:t>GVT</w:t>
             </w:r>
           </w:p>
         </w:tc>
@@ -1674,7 +1674,7 @@
                 <w:sz w:val="26"/>
                 <w:szCs w:val="26"/>
               </w:rPr>
-              <w:t>HF[PM]</w:t>
+              <w:t>HF (PM)</w:t>
             </w:r>
           </w:p>
         </w:tc>
@@ -3073,39 +3073,38 @@
             <w:r>
               <w:rPr>
                 <w:rFonts w:ascii="Calibri" w:eastAsia="Calibri" w:hAnsi="Calibri" w:cs="Calibri"/>
+                <w:sz w:val="26"/>
+                <w:szCs w:val="26"/>
+              </w:rPr>
+              <w:t>NLM</w:t>
+            </w:r>
+          </w:p>
+        </w:tc>
+        <w:tc>
+          <w:tcPr>
+            <w:tcW w:w="1554" w:type="dxa"/>
+            <w:tcBorders>
+              <w:top w:val="single" w:sz="4" w:space="0" w:color="000000"/>
+              <w:left w:val="single" w:sz="4" w:space="0" w:color="000000"/>
+              <w:bottom w:val="single" w:sz="4" w:space="0" w:color="000000"/>
+              <w:right w:val="single" w:sz="4" w:space="0" w:color="000000"/>
+            </w:tcBorders>
+            <w:shd w:val="clear" w:color="000000" w:fill="FFFFFF"/>
+            <w:tcMar>
+              <w:left w:w="108" w:type="dxa"/>
+              <w:right w:w="108" w:type="dxa"/>
+            </w:tcMar>
+          </w:tcPr>
+          <w:p>
+            <w:pPr>
+              <w:spacing w:after="0" w:line="240" w:lineRule="auto"/>
+              <w:jc w:val="center"/>
+              <w:rPr>
+                <w:rFonts w:ascii="Calibri" w:eastAsia="Calibri" w:hAnsi="Calibri" w:cs="Calibri"/>
                 <w:b/>
                 <w:sz w:val="26"/>
                 <w:szCs w:val="26"/>
               </w:rPr>
-              <w:t xml:space="preserve"> TBD</w:t>
-            </w:r>
-          </w:p>
-        </w:tc>
-        <w:tc>
-          <w:tcPr>
-            <w:tcW w:w="1554" w:type="dxa"/>
-            <w:tcBorders>
-              <w:top w:val="single" w:sz="4" w:space="0" w:color="000000"/>
-              <w:left w:val="single" w:sz="4" w:space="0" w:color="000000"/>
-              <w:bottom w:val="single" w:sz="4" w:space="0" w:color="000000"/>
-              <w:right w:val="single" w:sz="4" w:space="0" w:color="000000"/>
-            </w:tcBorders>
-            <w:shd w:val="clear" w:color="000000" w:fill="FFFFFF"/>
-            <w:tcMar>
-              <w:left w:w="108" w:type="dxa"/>
-              <w:right w:w="108" w:type="dxa"/>
-            </w:tcMar>
-          </w:tcPr>
-          <w:p>
-            <w:pPr>
-              <w:spacing w:after="0" w:line="240" w:lineRule="auto"/>
-              <w:jc w:val="center"/>
-              <w:rPr>
-                <w:rFonts w:ascii="Calibri" w:eastAsia="Calibri" w:hAnsi="Calibri" w:cs="Calibri"/>
-                <w:b/>
-                <w:sz w:val="26"/>
-                <w:szCs w:val="26"/>
-              </w:rPr>
             </w:pPr>
           </w:p>
         </w:tc>
@@ -3134,14 +3133,6 @@
                 <w:szCs w:val="26"/>
               </w:rPr>
             </w:pPr>
-            <w:r>
-              <w:rPr>
-                <w:rFonts w:ascii="Calibri" w:eastAsia="Calibri" w:hAnsi="Calibri" w:cs="Calibri"/>
-                <w:sz w:val="26"/>
-                <w:szCs w:val="26"/>
-              </w:rPr>
-              <w:t>RRI</w:t>
-            </w:r>
           </w:p>
         </w:tc>
         <w:tc>
@@ -3314,17 +3305,19 @@
               <w:jc w:val="center"/>
               <w:rPr>
                 <w:rFonts w:ascii="Calibri" w:eastAsia="Calibri" w:hAnsi="Calibri" w:cs="Calibri"/>
-                <w:sz w:val="26"/>
-                <w:szCs w:val="26"/>
-              </w:rPr>
-            </w:pPr>
-            <w:r>
-              <w:rPr>
-                <w:rFonts w:ascii="Calibri" w:eastAsia="Calibri" w:hAnsi="Calibri" w:cs="Calibri"/>
-                <w:sz w:val="26"/>
-                <w:szCs w:val="26"/>
-              </w:rPr>
-              <w:t xml:space="preserve">  NA</w:t>
+                <w:b/>
+                <w:sz w:val="26"/>
+                <w:szCs w:val="26"/>
+              </w:rPr>
+            </w:pPr>
+            <w:r>
+              <w:rPr>
+                <w:rFonts w:ascii="Calibri" w:eastAsia="Calibri" w:hAnsi="Calibri" w:cs="Calibri"/>
+                <w:b/>
+                <w:sz w:val="26"/>
+                <w:szCs w:val="26"/>
+              </w:rPr>
+              <w:t>NA</w:t>
             </w:r>
           </w:p>
         </w:tc>
@@ -3784,10 +3777,10 @@
             <w:r>
               <w:rPr>
                 <w:rFonts w:ascii="Calibri" w:eastAsia="Calibri" w:hAnsi="Calibri" w:cs="Calibri"/>
-                <w:sz w:val="26"/>
-                <w:szCs w:val="26"/>
-              </w:rPr>
-              <w:t>BLQ[PM]</w:t>
+                <w:sz w:val="28"/>
+                <w:szCs w:val="28"/>
+              </w:rPr>
+              <w:t>BPA</w:t>
             </w:r>
           </w:p>
         </w:tc>
@@ -3844,14 +3837,6 @@
                 <w:szCs w:val="26"/>
               </w:rPr>
             </w:pPr>
-            <w:r>
-              <w:rPr>
-                <w:rFonts w:ascii="Calibri" w:eastAsia="Calibri" w:hAnsi="Calibri" w:cs="Calibri"/>
-                <w:sz w:val="26"/>
-                <w:szCs w:val="26"/>
-              </w:rPr>
-              <w:t>GVT</w:t>
-            </w:r>
           </w:p>
         </w:tc>
         <w:tc>
@@ -4027,11 +4012,10 @@
             <w:r>
               <w:rPr>
                 <w:rFonts w:ascii="Calibri" w:eastAsia="Calibri" w:hAnsi="Calibri" w:cs="Calibri"/>
-                <w:b/>
-                <w:sz w:val="26"/>
-                <w:szCs w:val="26"/>
-              </w:rPr>
-              <w:t>NA</w:t>
+                <w:sz w:val="28"/>
+                <w:szCs w:val="28"/>
+              </w:rPr>
+              <w:t>BPA</w:t>
             </w:r>
           </w:p>
         </w:tc>
@@ -4311,13 +4295,15 @@
               <w:jc w:val="center"/>
               <w:rPr>
                 <w:rFonts w:ascii="Calibri" w:eastAsia="Calibri" w:hAnsi="Calibri" w:cs="Calibri"/>
-                <w:sz w:val="26"/>
-                <w:szCs w:val="26"/>
-              </w:rPr>
-            </w:pPr>
-            <w:r>
-              <w:rPr>
-                <w:rFonts w:ascii="Calibri" w:eastAsia="Calibri" w:hAnsi="Calibri" w:cs="Calibri"/>
+                <w:b/>
+                <w:sz w:val="26"/>
+                <w:szCs w:val="26"/>
+              </w:rPr>
+            </w:pPr>
+            <w:r>
+              <w:rPr>
+                <w:rFonts w:ascii="Calibri" w:eastAsia="Calibri" w:hAnsi="Calibri" w:cs="Calibri"/>
+                <w:b/>
                 <w:sz w:val="26"/>
                 <w:szCs w:val="26"/>
               </w:rPr>
@@ -4346,13 +4332,15 @@
               <w:jc w:val="center"/>
               <w:rPr>
                 <w:rFonts w:ascii="Calibri" w:eastAsia="Calibri" w:hAnsi="Calibri" w:cs="Calibri"/>
-                <w:sz w:val="26"/>
-                <w:szCs w:val="26"/>
-              </w:rPr>
-            </w:pPr>
-            <w:r>
-              <w:rPr>
-                <w:rFonts w:ascii="Calibri" w:eastAsia="Calibri" w:hAnsi="Calibri" w:cs="Calibri"/>
+                <w:b/>
+                <w:sz w:val="26"/>
+                <w:szCs w:val="26"/>
+              </w:rPr>
+            </w:pPr>
+            <w:r>
+              <w:rPr>
+                <w:rFonts w:ascii="Calibri" w:eastAsia="Calibri" w:hAnsi="Calibri" w:cs="Calibri"/>
+                <w:b/>
                 <w:sz w:val="26"/>
                 <w:szCs w:val="26"/>
               </w:rPr>
@@ -4381,13 +4369,15 @@
               <w:jc w:val="center"/>
               <w:rPr>
                 <w:rFonts w:ascii="Calibri" w:eastAsia="Calibri" w:hAnsi="Calibri" w:cs="Calibri"/>
-                <w:sz w:val="26"/>
-                <w:szCs w:val="26"/>
-              </w:rPr>
-            </w:pPr>
-            <w:r>
-              <w:rPr>
-                <w:rFonts w:ascii="Calibri" w:eastAsia="Calibri" w:hAnsi="Calibri" w:cs="Calibri"/>
+                <w:b/>
+                <w:sz w:val="26"/>
+                <w:szCs w:val="26"/>
+              </w:rPr>
+            </w:pPr>
+            <w:r>
+              <w:rPr>
+                <w:rFonts w:ascii="Calibri" w:eastAsia="Calibri" w:hAnsi="Calibri" w:cs="Calibri"/>
+                <w:b/>
                 <w:sz w:val="26"/>
                 <w:szCs w:val="26"/>
               </w:rPr>
@@ -4563,7 +4553,7 @@
                 <w:sz w:val="26"/>
                 <w:szCs w:val="26"/>
               </w:rPr>
-              <w:t>SHAKTI</w:t>
+              <w:t>SHQ</w:t>
             </w:r>
           </w:p>
         </w:tc>
@@ -4619,14 +4609,6 @@
                 <w:szCs w:val="26"/>
               </w:rPr>
             </w:pPr>
-            <w:r>
-              <w:rPr>
-                <w:rFonts w:ascii="Calibri" w:eastAsia="Calibri" w:hAnsi="Calibri" w:cs="Calibri"/>
-                <w:sz w:val="26"/>
-                <w:szCs w:val="26"/>
-              </w:rPr>
-              <w:t>HLV</w:t>
-            </w:r>
           </w:p>
         </w:tc>
         <w:tc>
@@ -5050,10 +5032,10 @@
             <w:r>
               <w:rPr>
                 <w:rFonts w:ascii="Calibri" w:eastAsia="Calibri" w:hAnsi="Calibri" w:cs="Calibri"/>
-                <w:sz w:val="28"/>
-                <w:szCs w:val="28"/>
-              </w:rPr>
-              <w:t>ARMADA2</w:t>
+                <w:sz w:val="26"/>
+                <w:szCs w:val="26"/>
+              </w:rPr>
+              <w:t>SHQ</w:t>
             </w:r>
           </w:p>
         </w:tc>
@@ -5109,14 +5091,6 @@
                 <w:szCs w:val="26"/>
               </w:rPr>
             </w:pPr>
-            <w:r>
-              <w:rPr>
-                <w:rFonts w:ascii="Calibri" w:eastAsia="Calibri" w:hAnsi="Calibri" w:cs="Calibri"/>
-                <w:sz w:val="26"/>
-                <w:szCs w:val="26"/>
-              </w:rPr>
-              <w:t>HLV</w:t>
-            </w:r>
           </w:p>
         </w:tc>
         <w:tc>
@@ -5277,48 +5251,46 @@
               <w:jc w:val="center"/>
               <w:rPr>
                 <w:rFonts w:ascii="Calibri" w:eastAsia="Calibri" w:hAnsi="Calibri" w:cs="Calibri"/>
+                <w:sz w:val="26"/>
+                <w:szCs w:val="26"/>
+              </w:rPr>
+            </w:pPr>
+            <w:r>
+              <w:rPr>
+                <w:rFonts w:ascii="Calibri" w:eastAsia="Calibri" w:hAnsi="Calibri" w:cs="Calibri"/>
+                <w:sz w:val="26"/>
+                <w:szCs w:val="26"/>
+              </w:rPr>
+              <w:t>R12A+R13A</w:t>
+            </w:r>
+          </w:p>
+        </w:tc>
+        <w:tc>
+          <w:tcPr>
+            <w:tcW w:w="1554" w:type="dxa"/>
+            <w:tcBorders>
+              <w:top w:val="single" w:sz="4" w:space="0" w:color="000000"/>
+              <w:left w:val="single" w:sz="4" w:space="0" w:color="000000"/>
+              <w:bottom w:val="single" w:sz="4" w:space="0" w:color="000000"/>
+              <w:right w:val="single" w:sz="4" w:space="0" w:color="000000"/>
+            </w:tcBorders>
+            <w:shd w:val="clear" w:color="000000" w:fill="FFFFFF"/>
+            <w:tcMar>
+              <w:left w:w="108" w:type="dxa"/>
+              <w:right w:w="108" w:type="dxa"/>
+            </w:tcMar>
+          </w:tcPr>
+          <w:p>
+            <w:pPr>
+              <w:spacing w:after="0" w:line="240" w:lineRule="auto"/>
+              <w:jc w:val="center"/>
+              <w:rPr>
+                <w:rFonts w:ascii="Calibri" w:eastAsia="Calibri" w:hAnsi="Calibri" w:cs="Calibri"/>
                 <w:b/>
                 <w:sz w:val="26"/>
                 <w:szCs w:val="26"/>
               </w:rPr>
             </w:pPr>
-            <w:r>
-              <w:rPr>
-                <w:rFonts w:ascii="Calibri" w:eastAsia="Calibri" w:hAnsi="Calibri" w:cs="Calibri"/>
-                <w:b/>
-                <w:sz w:val="26"/>
-                <w:szCs w:val="26"/>
-              </w:rPr>
-              <w:t>NA</w:t>
-            </w:r>
-          </w:p>
-        </w:tc>
-        <w:tc>
-          <w:tcPr>
-            <w:tcW w:w="1554" w:type="dxa"/>
-            <w:tcBorders>
-              <w:top w:val="single" w:sz="4" w:space="0" w:color="000000"/>
-              <w:left w:val="single" w:sz="4" w:space="0" w:color="000000"/>
-              <w:bottom w:val="single" w:sz="4" w:space="0" w:color="000000"/>
-              <w:right w:val="single" w:sz="4" w:space="0" w:color="000000"/>
-            </w:tcBorders>
-            <w:shd w:val="clear" w:color="000000" w:fill="FFFFFF"/>
-            <w:tcMar>
-              <w:left w:w="108" w:type="dxa"/>
-              <w:right w:w="108" w:type="dxa"/>
-            </w:tcMar>
-          </w:tcPr>
-          <w:p>
-            <w:pPr>
-              <w:spacing w:after="0" w:line="240" w:lineRule="auto"/>
-              <w:jc w:val="center"/>
-              <w:rPr>
-                <w:rFonts w:ascii="Calibri" w:eastAsia="Calibri" w:hAnsi="Calibri" w:cs="Calibri"/>
-                <w:b/>
-                <w:sz w:val="26"/>
-                <w:szCs w:val="26"/>
-              </w:rPr>
-            </w:pPr>
           </w:p>
         </w:tc>
         <w:tc>
@@ -5342,20 +5314,10 @@
               <w:jc w:val="center"/>
               <w:rPr>
                 <w:rFonts w:ascii="Calibri" w:eastAsia="Calibri" w:hAnsi="Calibri" w:cs="Calibri"/>
-                <w:b/>
-                <w:sz w:val="26"/>
-                <w:szCs w:val="26"/>
-              </w:rPr>
-            </w:pPr>
-            <w:r>
-              <w:rPr>
-                <w:rFonts w:ascii="Calibri" w:eastAsia="Calibri" w:hAnsi="Calibri" w:cs="Calibri"/>
-                <w:b/>
-                <w:sz w:val="26"/>
-                <w:szCs w:val="26"/>
-              </w:rPr>
-              <w:t>NA</w:t>
-            </w:r>
+                <w:sz w:val="26"/>
+                <w:szCs w:val="26"/>
+              </w:rPr>
+            </w:pPr>
           </w:p>
         </w:tc>
         <w:tc>
@@ -5582,7 +5544,7 @@
                 <w:sz w:val="26"/>
                 <w:szCs w:val="26"/>
               </w:rPr>
-              <w:t>BLQ1</w:t>
+              <w:t>HERA</w:t>
             </w:r>
           </w:p>
         </w:tc>
@@ -5809,7 +5771,7 @@
                 <w:sz w:val="26"/>
                 <w:szCs w:val="26"/>
               </w:rPr>
-              <w:t>RATNA</w:t>
+              <w:t>ICP</w:t>
             </w:r>
           </w:p>
         </w:tc>
@@ -6263,7 +6225,7 @@
                 <w:sz w:val="26"/>
                 <w:szCs w:val="26"/>
               </w:rPr>
-              <w:t>UDAY</w:t>
+              <w:t>SGAV</w:t>
             </w:r>
           </w:p>
         </w:tc>
@@ -6723,7 +6685,7 @@
                 <w:sz w:val="26"/>
                 <w:szCs w:val="26"/>
               </w:rPr>
-              <w:t>WIN/MNW</w:t>
+              <w:t>SJOT</w:t>
             </w:r>
           </w:p>
         </w:tc>
@@ -6858,6 +6820,7 @@
         </w:rPr>
       </w:pPr>
       <w:r>
+        <w:lastRenderedPageBreak/>
         <w:tab/>
       </w:r>
       <w:r>
@@ -7407,6 +7370,14 @@
                 <w:szCs w:val="26"/>
               </w:rPr>
             </w:pPr>
+            <w:r>
+              <w:rPr>
+                <w:rFonts w:ascii="Calibri" w:eastAsia="Calibri" w:hAnsi="Calibri" w:cs="Calibri"/>
+                <w:sz w:val="26"/>
+                <w:szCs w:val="26"/>
+              </w:rPr>
+              <w:t>TCPP CC +PROD</w:t>
+            </w:r>
           </w:p>
         </w:tc>
         <w:tc>
@@ -7621,6 +7592,16 @@
                 <w:szCs w:val="26"/>
               </w:rPr>
             </w:pPr>
+            <w:r>
+              <w:rPr>
+                <w:rFonts w:ascii="Calibri" w:eastAsia="Calibri" w:hAnsi="Calibri" w:cs="Calibri"/>
+                <w:sz w:val="26"/>
+                <w:szCs w:val="26"/>
+              </w:rPr>
+              <w:t>JIND</w:t>
+            </w:r>
+            <w:bookmarkStart w:id="0" w:name="_GoBack"/>
+            <w:bookmarkEnd w:id="0"/>
           </w:p>
         </w:tc>
         <w:tc>
@@ -8171,15 +8152,7 @@
           <w:b/>
           <w:sz w:val="24"/>
         </w:rPr>
-        <w:t>NOTE: No Schedule for Crew Change of</w:t>
-      </w:r>
-      <w:r>
-        <w:rPr>
-          <w:rFonts w:ascii="Calibri" w:eastAsia="Calibri" w:hAnsi="Calibri" w:cs="Calibri"/>
-          <w:b/>
-          <w:sz w:val="24"/>
-        </w:rPr>
-        <w:t xml:space="preserve"> Private Rigs.</w:t>
+        <w:t>NOTE: No Schedule for Crew Change of Private Rigs.</w:t>
       </w:r>
     </w:p>
     <w:p>
@@ -8197,41 +8170,7 @@
           <w:b/>
           <w:sz w:val="24"/>
         </w:rPr>
-        <w:t xml:space="preserve"> Samrat,</w:t>
-      </w:r>
-      <w:bookmarkStart w:id="0" w:name="_GoBack"/>
-      <w:bookmarkEnd w:id="0"/>
-      <w:r>
-        <w:rPr>
-          <w:rFonts w:ascii="Calibri" w:eastAsia="Calibri" w:hAnsi="Calibri" w:cs="Calibri"/>
-          <w:b/>
-          <w:sz w:val="24"/>
-        </w:rPr>
-        <w:t xml:space="preserve">AS1,AS2 </w:t>
-      </w:r>
-      <w:r>
-        <w:rPr>
-          <w:rFonts w:ascii="Calibri" w:eastAsia="Calibri" w:hAnsi="Calibri" w:cs="Calibri"/>
-          <w:b/>
-          <w:sz w:val="24"/>
-        </w:rPr>
-        <w:t xml:space="preserve"> CC </w:t>
-      </w:r>
-      <w:r>
-        <w:rPr>
-          <w:rFonts w:ascii="Calibri" w:eastAsia="Calibri" w:hAnsi="Calibri" w:cs="Calibri"/>
-          <w:b/>
-          <w:sz w:val="24"/>
-        </w:rPr>
-        <w:t>under review</w:t>
-      </w:r>
-      <w:r>
-        <w:rPr>
-          <w:rFonts w:ascii="Calibri" w:eastAsia="Calibri" w:hAnsi="Calibri" w:cs="Calibri"/>
-          <w:b/>
-          <w:sz w:val="24"/>
-        </w:rPr>
-        <w:t>.</w:t>
+        <w:t xml:space="preserve"> Samrat,AS1,AS2  CC under review.</w:t>
       </w:r>
     </w:p>
     <w:p>
@@ -8442,7 +8381,7 @@
         <v:rect id="_x0000_i1025" style="width:56.25pt;height:39pt" o:ole="" o:preferrelative="t" stroked="f">
           <v:imagedata r:id="rId1" o:title=""/>
         </v:rect>
-        <o:OLEObject Type="Embed" ProgID="StaticMetafile" ShapeID="_x0000_i1025" DrawAspect="Content" ObjectID="_1852035148" r:id="rId2"/>
+        <o:OLEObject Type="Embed" ProgID="StaticMetafile" ShapeID="_x0000_i1025" DrawAspect="Content" ObjectID="_1852119677" r:id="rId2"/>
       </w:object>
     </w:r>
     <w:r>
@@ -8486,7 +8425,7 @@
         <w:sz w:val="26"/>
         <w:szCs w:val="26"/>
       </w:rPr>
-      <w:t>8</w:t>
+      <w:t>9</w:t>
     </w:r>
     <w:r>
       <w:rPr>
@@ -8506,17 +8445,7 @@
         <w:sz w:val="26"/>
         <w:szCs w:val="26"/>
       </w:rPr>
-      <w:t>MO</w:t>
-    </w:r>
-    <w:r>
-      <w:rPr>
-        <w:rFonts w:ascii="Times New Roman" w:hAnsi="Times New Roman" w:cs="Times New Roman"/>
-        <w:b/>
-        <w:color w:val="000000" w:themeColor="text1"/>
-        <w:sz w:val="26"/>
-        <w:szCs w:val="26"/>
-      </w:rPr>
-      <w:t>N</w:t>
+      <w:t>TUES</w:t>
     </w:r>
     <w:r>
       <w:rPr>

</xml_diff>

<commit_message>
Sync - 2026-09-29 17:04
</commit_message>
<xml_diff>
--- a/files/Daily_Helicopter_Schedule.docx
+++ b/files/Daily_Helicopter_Schedule.docx
@@ -1174,15 +1174,7 @@
                 <w:sz w:val="26"/>
                 <w:szCs w:val="26"/>
               </w:rPr>
-              <w:t>RR</w:t>
-            </w:r>
-            <w:r>
-              <w:rPr>
-                <w:rFonts w:ascii="Calibri" w:eastAsia="Calibri" w:hAnsi="Calibri" w:cs="Calibri"/>
-                <w:sz w:val="26"/>
-                <w:szCs w:val="26"/>
-              </w:rPr>
-              <w:t>O</w:t>
+              <w:t>GVT</w:t>
             </w:r>
           </w:p>
         </w:tc>
@@ -1432,7 +1424,7 @@
                 <w:sz w:val="26"/>
                 <w:szCs w:val="26"/>
               </w:rPr>
-              <w:t>GVT</w:t>
+              <w:t>RRO</w:t>
             </w:r>
           </w:p>
         </w:tc>
@@ -2874,7 +2866,7 @@
       </w:tr>
       <w:tr>
         <w:trPr>
-          <w:trHeight w:val="376"/>
+          <w:trHeight w:val="204"/>
         </w:trPr>
         <w:tc>
           <w:tcPr>
@@ -3076,7 +3068,7 @@
                 <w:sz w:val="26"/>
                 <w:szCs w:val="26"/>
               </w:rPr>
-              <w:t>NLM</w:t>
+              <w:t>B193</w:t>
             </w:r>
           </w:p>
         </w:tc>
@@ -3133,6 +3125,14 @@
                 <w:szCs w:val="26"/>
               </w:rPr>
             </w:pPr>
+            <w:r>
+              <w:rPr>
+                <w:rFonts w:ascii="Calibri" w:eastAsia="Calibri" w:hAnsi="Calibri" w:cs="Calibri"/>
+                <w:sz w:val="26"/>
+                <w:szCs w:val="26"/>
+              </w:rPr>
+              <w:t>RRL</w:t>
+            </w:r>
           </w:p>
         </w:tc>
         <w:tc>
@@ -3837,6 +3837,14 @@
                 <w:szCs w:val="26"/>
               </w:rPr>
             </w:pPr>
+            <w:r>
+              <w:rPr>
+                <w:rFonts w:ascii="Calibri" w:eastAsia="Calibri" w:hAnsi="Calibri" w:cs="Calibri"/>
+                <w:sz w:val="26"/>
+                <w:szCs w:val="26"/>
+              </w:rPr>
+              <w:t>RRL</w:t>
+            </w:r>
           </w:p>
         </w:tc>
         <w:tc>
@@ -4072,6 +4080,14 @@
                 <w:szCs w:val="26"/>
               </w:rPr>
             </w:pPr>
+            <w:r>
+              <w:rPr>
+                <w:rFonts w:ascii="Calibri" w:eastAsia="Calibri" w:hAnsi="Calibri" w:cs="Calibri"/>
+                <w:sz w:val="26"/>
+                <w:szCs w:val="26"/>
+              </w:rPr>
+              <w:t>RRL</w:t>
+            </w:r>
           </w:p>
         </w:tc>
         <w:tc>
@@ -4337,52 +4353,34 @@
                 <w:szCs w:val="26"/>
               </w:rPr>
             </w:pPr>
-            <w:r>
+          </w:p>
+        </w:tc>
+        <w:tc>
+          <w:tcPr>
+            <w:tcW w:w="1302" w:type="dxa"/>
+            <w:tcBorders>
+              <w:top w:val="single" w:sz="4" w:space="0" w:color="000000"/>
+              <w:left w:val="single" w:sz="4" w:space="0" w:color="000000"/>
+              <w:bottom w:val="single" w:sz="4" w:space="0" w:color="000000"/>
+              <w:right w:val="single" w:sz="4" w:space="0" w:color="000000"/>
+            </w:tcBorders>
+            <w:shd w:val="clear" w:color="000000" w:fill="FFFFFF"/>
+            <w:tcMar>
+              <w:left w:w="108" w:type="dxa"/>
+              <w:right w:w="108" w:type="dxa"/>
+            </w:tcMar>
+          </w:tcPr>
+          <w:p>
+            <w:pPr>
+              <w:spacing w:after="0" w:line="240" w:lineRule="auto"/>
+              <w:jc w:val="center"/>
               <w:rPr>
                 <w:rFonts w:ascii="Calibri" w:eastAsia="Calibri" w:hAnsi="Calibri" w:cs="Calibri"/>
                 <w:b/>
                 <w:sz w:val="26"/>
                 <w:szCs w:val="26"/>
               </w:rPr>
-              <w:t>NA</w:t>
-            </w:r>
-          </w:p>
-        </w:tc>
-        <w:tc>
-          <w:tcPr>
-            <w:tcW w:w="1302" w:type="dxa"/>
-            <w:tcBorders>
-              <w:top w:val="single" w:sz="4" w:space="0" w:color="000000"/>
-              <w:left w:val="single" w:sz="4" w:space="0" w:color="000000"/>
-              <w:bottom w:val="single" w:sz="4" w:space="0" w:color="000000"/>
-              <w:right w:val="single" w:sz="4" w:space="0" w:color="000000"/>
-            </w:tcBorders>
-            <w:shd w:val="clear" w:color="000000" w:fill="FFFFFF"/>
-            <w:tcMar>
-              <w:left w:w="108" w:type="dxa"/>
-              <w:right w:w="108" w:type="dxa"/>
-            </w:tcMar>
-          </w:tcPr>
-          <w:p>
-            <w:pPr>
-              <w:spacing w:after="0" w:line="240" w:lineRule="auto"/>
-              <w:jc w:val="center"/>
-              <w:rPr>
-                <w:rFonts w:ascii="Calibri" w:eastAsia="Calibri" w:hAnsi="Calibri" w:cs="Calibri"/>
-                <w:b/>
-                <w:sz w:val="26"/>
-                <w:szCs w:val="26"/>
-              </w:rPr>
-            </w:pPr>
-            <w:r>
-              <w:rPr>
-                <w:rFonts w:ascii="Calibri" w:eastAsia="Calibri" w:hAnsi="Calibri" w:cs="Calibri"/>
-                <w:b/>
-                <w:sz w:val="26"/>
-                <w:szCs w:val="26"/>
-              </w:rPr>
-              <w:t>NA</w:t>
-            </w:r>
+            </w:pPr>
           </w:p>
         </w:tc>
         <w:tc>
@@ -4553,7 +4551,7 @@
                 <w:sz w:val="26"/>
                 <w:szCs w:val="26"/>
               </w:rPr>
-              <w:t>SHQ</w:t>
+              <w:t>B193</w:t>
             </w:r>
           </w:p>
         </w:tc>
@@ -4609,6 +4607,14 @@
                 <w:szCs w:val="26"/>
               </w:rPr>
             </w:pPr>
+            <w:r>
+              <w:rPr>
+                <w:rFonts w:ascii="Calibri" w:eastAsia="Calibri" w:hAnsi="Calibri" w:cs="Calibri"/>
+                <w:sz w:val="26"/>
+                <w:szCs w:val="26"/>
+              </w:rPr>
+              <w:t>HLV</w:t>
+            </w:r>
           </w:p>
         </w:tc>
         <w:tc>
@@ -4811,52 +4817,34 @@
                 <w:szCs w:val="26"/>
               </w:rPr>
             </w:pPr>
-            <w:r>
+          </w:p>
+        </w:tc>
+        <w:tc>
+          <w:tcPr>
+            <w:tcW w:w="1302" w:type="dxa"/>
+            <w:tcBorders>
+              <w:top w:val="single" w:sz="4" w:space="0" w:color="000000"/>
+              <w:left w:val="single" w:sz="4" w:space="0" w:color="000000"/>
+              <w:bottom w:val="single" w:sz="4" w:space="0" w:color="000000"/>
+              <w:right w:val="single" w:sz="4" w:space="0" w:color="000000"/>
+            </w:tcBorders>
+            <w:shd w:val="clear" w:color="000000" w:fill="FFFFFF"/>
+            <w:tcMar>
+              <w:left w:w="108" w:type="dxa"/>
+              <w:right w:w="108" w:type="dxa"/>
+            </w:tcMar>
+          </w:tcPr>
+          <w:p>
+            <w:pPr>
+              <w:spacing w:after="0" w:line="240" w:lineRule="auto"/>
+              <w:jc w:val="center"/>
               <w:rPr>
                 <w:rFonts w:ascii="Calibri" w:eastAsia="Calibri" w:hAnsi="Calibri" w:cs="Calibri"/>
                 <w:b/>
                 <w:sz w:val="26"/>
                 <w:szCs w:val="26"/>
               </w:rPr>
-              <w:t>NA</w:t>
-            </w:r>
-          </w:p>
-        </w:tc>
-        <w:tc>
-          <w:tcPr>
-            <w:tcW w:w="1302" w:type="dxa"/>
-            <w:tcBorders>
-              <w:top w:val="single" w:sz="4" w:space="0" w:color="000000"/>
-              <w:left w:val="single" w:sz="4" w:space="0" w:color="000000"/>
-              <w:bottom w:val="single" w:sz="4" w:space="0" w:color="000000"/>
-              <w:right w:val="single" w:sz="4" w:space="0" w:color="000000"/>
-            </w:tcBorders>
-            <w:shd w:val="clear" w:color="000000" w:fill="FFFFFF"/>
-            <w:tcMar>
-              <w:left w:w="108" w:type="dxa"/>
-              <w:right w:w="108" w:type="dxa"/>
-            </w:tcMar>
-          </w:tcPr>
-          <w:p>
-            <w:pPr>
-              <w:spacing w:after="0" w:line="240" w:lineRule="auto"/>
-              <w:jc w:val="center"/>
-              <w:rPr>
-                <w:rFonts w:ascii="Calibri" w:eastAsia="Calibri" w:hAnsi="Calibri" w:cs="Calibri"/>
-                <w:b/>
-                <w:sz w:val="26"/>
-                <w:szCs w:val="26"/>
-              </w:rPr>
-            </w:pPr>
-            <w:r>
-              <w:rPr>
-                <w:rFonts w:ascii="Calibri" w:eastAsia="Calibri" w:hAnsi="Calibri" w:cs="Calibri"/>
-                <w:b/>
-                <w:sz w:val="26"/>
-                <w:szCs w:val="26"/>
-              </w:rPr>
-              <w:t>NA</w:t>
-            </w:r>
+            </w:pPr>
           </w:p>
         </w:tc>
         <w:tc>
@@ -5032,10 +5020,10 @@
             <w:r>
               <w:rPr>
                 <w:rFonts w:ascii="Calibri" w:eastAsia="Calibri" w:hAnsi="Calibri" w:cs="Calibri"/>
-                <w:sz w:val="26"/>
-                <w:szCs w:val="26"/>
-              </w:rPr>
-              <w:t>SHQ</w:t>
+                <w:sz w:val="28"/>
+                <w:szCs w:val="28"/>
+              </w:rPr>
+              <w:t>NLM</w:t>
             </w:r>
           </w:p>
         </w:tc>
@@ -5091,6 +5079,14 @@
                 <w:szCs w:val="26"/>
               </w:rPr>
             </w:pPr>
+            <w:r>
+              <w:rPr>
+                <w:rFonts w:ascii="Calibri" w:eastAsia="Calibri" w:hAnsi="Calibri" w:cs="Calibri"/>
+                <w:sz w:val="26"/>
+                <w:szCs w:val="26"/>
+              </w:rPr>
+              <w:t>HLV</w:t>
+            </w:r>
           </w:p>
         </w:tc>
         <w:tc>
@@ -5261,7 +5257,7 @@
                 <w:sz w:val="26"/>
                 <w:szCs w:val="26"/>
               </w:rPr>
-              <w:t>R12A+R13A</w:t>
+              <w:t>NLM</w:t>
             </w:r>
           </w:p>
         </w:tc>
@@ -5318,6 +5314,14 @@
                 <w:szCs w:val="26"/>
               </w:rPr>
             </w:pPr>
+            <w:r>
+              <w:rPr>
+                <w:rFonts w:ascii="Calibri" w:eastAsia="Calibri" w:hAnsi="Calibri" w:cs="Calibri"/>
+                <w:sz w:val="26"/>
+                <w:szCs w:val="26"/>
+              </w:rPr>
+              <w:t>HLV</w:t>
+            </w:r>
           </w:p>
         </w:tc>
         <w:tc>
@@ -5544,7 +5548,7 @@
                 <w:sz w:val="26"/>
                 <w:szCs w:val="26"/>
               </w:rPr>
-              <w:t>HERA</w:t>
+              <w:t>SCA</w:t>
             </w:r>
           </w:p>
         </w:tc>
@@ -5600,6 +5604,14 @@
                 <w:szCs w:val="26"/>
               </w:rPr>
             </w:pPr>
+            <w:r>
+              <w:rPr>
+                <w:rFonts w:ascii="Calibri" w:eastAsia="Calibri" w:hAnsi="Calibri" w:cs="Calibri"/>
+                <w:sz w:val="26"/>
+                <w:szCs w:val="26"/>
+              </w:rPr>
+              <w:t>HLU</w:t>
+            </w:r>
           </w:p>
         </w:tc>
         <w:tc>
@@ -5771,7 +5783,7 @@
                 <w:sz w:val="26"/>
                 <w:szCs w:val="26"/>
               </w:rPr>
-              <w:t>ICP</w:t>
+              <w:t>SRAT</w:t>
             </w:r>
           </w:p>
         </w:tc>
@@ -5827,6 +5839,14 @@
                 <w:szCs w:val="26"/>
               </w:rPr>
             </w:pPr>
+            <w:r>
+              <w:rPr>
+                <w:rFonts w:ascii="Calibri" w:eastAsia="Calibri" w:hAnsi="Calibri" w:cs="Calibri"/>
+                <w:sz w:val="26"/>
+                <w:szCs w:val="26"/>
+              </w:rPr>
+              <w:t>HLH</w:t>
+            </w:r>
           </w:p>
         </w:tc>
         <w:tc>
@@ -5995,10 +6015,11 @@
             <w:r>
               <w:rPr>
                 <w:rFonts w:ascii="Calibri" w:eastAsia="Calibri" w:hAnsi="Calibri" w:cs="Calibri"/>
-                <w:sz w:val="26"/>
-                <w:szCs w:val="26"/>
-              </w:rPr>
-              <w:t>SLQ</w:t>
+                <w:b/>
+                <w:sz w:val="26"/>
+                <w:szCs w:val="26"/>
+              </w:rPr>
+              <w:t>NA</w:t>
             </w:r>
           </w:p>
         </w:tc>
@@ -6225,7 +6246,7 @@
                 <w:sz w:val="26"/>
                 <w:szCs w:val="26"/>
               </w:rPr>
-              <w:t>SGAV</w:t>
+              <w:t>MNW</w:t>
             </w:r>
           </w:p>
         </w:tc>
@@ -6288,6 +6309,14 @@
                 <w:szCs w:val="26"/>
               </w:rPr>
             </w:pPr>
+            <w:r>
+              <w:rPr>
+                <w:rFonts w:ascii="Calibri" w:eastAsia="Calibri" w:hAnsi="Calibri" w:cs="Calibri"/>
+                <w:sz w:val="26"/>
+                <w:szCs w:val="26"/>
+              </w:rPr>
+              <w:t>HLU</w:t>
+            </w:r>
           </w:p>
         </w:tc>
         <w:tc>
@@ -6459,7 +6488,7 @@
                 <w:sz w:val="26"/>
                 <w:szCs w:val="26"/>
               </w:rPr>
-              <w:t>NQO</w:t>
+              <w:t>SSAK</w:t>
             </w:r>
           </w:p>
         </w:tc>
@@ -6514,6 +6543,14 @@
                 <w:szCs w:val="26"/>
               </w:rPr>
             </w:pPr>
+            <w:r>
+              <w:rPr>
+                <w:rFonts w:ascii="Calibri" w:eastAsia="Calibri" w:hAnsi="Calibri" w:cs="Calibri"/>
+                <w:sz w:val="26"/>
+                <w:szCs w:val="26"/>
+              </w:rPr>
+              <w:t>HLH</w:t>
+            </w:r>
           </w:p>
         </w:tc>
         <w:tc>
@@ -6682,10 +6719,11 @@
             <w:r>
               <w:rPr>
                 <w:rFonts w:ascii="Calibri" w:eastAsia="Calibri" w:hAnsi="Calibri" w:cs="Calibri"/>
-                <w:sz w:val="26"/>
-                <w:szCs w:val="26"/>
-              </w:rPr>
-              <w:t>SJOT</w:t>
+                <w:b/>
+                <w:sz w:val="26"/>
+                <w:szCs w:val="26"/>
+              </w:rPr>
+              <w:t>NA</w:t>
             </w:r>
           </w:p>
         </w:tc>
@@ -6804,6 +6842,14 @@
                 <w:sz w:val="24"/>
               </w:rPr>
               <w:t xml:space="preserve">WAITING:  </w:t>
+            </w:r>
+            <w:r>
+              <w:rPr>
+                <w:rFonts w:ascii="Calibri" w:eastAsia="Calibri" w:hAnsi="Calibri" w:cs="Calibri"/>
+                <w:sz w:val="26"/>
+                <w:szCs w:val="26"/>
+              </w:rPr>
+              <w:t>SMRT</w:t>
             </w:r>
           </w:p>
         </w:tc>
@@ -6820,7 +6866,6 @@
         </w:rPr>
       </w:pPr>
       <w:r>
-        <w:lastRenderedPageBreak/>
         <w:tab/>
       </w:r>
       <w:r>
@@ -7376,7 +7421,7 @@
                 <w:sz w:val="26"/>
                 <w:szCs w:val="26"/>
               </w:rPr>
-              <w:t>TCPP CC +PROD</w:t>
+              <w:t>JIND</w:t>
             </w:r>
           </w:p>
         </w:tc>
@@ -7598,225 +7643,233 @@
                 <w:sz w:val="26"/>
                 <w:szCs w:val="26"/>
               </w:rPr>
-              <w:t>JIND</w:t>
+              <w:t>CHRU</w:t>
+            </w:r>
+          </w:p>
+        </w:tc>
+        <w:tc>
+          <w:tcPr>
+            <w:tcW w:w="1524" w:type="dxa"/>
+            <w:tcBorders>
+              <w:top w:val="single" w:sz="4" w:space="0" w:color="000000"/>
+              <w:left w:val="single" w:sz="4" w:space="0" w:color="000000"/>
+              <w:bottom w:val="single" w:sz="4" w:space="0" w:color="000000"/>
+              <w:right w:val="single" w:sz="4" w:space="0" w:color="000000"/>
+            </w:tcBorders>
+            <w:shd w:val="clear" w:color="000000" w:fill="FFFFFF"/>
+            <w:tcMar>
+              <w:left w:w="108" w:type="dxa"/>
+              <w:right w:w="108" w:type="dxa"/>
+            </w:tcMar>
+          </w:tcPr>
+          <w:p>
+            <w:pPr>
+              <w:spacing w:after="0" w:line="240" w:lineRule="auto"/>
+              <w:jc w:val="center"/>
+              <w:rPr>
+                <w:rFonts w:ascii="Calibri" w:eastAsia="Calibri" w:hAnsi="Calibri" w:cs="Calibri"/>
+                <w:sz w:val="26"/>
+                <w:szCs w:val="26"/>
+              </w:rPr>
+            </w:pPr>
+          </w:p>
+        </w:tc>
+        <w:tc>
+          <w:tcPr>
+            <w:tcW w:w="795" w:type="dxa"/>
+            <w:tcBorders>
+              <w:top w:val="single" w:sz="4" w:space="0" w:color="000000"/>
+              <w:left w:val="single" w:sz="4" w:space="0" w:color="000000"/>
+              <w:bottom w:val="single" w:sz="4" w:space="0" w:color="000000"/>
+              <w:right w:val="single" w:sz="4" w:space="0" w:color="000000"/>
+            </w:tcBorders>
+            <w:shd w:val="clear" w:color="000000" w:fill="FFFFFF"/>
+            <w:tcMar>
+              <w:left w:w="108" w:type="dxa"/>
+              <w:right w:w="108" w:type="dxa"/>
+            </w:tcMar>
+          </w:tcPr>
+          <w:p>
+            <w:pPr>
+              <w:spacing w:after="0" w:line="240" w:lineRule="auto"/>
+              <w:jc w:val="center"/>
+              <w:rPr>
+                <w:rFonts w:ascii="Calibri" w:eastAsia="Calibri" w:hAnsi="Calibri" w:cs="Calibri"/>
+                <w:sz w:val="26"/>
+                <w:szCs w:val="26"/>
+              </w:rPr>
+            </w:pPr>
+          </w:p>
+        </w:tc>
+        <w:tc>
+          <w:tcPr>
+            <w:tcW w:w="1300" w:type="dxa"/>
+            <w:tcBorders>
+              <w:top w:val="single" w:sz="4" w:space="0" w:color="000000"/>
+              <w:left w:val="single" w:sz="4" w:space="0" w:color="000000"/>
+              <w:bottom w:val="single" w:sz="4" w:space="0" w:color="000000"/>
+              <w:right w:val="single" w:sz="4" w:space="0" w:color="000000"/>
+            </w:tcBorders>
+            <w:shd w:val="clear" w:color="000000" w:fill="FFFFFF"/>
+            <w:tcMar>
+              <w:left w:w="108" w:type="dxa"/>
+              <w:right w:w="108" w:type="dxa"/>
+            </w:tcMar>
+          </w:tcPr>
+          <w:p>
+            <w:pPr>
+              <w:spacing w:after="0" w:line="240" w:lineRule="auto"/>
+              <w:jc w:val="center"/>
+              <w:rPr>
+                <w:rFonts w:ascii="Calibri" w:eastAsia="Calibri" w:hAnsi="Calibri" w:cs="Calibri"/>
+                <w:sz w:val="26"/>
+                <w:szCs w:val="26"/>
+              </w:rPr>
+            </w:pPr>
+          </w:p>
+        </w:tc>
+      </w:tr>
+      <w:tr>
+        <w:tc>
+          <w:tcPr>
+            <w:tcW w:w="671" w:type="dxa"/>
+            <w:tcBorders>
+              <w:top w:val="single" w:sz="4" w:space="0" w:color="000000"/>
+              <w:left w:val="single" w:sz="4" w:space="0" w:color="000000"/>
+              <w:bottom w:val="single" w:sz="4" w:space="0" w:color="000000"/>
+              <w:right w:val="single" w:sz="4" w:space="0" w:color="000000"/>
+            </w:tcBorders>
+            <w:shd w:val="clear" w:color="000000" w:fill="FFFFFF"/>
+            <w:tcMar>
+              <w:left w:w="108" w:type="dxa"/>
+              <w:right w:w="108" w:type="dxa"/>
+            </w:tcMar>
+          </w:tcPr>
+          <w:p>
+            <w:pPr>
+              <w:spacing w:after="0" w:line="240" w:lineRule="auto"/>
+              <w:jc w:val="center"/>
+              <w:rPr>
+                <w:rFonts w:ascii="Calibri" w:eastAsia="Calibri" w:hAnsi="Calibri" w:cs="Calibri"/>
+                <w:sz w:val="26"/>
+                <w:szCs w:val="26"/>
+              </w:rPr>
+            </w:pPr>
+            <w:r>
+              <w:rPr>
+                <w:rFonts w:ascii="Calibri" w:eastAsia="Calibri" w:hAnsi="Calibri" w:cs="Calibri"/>
+                <w:sz w:val="26"/>
+                <w:szCs w:val="26"/>
+              </w:rPr>
+              <w:t>3</w:t>
+            </w:r>
+          </w:p>
+        </w:tc>
+        <w:tc>
+          <w:tcPr>
+            <w:tcW w:w="1604" w:type="dxa"/>
+            <w:tcBorders>
+              <w:top w:val="single" w:sz="4" w:space="0" w:color="000000"/>
+              <w:left w:val="single" w:sz="4" w:space="0" w:color="000000"/>
+              <w:bottom w:val="single" w:sz="4" w:space="0" w:color="000000"/>
+              <w:right w:val="single" w:sz="4" w:space="0" w:color="000000"/>
+            </w:tcBorders>
+            <w:shd w:val="clear" w:color="000000" w:fill="FFFFFF"/>
+            <w:tcMar>
+              <w:left w:w="108" w:type="dxa"/>
+              <w:right w:w="108" w:type="dxa"/>
+            </w:tcMar>
+          </w:tcPr>
+          <w:p>
+            <w:pPr>
+              <w:spacing w:after="0" w:line="240" w:lineRule="auto"/>
+              <w:jc w:val="center"/>
+              <w:rPr>
+                <w:rFonts w:ascii="Calibri" w:eastAsia="Calibri" w:hAnsi="Calibri" w:cs="Calibri"/>
+                <w:sz w:val="26"/>
+                <w:szCs w:val="26"/>
+              </w:rPr>
+            </w:pPr>
+            <w:r>
+              <w:rPr>
+                <w:rFonts w:ascii="Calibri" w:eastAsia="Calibri" w:hAnsi="Calibri" w:cs="Calibri"/>
+                <w:sz w:val="26"/>
+                <w:szCs w:val="26"/>
+              </w:rPr>
+              <w:t>11:00</w:t>
+            </w:r>
+          </w:p>
+        </w:tc>
+        <w:tc>
+          <w:tcPr>
+            <w:tcW w:w="1444" w:type="dxa"/>
+            <w:tcBorders>
+              <w:top w:val="single" w:sz="4" w:space="0" w:color="000000"/>
+              <w:left w:val="single" w:sz="4" w:space="0" w:color="000000"/>
+              <w:bottom w:val="single" w:sz="4" w:space="0" w:color="000000"/>
+              <w:right w:val="single" w:sz="4" w:space="0" w:color="000000"/>
+            </w:tcBorders>
+            <w:shd w:val="clear" w:color="000000" w:fill="FFFFFF"/>
+            <w:tcMar>
+              <w:left w:w="108" w:type="dxa"/>
+              <w:right w:w="108" w:type="dxa"/>
+            </w:tcMar>
+          </w:tcPr>
+          <w:p>
+            <w:pPr>
+              <w:spacing w:after="0" w:line="240" w:lineRule="auto"/>
+              <w:jc w:val="center"/>
+              <w:rPr>
+                <w:rFonts w:ascii="Calibri" w:eastAsia="Calibri" w:hAnsi="Calibri" w:cs="Calibri"/>
+                <w:sz w:val="26"/>
+                <w:szCs w:val="26"/>
+              </w:rPr>
+            </w:pPr>
+            <w:r>
+              <w:rPr>
+                <w:rFonts w:ascii="Calibri" w:eastAsia="Calibri" w:hAnsi="Calibri" w:cs="Calibri"/>
+                <w:sz w:val="26"/>
+                <w:szCs w:val="26"/>
+              </w:rPr>
+              <w:t>12:30</w:t>
+            </w:r>
+          </w:p>
+        </w:tc>
+        <w:tc>
+          <w:tcPr>
+            <w:tcW w:w="1842" w:type="dxa"/>
+            <w:tcBorders>
+              <w:top w:val="single" w:sz="4" w:space="0" w:color="000000"/>
+              <w:left w:val="single" w:sz="4" w:space="0" w:color="000000"/>
+              <w:bottom w:val="single" w:sz="4" w:space="0" w:color="000000"/>
+              <w:right w:val="single" w:sz="4" w:space="0" w:color="000000"/>
+            </w:tcBorders>
+            <w:shd w:val="clear" w:color="000000" w:fill="FFFFFF"/>
+            <w:tcMar>
+              <w:left w:w="108" w:type="dxa"/>
+              <w:right w:w="108" w:type="dxa"/>
+            </w:tcMar>
+          </w:tcPr>
+          <w:p>
+            <w:pPr>
+              <w:spacing w:after="0" w:line="240" w:lineRule="auto"/>
+              <w:jc w:val="center"/>
+              <w:rPr>
+                <w:rFonts w:ascii="Calibri" w:eastAsia="Calibri" w:hAnsi="Calibri" w:cs="Calibri"/>
+                <w:sz w:val="26"/>
+                <w:szCs w:val="26"/>
+              </w:rPr>
+            </w:pPr>
+            <w:r>
+              <w:rPr>
+                <w:rFonts w:ascii="Calibri" w:eastAsia="Calibri" w:hAnsi="Calibri" w:cs="Calibri"/>
+                <w:sz w:val="26"/>
+                <w:szCs w:val="26"/>
+              </w:rPr>
+              <w:t>SJOT</w:t>
             </w:r>
             <w:bookmarkStart w:id="0" w:name="_GoBack"/>
             <w:bookmarkEnd w:id="0"/>
-          </w:p>
-        </w:tc>
-        <w:tc>
-          <w:tcPr>
-            <w:tcW w:w="1524" w:type="dxa"/>
-            <w:tcBorders>
-              <w:top w:val="single" w:sz="4" w:space="0" w:color="000000"/>
-              <w:left w:val="single" w:sz="4" w:space="0" w:color="000000"/>
-              <w:bottom w:val="single" w:sz="4" w:space="0" w:color="000000"/>
-              <w:right w:val="single" w:sz="4" w:space="0" w:color="000000"/>
-            </w:tcBorders>
-            <w:shd w:val="clear" w:color="000000" w:fill="FFFFFF"/>
-            <w:tcMar>
-              <w:left w:w="108" w:type="dxa"/>
-              <w:right w:w="108" w:type="dxa"/>
-            </w:tcMar>
-          </w:tcPr>
-          <w:p>
-            <w:pPr>
-              <w:spacing w:after="0" w:line="240" w:lineRule="auto"/>
-              <w:jc w:val="center"/>
-              <w:rPr>
-                <w:rFonts w:ascii="Calibri" w:eastAsia="Calibri" w:hAnsi="Calibri" w:cs="Calibri"/>
-                <w:sz w:val="26"/>
-                <w:szCs w:val="26"/>
-              </w:rPr>
-            </w:pPr>
-          </w:p>
-        </w:tc>
-        <w:tc>
-          <w:tcPr>
-            <w:tcW w:w="795" w:type="dxa"/>
-            <w:tcBorders>
-              <w:top w:val="single" w:sz="4" w:space="0" w:color="000000"/>
-              <w:left w:val="single" w:sz="4" w:space="0" w:color="000000"/>
-              <w:bottom w:val="single" w:sz="4" w:space="0" w:color="000000"/>
-              <w:right w:val="single" w:sz="4" w:space="0" w:color="000000"/>
-            </w:tcBorders>
-            <w:shd w:val="clear" w:color="000000" w:fill="FFFFFF"/>
-            <w:tcMar>
-              <w:left w:w="108" w:type="dxa"/>
-              <w:right w:w="108" w:type="dxa"/>
-            </w:tcMar>
-          </w:tcPr>
-          <w:p>
-            <w:pPr>
-              <w:spacing w:after="0" w:line="240" w:lineRule="auto"/>
-              <w:jc w:val="center"/>
-              <w:rPr>
-                <w:rFonts w:ascii="Calibri" w:eastAsia="Calibri" w:hAnsi="Calibri" w:cs="Calibri"/>
-                <w:sz w:val="26"/>
-                <w:szCs w:val="26"/>
-              </w:rPr>
-            </w:pPr>
-          </w:p>
-        </w:tc>
-        <w:tc>
-          <w:tcPr>
-            <w:tcW w:w="1300" w:type="dxa"/>
-            <w:tcBorders>
-              <w:top w:val="single" w:sz="4" w:space="0" w:color="000000"/>
-              <w:left w:val="single" w:sz="4" w:space="0" w:color="000000"/>
-              <w:bottom w:val="single" w:sz="4" w:space="0" w:color="000000"/>
-              <w:right w:val="single" w:sz="4" w:space="0" w:color="000000"/>
-            </w:tcBorders>
-            <w:shd w:val="clear" w:color="000000" w:fill="FFFFFF"/>
-            <w:tcMar>
-              <w:left w:w="108" w:type="dxa"/>
-              <w:right w:w="108" w:type="dxa"/>
-            </w:tcMar>
-          </w:tcPr>
-          <w:p>
-            <w:pPr>
-              <w:spacing w:after="0" w:line="240" w:lineRule="auto"/>
-              <w:jc w:val="center"/>
-              <w:rPr>
-                <w:rFonts w:ascii="Calibri" w:eastAsia="Calibri" w:hAnsi="Calibri" w:cs="Calibri"/>
-                <w:sz w:val="26"/>
-                <w:szCs w:val="26"/>
-              </w:rPr>
-            </w:pPr>
-          </w:p>
-        </w:tc>
-      </w:tr>
-      <w:tr>
-        <w:tc>
-          <w:tcPr>
-            <w:tcW w:w="671" w:type="dxa"/>
-            <w:tcBorders>
-              <w:top w:val="single" w:sz="4" w:space="0" w:color="000000"/>
-              <w:left w:val="single" w:sz="4" w:space="0" w:color="000000"/>
-              <w:bottom w:val="single" w:sz="4" w:space="0" w:color="000000"/>
-              <w:right w:val="single" w:sz="4" w:space="0" w:color="000000"/>
-            </w:tcBorders>
-            <w:shd w:val="clear" w:color="000000" w:fill="FFFFFF"/>
-            <w:tcMar>
-              <w:left w:w="108" w:type="dxa"/>
-              <w:right w:w="108" w:type="dxa"/>
-            </w:tcMar>
-          </w:tcPr>
-          <w:p>
-            <w:pPr>
-              <w:spacing w:after="0" w:line="240" w:lineRule="auto"/>
-              <w:jc w:val="center"/>
-              <w:rPr>
-                <w:rFonts w:ascii="Calibri" w:eastAsia="Calibri" w:hAnsi="Calibri" w:cs="Calibri"/>
-                <w:sz w:val="26"/>
-                <w:szCs w:val="26"/>
-              </w:rPr>
-            </w:pPr>
-            <w:r>
-              <w:rPr>
-                <w:rFonts w:ascii="Calibri" w:eastAsia="Calibri" w:hAnsi="Calibri" w:cs="Calibri"/>
-                <w:sz w:val="26"/>
-                <w:szCs w:val="26"/>
-              </w:rPr>
-              <w:t>3</w:t>
-            </w:r>
-          </w:p>
-        </w:tc>
-        <w:tc>
-          <w:tcPr>
-            <w:tcW w:w="1604" w:type="dxa"/>
-            <w:tcBorders>
-              <w:top w:val="single" w:sz="4" w:space="0" w:color="000000"/>
-              <w:left w:val="single" w:sz="4" w:space="0" w:color="000000"/>
-              <w:bottom w:val="single" w:sz="4" w:space="0" w:color="000000"/>
-              <w:right w:val="single" w:sz="4" w:space="0" w:color="000000"/>
-            </w:tcBorders>
-            <w:shd w:val="clear" w:color="000000" w:fill="FFFFFF"/>
-            <w:tcMar>
-              <w:left w:w="108" w:type="dxa"/>
-              <w:right w:w="108" w:type="dxa"/>
-            </w:tcMar>
-          </w:tcPr>
-          <w:p>
-            <w:pPr>
-              <w:spacing w:after="0" w:line="240" w:lineRule="auto"/>
-              <w:jc w:val="center"/>
-              <w:rPr>
-                <w:rFonts w:ascii="Calibri" w:eastAsia="Calibri" w:hAnsi="Calibri" w:cs="Calibri"/>
-                <w:sz w:val="26"/>
-                <w:szCs w:val="26"/>
-              </w:rPr>
-            </w:pPr>
-            <w:r>
-              <w:rPr>
-                <w:rFonts w:ascii="Calibri" w:eastAsia="Calibri" w:hAnsi="Calibri" w:cs="Calibri"/>
-                <w:sz w:val="26"/>
-                <w:szCs w:val="26"/>
-              </w:rPr>
-              <w:t>11:00</w:t>
-            </w:r>
-          </w:p>
-        </w:tc>
-        <w:tc>
-          <w:tcPr>
-            <w:tcW w:w="1444" w:type="dxa"/>
-            <w:tcBorders>
-              <w:top w:val="single" w:sz="4" w:space="0" w:color="000000"/>
-              <w:left w:val="single" w:sz="4" w:space="0" w:color="000000"/>
-              <w:bottom w:val="single" w:sz="4" w:space="0" w:color="000000"/>
-              <w:right w:val="single" w:sz="4" w:space="0" w:color="000000"/>
-            </w:tcBorders>
-            <w:shd w:val="clear" w:color="000000" w:fill="FFFFFF"/>
-            <w:tcMar>
-              <w:left w:w="108" w:type="dxa"/>
-              <w:right w:w="108" w:type="dxa"/>
-            </w:tcMar>
-          </w:tcPr>
-          <w:p>
-            <w:pPr>
-              <w:spacing w:after="0" w:line="240" w:lineRule="auto"/>
-              <w:jc w:val="center"/>
-              <w:rPr>
-                <w:rFonts w:ascii="Calibri" w:eastAsia="Calibri" w:hAnsi="Calibri" w:cs="Calibri"/>
-                <w:sz w:val="26"/>
-                <w:szCs w:val="26"/>
-              </w:rPr>
-            </w:pPr>
-            <w:r>
-              <w:rPr>
-                <w:rFonts w:ascii="Calibri" w:eastAsia="Calibri" w:hAnsi="Calibri" w:cs="Calibri"/>
-                <w:sz w:val="26"/>
-                <w:szCs w:val="26"/>
-              </w:rPr>
-              <w:t>12:30</w:t>
-            </w:r>
-          </w:p>
-        </w:tc>
-        <w:tc>
-          <w:tcPr>
-            <w:tcW w:w="1842" w:type="dxa"/>
-            <w:tcBorders>
-              <w:top w:val="single" w:sz="4" w:space="0" w:color="000000"/>
-              <w:left w:val="single" w:sz="4" w:space="0" w:color="000000"/>
-              <w:bottom w:val="single" w:sz="4" w:space="0" w:color="000000"/>
-              <w:right w:val="single" w:sz="4" w:space="0" w:color="000000"/>
-            </w:tcBorders>
-            <w:shd w:val="clear" w:color="000000" w:fill="FFFFFF"/>
-            <w:tcMar>
-              <w:left w:w="108" w:type="dxa"/>
-              <w:right w:w="108" w:type="dxa"/>
-            </w:tcMar>
-          </w:tcPr>
-          <w:p>
-            <w:pPr>
-              <w:spacing w:after="0" w:line="240" w:lineRule="auto"/>
-              <w:jc w:val="center"/>
-              <w:rPr>
-                <w:rFonts w:ascii="Calibri" w:eastAsia="Calibri" w:hAnsi="Calibri" w:cs="Calibri"/>
-                <w:sz w:val="26"/>
-                <w:szCs w:val="26"/>
-              </w:rPr>
-            </w:pPr>
           </w:p>
         </w:tc>
         <w:tc>
@@ -8381,7 +8434,7 @@
         <v:rect id="_x0000_i1025" style="width:56.25pt;height:39pt" o:ole="" o:preferrelative="t" stroked="f">
           <v:imagedata r:id="rId1" o:title=""/>
         </v:rect>
-        <o:OLEObject Type="Embed" ProgID="StaticMetafile" ShapeID="_x0000_i1025" DrawAspect="Content" ObjectID="_1852119677" r:id="rId2"/>
+        <o:OLEObject Type="Embed" ProgID="StaticMetafile" ShapeID="_x0000_i1025" DrawAspect="Content" ObjectID="_1852205444" r:id="rId2"/>
       </w:object>
     </w:r>
     <w:r>

</xml_diff>

<commit_message>
Sync - 2026-09-29 17:34
</commit_message>
<xml_diff>
--- a/files/Daily_Helicopter_Schedule.docx
+++ b/files/Daily_Helicopter_Schedule.docx
@@ -6866,6 +6866,7 @@
         </w:rPr>
       </w:pPr>
       <w:r>
+        <w:lastRenderedPageBreak/>
         <w:tab/>
       </w:r>
       <w:r>
@@ -7868,8 +7869,6 @@
               </w:rPr>
               <w:t>SJOT</w:t>
             </w:r>
-            <w:bookmarkStart w:id="0" w:name="_GoBack"/>
-            <w:bookmarkEnd w:id="0"/>
           </w:p>
         </w:tc>
         <w:tc>
@@ -8354,7 +8353,12 @@
       </w:pPr>
     </w:p>
     <w:sectPr>
-      <w:headerReference w:type="default" r:id="rId6"/>
+      <w:headerReference w:type="even" r:id="rId6"/>
+      <w:headerReference w:type="default" r:id="rId7"/>
+      <w:footerReference w:type="even" r:id="rId8"/>
+      <w:footerReference w:type="default" r:id="rId9"/>
+      <w:headerReference w:type="first" r:id="rId10"/>
+      <w:footerReference w:type="first" r:id="rId11"/>
       <w:pgSz w:w="11906" w:h="16838"/>
       <w:pgMar w:top="568" w:right="1440" w:bottom="1134" w:left="1276" w:header="708" w:footer="708" w:gutter="0"/>
       <w:cols w:space="708"/>
@@ -8389,6 +8393,36 @@
 </w:endnotes>
 </file>
 
+<file path=word/footer1.xml><?xml version="1.0" encoding="utf-8"?>
+<w:ftr xmlns:wpc="http://schemas.microsoft.com/office/word/2010/wordprocessingCanvas" xmlns:mc="http://schemas.openxmlformats.org/markup-compatibility/2006" xmlns:o="urn:schemas-microsoft-com:office:office" xmlns:r="http://schemas.openxmlformats.org/officeDocument/2006/relationships" xmlns:m="http://schemas.openxmlformats.org/officeDocument/2006/math" xmlns:v="urn:schemas-microsoft-com:vml" xmlns:wp14="http://schemas.microsoft.com/office/word/2010/wordprocessingDrawing" xmlns:wp="http://schemas.openxmlformats.org/drawingml/2006/wordprocessingDrawing" xmlns:w10="urn:schemas-microsoft-com:office:word" xmlns:w="http://schemas.openxmlformats.org/wordprocessingml/2006/main" xmlns:w14="http://schemas.microsoft.com/office/word/2010/wordml" xmlns:w15="http://schemas.microsoft.com/office/word/2012/wordml" xmlns:wpg="http://schemas.microsoft.com/office/word/2010/wordprocessingGroup" xmlns:wpi="http://schemas.microsoft.com/office/word/2010/wordprocessingInk" xmlns:wne="http://schemas.microsoft.com/office/word/2006/wordml" xmlns:wps="http://schemas.microsoft.com/office/word/2010/wordprocessingShape" mc:Ignorable="w14 w15 wp14">
+  <w:p>
+    <w:pPr>
+      <w:pStyle w:val="Footer"/>
+    </w:pPr>
+  </w:p>
+</w:ftr>
+</file>
+
+<file path=word/footer2.xml><?xml version="1.0" encoding="utf-8"?>
+<w:ftr xmlns:wpc="http://schemas.microsoft.com/office/word/2010/wordprocessingCanvas" xmlns:mc="http://schemas.openxmlformats.org/markup-compatibility/2006" xmlns:o="urn:schemas-microsoft-com:office:office" xmlns:r="http://schemas.openxmlformats.org/officeDocument/2006/relationships" xmlns:m="http://schemas.openxmlformats.org/officeDocument/2006/math" xmlns:v="urn:schemas-microsoft-com:vml" xmlns:wp14="http://schemas.microsoft.com/office/word/2010/wordprocessingDrawing" xmlns:wp="http://schemas.openxmlformats.org/drawingml/2006/wordprocessingDrawing" xmlns:w10="urn:schemas-microsoft-com:office:word" xmlns:w="http://schemas.openxmlformats.org/wordprocessingml/2006/main" xmlns:w14="http://schemas.microsoft.com/office/word/2010/wordml" xmlns:w15="http://schemas.microsoft.com/office/word/2012/wordml" xmlns:wpg="http://schemas.microsoft.com/office/word/2010/wordprocessingGroup" xmlns:wpi="http://schemas.microsoft.com/office/word/2010/wordprocessingInk" xmlns:wne="http://schemas.microsoft.com/office/word/2006/wordml" xmlns:wps="http://schemas.microsoft.com/office/word/2010/wordprocessingShape" mc:Ignorable="w14 w15 wp14">
+  <w:p>
+    <w:pPr>
+      <w:pStyle w:val="Footer"/>
+    </w:pPr>
+  </w:p>
+</w:ftr>
+</file>
+
+<file path=word/footer3.xml><?xml version="1.0" encoding="utf-8"?>
+<w:ftr xmlns:wpc="http://schemas.microsoft.com/office/word/2010/wordprocessingCanvas" xmlns:mc="http://schemas.openxmlformats.org/markup-compatibility/2006" xmlns:o="urn:schemas-microsoft-com:office:office" xmlns:r="http://schemas.openxmlformats.org/officeDocument/2006/relationships" xmlns:m="http://schemas.openxmlformats.org/officeDocument/2006/math" xmlns:v="urn:schemas-microsoft-com:vml" xmlns:wp14="http://schemas.microsoft.com/office/word/2010/wordprocessingDrawing" xmlns:wp="http://schemas.openxmlformats.org/drawingml/2006/wordprocessingDrawing" xmlns:w10="urn:schemas-microsoft-com:office:word" xmlns:w="http://schemas.openxmlformats.org/wordprocessingml/2006/main" xmlns:w14="http://schemas.microsoft.com/office/word/2010/wordml" xmlns:w15="http://schemas.microsoft.com/office/word/2012/wordml" xmlns:wpg="http://schemas.microsoft.com/office/word/2010/wordprocessingGroup" xmlns:wpi="http://schemas.microsoft.com/office/word/2010/wordprocessingInk" xmlns:wne="http://schemas.microsoft.com/office/word/2006/wordml" xmlns:wps="http://schemas.microsoft.com/office/word/2010/wordprocessingShape" mc:Ignorable="w14 w15 wp14">
+  <w:p>
+    <w:pPr>
+      <w:pStyle w:val="Footer"/>
+    </w:pPr>
+  </w:p>
+</w:ftr>
+</file>
+
 <file path=word/footnotes.xml><?xml version="1.0" encoding="utf-8"?>
 <w:footnotes xmlns:wpc="http://schemas.microsoft.com/office/word/2010/wordprocessingCanvas" xmlns:mc="http://schemas.openxmlformats.org/markup-compatibility/2006" xmlns:o="urn:schemas-microsoft-com:office:office" xmlns:r="http://schemas.openxmlformats.org/officeDocument/2006/relationships" xmlns:m="http://schemas.openxmlformats.org/officeDocument/2006/math" xmlns:v="urn:schemas-microsoft-com:vml" xmlns:wp14="http://schemas.microsoft.com/office/word/2010/wordprocessingDrawing" xmlns:wp="http://schemas.openxmlformats.org/drawingml/2006/wordprocessingDrawing" xmlns:w10="urn:schemas-microsoft-com:office:word" xmlns:w="http://schemas.openxmlformats.org/wordprocessingml/2006/main" xmlns:w14="http://schemas.microsoft.com/office/word/2010/wordml" xmlns:w15="http://schemas.microsoft.com/office/word/2012/wordml" xmlns:wpg="http://schemas.microsoft.com/office/word/2010/wordprocessingGroup" xmlns:wpi="http://schemas.microsoft.com/office/word/2010/wordprocessingInk" xmlns:wne="http://schemas.microsoft.com/office/word/2006/wordml" xmlns:wps="http://schemas.microsoft.com/office/word/2010/wordprocessingShape" mc:Ignorable="w14 w15 wp14">
   <w:footnote w:type="separator" w:id="-1">
@@ -8419,6 +8453,16 @@
   <w:p>
     <w:pPr>
       <w:pStyle w:val="Header"/>
+    </w:pPr>
+  </w:p>
+</w:hdr>
+</file>
+
+<file path=word/header2.xml><?xml version="1.0" encoding="utf-8"?>
+<w:hdr xmlns:wpc="http://schemas.microsoft.com/office/word/2010/wordprocessingCanvas" xmlns:mc="http://schemas.openxmlformats.org/markup-compatibility/2006" xmlns:o="urn:schemas-microsoft-com:office:office" xmlns:r="http://schemas.openxmlformats.org/officeDocument/2006/relationships" xmlns:m="http://schemas.openxmlformats.org/officeDocument/2006/math" xmlns:v="urn:schemas-microsoft-com:vml" xmlns:wp14="http://schemas.microsoft.com/office/word/2010/wordprocessingDrawing" xmlns:wp="http://schemas.openxmlformats.org/drawingml/2006/wordprocessingDrawing" xmlns:w10="urn:schemas-microsoft-com:office:word" xmlns:w="http://schemas.openxmlformats.org/wordprocessingml/2006/main" xmlns:w14="http://schemas.microsoft.com/office/word/2010/wordml" xmlns:w15="http://schemas.microsoft.com/office/word/2012/wordml" xmlns:wpg="http://schemas.microsoft.com/office/word/2010/wordprocessingGroup" xmlns:wpi="http://schemas.microsoft.com/office/word/2010/wordprocessingInk" xmlns:wne="http://schemas.microsoft.com/office/word/2006/wordml" xmlns:wps="http://schemas.microsoft.com/office/word/2010/wordprocessingShape" mc:Ignorable="w14 w15 wp14">
+  <w:p>
+    <w:pPr>
+      <w:pStyle w:val="Header"/>
       <w:ind w:left="-851"/>
       <w:jc w:val="center"/>
       <w:rPr>
@@ -8434,7 +8478,7 @@
         <v:rect id="_x0000_i1025" style="width:56.25pt;height:39pt" o:ole="" o:preferrelative="t" stroked="f">
           <v:imagedata r:id="rId1" o:title=""/>
         </v:rect>
-        <o:OLEObject Type="Embed" ProgID="StaticMetafile" ShapeID="_x0000_i1025" DrawAspect="Content" ObjectID="_1852205444" r:id="rId2"/>
+        <o:OLEObject Type="Embed" ProgID="StaticMetafile" ShapeID="_x0000_i1025" DrawAspect="Content" ObjectID="_1852207207" r:id="rId2"/>
       </w:object>
     </w:r>
     <w:r>
@@ -8468,17 +8512,7 @@
         <w:sz w:val="26"/>
         <w:szCs w:val="26"/>
       </w:rPr>
-      <w:t>2</w:t>
-    </w:r>
-    <w:r>
-      <w:rPr>
-        <w:rFonts w:ascii="Times New Roman" w:hAnsi="Times New Roman" w:cs="Times New Roman"/>
-        <w:b/>
-        <w:color w:val="000000" w:themeColor="text1"/>
-        <w:sz w:val="26"/>
-        <w:szCs w:val="26"/>
-      </w:rPr>
-      <w:t>9</w:t>
+      <w:t>30</w:t>
     </w:r>
     <w:r>
       <w:rPr>
@@ -8498,8 +8532,10 @@
         <w:sz w:val="26"/>
         <w:szCs w:val="26"/>
       </w:rPr>
-      <w:t>TUES</w:t>
+      <w:t>WEDNES</w:t>
     </w:r>
+    <w:bookmarkStart w:id="0" w:name="_GoBack"/>
+    <w:bookmarkEnd w:id="0"/>
     <w:r>
       <w:rPr>
         <w:rFonts w:ascii="Times New Roman" w:hAnsi="Times New Roman" w:cs="Times New Roman"/>
@@ -8521,6 +8557,16 @@
       <w:t>)</w:t>
     </w:r>
   </w:p>
+  <w:p>
+    <w:pPr>
+      <w:pStyle w:val="Header"/>
+    </w:pPr>
+  </w:p>
+</w:hdr>
+</file>
+
+<file path=word/header3.xml><?xml version="1.0" encoding="utf-8"?>
+<w:hdr xmlns:wpc="http://schemas.microsoft.com/office/word/2010/wordprocessingCanvas" xmlns:mc="http://schemas.openxmlformats.org/markup-compatibility/2006" xmlns:o="urn:schemas-microsoft-com:office:office" xmlns:r="http://schemas.openxmlformats.org/officeDocument/2006/relationships" xmlns:m="http://schemas.openxmlformats.org/officeDocument/2006/math" xmlns:v="urn:schemas-microsoft-com:vml" xmlns:wp14="http://schemas.microsoft.com/office/word/2010/wordprocessingDrawing" xmlns:wp="http://schemas.openxmlformats.org/drawingml/2006/wordprocessingDrawing" xmlns:w10="urn:schemas-microsoft-com:office:word" xmlns:w="http://schemas.openxmlformats.org/wordprocessingml/2006/main" xmlns:w14="http://schemas.microsoft.com/office/word/2010/wordml" xmlns:w15="http://schemas.microsoft.com/office/word/2012/wordml" xmlns:wpg="http://schemas.microsoft.com/office/word/2010/wordprocessingGroup" xmlns:wpi="http://schemas.microsoft.com/office/word/2010/wordprocessingInk" xmlns:wne="http://schemas.microsoft.com/office/word/2006/wordml" xmlns:wps="http://schemas.microsoft.com/office/word/2010/wordprocessingShape" mc:Ignorable="w14 w15 wp14">
   <w:p>
     <w:pPr>
       <w:pStyle w:val="Header"/>

</xml_diff>

<commit_message>
Sync - 2026-09-30 16:38
</commit_message>
<xml_diff>
--- a/files/Daily_Helicopter_Schedule.docx
+++ b/files/Daily_Helicopter_Schedule.docx
@@ -4778,6 +4778,14 @@
                 <w:szCs w:val="26"/>
               </w:rPr>
             </w:pPr>
+            <w:r>
+              <w:rPr>
+                <w:rFonts w:ascii="Calibri" w:eastAsia="Calibri" w:hAnsi="Calibri" w:cs="Calibri"/>
+                <w:sz w:val="26"/>
+                <w:szCs w:val="26"/>
+              </w:rPr>
+              <w:t>HEERA</w:t>
+            </w:r>
           </w:p>
         </w:tc>
         <w:tc>
@@ -6375,14 +6383,6 @@
                 <w:sz w:val="24"/>
               </w:rPr>
               <w:t xml:space="preserve">WAITING:  </w:t>
-            </w:r>
-            <w:r>
-              <w:rPr>
-                <w:rFonts w:ascii="Calibri" w:eastAsia="Calibri" w:hAnsi="Calibri" w:cs="Calibri"/>
-                <w:sz w:val="26"/>
-                <w:szCs w:val="26"/>
-              </w:rPr>
-              <w:t>SMRT</w:t>
             </w:r>
           </w:p>
         </w:tc>
@@ -6404,7 +6404,6 @@
           <w:b/>
           <w:sz w:val="24"/>
         </w:rPr>
-        <w:lastRenderedPageBreak/>
         <w:t xml:space="preserve">NOTE: </w:t>
       </w:r>
       <w:r>
@@ -6465,7 +6464,17 @@
           <w:b/>
           <w:sz w:val="24"/>
         </w:rPr>
-        <w:t>Also please check Crew boat schedule for Contract crew.</w:t>
+        <w:t>Also please chec</w:t>
+      </w:r>
+      <w:bookmarkStart w:id="0" w:name="_GoBack"/>
+      <w:bookmarkEnd w:id="0"/>
+      <w:r>
+        <w:rPr>
+          <w:rFonts w:ascii="Calibri" w:eastAsia="Calibri" w:hAnsi="Calibri" w:cs="Calibri"/>
+          <w:b/>
+          <w:sz w:val="24"/>
+        </w:rPr>
+        <w:t>k Crew boat schedule for Contract crew.</w:t>
       </w:r>
     </w:p>
     <w:p>
@@ -6491,6 +6500,7 @@
           <w:color w:val="2E74B5"/>
           <w:sz w:val="20"/>
         </w:rPr>
+        <w:lastRenderedPageBreak/>
         <w:tab/>
       </w:r>
     </w:p>
@@ -7821,8 +7831,6 @@
           <w:sz w:val="24"/>
         </w:rPr>
       </w:pPr>
-      <w:bookmarkStart w:id="0" w:name="_GoBack"/>
-      <w:bookmarkEnd w:id="0"/>
     </w:p>
     <w:p>
       <w:pPr>
@@ -7951,7 +7959,7 @@
         <v:rect id="_x0000_i1025" style="width:56.25pt;height:39pt" o:ole="" o:preferrelative="t" stroked="f">
           <v:imagedata r:id="rId1" o:title=""/>
         </v:rect>
-        <o:OLEObject Type="Embed" ProgID="StaticMetafile" ShapeID="_x0000_i1025" DrawAspect="Content" ObjectID="_1852289172" r:id="rId2"/>
+        <o:OLEObject Type="Embed" ProgID="StaticMetafile" ShapeID="_x0000_i1025" DrawAspect="Content" ObjectID="_1852290027" r:id="rId2"/>
       </w:object>
     </w:r>
     <w:r>

</xml_diff>

<commit_message>
Sync - 2026-10-02 17:44
</commit_message>
<xml_diff>
--- a/files/Daily_Helicopter_Schedule.docx
+++ b/files/Daily_Helicopter_Schedule.docx
@@ -604,7 +604,23 @@
                 <w:sz w:val="26"/>
                 <w:szCs w:val="26"/>
               </w:rPr>
-              <w:t>BLQ (D)</w:t>
+              <w:t>BLQ</w:t>
+            </w:r>
+            <w:r>
+              <w:rPr>
+                <w:rFonts w:ascii="Calibri" w:eastAsia="Calibri" w:hAnsi="Calibri" w:cs="Calibri"/>
+                <w:sz w:val="26"/>
+                <w:szCs w:val="26"/>
+              </w:rPr>
+              <w:t xml:space="preserve"> </w:t>
+            </w:r>
+            <w:r>
+              <w:rPr>
+                <w:rFonts w:ascii="Calibri" w:eastAsia="Calibri" w:hAnsi="Calibri" w:cs="Calibri"/>
+                <w:sz w:val="26"/>
+                <w:szCs w:val="26"/>
+              </w:rPr>
+              <w:t>(D)</w:t>
             </w:r>
           </w:p>
         </w:tc>
@@ -674,7 +690,7 @@
                 <w:sz w:val="26"/>
                 <w:szCs w:val="26"/>
               </w:rPr>
-              <w:t>GVT</w:t>
+              <w:t>NA</w:t>
             </w:r>
           </w:p>
         </w:tc>
@@ -1174,7 +1190,7 @@
                 <w:sz w:val="26"/>
                 <w:szCs w:val="26"/>
               </w:rPr>
-              <w:t>RRJ</w:t>
+              <w:t>GVT</w:t>
             </w:r>
           </w:p>
         </w:tc>
@@ -1424,7 +1440,7 @@
                 <w:sz w:val="26"/>
                 <w:szCs w:val="26"/>
               </w:rPr>
-              <w:t>RRO</w:t>
+              <w:t>RRJ</w:t>
             </w:r>
           </w:p>
         </w:tc>
@@ -1666,7 +1682,15 @@
                 <w:sz w:val="26"/>
                 <w:szCs w:val="26"/>
               </w:rPr>
-              <w:t>HF (PM)</w:t>
+              <w:t>BLQ</w:t>
+            </w:r>
+            <w:r>
+              <w:rPr>
+                <w:rFonts w:ascii="Calibri" w:eastAsia="Calibri" w:hAnsi="Calibri" w:cs="Calibri"/>
+                <w:sz w:val="26"/>
+                <w:szCs w:val="26"/>
+              </w:rPr>
+              <w:t xml:space="preserve"> (PM)</w:t>
             </w:r>
           </w:p>
         </w:tc>
@@ -1701,7 +1725,7 @@
                 <w:sz w:val="26"/>
                 <w:szCs w:val="26"/>
               </w:rPr>
-              <w:t>NA</w:t>
+              <w:t>GVHL 169</w:t>
             </w:r>
           </w:p>
         </w:tc>
@@ -1736,7 +1760,7 @@
                 <w:sz w:val="26"/>
                 <w:szCs w:val="26"/>
               </w:rPr>
-              <w:t>NA</w:t>
+              <w:t>RRK</w:t>
             </w:r>
           </w:p>
         </w:tc>
@@ -1771,8 +1795,10 @@
                 <w:sz w:val="26"/>
                 <w:szCs w:val="26"/>
               </w:rPr>
-              <w:t>00</w:t>
-            </w:r>
+              <w:t>06</w:t>
+            </w:r>
+            <w:bookmarkStart w:id="0" w:name="_GoBack"/>
+            <w:bookmarkEnd w:id="0"/>
           </w:p>
         </w:tc>
       </w:tr>
@@ -2267,7 +2293,7 @@
                 <w:sz w:val="26"/>
                 <w:szCs w:val="26"/>
               </w:rPr>
-              <w:t>RRK</w:t>
+              <w:t>RRO</w:t>
             </w:r>
           </w:p>
         </w:tc>
@@ -3068,7 +3094,7 @@
                 <w:sz w:val="26"/>
                 <w:szCs w:val="26"/>
               </w:rPr>
-              <w:t>BPB</w:t>
+              <w:t>PANNA</w:t>
             </w:r>
           </w:p>
         </w:tc>
@@ -3131,7 +3157,7 @@
                 <w:sz w:val="26"/>
                 <w:szCs w:val="26"/>
               </w:rPr>
-              <w:t>RRL</w:t>
+              <w:t>RRK</w:t>
             </w:r>
           </w:p>
         </w:tc>
@@ -3297,17 +3323,19 @@
               <w:jc w:val="center"/>
               <w:rPr>
                 <w:rFonts w:ascii="Calibri" w:eastAsia="Calibri" w:hAnsi="Calibri" w:cs="Calibri"/>
-                <w:sz w:val="26"/>
-                <w:szCs w:val="26"/>
-              </w:rPr>
-            </w:pPr>
-            <w:r>
-              <w:rPr>
-                <w:rFonts w:ascii="Calibri" w:eastAsia="Calibri" w:hAnsi="Calibri" w:cs="Calibri"/>
-                <w:sz w:val="26"/>
-                <w:szCs w:val="26"/>
-              </w:rPr>
-              <w:t>BPB</w:t>
+                <w:b/>
+                <w:sz w:val="26"/>
+                <w:szCs w:val="26"/>
+              </w:rPr>
+            </w:pPr>
+            <w:r>
+              <w:rPr>
+                <w:rFonts w:ascii="Calibri" w:eastAsia="Calibri" w:hAnsi="Calibri" w:cs="Calibri"/>
+                <w:b/>
+                <w:sz w:val="26"/>
+                <w:szCs w:val="26"/>
+              </w:rPr>
+              <w:t>NA</w:t>
             </w:r>
           </w:p>
         </w:tc>
@@ -3547,10 +3575,11 @@
             <w:r>
               <w:rPr>
                 <w:rFonts w:ascii="Calibri" w:eastAsia="Calibri" w:hAnsi="Calibri" w:cs="Calibri"/>
-                <w:sz w:val="26"/>
-                <w:szCs w:val="26"/>
-              </w:rPr>
-              <w:t>HEERA</w:t>
+                <w:b/>
+                <w:sz w:val="26"/>
+                <w:szCs w:val="26"/>
+              </w:rPr>
+              <w:t>NA</w:t>
             </w:r>
           </w:p>
         </w:tc>
@@ -4078,7 +4107,7 @@
                 <w:sz w:val="26"/>
                 <w:szCs w:val="26"/>
               </w:rPr>
-              <w:t>ICP</w:t>
+              <w:t>SRAT</w:t>
             </w:r>
           </w:p>
         </w:tc>
@@ -4134,14 +4163,6 @@
                 <w:szCs w:val="26"/>
               </w:rPr>
             </w:pPr>
-            <w:r>
-              <w:rPr>
-                <w:rFonts w:ascii="Calibri" w:eastAsia="Calibri" w:hAnsi="Calibri" w:cs="Calibri"/>
-                <w:sz w:val="26"/>
-                <w:szCs w:val="26"/>
-              </w:rPr>
-              <w:t>HLV</w:t>
-            </w:r>
           </w:p>
         </w:tc>
         <w:tc>
@@ -4550,7 +4571,7 @@
                 <w:sz w:val="28"/>
                 <w:szCs w:val="28"/>
               </w:rPr>
-              <w:t>MNW</w:t>
+              <w:t>AS2</w:t>
             </w:r>
           </w:p>
         </w:tc>
@@ -4606,14 +4627,6 @@
                 <w:szCs w:val="26"/>
               </w:rPr>
             </w:pPr>
-            <w:r>
-              <w:rPr>
-                <w:rFonts w:ascii="Calibri" w:eastAsia="Calibri" w:hAnsi="Calibri" w:cs="Calibri"/>
-                <w:sz w:val="26"/>
-                <w:szCs w:val="26"/>
-              </w:rPr>
-              <w:t>HLV</w:t>
-            </w:r>
           </w:p>
         </w:tc>
         <w:tc>
@@ -4784,7 +4797,15 @@
                 <w:sz w:val="26"/>
                 <w:szCs w:val="26"/>
               </w:rPr>
-              <w:t>HEERA</w:t>
+              <w:t>ADM</w:t>
+            </w:r>
+            <w:r>
+              <w:rPr>
+                <w:rFonts w:ascii="Calibri" w:eastAsia="Calibri" w:hAnsi="Calibri" w:cs="Calibri"/>
+                <w:sz w:val="26"/>
+                <w:szCs w:val="26"/>
+              </w:rPr>
+              <w:t>9</w:t>
             </w:r>
           </w:p>
         </w:tc>
@@ -4841,14 +4862,6 @@
                 <w:szCs w:val="26"/>
               </w:rPr>
             </w:pPr>
-            <w:r>
-              <w:rPr>
-                <w:rFonts w:ascii="Calibri" w:eastAsia="Calibri" w:hAnsi="Calibri" w:cs="Calibri"/>
-                <w:sz w:val="26"/>
-                <w:szCs w:val="26"/>
-              </w:rPr>
-              <w:t>HLV</w:t>
-            </w:r>
           </w:p>
         </w:tc>
         <w:tc>
@@ -5075,7 +5088,7 @@
                 <w:sz w:val="26"/>
                 <w:szCs w:val="26"/>
               </w:rPr>
-              <w:t>HEERA</w:t>
+              <w:t>SUDA</w:t>
             </w:r>
           </w:p>
         </w:tc>
@@ -5131,14 +5144,6 @@
                 <w:szCs w:val="26"/>
               </w:rPr>
             </w:pPr>
-            <w:r>
-              <w:rPr>
-                <w:rFonts w:ascii="Calibri" w:eastAsia="Calibri" w:hAnsi="Calibri" w:cs="Calibri"/>
-                <w:sz w:val="26"/>
-                <w:szCs w:val="26"/>
-              </w:rPr>
-              <w:t>HLU</w:t>
-            </w:r>
           </w:p>
         </w:tc>
         <w:tc>
@@ -5310,7 +5315,7 @@
                 <w:sz w:val="26"/>
                 <w:szCs w:val="26"/>
               </w:rPr>
-              <w:t>SUDA</w:t>
+              <w:t>AD10</w:t>
             </w:r>
           </w:p>
         </w:tc>
@@ -5366,14 +5371,6 @@
                 <w:szCs w:val="26"/>
               </w:rPr>
             </w:pPr>
-            <w:r>
-              <w:rPr>
-                <w:rFonts w:ascii="Calibri" w:eastAsia="Calibri" w:hAnsi="Calibri" w:cs="Calibri"/>
-                <w:sz w:val="26"/>
-                <w:szCs w:val="26"/>
-              </w:rPr>
-              <w:t>HLH</w:t>
-            </w:r>
           </w:p>
         </w:tc>
         <w:tc>
@@ -5545,7 +5542,7 @@
                 <w:sz w:val="26"/>
                 <w:szCs w:val="26"/>
               </w:rPr>
-              <w:t>SHP</w:t>
+              <w:t>SSAK</w:t>
             </w:r>
           </w:p>
         </w:tc>
@@ -5601,14 +5598,6 @@
                 <w:szCs w:val="26"/>
               </w:rPr>
             </w:pPr>
-            <w:r>
-              <w:rPr>
-                <w:rFonts w:ascii="Calibri" w:eastAsia="Calibri" w:hAnsi="Calibri" w:cs="Calibri"/>
-                <w:sz w:val="26"/>
-                <w:szCs w:val="26"/>
-              </w:rPr>
-              <w:t>HNB</w:t>
-            </w:r>
           </w:p>
         </w:tc>
         <w:tc>
@@ -5780,7 +5769,7 @@
                 <w:sz w:val="26"/>
                 <w:szCs w:val="26"/>
               </w:rPr>
-              <w:t>WIN</w:t>
+              <w:t>DISC1</w:t>
             </w:r>
           </w:p>
         </w:tc>
@@ -5843,14 +5832,6 @@
                 <w:szCs w:val="26"/>
               </w:rPr>
             </w:pPr>
-            <w:r>
-              <w:rPr>
-                <w:rFonts w:ascii="Calibri" w:eastAsia="Calibri" w:hAnsi="Calibri" w:cs="Calibri"/>
-                <w:sz w:val="26"/>
-                <w:szCs w:val="26"/>
-              </w:rPr>
-              <w:t>HLU</w:t>
-            </w:r>
           </w:p>
         </w:tc>
         <w:tc>
@@ -6022,7 +6003,7 @@
                 <w:sz w:val="26"/>
                 <w:szCs w:val="26"/>
               </w:rPr>
-              <w:t>AS1</w:t>
+              <w:t>JXLR</w:t>
             </w:r>
           </w:p>
         </w:tc>
@@ -6077,248 +6058,6 @@
                 <w:szCs w:val="26"/>
               </w:rPr>
             </w:pPr>
-            <w:r>
-              <w:rPr>
-                <w:rFonts w:ascii="Calibri" w:eastAsia="Calibri" w:hAnsi="Calibri" w:cs="Calibri"/>
-                <w:sz w:val="26"/>
-                <w:szCs w:val="26"/>
-              </w:rPr>
-              <w:t>HLH</w:t>
-            </w:r>
-          </w:p>
-        </w:tc>
-        <w:tc>
-          <w:tcPr>
-            <w:tcW w:w="1314" w:type="dxa"/>
-            <w:tcBorders>
-              <w:top w:val="single" w:sz="4" w:space="0" w:color="000000"/>
-              <w:left w:val="single" w:sz="4" w:space="0" w:color="000000"/>
-              <w:bottom w:val="single" w:sz="4" w:space="0" w:color="000000"/>
-              <w:right w:val="single" w:sz="4" w:space="0" w:color="000000"/>
-            </w:tcBorders>
-            <w:shd w:val="clear" w:color="000000" w:fill="FFFFFF"/>
-            <w:tcMar>
-              <w:left w:w="108" w:type="dxa"/>
-              <w:right w:w="108" w:type="dxa"/>
-            </w:tcMar>
-          </w:tcPr>
-          <w:p>
-            <w:pPr>
-              <w:spacing w:after="0" w:line="240" w:lineRule="auto"/>
-              <w:jc w:val="center"/>
-              <w:rPr>
-                <w:rFonts w:ascii="Calibri" w:eastAsia="Calibri" w:hAnsi="Calibri" w:cs="Calibri"/>
-                <w:sz w:val="26"/>
-                <w:szCs w:val="26"/>
-              </w:rPr>
-            </w:pPr>
-          </w:p>
-        </w:tc>
-      </w:tr>
-      <w:tr>
-        <w:trPr>
-          <w:trHeight w:val="337"/>
-        </w:trPr>
-        <w:tc>
-          <w:tcPr>
-            <w:tcW w:w="729" w:type="dxa"/>
-            <w:tcBorders>
-              <w:top w:val="single" w:sz="4" w:space="0" w:color="000000"/>
-              <w:left w:val="single" w:sz="4" w:space="0" w:color="000000"/>
-              <w:bottom w:val="single" w:sz="4" w:space="0" w:color="000000"/>
-              <w:right w:val="single" w:sz="4" w:space="0" w:color="000000"/>
-            </w:tcBorders>
-            <w:shd w:val="clear" w:color="000000" w:fill="FFFFFF"/>
-            <w:tcMar>
-              <w:left w:w="108" w:type="dxa"/>
-              <w:right w:w="108" w:type="dxa"/>
-            </w:tcMar>
-            <w:vAlign w:val="center"/>
-          </w:tcPr>
-          <w:p>
-            <w:pPr>
-              <w:spacing w:after="0" w:line="240" w:lineRule="auto"/>
-              <w:jc w:val="center"/>
-              <w:rPr>
-                <w:rFonts w:ascii="Calibri" w:eastAsia="Calibri" w:hAnsi="Calibri" w:cs="Calibri"/>
-                <w:sz w:val="26"/>
-                <w:szCs w:val="26"/>
-              </w:rPr>
-            </w:pPr>
-            <w:r>
-              <w:rPr>
-                <w:rFonts w:ascii="Calibri" w:eastAsia="Calibri" w:hAnsi="Calibri" w:cs="Calibri"/>
-                <w:sz w:val="26"/>
-                <w:szCs w:val="26"/>
-              </w:rPr>
-              <w:t>6</w:t>
-            </w:r>
-          </w:p>
-        </w:tc>
-        <w:tc>
-          <w:tcPr>
-            <w:tcW w:w="1606" w:type="dxa"/>
-            <w:tcBorders>
-              <w:top w:val="single" w:sz="4" w:space="0" w:color="000000"/>
-              <w:left w:val="single" w:sz="4" w:space="0" w:color="000000"/>
-              <w:bottom w:val="single" w:sz="4" w:space="0" w:color="000000"/>
-              <w:right w:val="single" w:sz="4" w:space="0" w:color="000000"/>
-            </w:tcBorders>
-            <w:shd w:val="clear" w:color="000000" w:fill="FFFFFF"/>
-            <w:tcMar>
-              <w:left w:w="108" w:type="dxa"/>
-              <w:right w:w="108" w:type="dxa"/>
-            </w:tcMar>
-          </w:tcPr>
-          <w:p>
-            <w:pPr>
-              <w:spacing w:after="0" w:line="240" w:lineRule="auto"/>
-              <w:jc w:val="center"/>
-              <w:rPr>
-                <w:rFonts w:ascii="Calibri" w:eastAsia="Calibri" w:hAnsi="Calibri" w:cs="Calibri"/>
-                <w:sz w:val="26"/>
-                <w:szCs w:val="26"/>
-              </w:rPr>
-            </w:pPr>
-            <w:r>
-              <w:rPr>
-                <w:rFonts w:ascii="Calibri" w:eastAsia="Calibri" w:hAnsi="Calibri" w:cs="Calibri"/>
-                <w:sz w:val="26"/>
-                <w:szCs w:val="26"/>
-              </w:rPr>
-              <w:t>10:00</w:t>
-            </w:r>
-          </w:p>
-        </w:tc>
-        <w:tc>
-          <w:tcPr>
-            <w:tcW w:w="1460" w:type="dxa"/>
-            <w:tcBorders>
-              <w:top w:val="single" w:sz="4" w:space="0" w:color="000000"/>
-              <w:left w:val="single" w:sz="4" w:space="0" w:color="000000"/>
-              <w:bottom w:val="single" w:sz="4" w:space="0" w:color="000000"/>
-              <w:right w:val="single" w:sz="4" w:space="0" w:color="000000"/>
-            </w:tcBorders>
-            <w:shd w:val="clear" w:color="000000" w:fill="FFFFFF"/>
-            <w:tcMar>
-              <w:left w:w="108" w:type="dxa"/>
-              <w:right w:w="108" w:type="dxa"/>
-            </w:tcMar>
-          </w:tcPr>
-          <w:p>
-            <w:pPr>
-              <w:spacing w:after="0" w:line="240" w:lineRule="auto"/>
-              <w:jc w:val="center"/>
-              <w:rPr>
-                <w:rFonts w:ascii="Calibri" w:eastAsia="Calibri" w:hAnsi="Calibri" w:cs="Calibri"/>
-                <w:sz w:val="26"/>
-                <w:szCs w:val="26"/>
-              </w:rPr>
-            </w:pPr>
-            <w:r>
-              <w:rPr>
-                <w:rFonts w:ascii="Calibri" w:eastAsia="Calibri" w:hAnsi="Calibri" w:cs="Calibri"/>
-                <w:sz w:val="26"/>
-                <w:szCs w:val="26"/>
-              </w:rPr>
-              <w:t>11:30</w:t>
-            </w:r>
-          </w:p>
-        </w:tc>
-        <w:tc>
-          <w:tcPr>
-            <w:tcW w:w="2523" w:type="dxa"/>
-            <w:tcBorders>
-              <w:top w:val="single" w:sz="4" w:space="0" w:color="000000"/>
-              <w:left w:val="single" w:sz="4" w:space="0" w:color="000000"/>
-              <w:bottom w:val="single" w:sz="4" w:space="0" w:color="000000"/>
-              <w:right w:val="single" w:sz="4" w:space="0" w:color="000000"/>
-            </w:tcBorders>
-            <w:shd w:val="clear" w:color="000000" w:fill="FFFFFF"/>
-            <w:tcMar>
-              <w:left w:w="108" w:type="dxa"/>
-              <w:right w:w="108" w:type="dxa"/>
-            </w:tcMar>
-          </w:tcPr>
-          <w:p>
-            <w:pPr>
-              <w:spacing w:after="0" w:line="240" w:lineRule="auto"/>
-              <w:jc w:val="center"/>
-              <w:rPr>
-                <w:rFonts w:ascii="Calibri" w:eastAsia="Calibri" w:hAnsi="Calibri" w:cs="Calibri"/>
-                <w:sz w:val="26"/>
-                <w:szCs w:val="26"/>
-              </w:rPr>
-            </w:pPr>
-            <w:r>
-              <w:rPr>
-                <w:rFonts w:ascii="Calibri" w:eastAsia="Calibri" w:hAnsi="Calibri" w:cs="Calibri"/>
-                <w:sz w:val="26"/>
-                <w:szCs w:val="26"/>
-              </w:rPr>
-              <w:t>JSUP</w:t>
-            </w:r>
-          </w:p>
-        </w:tc>
-        <w:tc>
-          <w:tcPr>
-            <w:tcW w:w="1554" w:type="dxa"/>
-            <w:tcBorders>
-              <w:top w:val="single" w:sz="4" w:space="0" w:color="000000"/>
-              <w:left w:val="single" w:sz="4" w:space="0" w:color="000000"/>
-              <w:bottom w:val="single" w:sz="4" w:space="0" w:color="000000"/>
-              <w:right w:val="single" w:sz="4" w:space="0" w:color="000000"/>
-            </w:tcBorders>
-            <w:shd w:val="clear" w:color="000000" w:fill="FFFFFF"/>
-            <w:tcMar>
-              <w:left w:w="108" w:type="dxa"/>
-              <w:right w:w="108" w:type="dxa"/>
-            </w:tcMar>
-          </w:tcPr>
-          <w:p>
-            <w:pPr>
-              <w:spacing w:after="0" w:line="240" w:lineRule="auto"/>
-              <w:rPr>
-                <w:rFonts w:ascii="Calibri" w:eastAsia="Calibri" w:hAnsi="Calibri" w:cs="Calibri"/>
-                <w:sz w:val="26"/>
-                <w:szCs w:val="26"/>
-              </w:rPr>
-            </w:pPr>
-          </w:p>
-        </w:tc>
-        <w:tc>
-          <w:tcPr>
-            <w:tcW w:w="1302" w:type="dxa"/>
-            <w:tcBorders>
-              <w:top w:val="single" w:sz="4" w:space="0" w:color="000000"/>
-              <w:left w:val="single" w:sz="4" w:space="0" w:color="000000"/>
-              <w:bottom w:val="single" w:sz="4" w:space="0" w:color="000000"/>
-              <w:right w:val="single" w:sz="4" w:space="0" w:color="000000"/>
-            </w:tcBorders>
-            <w:shd w:val="clear" w:color="000000" w:fill="FFFFFF"/>
-            <w:tcMar>
-              <w:left w:w="108" w:type="dxa"/>
-              <w:right w:w="108" w:type="dxa"/>
-            </w:tcMar>
-          </w:tcPr>
-          <w:p>
-            <w:pPr>
-              <w:spacing w:after="0" w:line="240" w:lineRule="auto"/>
-              <w:jc w:val="center"/>
-              <w:rPr>
-                <w:rFonts w:ascii="Calibri" w:eastAsia="Calibri" w:hAnsi="Calibri" w:cs="Calibri"/>
-                <w:sz w:val="26"/>
-                <w:szCs w:val="26"/>
-              </w:rPr>
-            </w:pPr>
-            <w:r>
-              <w:rPr>
-                <w:rFonts w:ascii="Calibri" w:eastAsia="Calibri" w:hAnsi="Calibri" w:cs="Calibri"/>
-                <w:sz w:val="26"/>
-                <w:szCs w:val="26"/>
-              </w:rPr>
-              <w:t>HNB</w:t>
-            </w:r>
           </w:p>
         </w:tc>
         <w:tc>
@@ -6428,25 +6167,33 @@
           <w:b/>
           <w:sz w:val="24"/>
         </w:rPr>
-        <w:t xml:space="preserve"> Samrat</w:t>
+        <w:t xml:space="preserve"> </w:t>
       </w:r>
-      <w:proofErr w:type="gramStart"/>
+      <w:proofErr w:type="spellStart"/>
       <w:r>
         <w:rPr>
           <w:rFonts w:ascii="Calibri" w:eastAsia="Calibri" w:hAnsi="Calibri" w:cs="Calibri"/>
           <w:b/>
           <w:sz w:val="24"/>
         </w:rPr>
-        <w:t>,AS1,AS2</w:t>
+        <w:t>Samrat</w:t>
       </w:r>
-      <w:proofErr w:type="gramEnd"/>
+      <w:proofErr w:type="spellEnd"/>
       <w:r>
         <w:rPr>
           <w:rFonts w:ascii="Calibri" w:eastAsia="Calibri" w:hAnsi="Calibri" w:cs="Calibri"/>
           <w:b/>
           <w:sz w:val="24"/>
         </w:rPr>
-        <w:t xml:space="preserve">  CC under review.</w:t>
+        <w:t>, AS1, AS2 CC</w:t>
+      </w:r>
+      <w:r>
+        <w:rPr>
+          <w:rFonts w:ascii="Calibri" w:eastAsia="Calibri" w:hAnsi="Calibri" w:cs="Calibri"/>
+          <w:b/>
+          <w:sz w:val="24"/>
+        </w:rPr>
+        <w:t xml:space="preserve"> under review.</w:t>
       </w:r>
     </w:p>
     <w:p>
@@ -6464,17 +6211,7 @@
           <w:b/>
           <w:sz w:val="24"/>
         </w:rPr>
-        <w:t>Also please chec</w:t>
-      </w:r>
-      <w:bookmarkStart w:id="0" w:name="_GoBack"/>
-      <w:bookmarkEnd w:id="0"/>
-      <w:r>
-        <w:rPr>
-          <w:rFonts w:ascii="Calibri" w:eastAsia="Calibri" w:hAnsi="Calibri" w:cs="Calibri"/>
-          <w:b/>
-          <w:sz w:val="24"/>
-        </w:rPr>
-        <w:t>k Crew boat schedule for Contract crew.</w:t>
+        <w:t>Also please check Crew boat schedule for Contract crew.</w:t>
       </w:r>
     </w:p>
     <w:p>
@@ -6500,7 +6237,6 @@
           <w:color w:val="2E74B5"/>
           <w:sz w:val="20"/>
         </w:rPr>
-        <w:lastRenderedPageBreak/>
         <w:tab/>
       </w:r>
     </w:p>
@@ -7056,7 +6792,7 @@
                 <w:sz w:val="26"/>
                 <w:szCs w:val="26"/>
               </w:rPr>
-              <w:t>SJOT</w:t>
+              <w:t>CHRU+TAPTI PROD</w:t>
             </w:r>
           </w:p>
         </w:tc>
@@ -7278,7 +7014,7 @@
                 <w:sz w:val="26"/>
                 <w:szCs w:val="26"/>
               </w:rPr>
-              <w:t>TAPTI PROD</w:t>
+              <w:t>SJOT</w:t>
             </w:r>
           </w:p>
         </w:tc>
@@ -7959,7 +7695,7 @@
         <v:rect id="_x0000_i1025" style="width:56.25pt;height:39pt" o:ole="" o:preferrelative="t" stroked="f">
           <v:imagedata r:id="rId1" o:title=""/>
         </v:rect>
-        <o:OLEObject Type="Embed" ProgID="StaticMetafile" ShapeID="_x0000_i1025" DrawAspect="Content" ObjectID="_1852290027" r:id="rId2"/>
+        <o:OLEObject Type="Embed" ProgID="StaticMetafile" ShapeID="_x0000_i1025" DrawAspect="Content" ObjectID="_1852466575" r:id="rId2"/>
       </w:object>
     </w:r>
     <w:r>
@@ -7993,7 +7729,17 @@
         <w:sz w:val="26"/>
         <w:szCs w:val="26"/>
       </w:rPr>
-      <w:t>01.10</w:t>
+      <w:t>03</w:t>
+    </w:r>
+    <w:r>
+      <w:rPr>
+        <w:rFonts w:ascii="Times New Roman" w:hAnsi="Times New Roman" w:cs="Times New Roman"/>
+        <w:b/>
+        <w:color w:val="000000" w:themeColor="text1"/>
+        <w:sz w:val="26"/>
+        <w:szCs w:val="26"/>
+      </w:rPr>
+      <w:t>.10</w:t>
     </w:r>
     <w:r>
       <w:rPr>
@@ -8013,7 +7759,7 @@
         <w:sz w:val="26"/>
         <w:szCs w:val="26"/>
       </w:rPr>
-      <w:t>THURS</w:t>
+      <w:t>SATUR</w:t>
     </w:r>
     <w:r>
       <w:rPr>

</xml_diff>

<commit_message>
Sync - 2026-10-04 12:22
</commit_message>
<xml_diff>
--- a/files/Daily_Helicopter_Schedule.docx
+++ b/files/Daily_Helicopter_Schedule.docx
@@ -604,15 +604,7 @@
                 <w:sz w:val="26"/>
                 <w:szCs w:val="26"/>
               </w:rPr>
-              <w:t>BLQ</w:t>
-            </w:r>
-            <w:r>
-              <w:rPr>
-                <w:rFonts w:ascii="Calibri" w:eastAsia="Calibri" w:hAnsi="Calibri" w:cs="Calibri"/>
-                <w:sz w:val="26"/>
-                <w:szCs w:val="26"/>
-              </w:rPr>
-              <w:t xml:space="preserve"> </w:t>
+              <w:t xml:space="preserve">BLQ </w:t>
             </w:r>
             <w:r>
               <w:rPr>
@@ -690,7 +682,7 @@
                 <w:sz w:val="26"/>
                 <w:szCs w:val="26"/>
               </w:rPr>
-              <w:t>NA</w:t>
+              <w:t>GVT</w:t>
             </w:r>
           </w:p>
         </w:tc>
@@ -940,7 +932,7 @@
                 <w:sz w:val="26"/>
                 <w:szCs w:val="26"/>
               </w:rPr>
-              <w:t>RRN</w:t>
+              <w:t>RRK</w:t>
             </w:r>
           </w:p>
         </w:tc>
@@ -1190,7 +1182,7 @@
                 <w:sz w:val="26"/>
                 <w:szCs w:val="26"/>
               </w:rPr>
-              <w:t>GVT</w:t>
+              <w:t>RRN</w:t>
             </w:r>
           </w:p>
         </w:tc>
@@ -1532,7 +1524,7 @@
       </w:tr>
       <w:tr>
         <w:trPr>
-          <w:trHeight w:val="337"/>
+          <w:trHeight w:val="102"/>
         </w:trPr>
         <w:tc>
           <w:tcPr>
@@ -1682,7 +1674,7 @@
                 <w:sz w:val="26"/>
                 <w:szCs w:val="26"/>
               </w:rPr>
-              <w:t>BLQ</w:t>
+              <w:t>HF</w:t>
             </w:r>
             <w:r>
               <w:rPr>
@@ -1725,7 +1717,7 @@
                 <w:sz w:val="26"/>
                 <w:szCs w:val="26"/>
               </w:rPr>
-              <w:t>GVHL 169</w:t>
+              <w:t>NA</w:t>
             </w:r>
           </w:p>
         </w:tc>
@@ -1760,7 +1752,7 @@
                 <w:sz w:val="26"/>
                 <w:szCs w:val="26"/>
               </w:rPr>
-              <w:t>RRK</w:t>
+              <w:t>NA</w:t>
             </w:r>
           </w:p>
         </w:tc>
@@ -1797,8 +1789,6 @@
               </w:rPr>
               <w:t>06</w:t>
             </w:r>
-            <w:bookmarkStart w:id="0" w:name="_GoBack"/>
-            <w:bookmarkEnd w:id="0"/>
           </w:p>
         </w:tc>
       </w:tr>
@@ -3091,10 +3081,11 @@
             <w:r>
               <w:rPr>
                 <w:rFonts w:ascii="Calibri" w:eastAsia="Calibri" w:hAnsi="Calibri" w:cs="Calibri"/>
-                <w:sz w:val="26"/>
-                <w:szCs w:val="26"/>
-              </w:rPr>
-              <w:t>PANNA</w:t>
+                <w:b/>
+                <w:sz w:val="26"/>
+                <w:szCs w:val="26"/>
+              </w:rPr>
+              <w:t>NA</w:t>
             </w:r>
           </w:p>
         </w:tc>
@@ -3151,14 +3142,6 @@
                 <w:szCs w:val="26"/>
               </w:rPr>
             </w:pPr>
-            <w:r>
-              <w:rPr>
-                <w:rFonts w:ascii="Calibri" w:eastAsia="Calibri" w:hAnsi="Calibri" w:cs="Calibri"/>
-                <w:sz w:val="26"/>
-                <w:szCs w:val="26"/>
-              </w:rPr>
-              <w:t>RRK</w:t>
-            </w:r>
           </w:p>
         </w:tc>
         <w:tc>
@@ -3392,14 +3375,6 @@
                 <w:szCs w:val="26"/>
               </w:rPr>
             </w:pPr>
-            <w:r>
-              <w:rPr>
-                <w:rFonts w:ascii="Calibri" w:eastAsia="Calibri" w:hAnsi="Calibri" w:cs="Calibri"/>
-                <w:sz w:val="26"/>
-                <w:szCs w:val="26"/>
-              </w:rPr>
-              <w:t>RRL</w:t>
-            </w:r>
           </w:p>
         </w:tc>
         <w:tc>
@@ -3636,14 +3611,6 @@
                 <w:szCs w:val="26"/>
               </w:rPr>
             </w:pPr>
-            <w:r>
-              <w:rPr>
-                <w:rFonts w:ascii="Calibri" w:eastAsia="Calibri" w:hAnsi="Calibri" w:cs="Calibri"/>
-                <w:sz w:val="26"/>
-                <w:szCs w:val="26"/>
-              </w:rPr>
-              <w:t>RRL</w:t>
-            </w:r>
           </w:p>
         </w:tc>
         <w:tc>
@@ -4107,7 +4074,7 @@
                 <w:sz w:val="26"/>
                 <w:szCs w:val="26"/>
               </w:rPr>
-              <w:t>SRAT</w:t>
+              <w:t>SGAV</w:t>
             </w:r>
           </w:p>
         </w:tc>
@@ -4568,10 +4535,10 @@
             <w:r>
               <w:rPr>
                 <w:rFonts w:ascii="Calibri" w:eastAsia="Calibri" w:hAnsi="Calibri" w:cs="Calibri"/>
-                <w:sz w:val="28"/>
-                <w:szCs w:val="28"/>
-              </w:rPr>
-              <w:t>AS2</w:t>
+                <w:sz w:val="26"/>
+                <w:szCs w:val="26"/>
+              </w:rPr>
+              <w:t>SGAV</w:t>
             </w:r>
           </w:p>
         </w:tc>
@@ -4794,18 +4761,9 @@
             <w:r>
               <w:rPr>
                 <w:rFonts w:ascii="Calibri" w:eastAsia="Calibri" w:hAnsi="Calibri" w:cs="Calibri"/>
-                <w:sz w:val="26"/>
-                <w:szCs w:val="26"/>
-              </w:rPr>
-              <w:t>ADM</w:t>
-            </w:r>
-            <w:r>
-              <w:rPr>
-                <w:rFonts w:ascii="Calibri" w:eastAsia="Calibri" w:hAnsi="Calibri" w:cs="Calibri"/>
-                <w:sz w:val="26"/>
-                <w:szCs w:val="26"/>
-              </w:rPr>
-              <w:t>9</w:t>
+                <w:sz w:val="24"/>
+              </w:rPr>
+              <w:t>FDIX</w:t>
             </w:r>
           </w:p>
         </w:tc>
@@ -5085,10 +5043,11 @@
             <w:r>
               <w:rPr>
                 <w:rFonts w:ascii="Calibri" w:eastAsia="Calibri" w:hAnsi="Calibri" w:cs="Calibri"/>
-                <w:sz w:val="26"/>
-                <w:szCs w:val="26"/>
-              </w:rPr>
-              <w:t>SUDA</w:t>
+                <w:b/>
+                <w:sz w:val="26"/>
+                <w:szCs w:val="26"/>
+              </w:rPr>
+              <w:t>NA</w:t>
             </w:r>
           </w:p>
         </w:tc>
@@ -5315,7 +5274,7 @@
                 <w:sz w:val="26"/>
                 <w:szCs w:val="26"/>
               </w:rPr>
-              <w:t>AD10</w:t>
+              <w:t>SUDA</w:t>
             </w:r>
           </w:p>
         </w:tc>
@@ -5542,7 +5501,7 @@
                 <w:sz w:val="26"/>
                 <w:szCs w:val="26"/>
               </w:rPr>
-              <w:t>SSAK</w:t>
+              <w:t>AS1</w:t>
             </w:r>
           </w:p>
         </w:tc>
@@ -5766,10 +5725,11 @@
             <w:r>
               <w:rPr>
                 <w:rFonts w:ascii="Calibri" w:eastAsia="Calibri" w:hAnsi="Calibri" w:cs="Calibri"/>
-                <w:sz w:val="26"/>
-                <w:szCs w:val="26"/>
-              </w:rPr>
-              <w:t>DISC1</w:t>
+                <w:b/>
+                <w:sz w:val="26"/>
+                <w:szCs w:val="26"/>
+              </w:rPr>
+              <w:t>NA</w:t>
             </w:r>
           </w:p>
         </w:tc>
@@ -6003,8 +5963,236 @@
                 <w:sz w:val="26"/>
                 <w:szCs w:val="26"/>
               </w:rPr>
-              <w:t>JXLR</w:t>
-            </w:r>
+              <w:t>VND2</w:t>
+            </w:r>
+          </w:p>
+        </w:tc>
+        <w:tc>
+          <w:tcPr>
+            <w:tcW w:w="1554" w:type="dxa"/>
+            <w:tcBorders>
+              <w:top w:val="single" w:sz="4" w:space="0" w:color="000000"/>
+              <w:left w:val="single" w:sz="4" w:space="0" w:color="000000"/>
+              <w:bottom w:val="single" w:sz="4" w:space="0" w:color="000000"/>
+              <w:right w:val="single" w:sz="4" w:space="0" w:color="000000"/>
+            </w:tcBorders>
+            <w:shd w:val="clear" w:color="000000" w:fill="FFFFFF"/>
+            <w:tcMar>
+              <w:left w:w="108" w:type="dxa"/>
+              <w:right w:w="108" w:type="dxa"/>
+            </w:tcMar>
+          </w:tcPr>
+          <w:p>
+            <w:pPr>
+              <w:spacing w:after="0" w:line="240" w:lineRule="auto"/>
+              <w:rPr>
+                <w:rFonts w:ascii="Calibri" w:eastAsia="Calibri" w:hAnsi="Calibri" w:cs="Calibri"/>
+                <w:sz w:val="26"/>
+                <w:szCs w:val="26"/>
+              </w:rPr>
+            </w:pPr>
+          </w:p>
+        </w:tc>
+        <w:tc>
+          <w:tcPr>
+            <w:tcW w:w="1302" w:type="dxa"/>
+            <w:tcBorders>
+              <w:top w:val="single" w:sz="4" w:space="0" w:color="000000"/>
+              <w:left w:val="single" w:sz="4" w:space="0" w:color="000000"/>
+              <w:bottom w:val="single" w:sz="4" w:space="0" w:color="000000"/>
+              <w:right w:val="single" w:sz="4" w:space="0" w:color="000000"/>
+            </w:tcBorders>
+            <w:shd w:val="clear" w:color="000000" w:fill="FFFFFF"/>
+            <w:tcMar>
+              <w:left w:w="108" w:type="dxa"/>
+              <w:right w:w="108" w:type="dxa"/>
+            </w:tcMar>
+          </w:tcPr>
+          <w:p>
+            <w:pPr>
+              <w:spacing w:after="0" w:line="240" w:lineRule="auto"/>
+              <w:jc w:val="center"/>
+              <w:rPr>
+                <w:rFonts w:ascii="Calibri" w:eastAsia="Calibri" w:hAnsi="Calibri" w:cs="Calibri"/>
+                <w:sz w:val="26"/>
+                <w:szCs w:val="26"/>
+              </w:rPr>
+            </w:pPr>
+          </w:p>
+        </w:tc>
+        <w:tc>
+          <w:tcPr>
+            <w:tcW w:w="1314" w:type="dxa"/>
+            <w:tcBorders>
+              <w:top w:val="single" w:sz="4" w:space="0" w:color="000000"/>
+              <w:left w:val="single" w:sz="4" w:space="0" w:color="000000"/>
+              <w:bottom w:val="single" w:sz="4" w:space="0" w:color="000000"/>
+              <w:right w:val="single" w:sz="4" w:space="0" w:color="000000"/>
+            </w:tcBorders>
+            <w:shd w:val="clear" w:color="000000" w:fill="FFFFFF"/>
+            <w:tcMar>
+              <w:left w:w="108" w:type="dxa"/>
+              <w:right w:w="108" w:type="dxa"/>
+            </w:tcMar>
+          </w:tcPr>
+          <w:p>
+            <w:pPr>
+              <w:spacing w:after="0" w:line="240" w:lineRule="auto"/>
+              <w:jc w:val="center"/>
+              <w:rPr>
+                <w:rFonts w:ascii="Calibri" w:eastAsia="Calibri" w:hAnsi="Calibri" w:cs="Calibri"/>
+                <w:sz w:val="26"/>
+                <w:szCs w:val="26"/>
+              </w:rPr>
+            </w:pPr>
+          </w:p>
+        </w:tc>
+      </w:tr>
+      <w:tr>
+        <w:trPr>
+          <w:trHeight w:val="337"/>
+        </w:trPr>
+        <w:tc>
+          <w:tcPr>
+            <w:tcW w:w="729" w:type="dxa"/>
+            <w:tcBorders>
+              <w:top w:val="single" w:sz="4" w:space="0" w:color="000000"/>
+              <w:left w:val="single" w:sz="4" w:space="0" w:color="000000"/>
+              <w:bottom w:val="single" w:sz="4" w:space="0" w:color="000000"/>
+              <w:right w:val="single" w:sz="4" w:space="0" w:color="000000"/>
+            </w:tcBorders>
+            <w:shd w:val="clear" w:color="000000" w:fill="FFFFFF"/>
+            <w:tcMar>
+              <w:left w:w="108" w:type="dxa"/>
+              <w:right w:w="108" w:type="dxa"/>
+            </w:tcMar>
+            <w:vAlign w:val="center"/>
+          </w:tcPr>
+          <w:p>
+            <w:pPr>
+              <w:spacing w:after="0" w:line="240" w:lineRule="auto"/>
+              <w:jc w:val="center"/>
+              <w:rPr>
+                <w:rFonts w:ascii="Calibri" w:eastAsia="Calibri" w:hAnsi="Calibri" w:cs="Calibri"/>
+                <w:sz w:val="26"/>
+                <w:szCs w:val="26"/>
+              </w:rPr>
+            </w:pPr>
+            <w:r>
+              <w:rPr>
+                <w:rFonts w:ascii="Calibri" w:eastAsia="Calibri" w:hAnsi="Calibri" w:cs="Calibri"/>
+                <w:sz w:val="26"/>
+                <w:szCs w:val="26"/>
+              </w:rPr>
+              <w:t>6</w:t>
+            </w:r>
+          </w:p>
+        </w:tc>
+        <w:tc>
+          <w:tcPr>
+            <w:tcW w:w="1606" w:type="dxa"/>
+            <w:tcBorders>
+              <w:top w:val="single" w:sz="4" w:space="0" w:color="000000"/>
+              <w:left w:val="single" w:sz="4" w:space="0" w:color="000000"/>
+              <w:bottom w:val="single" w:sz="4" w:space="0" w:color="000000"/>
+              <w:right w:val="single" w:sz="4" w:space="0" w:color="000000"/>
+            </w:tcBorders>
+            <w:shd w:val="clear" w:color="000000" w:fill="FFFFFF"/>
+            <w:tcMar>
+              <w:left w:w="108" w:type="dxa"/>
+              <w:right w:w="108" w:type="dxa"/>
+            </w:tcMar>
+          </w:tcPr>
+          <w:p>
+            <w:pPr>
+              <w:spacing w:after="0" w:line="240" w:lineRule="auto"/>
+              <w:jc w:val="center"/>
+              <w:rPr>
+                <w:rFonts w:ascii="Calibri" w:eastAsia="Calibri" w:hAnsi="Calibri" w:cs="Calibri"/>
+                <w:sz w:val="26"/>
+                <w:szCs w:val="26"/>
+              </w:rPr>
+            </w:pPr>
+            <w:r>
+              <w:rPr>
+                <w:rFonts w:ascii="Calibri" w:eastAsia="Calibri" w:hAnsi="Calibri" w:cs="Calibri"/>
+                <w:sz w:val="26"/>
+                <w:szCs w:val="26"/>
+              </w:rPr>
+              <w:t>10:00</w:t>
+            </w:r>
+          </w:p>
+        </w:tc>
+        <w:tc>
+          <w:tcPr>
+            <w:tcW w:w="1460" w:type="dxa"/>
+            <w:tcBorders>
+              <w:top w:val="single" w:sz="4" w:space="0" w:color="000000"/>
+              <w:left w:val="single" w:sz="4" w:space="0" w:color="000000"/>
+              <w:bottom w:val="single" w:sz="4" w:space="0" w:color="000000"/>
+              <w:right w:val="single" w:sz="4" w:space="0" w:color="000000"/>
+            </w:tcBorders>
+            <w:shd w:val="clear" w:color="000000" w:fill="FFFFFF"/>
+            <w:tcMar>
+              <w:left w:w="108" w:type="dxa"/>
+              <w:right w:w="108" w:type="dxa"/>
+            </w:tcMar>
+          </w:tcPr>
+          <w:p>
+            <w:pPr>
+              <w:spacing w:after="0" w:line="240" w:lineRule="auto"/>
+              <w:jc w:val="center"/>
+              <w:rPr>
+                <w:rFonts w:ascii="Calibri" w:eastAsia="Calibri" w:hAnsi="Calibri" w:cs="Calibri"/>
+                <w:sz w:val="26"/>
+                <w:szCs w:val="26"/>
+              </w:rPr>
+            </w:pPr>
+            <w:r>
+              <w:rPr>
+                <w:rFonts w:ascii="Calibri" w:eastAsia="Calibri" w:hAnsi="Calibri" w:cs="Calibri"/>
+                <w:sz w:val="26"/>
+                <w:szCs w:val="26"/>
+              </w:rPr>
+              <w:t>11:30</w:t>
+            </w:r>
+          </w:p>
+        </w:tc>
+        <w:tc>
+          <w:tcPr>
+            <w:tcW w:w="2523" w:type="dxa"/>
+            <w:tcBorders>
+              <w:top w:val="single" w:sz="4" w:space="0" w:color="000000"/>
+              <w:left w:val="single" w:sz="4" w:space="0" w:color="000000"/>
+              <w:bottom w:val="single" w:sz="4" w:space="0" w:color="000000"/>
+              <w:right w:val="single" w:sz="4" w:space="0" w:color="000000"/>
+            </w:tcBorders>
+            <w:shd w:val="clear" w:color="000000" w:fill="FFFFFF"/>
+            <w:tcMar>
+              <w:left w:w="108" w:type="dxa"/>
+              <w:right w:w="108" w:type="dxa"/>
+            </w:tcMar>
+          </w:tcPr>
+          <w:p>
+            <w:pPr>
+              <w:spacing w:after="0" w:line="240" w:lineRule="auto"/>
+              <w:jc w:val="center"/>
+              <w:rPr>
+                <w:rFonts w:ascii="Calibri" w:eastAsia="Calibri" w:hAnsi="Calibri" w:cs="Calibri"/>
+                <w:sz w:val="26"/>
+                <w:szCs w:val="26"/>
+              </w:rPr>
+            </w:pPr>
+            <w:r>
+              <w:rPr>
+                <w:rFonts w:ascii="Calibri" w:eastAsia="Calibri" w:hAnsi="Calibri" w:cs="Calibri"/>
+                <w:sz w:val="26"/>
+                <w:szCs w:val="26"/>
+              </w:rPr>
+              <w:t>ABN4</w:t>
+            </w:r>
+            <w:bookmarkStart w:id="0" w:name="_GoBack"/>
+            <w:bookmarkEnd w:id="0"/>
           </w:p>
         </w:tc>
         <w:tc>
@@ -6123,10 +6311,65 @@
               </w:rPr>
               <w:t xml:space="preserve">WAITING:  </w:t>
             </w:r>
+            <w:r>
+              <w:rPr>
+                <w:rFonts w:ascii="Calibri" w:eastAsia="Calibri" w:hAnsi="Calibri" w:cs="Calibri"/>
+                <w:sz w:val="24"/>
+              </w:rPr>
+              <w:t>VND1</w:t>
+            </w:r>
+            <w:r>
+              <w:rPr>
+                <w:rFonts w:ascii="Calibri" w:eastAsia="Calibri" w:hAnsi="Calibri" w:cs="Calibri"/>
+                <w:sz w:val="24"/>
+              </w:rPr>
+              <w:t>, CHTR</w:t>
+            </w:r>
+            <w:r>
+              <w:rPr>
+                <w:rFonts w:ascii="Calibri" w:eastAsia="Calibri" w:hAnsi="Calibri" w:cs="Calibri"/>
+                <w:sz w:val="24"/>
+              </w:rPr>
+              <w:t>,</w:t>
+            </w:r>
+            <w:r>
+              <w:rPr>
+                <w:rFonts w:ascii="Calibri" w:eastAsia="Calibri" w:hAnsi="Calibri" w:cs="Calibri"/>
+                <w:sz w:val="26"/>
+                <w:szCs w:val="26"/>
+              </w:rPr>
+              <w:t xml:space="preserve"> </w:t>
+            </w:r>
+            <w:r>
+              <w:rPr>
+                <w:rFonts w:ascii="Calibri" w:eastAsia="Calibri" w:hAnsi="Calibri" w:cs="Calibri"/>
+                <w:sz w:val="26"/>
+                <w:szCs w:val="26"/>
+              </w:rPr>
+              <w:t>DVDR</w:t>
+            </w:r>
+            <w:r>
+              <w:rPr>
+                <w:rFonts w:ascii="Calibri" w:eastAsia="Calibri" w:hAnsi="Calibri" w:cs="Calibri"/>
+                <w:sz w:val="24"/>
+              </w:rPr>
+              <w:t>.</w:t>
+            </w:r>
           </w:p>
         </w:tc>
       </w:tr>
     </w:tbl>
+    <w:p>
+      <w:pPr>
+        <w:spacing w:after="0" w:line="240" w:lineRule="auto"/>
+        <w:jc w:val="both"/>
+        <w:rPr>
+          <w:rFonts w:ascii="Calibri" w:eastAsia="Calibri" w:hAnsi="Calibri" w:cs="Calibri"/>
+          <w:b/>
+          <w:sz w:val="24"/>
+        </w:rPr>
+      </w:pPr>
+    </w:p>
     <w:p>
       <w:pPr>
         <w:spacing w:after="0" w:line="240" w:lineRule="auto"/>
@@ -6237,6 +6480,7 @@
           <w:color w:val="2E74B5"/>
           <w:sz w:val="20"/>
         </w:rPr>
+        <w:lastRenderedPageBreak/>
         <w:tab/>
       </w:r>
     </w:p>
@@ -6792,7 +7036,7 @@
                 <w:sz w:val="26"/>
                 <w:szCs w:val="26"/>
               </w:rPr>
-              <w:t>CHRU+TAPTI PROD</w:t>
+              <w:t>JIND</w:t>
             </w:r>
           </w:p>
         </w:tc>
@@ -7014,7 +7258,7 @@
                 <w:sz w:val="26"/>
                 <w:szCs w:val="26"/>
               </w:rPr>
-              <w:t>SJOT</w:t>
+              <w:t>TCPP CC+PROD</w:t>
             </w:r>
           </w:p>
         </w:tc>
@@ -7692,10 +7936,10 @@
     </w:pPr>
     <w:r>
       <w:object w:dxaOrig="1188" w:dyaOrig="900">
-        <v:rect id="_x0000_i1025" style="width:56.25pt;height:39pt" o:ole="" o:preferrelative="t" stroked="f">
+        <v:rect id="_x0000_i1025" style="width:56.4pt;height:39pt" o:ole="" o:preferrelative="t" stroked="f">
           <v:imagedata r:id="rId1" o:title=""/>
         </v:rect>
-        <o:OLEObject Type="Embed" ProgID="StaticMetafile" ShapeID="_x0000_i1025" DrawAspect="Content" ObjectID="_1852466575" r:id="rId2"/>
+        <o:OLEObject Type="Embed" ProgID="StaticMetafile" ShapeID="_x0000_i1025" DrawAspect="Content" ObjectID="_1852553756" r:id="rId2"/>
       </w:object>
     </w:r>
     <w:r>
@@ -7729,7 +7973,17 @@
         <w:sz w:val="26"/>
         <w:szCs w:val="26"/>
       </w:rPr>
-      <w:t>03</w:t>
+      <w:t>0</w:t>
+    </w:r>
+    <w:r>
+      <w:rPr>
+        <w:rFonts w:ascii="Times New Roman" w:hAnsi="Times New Roman" w:cs="Times New Roman"/>
+        <w:b/>
+        <w:color w:val="000000" w:themeColor="text1"/>
+        <w:sz w:val="26"/>
+        <w:szCs w:val="26"/>
+      </w:rPr>
+      <w:t>4</w:t>
     </w:r>
     <w:r>
       <w:rPr>
@@ -7759,7 +8013,17 @@
         <w:sz w:val="26"/>
         <w:szCs w:val="26"/>
       </w:rPr>
-      <w:t>SATUR</w:t>
+      <w:t>S</w:t>
+    </w:r>
+    <w:r>
+      <w:rPr>
+        <w:rFonts w:ascii="Times New Roman" w:hAnsi="Times New Roman" w:cs="Times New Roman"/>
+        <w:b/>
+        <w:color w:val="000000" w:themeColor="text1"/>
+        <w:sz w:val="26"/>
+        <w:szCs w:val="26"/>
+      </w:rPr>
+      <w:t>UN</w:t>
     </w:r>
     <w:r>
       <w:rPr>

</xml_diff>

<commit_message>
Sync - 2026-10-04 15:53
</commit_message>
<xml_diff>
--- a/files/Daily_Helicopter_Schedule.docx
+++ b/files/Daily_Helicopter_Schedule.docx
@@ -4074,7 +4074,7 @@
                 <w:sz w:val="26"/>
                 <w:szCs w:val="26"/>
               </w:rPr>
-              <w:t>SGAV</w:t>
+              <w:t>WIN</w:t>
             </w:r>
           </w:p>
         </w:tc>
@@ -4535,11 +4535,21 @@
             <w:r>
               <w:rPr>
                 <w:rFonts w:ascii="Calibri" w:eastAsia="Calibri" w:hAnsi="Calibri" w:cs="Calibri"/>
-                <w:sz w:val="26"/>
-                <w:szCs w:val="26"/>
-              </w:rPr>
-              <w:t>SGAV</w:t>
-            </w:r>
+                <w:sz w:val="28"/>
+                <w:szCs w:val="28"/>
+              </w:rPr>
+              <w:t>AS2</w:t>
+            </w:r>
+            <w:r>
+              <w:rPr>
+                <w:rFonts w:ascii="Calibri" w:eastAsia="Calibri" w:hAnsi="Calibri" w:cs="Calibri"/>
+                <w:sz w:val="28"/>
+                <w:szCs w:val="28"/>
+              </w:rPr>
+              <w:t>/SHQ</w:t>
+            </w:r>
+            <w:bookmarkStart w:id="0" w:name="_GoBack"/>
+            <w:bookmarkEnd w:id="0"/>
           </w:p>
         </w:tc>
         <w:tc>
@@ -4761,9 +4771,10 @@
             <w:r>
               <w:rPr>
                 <w:rFonts w:ascii="Calibri" w:eastAsia="Calibri" w:hAnsi="Calibri" w:cs="Calibri"/>
-                <w:sz w:val="24"/>
-              </w:rPr>
-              <w:t>FDIX</w:t>
+                <w:sz w:val="26"/>
+                <w:szCs w:val="26"/>
+              </w:rPr>
+              <w:t>SLQ</w:t>
             </w:r>
           </w:p>
         </w:tc>
@@ -5043,11 +5054,10 @@
             <w:r>
               <w:rPr>
                 <w:rFonts w:ascii="Calibri" w:eastAsia="Calibri" w:hAnsi="Calibri" w:cs="Calibri"/>
-                <w:b/>
-                <w:sz w:val="26"/>
-                <w:szCs w:val="26"/>
-              </w:rPr>
-              <w:t>NA</w:t>
+                <w:sz w:val="26"/>
+                <w:szCs w:val="26"/>
+              </w:rPr>
+              <w:t>RATNA</w:t>
             </w:r>
           </w:p>
         </w:tc>
@@ -5274,7 +5284,7 @@
                 <w:sz w:val="26"/>
                 <w:szCs w:val="26"/>
               </w:rPr>
-              <w:t>SUDA</w:t>
+              <w:t>BLQ1</w:t>
             </w:r>
           </w:p>
         </w:tc>
@@ -5501,7 +5511,7 @@
                 <w:sz w:val="26"/>
                 <w:szCs w:val="26"/>
               </w:rPr>
-              <w:t>AS1</w:t>
+              <w:t>SLQ</w:t>
             </w:r>
           </w:p>
         </w:tc>
@@ -5725,11 +5735,10 @@
             <w:r>
               <w:rPr>
                 <w:rFonts w:ascii="Calibri" w:eastAsia="Calibri" w:hAnsi="Calibri" w:cs="Calibri"/>
-                <w:b/>
-                <w:sz w:val="26"/>
-                <w:szCs w:val="26"/>
-              </w:rPr>
-              <w:t>NA</w:t>
+                <w:sz w:val="26"/>
+                <w:szCs w:val="26"/>
+              </w:rPr>
+              <w:t>MNW</w:t>
             </w:r>
           </w:p>
         </w:tc>
@@ -5963,7 +5972,7 @@
                 <w:sz w:val="26"/>
                 <w:szCs w:val="26"/>
               </w:rPr>
-              <w:t>VND2</w:t>
+              <w:t>NQO</w:t>
             </w:r>
           </w:p>
         </w:tc>
@@ -6189,10 +6198,8 @@
                 <w:sz w:val="26"/>
                 <w:szCs w:val="26"/>
               </w:rPr>
-              <w:t>ABN4</w:t>
-            </w:r>
-            <w:bookmarkStart w:id="0" w:name="_GoBack"/>
-            <w:bookmarkEnd w:id="0"/>
+              <w:t>SHAKTI</w:t>
+            </w:r>
           </w:p>
         </w:tc>
         <w:tc>
@@ -6309,51 +6316,7 @@
                 <w:b/>
                 <w:sz w:val="24"/>
               </w:rPr>
-              <w:t xml:space="preserve">WAITING:  </w:t>
-            </w:r>
-            <w:r>
-              <w:rPr>
-                <w:rFonts w:ascii="Calibri" w:eastAsia="Calibri" w:hAnsi="Calibri" w:cs="Calibri"/>
-                <w:sz w:val="24"/>
-              </w:rPr>
-              <w:t>VND1</w:t>
-            </w:r>
-            <w:r>
-              <w:rPr>
-                <w:rFonts w:ascii="Calibri" w:eastAsia="Calibri" w:hAnsi="Calibri" w:cs="Calibri"/>
-                <w:sz w:val="24"/>
-              </w:rPr>
-              <w:t>, CHTR</w:t>
-            </w:r>
-            <w:r>
-              <w:rPr>
-                <w:rFonts w:ascii="Calibri" w:eastAsia="Calibri" w:hAnsi="Calibri" w:cs="Calibri"/>
-                <w:sz w:val="24"/>
-              </w:rPr>
-              <w:t>,</w:t>
-            </w:r>
-            <w:r>
-              <w:rPr>
-                <w:rFonts w:ascii="Calibri" w:eastAsia="Calibri" w:hAnsi="Calibri" w:cs="Calibri"/>
-                <w:sz w:val="26"/>
-                <w:szCs w:val="26"/>
-              </w:rPr>
-              <w:t xml:space="preserve"> </w:t>
-            </w:r>
-            <w:r>
-              <w:rPr>
-                <w:rFonts w:ascii="Calibri" w:eastAsia="Calibri" w:hAnsi="Calibri" w:cs="Calibri"/>
-                <w:sz w:val="26"/>
-                <w:szCs w:val="26"/>
-              </w:rPr>
-              <w:t>DVDR</w:t>
-            </w:r>
-            <w:r>
-              <w:rPr>
-                <w:rFonts w:ascii="Calibri" w:eastAsia="Calibri" w:hAnsi="Calibri" w:cs="Calibri"/>
-                <w:sz w:val="24"/>
-              </w:rPr>
-              <w:t>.</w:t>
+              <w:t>WAITING:NIL</w:t>
             </w:r>
           </w:p>
         </w:tc>
@@ -7258,7 +7221,7 @@
                 <w:sz w:val="26"/>
                 <w:szCs w:val="26"/>
               </w:rPr>
-              <w:t>TCPP CC+PROD</w:t>
+              <w:t>TCPP L/O</w:t>
             </w:r>
           </w:p>
         </w:tc>
@@ -7936,10 +7899,10 @@
     </w:pPr>
     <w:r>
       <w:object w:dxaOrig="1188" w:dyaOrig="900">
-        <v:rect id="_x0000_i1025" style="width:56.4pt;height:39pt" o:ole="" o:preferrelative="t" stroked="f">
+        <v:rect id="_x0000_i1025" style="width:56pt;height:39.2pt" o:ole="" o:preferrelative="t" stroked="f">
           <v:imagedata r:id="rId1" o:title=""/>
         </v:rect>
-        <o:OLEObject Type="Embed" ProgID="StaticMetafile" ShapeID="_x0000_i1025" DrawAspect="Content" ObjectID="_1852553756" r:id="rId2"/>
+        <o:OLEObject Type="Embed" ProgID="StaticMetafile" ShapeID="_x0000_i1025" DrawAspect="Content" ObjectID="_1852633797" r:id="rId2"/>
       </w:object>
     </w:r>
     <w:r>
@@ -7983,7 +7946,7 @@
         <w:sz w:val="26"/>
         <w:szCs w:val="26"/>
       </w:rPr>
-      <w:t>4</w:t>
+      <w:t>5</w:t>
     </w:r>
     <w:r>
       <w:rPr>
@@ -8013,7 +7976,7 @@
         <w:sz w:val="26"/>
         <w:szCs w:val="26"/>
       </w:rPr>
-      <w:t>S</w:t>
+      <w:t>MO</w:t>
     </w:r>
     <w:r>
       <w:rPr>
@@ -8023,7 +7986,7 @@
         <w:sz w:val="26"/>
         <w:szCs w:val="26"/>
       </w:rPr>
-      <w:t>UN</w:t>
+      <w:t>N</w:t>
     </w:r>
     <w:r>
       <w:rPr>

</xml_diff>

<commit_message>
Sync - 2026-10-04 18:23
</commit_message>
<xml_diff>
--- a/files/Daily_Helicopter_Schedule.docx
+++ b/files/Daily_Helicopter_Schedule.docx
@@ -4548,8 +4548,6 @@
               </w:rPr>
               <w:t>/SHQ</w:t>
             </w:r>
-            <w:bookmarkStart w:id="0" w:name="_GoBack"/>
-            <w:bookmarkEnd w:id="0"/>
           </w:p>
         </w:tc>
         <w:tc>
@@ -4774,7 +4772,7 @@
                 <w:sz w:val="26"/>
                 <w:szCs w:val="26"/>
               </w:rPr>
-              <w:t>SLQ</w:t>
+              <w:t>PANNA</w:t>
             </w:r>
           </w:p>
         </w:tc>
@@ -7438,6 +7436,16 @@
                 <w:szCs w:val="26"/>
               </w:rPr>
             </w:pPr>
+            <w:r>
+              <w:rPr>
+                <w:rFonts w:ascii="Calibri" w:eastAsia="Calibri" w:hAnsi="Calibri" w:cs="Calibri"/>
+                <w:sz w:val="26"/>
+                <w:szCs w:val="26"/>
+              </w:rPr>
+              <w:t>UDAY</w:t>
+            </w:r>
+            <w:bookmarkStart w:id="0" w:name="_GoBack"/>
+            <w:bookmarkEnd w:id="0"/>
           </w:p>
         </w:tc>
         <w:tc>
@@ -7902,7 +7910,7 @@
         <v:rect id="_x0000_i1025" style="width:56pt;height:39.2pt" o:ole="" o:preferrelative="t" stroked="f">
           <v:imagedata r:id="rId1" o:title=""/>
         </v:rect>
-        <o:OLEObject Type="Embed" ProgID="StaticMetafile" ShapeID="_x0000_i1025" DrawAspect="Content" ObjectID="_1852633797" r:id="rId2"/>
+        <o:OLEObject Type="Embed" ProgID="StaticMetafile" ShapeID="_x0000_i1025" DrawAspect="Content" ObjectID="_1852637723" r:id="rId2"/>
       </w:object>
     </w:r>
     <w:r>

</xml_diff>

<commit_message>
Sync - 2026-10-05 15:56
</commit_message>
<xml_diff>
--- a/files/Daily_Helicopter_Schedule.docx
+++ b/files/Daily_Helicopter_Schedule.docx
@@ -1182,7 +1182,7 @@
                 <w:sz w:val="26"/>
                 <w:szCs w:val="26"/>
               </w:rPr>
-              <w:t>RRN</w:t>
+              <w:t>RRJ</w:t>
             </w:r>
           </w:p>
         </w:tc>
@@ -1217,7 +1217,7 @@
                 <w:sz w:val="26"/>
                 <w:szCs w:val="26"/>
               </w:rPr>
-              <w:t>05</w:t>
+              <w:t>06</w:t>
             </w:r>
           </w:p>
         </w:tc>
@@ -1432,7 +1432,7 @@
                 <w:sz w:val="26"/>
                 <w:szCs w:val="26"/>
               </w:rPr>
-              <w:t>RRJ</w:t>
+              <w:t>RRN</w:t>
             </w:r>
           </w:p>
         </w:tc>
@@ -1467,7 +1467,7 @@
                 <w:sz w:val="26"/>
                 <w:szCs w:val="26"/>
               </w:rPr>
-              <w:t>06</w:t>
+              <w:t>05</w:t>
             </w:r>
           </w:p>
         </w:tc>
@@ -1639,7 +1639,15 @@
                 <w:sz w:val="26"/>
                 <w:szCs w:val="26"/>
               </w:rPr>
-              <w:t>1:00</w:t>
+              <w:t>0:0</w:t>
+            </w:r>
+            <w:r>
+              <w:rPr>
+                <w:rFonts w:ascii="Calibri" w:eastAsia="Calibri" w:hAnsi="Calibri" w:cs="Calibri"/>
+                <w:sz w:val="26"/>
+                <w:szCs w:val="26"/>
+              </w:rPr>
+              <w:t>0</w:t>
             </w:r>
           </w:p>
         </w:tc>
@@ -1717,7 +1725,7 @@
                 <w:sz w:val="26"/>
                 <w:szCs w:val="26"/>
               </w:rPr>
-              <w:t>NA</w:t>
+              <w:t>GVHL 169</w:t>
             </w:r>
           </w:p>
         </w:tc>
@@ -1752,7 +1760,7 @@
                 <w:sz w:val="26"/>
                 <w:szCs w:val="26"/>
               </w:rPr>
-              <w:t>NA</w:t>
+              <w:t>RRL</w:t>
             </w:r>
           </w:p>
         </w:tc>
@@ -3081,11 +3089,10 @@
             <w:r>
               <w:rPr>
                 <w:rFonts w:ascii="Calibri" w:eastAsia="Calibri" w:hAnsi="Calibri" w:cs="Calibri"/>
-                <w:b/>
-                <w:sz w:val="26"/>
-                <w:szCs w:val="26"/>
-              </w:rPr>
-              <w:t>NA</w:t>
+                <w:sz w:val="26"/>
+                <w:szCs w:val="26"/>
+              </w:rPr>
+              <w:t xml:space="preserve"> NA</w:t>
             </w:r>
           </w:p>
         </w:tc>
@@ -3306,15 +3313,13 @@
               <w:jc w:val="center"/>
               <w:rPr>
                 <w:rFonts w:ascii="Calibri" w:eastAsia="Calibri" w:hAnsi="Calibri" w:cs="Calibri"/>
-                <w:b/>
-                <w:sz w:val="26"/>
-                <w:szCs w:val="26"/>
-              </w:rPr>
-            </w:pPr>
-            <w:r>
-              <w:rPr>
-                <w:rFonts w:ascii="Calibri" w:eastAsia="Calibri" w:hAnsi="Calibri" w:cs="Calibri"/>
-                <w:b/>
+                <w:sz w:val="26"/>
+                <w:szCs w:val="26"/>
+              </w:rPr>
+            </w:pPr>
+            <w:r>
+              <w:rPr>
+                <w:rFonts w:ascii="Calibri" w:eastAsia="Calibri" w:hAnsi="Calibri" w:cs="Calibri"/>
                 <w:sz w:val="26"/>
                 <w:szCs w:val="26"/>
               </w:rPr>
@@ -3550,7 +3555,6 @@
             <w:r>
               <w:rPr>
                 <w:rFonts w:ascii="Calibri" w:eastAsia="Calibri" w:hAnsi="Calibri" w:cs="Calibri"/>
-                <w:b/>
                 <w:sz w:val="26"/>
                 <w:szCs w:val="26"/>
               </w:rPr>
@@ -4074,7 +4078,7 @@
                 <w:sz w:val="26"/>
                 <w:szCs w:val="26"/>
               </w:rPr>
-              <w:t>WIN</w:t>
+              <w:t>R10A/R13A/NLM</w:t>
             </w:r>
           </w:p>
         </w:tc>
@@ -4535,18 +4539,10 @@
             <w:r>
               <w:rPr>
                 <w:rFonts w:ascii="Calibri" w:eastAsia="Calibri" w:hAnsi="Calibri" w:cs="Calibri"/>
-                <w:sz w:val="28"/>
-                <w:szCs w:val="28"/>
-              </w:rPr>
-              <w:t>AS2</w:t>
-            </w:r>
-            <w:r>
-              <w:rPr>
-                <w:rFonts w:ascii="Calibri" w:eastAsia="Calibri" w:hAnsi="Calibri" w:cs="Calibri"/>
-                <w:sz w:val="28"/>
-                <w:szCs w:val="28"/>
-              </w:rPr>
-              <w:t>/SHQ</w:t>
+                <w:sz w:val="26"/>
+                <w:szCs w:val="26"/>
+              </w:rPr>
+              <w:t>BLQ1</w:t>
             </w:r>
           </w:p>
         </w:tc>
@@ -4769,10 +4765,18 @@
             <w:r>
               <w:rPr>
                 <w:rFonts w:ascii="Calibri" w:eastAsia="Calibri" w:hAnsi="Calibri" w:cs="Calibri"/>
-                <w:sz w:val="26"/>
-                <w:szCs w:val="26"/>
-              </w:rPr>
-              <w:t>PANNA</w:t>
+                <w:sz w:val="28"/>
+                <w:szCs w:val="28"/>
+              </w:rPr>
+              <w:t>SHQ</w:t>
+            </w:r>
+            <w:r>
+              <w:rPr>
+                <w:rFonts w:ascii="Calibri" w:eastAsia="Calibri" w:hAnsi="Calibri" w:cs="Calibri"/>
+                <w:sz w:val="26"/>
+                <w:szCs w:val="26"/>
+              </w:rPr>
+              <w:t xml:space="preserve"> </w:t>
             </w:r>
           </w:p>
         </w:tc>
@@ -5055,7 +5059,7 @@
                 <w:sz w:val="26"/>
                 <w:szCs w:val="26"/>
               </w:rPr>
-              <w:t>RATNA</w:t>
+              <w:t>HRA/NLM</w:t>
             </w:r>
           </w:p>
         </w:tc>
@@ -5282,7 +5286,7 @@
                 <w:sz w:val="26"/>
                 <w:szCs w:val="26"/>
               </w:rPr>
-              <w:t>BLQ1</w:t>
+              <w:t>SLQ</w:t>
             </w:r>
           </w:p>
         </w:tc>
@@ -5509,7 +5513,7 @@
                 <w:sz w:val="26"/>
                 <w:szCs w:val="26"/>
               </w:rPr>
-              <w:t>SLQ</w:t>
+              <w:t>SHQ</w:t>
             </w:r>
           </w:p>
         </w:tc>
@@ -5736,8 +5740,10 @@
                 <w:sz w:val="26"/>
                 <w:szCs w:val="26"/>
               </w:rPr>
-              <w:t>MNW</w:t>
-            </w:r>
+              <w:t>NQO</w:t>
+            </w:r>
+            <w:bookmarkStart w:id="0" w:name="_GoBack"/>
+            <w:bookmarkEnd w:id="0"/>
           </w:p>
         </w:tc>
         <w:tc>
@@ -5970,7 +5976,7 @@
                 <w:sz w:val="26"/>
                 <w:szCs w:val="26"/>
               </w:rPr>
-              <w:t>NQO</w:t>
+              <w:t>ICW</w:t>
             </w:r>
           </w:p>
         </w:tc>
@@ -6196,7 +6202,7 @@
                 <w:sz w:val="26"/>
                 <w:szCs w:val="26"/>
               </w:rPr>
-              <w:t>SHAKTI</w:t>
+              <w:t>JYOTI</w:t>
             </w:r>
           </w:p>
         </w:tc>
@@ -6997,7 +7003,7 @@
                 <w:sz w:val="26"/>
                 <w:szCs w:val="26"/>
               </w:rPr>
-              <w:t>JIND</w:t>
+              <w:t>JYOTI</w:t>
             </w:r>
           </w:p>
         </w:tc>
@@ -7219,7 +7225,7 @@
                 <w:sz w:val="26"/>
                 <w:szCs w:val="26"/>
               </w:rPr>
-              <w:t>TCPP L/O</w:t>
+              <w:t>CET</w:t>
             </w:r>
           </w:p>
         </w:tc>
@@ -7442,10 +7448,8 @@
                 <w:sz w:val="26"/>
                 <w:szCs w:val="26"/>
               </w:rPr>
-              <w:t>UDAY</w:t>
-            </w:r>
-            <w:bookmarkStart w:id="0" w:name="_GoBack"/>
-            <w:bookmarkEnd w:id="0"/>
+              <w:t>L/O</w:t>
+            </w:r>
           </w:p>
         </w:tc>
         <w:tc>
@@ -7907,10 +7911,10 @@
     </w:pPr>
     <w:r>
       <w:object w:dxaOrig="1188" w:dyaOrig="900">
-        <v:rect id="_x0000_i1025" style="width:56pt;height:39.2pt" o:ole="" o:preferrelative="t" stroked="f">
+        <v:rect id="_x0000_i1025" style="width:55.9pt;height:39.05pt" o:ole="" o:preferrelative="t" stroked="f">
           <v:imagedata r:id="rId1" o:title=""/>
         </v:rect>
-        <o:OLEObject Type="Embed" ProgID="StaticMetafile" ShapeID="_x0000_i1025" DrawAspect="Content" ObjectID="_1852637723" r:id="rId2"/>
+        <o:OLEObject Type="Embed" ProgID="StaticMetafile" ShapeID="_x0000_i1025" DrawAspect="Content" ObjectID="_1852720268" r:id="rId2"/>
       </w:object>
     </w:r>
     <w:r>
@@ -7954,7 +7958,7 @@
         <w:sz w:val="26"/>
         <w:szCs w:val="26"/>
       </w:rPr>
-      <w:t>5</w:t>
+      <w:t>6</w:t>
     </w:r>
     <w:r>
       <w:rPr>
@@ -7984,17 +7988,7 @@
         <w:sz w:val="26"/>
         <w:szCs w:val="26"/>
       </w:rPr>
-      <w:t>MO</w:t>
-    </w:r>
-    <w:r>
-      <w:rPr>
-        <w:rFonts w:ascii="Times New Roman" w:hAnsi="Times New Roman" w:cs="Times New Roman"/>
-        <w:b/>
-        <w:color w:val="000000" w:themeColor="text1"/>
-        <w:sz w:val="26"/>
-        <w:szCs w:val="26"/>
-      </w:rPr>
-      <w:t>N</w:t>
+      <w:t>TUES</w:t>
     </w:r>
     <w:r>
       <w:rPr>

</xml_diff>

<commit_message>
Sync - 2026-10-05 17:26
</commit_message>
<xml_diff>
--- a/files/Daily_Helicopter_Schedule.docx
+++ b/files/Daily_Helicopter_Schedule.docx
@@ -4768,15 +4768,7 @@
                 <w:sz w:val="28"/>
                 <w:szCs w:val="28"/>
               </w:rPr>
-              <w:t>SHQ</w:t>
-            </w:r>
-            <w:r>
-              <w:rPr>
-                <w:rFonts w:ascii="Calibri" w:eastAsia="Calibri" w:hAnsi="Calibri" w:cs="Calibri"/>
-                <w:sz w:val="26"/>
-                <w:szCs w:val="26"/>
-              </w:rPr>
-              <w:t xml:space="preserve"> </w:t>
+              <w:t>PANNA</w:t>
             </w:r>
           </w:p>
         </w:tc>
@@ -5742,8 +5734,6 @@
               </w:rPr>
               <w:t>NQO</w:t>
             </w:r>
-            <w:bookmarkStart w:id="0" w:name="_GoBack"/>
-            <w:bookmarkEnd w:id="0"/>
           </w:p>
         </w:tc>
         <w:tc>
@@ -6320,8 +6310,17 @@
                 <w:b/>
                 <w:sz w:val="24"/>
               </w:rPr>
-              <w:t>WAITING:NIL</w:t>
-            </w:r>
+              <w:t>WAITING:</w:t>
+            </w:r>
+            <w:r>
+              <w:rPr>
+                <w:rFonts w:ascii="Calibri" w:eastAsia="Calibri" w:hAnsi="Calibri" w:cs="Calibri"/>
+                <w:sz w:val="24"/>
+              </w:rPr>
+              <w:t>GAURAV</w:t>
+            </w:r>
+            <w:bookmarkStart w:id="0" w:name="_GoBack"/>
+            <w:bookmarkEnd w:id="0"/>
           </w:p>
         </w:tc>
       </w:tr>
@@ -7914,7 +7913,7 @@
         <v:rect id="_x0000_i1025" style="width:55.9pt;height:39.05pt" o:ole="" o:preferrelative="t" stroked="f">
           <v:imagedata r:id="rId1" o:title=""/>
         </v:rect>
-        <o:OLEObject Type="Embed" ProgID="StaticMetafile" ShapeID="_x0000_i1025" DrawAspect="Content" ObjectID="_1852720268" r:id="rId2"/>
+        <o:OLEObject Type="Embed" ProgID="StaticMetafile" ShapeID="_x0000_i1025" DrawAspect="Content" ObjectID="_1852726046" r:id="rId2"/>
       </w:object>
     </w:r>
     <w:r>

</xml_diff>

<commit_message>
Sync - 2026-10-06 17:28
</commit_message>
<xml_diff>
--- a/files/Daily_Helicopter_Schedule.docx
+++ b/files/Daily_Helicopter_Schedule.docx
@@ -1725,7 +1725,7 @@
                 <w:sz w:val="26"/>
                 <w:szCs w:val="26"/>
               </w:rPr>
-              <w:t>GVHL 169</w:t>
+              <w:t>NA</w:t>
             </w:r>
           </w:p>
         </w:tc>
@@ -1760,7 +1760,7 @@
                 <w:sz w:val="26"/>
                 <w:szCs w:val="26"/>
               </w:rPr>
-              <w:t>RRL</w:t>
+              <w:t>NA</w:t>
             </w:r>
           </w:p>
         </w:tc>
@@ -3092,7 +3092,7 @@
                 <w:sz w:val="26"/>
                 <w:szCs w:val="26"/>
               </w:rPr>
-              <w:t xml:space="preserve"> NA</w:t>
+              <w:t>NLM</w:t>
             </w:r>
           </w:p>
         </w:tc>
@@ -3149,6 +3149,14 @@
                 <w:szCs w:val="26"/>
               </w:rPr>
             </w:pPr>
+            <w:r>
+              <w:rPr>
+                <w:rFonts w:ascii="Calibri" w:eastAsia="Calibri" w:hAnsi="Calibri" w:cs="Calibri"/>
+                <w:sz w:val="26"/>
+                <w:szCs w:val="26"/>
+              </w:rPr>
+              <w:t>RRL</w:t>
+            </w:r>
           </w:p>
         </w:tc>
         <w:tc>
@@ -3288,7 +3296,7 @@
                 <w:sz w:val="26"/>
                 <w:szCs w:val="26"/>
               </w:rPr>
-              <w:t>11:05</w:t>
+              <w:t>11:00</w:t>
             </w:r>
           </w:p>
         </w:tc>
@@ -3323,7 +3331,7 @@
                 <w:sz w:val="26"/>
                 <w:szCs w:val="26"/>
               </w:rPr>
-              <w:t>NA</w:t>
+              <w:t>NLM</w:t>
             </w:r>
           </w:p>
         </w:tc>
@@ -3380,6 +3388,14 @@
                 <w:szCs w:val="26"/>
               </w:rPr>
             </w:pPr>
+            <w:r>
+              <w:rPr>
+                <w:rFonts w:ascii="Calibri" w:eastAsia="Calibri" w:hAnsi="Calibri" w:cs="Calibri"/>
+                <w:sz w:val="26"/>
+                <w:szCs w:val="26"/>
+              </w:rPr>
+              <w:t>RRL</w:t>
+            </w:r>
           </w:p>
         </w:tc>
         <w:tc>
@@ -3558,7 +3574,7 @@
                 <w:sz w:val="26"/>
                 <w:szCs w:val="26"/>
               </w:rPr>
-              <w:t>NA</w:t>
+              <w:t>NLM</w:t>
             </w:r>
           </w:p>
         </w:tc>
@@ -3615,6 +3631,14 @@
                 <w:szCs w:val="26"/>
               </w:rPr>
             </w:pPr>
+            <w:r>
+              <w:rPr>
+                <w:rFonts w:ascii="Calibri" w:eastAsia="Calibri" w:hAnsi="Calibri" w:cs="Calibri"/>
+                <w:sz w:val="26"/>
+                <w:szCs w:val="26"/>
+              </w:rPr>
+              <w:t>RRL</w:t>
+            </w:r>
           </w:p>
         </w:tc>
         <w:tc>
@@ -4078,7 +4102,7 @@
                 <w:sz w:val="26"/>
                 <w:szCs w:val="26"/>
               </w:rPr>
-              <w:t>R10A/R13A/NLM</w:t>
+              <w:t>B193</w:t>
             </w:r>
           </w:p>
         </w:tc>
@@ -4539,10 +4563,10 @@
             <w:r>
               <w:rPr>
                 <w:rFonts w:ascii="Calibri" w:eastAsia="Calibri" w:hAnsi="Calibri" w:cs="Calibri"/>
-                <w:sz w:val="26"/>
-                <w:szCs w:val="26"/>
-              </w:rPr>
-              <w:t>BLQ1</w:t>
+                <w:sz w:val="28"/>
+                <w:szCs w:val="28"/>
+              </w:rPr>
+              <w:t>SCA</w:t>
             </w:r>
           </w:p>
         </w:tc>
@@ -4765,10 +4789,10 @@
             <w:r>
               <w:rPr>
                 <w:rFonts w:ascii="Calibri" w:eastAsia="Calibri" w:hAnsi="Calibri" w:cs="Calibri"/>
-                <w:sz w:val="28"/>
-                <w:szCs w:val="28"/>
-              </w:rPr>
-              <w:t>PANNA</w:t>
+                <w:sz w:val="26"/>
+                <w:szCs w:val="26"/>
+              </w:rPr>
+              <w:t>SRAT</w:t>
             </w:r>
           </w:p>
         </w:tc>
@@ -5051,7 +5075,7 @@
                 <w:sz w:val="26"/>
                 <w:szCs w:val="26"/>
               </w:rPr>
-              <w:t>HRA/NLM</w:t>
+              <w:t>SGAV (B/L)</w:t>
             </w:r>
           </w:p>
         </w:tc>
@@ -5278,7 +5302,7 @@
                 <w:sz w:val="26"/>
                 <w:szCs w:val="26"/>
               </w:rPr>
-              <w:t>SLQ</w:t>
+              <w:t>MNW</w:t>
             </w:r>
           </w:p>
         </w:tc>
@@ -5307,6 +5331,8 @@
                 <w:szCs w:val="26"/>
               </w:rPr>
             </w:pPr>
+            <w:bookmarkStart w:id="0" w:name="_GoBack"/>
+            <w:bookmarkEnd w:id="0"/>
           </w:p>
         </w:tc>
         <w:tc>
@@ -5505,7 +5531,7 @@
                 <w:sz w:val="26"/>
                 <w:szCs w:val="26"/>
               </w:rPr>
-              <w:t>SHQ</w:t>
+              <w:t>AS1</w:t>
             </w:r>
           </w:p>
         </w:tc>
@@ -5732,7 +5758,7 @@
                 <w:sz w:val="26"/>
                 <w:szCs w:val="26"/>
               </w:rPr>
-              <w:t>NQO</w:t>
+              <w:t>SSAK</w:t>
             </w:r>
           </w:p>
         </w:tc>
@@ -5966,7 +5992,7 @@
                 <w:sz w:val="26"/>
                 <w:szCs w:val="26"/>
               </w:rPr>
-              <w:t>ICW</w:t>
+              <w:t>SMRT</w:t>
             </w:r>
           </w:p>
         </w:tc>
@@ -6192,7 +6218,7 @@
                 <w:sz w:val="26"/>
                 <w:szCs w:val="26"/>
               </w:rPr>
-              <w:t>JYOTI</w:t>
+              <w:t>BPA</w:t>
             </w:r>
           </w:p>
         </w:tc>
@@ -6310,17 +6336,8 @@
                 <w:b/>
                 <w:sz w:val="24"/>
               </w:rPr>
-              <w:t>WAITING:</w:t>
-            </w:r>
-            <w:r>
-              <w:rPr>
-                <w:rFonts w:ascii="Calibri" w:eastAsia="Calibri" w:hAnsi="Calibri" w:cs="Calibri"/>
-                <w:sz w:val="24"/>
-              </w:rPr>
-              <w:t>GAURAV</w:t>
-            </w:r>
-            <w:bookmarkStart w:id="0" w:name="_GoBack"/>
-            <w:bookmarkEnd w:id="0"/>
+              <w:t>WAITING</w:t>
+            </w:r>
           </w:p>
         </w:tc>
       </w:tr>
@@ -7002,7 +7019,7 @@
                 <w:sz w:val="26"/>
                 <w:szCs w:val="26"/>
               </w:rPr>
-              <w:t>JYOTI</w:t>
+              <w:t>CHRU</w:t>
             </w:r>
           </w:p>
         </w:tc>
@@ -7224,7 +7241,7 @@
                 <w:sz w:val="26"/>
                 <w:szCs w:val="26"/>
               </w:rPr>
-              <w:t>CET</w:t>
+              <w:t>JIND</w:t>
             </w:r>
           </w:p>
         </w:tc>
@@ -7441,14 +7458,6 @@
                 <w:szCs w:val="26"/>
               </w:rPr>
             </w:pPr>
-            <w:r>
-              <w:rPr>
-                <w:rFonts w:ascii="Calibri" w:eastAsia="Calibri" w:hAnsi="Calibri" w:cs="Calibri"/>
-                <w:sz w:val="26"/>
-                <w:szCs w:val="26"/>
-              </w:rPr>
-              <w:t>L/O</w:t>
-            </w:r>
           </w:p>
         </w:tc>
         <w:tc>
@@ -7910,10 +7919,10 @@
     </w:pPr>
     <w:r>
       <w:object w:dxaOrig="1188" w:dyaOrig="900">
-        <v:rect id="_x0000_i1025" style="width:55.9pt;height:39.05pt" o:ole="" o:preferrelative="t" stroked="f">
+        <v:rect id="_x0000_i1025" style="width:55.9pt;height:38.95pt" o:ole="" o:preferrelative="t" stroked="f">
           <v:imagedata r:id="rId1" o:title=""/>
         </v:rect>
-        <o:OLEObject Type="Embed" ProgID="StaticMetafile" ShapeID="_x0000_i1025" DrawAspect="Content" ObjectID="_1852726046" r:id="rId2"/>
+        <o:OLEObject Type="Embed" ProgID="StaticMetafile" ShapeID="_x0000_i1025" DrawAspect="Content" ObjectID="_1852810853" r:id="rId2"/>
       </w:object>
     </w:r>
     <w:r>
@@ -7957,7 +7966,7 @@
         <w:sz w:val="26"/>
         <w:szCs w:val="26"/>
       </w:rPr>
-      <w:t>6</w:t>
+      <w:t>7</w:t>
     </w:r>
     <w:r>
       <w:rPr>
@@ -7987,7 +7996,17 @@
         <w:sz w:val="26"/>
         <w:szCs w:val="26"/>
       </w:rPr>
-      <w:t>TUES</w:t>
+      <w:t>WEDN</w:t>
+    </w:r>
+    <w:r>
+      <w:rPr>
+        <w:rFonts w:ascii="Times New Roman" w:hAnsi="Times New Roman" w:cs="Times New Roman"/>
+        <w:b/>
+        <w:color w:val="000000" w:themeColor="text1"/>
+        <w:sz w:val="26"/>
+        <w:szCs w:val="26"/>
+      </w:rPr>
+      <w:t>ES</w:t>
     </w:r>
     <w:r>
       <w:rPr>

</xml_diff>

<commit_message>
Sync - 2026-10-08 17:03
</commit_message>
<xml_diff>
--- a/files/Daily_Helicopter_Schedule.docx
+++ b/files/Daily_Helicopter_Schedule.docx
@@ -1116,7 +1116,7 @@
                 <w:sz w:val="28"/>
                 <w:szCs w:val="28"/>
               </w:rPr>
-              <w:t xml:space="preserve">SF (D) </w:t>
+              <w:t>SF (D)+NF[D]</w:t>
             </w:r>
           </w:p>
         </w:tc>
@@ -1366,7 +1366,7 @@
                 <w:sz w:val="28"/>
                 <w:szCs w:val="28"/>
               </w:rPr>
-              <w:t>NF (D)</w:t>
+              <w:t>NA</w:t>
             </w:r>
           </w:p>
         </w:tc>
@@ -1401,7 +1401,7 @@
                 <w:sz w:val="28"/>
                 <w:szCs w:val="28"/>
               </w:rPr>
-              <w:t>GVHL 412</w:t>
+              <w:t>NA</w:t>
             </w:r>
           </w:p>
         </w:tc>
@@ -1436,7 +1436,7 @@
                 <w:sz w:val="28"/>
                 <w:szCs w:val="28"/>
               </w:rPr>
-              <w:t>RRJ</w:t>
+              <w:t>NA</w:t>
             </w:r>
           </w:p>
         </w:tc>
@@ -1471,7 +1471,7 @@
                 <w:sz w:val="28"/>
                 <w:szCs w:val="28"/>
               </w:rPr>
-              <w:t>05</w:t>
+              <w:t>00</w:t>
             </w:r>
           </w:p>
         </w:tc>
@@ -1737,7 +1737,7 @@
                 <w:sz w:val="28"/>
                 <w:szCs w:val="28"/>
               </w:rPr>
-              <w:t>GVHL 169</w:t>
+              <w:t>NA</w:t>
             </w:r>
           </w:p>
         </w:tc>
@@ -1772,7 +1772,7 @@
                 <w:sz w:val="28"/>
                 <w:szCs w:val="28"/>
               </w:rPr>
-              <w:t>RRL</w:t>
+              <w:t>NA</w:t>
             </w:r>
           </w:p>
         </w:tc>
@@ -1807,7 +1807,7 @@
                 <w:sz w:val="28"/>
                 <w:szCs w:val="28"/>
               </w:rPr>
-              <w:t>06</w:t>
+              <w:t>00</w:t>
             </w:r>
           </w:p>
         </w:tc>
@@ -1921,7 +1921,15 @@
                 <w:sz w:val="28"/>
                 <w:szCs w:val="28"/>
               </w:rPr>
-              <w:t>14:00</w:t>
+              <w:t>11:0</w:t>
+            </w:r>
+            <w:r>
+              <w:rPr>
+                <w:rFonts w:ascii="Calibri" w:eastAsia="Calibri" w:hAnsi="Calibri" w:cs="Calibri"/>
+                <w:sz w:val="28"/>
+                <w:szCs w:val="28"/>
+              </w:rPr>
+              <w:t>0</w:t>
             </w:r>
           </w:p>
         </w:tc>
@@ -1960,7 +1968,15 @@
                 <w:sz w:val="28"/>
                 <w:szCs w:val="28"/>
               </w:rPr>
-              <w:t>BLQ (N)</w:t>
+              <w:t>BLQ (PM</w:t>
+            </w:r>
+            <w:r>
+              <w:rPr>
+                <w:rFonts w:ascii="Calibri" w:eastAsia="Calibri" w:hAnsi="Calibri" w:cs="Calibri"/>
+                <w:sz w:val="28"/>
+                <w:szCs w:val="28"/>
+              </w:rPr>
+              <w:t>)</w:t>
             </w:r>
           </w:p>
         </w:tc>
@@ -1995,7 +2011,7 @@
                 <w:sz w:val="28"/>
                 <w:szCs w:val="28"/>
               </w:rPr>
-              <w:t>HELIGO 145</w:t>
+              <w:t>NA</w:t>
             </w:r>
           </w:p>
         </w:tc>
@@ -2030,7 +2046,7 @@
                 <w:sz w:val="28"/>
                 <w:szCs w:val="28"/>
               </w:rPr>
-              <w:t>HLW</w:t>
+              <w:t>NA</w:t>
             </w:r>
           </w:p>
         </w:tc>
@@ -2065,7 +2081,7 @@
                 <w:sz w:val="28"/>
                 <w:szCs w:val="28"/>
               </w:rPr>
-              <w:t>07</w:t>
+              <w:t>00</w:t>
             </w:r>
           </w:p>
         </w:tc>
@@ -2544,7 +2560,7 @@
                 <w:sz w:val="28"/>
                 <w:szCs w:val="28"/>
               </w:rPr>
-              <w:t>RRI</w:t>
+              <w:t>RRJ</w:t>
             </w:r>
           </w:p>
         </w:tc>
@@ -3088,7 +3104,7 @@
                 <w:sz w:val="28"/>
                 <w:szCs w:val="28"/>
               </w:rPr>
-              <w:t>HERA</w:t>
+              <w:t>BLQ2</w:t>
             </w:r>
           </w:p>
         </w:tc>
@@ -3327,7 +3343,7 @@
                 <w:sz w:val="28"/>
                 <w:szCs w:val="28"/>
               </w:rPr>
-              <w:t>NA</w:t>
+              <w:t>BLQ2</w:t>
             </w:r>
           </w:p>
         </w:tc>
@@ -3384,6 +3400,14 @@
                 <w:szCs w:val="28"/>
               </w:rPr>
             </w:pPr>
+            <w:r>
+              <w:rPr>
+                <w:rFonts w:ascii="Calibri" w:eastAsia="Calibri" w:hAnsi="Calibri" w:cs="Calibri"/>
+                <w:sz w:val="28"/>
+                <w:szCs w:val="28"/>
+              </w:rPr>
+              <w:t>RRL</w:t>
+            </w:r>
           </w:p>
         </w:tc>
         <w:tc>
@@ -3562,7 +3586,7 @@
                 <w:sz w:val="28"/>
                 <w:szCs w:val="28"/>
               </w:rPr>
-              <w:t>NA</w:t>
+              <w:t>BLQ2</w:t>
             </w:r>
           </w:p>
         </w:tc>
@@ -3619,6 +3643,14 @@
                 <w:szCs w:val="28"/>
               </w:rPr>
             </w:pPr>
+            <w:r>
+              <w:rPr>
+                <w:rFonts w:ascii="Calibri" w:eastAsia="Calibri" w:hAnsi="Calibri" w:cs="Calibri"/>
+                <w:sz w:val="28"/>
+                <w:szCs w:val="28"/>
+              </w:rPr>
+              <w:t>RRL</w:t>
+            </w:r>
           </w:p>
         </w:tc>
         <w:tc>
@@ -4074,7 +4106,7 @@
                 <w:sz w:val="28"/>
                 <w:szCs w:val="28"/>
               </w:rPr>
-              <w:t>WIN</w:t>
+              <w:t xml:space="preserve"> B193</w:t>
             </w:r>
           </w:p>
         </w:tc>
@@ -4130,6 +4162,14 @@
                 <w:szCs w:val="28"/>
               </w:rPr>
             </w:pPr>
+            <w:r>
+              <w:rPr>
+                <w:rFonts w:ascii="Calibri" w:eastAsia="Calibri" w:hAnsi="Calibri" w:cs="Calibri"/>
+                <w:sz w:val="28"/>
+                <w:szCs w:val="28"/>
+              </w:rPr>
+              <w:t>HLV</w:t>
+            </w:r>
           </w:p>
         </w:tc>
         <w:tc>
@@ -4530,7 +4570,15 @@
                 <w:sz w:val="28"/>
                 <w:szCs w:val="28"/>
               </w:rPr>
-              <w:t>SRAT</w:t>
+              <w:t xml:space="preserve"> </w:t>
+            </w:r>
+            <w:r>
+              <w:rPr>
+                <w:rFonts w:ascii="Calibri" w:eastAsia="Calibri" w:hAnsi="Calibri" w:cs="Calibri"/>
+                <w:sz w:val="28"/>
+                <w:szCs w:val="28"/>
+              </w:rPr>
+              <w:t xml:space="preserve"> GAURAV</w:t>
             </w:r>
           </w:p>
         </w:tc>
@@ -4586,6 +4634,14 @@
                 <w:szCs w:val="28"/>
               </w:rPr>
             </w:pPr>
+            <w:r>
+              <w:rPr>
+                <w:rFonts w:ascii="Calibri" w:eastAsia="Calibri" w:hAnsi="Calibri" w:cs="Calibri"/>
+                <w:sz w:val="28"/>
+                <w:szCs w:val="28"/>
+              </w:rPr>
+              <w:t>HLV</w:t>
+            </w:r>
           </w:p>
         </w:tc>
         <w:tc>
@@ -5040,7 +5096,7 @@
                 <w:sz w:val="28"/>
                 <w:szCs w:val="28"/>
               </w:rPr>
-              <w:t>ICP</w:t>
+              <w:t>SHQ</w:t>
             </w:r>
           </w:p>
         </w:tc>
@@ -5267,7 +5323,7 @@
                 <w:sz w:val="28"/>
                 <w:szCs w:val="28"/>
               </w:rPr>
-              <w:t>SHQ</w:t>
+              <w:t>ICW</w:t>
             </w:r>
           </w:p>
         </w:tc>
@@ -5494,7 +5550,7 @@
                 <w:sz w:val="28"/>
                 <w:szCs w:val="28"/>
               </w:rPr>
-              <w:t>HERA</w:t>
+              <w:t>SLQ</w:t>
             </w:r>
           </w:p>
         </w:tc>
@@ -5721,7 +5777,7 @@
                 <w:sz w:val="28"/>
                 <w:szCs w:val="28"/>
               </w:rPr>
-              <w:t>BPB</w:t>
+              <w:t>NQO</w:t>
             </w:r>
           </w:p>
         </w:tc>
@@ -6181,7 +6237,7 @@
                 <w:sz w:val="28"/>
                 <w:szCs w:val="28"/>
               </w:rPr>
-              <w:t>JSUP</w:t>
+              <w:t>JYOTI</w:t>
             </w:r>
           </w:p>
         </w:tc>
@@ -6303,6 +6359,15 @@
                 <w:szCs w:val="28"/>
               </w:rPr>
               <w:t>WAITING</w:t>
+            </w:r>
+            <w:r>
+              <w:rPr>
+                <w:rFonts w:ascii="Calibri" w:eastAsia="Calibri" w:hAnsi="Calibri" w:cs="Calibri"/>
+                <w:b/>
+                <w:sz w:val="28"/>
+                <w:szCs w:val="28"/>
+              </w:rPr>
+              <w:t>:J.SUP</w:t>
             </w:r>
           </w:p>
         </w:tc>
@@ -7023,7 +7088,229 @@
                 <w:sz w:val="28"/>
                 <w:szCs w:val="28"/>
               </w:rPr>
-              <w:t>TCPP</w:t>
+              <w:t>UDAY</w:t>
+            </w:r>
+          </w:p>
+        </w:tc>
+        <w:tc>
+          <w:tcPr>
+            <w:tcW w:w="1524" w:type="dxa"/>
+            <w:tcBorders>
+              <w:top w:val="single" w:sz="4" w:space="0" w:color="000000"/>
+              <w:left w:val="single" w:sz="4" w:space="0" w:color="000000"/>
+              <w:bottom w:val="single" w:sz="4" w:space="0" w:color="000000"/>
+              <w:right w:val="single" w:sz="4" w:space="0" w:color="000000"/>
+            </w:tcBorders>
+            <w:shd w:val="clear" w:color="000000" w:fill="FFFFFF"/>
+            <w:tcMar>
+              <w:left w:w="108" w:type="dxa"/>
+              <w:right w:w="108" w:type="dxa"/>
+            </w:tcMar>
+          </w:tcPr>
+          <w:p>
+            <w:pPr>
+              <w:spacing w:after="0" w:line="240" w:lineRule="auto"/>
+              <w:rPr>
+                <w:rFonts w:ascii="Calibri" w:eastAsia="Calibri" w:hAnsi="Calibri" w:cs="Calibri"/>
+                <w:sz w:val="28"/>
+                <w:szCs w:val="28"/>
+              </w:rPr>
+            </w:pPr>
+          </w:p>
+        </w:tc>
+        <w:tc>
+          <w:tcPr>
+            <w:tcW w:w="795" w:type="dxa"/>
+            <w:tcBorders>
+              <w:top w:val="single" w:sz="4" w:space="0" w:color="000000"/>
+              <w:left w:val="single" w:sz="4" w:space="0" w:color="000000"/>
+              <w:bottom w:val="single" w:sz="4" w:space="0" w:color="000000"/>
+              <w:right w:val="single" w:sz="4" w:space="0" w:color="000000"/>
+            </w:tcBorders>
+            <w:shd w:val="clear" w:color="000000" w:fill="FFFFFF"/>
+            <w:tcMar>
+              <w:left w:w="108" w:type="dxa"/>
+              <w:right w:w="108" w:type="dxa"/>
+            </w:tcMar>
+          </w:tcPr>
+          <w:p>
+            <w:pPr>
+              <w:spacing w:after="0" w:line="240" w:lineRule="auto"/>
+              <w:jc w:val="center"/>
+              <w:rPr>
+                <w:rFonts w:ascii="Calibri" w:eastAsia="Calibri" w:hAnsi="Calibri" w:cs="Calibri"/>
+                <w:sz w:val="28"/>
+                <w:szCs w:val="28"/>
+              </w:rPr>
+            </w:pPr>
+          </w:p>
+        </w:tc>
+        <w:tc>
+          <w:tcPr>
+            <w:tcW w:w="1300" w:type="dxa"/>
+            <w:tcBorders>
+              <w:top w:val="single" w:sz="4" w:space="0" w:color="000000"/>
+              <w:left w:val="single" w:sz="4" w:space="0" w:color="000000"/>
+              <w:bottom w:val="single" w:sz="4" w:space="0" w:color="000000"/>
+              <w:right w:val="single" w:sz="4" w:space="0" w:color="000000"/>
+            </w:tcBorders>
+            <w:shd w:val="clear" w:color="000000" w:fill="FFFFFF"/>
+            <w:tcMar>
+              <w:left w:w="108" w:type="dxa"/>
+              <w:right w:w="108" w:type="dxa"/>
+            </w:tcMar>
+          </w:tcPr>
+          <w:p>
+            <w:pPr>
+              <w:spacing w:after="0" w:line="240" w:lineRule="auto"/>
+              <w:jc w:val="center"/>
+              <w:rPr>
+                <w:rFonts w:ascii="Calibri" w:eastAsia="Calibri" w:hAnsi="Calibri" w:cs="Calibri"/>
+                <w:sz w:val="28"/>
+                <w:szCs w:val="28"/>
+              </w:rPr>
+            </w:pPr>
+          </w:p>
+        </w:tc>
+      </w:tr>
+      <w:tr>
+        <w:tc>
+          <w:tcPr>
+            <w:tcW w:w="671" w:type="dxa"/>
+            <w:tcBorders>
+              <w:top w:val="single" w:sz="4" w:space="0" w:color="000000"/>
+              <w:left w:val="single" w:sz="4" w:space="0" w:color="000000"/>
+              <w:bottom w:val="single" w:sz="4" w:space="0" w:color="000000"/>
+              <w:right w:val="single" w:sz="4" w:space="0" w:color="000000"/>
+            </w:tcBorders>
+            <w:shd w:val="clear" w:color="000000" w:fill="FFFFFF"/>
+            <w:tcMar>
+              <w:left w:w="108" w:type="dxa"/>
+              <w:right w:w="108" w:type="dxa"/>
+            </w:tcMar>
+          </w:tcPr>
+          <w:p>
+            <w:pPr>
+              <w:spacing w:after="0" w:line="240" w:lineRule="auto"/>
+              <w:jc w:val="center"/>
+              <w:rPr>
+                <w:rFonts w:ascii="Calibri" w:eastAsia="Calibri" w:hAnsi="Calibri" w:cs="Calibri"/>
+                <w:sz w:val="28"/>
+                <w:szCs w:val="28"/>
+              </w:rPr>
+            </w:pPr>
+            <w:r>
+              <w:rPr>
+                <w:rFonts w:ascii="Calibri" w:eastAsia="Calibri" w:hAnsi="Calibri" w:cs="Calibri"/>
+                <w:sz w:val="28"/>
+                <w:szCs w:val="28"/>
+              </w:rPr>
+              <w:t>2</w:t>
+            </w:r>
+          </w:p>
+        </w:tc>
+        <w:tc>
+          <w:tcPr>
+            <w:tcW w:w="1604" w:type="dxa"/>
+            <w:tcBorders>
+              <w:top w:val="single" w:sz="4" w:space="0" w:color="000000"/>
+              <w:left w:val="single" w:sz="4" w:space="0" w:color="000000"/>
+              <w:bottom w:val="single" w:sz="4" w:space="0" w:color="000000"/>
+              <w:right w:val="single" w:sz="4" w:space="0" w:color="000000"/>
+            </w:tcBorders>
+            <w:shd w:val="clear" w:color="000000" w:fill="FFFFFF"/>
+            <w:tcMar>
+              <w:left w:w="108" w:type="dxa"/>
+              <w:right w:w="108" w:type="dxa"/>
+            </w:tcMar>
+          </w:tcPr>
+          <w:p>
+            <w:pPr>
+              <w:spacing w:after="0" w:line="240" w:lineRule="auto"/>
+              <w:jc w:val="center"/>
+              <w:rPr>
+                <w:rFonts w:ascii="Calibri" w:eastAsia="Calibri" w:hAnsi="Calibri" w:cs="Calibri"/>
+                <w:sz w:val="28"/>
+                <w:szCs w:val="28"/>
+              </w:rPr>
+            </w:pPr>
+            <w:r>
+              <w:rPr>
+                <w:rFonts w:ascii="Calibri" w:eastAsia="Calibri" w:hAnsi="Calibri" w:cs="Calibri"/>
+                <w:sz w:val="28"/>
+                <w:szCs w:val="28"/>
+              </w:rPr>
+              <w:t>09:00</w:t>
+            </w:r>
+          </w:p>
+        </w:tc>
+        <w:tc>
+          <w:tcPr>
+            <w:tcW w:w="1444" w:type="dxa"/>
+            <w:tcBorders>
+              <w:top w:val="single" w:sz="4" w:space="0" w:color="000000"/>
+              <w:left w:val="single" w:sz="4" w:space="0" w:color="000000"/>
+              <w:bottom w:val="single" w:sz="4" w:space="0" w:color="000000"/>
+              <w:right w:val="single" w:sz="4" w:space="0" w:color="000000"/>
+            </w:tcBorders>
+            <w:shd w:val="clear" w:color="000000" w:fill="FFFFFF"/>
+            <w:tcMar>
+              <w:left w:w="108" w:type="dxa"/>
+              <w:right w:w="108" w:type="dxa"/>
+            </w:tcMar>
+          </w:tcPr>
+          <w:p>
+            <w:pPr>
+              <w:spacing w:after="0" w:line="240" w:lineRule="auto"/>
+              <w:jc w:val="center"/>
+              <w:rPr>
+                <w:rFonts w:ascii="Calibri" w:eastAsia="Calibri" w:hAnsi="Calibri" w:cs="Calibri"/>
+                <w:sz w:val="28"/>
+                <w:szCs w:val="28"/>
+              </w:rPr>
+            </w:pPr>
+            <w:r>
+              <w:rPr>
+                <w:rFonts w:ascii="Calibri" w:eastAsia="Calibri" w:hAnsi="Calibri" w:cs="Calibri"/>
+                <w:sz w:val="28"/>
+                <w:szCs w:val="28"/>
+              </w:rPr>
+              <w:t>10:00</w:t>
+            </w:r>
+          </w:p>
+        </w:tc>
+        <w:tc>
+          <w:tcPr>
+            <w:tcW w:w="1842" w:type="dxa"/>
+            <w:tcBorders>
+              <w:top w:val="single" w:sz="4" w:space="0" w:color="000000"/>
+              <w:left w:val="single" w:sz="4" w:space="0" w:color="000000"/>
+              <w:bottom w:val="single" w:sz="4" w:space="0" w:color="000000"/>
+              <w:right w:val="single" w:sz="4" w:space="0" w:color="000000"/>
+            </w:tcBorders>
+            <w:shd w:val="clear" w:color="000000" w:fill="FFFFFF"/>
+            <w:tcMar>
+              <w:left w:w="108" w:type="dxa"/>
+              <w:right w:w="108" w:type="dxa"/>
+            </w:tcMar>
+          </w:tcPr>
+          <w:p>
+            <w:pPr>
+              <w:spacing w:after="0" w:line="240" w:lineRule="auto"/>
+              <w:jc w:val="center"/>
+              <w:rPr>
+                <w:rFonts w:ascii="Calibri" w:eastAsia="Calibri" w:hAnsi="Calibri" w:cs="Calibri"/>
+                <w:sz w:val="28"/>
+                <w:szCs w:val="28"/>
+              </w:rPr>
+            </w:pPr>
+            <w:r>
+              <w:rPr>
+                <w:rFonts w:ascii="Calibri" w:eastAsia="Calibri" w:hAnsi="Calibri" w:cs="Calibri"/>
+                <w:sz w:val="28"/>
+                <w:szCs w:val="28"/>
+              </w:rPr>
+              <w:t>UDAY</w:t>
             </w:r>
             <w:bookmarkStart w:id="0" w:name="_GoBack"/>
             <w:bookmarkEnd w:id="0"/>
@@ -7047,6 +7334,7 @@
           <w:p>
             <w:pPr>
               <w:spacing w:after="0" w:line="240" w:lineRule="auto"/>
+              <w:jc w:val="center"/>
               <w:rPr>
                 <w:rFonts w:ascii="Calibri" w:eastAsia="Calibri" w:hAnsi="Calibri" w:cs="Calibri"/>
                 <w:sz w:val="28"/>
@@ -7142,7 +7430,7 @@
                 <w:sz w:val="28"/>
                 <w:szCs w:val="28"/>
               </w:rPr>
-              <w:t>2</w:t>
+              <w:t>3</w:t>
             </w:r>
           </w:p>
         </w:tc>
@@ -7177,7 +7465,7 @@
                 <w:sz w:val="28"/>
                 <w:szCs w:val="28"/>
               </w:rPr>
-              <w:t>09:00</w:t>
+              <w:t>11:00</w:t>
             </w:r>
           </w:p>
         </w:tc>
@@ -7212,7 +7500,7 @@
                 <w:sz w:val="28"/>
                 <w:szCs w:val="28"/>
               </w:rPr>
-              <w:t>10:00</w:t>
+              <w:t>12:30</w:t>
             </w:r>
           </w:p>
         </w:tc>
@@ -7247,223 +7535,8 @@
                 <w:sz w:val="28"/>
                 <w:szCs w:val="28"/>
               </w:rPr>
-              <w:t>JIND</w:t>
-            </w:r>
-          </w:p>
-        </w:tc>
-        <w:tc>
-          <w:tcPr>
-            <w:tcW w:w="1524" w:type="dxa"/>
-            <w:tcBorders>
-              <w:top w:val="single" w:sz="4" w:space="0" w:color="000000"/>
-              <w:left w:val="single" w:sz="4" w:space="0" w:color="000000"/>
-              <w:bottom w:val="single" w:sz="4" w:space="0" w:color="000000"/>
-              <w:right w:val="single" w:sz="4" w:space="0" w:color="000000"/>
-            </w:tcBorders>
-            <w:shd w:val="clear" w:color="000000" w:fill="FFFFFF"/>
-            <w:tcMar>
-              <w:left w:w="108" w:type="dxa"/>
-              <w:right w:w="108" w:type="dxa"/>
-            </w:tcMar>
-          </w:tcPr>
-          <w:p>
-            <w:pPr>
-              <w:spacing w:after="0" w:line="240" w:lineRule="auto"/>
-              <w:jc w:val="center"/>
-              <w:rPr>
-                <w:rFonts w:ascii="Calibri" w:eastAsia="Calibri" w:hAnsi="Calibri" w:cs="Calibri"/>
-                <w:sz w:val="28"/>
-                <w:szCs w:val="28"/>
-              </w:rPr>
-            </w:pPr>
-          </w:p>
-        </w:tc>
-        <w:tc>
-          <w:tcPr>
-            <w:tcW w:w="795" w:type="dxa"/>
-            <w:tcBorders>
-              <w:top w:val="single" w:sz="4" w:space="0" w:color="000000"/>
-              <w:left w:val="single" w:sz="4" w:space="0" w:color="000000"/>
-              <w:bottom w:val="single" w:sz="4" w:space="0" w:color="000000"/>
-              <w:right w:val="single" w:sz="4" w:space="0" w:color="000000"/>
-            </w:tcBorders>
-            <w:shd w:val="clear" w:color="000000" w:fill="FFFFFF"/>
-            <w:tcMar>
-              <w:left w:w="108" w:type="dxa"/>
-              <w:right w:w="108" w:type="dxa"/>
-            </w:tcMar>
-          </w:tcPr>
-          <w:p>
-            <w:pPr>
-              <w:spacing w:after="0" w:line="240" w:lineRule="auto"/>
-              <w:jc w:val="center"/>
-              <w:rPr>
-                <w:rFonts w:ascii="Calibri" w:eastAsia="Calibri" w:hAnsi="Calibri" w:cs="Calibri"/>
-                <w:sz w:val="28"/>
-                <w:szCs w:val="28"/>
-              </w:rPr>
-            </w:pPr>
-          </w:p>
-        </w:tc>
-        <w:tc>
-          <w:tcPr>
-            <w:tcW w:w="1300" w:type="dxa"/>
-            <w:tcBorders>
-              <w:top w:val="single" w:sz="4" w:space="0" w:color="000000"/>
-              <w:left w:val="single" w:sz="4" w:space="0" w:color="000000"/>
-              <w:bottom w:val="single" w:sz="4" w:space="0" w:color="000000"/>
-              <w:right w:val="single" w:sz="4" w:space="0" w:color="000000"/>
-            </w:tcBorders>
-            <w:shd w:val="clear" w:color="000000" w:fill="FFFFFF"/>
-            <w:tcMar>
-              <w:left w:w="108" w:type="dxa"/>
-              <w:right w:w="108" w:type="dxa"/>
-            </w:tcMar>
-          </w:tcPr>
-          <w:p>
-            <w:pPr>
-              <w:spacing w:after="0" w:line="240" w:lineRule="auto"/>
-              <w:jc w:val="center"/>
-              <w:rPr>
-                <w:rFonts w:ascii="Calibri" w:eastAsia="Calibri" w:hAnsi="Calibri" w:cs="Calibri"/>
-                <w:sz w:val="28"/>
-                <w:szCs w:val="28"/>
-              </w:rPr>
-            </w:pPr>
-          </w:p>
-        </w:tc>
-      </w:tr>
-      <w:tr>
-        <w:tc>
-          <w:tcPr>
-            <w:tcW w:w="671" w:type="dxa"/>
-            <w:tcBorders>
-              <w:top w:val="single" w:sz="4" w:space="0" w:color="000000"/>
-              <w:left w:val="single" w:sz="4" w:space="0" w:color="000000"/>
-              <w:bottom w:val="single" w:sz="4" w:space="0" w:color="000000"/>
-              <w:right w:val="single" w:sz="4" w:space="0" w:color="000000"/>
-            </w:tcBorders>
-            <w:shd w:val="clear" w:color="000000" w:fill="FFFFFF"/>
-            <w:tcMar>
-              <w:left w:w="108" w:type="dxa"/>
-              <w:right w:w="108" w:type="dxa"/>
-            </w:tcMar>
-          </w:tcPr>
-          <w:p>
-            <w:pPr>
-              <w:spacing w:after="0" w:line="240" w:lineRule="auto"/>
-              <w:jc w:val="center"/>
-              <w:rPr>
-                <w:rFonts w:ascii="Calibri" w:eastAsia="Calibri" w:hAnsi="Calibri" w:cs="Calibri"/>
-                <w:sz w:val="28"/>
-                <w:szCs w:val="28"/>
-              </w:rPr>
-            </w:pPr>
-            <w:r>
-              <w:rPr>
-                <w:rFonts w:ascii="Calibri" w:eastAsia="Calibri" w:hAnsi="Calibri" w:cs="Calibri"/>
-                <w:sz w:val="28"/>
-                <w:szCs w:val="28"/>
-              </w:rPr>
-              <w:t>3</w:t>
-            </w:r>
-          </w:p>
-        </w:tc>
-        <w:tc>
-          <w:tcPr>
-            <w:tcW w:w="1604" w:type="dxa"/>
-            <w:tcBorders>
-              <w:top w:val="single" w:sz="4" w:space="0" w:color="000000"/>
-              <w:left w:val="single" w:sz="4" w:space="0" w:color="000000"/>
-              <w:bottom w:val="single" w:sz="4" w:space="0" w:color="000000"/>
-              <w:right w:val="single" w:sz="4" w:space="0" w:color="000000"/>
-            </w:tcBorders>
-            <w:shd w:val="clear" w:color="000000" w:fill="FFFFFF"/>
-            <w:tcMar>
-              <w:left w:w="108" w:type="dxa"/>
-              <w:right w:w="108" w:type="dxa"/>
-            </w:tcMar>
-          </w:tcPr>
-          <w:p>
-            <w:pPr>
-              <w:spacing w:after="0" w:line="240" w:lineRule="auto"/>
-              <w:jc w:val="center"/>
-              <w:rPr>
-                <w:rFonts w:ascii="Calibri" w:eastAsia="Calibri" w:hAnsi="Calibri" w:cs="Calibri"/>
-                <w:sz w:val="28"/>
-                <w:szCs w:val="28"/>
-              </w:rPr>
-            </w:pPr>
-            <w:r>
-              <w:rPr>
-                <w:rFonts w:ascii="Calibri" w:eastAsia="Calibri" w:hAnsi="Calibri" w:cs="Calibri"/>
-                <w:sz w:val="28"/>
-                <w:szCs w:val="28"/>
-              </w:rPr>
-              <w:t>11:00</w:t>
-            </w:r>
-          </w:p>
-        </w:tc>
-        <w:tc>
-          <w:tcPr>
-            <w:tcW w:w="1444" w:type="dxa"/>
-            <w:tcBorders>
-              <w:top w:val="single" w:sz="4" w:space="0" w:color="000000"/>
-              <w:left w:val="single" w:sz="4" w:space="0" w:color="000000"/>
-              <w:bottom w:val="single" w:sz="4" w:space="0" w:color="000000"/>
-              <w:right w:val="single" w:sz="4" w:space="0" w:color="000000"/>
-            </w:tcBorders>
-            <w:shd w:val="clear" w:color="000000" w:fill="FFFFFF"/>
-            <w:tcMar>
-              <w:left w:w="108" w:type="dxa"/>
-              <w:right w:w="108" w:type="dxa"/>
-            </w:tcMar>
-          </w:tcPr>
-          <w:p>
-            <w:pPr>
-              <w:spacing w:after="0" w:line="240" w:lineRule="auto"/>
-              <w:jc w:val="center"/>
-              <w:rPr>
-                <w:rFonts w:ascii="Calibri" w:eastAsia="Calibri" w:hAnsi="Calibri" w:cs="Calibri"/>
-                <w:sz w:val="28"/>
-                <w:szCs w:val="28"/>
-              </w:rPr>
-            </w:pPr>
-            <w:r>
-              <w:rPr>
-                <w:rFonts w:ascii="Calibri" w:eastAsia="Calibri" w:hAnsi="Calibri" w:cs="Calibri"/>
-                <w:sz w:val="28"/>
-                <w:szCs w:val="28"/>
-              </w:rPr>
-              <w:t>12:30</w:t>
-            </w:r>
-          </w:p>
-        </w:tc>
-        <w:tc>
-          <w:tcPr>
-            <w:tcW w:w="1842" w:type="dxa"/>
-            <w:tcBorders>
-              <w:top w:val="single" w:sz="4" w:space="0" w:color="000000"/>
-              <w:left w:val="single" w:sz="4" w:space="0" w:color="000000"/>
-              <w:bottom w:val="single" w:sz="4" w:space="0" w:color="000000"/>
-              <w:right w:val="single" w:sz="4" w:space="0" w:color="000000"/>
-            </w:tcBorders>
-            <w:shd w:val="clear" w:color="000000" w:fill="FFFFFF"/>
-            <w:tcMar>
-              <w:left w:w="108" w:type="dxa"/>
-              <w:right w:w="108" w:type="dxa"/>
-            </w:tcMar>
-          </w:tcPr>
-          <w:p>
-            <w:pPr>
-              <w:spacing w:after="0" w:line="240" w:lineRule="auto"/>
-              <w:jc w:val="center"/>
-              <w:rPr>
-                <w:rFonts w:ascii="Calibri" w:eastAsia="Calibri" w:hAnsi="Calibri" w:cs="Calibri"/>
-                <w:sz w:val="28"/>
-                <w:szCs w:val="28"/>
-              </w:rPr>
-            </w:pPr>
+              <w:t>L/O</w:t>
+            </w:r>
           </w:p>
         </w:tc>
         <w:tc>
@@ -7938,10 +8011,10 @@
         <w:szCs w:val="28"/>
       </w:rPr>
       <w:object w:dxaOrig="1188" w:dyaOrig="900">
-        <v:rect id="_x0000_i1025" style="width:56.25pt;height:39pt" o:ole="" o:preferrelative="t" stroked="f">
+        <v:rect id="_x0000_i1025" style="width:56.35pt;height:38.8pt" o:ole="" o:preferrelative="t" stroked="f">
           <v:imagedata r:id="rId1" o:title=""/>
         </v:rect>
-        <o:OLEObject Type="Embed" ProgID="StaticMetafile" ShapeID="_x0000_i1025" DrawAspect="Content" ObjectID="_1852896236" r:id="rId2"/>
+        <o:OLEObject Type="Embed" ProgID="StaticMetafile" ShapeID="_x0000_i1025" DrawAspect="Content" ObjectID="_1852980906" r:id="rId2"/>
       </w:object>
     </w:r>
     <w:r>
@@ -7989,7 +8062,7 @@
         <w:sz w:val="28"/>
         <w:szCs w:val="28"/>
       </w:rPr>
-      <w:t>8</w:t>
+      <w:t>9</w:t>
     </w:r>
     <w:r>
       <w:rPr>
@@ -8019,17 +8092,7 @@
         <w:sz w:val="28"/>
         <w:szCs w:val="28"/>
       </w:rPr>
-      <w:t>THUR</w:t>
-    </w:r>
-    <w:r>
-      <w:rPr>
-        <w:rFonts w:cs="Times New Roman"/>
-        <w:b/>
-        <w:color w:val="000000" w:themeColor="text1"/>
-        <w:sz w:val="28"/>
-        <w:szCs w:val="28"/>
-      </w:rPr>
-      <w:t>S</w:t>
+      <w:t>FRI</w:t>
     </w:r>
     <w:r>
       <w:rPr>

</xml_diff>

<commit_message>
Sync - 2026-10-08 18:04
</commit_message>
<xml_diff>
--- a/files/Daily_Helicopter_Schedule.docx
+++ b/files/Daily_Helicopter_Schedule.docx
@@ -651,7 +651,7 @@
                 <w:sz w:val="28"/>
                 <w:szCs w:val="28"/>
               </w:rPr>
-              <w:t>GVHL 412</w:t>
+              <w:t>GVHL 169</w:t>
             </w:r>
           </w:p>
         </w:tc>
@@ -686,7 +686,7 @@
                 <w:sz w:val="28"/>
                 <w:szCs w:val="28"/>
               </w:rPr>
-              <w:t>GVT</w:t>
+              <w:t>RRL</w:t>
             </w:r>
           </w:p>
         </w:tc>
@@ -2560,7 +2560,7 @@
                 <w:sz w:val="28"/>
                 <w:szCs w:val="28"/>
               </w:rPr>
-              <w:t>RRJ</w:t>
+              <w:t>GVT</w:t>
             </w:r>
           </w:p>
         </w:tc>
@@ -3104,7 +3104,7 @@
                 <w:sz w:val="28"/>
                 <w:szCs w:val="28"/>
               </w:rPr>
-              <w:t>BLQ2</w:t>
+              <w:t>NA</w:t>
             </w:r>
           </w:p>
         </w:tc>
@@ -3161,14 +3161,6 @@
                 <w:szCs w:val="28"/>
               </w:rPr>
             </w:pPr>
-            <w:r>
-              <w:rPr>
-                <w:rFonts w:ascii="Calibri" w:eastAsia="Calibri" w:hAnsi="Calibri" w:cs="Calibri"/>
-                <w:sz w:val="28"/>
-                <w:szCs w:val="28"/>
-              </w:rPr>
-              <w:t>RRL</w:t>
-            </w:r>
           </w:p>
         </w:tc>
         <w:tc>
@@ -3343,7 +3335,7 @@
                 <w:sz w:val="28"/>
                 <w:szCs w:val="28"/>
               </w:rPr>
-              <w:t>BLQ2</w:t>
+              <w:t>NA</w:t>
             </w:r>
           </w:p>
         </w:tc>
@@ -3400,14 +3392,6 @@
                 <w:szCs w:val="28"/>
               </w:rPr>
             </w:pPr>
-            <w:r>
-              <w:rPr>
-                <w:rFonts w:ascii="Calibri" w:eastAsia="Calibri" w:hAnsi="Calibri" w:cs="Calibri"/>
-                <w:sz w:val="28"/>
-                <w:szCs w:val="28"/>
-              </w:rPr>
-              <w:t>RRL</w:t>
-            </w:r>
           </w:p>
         </w:tc>
         <w:tc>
@@ -3586,7 +3570,7 @@
                 <w:sz w:val="28"/>
                 <w:szCs w:val="28"/>
               </w:rPr>
-              <w:t>BLQ2</w:t>
+              <w:t>NA</w:t>
             </w:r>
           </w:p>
         </w:tc>
@@ -3643,14 +3627,6 @@
                 <w:szCs w:val="28"/>
               </w:rPr>
             </w:pPr>
-            <w:r>
-              <w:rPr>
-                <w:rFonts w:ascii="Calibri" w:eastAsia="Calibri" w:hAnsi="Calibri" w:cs="Calibri"/>
-                <w:sz w:val="28"/>
-                <w:szCs w:val="28"/>
-              </w:rPr>
-              <w:t>RRL</w:t>
-            </w:r>
           </w:p>
         </w:tc>
         <w:tc>
@@ -4570,16 +4546,10 @@
                 <w:sz w:val="28"/>
                 <w:szCs w:val="28"/>
               </w:rPr>
-              <w:t xml:space="preserve"> </w:t>
-            </w:r>
-            <w:r>
-              <w:rPr>
-                <w:rFonts w:ascii="Calibri" w:eastAsia="Calibri" w:hAnsi="Calibri" w:cs="Calibri"/>
-                <w:sz w:val="28"/>
-                <w:szCs w:val="28"/>
-              </w:rPr>
-              <w:t xml:space="preserve"> GAURAV</w:t>
-            </w:r>
+              <w:t>BLQ2</w:t>
+            </w:r>
+            <w:bookmarkStart w:id="0" w:name="_GoBack"/>
+            <w:bookmarkEnd w:id="0"/>
           </w:p>
         </w:tc>
         <w:tc>
@@ -4809,39 +4779,38 @@
             <w:r>
               <w:rPr>
                 <w:rFonts w:ascii="Calibri" w:eastAsia="Calibri" w:hAnsi="Calibri" w:cs="Calibri"/>
+                <w:sz w:val="28"/>
+                <w:szCs w:val="28"/>
+              </w:rPr>
+              <w:t xml:space="preserve">  GAURAV</w:t>
+            </w:r>
+          </w:p>
+        </w:tc>
+        <w:tc>
+          <w:tcPr>
+            <w:tcW w:w="1574" w:type="dxa"/>
+            <w:tcBorders>
+              <w:top w:val="single" w:sz="4" w:space="0" w:color="000000"/>
+              <w:left w:val="single" w:sz="4" w:space="0" w:color="000000"/>
+              <w:bottom w:val="single" w:sz="4" w:space="0" w:color="000000"/>
+              <w:right w:val="single" w:sz="4" w:space="0" w:color="000000"/>
+            </w:tcBorders>
+            <w:shd w:val="clear" w:color="000000" w:fill="FFFFFF"/>
+            <w:tcMar>
+              <w:left w:w="108" w:type="dxa"/>
+              <w:right w:w="108" w:type="dxa"/>
+            </w:tcMar>
+          </w:tcPr>
+          <w:p>
+            <w:pPr>
+              <w:spacing w:after="0" w:line="240" w:lineRule="auto"/>
+              <w:jc w:val="center"/>
+              <w:rPr>
+                <w:rFonts w:ascii="Calibri" w:eastAsia="Calibri" w:hAnsi="Calibri" w:cs="Calibri"/>
                 <w:b/>
                 <w:sz w:val="28"/>
                 <w:szCs w:val="28"/>
               </w:rPr>
-              <w:t>NA</w:t>
-            </w:r>
-          </w:p>
-        </w:tc>
-        <w:tc>
-          <w:tcPr>
-            <w:tcW w:w="1574" w:type="dxa"/>
-            <w:tcBorders>
-              <w:top w:val="single" w:sz="4" w:space="0" w:color="000000"/>
-              <w:left w:val="single" w:sz="4" w:space="0" w:color="000000"/>
-              <w:bottom w:val="single" w:sz="4" w:space="0" w:color="000000"/>
-              <w:right w:val="single" w:sz="4" w:space="0" w:color="000000"/>
-            </w:tcBorders>
-            <w:shd w:val="clear" w:color="000000" w:fill="FFFFFF"/>
-            <w:tcMar>
-              <w:left w:w="108" w:type="dxa"/>
-              <w:right w:w="108" w:type="dxa"/>
-            </w:tcMar>
-          </w:tcPr>
-          <w:p>
-            <w:pPr>
-              <w:spacing w:after="0" w:line="240" w:lineRule="auto"/>
-              <w:jc w:val="center"/>
-              <w:rPr>
-                <w:rFonts w:ascii="Calibri" w:eastAsia="Calibri" w:hAnsi="Calibri" w:cs="Calibri"/>
-                <w:b/>
-                <w:sz w:val="28"/>
-                <w:szCs w:val="28"/>
-              </w:rPr>
             </w:pPr>
           </w:p>
         </w:tc>
@@ -4870,6 +4839,14 @@
                 <w:szCs w:val="28"/>
               </w:rPr>
             </w:pPr>
+            <w:r>
+              <w:rPr>
+                <w:rFonts w:ascii="Calibri" w:eastAsia="Calibri" w:hAnsi="Calibri" w:cs="Calibri"/>
+                <w:sz w:val="28"/>
+                <w:szCs w:val="28"/>
+              </w:rPr>
+              <w:t>HLV</w:t>
+            </w:r>
           </w:p>
         </w:tc>
         <w:tc>
@@ -7312,8 +7289,6 @@
               </w:rPr>
               <w:t>UDAY</w:t>
             </w:r>
-            <w:bookmarkStart w:id="0" w:name="_GoBack"/>
-            <w:bookmarkEnd w:id="0"/>
           </w:p>
         </w:tc>
         <w:tc>
@@ -8014,7 +7989,7 @@
         <v:rect id="_x0000_i1025" style="width:56.35pt;height:38.8pt" o:ole="" o:preferrelative="t" stroked="f">
           <v:imagedata r:id="rId1" o:title=""/>
         </v:rect>
-        <o:OLEObject Type="Embed" ProgID="StaticMetafile" ShapeID="_x0000_i1025" DrawAspect="Content" ObjectID="_1852980906" r:id="rId2"/>
+        <o:OLEObject Type="Embed" ProgID="StaticMetafile" ShapeID="_x0000_i1025" DrawAspect="Content" ObjectID="_1852986128" r:id="rId2"/>
       </w:object>
     </w:r>
     <w:r>

</xml_diff>

<commit_message>
Sync - 2026-10-09 16:08
</commit_message>
<xml_diff>
--- a/files/Daily_Helicopter_Schedule.docx
+++ b/files/Daily_Helicopter_Schedule.docx
@@ -651,7 +651,7 @@
                 <w:sz w:val="28"/>
                 <w:szCs w:val="28"/>
               </w:rPr>
-              <w:t>GVHL 169</w:t>
+              <w:t>HELIGO 412</w:t>
             </w:r>
           </w:p>
         </w:tc>
@@ -686,7 +686,7 @@
                 <w:sz w:val="28"/>
                 <w:szCs w:val="28"/>
               </w:rPr>
-              <w:t>RRL</w:t>
+              <w:t>HLV</w:t>
             </w:r>
           </w:p>
         </w:tc>
@@ -1116,7 +1116,7 @@
                 <w:sz w:val="28"/>
                 <w:szCs w:val="28"/>
               </w:rPr>
-              <w:t>SF (D)+NF[D]</w:t>
+              <w:t>SF (D)</w:t>
             </w:r>
           </w:p>
         </w:tc>
@@ -1366,7 +1366,7 @@
                 <w:sz w:val="28"/>
                 <w:szCs w:val="28"/>
               </w:rPr>
-              <w:t>NA</w:t>
+              <w:t>NF[D]</w:t>
             </w:r>
           </w:p>
         </w:tc>
@@ -1401,7 +1401,7 @@
                 <w:sz w:val="28"/>
                 <w:szCs w:val="28"/>
               </w:rPr>
-              <w:t>NA</w:t>
+              <w:t>GVHL 412</w:t>
             </w:r>
           </w:p>
         </w:tc>
@@ -1436,7 +1436,7 @@
                 <w:sz w:val="28"/>
                 <w:szCs w:val="28"/>
               </w:rPr>
-              <w:t>NA</w:t>
+              <w:t>RRJ</w:t>
             </w:r>
           </w:p>
         </w:tc>
@@ -1471,7 +1471,257 @@
                 <w:sz w:val="28"/>
                 <w:szCs w:val="28"/>
               </w:rPr>
-              <w:t>00</w:t>
+              <w:t>06</w:t>
+            </w:r>
+          </w:p>
+        </w:tc>
+      </w:tr>
+      <w:tr>
+        <w:trPr>
+          <w:trHeight w:val="308"/>
+        </w:trPr>
+        <w:tc>
+          <w:tcPr>
+            <w:tcW w:w="735" w:type="dxa"/>
+            <w:tcBorders>
+              <w:top w:val="single" w:sz="4" w:space="0" w:color="000000"/>
+              <w:left w:val="single" w:sz="4" w:space="0" w:color="000000"/>
+              <w:bottom w:val="single" w:sz="4" w:space="0" w:color="000000"/>
+              <w:right w:val="single" w:sz="4" w:space="0" w:color="000000"/>
+            </w:tcBorders>
+            <w:shd w:val="clear" w:color="auto" w:fill="auto"/>
+            <w:tcMar>
+              <w:left w:w="108" w:type="dxa"/>
+              <w:right w:w="108" w:type="dxa"/>
+            </w:tcMar>
+          </w:tcPr>
+          <w:p>
+            <w:pPr>
+              <w:spacing w:after="0" w:line="240" w:lineRule="auto"/>
+              <w:jc w:val="center"/>
+              <w:rPr>
+                <w:rFonts w:ascii="Calibri" w:eastAsia="Calibri" w:hAnsi="Calibri" w:cs="Calibri"/>
+                <w:sz w:val="28"/>
+                <w:szCs w:val="28"/>
+              </w:rPr>
+            </w:pPr>
+            <w:r>
+              <w:rPr>
+                <w:rFonts w:ascii="Calibri" w:eastAsia="Calibri" w:hAnsi="Calibri" w:cs="Calibri"/>
+                <w:sz w:val="28"/>
+                <w:szCs w:val="28"/>
+              </w:rPr>
+              <w:t>5</w:t>
+            </w:r>
+          </w:p>
+        </w:tc>
+        <w:tc>
+          <w:tcPr>
+            <w:tcW w:w="1628" w:type="dxa"/>
+            <w:tcBorders>
+              <w:top w:val="single" w:sz="4" w:space="0" w:color="000000"/>
+              <w:left w:val="single" w:sz="4" w:space="0" w:color="000000"/>
+              <w:bottom w:val="single" w:sz="4" w:space="0" w:color="000000"/>
+              <w:right w:val="single" w:sz="4" w:space="0" w:color="000000"/>
+            </w:tcBorders>
+            <w:shd w:val="clear" w:color="auto" w:fill="auto"/>
+            <w:tcMar>
+              <w:left w:w="108" w:type="dxa"/>
+              <w:right w:w="108" w:type="dxa"/>
+            </w:tcMar>
+          </w:tcPr>
+          <w:p>
+            <w:pPr>
+              <w:spacing w:after="0" w:line="240" w:lineRule="auto"/>
+              <w:jc w:val="center"/>
+              <w:rPr>
+                <w:rFonts w:ascii="Calibri" w:eastAsia="Calibri" w:hAnsi="Calibri" w:cs="Calibri"/>
+                <w:sz w:val="28"/>
+                <w:szCs w:val="28"/>
+              </w:rPr>
+            </w:pPr>
+            <w:r>
+              <w:rPr>
+                <w:rFonts w:ascii="Calibri" w:eastAsia="Calibri" w:hAnsi="Calibri" w:cs="Calibri"/>
+                <w:sz w:val="28"/>
+                <w:szCs w:val="28"/>
+              </w:rPr>
+              <w:t>06:30</w:t>
+            </w:r>
+          </w:p>
+        </w:tc>
+        <w:tc>
+          <w:tcPr>
+            <w:tcW w:w="1480" w:type="dxa"/>
+            <w:tcBorders>
+              <w:top w:val="single" w:sz="4" w:space="0" w:color="000000"/>
+              <w:left w:val="single" w:sz="4" w:space="0" w:color="000000"/>
+              <w:bottom w:val="single" w:sz="4" w:space="0" w:color="000000"/>
+              <w:right w:val="single" w:sz="4" w:space="0" w:color="000000"/>
+            </w:tcBorders>
+            <w:shd w:val="clear" w:color="auto" w:fill="auto"/>
+            <w:tcMar>
+              <w:left w:w="108" w:type="dxa"/>
+              <w:right w:w="108" w:type="dxa"/>
+            </w:tcMar>
+          </w:tcPr>
+          <w:p>
+            <w:pPr>
+              <w:spacing w:after="0" w:line="240" w:lineRule="auto"/>
+              <w:jc w:val="center"/>
+              <w:rPr>
+                <w:rFonts w:ascii="Calibri" w:eastAsia="Calibri" w:hAnsi="Calibri" w:cs="Calibri"/>
+                <w:sz w:val="28"/>
+                <w:szCs w:val="28"/>
+              </w:rPr>
+            </w:pPr>
+            <w:r>
+              <w:rPr>
+                <w:rFonts w:ascii="Calibri" w:eastAsia="Calibri" w:hAnsi="Calibri" w:cs="Calibri"/>
+                <w:sz w:val="28"/>
+                <w:szCs w:val="28"/>
+              </w:rPr>
+              <w:t>09:00</w:t>
+            </w:r>
+          </w:p>
+        </w:tc>
+        <w:tc>
+          <w:tcPr>
+            <w:tcW w:w="2529" w:type="dxa"/>
+            <w:tcBorders>
+              <w:top w:val="single" w:sz="4" w:space="0" w:color="000000"/>
+              <w:left w:val="single" w:sz="4" w:space="0" w:color="000000"/>
+              <w:bottom w:val="single" w:sz="4" w:space="0" w:color="000000"/>
+              <w:right w:val="single" w:sz="4" w:space="0" w:color="000000"/>
+            </w:tcBorders>
+            <w:shd w:val="clear" w:color="auto" w:fill="auto"/>
+            <w:tcMar>
+              <w:left w:w="108" w:type="dxa"/>
+              <w:right w:w="108" w:type="dxa"/>
+            </w:tcMar>
+          </w:tcPr>
+          <w:p>
+            <w:pPr>
+              <w:spacing w:after="0" w:line="240" w:lineRule="auto"/>
+              <w:jc w:val="center"/>
+              <w:rPr>
+                <w:rFonts w:ascii="Calibri" w:eastAsia="Calibri" w:hAnsi="Calibri" w:cs="Calibri"/>
+                <w:sz w:val="28"/>
+                <w:szCs w:val="28"/>
+              </w:rPr>
+            </w:pPr>
+            <w:r>
+              <w:rPr>
+                <w:rFonts w:ascii="Calibri" w:eastAsia="Calibri" w:hAnsi="Calibri" w:cs="Calibri"/>
+                <w:sz w:val="28"/>
+                <w:szCs w:val="28"/>
+              </w:rPr>
+              <w:t>TAPTI via RATNA</w:t>
+            </w:r>
+          </w:p>
+        </w:tc>
+        <w:tc>
+          <w:tcPr>
+            <w:tcW w:w="1574" w:type="dxa"/>
+            <w:tcBorders>
+              <w:top w:val="single" w:sz="4" w:space="0" w:color="000000"/>
+              <w:left w:val="single" w:sz="4" w:space="0" w:color="000000"/>
+              <w:bottom w:val="single" w:sz="4" w:space="0" w:color="000000"/>
+              <w:right w:val="single" w:sz="4" w:space="0" w:color="000000"/>
+            </w:tcBorders>
+            <w:shd w:val="clear" w:color="auto" w:fill="auto"/>
+            <w:tcMar>
+              <w:left w:w="108" w:type="dxa"/>
+              <w:right w:w="108" w:type="dxa"/>
+            </w:tcMar>
+          </w:tcPr>
+          <w:p>
+            <w:pPr>
+              <w:spacing w:after="0" w:line="240" w:lineRule="auto"/>
+              <w:jc w:val="center"/>
+              <w:rPr>
+                <w:rFonts w:ascii="Calibri" w:eastAsia="Calibri" w:hAnsi="Calibri" w:cs="Calibri"/>
+                <w:sz w:val="28"/>
+                <w:szCs w:val="28"/>
+              </w:rPr>
+            </w:pPr>
+            <w:r>
+              <w:rPr>
+                <w:rFonts w:ascii="Calibri" w:eastAsia="Calibri" w:hAnsi="Calibri" w:cs="Calibri"/>
+                <w:sz w:val="28"/>
+                <w:szCs w:val="28"/>
+              </w:rPr>
+              <w:t>GVHL 412</w:t>
+            </w:r>
+          </w:p>
+        </w:tc>
+        <w:tc>
+          <w:tcPr>
+            <w:tcW w:w="1360" w:type="dxa"/>
+            <w:tcBorders>
+              <w:top w:val="single" w:sz="4" w:space="0" w:color="000000"/>
+              <w:left w:val="single" w:sz="4" w:space="0" w:color="000000"/>
+              <w:bottom w:val="single" w:sz="4" w:space="0" w:color="000000"/>
+              <w:right w:val="single" w:sz="4" w:space="0" w:color="000000"/>
+            </w:tcBorders>
+            <w:shd w:val="clear" w:color="auto" w:fill="auto"/>
+            <w:tcMar>
+              <w:left w:w="108" w:type="dxa"/>
+              <w:right w:w="108" w:type="dxa"/>
+            </w:tcMar>
+          </w:tcPr>
+          <w:p>
+            <w:pPr>
+              <w:spacing w:after="0" w:line="240" w:lineRule="auto"/>
+              <w:jc w:val="center"/>
+              <w:rPr>
+                <w:rFonts w:ascii="Calibri" w:eastAsia="Calibri" w:hAnsi="Calibri" w:cs="Calibri"/>
+                <w:sz w:val="28"/>
+                <w:szCs w:val="28"/>
+              </w:rPr>
+            </w:pPr>
+            <w:r>
+              <w:rPr>
+                <w:rFonts w:ascii="Calibri" w:eastAsia="Calibri" w:hAnsi="Calibri" w:cs="Calibri"/>
+                <w:sz w:val="28"/>
+                <w:szCs w:val="28"/>
+              </w:rPr>
+              <w:t>GVT</w:t>
+            </w:r>
+          </w:p>
+        </w:tc>
+        <w:tc>
+          <w:tcPr>
+            <w:tcW w:w="1332" w:type="dxa"/>
+            <w:tcBorders>
+              <w:top w:val="single" w:sz="4" w:space="0" w:color="000000"/>
+              <w:left w:val="single" w:sz="4" w:space="0" w:color="000000"/>
+              <w:bottom w:val="single" w:sz="4" w:space="0" w:color="000000"/>
+              <w:right w:val="single" w:sz="4" w:space="0" w:color="000000"/>
+            </w:tcBorders>
+            <w:shd w:val="clear" w:color="000000" w:fill="FFFFFF"/>
+            <w:tcMar>
+              <w:left w:w="108" w:type="dxa"/>
+              <w:right w:w="108" w:type="dxa"/>
+            </w:tcMar>
+          </w:tcPr>
+          <w:p>
+            <w:pPr>
+              <w:spacing w:after="0" w:line="240" w:lineRule="auto"/>
+              <w:jc w:val="center"/>
+              <w:rPr>
+                <w:rFonts w:ascii="Calibri" w:eastAsia="Calibri" w:hAnsi="Calibri" w:cs="Calibri"/>
+                <w:sz w:val="28"/>
+                <w:szCs w:val="28"/>
+              </w:rPr>
+            </w:pPr>
+            <w:r>
+              <w:rPr>
+                <w:rFonts w:ascii="Calibri" w:eastAsia="Calibri" w:hAnsi="Calibri" w:cs="Calibri"/>
+                <w:sz w:val="28"/>
+                <w:szCs w:val="28"/>
+              </w:rPr>
+              <w:t>05</w:t>
             </w:r>
           </w:p>
         </w:tc>
@@ -1643,15 +1893,7 @@
                 <w:sz w:val="28"/>
                 <w:szCs w:val="28"/>
               </w:rPr>
-              <w:t>1</w:t>
-            </w:r>
-            <w:r>
-              <w:rPr>
-                <w:rFonts w:ascii="Calibri" w:eastAsia="Calibri" w:hAnsi="Calibri" w:cs="Calibri"/>
-                <w:sz w:val="28"/>
-                <w:szCs w:val="28"/>
-              </w:rPr>
-              <w:t>:0</w:t>
+              <w:t>0:3</w:t>
             </w:r>
             <w:r>
               <w:rPr>
@@ -1737,7 +1979,7 @@
                 <w:sz w:val="28"/>
                 <w:szCs w:val="28"/>
               </w:rPr>
-              <w:t>NA</w:t>
+              <w:t>GVHL 169</w:t>
             </w:r>
           </w:p>
         </w:tc>
@@ -1772,7 +2014,7 @@
                 <w:sz w:val="28"/>
                 <w:szCs w:val="28"/>
               </w:rPr>
-              <w:t>NA</w:t>
+              <w:t>RRL</w:t>
             </w:r>
           </w:p>
         </w:tc>
@@ -1807,7 +2049,7 @@
                 <w:sz w:val="28"/>
                 <w:szCs w:val="28"/>
               </w:rPr>
-              <w:t>00</w:t>
+              <w:t>05</w:t>
             </w:r>
           </w:p>
         </w:tc>
@@ -2560,7 +2802,7 @@
                 <w:sz w:val="28"/>
                 <w:szCs w:val="28"/>
               </w:rPr>
-              <w:t>GVT</w:t>
+              <w:t>RRI</w:t>
             </w:r>
           </w:p>
         </w:tc>
@@ -4082,7 +4324,7 @@
                 <w:sz w:val="28"/>
                 <w:szCs w:val="28"/>
               </w:rPr>
-              <w:t xml:space="preserve"> B193</w:t>
+              <w:t>NA</w:t>
             </w:r>
           </w:p>
         </w:tc>
@@ -4138,14 +4380,6 @@
                 <w:szCs w:val="28"/>
               </w:rPr>
             </w:pPr>
-            <w:r>
-              <w:rPr>
-                <w:rFonts w:ascii="Calibri" w:eastAsia="Calibri" w:hAnsi="Calibri" w:cs="Calibri"/>
-                <w:sz w:val="28"/>
-                <w:szCs w:val="28"/>
-              </w:rPr>
-              <w:t>HLV</w:t>
-            </w:r>
           </w:p>
         </w:tc>
         <w:tc>
@@ -4546,10 +4780,8 @@
                 <w:sz w:val="28"/>
                 <w:szCs w:val="28"/>
               </w:rPr>
-              <w:t>BLQ2</w:t>
-            </w:r>
-            <w:bookmarkStart w:id="0" w:name="_GoBack"/>
-            <w:bookmarkEnd w:id="0"/>
+              <w:t>NA</w:t>
+            </w:r>
           </w:p>
         </w:tc>
         <w:tc>
@@ -4604,14 +4836,6 @@
                 <w:szCs w:val="28"/>
               </w:rPr>
             </w:pPr>
-            <w:r>
-              <w:rPr>
-                <w:rFonts w:ascii="Calibri" w:eastAsia="Calibri" w:hAnsi="Calibri" w:cs="Calibri"/>
-                <w:sz w:val="28"/>
-                <w:szCs w:val="28"/>
-              </w:rPr>
-              <w:t>HLV</w:t>
-            </w:r>
           </w:p>
         </w:tc>
         <w:tc>
@@ -4782,7 +5006,7 @@
                 <w:sz w:val="28"/>
                 <w:szCs w:val="28"/>
               </w:rPr>
-              <w:t xml:space="preserve">  GAURAV</w:t>
+              <w:t>NA</w:t>
             </w:r>
           </w:p>
         </w:tc>
@@ -4839,14 +5063,6 @@
                 <w:szCs w:val="28"/>
               </w:rPr>
             </w:pPr>
-            <w:r>
-              <w:rPr>
-                <w:rFonts w:ascii="Calibri" w:eastAsia="Calibri" w:hAnsi="Calibri" w:cs="Calibri"/>
-                <w:sz w:val="28"/>
-                <w:szCs w:val="28"/>
-              </w:rPr>
-              <w:t>HLV</w:t>
-            </w:r>
           </w:p>
         </w:tc>
         <w:tc>
@@ -5073,7 +5289,7 @@
                 <w:sz w:val="28"/>
                 <w:szCs w:val="28"/>
               </w:rPr>
-              <w:t>SHQ</w:t>
+              <w:t>ARMADA2</w:t>
             </w:r>
           </w:p>
         </w:tc>
@@ -5300,7 +5516,7 @@
                 <w:sz w:val="28"/>
                 <w:szCs w:val="28"/>
               </w:rPr>
-              <w:t>ICW</w:t>
+              <w:t>SHAKTI</w:t>
             </w:r>
           </w:p>
         </w:tc>
@@ -5527,7 +5743,7 @@
                 <w:sz w:val="28"/>
                 <w:szCs w:val="28"/>
               </w:rPr>
-              <w:t>SLQ</w:t>
+              <w:t>UDAY</w:t>
             </w:r>
           </w:p>
         </w:tc>
@@ -5754,7 +5970,7 @@
                 <w:sz w:val="28"/>
                 <w:szCs w:val="28"/>
               </w:rPr>
-              <w:t>NQO</w:t>
+              <w:t>ABN4</w:t>
             </w:r>
           </w:p>
         </w:tc>
@@ -5988,7 +6204,7 @@
                 <w:sz w:val="28"/>
                 <w:szCs w:val="28"/>
               </w:rPr>
-              <w:t>MNW</w:t>
+              <w:t>VKDN2</w:t>
             </w:r>
           </w:p>
         </w:tc>
@@ -6214,7 +6430,7 @@
                 <w:sz w:val="28"/>
                 <w:szCs w:val="28"/>
               </w:rPr>
-              <w:t>JYOTI</w:t>
+              <w:t>J SUP</w:t>
             </w:r>
           </w:p>
         </w:tc>
@@ -6344,7 +6560,7 @@
                 <w:sz w:val="28"/>
                 <w:szCs w:val="28"/>
               </w:rPr>
-              <w:t>:J.SUP</w:t>
+              <w:t>:</w:t>
             </w:r>
           </w:p>
         </w:tc>
@@ -7065,8 +7281,10 @@
                 <w:sz w:val="28"/>
                 <w:szCs w:val="28"/>
               </w:rPr>
-              <w:t>UDAY</w:t>
-            </w:r>
+              <w:t>TAPTI</w:t>
+            </w:r>
+            <w:bookmarkStart w:id="0" w:name="_GoBack"/>
+            <w:bookmarkEnd w:id="0"/>
           </w:p>
         </w:tc>
         <w:tc>
@@ -7120,6 +7338,14 @@
                 <w:szCs w:val="28"/>
               </w:rPr>
             </w:pPr>
+            <w:r>
+              <w:rPr>
+                <w:rFonts w:ascii="Calibri" w:eastAsia="Calibri" w:hAnsi="Calibri" w:cs="Calibri"/>
+                <w:sz w:val="28"/>
+                <w:szCs w:val="28"/>
+              </w:rPr>
+              <w:t>GVT</w:t>
+            </w:r>
           </w:p>
         </w:tc>
         <w:tc>
@@ -7281,14 +7507,6 @@
                 <w:szCs w:val="28"/>
               </w:rPr>
             </w:pPr>
-            <w:r>
-              <w:rPr>
-                <w:rFonts w:ascii="Calibri" w:eastAsia="Calibri" w:hAnsi="Calibri" w:cs="Calibri"/>
-                <w:sz w:val="28"/>
-                <w:szCs w:val="28"/>
-              </w:rPr>
-              <w:t>UDAY</w:t>
-            </w:r>
           </w:p>
         </w:tc>
         <w:tc>
@@ -7343,6 +7561,14 @@
                 <w:szCs w:val="28"/>
               </w:rPr>
             </w:pPr>
+            <w:r>
+              <w:rPr>
+                <w:rFonts w:ascii="Calibri" w:eastAsia="Calibri" w:hAnsi="Calibri" w:cs="Calibri"/>
+                <w:sz w:val="28"/>
+                <w:szCs w:val="28"/>
+              </w:rPr>
+              <w:t>GVT</w:t>
+            </w:r>
           </w:p>
         </w:tc>
         <w:tc>
@@ -7504,14 +7730,6 @@
                 <w:szCs w:val="28"/>
               </w:rPr>
             </w:pPr>
-            <w:r>
-              <w:rPr>
-                <w:rFonts w:ascii="Calibri" w:eastAsia="Calibri" w:hAnsi="Calibri" w:cs="Calibri"/>
-                <w:sz w:val="28"/>
-                <w:szCs w:val="28"/>
-              </w:rPr>
-              <w:t>L/O</w:t>
-            </w:r>
           </w:p>
         </w:tc>
         <w:tc>
@@ -7566,6 +7784,14 @@
                 <w:szCs w:val="28"/>
               </w:rPr>
             </w:pPr>
+            <w:r>
+              <w:rPr>
+                <w:rFonts w:ascii="Calibri" w:eastAsia="Calibri" w:hAnsi="Calibri" w:cs="Calibri"/>
+                <w:sz w:val="28"/>
+                <w:szCs w:val="28"/>
+              </w:rPr>
+              <w:t>GVT</w:t>
+            </w:r>
           </w:p>
         </w:tc>
         <w:tc>
@@ -7986,10 +8212,10 @@
         <w:szCs w:val="28"/>
       </w:rPr>
       <w:object w:dxaOrig="1188" w:dyaOrig="900">
-        <v:rect id="_x0000_i1025" style="width:56.35pt;height:38.8pt" o:ole="" o:preferrelative="t" stroked="f">
+        <v:rect id="_x0000_i1025" style="width:56.3pt;height:38.6pt" o:ole="" o:preferrelative="t" stroked="f">
           <v:imagedata r:id="rId1" o:title=""/>
         </v:rect>
-        <o:OLEObject Type="Embed" ProgID="StaticMetafile" ShapeID="_x0000_i1025" DrawAspect="Content" ObjectID="_1852986128" r:id="rId2"/>
+        <o:OLEObject Type="Embed" ProgID="StaticMetafile" ShapeID="_x0000_i1025" DrawAspect="Content" ObjectID="_1853066086" r:id="rId2"/>
       </w:object>
     </w:r>
     <w:r>
@@ -8027,17 +8253,7 @@
         <w:sz w:val="28"/>
         <w:szCs w:val="28"/>
       </w:rPr>
-      <w:t>0</w:t>
-    </w:r>
-    <w:r>
-      <w:rPr>
-        <w:rFonts w:cs="Times New Roman"/>
-        <w:b/>
-        <w:color w:val="000000" w:themeColor="text1"/>
-        <w:sz w:val="28"/>
-        <w:szCs w:val="28"/>
-      </w:rPr>
-      <w:t>9</w:t>
+      <w:t>10</w:t>
     </w:r>
     <w:r>
       <w:rPr>
@@ -8067,7 +8283,7 @@
         <w:sz w:val="28"/>
         <w:szCs w:val="28"/>
       </w:rPr>
-      <w:t>FRI</w:t>
+      <w:t>SATUR</w:t>
     </w:r>
     <w:r>
       <w:rPr>

</xml_diff>

<commit_message>
Sync - 2026-10-09 17:38
</commit_message>
<xml_diff>
--- a/files/Daily_Helicopter_Schedule.docx
+++ b/files/Daily_Helicopter_Schedule.docx
@@ -1581,7 +1581,17 @@
                 <w:sz w:val="28"/>
                 <w:szCs w:val="28"/>
               </w:rPr>
-              <w:t>09:00</w:t>
+              <w:t>08:3</w:t>
+            </w:r>
+            <w:bookmarkStart w:id="0" w:name="_GoBack"/>
+            <w:bookmarkEnd w:id="0"/>
+            <w:r>
+              <w:rPr>
+                <w:rFonts w:ascii="Calibri" w:eastAsia="Calibri" w:hAnsi="Calibri" w:cs="Calibri"/>
+                <w:sz w:val="28"/>
+                <w:szCs w:val="28"/>
+              </w:rPr>
+              <w:t>0</w:t>
             </w:r>
           </w:p>
         </w:tc>
@@ -6661,6 +6671,7 @@
           <w:sz w:val="28"/>
           <w:szCs w:val="28"/>
         </w:rPr>
+        <w:lastRenderedPageBreak/>
         <w:t>Also please check Crew boat schedule for Contract crew.</w:t>
       </w:r>
     </w:p>
@@ -6689,7 +6700,6 @@
           <w:sz w:val="28"/>
           <w:szCs w:val="28"/>
         </w:rPr>
-        <w:lastRenderedPageBreak/>
         <w:tab/>
       </w:r>
     </w:p>
@@ -7283,8 +7293,6 @@
               </w:rPr>
               <w:t>TAPTI</w:t>
             </w:r>
-            <w:bookmarkStart w:id="0" w:name="_GoBack"/>
-            <w:bookmarkEnd w:id="0"/>
           </w:p>
         </w:tc>
         <w:tc>
@@ -8212,10 +8220,10 @@
         <w:szCs w:val="28"/>
       </w:rPr>
       <w:object w:dxaOrig="1188" w:dyaOrig="900">
-        <v:rect id="_x0000_i1025" style="width:56.3pt;height:38.6pt" o:ole="" o:preferrelative="t" stroked="f">
+        <v:rect id="_x0000_i1025" style="width:56.4pt;height:38.6pt" o:ole="" o:preferrelative="t" stroked="f">
           <v:imagedata r:id="rId1" o:title=""/>
         </v:rect>
-        <o:OLEObject Type="Embed" ProgID="StaticMetafile" ShapeID="_x0000_i1025" DrawAspect="Content" ObjectID="_1853066086" r:id="rId2"/>
+        <o:OLEObject Type="Embed" ProgID="StaticMetafile" ShapeID="_x0000_i1025" DrawAspect="Content" ObjectID="_1853071288" r:id="rId2"/>
       </w:object>
     </w:r>
     <w:r>

</xml_diff>

<commit_message>
Sync - 2026-10-10 17:40
</commit_message>
<xml_diff>
--- a/files/Daily_Helicopter_Schedule.docx
+++ b/files/Daily_Helicopter_Schedule.docx
@@ -686,7 +686,7 @@
                 <w:sz w:val="28"/>
                 <w:szCs w:val="28"/>
               </w:rPr>
-              <w:t>RRL</w:t>
+              <w:t>RRK</w:t>
             </w:r>
           </w:p>
         </w:tc>
@@ -936,7 +936,7 @@
                 <w:sz w:val="28"/>
                 <w:szCs w:val="28"/>
               </w:rPr>
-              <w:t>RRK</w:t>
+              <w:t>RRL</w:t>
             </w:r>
           </w:p>
         </w:tc>
@@ -4570,7 +4570,7 @@
                 <w:sz w:val="28"/>
                 <w:szCs w:val="28"/>
               </w:rPr>
-              <w:t>VND1</w:t>
+              <w:t>SRAT</w:t>
             </w:r>
           </w:p>
         </w:tc>
@@ -6248,8 +6248,6 @@
                 <w:szCs w:val="28"/>
               </w:rPr>
             </w:pPr>
-            <w:bookmarkStart w:id="0" w:name="_GoBack"/>
-            <w:bookmarkEnd w:id="0"/>
           </w:p>
         </w:tc>
         <w:tc>
@@ -7534,8 +7532,10 @@
                 <w:sz w:val="28"/>
                 <w:szCs w:val="28"/>
               </w:rPr>
-              <w:t>SUDA</w:t>
-            </w:r>
+              <w:t>SGAV</w:t>
+            </w:r>
+            <w:bookmarkStart w:id="0" w:name="_GoBack"/>
+            <w:bookmarkEnd w:id="0"/>
           </w:p>
         </w:tc>
         <w:tc>
@@ -8034,10 +8034,10 @@
         <w:szCs w:val="28"/>
       </w:rPr>
       <w:object w:dxaOrig="1188" w:dyaOrig="900">
-        <v:rect id="_x0000_i1025" style="width:56.45pt;height:38.25pt" o:ole="" o:preferrelative="t" stroked="f">
+        <v:rect id="_x0000_i1025" style="width:56.25pt;height:38.25pt" o:ole="" o:preferrelative="t" stroked="f">
           <v:imagedata r:id="rId1" o:title=""/>
         </v:rect>
-        <o:OLEObject Type="Embed" ProgID="StaticMetafile" ShapeID="_x0000_i1025" DrawAspect="Content" ObjectID="_1853155096" r:id="rId2"/>
+        <o:OLEObject Type="Embed" ProgID="StaticMetafile" ShapeID="_x0000_i1025" DrawAspect="Content" ObjectID="_1853157107" r:id="rId2"/>
       </w:object>
     </w:r>
     <w:r>

</xml_diff>

<commit_message>
Sync - 2026-10-11 16:12
</commit_message>
<xml_diff>
--- a/files/Daily_Helicopter_Schedule.docx
+++ b/files/Daily_Helicopter_Schedule.docx
@@ -651,7 +651,7 @@
                 <w:sz w:val="28"/>
                 <w:szCs w:val="28"/>
               </w:rPr>
-              <w:t>GVHL 169</w:t>
+              <w:t>HELIGO 412</w:t>
             </w:r>
           </w:p>
         </w:tc>
@@ -686,7 +686,7 @@
                 <w:sz w:val="28"/>
                 <w:szCs w:val="28"/>
               </w:rPr>
-              <w:t>RRK</w:t>
+              <w:t>HLV</w:t>
             </w:r>
           </w:p>
         </w:tc>
@@ -721,7 +721,7 @@
                 <w:sz w:val="28"/>
                 <w:szCs w:val="28"/>
               </w:rPr>
-              <w:t>07</w:t>
+              <w:t>08</w:t>
             </w:r>
           </w:p>
         </w:tc>
@@ -936,7 +936,7 @@
                 <w:sz w:val="28"/>
                 <w:szCs w:val="28"/>
               </w:rPr>
-              <w:t>RRL</w:t>
+              <w:t>RRK</w:t>
             </w:r>
           </w:p>
         </w:tc>
@@ -1188,6 +1188,14 @@
               </w:rPr>
               <w:t>RRN</w:t>
             </w:r>
+            <w:r>
+              <w:rPr>
+                <w:rFonts w:ascii="Calibri" w:eastAsia="Calibri" w:hAnsi="Calibri" w:cs="Calibri"/>
+                <w:sz w:val="28"/>
+                <w:szCs w:val="28"/>
+              </w:rPr>
+              <w:t xml:space="preserve"> </w:t>
+            </w:r>
           </w:p>
         </w:tc>
         <w:tc>
@@ -1729,7 +1737,7 @@
                 <w:sz w:val="28"/>
                 <w:szCs w:val="28"/>
               </w:rPr>
-              <w:t>NA</w:t>
+              <w:t>HELIGO412</w:t>
             </w:r>
           </w:p>
         </w:tc>
@@ -1764,7 +1772,7 @@
                 <w:sz w:val="28"/>
                 <w:szCs w:val="28"/>
               </w:rPr>
-              <w:t>NA</w:t>
+              <w:t>HLT</w:t>
             </w:r>
           </w:p>
         </w:tc>
@@ -3136,7 +3144,7 @@
                 <w:sz w:val="28"/>
                 <w:szCs w:val="28"/>
               </w:rPr>
-              <w:t>NA</w:t>
+              <w:t>BPA</w:t>
             </w:r>
           </w:p>
         </w:tc>
@@ -3193,6 +3201,14 @@
                 <w:szCs w:val="28"/>
               </w:rPr>
             </w:pPr>
+            <w:r>
+              <w:rPr>
+                <w:rFonts w:ascii="Calibri" w:eastAsia="Calibri" w:hAnsi="Calibri" w:cs="Calibri"/>
+                <w:sz w:val="28"/>
+                <w:szCs w:val="28"/>
+              </w:rPr>
+              <w:t>RRL</w:t>
+            </w:r>
           </w:p>
         </w:tc>
         <w:tc>
@@ -4114,7 +4130,7 @@
                 <w:sz w:val="28"/>
                 <w:szCs w:val="28"/>
               </w:rPr>
-              <w:t>CHTR</w:t>
+              <w:t>NA</w:t>
             </w:r>
           </w:p>
         </w:tc>
@@ -4570,7 +4586,7 @@
                 <w:sz w:val="28"/>
                 <w:szCs w:val="28"/>
               </w:rPr>
-              <w:t>SRAT</w:t>
+              <w:t>NA</w:t>
             </w:r>
           </w:p>
         </w:tc>
@@ -5079,7 +5095,7 @@
                 <w:sz w:val="28"/>
                 <w:szCs w:val="28"/>
               </w:rPr>
-              <w:t>SJOT</w:t>
+              <w:t>SLQ</w:t>
             </w:r>
           </w:p>
         </w:tc>
@@ -5306,7 +5322,7 @@
                 <w:sz w:val="28"/>
                 <w:szCs w:val="28"/>
               </w:rPr>
-              <w:t>ABN4</w:t>
+              <w:t>SGAV</w:t>
             </w:r>
           </w:p>
         </w:tc>
@@ -5533,7 +5549,7 @@
                 <w:sz w:val="28"/>
                 <w:szCs w:val="28"/>
               </w:rPr>
-              <w:t>ARMADA 1</w:t>
+              <w:t>WIN+MNW</w:t>
             </w:r>
           </w:p>
         </w:tc>
@@ -5760,7 +5776,7 @@
                 <w:sz w:val="28"/>
                 <w:szCs w:val="28"/>
               </w:rPr>
-              <w:t>SJOT</w:t>
+              <w:t>AS2</w:t>
             </w:r>
           </w:p>
         </w:tc>
@@ -5994,7 +6010,7 @@
                 <w:sz w:val="28"/>
                 <w:szCs w:val="28"/>
               </w:rPr>
-              <w:t>JSUP</w:t>
+              <w:t>NQO</w:t>
             </w:r>
           </w:p>
         </w:tc>
@@ -6220,7 +6236,7 @@
                 <w:sz w:val="28"/>
                 <w:szCs w:val="28"/>
               </w:rPr>
-              <w:t>VND2</w:t>
+              <w:t>SSAK</w:t>
             </w:r>
           </w:p>
         </w:tc>
@@ -7071,7 +7087,7 @@
                 <w:sz w:val="28"/>
                 <w:szCs w:val="28"/>
               </w:rPr>
-              <w:t>CHRU</w:t>
+              <w:t>TCPP</w:t>
             </w:r>
           </w:p>
         </w:tc>
@@ -7301,7 +7317,7 @@
                 <w:sz w:val="28"/>
                 <w:szCs w:val="28"/>
               </w:rPr>
-              <w:t>SUDA</w:t>
+              <w:t>CHRU</w:t>
             </w:r>
           </w:p>
         </w:tc>
@@ -7532,7 +7548,7 @@
                 <w:sz w:val="28"/>
                 <w:szCs w:val="28"/>
               </w:rPr>
-              <w:t>SGAV</w:t>
+              <w:t>SUDA</w:t>
             </w:r>
             <w:bookmarkStart w:id="0" w:name="_GoBack"/>
             <w:bookmarkEnd w:id="0"/>
@@ -7759,14 +7775,6 @@
                 <w:szCs w:val="28"/>
               </w:rPr>
             </w:pPr>
-            <w:r>
-              <w:rPr>
-                <w:rFonts w:ascii="Calibri" w:eastAsia="Calibri" w:hAnsi="Calibri" w:cs="Calibri"/>
-                <w:sz w:val="28"/>
-                <w:szCs w:val="28"/>
-              </w:rPr>
-              <w:t>TCPP</w:t>
-            </w:r>
           </w:p>
         </w:tc>
         <w:tc>
@@ -8034,10 +8042,10 @@
         <w:szCs w:val="28"/>
       </w:rPr>
       <w:object w:dxaOrig="1188" w:dyaOrig="900">
-        <v:rect id="_x0000_i1025" style="width:56.25pt;height:38.25pt" o:ole="" o:preferrelative="t" stroked="f">
+        <v:rect id="_x0000_i1025" style="width:55.8pt;height:38.25pt" o:ole="" o:preferrelative="t" stroked="f">
           <v:imagedata r:id="rId1" o:title=""/>
         </v:rect>
-        <o:OLEObject Type="Embed" ProgID="StaticMetafile" ShapeID="_x0000_i1025" DrawAspect="Content" ObjectID="_1853157107" r:id="rId2"/>
+        <o:OLEObject Type="Embed" ProgID="StaticMetafile" ShapeID="_x0000_i1025" DrawAspect="Content" ObjectID="_1853238680" r:id="rId2"/>
       </w:object>
     </w:r>
     <w:r>
@@ -8085,7 +8093,7 @@
         <w:sz w:val="28"/>
         <w:szCs w:val="28"/>
       </w:rPr>
-      <w:t>1</w:t>
+      <w:t>2</w:t>
     </w:r>
     <w:r>
       <w:rPr>
@@ -8115,17 +8123,7 @@
         <w:sz w:val="28"/>
         <w:szCs w:val="28"/>
       </w:rPr>
-      <w:t>S</w:t>
-    </w:r>
-    <w:r>
-      <w:rPr>
-        <w:rFonts w:cs="Times New Roman"/>
-        <w:b/>
-        <w:color w:val="000000" w:themeColor="text1"/>
-        <w:sz w:val="28"/>
-        <w:szCs w:val="28"/>
-      </w:rPr>
-      <w:t>UN</w:t>
+      <w:t>MON</w:t>
     </w:r>
     <w:r>
       <w:rPr>

</xml_diff>

<commit_message>
Sync - 2026-10-12 15:45
</commit_message>
<xml_diff>
--- a/files/Daily_Helicopter_Schedule.docx
+++ b/files/Daily_Helicopter_Schedule.docx
@@ -651,7 +651,7 @@
                 <w:sz w:val="28"/>
                 <w:szCs w:val="28"/>
               </w:rPr>
-              <w:t>HELIGO 412</w:t>
+              <w:t>GVHL 169</w:t>
             </w:r>
           </w:p>
         </w:tc>
@@ -686,7 +686,7 @@
                 <w:sz w:val="28"/>
                 <w:szCs w:val="28"/>
               </w:rPr>
-              <w:t>HLV</w:t>
+              <w:t>RRK</w:t>
             </w:r>
           </w:p>
         </w:tc>
@@ -721,7 +721,7 @@
                 <w:sz w:val="28"/>
                 <w:szCs w:val="28"/>
               </w:rPr>
-              <w:t>08</w:t>
+              <w:t>05</w:t>
             </w:r>
           </w:p>
         </w:tc>
@@ -936,7 +936,7 @@
                 <w:sz w:val="28"/>
                 <w:szCs w:val="28"/>
               </w:rPr>
-              <w:t>RRK</w:t>
+              <w:t>RRL</w:t>
             </w:r>
           </w:p>
         </w:tc>
@@ -3144,7 +3144,7 @@
                 <w:sz w:val="28"/>
                 <w:szCs w:val="28"/>
               </w:rPr>
-              <w:t>BPA</w:t>
+              <w:t xml:space="preserve"> NA</w:t>
             </w:r>
           </w:p>
         </w:tc>
@@ -3201,14 +3201,6 @@
                 <w:szCs w:val="28"/>
               </w:rPr>
             </w:pPr>
-            <w:r>
-              <w:rPr>
-                <w:rFonts w:ascii="Calibri" w:eastAsia="Calibri" w:hAnsi="Calibri" w:cs="Calibri"/>
-                <w:sz w:val="28"/>
-                <w:szCs w:val="28"/>
-              </w:rPr>
-              <w:t>RRL</w:t>
-            </w:r>
           </w:p>
         </w:tc>
         <w:tc>
@@ -4130,7 +4122,7 @@
                 <w:sz w:val="28"/>
                 <w:szCs w:val="28"/>
               </w:rPr>
-              <w:t>NA</w:t>
+              <w:t>ARMADA2</w:t>
             </w:r>
           </w:p>
         </w:tc>
@@ -4586,7 +4578,7 @@
                 <w:sz w:val="28"/>
                 <w:szCs w:val="28"/>
               </w:rPr>
-              <w:t>NA</w:t>
+              <w:t>BLQ1</w:t>
             </w:r>
           </w:p>
         </w:tc>
@@ -4812,8 +4804,10 @@
                 <w:sz w:val="28"/>
                 <w:szCs w:val="28"/>
               </w:rPr>
-              <w:t>NA</w:t>
-            </w:r>
+              <w:t>R9A/R12A</w:t>
+            </w:r>
+            <w:bookmarkStart w:id="0" w:name="_GoBack"/>
+            <w:bookmarkEnd w:id="0"/>
           </w:p>
         </w:tc>
         <w:tc>
@@ -5095,7 +5089,7 @@
                 <w:sz w:val="28"/>
                 <w:szCs w:val="28"/>
               </w:rPr>
-              <w:t>SLQ</w:t>
+              <w:t>SHQ</w:t>
             </w:r>
           </w:p>
         </w:tc>
@@ -5322,7 +5316,7 @@
                 <w:sz w:val="28"/>
                 <w:szCs w:val="28"/>
               </w:rPr>
-              <w:t>SGAV</w:t>
+              <w:t>HRA/NLM</w:t>
             </w:r>
           </w:p>
         </w:tc>
@@ -5549,7 +5543,7 @@
                 <w:sz w:val="28"/>
                 <w:szCs w:val="28"/>
               </w:rPr>
-              <w:t>WIN+MNW</w:t>
+              <w:t>SLQ</w:t>
             </w:r>
           </w:p>
         </w:tc>
@@ -5776,7 +5770,7 @@
                 <w:sz w:val="28"/>
                 <w:szCs w:val="28"/>
               </w:rPr>
-              <w:t>AS2</w:t>
+              <w:t>NQO</w:t>
             </w:r>
           </w:p>
         </w:tc>
@@ -6010,7 +6004,7 @@
                 <w:sz w:val="28"/>
                 <w:szCs w:val="28"/>
               </w:rPr>
-              <w:t>NQO</w:t>
+              <w:t>ICW</w:t>
             </w:r>
           </w:p>
         </w:tc>
@@ -6236,7 +6230,7 @@
                 <w:sz w:val="28"/>
                 <w:szCs w:val="28"/>
               </w:rPr>
-              <w:t>SSAK</w:t>
+              <w:t>JYOTI</w:t>
             </w:r>
           </w:p>
         </w:tc>
@@ -6367,6 +6361,15 @@
                 <w:szCs w:val="28"/>
               </w:rPr>
               <w:t>:</w:t>
+            </w:r>
+            <w:r>
+              <w:rPr>
+                <w:rFonts w:ascii="Calibri" w:eastAsia="Calibri" w:hAnsi="Calibri" w:cs="Calibri"/>
+                <w:b/>
+                <w:sz w:val="28"/>
+                <w:szCs w:val="28"/>
+              </w:rPr>
+              <w:t>PQ</w:t>
             </w:r>
           </w:p>
         </w:tc>
@@ -7087,7 +7090,7 @@
                 <w:sz w:val="28"/>
                 <w:szCs w:val="28"/>
               </w:rPr>
-              <w:t>TCPP</w:t>
+              <w:t>SUDA</w:t>
             </w:r>
           </w:p>
         </w:tc>
@@ -7317,7 +7320,7 @@
                 <w:sz w:val="28"/>
                 <w:szCs w:val="28"/>
               </w:rPr>
-              <w:t>CHRU</w:t>
+              <w:t>L/O</w:t>
             </w:r>
           </w:p>
         </w:tc>
@@ -7548,10 +7551,8 @@
                 <w:sz w:val="28"/>
                 <w:szCs w:val="28"/>
               </w:rPr>
-              <w:t>SUDA</w:t>
-            </w:r>
-            <w:bookmarkStart w:id="0" w:name="_GoBack"/>
-            <w:bookmarkEnd w:id="0"/>
+              <w:t>L/O</w:t>
+            </w:r>
           </w:p>
         </w:tc>
         <w:tc>
@@ -8042,10 +8043,10 @@
         <w:szCs w:val="28"/>
       </w:rPr>
       <w:object w:dxaOrig="1188" w:dyaOrig="900">
-        <v:rect id="_x0000_i1025" style="width:55.8pt;height:38.25pt" o:ole="" o:preferrelative="t" stroked="f">
+        <v:rect id="_x0000_i1025" style="width:55.65pt;height:38.45pt" o:ole="" o:preferrelative="t" stroked="f">
           <v:imagedata r:id="rId1" o:title=""/>
         </v:rect>
-        <o:OLEObject Type="Embed" ProgID="StaticMetafile" ShapeID="_x0000_i1025" DrawAspect="Content" ObjectID="_1853238680" r:id="rId2"/>
+        <o:OLEObject Type="Embed" ProgID="StaticMetafile" ShapeID="_x0000_i1025" DrawAspect="Content" ObjectID="_1853324595" r:id="rId2"/>
       </w:object>
     </w:r>
     <w:r>
@@ -8093,7 +8094,7 @@
         <w:sz w:val="28"/>
         <w:szCs w:val="28"/>
       </w:rPr>
-      <w:t>2</w:t>
+      <w:t>3</w:t>
     </w:r>
     <w:r>
       <w:rPr>
@@ -8123,7 +8124,7 @@
         <w:sz w:val="28"/>
         <w:szCs w:val="28"/>
       </w:rPr>
-      <w:t>MON</w:t>
+      <w:t>TUES</w:t>
     </w:r>
     <w:r>
       <w:rPr>

</xml_diff>

<commit_message>
Sync - 2026-10-13 16:32
</commit_message>
<xml_diff>
--- a/files/Daily_Helicopter_Schedule.docx
+++ b/files/Daily_Helicopter_Schedule.docx
@@ -686,7 +686,7 @@
                 <w:sz w:val="28"/>
                 <w:szCs w:val="28"/>
               </w:rPr>
-              <w:t>RRK</w:t>
+              <w:t>RRJ</w:t>
             </w:r>
           </w:p>
         </w:tc>
@@ -936,7 +936,7 @@
                 <w:sz w:val="28"/>
                 <w:szCs w:val="28"/>
               </w:rPr>
-              <w:t>RRL</w:t>
+              <w:t>RRK</w:t>
             </w:r>
           </w:p>
         </w:tc>
@@ -1118,6 +1118,14 @@
               </w:rPr>
               <w:t>SF (D)</w:t>
             </w:r>
+            <w:r>
+              <w:rPr>
+                <w:rFonts w:ascii="Calibri" w:eastAsia="Calibri" w:hAnsi="Calibri" w:cs="Calibri"/>
+                <w:sz w:val="28"/>
+                <w:szCs w:val="28"/>
+              </w:rPr>
+              <w:t>+NF[D]</w:t>
+            </w:r>
           </w:p>
         </w:tc>
         <w:tc>
@@ -1374,7 +1382,7 @@
                 <w:sz w:val="28"/>
                 <w:szCs w:val="28"/>
               </w:rPr>
-              <w:t>NF (D)</w:t>
+              <w:t xml:space="preserve"> NA</w:t>
             </w:r>
           </w:p>
         </w:tc>
@@ -1409,7 +1417,7 @@
                 <w:sz w:val="28"/>
                 <w:szCs w:val="28"/>
               </w:rPr>
-              <w:t>GVHL 412</w:t>
+              <w:t>NA</w:t>
             </w:r>
           </w:p>
         </w:tc>
@@ -1444,7 +1452,7 @@
                 <w:sz w:val="28"/>
                 <w:szCs w:val="28"/>
               </w:rPr>
-              <w:t>RRJ</w:t>
+              <w:t>NA</w:t>
             </w:r>
           </w:p>
         </w:tc>
@@ -1479,7 +1487,7 @@
                 <w:sz w:val="28"/>
                 <w:szCs w:val="28"/>
               </w:rPr>
-              <w:t>06</w:t>
+              <w:t>00</w:t>
             </w:r>
           </w:p>
         </w:tc>
@@ -1737,7 +1745,7 @@
                 <w:sz w:val="28"/>
                 <w:szCs w:val="28"/>
               </w:rPr>
-              <w:t>HELIGO412</w:t>
+              <w:t>NA</w:t>
             </w:r>
           </w:p>
         </w:tc>
@@ -1772,7 +1780,7 @@
                 <w:sz w:val="28"/>
                 <w:szCs w:val="28"/>
               </w:rPr>
-              <w:t>HLT</w:t>
+              <w:t>NA</w:t>
             </w:r>
           </w:p>
         </w:tc>
@@ -1807,7 +1815,7 @@
                 <w:sz w:val="28"/>
                 <w:szCs w:val="28"/>
               </w:rPr>
-              <w:t>05</w:t>
+              <w:t>00</w:t>
             </w:r>
           </w:p>
         </w:tc>
@@ -3144,7 +3152,7 @@
                 <w:sz w:val="28"/>
                 <w:szCs w:val="28"/>
               </w:rPr>
-              <w:t xml:space="preserve"> NA</w:t>
+              <w:t>BLQ1</w:t>
             </w:r>
           </w:p>
         </w:tc>
@@ -3174,6 +3182,14 @@
                 <w:szCs w:val="28"/>
               </w:rPr>
             </w:pPr>
+            <w:r>
+              <w:rPr>
+                <w:rFonts w:ascii="Calibri" w:eastAsia="Calibri" w:hAnsi="Calibri" w:cs="Calibri"/>
+                <w:sz w:val="28"/>
+                <w:szCs w:val="28"/>
+              </w:rPr>
+              <w:t>GVHL 169</w:t>
+            </w:r>
           </w:p>
         </w:tc>
         <w:tc>
@@ -3201,6 +3217,14 @@
                 <w:szCs w:val="28"/>
               </w:rPr>
             </w:pPr>
+            <w:r>
+              <w:rPr>
+                <w:rFonts w:ascii="Calibri" w:eastAsia="Calibri" w:hAnsi="Calibri" w:cs="Calibri"/>
+                <w:sz w:val="28"/>
+                <w:szCs w:val="28"/>
+              </w:rPr>
+              <w:t>RRL</w:t>
+            </w:r>
           </w:p>
         </w:tc>
         <w:tc>
@@ -3375,7 +3399,7 @@
                 <w:sz w:val="28"/>
                 <w:szCs w:val="28"/>
               </w:rPr>
-              <w:t>NA</w:t>
+              <w:t>BLQ1</w:t>
             </w:r>
           </w:p>
         </w:tc>
@@ -3405,6 +3429,14 @@
                 <w:szCs w:val="28"/>
               </w:rPr>
             </w:pPr>
+            <w:r>
+              <w:rPr>
+                <w:rFonts w:ascii="Calibri" w:eastAsia="Calibri" w:hAnsi="Calibri" w:cs="Calibri"/>
+                <w:sz w:val="28"/>
+                <w:szCs w:val="28"/>
+              </w:rPr>
+              <w:t>GVHL 169</w:t>
+            </w:r>
           </w:p>
         </w:tc>
         <w:tc>
@@ -3432,6 +3464,14 @@
                 <w:szCs w:val="28"/>
               </w:rPr>
             </w:pPr>
+            <w:r>
+              <w:rPr>
+                <w:rFonts w:ascii="Calibri" w:eastAsia="Calibri" w:hAnsi="Calibri" w:cs="Calibri"/>
+                <w:sz w:val="28"/>
+                <w:szCs w:val="28"/>
+              </w:rPr>
+              <w:t>RRL</w:t>
+            </w:r>
           </w:p>
         </w:tc>
         <w:tc>
@@ -3610,7 +3650,7 @@
                 <w:sz w:val="28"/>
                 <w:szCs w:val="28"/>
               </w:rPr>
-              <w:t>NA</w:t>
+              <w:t>NLM</w:t>
             </w:r>
           </w:p>
         </w:tc>
@@ -3640,6 +3680,14 @@
                 <w:szCs w:val="28"/>
               </w:rPr>
             </w:pPr>
+            <w:r>
+              <w:rPr>
+                <w:rFonts w:ascii="Calibri" w:eastAsia="Calibri" w:hAnsi="Calibri" w:cs="Calibri"/>
+                <w:sz w:val="28"/>
+                <w:szCs w:val="28"/>
+              </w:rPr>
+              <w:t>GVHL 169</w:t>
+            </w:r>
           </w:p>
         </w:tc>
         <w:tc>
@@ -3667,6 +3715,14 @@
                 <w:szCs w:val="28"/>
               </w:rPr>
             </w:pPr>
+            <w:r>
+              <w:rPr>
+                <w:rFonts w:ascii="Calibri" w:eastAsia="Calibri" w:hAnsi="Calibri" w:cs="Calibri"/>
+                <w:sz w:val="28"/>
+                <w:szCs w:val="28"/>
+              </w:rPr>
+              <w:t>RRL</w:t>
+            </w:r>
           </w:p>
         </w:tc>
         <w:tc>
@@ -4122,7 +4178,15 @@
                 <w:sz w:val="28"/>
                 <w:szCs w:val="28"/>
               </w:rPr>
-              <w:t>ARMADA2</w:t>
+              <w:t>SCA</w:t>
+            </w:r>
+            <w:r>
+              <w:rPr>
+                <w:rFonts w:ascii="Calibri" w:eastAsia="Calibri" w:hAnsi="Calibri" w:cs="Calibri"/>
+                <w:sz w:val="28"/>
+                <w:szCs w:val="28"/>
+              </w:rPr>
+              <w:t xml:space="preserve"> </w:t>
             </w:r>
           </w:p>
         </w:tc>
@@ -4578,7 +4642,7 @@
                 <w:sz w:val="28"/>
                 <w:szCs w:val="28"/>
               </w:rPr>
-              <w:t>BLQ1</w:t>
+              <w:t>ARMADA2</w:t>
             </w:r>
           </w:p>
         </w:tc>
@@ -4804,10 +4868,8 @@
                 <w:sz w:val="28"/>
                 <w:szCs w:val="28"/>
               </w:rPr>
-              <w:t>R9A/R12A</w:t>
-            </w:r>
-            <w:bookmarkStart w:id="0" w:name="_GoBack"/>
-            <w:bookmarkEnd w:id="0"/>
+              <w:t>JYOTI</w:t>
+            </w:r>
           </w:p>
         </w:tc>
         <w:tc>
@@ -5089,7 +5151,7 @@
                 <w:sz w:val="28"/>
                 <w:szCs w:val="28"/>
               </w:rPr>
-              <w:t>SHQ</w:t>
+              <w:t>B193</w:t>
             </w:r>
           </w:p>
         </w:tc>
@@ -5316,7 +5378,7 @@
                 <w:sz w:val="28"/>
                 <w:szCs w:val="28"/>
               </w:rPr>
-              <w:t>HRA/NLM</w:t>
+              <w:t>RATNA</w:t>
             </w:r>
           </w:p>
         </w:tc>
@@ -5533,17 +5595,18 @@
               <w:jc w:val="center"/>
               <w:rPr>
                 <w:rFonts w:ascii="Calibri" w:eastAsia="Calibri" w:hAnsi="Calibri" w:cs="Calibri"/>
-                <w:sz w:val="28"/>
-                <w:szCs w:val="28"/>
-              </w:rPr>
-            </w:pPr>
-            <w:r>
-              <w:rPr>
-                <w:rFonts w:ascii="Calibri" w:eastAsia="Calibri" w:hAnsi="Calibri" w:cs="Calibri"/>
-                <w:sz w:val="28"/>
-                <w:szCs w:val="28"/>
-              </w:rPr>
-              <w:t>SLQ</w:t>
+                <w:b/>
+                <w:sz w:val="28"/>
+                <w:szCs w:val="28"/>
+              </w:rPr>
+            </w:pPr>
+            <w:r>
+              <w:rPr>
+                <w:rFonts w:ascii="Calibri" w:eastAsia="Calibri" w:hAnsi="Calibri" w:cs="Calibri"/>
+                <w:sz w:val="28"/>
+                <w:szCs w:val="28"/>
+              </w:rPr>
+              <w:t>SHAKTI</w:t>
             </w:r>
           </w:p>
         </w:tc>
@@ -5770,7 +5833,7 @@
                 <w:sz w:val="28"/>
                 <w:szCs w:val="28"/>
               </w:rPr>
-              <w:t>NQO</w:t>
+              <w:t>NLM</w:t>
             </w:r>
           </w:p>
         </w:tc>
@@ -6004,7 +6067,7 @@
                 <w:sz w:val="28"/>
                 <w:szCs w:val="28"/>
               </w:rPr>
-              <w:t>ICW</w:t>
+              <w:t>MNW</w:t>
             </w:r>
           </w:p>
         </w:tc>
@@ -6365,11 +6428,18 @@
             <w:r>
               <w:rPr>
                 <w:rFonts w:ascii="Calibri" w:eastAsia="Calibri" w:hAnsi="Calibri" w:cs="Calibri"/>
-                <w:b/>
-                <w:sz w:val="28"/>
-                <w:szCs w:val="28"/>
-              </w:rPr>
-              <w:t>PQ</w:t>
+                <w:sz w:val="28"/>
+                <w:szCs w:val="28"/>
+              </w:rPr>
+              <w:t>SMRT</w:t>
+            </w:r>
+            <w:r>
+              <w:rPr>
+                <w:rFonts w:ascii="Calibri" w:eastAsia="Calibri" w:hAnsi="Calibri" w:cs="Calibri"/>
+                <w:sz w:val="28"/>
+                <w:szCs w:val="28"/>
+              </w:rPr>
+              <w:t xml:space="preserve">, </w:t>
             </w:r>
           </w:p>
         </w:tc>
@@ -7090,7 +7160,7 @@
                 <w:sz w:val="28"/>
                 <w:szCs w:val="28"/>
               </w:rPr>
-              <w:t>SUDA</w:t>
+              <w:t>J STAR</w:t>
             </w:r>
           </w:p>
         </w:tc>
@@ -7320,7 +7390,7 @@
                 <w:sz w:val="28"/>
                 <w:szCs w:val="28"/>
               </w:rPr>
-              <w:t>L/O</w:t>
+              <w:t>GAURAV</w:t>
             </w:r>
           </w:p>
         </w:tc>
@@ -7551,8 +7621,10 @@
                 <w:sz w:val="28"/>
                 <w:szCs w:val="28"/>
               </w:rPr>
-              <w:t>L/O</w:t>
-            </w:r>
+              <w:t>CHARU</w:t>
+            </w:r>
+            <w:bookmarkStart w:id="0" w:name="_GoBack"/>
+            <w:bookmarkEnd w:id="0"/>
           </w:p>
         </w:tc>
         <w:tc>
@@ -8043,10 +8115,10 @@
         <w:szCs w:val="28"/>
       </w:rPr>
       <w:object w:dxaOrig="1188" w:dyaOrig="900">
-        <v:rect id="_x0000_i1025" style="width:55.65pt;height:38.45pt" o:ole="" o:preferrelative="t" stroked="f">
+        <v:rect id="_x0000_i1025" style="width:55.65pt;height:38.6pt" o:ole="" o:preferrelative="t" stroked="f">
           <v:imagedata r:id="rId1" o:title=""/>
         </v:rect>
-        <o:OLEObject Type="Embed" ProgID="StaticMetafile" ShapeID="_x0000_i1025" DrawAspect="Content" ObjectID="_1853324595" r:id="rId2"/>
+        <o:OLEObject Type="Embed" ProgID="StaticMetafile" ShapeID="_x0000_i1025" DrawAspect="Content" ObjectID="_1853413958" r:id="rId2"/>
       </w:object>
     </w:r>
     <w:r>
@@ -8094,7 +8166,7 @@
         <w:sz w:val="28"/>
         <w:szCs w:val="28"/>
       </w:rPr>
-      <w:t>3</w:t>
+      <w:t>4</w:t>
     </w:r>
     <w:r>
       <w:rPr>
@@ -8124,7 +8196,17 @@
         <w:sz w:val="28"/>
         <w:szCs w:val="28"/>
       </w:rPr>
-      <w:t>TUES</w:t>
+      <w:t>WEDN</w:t>
+    </w:r>
+    <w:r>
+      <w:rPr>
+        <w:rFonts w:cs="Times New Roman"/>
+        <w:b/>
+        <w:color w:val="000000" w:themeColor="text1"/>
+        <w:sz w:val="28"/>
+        <w:szCs w:val="28"/>
+      </w:rPr>
+      <w:t>ES</w:t>
     </w:r>
     <w:r>
       <w:rPr>

</xml_diff>

<commit_message>
Sync - 2026-10-14 18:06
</commit_message>
<xml_diff>
--- a/files/Daily_Helicopter_Schedule.docx
+++ b/files/Daily_Helicopter_Schedule.docx
@@ -1118,14 +1118,6 @@
               </w:rPr>
               <w:t>SF (D)</w:t>
             </w:r>
-            <w:r>
-              <w:rPr>
-                <w:rFonts w:ascii="Calibri" w:eastAsia="Calibri" w:hAnsi="Calibri" w:cs="Calibri"/>
-                <w:sz w:val="28"/>
-                <w:szCs w:val="28"/>
-              </w:rPr>
-              <w:t>+NF[D]</w:t>
-            </w:r>
           </w:p>
         </w:tc>
         <w:tc>
@@ -1382,7 +1374,31 @@
                 <w:sz w:val="28"/>
                 <w:szCs w:val="28"/>
               </w:rPr>
-              <w:t xml:space="preserve"> NA</w:t>
+              <w:t>NF</w:t>
+            </w:r>
+            <w:r>
+              <w:rPr>
+                <w:rFonts w:ascii="Calibri" w:eastAsia="Calibri" w:hAnsi="Calibri" w:cs="Calibri"/>
+                <w:sz w:val="28"/>
+                <w:szCs w:val="28"/>
+              </w:rPr>
+              <w:t>(</w:t>
+            </w:r>
+            <w:r>
+              <w:rPr>
+                <w:rFonts w:ascii="Calibri" w:eastAsia="Calibri" w:hAnsi="Calibri" w:cs="Calibri"/>
+                <w:sz w:val="28"/>
+                <w:szCs w:val="28"/>
+              </w:rPr>
+              <w:t>D</w:t>
+            </w:r>
+            <w:r>
+              <w:rPr>
+                <w:rFonts w:ascii="Calibri" w:eastAsia="Calibri" w:hAnsi="Calibri" w:cs="Calibri"/>
+                <w:sz w:val="28"/>
+                <w:szCs w:val="28"/>
+              </w:rPr>
+              <w:t>)</w:t>
             </w:r>
           </w:p>
         </w:tc>
@@ -1417,7 +1433,7 @@
                 <w:sz w:val="28"/>
                 <w:szCs w:val="28"/>
               </w:rPr>
-              <w:t>NA</w:t>
+              <w:t>HELIGO 412</w:t>
             </w:r>
           </w:p>
         </w:tc>
@@ -1452,7 +1468,7 @@
                 <w:sz w:val="28"/>
                 <w:szCs w:val="28"/>
               </w:rPr>
-              <w:t>NA</w:t>
+              <w:t>HLT</w:t>
             </w:r>
           </w:p>
         </w:tc>
@@ -1487,7 +1503,7 @@
                 <w:sz w:val="28"/>
                 <w:szCs w:val="28"/>
               </w:rPr>
-              <w:t>00</w:t>
+              <w:t>07</w:t>
             </w:r>
           </w:p>
         </w:tc>
@@ -1745,7 +1761,7 @@
                 <w:sz w:val="28"/>
                 <w:szCs w:val="28"/>
               </w:rPr>
-              <w:t>NA</w:t>
+              <w:t>HELIGO 412</w:t>
             </w:r>
           </w:p>
         </w:tc>
@@ -1780,7 +1796,7 @@
                 <w:sz w:val="28"/>
                 <w:szCs w:val="28"/>
               </w:rPr>
-              <w:t>NA</w:t>
+              <w:t>HLV</w:t>
             </w:r>
           </w:p>
         </w:tc>
@@ -1815,7 +1831,7 @@
                 <w:sz w:val="28"/>
                 <w:szCs w:val="28"/>
               </w:rPr>
-              <w:t>00</w:t>
+              <w:t>08</w:t>
             </w:r>
           </w:p>
         </w:tc>
@@ -3152,7 +3168,7 @@
                 <w:sz w:val="28"/>
                 <w:szCs w:val="28"/>
               </w:rPr>
-              <w:t>BLQ1</w:t>
+              <w:t>BLQ2</w:t>
             </w:r>
           </w:p>
         </w:tc>
@@ -3399,7 +3415,7 @@
                 <w:sz w:val="28"/>
                 <w:szCs w:val="28"/>
               </w:rPr>
-              <w:t>BLQ1</w:t>
+              <w:t>BLQ2</w:t>
             </w:r>
           </w:p>
         </w:tc>
@@ -3647,10 +3663,11 @@
             <w:r>
               <w:rPr>
                 <w:rFonts w:ascii="Calibri" w:eastAsia="Calibri" w:hAnsi="Calibri" w:cs="Calibri"/>
-                <w:sz w:val="28"/>
-                <w:szCs w:val="28"/>
-              </w:rPr>
-              <w:t>NLM</w:t>
+                <w:b/>
+                <w:sz w:val="28"/>
+                <w:szCs w:val="28"/>
+              </w:rPr>
+              <w:t>NA</w:t>
             </w:r>
           </w:p>
         </w:tc>
@@ -3680,14 +3697,6 @@
                 <w:szCs w:val="28"/>
               </w:rPr>
             </w:pPr>
-            <w:r>
-              <w:rPr>
-                <w:rFonts w:ascii="Calibri" w:eastAsia="Calibri" w:hAnsi="Calibri" w:cs="Calibri"/>
-                <w:sz w:val="28"/>
-                <w:szCs w:val="28"/>
-              </w:rPr>
-              <w:t>GVHL 169</w:t>
-            </w:r>
           </w:p>
         </w:tc>
         <w:tc>
@@ -3715,14 +3724,6 @@
                 <w:szCs w:val="28"/>
               </w:rPr>
             </w:pPr>
-            <w:r>
-              <w:rPr>
-                <w:rFonts w:ascii="Calibri" w:eastAsia="Calibri" w:hAnsi="Calibri" w:cs="Calibri"/>
-                <w:sz w:val="28"/>
-                <w:szCs w:val="28"/>
-              </w:rPr>
-              <w:t>RRL</w:t>
-            </w:r>
           </w:p>
         </w:tc>
         <w:tc>
@@ -4178,15 +4179,7 @@
                 <w:sz w:val="28"/>
                 <w:szCs w:val="28"/>
               </w:rPr>
-              <w:t>SCA</w:t>
-            </w:r>
-            <w:r>
-              <w:rPr>
-                <w:rFonts w:ascii="Calibri" w:eastAsia="Calibri" w:hAnsi="Calibri" w:cs="Calibri"/>
-                <w:sz w:val="28"/>
-                <w:szCs w:val="28"/>
-              </w:rPr>
-              <w:t xml:space="preserve"> </w:t>
+              <w:t>MNW</w:t>
             </w:r>
           </w:p>
         </w:tc>
@@ -4639,11 +4632,14 @@
             <w:r>
               <w:rPr>
                 <w:rFonts w:ascii="Calibri" w:eastAsia="Calibri" w:hAnsi="Calibri" w:cs="Calibri"/>
-                <w:sz w:val="28"/>
-                <w:szCs w:val="28"/>
-              </w:rPr>
-              <w:t>ARMADA2</w:t>
-            </w:r>
+                <w:b/>
+                <w:sz w:val="28"/>
+                <w:szCs w:val="28"/>
+              </w:rPr>
+              <w:t>NA</w:t>
+            </w:r>
+            <w:bookmarkStart w:id="0" w:name="_GoBack"/>
+            <w:bookmarkEnd w:id="0"/>
           </w:p>
         </w:tc>
         <w:tc>
@@ -4865,10 +4861,11 @@
             <w:r>
               <w:rPr>
                 <w:rFonts w:ascii="Calibri" w:eastAsia="Calibri" w:hAnsi="Calibri" w:cs="Calibri"/>
-                <w:sz w:val="28"/>
-                <w:szCs w:val="28"/>
-              </w:rPr>
-              <w:t>JYOTI</w:t>
+                <w:b/>
+                <w:sz w:val="28"/>
+                <w:szCs w:val="28"/>
+              </w:rPr>
+              <w:t>NA</w:t>
             </w:r>
           </w:p>
         </w:tc>
@@ -5151,7 +5148,7 @@
                 <w:sz w:val="28"/>
                 <w:szCs w:val="28"/>
               </w:rPr>
-              <w:t>B193</w:t>
+              <w:t>ICP</w:t>
             </w:r>
           </w:p>
         </w:tc>
@@ -5378,7 +5375,7 @@
                 <w:sz w:val="28"/>
                 <w:szCs w:val="28"/>
               </w:rPr>
-              <w:t>RATNA</w:t>
+              <w:t>SHQ</w:t>
             </w:r>
           </w:p>
         </w:tc>
@@ -5595,18 +5592,17 @@
               <w:jc w:val="center"/>
               <w:rPr>
                 <w:rFonts w:ascii="Calibri" w:eastAsia="Calibri" w:hAnsi="Calibri" w:cs="Calibri"/>
-                <w:b/>
-                <w:sz w:val="28"/>
-                <w:szCs w:val="28"/>
-              </w:rPr>
-            </w:pPr>
-            <w:r>
-              <w:rPr>
-                <w:rFonts w:ascii="Calibri" w:eastAsia="Calibri" w:hAnsi="Calibri" w:cs="Calibri"/>
-                <w:sz w:val="28"/>
-                <w:szCs w:val="28"/>
-              </w:rPr>
-              <w:t>SHAKTI</w:t>
+                <w:sz w:val="28"/>
+                <w:szCs w:val="28"/>
+              </w:rPr>
+            </w:pPr>
+            <w:r>
+              <w:rPr>
+                <w:rFonts w:ascii="Calibri" w:eastAsia="Calibri" w:hAnsi="Calibri" w:cs="Calibri"/>
+                <w:sz w:val="28"/>
+                <w:szCs w:val="28"/>
+              </w:rPr>
+              <w:t>HERA</w:t>
             </w:r>
           </w:p>
         </w:tc>
@@ -5833,7 +5829,7 @@
                 <w:sz w:val="28"/>
                 <w:szCs w:val="28"/>
               </w:rPr>
-              <w:t>NLM</w:t>
+              <w:t>SGAV</w:t>
             </w:r>
           </w:p>
         </w:tc>
@@ -6067,7 +6063,7 @@
                 <w:sz w:val="28"/>
                 <w:szCs w:val="28"/>
               </w:rPr>
-              <w:t>MNW</w:t>
+              <w:t>WIN</w:t>
             </w:r>
           </w:p>
         </w:tc>
@@ -6293,7 +6289,7 @@
                 <w:sz w:val="28"/>
                 <w:szCs w:val="28"/>
               </w:rPr>
-              <w:t>JYOTI</w:t>
+              <w:t>FPSO</w:t>
             </w:r>
           </w:p>
         </w:tc>
@@ -6431,15 +6427,7 @@
                 <w:sz w:val="28"/>
                 <w:szCs w:val="28"/>
               </w:rPr>
-              <w:t>SMRT</w:t>
-            </w:r>
-            <w:r>
-              <w:rPr>
-                <w:rFonts w:ascii="Calibri" w:eastAsia="Calibri" w:hAnsi="Calibri" w:cs="Calibri"/>
-                <w:sz w:val="28"/>
-                <w:szCs w:val="28"/>
-              </w:rPr>
-              <w:t xml:space="preserve">, </w:t>
+              <w:t xml:space="preserve"> </w:t>
             </w:r>
           </w:p>
         </w:tc>
@@ -7154,14 +7142,6 @@
                 <w:szCs w:val="28"/>
               </w:rPr>
             </w:pPr>
-            <w:r>
-              <w:rPr>
-                <w:rFonts w:ascii="Calibri" w:eastAsia="Calibri" w:hAnsi="Calibri" w:cs="Calibri"/>
-                <w:sz w:val="28"/>
-                <w:szCs w:val="28"/>
-              </w:rPr>
-              <w:t>J STAR</w:t>
-            </w:r>
           </w:p>
         </w:tc>
         <w:tc>
@@ -7384,14 +7364,6 @@
                 <w:szCs w:val="28"/>
               </w:rPr>
             </w:pPr>
-            <w:r>
-              <w:rPr>
-                <w:rFonts w:ascii="Calibri" w:eastAsia="Calibri" w:hAnsi="Calibri" w:cs="Calibri"/>
-                <w:sz w:val="28"/>
-                <w:szCs w:val="28"/>
-              </w:rPr>
-              <w:t>GAURAV</w:t>
-            </w:r>
           </w:p>
         </w:tc>
         <w:tc>
@@ -7615,16 +7587,6 @@
                 <w:szCs w:val="28"/>
               </w:rPr>
             </w:pPr>
-            <w:r>
-              <w:rPr>
-                <w:rFonts w:ascii="Calibri" w:eastAsia="Calibri" w:hAnsi="Calibri" w:cs="Calibri"/>
-                <w:sz w:val="28"/>
-                <w:szCs w:val="28"/>
-              </w:rPr>
-              <w:t>CHARU</w:t>
-            </w:r>
-            <w:bookmarkStart w:id="0" w:name="_GoBack"/>
-            <w:bookmarkEnd w:id="0"/>
           </w:p>
         </w:tc>
         <w:tc>
@@ -8115,10 +8077,10 @@
         <w:szCs w:val="28"/>
       </w:rPr>
       <w:object w:dxaOrig="1188" w:dyaOrig="900">
-        <v:rect id="_x0000_i1025" style="width:55.65pt;height:38.6pt" o:ole="" o:preferrelative="t" stroked="f">
+        <v:rect id="_x0000_i1025" style="width:55.5pt;height:38.25pt" o:ole="" o:preferrelative="t" stroked="f">
           <v:imagedata r:id="rId1" o:title=""/>
         </v:rect>
-        <o:OLEObject Type="Embed" ProgID="StaticMetafile" ShapeID="_x0000_i1025" DrawAspect="Content" ObjectID="_1853413958" r:id="rId2"/>
+        <o:OLEObject Type="Embed" ProgID="StaticMetafile" ShapeID="_x0000_i1025" DrawAspect="Content" ObjectID="_1853497018" r:id="rId2"/>
       </w:object>
     </w:r>
     <w:r>
@@ -8166,7 +8128,7 @@
         <w:sz w:val="28"/>
         <w:szCs w:val="28"/>
       </w:rPr>
-      <w:t>4</w:t>
+      <w:t>5</w:t>
     </w:r>
     <w:r>
       <w:rPr>
@@ -8196,17 +8158,7 @@
         <w:sz w:val="28"/>
         <w:szCs w:val="28"/>
       </w:rPr>
-      <w:t>WEDN</w:t>
-    </w:r>
-    <w:r>
-      <w:rPr>
-        <w:rFonts w:cs="Times New Roman"/>
-        <w:b/>
-        <w:color w:val="000000" w:themeColor="text1"/>
-        <w:sz w:val="28"/>
-        <w:szCs w:val="28"/>
-      </w:rPr>
-      <w:t>ES</w:t>
+      <w:t>THURS</w:t>
     </w:r>
     <w:r>
       <w:rPr>

</xml_diff>

<commit_message>
Sync - 2026-10-15 17:07
</commit_message>
<xml_diff>
--- a/files/Daily_Helicopter_Schedule.docx
+++ b/files/Daily_Helicopter_Schedule.docx
@@ -1761,7 +1761,7 @@
                 <w:sz w:val="28"/>
                 <w:szCs w:val="28"/>
               </w:rPr>
-              <w:t>HELIGO 412</w:t>
+              <w:t>NA</w:t>
             </w:r>
           </w:p>
         </w:tc>
@@ -1796,7 +1796,7 @@
                 <w:sz w:val="28"/>
                 <w:szCs w:val="28"/>
               </w:rPr>
-              <w:t>HLV</w:t>
+              <w:t>NA</w:t>
             </w:r>
           </w:p>
         </w:tc>
@@ -1831,7 +1831,15 @@
                 <w:sz w:val="28"/>
                 <w:szCs w:val="28"/>
               </w:rPr>
-              <w:t>08</w:t>
+              <w:t>0</w:t>
+            </w:r>
+            <w:r>
+              <w:rPr>
+                <w:rFonts w:ascii="Calibri" w:eastAsia="Calibri" w:hAnsi="Calibri" w:cs="Calibri"/>
+                <w:sz w:val="28"/>
+                <w:szCs w:val="28"/>
+              </w:rPr>
+              <w:t>0</w:t>
             </w:r>
           </w:p>
         </w:tc>
@@ -3415,7 +3423,15 @@
                 <w:sz w:val="28"/>
                 <w:szCs w:val="28"/>
               </w:rPr>
-              <w:t>BLQ2</w:t>
+              <w:t>B</w:t>
+            </w:r>
+            <w:r>
+              <w:rPr>
+                <w:rFonts w:ascii="Calibri" w:eastAsia="Calibri" w:hAnsi="Calibri" w:cs="Calibri"/>
+                <w:sz w:val="28"/>
+                <w:szCs w:val="28"/>
+              </w:rPr>
+              <w:t>193</w:t>
             </w:r>
           </w:p>
         </w:tc>
@@ -4176,10 +4192,11 @@
             <w:r>
               <w:rPr>
                 <w:rFonts w:ascii="Calibri" w:eastAsia="Calibri" w:hAnsi="Calibri" w:cs="Calibri"/>
-                <w:sz w:val="28"/>
-                <w:szCs w:val="28"/>
-              </w:rPr>
-              <w:t>MNW</w:t>
+                <w:b/>
+                <w:sz w:val="28"/>
+                <w:szCs w:val="28"/>
+              </w:rPr>
+              <w:t>NA</w:t>
             </w:r>
           </w:p>
         </w:tc>
@@ -4638,8 +4655,6 @@
               </w:rPr>
               <w:t>NA</w:t>
             </w:r>
-            <w:bookmarkStart w:id="0" w:name="_GoBack"/>
-            <w:bookmarkEnd w:id="0"/>
           </w:p>
         </w:tc>
         <w:tc>
@@ -5375,7 +5390,7 @@
                 <w:sz w:val="28"/>
                 <w:szCs w:val="28"/>
               </w:rPr>
-              <w:t>SHQ</w:t>
+              <w:t>MNW</w:t>
             </w:r>
           </w:p>
         </w:tc>
@@ -5602,7 +5617,7 @@
                 <w:sz w:val="28"/>
                 <w:szCs w:val="28"/>
               </w:rPr>
-              <w:t>HERA</w:t>
+              <w:t>SLQ</w:t>
             </w:r>
           </w:p>
         </w:tc>
@@ -5829,7 +5844,7 @@
                 <w:sz w:val="28"/>
                 <w:szCs w:val="28"/>
               </w:rPr>
-              <w:t>SGAV</w:t>
+              <w:t>NQO</w:t>
             </w:r>
           </w:p>
         </w:tc>
@@ -6063,7 +6078,15 @@
                 <w:sz w:val="28"/>
                 <w:szCs w:val="28"/>
               </w:rPr>
-              <w:t>WIN</w:t>
+              <w:t>SJOT</w:t>
+            </w:r>
+            <w:r>
+              <w:rPr>
+                <w:rFonts w:ascii="Calibri" w:eastAsia="Calibri" w:hAnsi="Calibri" w:cs="Calibri"/>
+                <w:sz w:val="28"/>
+                <w:szCs w:val="28"/>
+              </w:rPr>
+              <w:t xml:space="preserve"> </w:t>
             </w:r>
           </w:p>
         </w:tc>
@@ -6283,14 +6306,16 @@
                 <w:szCs w:val="28"/>
               </w:rPr>
             </w:pPr>
-            <w:r>
-              <w:rPr>
-                <w:rFonts w:ascii="Calibri" w:eastAsia="Calibri" w:hAnsi="Calibri" w:cs="Calibri"/>
-                <w:sz w:val="28"/>
-                <w:szCs w:val="28"/>
-              </w:rPr>
-              <w:t>FPSO</w:t>
-            </w:r>
+            <w:bookmarkStart w:id="0" w:name="_GoBack"/>
+            <w:r>
+              <w:rPr>
+                <w:rFonts w:ascii="Calibri" w:eastAsia="Calibri" w:hAnsi="Calibri" w:cs="Calibri"/>
+                <w:sz w:val="28"/>
+                <w:szCs w:val="28"/>
+              </w:rPr>
+              <w:t>SHQ</w:t>
+            </w:r>
+            <w:bookmarkEnd w:id="0"/>
           </w:p>
         </w:tc>
         <w:tc>
@@ -7142,6 +7167,14 @@
                 <w:szCs w:val="28"/>
               </w:rPr>
             </w:pPr>
+            <w:r>
+              <w:rPr>
+                <w:rFonts w:ascii="Calibri" w:eastAsia="Calibri" w:hAnsi="Calibri" w:cs="Calibri"/>
+                <w:sz w:val="28"/>
+                <w:szCs w:val="28"/>
+              </w:rPr>
+              <w:t>SUDA</w:t>
+            </w:r>
           </w:p>
         </w:tc>
         <w:tc>
@@ -7364,6 +7397,14 @@
                 <w:szCs w:val="28"/>
               </w:rPr>
             </w:pPr>
+            <w:r>
+              <w:rPr>
+                <w:rFonts w:ascii="Calibri" w:eastAsia="Calibri" w:hAnsi="Calibri" w:cs="Calibri"/>
+                <w:sz w:val="28"/>
+                <w:szCs w:val="28"/>
+              </w:rPr>
+              <w:t>SRAT</w:t>
+            </w:r>
           </w:p>
         </w:tc>
         <w:tc>
@@ -8080,7 +8121,7 @@
         <v:rect id="_x0000_i1025" style="width:55.5pt;height:38.25pt" o:ole="" o:preferrelative="t" stroked="f">
           <v:imagedata r:id="rId1" o:title=""/>
         </v:rect>
-        <o:OLEObject Type="Embed" ProgID="StaticMetafile" ShapeID="_x0000_i1025" DrawAspect="Content" ObjectID="_1853497018" r:id="rId2"/>
+        <o:OLEObject Type="Embed" ProgID="StaticMetafile" ShapeID="_x0000_i1025" DrawAspect="Content" ObjectID="_1853588704" r:id="rId2"/>
       </w:object>
     </w:r>
     <w:r>
@@ -8128,7 +8169,7 @@
         <w:sz w:val="28"/>
         <w:szCs w:val="28"/>
       </w:rPr>
-      <w:t>5</w:t>
+      <w:t>6</w:t>
     </w:r>
     <w:r>
       <w:rPr>
@@ -8158,7 +8199,7 @@
         <w:sz w:val="28"/>
         <w:szCs w:val="28"/>
       </w:rPr>
-      <w:t>THURS</w:t>
+      <w:t>FRI</w:t>
     </w:r>
     <w:r>
       <w:rPr>

</xml_diff>

<commit_message>
Sync - 2026-10-16 16:09
</commit_message>
<xml_diff>
--- a/files/Daily_Helicopter_Schedule.docx
+++ b/files/Daily_Helicopter_Schedule.docx
@@ -1400,6 +1400,16 @@
               </w:rPr>
               <w:t>)</w:t>
             </w:r>
+            <w:r>
+              <w:rPr>
+                <w:rFonts w:ascii="Calibri" w:eastAsia="Calibri" w:hAnsi="Calibri" w:cs="Calibri"/>
+                <w:sz w:val="28"/>
+                <w:szCs w:val="28"/>
+              </w:rPr>
+              <w:t xml:space="preserve"> </w:t>
+            </w:r>
+            <w:bookmarkStart w:id="0" w:name="_GoBack"/>
+            <w:bookmarkEnd w:id="0"/>
           </w:p>
         </w:tc>
         <w:tc>
@@ -1718,15 +1728,7 @@
                 <w:sz w:val="28"/>
                 <w:szCs w:val="28"/>
               </w:rPr>
-              <w:t>HF</w:t>
-            </w:r>
-            <w:r>
-              <w:rPr>
-                <w:rFonts w:ascii="Calibri" w:eastAsia="Calibri" w:hAnsi="Calibri" w:cs="Calibri"/>
-                <w:sz w:val="28"/>
-                <w:szCs w:val="28"/>
-              </w:rPr>
-              <w:t xml:space="preserve"> (PM)</w:t>
+              <w:t>HF (PM)</w:t>
             </w:r>
           </w:p>
         </w:tc>
@@ -1739,29 +1741,30 @@
               <w:bottom w:val="single" w:sz="4" w:space="0" w:color="000000"/>
               <w:right w:val="single" w:sz="4" w:space="0" w:color="000000"/>
             </w:tcBorders>
-            <w:shd w:val="clear" w:color="auto" w:fill="auto"/>
-            <w:tcMar>
-              <w:left w:w="108" w:type="dxa"/>
-              <w:right w:w="108" w:type="dxa"/>
-            </w:tcMar>
-          </w:tcPr>
-          <w:p>
-            <w:pPr>
-              <w:spacing w:after="0" w:line="240" w:lineRule="auto"/>
-              <w:jc w:val="center"/>
-              <w:rPr>
-                <w:rFonts w:ascii="Calibri" w:eastAsia="Calibri" w:hAnsi="Calibri" w:cs="Calibri"/>
-                <w:sz w:val="28"/>
-                <w:szCs w:val="28"/>
-              </w:rPr>
-            </w:pPr>
-            <w:r>
-              <w:rPr>
-                <w:rFonts w:ascii="Calibri" w:eastAsia="Calibri" w:hAnsi="Calibri" w:cs="Calibri"/>
-                <w:sz w:val="28"/>
-                <w:szCs w:val="28"/>
-              </w:rPr>
-              <w:t>NA</w:t>
+            <w:shd w:val="clear" w:color="000000" w:fill="FFFFFF"/>
+            <w:tcMar>
+              <w:left w:w="108" w:type="dxa"/>
+              <w:right w:w="108" w:type="dxa"/>
+            </w:tcMar>
+          </w:tcPr>
+          <w:p>
+            <w:pPr>
+              <w:spacing w:after="0" w:line="240" w:lineRule="auto"/>
+              <w:jc w:val="center"/>
+              <w:rPr>
+                <w:rFonts w:ascii="Calibri" w:eastAsia="Calibri" w:hAnsi="Calibri" w:cs="Calibri"/>
+                <w:b/>
+                <w:sz w:val="28"/>
+                <w:szCs w:val="28"/>
+              </w:rPr>
+            </w:pPr>
+            <w:r>
+              <w:rPr>
+                <w:rFonts w:ascii="Calibri" w:eastAsia="Calibri" w:hAnsi="Calibri" w:cs="Calibri"/>
+                <w:sz w:val="28"/>
+                <w:szCs w:val="28"/>
+              </w:rPr>
+              <w:t>GVHL 169</w:t>
             </w:r>
           </w:p>
         </w:tc>
@@ -1774,29 +1777,29 @@
               <w:bottom w:val="single" w:sz="4" w:space="0" w:color="000000"/>
               <w:right w:val="single" w:sz="4" w:space="0" w:color="000000"/>
             </w:tcBorders>
-            <w:shd w:val="clear" w:color="auto" w:fill="auto"/>
-            <w:tcMar>
-              <w:left w:w="108" w:type="dxa"/>
-              <w:right w:w="108" w:type="dxa"/>
-            </w:tcMar>
-          </w:tcPr>
-          <w:p>
-            <w:pPr>
-              <w:spacing w:after="0" w:line="240" w:lineRule="auto"/>
-              <w:jc w:val="center"/>
-              <w:rPr>
-                <w:rFonts w:ascii="Calibri" w:eastAsia="Calibri" w:hAnsi="Calibri" w:cs="Calibri"/>
-                <w:sz w:val="28"/>
-                <w:szCs w:val="28"/>
-              </w:rPr>
-            </w:pPr>
-            <w:r>
-              <w:rPr>
-                <w:rFonts w:ascii="Calibri" w:eastAsia="Calibri" w:hAnsi="Calibri" w:cs="Calibri"/>
-                <w:sz w:val="28"/>
-                <w:szCs w:val="28"/>
-              </w:rPr>
-              <w:t>NA</w:t>
+            <w:shd w:val="clear" w:color="000000" w:fill="FFFFFF"/>
+            <w:tcMar>
+              <w:left w:w="108" w:type="dxa"/>
+              <w:right w:w="108" w:type="dxa"/>
+            </w:tcMar>
+          </w:tcPr>
+          <w:p>
+            <w:pPr>
+              <w:spacing w:after="0" w:line="240" w:lineRule="auto"/>
+              <w:jc w:val="center"/>
+              <w:rPr>
+                <w:rFonts w:ascii="Calibri" w:eastAsia="Calibri" w:hAnsi="Calibri" w:cs="Calibri"/>
+                <w:sz w:val="28"/>
+                <w:szCs w:val="28"/>
+              </w:rPr>
+            </w:pPr>
+            <w:r>
+              <w:rPr>
+                <w:rFonts w:ascii="Calibri" w:eastAsia="Calibri" w:hAnsi="Calibri" w:cs="Calibri"/>
+                <w:sz w:val="28"/>
+                <w:szCs w:val="28"/>
+              </w:rPr>
+              <w:t>RRL</w:t>
             </w:r>
           </w:p>
         </w:tc>
@@ -1831,15 +1834,7 @@
                 <w:sz w:val="28"/>
                 <w:szCs w:val="28"/>
               </w:rPr>
-              <w:t>0</w:t>
-            </w:r>
-            <w:r>
-              <w:rPr>
-                <w:rFonts w:ascii="Calibri" w:eastAsia="Calibri" w:hAnsi="Calibri" w:cs="Calibri"/>
-                <w:sz w:val="28"/>
-                <w:szCs w:val="28"/>
-              </w:rPr>
-              <w:t>0</w:t>
+              <w:t>06</w:t>
             </w:r>
           </w:p>
         </w:tc>
@@ -1977,23 +1972,7 @@
                 <w:sz w:val="28"/>
                 <w:szCs w:val="28"/>
               </w:rPr>
-              <w:t>1</w:t>
-            </w:r>
-            <w:r>
-              <w:rPr>
-                <w:rFonts w:ascii="Calibri" w:eastAsia="Calibri" w:hAnsi="Calibri" w:cs="Calibri"/>
-                <w:sz w:val="28"/>
-                <w:szCs w:val="28"/>
-              </w:rPr>
-              <w:t>4</w:t>
-            </w:r>
-            <w:r>
-              <w:rPr>
-                <w:rFonts w:ascii="Calibri" w:eastAsia="Calibri" w:hAnsi="Calibri" w:cs="Calibri"/>
-                <w:sz w:val="28"/>
-                <w:szCs w:val="28"/>
-              </w:rPr>
-              <w:t>:0</w:t>
+              <w:t>14:0</w:t>
             </w:r>
             <w:r>
               <w:rPr>
@@ -3176,7 +3155,7 @@
                 <w:sz w:val="28"/>
                 <w:szCs w:val="28"/>
               </w:rPr>
-              <w:t>BLQ2</w:t>
+              <w:t>NA</w:t>
             </w:r>
           </w:p>
         </w:tc>
@@ -3206,14 +3185,6 @@
                 <w:szCs w:val="28"/>
               </w:rPr>
             </w:pPr>
-            <w:r>
-              <w:rPr>
-                <w:rFonts w:ascii="Calibri" w:eastAsia="Calibri" w:hAnsi="Calibri" w:cs="Calibri"/>
-                <w:sz w:val="28"/>
-                <w:szCs w:val="28"/>
-              </w:rPr>
-              <w:t>GVHL 169</w:t>
-            </w:r>
           </w:p>
         </w:tc>
         <w:tc>
@@ -3241,14 +3212,6 @@
                 <w:szCs w:val="28"/>
               </w:rPr>
             </w:pPr>
-            <w:r>
-              <w:rPr>
-                <w:rFonts w:ascii="Calibri" w:eastAsia="Calibri" w:hAnsi="Calibri" w:cs="Calibri"/>
-                <w:sz w:val="28"/>
-                <w:szCs w:val="28"/>
-              </w:rPr>
-              <w:t>RRL</w:t>
-            </w:r>
           </w:p>
         </w:tc>
         <w:tc>
@@ -3423,15 +3386,7 @@
                 <w:sz w:val="28"/>
                 <w:szCs w:val="28"/>
               </w:rPr>
-              <w:t>B</w:t>
-            </w:r>
-            <w:r>
-              <w:rPr>
-                <w:rFonts w:ascii="Calibri" w:eastAsia="Calibri" w:hAnsi="Calibri" w:cs="Calibri"/>
-                <w:sz w:val="28"/>
-                <w:szCs w:val="28"/>
-              </w:rPr>
-              <w:t>193</w:t>
+              <w:t>NA</w:t>
             </w:r>
           </w:p>
         </w:tc>
@@ -3461,14 +3416,6 @@
                 <w:szCs w:val="28"/>
               </w:rPr>
             </w:pPr>
-            <w:r>
-              <w:rPr>
-                <w:rFonts w:ascii="Calibri" w:eastAsia="Calibri" w:hAnsi="Calibri" w:cs="Calibri"/>
-                <w:sz w:val="28"/>
-                <w:szCs w:val="28"/>
-              </w:rPr>
-              <w:t>GVHL 169</w:t>
-            </w:r>
           </w:p>
         </w:tc>
         <w:tc>
@@ -3496,14 +3443,6 @@
                 <w:szCs w:val="28"/>
               </w:rPr>
             </w:pPr>
-            <w:r>
-              <w:rPr>
-                <w:rFonts w:ascii="Calibri" w:eastAsia="Calibri" w:hAnsi="Calibri" w:cs="Calibri"/>
-                <w:sz w:val="28"/>
-                <w:szCs w:val="28"/>
-              </w:rPr>
-              <w:t>RRL</w:t>
-            </w:r>
           </w:p>
         </w:tc>
         <w:tc>
@@ -5163,7 +5102,7 @@
                 <w:sz w:val="28"/>
                 <w:szCs w:val="28"/>
               </w:rPr>
-              <w:t>ICP</w:t>
+              <w:t>VKDN2</w:t>
             </w:r>
           </w:p>
         </w:tc>
@@ -5390,7 +5329,7 @@
                 <w:sz w:val="28"/>
                 <w:szCs w:val="28"/>
               </w:rPr>
-              <w:t>MNW</w:t>
+              <w:t>SHAKTI</w:t>
             </w:r>
           </w:p>
         </w:tc>
@@ -5617,7 +5556,7 @@
                 <w:sz w:val="28"/>
                 <w:szCs w:val="28"/>
               </w:rPr>
-              <w:t>SLQ</w:t>
+              <w:t>J SUP</w:t>
             </w:r>
           </w:p>
         </w:tc>
@@ -5844,7 +5783,7 @@
                 <w:sz w:val="28"/>
                 <w:szCs w:val="28"/>
               </w:rPr>
-              <w:t>NQO</w:t>
+              <w:t>VKDN2</w:t>
             </w:r>
           </w:p>
         </w:tc>
@@ -6078,15 +6017,7 @@
                 <w:sz w:val="28"/>
                 <w:szCs w:val="28"/>
               </w:rPr>
-              <w:t>SJOT</w:t>
-            </w:r>
-            <w:r>
-              <w:rPr>
-                <w:rFonts w:ascii="Calibri" w:eastAsia="Calibri" w:hAnsi="Calibri" w:cs="Calibri"/>
-                <w:sz w:val="28"/>
-                <w:szCs w:val="28"/>
-              </w:rPr>
-              <w:t xml:space="preserve"> </w:t>
+              <w:t>ABN4</w:t>
             </w:r>
           </w:p>
         </w:tc>
@@ -6306,16 +6237,14 @@
                 <w:szCs w:val="28"/>
               </w:rPr>
             </w:pPr>
-            <w:bookmarkStart w:id="0" w:name="_GoBack"/>
-            <w:r>
-              <w:rPr>
-                <w:rFonts w:ascii="Calibri" w:eastAsia="Calibri" w:hAnsi="Calibri" w:cs="Calibri"/>
-                <w:sz w:val="28"/>
-                <w:szCs w:val="28"/>
-              </w:rPr>
-              <w:t>SHQ</w:t>
-            </w:r>
-            <w:bookmarkEnd w:id="0"/>
+            <w:r>
+              <w:rPr>
+                <w:rFonts w:ascii="Calibri" w:eastAsia="Calibri" w:hAnsi="Calibri" w:cs="Calibri"/>
+                <w:sz w:val="28"/>
+                <w:szCs w:val="28"/>
+              </w:rPr>
+              <w:t>J SUP</w:t>
+            </w:r>
           </w:p>
         </w:tc>
         <w:tc>
@@ -7173,7 +7102,7 @@
                 <w:sz w:val="28"/>
                 <w:szCs w:val="28"/>
               </w:rPr>
-              <w:t>SUDA</w:t>
+              <w:t>GAURAV</w:t>
             </w:r>
           </w:p>
         </w:tc>
@@ -7403,7 +7332,7 @@
                 <w:sz w:val="28"/>
                 <w:szCs w:val="28"/>
               </w:rPr>
-              <w:t>SRAT</w:t>
+              <w:t>CHARU</w:t>
             </w:r>
           </w:p>
         </w:tc>
@@ -7628,6 +7557,14 @@
                 <w:szCs w:val="28"/>
               </w:rPr>
             </w:pPr>
+            <w:r>
+              <w:rPr>
+                <w:rFonts w:ascii="Calibri" w:eastAsia="Calibri" w:hAnsi="Calibri" w:cs="Calibri"/>
+                <w:sz w:val="28"/>
+                <w:szCs w:val="28"/>
+              </w:rPr>
+              <w:t>L/O</w:t>
+            </w:r>
           </w:p>
         </w:tc>
         <w:tc>
@@ -8118,10 +8055,10 @@
         <w:szCs w:val="28"/>
       </w:rPr>
       <w:object w:dxaOrig="1188" w:dyaOrig="900">
-        <v:rect id="_x0000_i1025" style="width:55.5pt;height:38.25pt" o:ole="" o:preferrelative="t" stroked="f">
+        <v:rect id="_x0000_i1025" style="width:55.35pt;height:37.9pt" o:ole="" o:preferrelative="t" stroked="f">
           <v:imagedata r:id="rId1" o:title=""/>
         </v:rect>
-        <o:OLEObject Type="Embed" ProgID="StaticMetafile" ShapeID="_x0000_i1025" DrawAspect="Content" ObjectID="_1853588704" r:id="rId2"/>
+        <o:OLEObject Type="Embed" ProgID="StaticMetafile" ShapeID="_x0000_i1025" DrawAspect="Content" ObjectID="_1853671537" r:id="rId2"/>
       </w:object>
     </w:r>
     <w:r>
@@ -8169,7 +8106,7 @@
         <w:sz w:val="28"/>
         <w:szCs w:val="28"/>
       </w:rPr>
-      <w:t>6</w:t>
+      <w:t>7</w:t>
     </w:r>
     <w:r>
       <w:rPr>
@@ -8199,7 +8136,7 @@
         <w:sz w:val="28"/>
         <w:szCs w:val="28"/>
       </w:rPr>
-      <w:t>FRI</w:t>
+      <w:t>SATUR</w:t>
     </w:r>
     <w:r>
       <w:rPr>

</xml_diff>

<commit_message>
Sync - 2026-10-16 16:39
</commit_message>
<xml_diff>
--- a/files/Daily_Helicopter_Schedule.docx
+++ b/files/Daily_Helicopter_Schedule.docx
@@ -608,15 +608,7 @@
                 <w:sz w:val="28"/>
                 <w:szCs w:val="28"/>
               </w:rPr>
-              <w:t xml:space="preserve">BLQ </w:t>
-            </w:r>
-            <w:r>
-              <w:rPr>
-                <w:rFonts w:ascii="Calibri" w:eastAsia="Calibri" w:hAnsi="Calibri" w:cs="Calibri"/>
-                <w:sz w:val="28"/>
-                <w:szCs w:val="28"/>
-              </w:rPr>
-              <w:t>(D)</w:t>
+              <w:t>BLQ (D)</w:t>
             </w:r>
           </w:p>
         </w:tc>
@@ -629,29 +621,29 @@
               <w:bottom w:val="single" w:sz="4" w:space="0" w:color="000000"/>
               <w:right w:val="single" w:sz="4" w:space="0" w:color="000000"/>
             </w:tcBorders>
-            <w:shd w:val="clear" w:color="000000" w:fill="FFFFFF"/>
-            <w:tcMar>
-              <w:left w:w="108" w:type="dxa"/>
-              <w:right w:w="108" w:type="dxa"/>
-            </w:tcMar>
-          </w:tcPr>
-          <w:p>
-            <w:pPr>
-              <w:spacing w:after="0" w:line="240" w:lineRule="auto"/>
-              <w:jc w:val="center"/>
-              <w:rPr>
-                <w:rFonts w:ascii="Calibri" w:eastAsia="Calibri" w:hAnsi="Calibri" w:cs="Calibri"/>
-                <w:sz w:val="28"/>
-                <w:szCs w:val="28"/>
-              </w:rPr>
-            </w:pPr>
-            <w:r>
-              <w:rPr>
-                <w:rFonts w:ascii="Calibri" w:eastAsia="Calibri" w:hAnsi="Calibri" w:cs="Calibri"/>
-                <w:sz w:val="28"/>
-                <w:szCs w:val="28"/>
-              </w:rPr>
-              <w:t>GVHL 169</w:t>
+            <w:shd w:val="clear" w:color="auto" w:fill="auto"/>
+            <w:tcMar>
+              <w:left w:w="108" w:type="dxa"/>
+              <w:right w:w="108" w:type="dxa"/>
+            </w:tcMar>
+          </w:tcPr>
+          <w:p>
+            <w:pPr>
+              <w:spacing w:after="0" w:line="240" w:lineRule="auto"/>
+              <w:jc w:val="center"/>
+              <w:rPr>
+                <w:rFonts w:ascii="Calibri" w:eastAsia="Calibri" w:hAnsi="Calibri" w:cs="Calibri"/>
+                <w:sz w:val="28"/>
+                <w:szCs w:val="28"/>
+              </w:rPr>
+            </w:pPr>
+            <w:r>
+              <w:rPr>
+                <w:rFonts w:ascii="Calibri" w:eastAsia="Calibri" w:hAnsi="Calibri" w:cs="Calibri"/>
+                <w:sz w:val="28"/>
+                <w:szCs w:val="28"/>
+              </w:rPr>
+              <w:t>HELIGO 412</w:t>
             </w:r>
           </w:p>
         </w:tc>
@@ -664,29 +656,29 @@
               <w:bottom w:val="single" w:sz="4" w:space="0" w:color="000000"/>
               <w:right w:val="single" w:sz="4" w:space="0" w:color="000000"/>
             </w:tcBorders>
-            <w:shd w:val="clear" w:color="000000" w:fill="FFFFFF"/>
-            <w:tcMar>
-              <w:left w:w="108" w:type="dxa"/>
-              <w:right w:w="108" w:type="dxa"/>
-            </w:tcMar>
-          </w:tcPr>
-          <w:p>
-            <w:pPr>
-              <w:spacing w:after="0" w:line="240" w:lineRule="auto"/>
-              <w:jc w:val="center"/>
-              <w:rPr>
-                <w:rFonts w:ascii="Calibri" w:eastAsia="Calibri" w:hAnsi="Calibri" w:cs="Calibri"/>
-                <w:sz w:val="28"/>
-                <w:szCs w:val="28"/>
-              </w:rPr>
-            </w:pPr>
-            <w:r>
-              <w:rPr>
-                <w:rFonts w:ascii="Calibri" w:eastAsia="Calibri" w:hAnsi="Calibri" w:cs="Calibri"/>
-                <w:sz w:val="28"/>
-                <w:szCs w:val="28"/>
-              </w:rPr>
-              <w:t>RRJ</w:t>
+            <w:shd w:val="clear" w:color="auto" w:fill="auto"/>
+            <w:tcMar>
+              <w:left w:w="108" w:type="dxa"/>
+              <w:right w:w="108" w:type="dxa"/>
+            </w:tcMar>
+          </w:tcPr>
+          <w:p>
+            <w:pPr>
+              <w:spacing w:after="0" w:line="240" w:lineRule="auto"/>
+              <w:jc w:val="center"/>
+              <w:rPr>
+                <w:rFonts w:ascii="Calibri" w:eastAsia="Calibri" w:hAnsi="Calibri" w:cs="Calibri"/>
+                <w:sz w:val="28"/>
+                <w:szCs w:val="28"/>
+              </w:rPr>
+            </w:pPr>
+            <w:r>
+              <w:rPr>
+                <w:rFonts w:ascii="Calibri" w:eastAsia="Calibri" w:hAnsi="Calibri" w:cs="Calibri"/>
+                <w:sz w:val="28"/>
+                <w:szCs w:val="28"/>
+              </w:rPr>
+              <w:t>HLT</w:t>
             </w:r>
           </w:p>
         </w:tc>
@@ -1116,7 +1108,7 @@
                 <w:sz w:val="28"/>
                 <w:szCs w:val="28"/>
               </w:rPr>
-              <w:t>SF (D)</w:t>
+              <w:t>SF (D)+NF[D]</w:t>
             </w:r>
           </w:p>
         </w:tc>
@@ -1374,42 +1366,8 @@
                 <w:sz w:val="28"/>
                 <w:szCs w:val="28"/>
               </w:rPr>
-              <w:t>NF</w:t>
-            </w:r>
-            <w:r>
-              <w:rPr>
-                <w:rFonts w:ascii="Calibri" w:eastAsia="Calibri" w:hAnsi="Calibri" w:cs="Calibri"/>
-                <w:sz w:val="28"/>
-                <w:szCs w:val="28"/>
-              </w:rPr>
-              <w:t>(</w:t>
-            </w:r>
-            <w:r>
-              <w:rPr>
-                <w:rFonts w:ascii="Calibri" w:eastAsia="Calibri" w:hAnsi="Calibri" w:cs="Calibri"/>
-                <w:sz w:val="28"/>
-                <w:szCs w:val="28"/>
-              </w:rPr>
-              <w:t>D</w:t>
-            </w:r>
-            <w:r>
-              <w:rPr>
-                <w:rFonts w:ascii="Calibri" w:eastAsia="Calibri" w:hAnsi="Calibri" w:cs="Calibri"/>
-                <w:sz w:val="28"/>
-                <w:szCs w:val="28"/>
-              </w:rPr>
-              <w:t>)</w:t>
-            </w:r>
-            <w:r>
-              <w:rPr>
-                <w:rFonts w:ascii="Calibri" w:eastAsia="Calibri" w:hAnsi="Calibri" w:cs="Calibri"/>
-                <w:sz w:val="28"/>
-                <w:szCs w:val="28"/>
-              </w:rPr>
-              <w:t xml:space="preserve"> </w:t>
-            </w:r>
-            <w:bookmarkStart w:id="0" w:name="_GoBack"/>
-            <w:bookmarkEnd w:id="0"/>
+              <w:t>NA</w:t>
+            </w:r>
           </w:p>
         </w:tc>
         <w:tc>
@@ -1443,7 +1401,7 @@
                 <w:sz w:val="28"/>
                 <w:szCs w:val="28"/>
               </w:rPr>
-              <w:t>HELIGO 412</w:t>
+              <w:t>NA</w:t>
             </w:r>
           </w:p>
         </w:tc>
@@ -1478,7 +1436,7 @@
                 <w:sz w:val="28"/>
                 <w:szCs w:val="28"/>
               </w:rPr>
-              <w:t>HLT</w:t>
+              <w:t>NA</w:t>
             </w:r>
           </w:p>
         </w:tc>
@@ -1513,7 +1471,7 @@
                 <w:sz w:val="28"/>
                 <w:szCs w:val="28"/>
               </w:rPr>
-              <w:t>07</w:t>
+              <w:t>00</w:t>
             </w:r>
           </w:p>
         </w:tc>
@@ -2611,7 +2569,7 @@
                 <w:sz w:val="28"/>
                 <w:szCs w:val="28"/>
               </w:rPr>
-              <w:t>RRI</w:t>
+              <w:t>RRJ</w:t>
             </w:r>
           </w:p>
         </w:tc>
@@ -3155,7 +3113,7 @@
                 <w:sz w:val="28"/>
                 <w:szCs w:val="28"/>
               </w:rPr>
-              <w:t>NA</w:t>
+              <w:t>BLQ1</w:t>
             </w:r>
           </w:p>
         </w:tc>
@@ -3212,6 +3170,14 @@
                 <w:szCs w:val="28"/>
               </w:rPr>
             </w:pPr>
+            <w:r>
+              <w:rPr>
+                <w:rFonts w:ascii="Calibri" w:eastAsia="Calibri" w:hAnsi="Calibri" w:cs="Calibri"/>
+                <w:sz w:val="28"/>
+                <w:szCs w:val="28"/>
+              </w:rPr>
+              <w:t>RRJ</w:t>
+            </w:r>
           </w:p>
         </w:tc>
         <w:tc>
@@ -3386,8 +3352,10 @@
                 <w:sz w:val="28"/>
                 <w:szCs w:val="28"/>
               </w:rPr>
-              <w:t>NA</w:t>
-            </w:r>
+              <w:t>MNW</w:t>
+            </w:r>
+            <w:bookmarkStart w:id="0" w:name="_GoBack"/>
+            <w:bookmarkEnd w:id="0"/>
           </w:p>
         </w:tc>
         <w:tc>
@@ -3443,6 +3411,14 @@
                 <w:szCs w:val="28"/>
               </w:rPr>
             </w:pPr>
+            <w:r>
+              <w:rPr>
+                <w:rFonts w:ascii="Calibri" w:eastAsia="Calibri" w:hAnsi="Calibri" w:cs="Calibri"/>
+                <w:sz w:val="28"/>
+                <w:szCs w:val="28"/>
+              </w:rPr>
+              <w:t>RRI</w:t>
+            </w:r>
           </w:p>
         </w:tc>
         <w:tc>
@@ -6461,7 +6437,27 @@
           <w:sz w:val="28"/>
           <w:szCs w:val="28"/>
         </w:rPr>
-        <w:t xml:space="preserve"> under review.</w:t>
+        <w:t xml:space="preserve"> under </w:t>
+      </w:r>
+      <w:proofErr w:type="gramStart"/>
+      <w:r>
+        <w:rPr>
+          <w:rFonts w:ascii="Calibri" w:eastAsia="Calibri" w:hAnsi="Calibri" w:cs="Calibri"/>
+          <w:b/>
+          <w:sz w:val="28"/>
+          <w:szCs w:val="28"/>
+        </w:rPr>
+        <w:t>review</w:t>
+      </w:r>
+      <w:proofErr w:type="gramEnd"/>
+      <w:r>
+        <w:rPr>
+          <w:rFonts w:ascii="Calibri" w:eastAsia="Calibri" w:hAnsi="Calibri" w:cs="Calibri"/>
+          <w:b/>
+          <w:sz w:val="28"/>
+          <w:szCs w:val="28"/>
+        </w:rPr>
+        <w:t>.</w:t>
       </w:r>
     </w:p>
     <w:p>
@@ -8055,10 +8051,10 @@
         <w:szCs w:val="28"/>
       </w:rPr>
       <w:object w:dxaOrig="1188" w:dyaOrig="900">
-        <v:rect id="_x0000_i1025" style="width:55.35pt;height:37.9pt" o:ole="" o:preferrelative="t" stroked="f">
+        <v:rect id="_x0000_i1025" style="width:55.25pt;height:37.65pt" o:ole="" o:preferrelative="t" stroked="f">
           <v:imagedata r:id="rId1" o:title=""/>
         </v:rect>
-        <o:OLEObject Type="Embed" ProgID="StaticMetafile" ShapeID="_x0000_i1025" DrawAspect="Content" ObjectID="_1853671537" r:id="rId2"/>
+        <o:OLEObject Type="Embed" ProgID="StaticMetafile" ShapeID="_x0000_i1025" DrawAspect="Content" ObjectID="_1853673739" r:id="rId2"/>
       </w:object>
     </w:r>
     <w:r>

</xml_diff>

<commit_message>
Sync - 2026-10-17 15:41
</commit_message>
<xml_diff>
--- a/files/Daily_Helicopter_Schedule.docx
+++ b/files/Daily_Helicopter_Schedule.docx
@@ -1108,7 +1108,7 @@
                 <w:sz w:val="28"/>
                 <w:szCs w:val="28"/>
               </w:rPr>
-              <w:t>SF (D)+NF[D]</w:t>
+              <w:t>SF (D)</w:t>
             </w:r>
           </w:p>
         </w:tc>
@@ -1366,7 +1366,7 @@
                 <w:sz w:val="28"/>
                 <w:szCs w:val="28"/>
               </w:rPr>
-              <w:t>NA</w:t>
+              <w:t>NF[D]</w:t>
             </w:r>
           </w:p>
         </w:tc>
@@ -1401,7 +1401,7 @@
                 <w:sz w:val="28"/>
                 <w:szCs w:val="28"/>
               </w:rPr>
-              <w:t>NA</w:t>
+              <w:t>GVHL 412</w:t>
             </w:r>
           </w:p>
         </w:tc>
@@ -1436,7 +1436,7 @@
                 <w:sz w:val="28"/>
                 <w:szCs w:val="28"/>
               </w:rPr>
-              <w:t>NA</w:t>
+              <w:t>RRI</w:t>
             </w:r>
           </w:p>
         </w:tc>
@@ -1471,7 +1471,7 @@
                 <w:sz w:val="28"/>
                 <w:szCs w:val="28"/>
               </w:rPr>
-              <w:t>00</w:t>
+              <w:t>07</w:t>
             </w:r>
           </w:p>
         </w:tc>
@@ -3113,7 +3113,7 @@
                 <w:sz w:val="28"/>
                 <w:szCs w:val="28"/>
               </w:rPr>
-              <w:t>BLQ1</w:t>
+              <w:t>NA</w:t>
             </w:r>
           </w:p>
         </w:tc>
@@ -3170,14 +3170,6 @@
                 <w:szCs w:val="28"/>
               </w:rPr>
             </w:pPr>
-            <w:r>
-              <w:rPr>
-                <w:rFonts w:ascii="Calibri" w:eastAsia="Calibri" w:hAnsi="Calibri" w:cs="Calibri"/>
-                <w:sz w:val="28"/>
-                <w:szCs w:val="28"/>
-              </w:rPr>
-              <w:t>RRJ</w:t>
-            </w:r>
           </w:p>
         </w:tc>
         <w:tc>
@@ -3352,10 +3344,8 @@
                 <w:sz w:val="28"/>
                 <w:szCs w:val="28"/>
               </w:rPr>
-              <w:t>MNW</w:t>
-            </w:r>
-            <w:bookmarkStart w:id="0" w:name="_GoBack"/>
-            <w:bookmarkEnd w:id="0"/>
+              <w:t>NA</w:t>
+            </w:r>
           </w:p>
         </w:tc>
         <w:tc>
@@ -3411,14 +3401,6 @@
                 <w:szCs w:val="28"/>
               </w:rPr>
             </w:pPr>
-            <w:r>
-              <w:rPr>
-                <w:rFonts w:ascii="Calibri" w:eastAsia="Calibri" w:hAnsi="Calibri" w:cs="Calibri"/>
-                <w:sz w:val="28"/>
-                <w:szCs w:val="28"/>
-              </w:rPr>
-              <w:t>RRI</w:t>
-            </w:r>
           </w:p>
         </w:tc>
         <w:tc>
@@ -4107,11 +4089,19 @@
             <w:r>
               <w:rPr>
                 <w:rFonts w:ascii="Calibri" w:eastAsia="Calibri" w:hAnsi="Calibri" w:cs="Calibri"/>
+                <w:sz w:val="28"/>
+                <w:szCs w:val="28"/>
+              </w:rPr>
+              <w:t>FD9</w:t>
+            </w:r>
+            <w:r>
+              <w:rPr>
+                <w:rFonts w:ascii="Calibri" w:eastAsia="Calibri" w:hAnsi="Calibri" w:cs="Calibri"/>
                 <w:b/>
                 <w:sz w:val="28"/>
                 <w:szCs w:val="28"/>
               </w:rPr>
-              <w:t>NA</w:t>
+              <w:t xml:space="preserve"> </w:t>
             </w:r>
           </w:p>
         </w:tc>
@@ -4564,11 +4554,19 @@
             <w:r>
               <w:rPr>
                 <w:rFonts w:ascii="Calibri" w:eastAsia="Calibri" w:hAnsi="Calibri" w:cs="Calibri"/>
+                <w:sz w:val="28"/>
+                <w:szCs w:val="28"/>
+              </w:rPr>
+              <w:t>DVDR</w:t>
+            </w:r>
+            <w:r>
+              <w:rPr>
+                <w:rFonts w:ascii="Calibri" w:eastAsia="Calibri" w:hAnsi="Calibri" w:cs="Calibri"/>
                 <w:b/>
                 <w:sz w:val="28"/>
                 <w:szCs w:val="28"/>
               </w:rPr>
-              <w:t>NA</w:t>
+              <w:t xml:space="preserve"> </w:t>
             </w:r>
           </w:p>
         </w:tc>
@@ -4791,11 +4789,18 @@
             <w:r>
               <w:rPr>
                 <w:rFonts w:ascii="Calibri" w:eastAsia="Calibri" w:hAnsi="Calibri" w:cs="Calibri"/>
-                <w:b/>
-                <w:sz w:val="28"/>
-                <w:szCs w:val="28"/>
-              </w:rPr>
-              <w:t>NA</w:t>
+                <w:sz w:val="28"/>
+                <w:szCs w:val="28"/>
+              </w:rPr>
+              <w:t xml:space="preserve"> </w:t>
+            </w:r>
+            <w:r>
+              <w:rPr>
+                <w:rFonts w:ascii="Calibri" w:eastAsia="Calibri" w:hAnsi="Calibri" w:cs="Calibri"/>
+                <w:sz w:val="28"/>
+                <w:szCs w:val="28"/>
+              </w:rPr>
+              <w:t>DISC1</w:t>
             </w:r>
           </w:p>
         </w:tc>
@@ -5078,7 +5083,7 @@
                 <w:sz w:val="28"/>
                 <w:szCs w:val="28"/>
               </w:rPr>
-              <w:t>VKDN2</w:t>
+              <w:t>ARMADA1</w:t>
             </w:r>
           </w:p>
         </w:tc>
@@ -5305,7 +5310,7 @@
                 <w:sz w:val="28"/>
                 <w:szCs w:val="28"/>
               </w:rPr>
-              <w:t>SHAKTI</w:t>
+              <w:t>SCHLR</w:t>
             </w:r>
           </w:p>
         </w:tc>
@@ -5532,7 +5537,7 @@
                 <w:sz w:val="28"/>
                 <w:szCs w:val="28"/>
               </w:rPr>
-              <w:t>J SUP</w:t>
+              <w:t>RATNA</w:t>
             </w:r>
           </w:p>
         </w:tc>
@@ -5759,7 +5764,7 @@
                 <w:sz w:val="28"/>
                 <w:szCs w:val="28"/>
               </w:rPr>
-              <w:t>VKDN2</w:t>
+              <w:t>TRI-2</w:t>
             </w:r>
           </w:p>
         </w:tc>
@@ -5993,7 +5998,7 @@
                 <w:sz w:val="28"/>
                 <w:szCs w:val="28"/>
               </w:rPr>
-              <w:t>ABN4</w:t>
+              <w:t>ABAN4</w:t>
             </w:r>
           </w:p>
         </w:tc>
@@ -6437,27 +6442,7 @@
           <w:sz w:val="28"/>
           <w:szCs w:val="28"/>
         </w:rPr>
-        <w:t xml:space="preserve"> under </w:t>
-      </w:r>
-      <w:proofErr w:type="gramStart"/>
-      <w:r>
-        <w:rPr>
-          <w:rFonts w:ascii="Calibri" w:eastAsia="Calibri" w:hAnsi="Calibri" w:cs="Calibri"/>
-          <w:b/>
-          <w:sz w:val="28"/>
-          <w:szCs w:val="28"/>
-        </w:rPr>
-        <w:t>review</w:t>
-      </w:r>
-      <w:proofErr w:type="gramEnd"/>
-      <w:r>
-        <w:rPr>
-          <w:rFonts w:ascii="Calibri" w:eastAsia="Calibri" w:hAnsi="Calibri" w:cs="Calibri"/>
-          <w:b/>
-          <w:sz w:val="28"/>
-          <w:szCs w:val="28"/>
-        </w:rPr>
-        <w:t>.</w:t>
+        <w:t xml:space="preserve"> under review.</w:t>
       </w:r>
     </w:p>
     <w:p>
@@ -7098,7 +7083,7 @@
                 <w:sz w:val="28"/>
                 <w:szCs w:val="28"/>
               </w:rPr>
-              <w:t>GAURAV</w:t>
+              <w:t>TAPTI[D]</w:t>
             </w:r>
           </w:p>
         </w:tc>
@@ -7322,14 +7307,6 @@
                 <w:szCs w:val="28"/>
               </w:rPr>
             </w:pPr>
-            <w:r>
-              <w:rPr>
-                <w:rFonts w:ascii="Calibri" w:eastAsia="Calibri" w:hAnsi="Calibri" w:cs="Calibri"/>
-                <w:sz w:val="28"/>
-                <w:szCs w:val="28"/>
-              </w:rPr>
-              <w:t>CHARU</w:t>
-            </w:r>
           </w:p>
         </w:tc>
         <w:tc>
@@ -7553,14 +7530,6 @@
                 <w:szCs w:val="28"/>
               </w:rPr>
             </w:pPr>
-            <w:r>
-              <w:rPr>
-                <w:rFonts w:ascii="Calibri" w:eastAsia="Calibri" w:hAnsi="Calibri" w:cs="Calibri"/>
-                <w:sz w:val="28"/>
-                <w:szCs w:val="28"/>
-              </w:rPr>
-              <w:t>L/O</w:t>
-            </w:r>
           </w:p>
         </w:tc>
         <w:tc>
@@ -7970,7 +7939,12 @@
       </w:pPr>
     </w:p>
     <w:sectPr>
-      <w:headerReference w:type="default" r:id="rId6"/>
+      <w:headerReference w:type="even" r:id="rId6"/>
+      <w:headerReference w:type="default" r:id="rId7"/>
+      <w:footerReference w:type="even" r:id="rId8"/>
+      <w:footerReference w:type="default" r:id="rId9"/>
+      <w:headerReference w:type="first" r:id="rId10"/>
+      <w:footerReference w:type="first" r:id="rId11"/>
       <w:pgSz w:w="11906" w:h="16838"/>
       <w:pgMar w:top="1" w:right="1440" w:bottom="1134" w:left="1134" w:header="708" w:footer="708" w:gutter="0"/>
       <w:cols w:space="708"/>
@@ -8005,6 +7979,36 @@
 </w:endnotes>
 </file>
 
+<file path=word/footer1.xml><?xml version="1.0" encoding="utf-8"?>
+<w:ftr xmlns:wpc="http://schemas.microsoft.com/office/word/2010/wordprocessingCanvas" xmlns:mc="http://schemas.openxmlformats.org/markup-compatibility/2006" xmlns:o="urn:schemas-microsoft-com:office:office" xmlns:r="http://schemas.openxmlformats.org/officeDocument/2006/relationships" xmlns:m="http://schemas.openxmlformats.org/officeDocument/2006/math" xmlns:v="urn:schemas-microsoft-com:vml" xmlns:wp14="http://schemas.microsoft.com/office/word/2010/wordprocessingDrawing" xmlns:wp="http://schemas.openxmlformats.org/drawingml/2006/wordprocessingDrawing" xmlns:w10="urn:schemas-microsoft-com:office:word" xmlns:w="http://schemas.openxmlformats.org/wordprocessingml/2006/main" xmlns:w14="http://schemas.microsoft.com/office/word/2010/wordml" xmlns:w15="http://schemas.microsoft.com/office/word/2012/wordml" xmlns:wpg="http://schemas.microsoft.com/office/word/2010/wordprocessingGroup" xmlns:wpi="http://schemas.microsoft.com/office/word/2010/wordprocessingInk" xmlns:wne="http://schemas.microsoft.com/office/word/2006/wordml" xmlns:wps="http://schemas.microsoft.com/office/word/2010/wordprocessingShape" mc:Ignorable="w14 w15 wp14">
+  <w:p>
+    <w:pPr>
+      <w:pStyle w:val="Footer"/>
+    </w:pPr>
+  </w:p>
+</w:ftr>
+</file>
+
+<file path=word/footer2.xml><?xml version="1.0" encoding="utf-8"?>
+<w:ftr xmlns:wpc="http://schemas.microsoft.com/office/word/2010/wordprocessingCanvas" xmlns:mc="http://schemas.openxmlformats.org/markup-compatibility/2006" xmlns:o="urn:schemas-microsoft-com:office:office" xmlns:r="http://schemas.openxmlformats.org/officeDocument/2006/relationships" xmlns:m="http://schemas.openxmlformats.org/officeDocument/2006/math" xmlns:v="urn:schemas-microsoft-com:vml" xmlns:wp14="http://schemas.microsoft.com/office/word/2010/wordprocessingDrawing" xmlns:wp="http://schemas.openxmlformats.org/drawingml/2006/wordprocessingDrawing" xmlns:w10="urn:schemas-microsoft-com:office:word" xmlns:w="http://schemas.openxmlformats.org/wordprocessingml/2006/main" xmlns:w14="http://schemas.microsoft.com/office/word/2010/wordml" xmlns:w15="http://schemas.microsoft.com/office/word/2012/wordml" xmlns:wpg="http://schemas.microsoft.com/office/word/2010/wordprocessingGroup" xmlns:wpi="http://schemas.microsoft.com/office/word/2010/wordprocessingInk" xmlns:wne="http://schemas.microsoft.com/office/word/2006/wordml" xmlns:wps="http://schemas.microsoft.com/office/word/2010/wordprocessingShape" mc:Ignorable="w14 w15 wp14">
+  <w:p>
+    <w:pPr>
+      <w:pStyle w:val="Footer"/>
+    </w:pPr>
+  </w:p>
+</w:ftr>
+</file>
+
+<file path=word/footer3.xml><?xml version="1.0" encoding="utf-8"?>
+<w:ftr xmlns:wpc="http://schemas.microsoft.com/office/word/2010/wordprocessingCanvas" xmlns:mc="http://schemas.openxmlformats.org/markup-compatibility/2006" xmlns:o="urn:schemas-microsoft-com:office:office" xmlns:r="http://schemas.openxmlformats.org/officeDocument/2006/relationships" xmlns:m="http://schemas.openxmlformats.org/officeDocument/2006/math" xmlns:v="urn:schemas-microsoft-com:vml" xmlns:wp14="http://schemas.microsoft.com/office/word/2010/wordprocessingDrawing" xmlns:wp="http://schemas.openxmlformats.org/drawingml/2006/wordprocessingDrawing" xmlns:w10="urn:schemas-microsoft-com:office:word" xmlns:w="http://schemas.openxmlformats.org/wordprocessingml/2006/main" xmlns:w14="http://schemas.microsoft.com/office/word/2010/wordml" xmlns:w15="http://schemas.microsoft.com/office/word/2012/wordml" xmlns:wpg="http://schemas.microsoft.com/office/word/2010/wordprocessingGroup" xmlns:wpi="http://schemas.microsoft.com/office/word/2010/wordprocessingInk" xmlns:wne="http://schemas.microsoft.com/office/word/2006/wordml" xmlns:wps="http://schemas.microsoft.com/office/word/2010/wordprocessingShape" mc:Ignorable="w14 w15 wp14">
+  <w:p>
+    <w:pPr>
+      <w:pStyle w:val="Footer"/>
+    </w:pPr>
+  </w:p>
+</w:ftr>
+</file>
+
 <file path=word/footnotes.xml><?xml version="1.0" encoding="utf-8"?>
 <w:footnotes xmlns:wpc="http://schemas.microsoft.com/office/word/2010/wordprocessingCanvas" xmlns:mc="http://schemas.openxmlformats.org/markup-compatibility/2006" xmlns:o="urn:schemas-microsoft-com:office:office" xmlns:r="http://schemas.openxmlformats.org/officeDocument/2006/relationships" xmlns:m="http://schemas.openxmlformats.org/officeDocument/2006/math" xmlns:v="urn:schemas-microsoft-com:vml" xmlns:wp14="http://schemas.microsoft.com/office/word/2010/wordprocessingDrawing" xmlns:wp="http://schemas.openxmlformats.org/drawingml/2006/wordprocessingDrawing" xmlns:w10="urn:schemas-microsoft-com:office:word" xmlns:w="http://schemas.openxmlformats.org/wordprocessingml/2006/main" xmlns:w14="http://schemas.microsoft.com/office/word/2010/wordml" xmlns:w15="http://schemas.microsoft.com/office/word/2012/wordml" xmlns:wpg="http://schemas.microsoft.com/office/word/2010/wordprocessingGroup" xmlns:wpi="http://schemas.microsoft.com/office/word/2010/wordprocessingInk" xmlns:wne="http://schemas.microsoft.com/office/word/2006/wordml" xmlns:wps="http://schemas.microsoft.com/office/word/2010/wordprocessingShape" mc:Ignorable="w14 w15 wp14">
   <w:footnote w:type="separator" w:id="-1">
@@ -8035,6 +8039,16 @@
   <w:p>
     <w:pPr>
       <w:pStyle w:val="Header"/>
+    </w:pPr>
+  </w:p>
+</w:hdr>
+</file>
+
+<file path=word/header2.xml><?xml version="1.0" encoding="utf-8"?>
+<w:hdr xmlns:wpc="http://schemas.microsoft.com/office/word/2010/wordprocessingCanvas" xmlns:mc="http://schemas.openxmlformats.org/markup-compatibility/2006" xmlns:o="urn:schemas-microsoft-com:office:office" xmlns:r="http://schemas.openxmlformats.org/officeDocument/2006/relationships" xmlns:m="http://schemas.openxmlformats.org/officeDocument/2006/math" xmlns:v="urn:schemas-microsoft-com:vml" xmlns:wp14="http://schemas.microsoft.com/office/word/2010/wordprocessingDrawing" xmlns:wp="http://schemas.openxmlformats.org/drawingml/2006/wordprocessingDrawing" xmlns:w10="urn:schemas-microsoft-com:office:word" xmlns:w="http://schemas.openxmlformats.org/wordprocessingml/2006/main" xmlns:w14="http://schemas.microsoft.com/office/word/2010/wordml" xmlns:w15="http://schemas.microsoft.com/office/word/2012/wordml" xmlns:wpg="http://schemas.microsoft.com/office/word/2010/wordprocessingGroup" xmlns:wpi="http://schemas.microsoft.com/office/word/2010/wordprocessingInk" xmlns:wne="http://schemas.microsoft.com/office/word/2006/wordml" xmlns:wps="http://schemas.microsoft.com/office/word/2010/wordprocessingShape" mc:Ignorable="w14 w15 wp14">
+  <w:p>
+    <w:pPr>
+      <w:pStyle w:val="Header"/>
       <w:ind w:left="-851"/>
       <w:jc w:val="center"/>
       <w:rPr>
@@ -8051,10 +8065,10 @@
         <w:szCs w:val="28"/>
       </w:rPr>
       <w:object w:dxaOrig="1188" w:dyaOrig="900">
-        <v:rect id="_x0000_i1025" style="width:55.25pt;height:37.65pt" o:ole="" o:preferrelative="t" stroked="f">
+        <v:rect id="_x0000_i1025" style="width:54.8pt;height:37.6pt" o:ole="" o:preferrelative="t" stroked="f">
           <v:imagedata r:id="rId1" o:title=""/>
         </v:rect>
-        <o:OLEObject Type="Embed" ProgID="StaticMetafile" ShapeID="_x0000_i1025" DrawAspect="Content" ObjectID="_1853673739" r:id="rId2"/>
+        <o:OLEObject Type="Embed" ProgID="StaticMetafile" ShapeID="_x0000_i1025" DrawAspect="Content" ObjectID="_1853753960" r:id="rId2"/>
       </w:object>
     </w:r>
     <w:r>
@@ -8102,7 +8116,7 @@
         <w:sz w:val="28"/>
         <w:szCs w:val="28"/>
       </w:rPr>
-      <w:t>7</w:t>
+      <w:t>8</w:t>
     </w:r>
     <w:r>
       <w:rPr>
@@ -8122,7 +8136,7 @@
         <w:sz w:val="28"/>
         <w:szCs w:val="28"/>
       </w:rPr>
-      <w:t>.2026 (</w:t>
+      <w:t xml:space="preserve">.2026 </w:t>
     </w:r>
     <w:r>
       <w:rPr>
@@ -8132,8 +8146,20 @@
         <w:sz w:val="28"/>
         <w:szCs w:val="28"/>
       </w:rPr>
-      <w:t>SATUR</w:t>
+      <w:t>(</w:t>
     </w:r>
+    <w:r>
+      <w:rPr>
+        <w:rFonts w:cs="Times New Roman"/>
+        <w:b/>
+        <w:color w:val="000000" w:themeColor="text1"/>
+        <w:sz w:val="28"/>
+        <w:szCs w:val="28"/>
+      </w:rPr>
+      <w:t>SUN</w:t>
+    </w:r>
+    <w:bookmarkStart w:id="0" w:name="_GoBack"/>
+    <w:bookmarkEnd w:id="0"/>
     <w:r>
       <w:rPr>
         <w:rFonts w:cs="Times New Roman"/>
@@ -8155,6 +8181,16 @@
       <w:t>)</w:t>
     </w:r>
   </w:p>
+  <w:p>
+    <w:pPr>
+      <w:pStyle w:val="Header"/>
+    </w:pPr>
+  </w:p>
+</w:hdr>
+</file>
+
+<file path=word/header3.xml><?xml version="1.0" encoding="utf-8"?>
+<w:hdr xmlns:wpc="http://schemas.microsoft.com/office/word/2010/wordprocessingCanvas" xmlns:mc="http://schemas.openxmlformats.org/markup-compatibility/2006" xmlns:o="urn:schemas-microsoft-com:office:office" xmlns:r="http://schemas.openxmlformats.org/officeDocument/2006/relationships" xmlns:m="http://schemas.openxmlformats.org/officeDocument/2006/math" xmlns:v="urn:schemas-microsoft-com:vml" xmlns:wp14="http://schemas.microsoft.com/office/word/2010/wordprocessingDrawing" xmlns:wp="http://schemas.openxmlformats.org/drawingml/2006/wordprocessingDrawing" xmlns:w10="urn:schemas-microsoft-com:office:word" xmlns:w="http://schemas.openxmlformats.org/wordprocessingml/2006/main" xmlns:w14="http://schemas.microsoft.com/office/word/2010/wordml" xmlns:w15="http://schemas.microsoft.com/office/word/2012/wordml" xmlns:wpg="http://schemas.microsoft.com/office/word/2010/wordprocessingGroup" xmlns:wpi="http://schemas.microsoft.com/office/word/2010/wordprocessingInk" xmlns:wne="http://schemas.microsoft.com/office/word/2006/wordml" xmlns:wps="http://schemas.microsoft.com/office/word/2010/wordprocessingShape" mc:Ignorable="w14 w15 wp14">
   <w:p>
     <w:pPr>
       <w:pStyle w:val="Header"/>

</xml_diff>

<commit_message>
Sync - 2026-10-17 17:11
</commit_message>
<xml_diff>
--- a/files/Daily_Helicopter_Schedule.docx
+++ b/files/Daily_Helicopter_Schedule.docx
@@ -4800,8 +4800,10 @@
                 <w:sz w:val="28"/>
                 <w:szCs w:val="28"/>
               </w:rPr>
-              <w:t>DISC1</w:t>
-            </w:r>
+              <w:t>ABAN8</w:t>
+            </w:r>
+            <w:bookmarkStart w:id="0" w:name="_GoBack"/>
+            <w:bookmarkEnd w:id="0"/>
           </w:p>
         </w:tc>
         <w:tc>
@@ -7939,12 +7941,7 @@
       </w:pPr>
     </w:p>
     <w:sectPr>
-      <w:headerReference w:type="even" r:id="rId6"/>
-      <w:headerReference w:type="default" r:id="rId7"/>
-      <w:footerReference w:type="even" r:id="rId8"/>
-      <w:footerReference w:type="default" r:id="rId9"/>
-      <w:headerReference w:type="first" r:id="rId10"/>
-      <w:footerReference w:type="first" r:id="rId11"/>
+      <w:headerReference w:type="default" r:id="rId6"/>
       <w:pgSz w:w="11906" w:h="16838"/>
       <w:pgMar w:top="1" w:right="1440" w:bottom="1134" w:left="1134" w:header="708" w:footer="708" w:gutter="0"/>
       <w:cols w:space="708"/>
@@ -7979,36 +7976,6 @@
 </w:endnotes>
 </file>
 
-<file path=word/footer1.xml><?xml version="1.0" encoding="utf-8"?>
-<w:ftr xmlns:wpc="http://schemas.microsoft.com/office/word/2010/wordprocessingCanvas" xmlns:mc="http://schemas.openxmlformats.org/markup-compatibility/2006" xmlns:o="urn:schemas-microsoft-com:office:office" xmlns:r="http://schemas.openxmlformats.org/officeDocument/2006/relationships" xmlns:m="http://schemas.openxmlformats.org/officeDocument/2006/math" xmlns:v="urn:schemas-microsoft-com:vml" xmlns:wp14="http://schemas.microsoft.com/office/word/2010/wordprocessingDrawing" xmlns:wp="http://schemas.openxmlformats.org/drawingml/2006/wordprocessingDrawing" xmlns:w10="urn:schemas-microsoft-com:office:word" xmlns:w="http://schemas.openxmlformats.org/wordprocessingml/2006/main" xmlns:w14="http://schemas.microsoft.com/office/word/2010/wordml" xmlns:w15="http://schemas.microsoft.com/office/word/2012/wordml" xmlns:wpg="http://schemas.microsoft.com/office/word/2010/wordprocessingGroup" xmlns:wpi="http://schemas.microsoft.com/office/word/2010/wordprocessingInk" xmlns:wne="http://schemas.microsoft.com/office/word/2006/wordml" xmlns:wps="http://schemas.microsoft.com/office/word/2010/wordprocessingShape" mc:Ignorable="w14 w15 wp14">
-  <w:p>
-    <w:pPr>
-      <w:pStyle w:val="Footer"/>
-    </w:pPr>
-  </w:p>
-</w:ftr>
-</file>
-
-<file path=word/footer2.xml><?xml version="1.0" encoding="utf-8"?>
-<w:ftr xmlns:wpc="http://schemas.microsoft.com/office/word/2010/wordprocessingCanvas" xmlns:mc="http://schemas.openxmlformats.org/markup-compatibility/2006" xmlns:o="urn:schemas-microsoft-com:office:office" xmlns:r="http://schemas.openxmlformats.org/officeDocument/2006/relationships" xmlns:m="http://schemas.openxmlformats.org/officeDocument/2006/math" xmlns:v="urn:schemas-microsoft-com:vml" xmlns:wp14="http://schemas.microsoft.com/office/word/2010/wordprocessingDrawing" xmlns:wp="http://schemas.openxmlformats.org/drawingml/2006/wordprocessingDrawing" xmlns:w10="urn:schemas-microsoft-com:office:word" xmlns:w="http://schemas.openxmlformats.org/wordprocessingml/2006/main" xmlns:w14="http://schemas.microsoft.com/office/word/2010/wordml" xmlns:w15="http://schemas.microsoft.com/office/word/2012/wordml" xmlns:wpg="http://schemas.microsoft.com/office/word/2010/wordprocessingGroup" xmlns:wpi="http://schemas.microsoft.com/office/word/2010/wordprocessingInk" xmlns:wne="http://schemas.microsoft.com/office/word/2006/wordml" xmlns:wps="http://schemas.microsoft.com/office/word/2010/wordprocessingShape" mc:Ignorable="w14 w15 wp14">
-  <w:p>
-    <w:pPr>
-      <w:pStyle w:val="Footer"/>
-    </w:pPr>
-  </w:p>
-</w:ftr>
-</file>
-
-<file path=word/footer3.xml><?xml version="1.0" encoding="utf-8"?>
-<w:ftr xmlns:wpc="http://schemas.microsoft.com/office/word/2010/wordprocessingCanvas" xmlns:mc="http://schemas.openxmlformats.org/markup-compatibility/2006" xmlns:o="urn:schemas-microsoft-com:office:office" xmlns:r="http://schemas.openxmlformats.org/officeDocument/2006/relationships" xmlns:m="http://schemas.openxmlformats.org/officeDocument/2006/math" xmlns:v="urn:schemas-microsoft-com:vml" xmlns:wp14="http://schemas.microsoft.com/office/word/2010/wordprocessingDrawing" xmlns:wp="http://schemas.openxmlformats.org/drawingml/2006/wordprocessingDrawing" xmlns:w10="urn:schemas-microsoft-com:office:word" xmlns:w="http://schemas.openxmlformats.org/wordprocessingml/2006/main" xmlns:w14="http://schemas.microsoft.com/office/word/2010/wordml" xmlns:w15="http://schemas.microsoft.com/office/word/2012/wordml" xmlns:wpg="http://schemas.microsoft.com/office/word/2010/wordprocessingGroup" xmlns:wpi="http://schemas.microsoft.com/office/word/2010/wordprocessingInk" xmlns:wne="http://schemas.microsoft.com/office/word/2006/wordml" xmlns:wps="http://schemas.microsoft.com/office/word/2010/wordprocessingShape" mc:Ignorable="w14 w15 wp14">
-  <w:p>
-    <w:pPr>
-      <w:pStyle w:val="Footer"/>
-    </w:pPr>
-  </w:p>
-</w:ftr>
-</file>
-
 <file path=word/footnotes.xml><?xml version="1.0" encoding="utf-8"?>
 <w:footnotes xmlns:wpc="http://schemas.microsoft.com/office/word/2010/wordprocessingCanvas" xmlns:mc="http://schemas.openxmlformats.org/markup-compatibility/2006" xmlns:o="urn:schemas-microsoft-com:office:office" xmlns:r="http://schemas.openxmlformats.org/officeDocument/2006/relationships" xmlns:m="http://schemas.openxmlformats.org/officeDocument/2006/math" xmlns:v="urn:schemas-microsoft-com:vml" xmlns:wp14="http://schemas.microsoft.com/office/word/2010/wordprocessingDrawing" xmlns:wp="http://schemas.openxmlformats.org/drawingml/2006/wordprocessingDrawing" xmlns:w10="urn:schemas-microsoft-com:office:word" xmlns:w="http://schemas.openxmlformats.org/wordprocessingml/2006/main" xmlns:w14="http://schemas.microsoft.com/office/word/2010/wordml" xmlns:w15="http://schemas.microsoft.com/office/word/2012/wordml" xmlns:wpg="http://schemas.microsoft.com/office/word/2010/wordprocessingGroup" xmlns:wpi="http://schemas.microsoft.com/office/word/2010/wordprocessingInk" xmlns:wne="http://schemas.microsoft.com/office/word/2006/wordml" xmlns:wps="http://schemas.microsoft.com/office/word/2010/wordprocessingShape" mc:Ignorable="w14 w15 wp14">
   <w:footnote w:type="separator" w:id="-1">
@@ -8039,16 +8006,6 @@
   <w:p>
     <w:pPr>
       <w:pStyle w:val="Header"/>
-    </w:pPr>
-  </w:p>
-</w:hdr>
-</file>
-
-<file path=word/header2.xml><?xml version="1.0" encoding="utf-8"?>
-<w:hdr xmlns:wpc="http://schemas.microsoft.com/office/word/2010/wordprocessingCanvas" xmlns:mc="http://schemas.openxmlformats.org/markup-compatibility/2006" xmlns:o="urn:schemas-microsoft-com:office:office" xmlns:r="http://schemas.openxmlformats.org/officeDocument/2006/relationships" xmlns:m="http://schemas.openxmlformats.org/officeDocument/2006/math" xmlns:v="urn:schemas-microsoft-com:vml" xmlns:wp14="http://schemas.microsoft.com/office/word/2010/wordprocessingDrawing" xmlns:wp="http://schemas.openxmlformats.org/drawingml/2006/wordprocessingDrawing" xmlns:w10="urn:schemas-microsoft-com:office:word" xmlns:w="http://schemas.openxmlformats.org/wordprocessingml/2006/main" xmlns:w14="http://schemas.microsoft.com/office/word/2010/wordml" xmlns:w15="http://schemas.microsoft.com/office/word/2012/wordml" xmlns:wpg="http://schemas.microsoft.com/office/word/2010/wordprocessingGroup" xmlns:wpi="http://schemas.microsoft.com/office/word/2010/wordprocessingInk" xmlns:wne="http://schemas.microsoft.com/office/word/2006/wordml" xmlns:wps="http://schemas.microsoft.com/office/word/2010/wordprocessingShape" mc:Ignorable="w14 w15 wp14">
-  <w:p>
-    <w:pPr>
-      <w:pStyle w:val="Header"/>
       <w:ind w:left="-851"/>
       <w:jc w:val="center"/>
       <w:rPr>
@@ -8065,10 +8022,10 @@
         <w:szCs w:val="28"/>
       </w:rPr>
       <w:object w:dxaOrig="1188" w:dyaOrig="900">
-        <v:rect id="_x0000_i1025" style="width:54.8pt;height:37.6pt" o:ole="" o:preferrelative="t" stroked="f">
+        <v:rect id="_x0000_i1025" style="width:55pt;height:37.35pt" o:ole="" o:preferrelative="t" stroked="f">
           <v:imagedata r:id="rId1" o:title=""/>
         </v:rect>
-        <o:OLEObject Type="Embed" ProgID="StaticMetafile" ShapeID="_x0000_i1025" DrawAspect="Content" ObjectID="_1853753960" r:id="rId2"/>
+        <o:OLEObject Type="Embed" ProgID="StaticMetafile" ShapeID="_x0000_i1025" DrawAspect="Content" ObjectID="_1853759128" r:id="rId2"/>
       </w:object>
     </w:r>
     <w:r>
@@ -8136,17 +8093,7 @@
         <w:sz w:val="28"/>
         <w:szCs w:val="28"/>
       </w:rPr>
-      <w:t xml:space="preserve">.2026 </w:t>
-    </w:r>
-    <w:r>
-      <w:rPr>
-        <w:rFonts w:cs="Times New Roman"/>
-        <w:b/>
-        <w:color w:val="000000" w:themeColor="text1"/>
-        <w:sz w:val="28"/>
-        <w:szCs w:val="28"/>
-      </w:rPr>
-      <w:t>(</w:t>
+      <w:t>.2026 (</w:t>
     </w:r>
     <w:r>
       <w:rPr>
@@ -8158,8 +8105,6 @@
       </w:rPr>
       <w:t>SUN</w:t>
     </w:r>
-    <w:bookmarkStart w:id="0" w:name="_GoBack"/>
-    <w:bookmarkEnd w:id="0"/>
     <w:r>
       <w:rPr>
         <w:rFonts w:cs="Times New Roman"/>
@@ -8181,16 +8126,6 @@
       <w:t>)</w:t>
     </w:r>
   </w:p>
-  <w:p>
-    <w:pPr>
-      <w:pStyle w:val="Header"/>
-    </w:pPr>
-  </w:p>
-</w:hdr>
-</file>
-
-<file path=word/header3.xml><?xml version="1.0" encoding="utf-8"?>
-<w:hdr xmlns:wpc="http://schemas.microsoft.com/office/word/2010/wordprocessingCanvas" xmlns:mc="http://schemas.openxmlformats.org/markup-compatibility/2006" xmlns:o="urn:schemas-microsoft-com:office:office" xmlns:r="http://schemas.openxmlformats.org/officeDocument/2006/relationships" xmlns:m="http://schemas.openxmlformats.org/officeDocument/2006/math" xmlns:v="urn:schemas-microsoft-com:vml" xmlns:wp14="http://schemas.microsoft.com/office/word/2010/wordprocessingDrawing" xmlns:wp="http://schemas.openxmlformats.org/drawingml/2006/wordprocessingDrawing" xmlns:w10="urn:schemas-microsoft-com:office:word" xmlns:w="http://schemas.openxmlformats.org/wordprocessingml/2006/main" xmlns:w14="http://schemas.microsoft.com/office/word/2010/wordml" xmlns:w15="http://schemas.microsoft.com/office/word/2012/wordml" xmlns:wpg="http://schemas.microsoft.com/office/word/2010/wordprocessingGroup" xmlns:wpi="http://schemas.microsoft.com/office/word/2010/wordprocessingInk" xmlns:wne="http://schemas.microsoft.com/office/word/2006/wordml" xmlns:wps="http://schemas.microsoft.com/office/word/2010/wordprocessingShape" mc:Ignorable="w14 w15 wp14">
   <w:p>
     <w:pPr>
       <w:pStyle w:val="Header"/>

</xml_diff>

<commit_message>
Sync - 2026-10-18 16:43
</commit_message>
<xml_diff>
--- a/files/Daily_Helicopter_Schedule.docx
+++ b/files/Daily_Helicopter_Schedule.docx
@@ -1719,10 +1719,11 @@
             <w:r>
               <w:rPr>
                 <w:rFonts w:ascii="Calibri" w:eastAsia="Calibri" w:hAnsi="Calibri" w:cs="Calibri"/>
-                <w:sz w:val="28"/>
-                <w:szCs w:val="28"/>
-              </w:rPr>
-              <w:t>GVHL 169</w:t>
+                <w:b/>
+                <w:sz w:val="28"/>
+                <w:szCs w:val="28"/>
+              </w:rPr>
+              <w:t>NA</w:t>
             </w:r>
           </w:p>
         </w:tc>
@@ -1747,17 +1748,19 @@
               <w:jc w:val="center"/>
               <w:rPr>
                 <w:rFonts w:ascii="Calibri" w:eastAsia="Calibri" w:hAnsi="Calibri" w:cs="Calibri"/>
-                <w:sz w:val="28"/>
-                <w:szCs w:val="28"/>
-              </w:rPr>
-            </w:pPr>
-            <w:r>
-              <w:rPr>
-                <w:rFonts w:ascii="Calibri" w:eastAsia="Calibri" w:hAnsi="Calibri" w:cs="Calibri"/>
-                <w:sz w:val="28"/>
-                <w:szCs w:val="28"/>
-              </w:rPr>
-              <w:t>RRL</w:t>
+                <w:b/>
+                <w:sz w:val="28"/>
+                <w:szCs w:val="28"/>
+              </w:rPr>
+            </w:pPr>
+            <w:r>
+              <w:rPr>
+                <w:rFonts w:ascii="Calibri" w:eastAsia="Calibri" w:hAnsi="Calibri" w:cs="Calibri"/>
+                <w:b/>
+                <w:sz w:val="28"/>
+                <w:szCs w:val="28"/>
+              </w:rPr>
+              <w:t>NA</w:t>
             </w:r>
           </w:p>
         </w:tc>
@@ -3113,7 +3116,7 @@
                 <w:sz w:val="28"/>
                 <w:szCs w:val="28"/>
               </w:rPr>
-              <w:t>NA</w:t>
+              <w:t>BPA</w:t>
             </w:r>
           </w:p>
         </w:tc>
@@ -3344,7 +3347,7 @@
                 <w:sz w:val="28"/>
                 <w:szCs w:val="28"/>
               </w:rPr>
-              <w:t>NA</w:t>
+              <w:t>BPA</w:t>
             </w:r>
           </w:p>
         </w:tc>
@@ -4094,15 +4097,6 @@
               </w:rPr>
               <w:t>FD9</w:t>
             </w:r>
-            <w:r>
-              <w:rPr>
-                <w:rFonts w:ascii="Calibri" w:eastAsia="Calibri" w:hAnsi="Calibri" w:cs="Calibri"/>
-                <w:b/>
-                <w:sz w:val="28"/>
-                <w:szCs w:val="28"/>
-              </w:rPr>
-              <w:t xml:space="preserve"> </w:t>
-            </w:r>
           </w:p>
         </w:tc>
         <w:tc>
@@ -4557,16 +4551,7 @@
                 <w:sz w:val="28"/>
                 <w:szCs w:val="28"/>
               </w:rPr>
-              <w:t>DVDR</w:t>
-            </w:r>
-            <w:r>
-              <w:rPr>
-                <w:rFonts w:ascii="Calibri" w:eastAsia="Calibri" w:hAnsi="Calibri" w:cs="Calibri"/>
-                <w:b/>
-                <w:sz w:val="28"/>
-                <w:szCs w:val="28"/>
-              </w:rPr>
-              <w:t xml:space="preserve"> </w:t>
+              <w:t>AS2</w:t>
             </w:r>
           </w:p>
         </w:tc>
@@ -4792,18 +4777,8 @@
                 <w:sz w:val="28"/>
                 <w:szCs w:val="28"/>
               </w:rPr>
-              <w:t xml:space="preserve"> </w:t>
-            </w:r>
-            <w:r>
-              <w:rPr>
-                <w:rFonts w:ascii="Calibri" w:eastAsia="Calibri" w:hAnsi="Calibri" w:cs="Calibri"/>
-                <w:sz w:val="28"/>
-                <w:szCs w:val="28"/>
-              </w:rPr>
-              <w:t>ABAN8</w:t>
-            </w:r>
-            <w:bookmarkStart w:id="0" w:name="_GoBack"/>
-            <w:bookmarkEnd w:id="0"/>
+              <w:t>ABN8</w:t>
+            </w:r>
           </w:p>
         </w:tc>
         <w:tc>
@@ -5085,7 +5060,7 @@
                 <w:sz w:val="28"/>
                 <w:szCs w:val="28"/>
               </w:rPr>
-              <w:t>ARMADA1</w:t>
+              <w:t>SGAV</w:t>
             </w:r>
           </w:p>
         </w:tc>
@@ -5312,7 +5287,7 @@
                 <w:sz w:val="28"/>
                 <w:szCs w:val="28"/>
               </w:rPr>
-              <w:t>SCHLR</w:t>
+              <w:t>SLQ</w:t>
             </w:r>
           </w:p>
         </w:tc>
@@ -5539,7 +5514,7 @@
                 <w:sz w:val="28"/>
                 <w:szCs w:val="28"/>
               </w:rPr>
-              <w:t>RATNA</w:t>
+              <w:t>SSAK</w:t>
             </w:r>
           </w:p>
         </w:tc>
@@ -5766,7 +5741,7 @@
                 <w:sz w:val="28"/>
                 <w:szCs w:val="28"/>
               </w:rPr>
-              <w:t>TRI-2</w:t>
+              <w:t>NQO</w:t>
             </w:r>
           </w:p>
         </w:tc>
@@ -6000,7 +5975,7 @@
                 <w:sz w:val="28"/>
                 <w:szCs w:val="28"/>
               </w:rPr>
-              <w:t>ABAN4</w:t>
+              <w:t>DVDR</w:t>
             </w:r>
           </w:p>
         </w:tc>
@@ -6226,7 +6201,7 @@
                 <w:sz w:val="28"/>
                 <w:szCs w:val="28"/>
               </w:rPr>
-              <w:t>J SUP</w:t>
+              <w:t>WIN+MNW</w:t>
             </w:r>
           </w:p>
         </w:tc>
@@ -7085,7 +7060,7 @@
                 <w:sz w:val="28"/>
                 <w:szCs w:val="28"/>
               </w:rPr>
-              <w:t>TAPTI[D]</w:t>
+              <w:t>SUDA</w:t>
             </w:r>
           </w:p>
         </w:tc>
@@ -7309,6 +7284,16 @@
                 <w:szCs w:val="28"/>
               </w:rPr>
             </w:pPr>
+            <w:r>
+              <w:rPr>
+                <w:rFonts w:ascii="Calibri" w:eastAsia="Calibri" w:hAnsi="Calibri" w:cs="Calibri"/>
+                <w:sz w:val="28"/>
+                <w:szCs w:val="28"/>
+              </w:rPr>
+              <w:t>TCPP</w:t>
+            </w:r>
+            <w:bookmarkStart w:id="0" w:name="_GoBack"/>
+            <w:bookmarkEnd w:id="0"/>
           </w:p>
         </w:tc>
         <w:tc>
@@ -8022,10 +8007,10 @@
         <w:szCs w:val="28"/>
       </w:rPr>
       <w:object w:dxaOrig="1188" w:dyaOrig="900">
-        <v:rect id="_x0000_i1025" style="width:55pt;height:37.35pt" o:ole="" o:preferrelative="t" stroked="f">
+        <v:rect id="_x0000_i1025" style="width:55pt;height:37pt" o:ole="" o:preferrelative="t" stroked="f">
           <v:imagedata r:id="rId1" o:title=""/>
         </v:rect>
-        <o:OLEObject Type="Embed" ProgID="StaticMetafile" ShapeID="_x0000_i1025" DrawAspect="Content" ObjectID="_1853759128" r:id="rId2"/>
+        <o:OLEObject Type="Embed" ProgID="StaticMetafile" ShapeID="_x0000_i1025" DrawAspect="Content" ObjectID="_1853844749" r:id="rId2"/>
       </w:object>
     </w:r>
     <w:r>
@@ -8073,7 +8058,7 @@
         <w:sz w:val="28"/>
         <w:szCs w:val="28"/>
       </w:rPr>
-      <w:t>8</w:t>
+      <w:t>9</w:t>
     </w:r>
     <w:r>
       <w:rPr>
@@ -8103,7 +8088,17 @@
         <w:sz w:val="28"/>
         <w:szCs w:val="28"/>
       </w:rPr>
-      <w:t>SUN</w:t>
+      <w:t>MO</w:t>
+    </w:r>
+    <w:r>
+      <w:rPr>
+        <w:rFonts w:cs="Times New Roman"/>
+        <w:b/>
+        <w:color w:val="000000" w:themeColor="text1"/>
+        <w:sz w:val="28"/>
+        <w:szCs w:val="28"/>
+      </w:rPr>
+      <w:t>N</w:t>
     </w:r>
     <w:r>
       <w:rPr>

</xml_diff>

<commit_message>
Sync - 2026-10-19 16:45
</commit_message>
<xml_diff>
--- a/files/Daily_Helicopter_Schedule.docx
+++ b/files/Daily_Helicopter_Schedule.docx
@@ -1143,7 +1143,7 @@
                 <w:sz w:val="28"/>
                 <w:szCs w:val="28"/>
               </w:rPr>
-              <w:t>GVHL 169</w:t>
+              <w:t>HELIGO 412</w:t>
             </w:r>
           </w:p>
         </w:tc>
@@ -1178,15 +1178,7 @@
                 <w:sz w:val="28"/>
                 <w:szCs w:val="28"/>
               </w:rPr>
-              <w:t>RRN</w:t>
-            </w:r>
-            <w:r>
-              <w:rPr>
-                <w:rFonts w:ascii="Calibri" w:eastAsia="Calibri" w:hAnsi="Calibri" w:cs="Calibri"/>
-                <w:sz w:val="28"/>
-                <w:szCs w:val="28"/>
-              </w:rPr>
-              <w:t xml:space="preserve"> </w:t>
+              <w:t>HLV</w:t>
             </w:r>
           </w:p>
         </w:tc>
@@ -1221,7 +1213,7 @@
                 <w:sz w:val="28"/>
                 <w:szCs w:val="28"/>
               </w:rPr>
-              <w:t>06</w:t>
+              <w:t>08</w:t>
             </w:r>
           </w:p>
         </w:tc>
@@ -1643,7 +1635,7 @@
                 <w:sz w:val="28"/>
                 <w:szCs w:val="28"/>
               </w:rPr>
-              <w:t>0:3</w:t>
+              <w:t>1:0</w:t>
             </w:r>
             <w:r>
               <w:rPr>
@@ -1711,19 +1703,17 @@
               <w:jc w:val="center"/>
               <w:rPr>
                 <w:rFonts w:ascii="Calibri" w:eastAsia="Calibri" w:hAnsi="Calibri" w:cs="Calibri"/>
-                <w:b/>
-                <w:sz w:val="28"/>
-                <w:szCs w:val="28"/>
-              </w:rPr>
-            </w:pPr>
-            <w:r>
-              <w:rPr>
-                <w:rFonts w:ascii="Calibri" w:eastAsia="Calibri" w:hAnsi="Calibri" w:cs="Calibri"/>
-                <w:b/>
-                <w:sz w:val="28"/>
-                <w:szCs w:val="28"/>
-              </w:rPr>
-              <w:t>NA</w:t>
+                <w:sz w:val="28"/>
+                <w:szCs w:val="28"/>
+              </w:rPr>
+            </w:pPr>
+            <w:r>
+              <w:rPr>
+                <w:rFonts w:ascii="Calibri" w:eastAsia="Calibri" w:hAnsi="Calibri" w:cs="Calibri"/>
+                <w:sz w:val="28"/>
+                <w:szCs w:val="28"/>
+              </w:rPr>
+              <w:t>GVHL 169</w:t>
             </w:r>
           </w:p>
         </w:tc>
@@ -1748,19 +1738,17 @@
               <w:jc w:val="center"/>
               <w:rPr>
                 <w:rFonts w:ascii="Calibri" w:eastAsia="Calibri" w:hAnsi="Calibri" w:cs="Calibri"/>
-                <w:b/>
-                <w:sz w:val="28"/>
-                <w:szCs w:val="28"/>
-              </w:rPr>
-            </w:pPr>
-            <w:r>
-              <w:rPr>
-                <w:rFonts w:ascii="Calibri" w:eastAsia="Calibri" w:hAnsi="Calibri" w:cs="Calibri"/>
-                <w:b/>
-                <w:sz w:val="28"/>
-                <w:szCs w:val="28"/>
-              </w:rPr>
-              <w:t>NA</w:t>
+                <w:sz w:val="28"/>
+                <w:szCs w:val="28"/>
+              </w:rPr>
+            </w:pPr>
+            <w:r>
+              <w:rPr>
+                <w:rFonts w:ascii="Calibri" w:eastAsia="Calibri" w:hAnsi="Calibri" w:cs="Calibri"/>
+                <w:sz w:val="28"/>
+                <w:szCs w:val="28"/>
+              </w:rPr>
+              <w:t>RRO</w:t>
             </w:r>
           </w:p>
         </w:tc>
@@ -2315,7 +2303,7 @@
                 <w:sz w:val="28"/>
                 <w:szCs w:val="28"/>
               </w:rPr>
-              <w:t>RRO</w:t>
+              <w:t>RRN</w:t>
             </w:r>
           </w:p>
         </w:tc>
@@ -3042,7 +3030,7 @@
                 <w:sz w:val="28"/>
                 <w:szCs w:val="28"/>
               </w:rPr>
-              <w:t>07:00</w:t>
+              <w:t>06:50</w:t>
             </w:r>
           </w:p>
         </w:tc>
@@ -3081,7 +3069,7 @@
                 <w:sz w:val="28"/>
                 <w:szCs w:val="28"/>
               </w:rPr>
-              <w:t>09:00</w:t>
+              <w:t>08:55</w:t>
             </w:r>
           </w:p>
         </w:tc>
@@ -3116,7 +3104,7 @@
                 <w:sz w:val="28"/>
                 <w:szCs w:val="28"/>
               </w:rPr>
-              <w:t>BPA</w:t>
+              <w:t>R10A+R12B</w:t>
             </w:r>
           </w:p>
         </w:tc>
@@ -3173,6 +3161,14 @@
                 <w:szCs w:val="28"/>
               </w:rPr>
             </w:pPr>
+            <w:r>
+              <w:rPr>
+                <w:rFonts w:ascii="Calibri" w:eastAsia="Calibri" w:hAnsi="Calibri" w:cs="Calibri"/>
+                <w:sz w:val="28"/>
+                <w:szCs w:val="28"/>
+              </w:rPr>
+              <w:t>RRN</w:t>
+            </w:r>
           </w:p>
         </w:tc>
         <w:tc>
@@ -3273,7 +3269,7 @@
                 <w:sz w:val="28"/>
                 <w:szCs w:val="28"/>
               </w:rPr>
-              <w:t>08:20</w:t>
+              <w:t>07:00</w:t>
             </w:r>
           </w:p>
         </w:tc>
@@ -3312,6 +3308,237 @@
                 <w:sz w:val="28"/>
                 <w:szCs w:val="28"/>
               </w:rPr>
+              <w:t>09:00</w:t>
+            </w:r>
+          </w:p>
+        </w:tc>
+        <w:tc>
+          <w:tcPr>
+            <w:tcW w:w="2529" w:type="dxa"/>
+            <w:tcBorders>
+              <w:top w:val="single" w:sz="4" w:space="0" w:color="000000"/>
+              <w:left w:val="single" w:sz="4" w:space="0" w:color="000000"/>
+              <w:bottom w:val="single" w:sz="4" w:space="0" w:color="000000"/>
+              <w:right w:val="single" w:sz="4" w:space="0" w:color="000000"/>
+            </w:tcBorders>
+            <w:shd w:val="clear" w:color="000000" w:fill="FFFFFF"/>
+            <w:tcMar>
+              <w:left w:w="108" w:type="dxa"/>
+              <w:right w:w="108" w:type="dxa"/>
+            </w:tcMar>
+          </w:tcPr>
+          <w:p>
+            <w:pPr>
+              <w:spacing w:after="0" w:line="240" w:lineRule="auto"/>
+              <w:jc w:val="center"/>
+              <w:rPr>
+                <w:rFonts w:ascii="Calibri" w:eastAsia="Calibri" w:hAnsi="Calibri" w:cs="Calibri"/>
+                <w:sz w:val="28"/>
+                <w:szCs w:val="28"/>
+              </w:rPr>
+            </w:pPr>
+            <w:r>
+              <w:rPr>
+                <w:rFonts w:ascii="Calibri" w:eastAsia="Calibri" w:hAnsi="Calibri" w:cs="Calibri"/>
+                <w:sz w:val="28"/>
+                <w:szCs w:val="28"/>
+              </w:rPr>
+              <w:t>BPA</w:t>
+            </w:r>
+          </w:p>
+        </w:tc>
+        <w:tc>
+          <w:tcPr>
+            <w:tcW w:w="1574" w:type="dxa"/>
+            <w:tcBorders>
+              <w:top w:val="single" w:sz="4" w:space="0" w:color="000000"/>
+              <w:left w:val="single" w:sz="4" w:space="0" w:color="000000"/>
+              <w:bottom w:val="single" w:sz="4" w:space="0" w:color="000000"/>
+              <w:right w:val="single" w:sz="4" w:space="0" w:color="000000"/>
+            </w:tcBorders>
+            <w:shd w:val="clear" w:color="000000" w:fill="FFFFFF"/>
+            <w:tcMar>
+              <w:left w:w="108" w:type="dxa"/>
+              <w:right w:w="108" w:type="dxa"/>
+            </w:tcMar>
+          </w:tcPr>
+          <w:p>
+            <w:pPr>
+              <w:spacing w:after="0" w:line="240" w:lineRule="auto"/>
+              <w:jc w:val="center"/>
+              <w:rPr>
+                <w:rFonts w:ascii="Calibri" w:eastAsia="Calibri" w:hAnsi="Calibri" w:cs="Calibri"/>
+                <w:b/>
+                <w:sz w:val="28"/>
+                <w:szCs w:val="28"/>
+              </w:rPr>
+            </w:pPr>
+          </w:p>
+        </w:tc>
+        <w:tc>
+          <w:tcPr>
+            <w:tcW w:w="1360" w:type="dxa"/>
+            <w:tcBorders>
+              <w:top w:val="single" w:sz="4" w:space="0" w:color="000000"/>
+              <w:left w:val="single" w:sz="4" w:space="0" w:color="000000"/>
+              <w:bottom w:val="single" w:sz="4" w:space="0" w:color="000000"/>
+              <w:right w:val="single" w:sz="4" w:space="0" w:color="000000"/>
+            </w:tcBorders>
+            <w:shd w:val="clear" w:color="000000" w:fill="FFFFFF"/>
+            <w:tcMar>
+              <w:left w:w="108" w:type="dxa"/>
+              <w:right w:w="108" w:type="dxa"/>
+            </w:tcMar>
+          </w:tcPr>
+          <w:p>
+            <w:pPr>
+              <w:spacing w:after="0" w:line="240" w:lineRule="auto"/>
+              <w:jc w:val="center"/>
+              <w:rPr>
+                <w:rFonts w:ascii="Calibri" w:eastAsia="Calibri" w:hAnsi="Calibri" w:cs="Calibri"/>
+                <w:sz w:val="28"/>
+                <w:szCs w:val="28"/>
+              </w:rPr>
+            </w:pPr>
+            <w:r>
+              <w:rPr>
+                <w:rFonts w:ascii="Calibri" w:eastAsia="Calibri" w:hAnsi="Calibri" w:cs="Calibri"/>
+                <w:sz w:val="28"/>
+                <w:szCs w:val="28"/>
+              </w:rPr>
+              <w:t>RRL</w:t>
+            </w:r>
+          </w:p>
+        </w:tc>
+        <w:tc>
+          <w:tcPr>
+            <w:tcW w:w="1335" w:type="dxa"/>
+            <w:tcBorders>
+              <w:top w:val="single" w:sz="4" w:space="0" w:color="000000"/>
+              <w:left w:val="single" w:sz="4" w:space="0" w:color="000000"/>
+              <w:bottom w:val="single" w:sz="4" w:space="0" w:color="000000"/>
+              <w:right w:val="single" w:sz="4" w:space="0" w:color="000000"/>
+            </w:tcBorders>
+            <w:shd w:val="clear" w:color="000000" w:fill="FFFFFF"/>
+            <w:tcMar>
+              <w:left w:w="108" w:type="dxa"/>
+              <w:right w:w="108" w:type="dxa"/>
+            </w:tcMar>
+          </w:tcPr>
+          <w:p>
+            <w:pPr>
+              <w:spacing w:after="0" w:line="240" w:lineRule="auto"/>
+              <w:jc w:val="center"/>
+              <w:rPr>
+                <w:rFonts w:ascii="Calibri" w:eastAsia="Calibri" w:hAnsi="Calibri" w:cs="Calibri"/>
+                <w:sz w:val="28"/>
+                <w:szCs w:val="28"/>
+              </w:rPr>
+            </w:pPr>
+          </w:p>
+        </w:tc>
+      </w:tr>
+      <w:tr>
+        <w:trPr>
+          <w:trHeight w:val="308"/>
+        </w:trPr>
+        <w:tc>
+          <w:tcPr>
+            <w:tcW w:w="735" w:type="dxa"/>
+            <w:tcBorders>
+              <w:top w:val="single" w:sz="4" w:space="0" w:color="000000"/>
+              <w:left w:val="single" w:sz="4" w:space="0" w:color="000000"/>
+              <w:bottom w:val="single" w:sz="4" w:space="0" w:color="000000"/>
+              <w:right w:val="single" w:sz="4" w:space="0" w:color="000000"/>
+            </w:tcBorders>
+            <w:shd w:val="clear" w:color="000000" w:fill="FFFFFF"/>
+            <w:tcMar>
+              <w:left w:w="108" w:type="dxa"/>
+              <w:right w:w="108" w:type="dxa"/>
+            </w:tcMar>
+          </w:tcPr>
+          <w:p>
+            <w:pPr>
+              <w:spacing w:after="0" w:line="240" w:lineRule="auto"/>
+              <w:jc w:val="center"/>
+              <w:rPr>
+                <w:rFonts w:ascii="Calibri" w:eastAsia="Calibri" w:hAnsi="Calibri" w:cs="Calibri"/>
+                <w:sz w:val="28"/>
+                <w:szCs w:val="28"/>
+              </w:rPr>
+            </w:pPr>
+          </w:p>
+        </w:tc>
+        <w:tc>
+          <w:tcPr>
+            <w:tcW w:w="1628" w:type="dxa"/>
+            <w:tcBorders>
+              <w:top w:val="single" w:sz="4" w:space="0" w:color="000000"/>
+              <w:left w:val="single" w:sz="4" w:space="0" w:color="000000"/>
+              <w:bottom w:val="single" w:sz="4" w:space="0" w:color="000000"/>
+              <w:right w:val="single" w:sz="4" w:space="0" w:color="000000"/>
+            </w:tcBorders>
+            <w:shd w:val="clear" w:color="000000" w:fill="FFFFFF"/>
+            <w:tcMar>
+              <w:left w:w="108" w:type="dxa"/>
+              <w:right w:w="108" w:type="dxa"/>
+            </w:tcMar>
+          </w:tcPr>
+          <w:p>
+            <w:pPr>
+              <w:spacing w:after="0" w:line="240" w:lineRule="auto"/>
+              <w:jc w:val="center"/>
+              <w:rPr>
+                <w:rFonts w:ascii="Calibri" w:eastAsia="Calibri" w:hAnsi="Calibri" w:cs="Calibri"/>
+                <w:sz w:val="28"/>
+                <w:szCs w:val="28"/>
+              </w:rPr>
+            </w:pPr>
+            <w:r>
+              <w:rPr>
+                <w:rFonts w:ascii="Calibri" w:eastAsia="Calibri" w:hAnsi="Calibri" w:cs="Calibri"/>
+                <w:sz w:val="28"/>
+                <w:szCs w:val="28"/>
+              </w:rPr>
+              <w:t>08:20</w:t>
+            </w:r>
+          </w:p>
+        </w:tc>
+        <w:tc>
+          <w:tcPr>
+            <w:tcW w:w="1480" w:type="dxa"/>
+            <w:tcBorders>
+              <w:top w:val="single" w:sz="4" w:space="0" w:color="000000"/>
+              <w:left w:val="single" w:sz="4" w:space="0" w:color="000000"/>
+              <w:bottom w:val="single" w:sz="4" w:space="0" w:color="000000"/>
+              <w:right w:val="single" w:sz="4" w:space="0" w:color="000000"/>
+            </w:tcBorders>
+            <w:shd w:val="clear" w:color="000000" w:fill="FFFFFF"/>
+            <w:tcMar>
+              <w:left w:w="108" w:type="dxa"/>
+              <w:right w:w="108" w:type="dxa"/>
+            </w:tcMar>
+          </w:tcPr>
+          <w:p>
+            <w:pPr>
+              <w:tabs>
+                <w:tab w:val="left" w:pos="368"/>
+                <w:tab w:val="center" w:pos="767"/>
+              </w:tabs>
+              <w:spacing w:after="0" w:line="240" w:lineRule="auto"/>
+              <w:jc w:val="center"/>
+              <w:rPr>
+                <w:rFonts w:ascii="Calibri" w:eastAsia="Calibri" w:hAnsi="Calibri" w:cs="Calibri"/>
+                <w:sz w:val="28"/>
+                <w:szCs w:val="28"/>
+              </w:rPr>
+            </w:pPr>
+            <w:r>
+              <w:rPr>
+                <w:rFonts w:ascii="Calibri" w:eastAsia="Calibri" w:hAnsi="Calibri" w:cs="Calibri"/>
+                <w:sz w:val="28"/>
+                <w:szCs w:val="28"/>
+              </w:rPr>
               <w:t>11:00</w:t>
             </w:r>
           </w:p>
@@ -3404,6 +3631,14 @@
                 <w:szCs w:val="28"/>
               </w:rPr>
             </w:pPr>
+            <w:r>
+              <w:rPr>
+                <w:rFonts w:ascii="Calibri" w:eastAsia="Calibri" w:hAnsi="Calibri" w:cs="Calibri"/>
+                <w:sz w:val="28"/>
+                <w:szCs w:val="28"/>
+              </w:rPr>
+              <w:t>RRL</w:t>
+            </w:r>
           </w:p>
         </w:tc>
         <w:tc>
@@ -4095,7 +4330,7 @@
                 <w:sz w:val="28"/>
                 <w:szCs w:val="28"/>
               </w:rPr>
-              <w:t>FD9</w:t>
+              <w:t>NA</w:t>
             </w:r>
           </w:p>
         </w:tc>
@@ -4551,7 +4786,7 @@
                 <w:sz w:val="28"/>
                 <w:szCs w:val="28"/>
               </w:rPr>
-              <w:t>AS2</w:t>
+              <w:t>NA</w:t>
             </w:r>
           </w:p>
         </w:tc>
@@ -4777,7 +5012,7 @@
                 <w:sz w:val="28"/>
                 <w:szCs w:val="28"/>
               </w:rPr>
-              <w:t>ABN8</w:t>
+              <w:t>NA</w:t>
             </w:r>
           </w:p>
         </w:tc>
@@ -5060,7 +5295,7 @@
                 <w:sz w:val="28"/>
                 <w:szCs w:val="28"/>
               </w:rPr>
-              <w:t>SGAV</w:t>
+              <w:t>SHP</w:t>
             </w:r>
           </w:p>
         </w:tc>
@@ -5287,7 +5522,7 @@
                 <w:sz w:val="28"/>
                 <w:szCs w:val="28"/>
               </w:rPr>
-              <w:t>SLQ</w:t>
+              <w:t>HERA/NLM</w:t>
             </w:r>
           </w:p>
         </w:tc>
@@ -5514,7 +5749,7 @@
                 <w:sz w:val="28"/>
                 <w:szCs w:val="28"/>
               </w:rPr>
-              <w:t>SSAK</w:t>
+              <w:t>SLQ</w:t>
             </w:r>
           </w:p>
         </w:tc>
@@ -5741,7 +5976,7 @@
                 <w:sz w:val="28"/>
                 <w:szCs w:val="28"/>
               </w:rPr>
-              <w:t>NQO</w:t>
+              <w:t>SJOT</w:t>
             </w:r>
           </w:p>
         </w:tc>
@@ -5975,7 +6210,7 @@
                 <w:sz w:val="28"/>
                 <w:szCs w:val="28"/>
               </w:rPr>
-              <w:t>DVDR</w:t>
+              <w:t>ICP</w:t>
             </w:r>
           </w:p>
         </w:tc>
@@ -6201,7 +6436,7 @@
                 <w:sz w:val="28"/>
                 <w:szCs w:val="28"/>
               </w:rPr>
-              <w:t>WIN+MNW</w:t>
+              <w:t>NQO</w:t>
             </w:r>
           </w:p>
         </w:tc>
@@ -6440,6 +6675,7 @@
           <w:sz w:val="28"/>
           <w:szCs w:val="28"/>
         </w:rPr>
+        <w:lastRenderedPageBreak/>
         <w:t>Also please check Crew boat schedule for Contract crew.</w:t>
       </w:r>
     </w:p>
@@ -6468,7 +6704,6 @@
           <w:sz w:val="28"/>
           <w:szCs w:val="28"/>
         </w:rPr>
-        <w:lastRenderedPageBreak/>
         <w:tab/>
       </w:r>
     </w:p>
@@ -7290,7 +7525,7 @@
                 <w:sz w:val="28"/>
                 <w:szCs w:val="28"/>
               </w:rPr>
-              <w:t>TCPP</w:t>
+              <w:t>JIND</w:t>
             </w:r>
             <w:bookmarkStart w:id="0" w:name="_GoBack"/>
             <w:bookmarkEnd w:id="0"/>
@@ -8007,10 +8242,10 @@
         <w:szCs w:val="28"/>
       </w:rPr>
       <w:object w:dxaOrig="1188" w:dyaOrig="900">
-        <v:rect id="_x0000_i1025" style="width:55pt;height:37pt" o:ole="" o:preferrelative="t" stroked="f">
+        <v:rect id="_x0000_i1025" style="width:54.75pt;height:37.5pt" o:ole="" o:preferrelative="t" stroked="f">
           <v:imagedata r:id="rId1" o:title=""/>
         </v:rect>
-        <o:OLEObject Type="Embed" ProgID="StaticMetafile" ShapeID="_x0000_i1025" DrawAspect="Content" ObjectID="_1853844749" r:id="rId2"/>
+        <o:OLEObject Type="Embed" ProgID="StaticMetafile" ShapeID="_x0000_i1025" DrawAspect="Content" ObjectID="_1853933325" r:id="rId2"/>
       </w:object>
     </w:r>
     <w:r>
@@ -8048,17 +8283,7 @@
         <w:sz w:val="28"/>
         <w:szCs w:val="28"/>
       </w:rPr>
-      <w:t>1</w:t>
-    </w:r>
-    <w:r>
-      <w:rPr>
-        <w:rFonts w:cs="Times New Roman"/>
-        <w:b/>
-        <w:color w:val="000000" w:themeColor="text1"/>
-        <w:sz w:val="28"/>
-        <w:szCs w:val="28"/>
-      </w:rPr>
-      <w:t>9</w:t>
+      <w:t>20</w:t>
     </w:r>
     <w:r>
       <w:rPr>
@@ -8088,17 +8313,7 @@
         <w:sz w:val="28"/>
         <w:szCs w:val="28"/>
       </w:rPr>
-      <w:t>MO</w:t>
-    </w:r>
-    <w:r>
-      <w:rPr>
-        <w:rFonts w:cs="Times New Roman"/>
-        <w:b/>
-        <w:color w:val="000000" w:themeColor="text1"/>
-        <w:sz w:val="28"/>
-        <w:szCs w:val="28"/>
-      </w:rPr>
-      <w:t>N</w:t>
+      <w:t>TUES</w:t>
     </w:r>
     <w:r>
       <w:rPr>

</xml_diff>

<commit_message>
Sync - 2026-10-20 15:47
</commit_message>
<xml_diff>
--- a/files/Daily_Helicopter_Schedule.docx
+++ b/files/Daily_Helicopter_Schedule.docx
@@ -1143,7 +1143,7 @@
                 <w:sz w:val="28"/>
                 <w:szCs w:val="28"/>
               </w:rPr>
-              <w:t>HELIGO 412</w:t>
+              <w:t>GVHL 169</w:t>
             </w:r>
           </w:p>
         </w:tc>
@@ -1178,7 +1178,7 @@
                 <w:sz w:val="28"/>
                 <w:szCs w:val="28"/>
               </w:rPr>
-              <w:t>HLV</w:t>
+              <w:t>RRO</w:t>
             </w:r>
           </w:p>
         </w:tc>
@@ -1213,7 +1213,7 @@
                 <w:sz w:val="28"/>
                 <w:szCs w:val="28"/>
               </w:rPr>
-              <w:t>08</w:t>
+              <w:t>05</w:t>
             </w:r>
           </w:p>
         </w:tc>
@@ -1713,7 +1713,7 @@
                 <w:sz w:val="28"/>
                 <w:szCs w:val="28"/>
               </w:rPr>
-              <w:t>GVHL 169</w:t>
+              <w:t>NA</w:t>
             </w:r>
           </w:p>
         </w:tc>
@@ -1748,7 +1748,7 @@
                 <w:sz w:val="28"/>
                 <w:szCs w:val="28"/>
               </w:rPr>
-              <w:t>RRO</w:t>
+              <w:t>NA</w:t>
             </w:r>
           </w:p>
         </w:tc>
@@ -1783,7 +1783,7 @@
                 <w:sz w:val="28"/>
                 <w:szCs w:val="28"/>
               </w:rPr>
-              <w:t>06</w:t>
+              <w:t>00</w:t>
             </w:r>
           </w:p>
         </w:tc>
@@ -2303,7 +2303,7 @@
                 <w:sz w:val="28"/>
                 <w:szCs w:val="28"/>
               </w:rPr>
-              <w:t>RRN</w:t>
+              <w:t>RRL</w:t>
             </w:r>
           </w:p>
         </w:tc>
@@ -3104,7 +3104,7 @@
                 <w:sz w:val="28"/>
                 <w:szCs w:val="28"/>
               </w:rPr>
-              <w:t>R10A+R12B</w:t>
+              <w:t>NA</w:t>
             </w:r>
           </w:p>
         </w:tc>
@@ -3161,14 +3161,6 @@
                 <w:szCs w:val="28"/>
               </w:rPr>
             </w:pPr>
-            <w:r>
-              <w:rPr>
-                <w:rFonts w:ascii="Calibri" w:eastAsia="Calibri" w:hAnsi="Calibri" w:cs="Calibri"/>
-                <w:sz w:val="28"/>
-                <w:szCs w:val="28"/>
-              </w:rPr>
-              <w:t>RRN</w:t>
-            </w:r>
           </w:p>
         </w:tc>
         <w:tc>
@@ -3343,7 +3335,7 @@
                 <w:sz w:val="28"/>
                 <w:szCs w:val="28"/>
               </w:rPr>
-              <w:t>BPA</w:t>
+              <w:t>BLQ1</w:t>
             </w:r>
           </w:p>
         </w:tc>
@@ -3406,7 +3398,7 @@
                 <w:sz w:val="28"/>
                 <w:szCs w:val="28"/>
               </w:rPr>
-              <w:t>RRL</w:t>
+              <w:t>RRN</w:t>
             </w:r>
           </w:p>
         </w:tc>
@@ -3574,7 +3566,7 @@
                 <w:sz w:val="28"/>
                 <w:szCs w:val="28"/>
               </w:rPr>
-              <w:t>BPA</w:t>
+              <w:t>BLQ1</w:t>
             </w:r>
           </w:p>
         </w:tc>
@@ -3637,7 +3629,7 @@
                 <w:sz w:val="28"/>
                 <w:szCs w:val="28"/>
               </w:rPr>
-              <w:t>RRL</w:t>
+              <w:t>RRN</w:t>
             </w:r>
           </w:p>
         </w:tc>
@@ -4330,7 +4322,7 @@
                 <w:sz w:val="28"/>
                 <w:szCs w:val="28"/>
               </w:rPr>
-              <w:t>NA</w:t>
+              <w:t xml:space="preserve"> NLM</w:t>
             </w:r>
           </w:p>
         </w:tc>
@@ -4386,6 +4378,14 @@
                 <w:szCs w:val="28"/>
               </w:rPr>
             </w:pPr>
+            <w:r>
+              <w:rPr>
+                <w:rFonts w:ascii="Calibri" w:eastAsia="Calibri" w:hAnsi="Calibri" w:cs="Calibri"/>
+                <w:sz w:val="28"/>
+                <w:szCs w:val="28"/>
+              </w:rPr>
+              <w:t>HLV</w:t>
+            </w:r>
           </w:p>
         </w:tc>
         <w:tc>
@@ -4786,7 +4786,7 @@
                 <w:sz w:val="28"/>
                 <w:szCs w:val="28"/>
               </w:rPr>
-              <w:t>NA</w:t>
+              <w:t>SMRT</w:t>
             </w:r>
           </w:p>
         </w:tc>
@@ -4842,6 +4842,14 @@
                 <w:szCs w:val="28"/>
               </w:rPr>
             </w:pPr>
+            <w:r>
+              <w:rPr>
+                <w:rFonts w:ascii="Calibri" w:eastAsia="Calibri" w:hAnsi="Calibri" w:cs="Calibri"/>
+                <w:sz w:val="28"/>
+                <w:szCs w:val="28"/>
+              </w:rPr>
+              <w:t>HLV</w:t>
+            </w:r>
           </w:p>
         </w:tc>
         <w:tc>
@@ -5012,7 +5020,15 @@
                 <w:sz w:val="28"/>
                 <w:szCs w:val="28"/>
               </w:rPr>
-              <w:t>NA</w:t>
+              <w:t xml:space="preserve"> </w:t>
+            </w:r>
+            <w:r>
+              <w:rPr>
+                <w:rFonts w:ascii="Calibri" w:eastAsia="Calibri" w:hAnsi="Calibri" w:cs="Calibri"/>
+                <w:sz w:val="28"/>
+                <w:szCs w:val="28"/>
+              </w:rPr>
+              <w:t>SHAKTI</w:t>
             </w:r>
           </w:p>
         </w:tc>
@@ -5069,6 +5085,14 @@
                 <w:szCs w:val="28"/>
               </w:rPr>
             </w:pPr>
+            <w:r>
+              <w:rPr>
+                <w:rFonts w:ascii="Calibri" w:eastAsia="Calibri" w:hAnsi="Calibri" w:cs="Calibri"/>
+                <w:sz w:val="28"/>
+                <w:szCs w:val="28"/>
+              </w:rPr>
+              <w:t>HLV</w:t>
+            </w:r>
           </w:p>
         </w:tc>
         <w:tc>
@@ -5295,7 +5319,15 @@
                 <w:sz w:val="28"/>
                 <w:szCs w:val="28"/>
               </w:rPr>
-              <w:t>SHP</w:t>
+              <w:t>B193</w:t>
+            </w:r>
+            <w:r>
+              <w:rPr>
+                <w:rFonts w:ascii="Calibri" w:eastAsia="Calibri" w:hAnsi="Calibri" w:cs="Calibri"/>
+                <w:sz w:val="28"/>
+                <w:szCs w:val="28"/>
+              </w:rPr>
+              <w:t xml:space="preserve"> </w:t>
             </w:r>
           </w:p>
         </w:tc>
@@ -5522,7 +5554,7 @@
                 <w:sz w:val="28"/>
                 <w:szCs w:val="28"/>
               </w:rPr>
-              <w:t>HERA/NLM</w:t>
+              <w:t>RATNA</w:t>
             </w:r>
           </w:p>
         </w:tc>
@@ -5749,7 +5781,7 @@
                 <w:sz w:val="28"/>
                 <w:szCs w:val="28"/>
               </w:rPr>
-              <w:t>SLQ</w:t>
+              <w:t>SCA</w:t>
             </w:r>
           </w:p>
         </w:tc>
@@ -5976,7 +6008,7 @@
                 <w:sz w:val="28"/>
                 <w:szCs w:val="28"/>
               </w:rPr>
-              <w:t>SJOT</w:t>
+              <w:t>NLM</w:t>
             </w:r>
           </w:p>
         </w:tc>
@@ -6210,7 +6242,7 @@
                 <w:sz w:val="28"/>
                 <w:szCs w:val="28"/>
               </w:rPr>
-              <w:t>ICP</w:t>
+              <w:t>MNW</w:t>
             </w:r>
           </w:p>
         </w:tc>
@@ -6436,7 +6468,7 @@
                 <w:sz w:val="28"/>
                 <w:szCs w:val="28"/>
               </w:rPr>
-              <w:t>NQO</w:t>
+              <w:t>SHAKTI</w:t>
             </w:r>
           </w:p>
         </w:tc>
@@ -7295,7 +7327,7 @@
                 <w:sz w:val="28"/>
                 <w:szCs w:val="28"/>
               </w:rPr>
-              <w:t>SUDA</w:t>
+              <w:t>CHARU</w:t>
             </w:r>
           </w:p>
         </w:tc>
@@ -7525,233 +7557,241 @@
                 <w:sz w:val="28"/>
                 <w:szCs w:val="28"/>
               </w:rPr>
-              <w:t>JIND</w:t>
+              <w:t>J STAR</w:t>
+            </w:r>
+          </w:p>
+        </w:tc>
+        <w:tc>
+          <w:tcPr>
+            <w:tcW w:w="1524" w:type="dxa"/>
+            <w:tcBorders>
+              <w:top w:val="single" w:sz="4" w:space="0" w:color="000000"/>
+              <w:left w:val="single" w:sz="4" w:space="0" w:color="000000"/>
+              <w:bottom w:val="single" w:sz="4" w:space="0" w:color="000000"/>
+              <w:right w:val="single" w:sz="4" w:space="0" w:color="000000"/>
+            </w:tcBorders>
+            <w:shd w:val="clear" w:color="000000" w:fill="FFFFFF"/>
+            <w:tcMar>
+              <w:left w:w="108" w:type="dxa"/>
+              <w:right w:w="108" w:type="dxa"/>
+            </w:tcMar>
+          </w:tcPr>
+          <w:p>
+            <w:pPr>
+              <w:spacing w:after="0" w:line="240" w:lineRule="auto"/>
+              <w:jc w:val="center"/>
+              <w:rPr>
+                <w:rFonts w:ascii="Calibri" w:eastAsia="Calibri" w:hAnsi="Calibri" w:cs="Calibri"/>
+                <w:sz w:val="28"/>
+                <w:szCs w:val="28"/>
+              </w:rPr>
+            </w:pPr>
+          </w:p>
+        </w:tc>
+        <w:tc>
+          <w:tcPr>
+            <w:tcW w:w="795" w:type="dxa"/>
+            <w:tcBorders>
+              <w:top w:val="single" w:sz="4" w:space="0" w:color="000000"/>
+              <w:left w:val="single" w:sz="4" w:space="0" w:color="000000"/>
+              <w:bottom w:val="single" w:sz="4" w:space="0" w:color="000000"/>
+              <w:right w:val="single" w:sz="4" w:space="0" w:color="000000"/>
+            </w:tcBorders>
+            <w:shd w:val="clear" w:color="000000" w:fill="FFFFFF"/>
+            <w:tcMar>
+              <w:left w:w="108" w:type="dxa"/>
+              <w:right w:w="108" w:type="dxa"/>
+            </w:tcMar>
+          </w:tcPr>
+          <w:p>
+            <w:pPr>
+              <w:spacing w:after="0" w:line="240" w:lineRule="auto"/>
+              <w:jc w:val="center"/>
+              <w:rPr>
+                <w:rFonts w:ascii="Calibri" w:eastAsia="Calibri" w:hAnsi="Calibri" w:cs="Calibri"/>
+                <w:sz w:val="28"/>
+                <w:szCs w:val="28"/>
+              </w:rPr>
+            </w:pPr>
+            <w:r>
+              <w:rPr>
+                <w:rFonts w:ascii="Calibri" w:eastAsia="Calibri" w:hAnsi="Calibri" w:cs="Calibri"/>
+                <w:sz w:val="28"/>
+                <w:szCs w:val="28"/>
+              </w:rPr>
+              <w:t>GVT</w:t>
+            </w:r>
+          </w:p>
+        </w:tc>
+        <w:tc>
+          <w:tcPr>
+            <w:tcW w:w="1300" w:type="dxa"/>
+            <w:tcBorders>
+              <w:top w:val="single" w:sz="4" w:space="0" w:color="000000"/>
+              <w:left w:val="single" w:sz="4" w:space="0" w:color="000000"/>
+              <w:bottom w:val="single" w:sz="4" w:space="0" w:color="000000"/>
+              <w:right w:val="single" w:sz="4" w:space="0" w:color="000000"/>
+            </w:tcBorders>
+            <w:shd w:val="clear" w:color="000000" w:fill="FFFFFF"/>
+            <w:tcMar>
+              <w:left w:w="108" w:type="dxa"/>
+              <w:right w:w="108" w:type="dxa"/>
+            </w:tcMar>
+          </w:tcPr>
+          <w:p>
+            <w:pPr>
+              <w:spacing w:after="0" w:line="240" w:lineRule="auto"/>
+              <w:jc w:val="center"/>
+              <w:rPr>
+                <w:rFonts w:ascii="Calibri" w:eastAsia="Calibri" w:hAnsi="Calibri" w:cs="Calibri"/>
+                <w:sz w:val="28"/>
+                <w:szCs w:val="28"/>
+              </w:rPr>
+            </w:pPr>
+          </w:p>
+        </w:tc>
+      </w:tr>
+      <w:tr>
+        <w:tc>
+          <w:tcPr>
+            <w:tcW w:w="671" w:type="dxa"/>
+            <w:tcBorders>
+              <w:top w:val="single" w:sz="4" w:space="0" w:color="000000"/>
+              <w:left w:val="single" w:sz="4" w:space="0" w:color="000000"/>
+              <w:bottom w:val="single" w:sz="4" w:space="0" w:color="000000"/>
+              <w:right w:val="single" w:sz="4" w:space="0" w:color="000000"/>
+            </w:tcBorders>
+            <w:shd w:val="clear" w:color="000000" w:fill="FFFFFF"/>
+            <w:tcMar>
+              <w:left w:w="108" w:type="dxa"/>
+              <w:right w:w="108" w:type="dxa"/>
+            </w:tcMar>
+          </w:tcPr>
+          <w:p>
+            <w:pPr>
+              <w:spacing w:after="0" w:line="240" w:lineRule="auto"/>
+              <w:jc w:val="center"/>
+              <w:rPr>
+                <w:rFonts w:ascii="Calibri" w:eastAsia="Calibri" w:hAnsi="Calibri" w:cs="Calibri"/>
+                <w:sz w:val="28"/>
+                <w:szCs w:val="28"/>
+              </w:rPr>
+            </w:pPr>
+            <w:r>
+              <w:rPr>
+                <w:rFonts w:ascii="Calibri" w:eastAsia="Calibri" w:hAnsi="Calibri" w:cs="Calibri"/>
+                <w:sz w:val="28"/>
+                <w:szCs w:val="28"/>
+              </w:rPr>
+              <w:t>3</w:t>
+            </w:r>
+          </w:p>
+        </w:tc>
+        <w:tc>
+          <w:tcPr>
+            <w:tcW w:w="1604" w:type="dxa"/>
+            <w:tcBorders>
+              <w:top w:val="single" w:sz="4" w:space="0" w:color="000000"/>
+              <w:left w:val="single" w:sz="4" w:space="0" w:color="000000"/>
+              <w:bottom w:val="single" w:sz="4" w:space="0" w:color="000000"/>
+              <w:right w:val="single" w:sz="4" w:space="0" w:color="000000"/>
+            </w:tcBorders>
+            <w:shd w:val="clear" w:color="000000" w:fill="FFFFFF"/>
+            <w:tcMar>
+              <w:left w:w="108" w:type="dxa"/>
+              <w:right w:w="108" w:type="dxa"/>
+            </w:tcMar>
+          </w:tcPr>
+          <w:p>
+            <w:pPr>
+              <w:spacing w:after="0" w:line="240" w:lineRule="auto"/>
+              <w:jc w:val="center"/>
+              <w:rPr>
+                <w:rFonts w:ascii="Calibri" w:eastAsia="Calibri" w:hAnsi="Calibri" w:cs="Calibri"/>
+                <w:sz w:val="28"/>
+                <w:szCs w:val="28"/>
+              </w:rPr>
+            </w:pPr>
+            <w:r>
+              <w:rPr>
+                <w:rFonts w:ascii="Calibri" w:eastAsia="Calibri" w:hAnsi="Calibri" w:cs="Calibri"/>
+                <w:sz w:val="28"/>
+                <w:szCs w:val="28"/>
+              </w:rPr>
+              <w:t>11:00</w:t>
+            </w:r>
+          </w:p>
+        </w:tc>
+        <w:tc>
+          <w:tcPr>
+            <w:tcW w:w="1444" w:type="dxa"/>
+            <w:tcBorders>
+              <w:top w:val="single" w:sz="4" w:space="0" w:color="000000"/>
+              <w:left w:val="single" w:sz="4" w:space="0" w:color="000000"/>
+              <w:bottom w:val="single" w:sz="4" w:space="0" w:color="000000"/>
+              <w:right w:val="single" w:sz="4" w:space="0" w:color="000000"/>
+            </w:tcBorders>
+            <w:shd w:val="clear" w:color="000000" w:fill="FFFFFF"/>
+            <w:tcMar>
+              <w:left w:w="108" w:type="dxa"/>
+              <w:right w:w="108" w:type="dxa"/>
+            </w:tcMar>
+          </w:tcPr>
+          <w:p>
+            <w:pPr>
+              <w:spacing w:after="0" w:line="240" w:lineRule="auto"/>
+              <w:jc w:val="center"/>
+              <w:rPr>
+                <w:rFonts w:ascii="Calibri" w:eastAsia="Calibri" w:hAnsi="Calibri" w:cs="Calibri"/>
+                <w:sz w:val="28"/>
+                <w:szCs w:val="28"/>
+              </w:rPr>
+            </w:pPr>
+            <w:r>
+              <w:rPr>
+                <w:rFonts w:ascii="Calibri" w:eastAsia="Calibri" w:hAnsi="Calibri" w:cs="Calibri"/>
+                <w:sz w:val="28"/>
+                <w:szCs w:val="28"/>
+              </w:rPr>
+              <w:t>12:30</w:t>
+            </w:r>
+          </w:p>
+        </w:tc>
+        <w:tc>
+          <w:tcPr>
+            <w:tcW w:w="1842" w:type="dxa"/>
+            <w:tcBorders>
+              <w:top w:val="single" w:sz="4" w:space="0" w:color="000000"/>
+              <w:left w:val="single" w:sz="4" w:space="0" w:color="000000"/>
+              <w:bottom w:val="single" w:sz="4" w:space="0" w:color="000000"/>
+              <w:right w:val="single" w:sz="4" w:space="0" w:color="000000"/>
+            </w:tcBorders>
+            <w:shd w:val="clear" w:color="000000" w:fill="FFFFFF"/>
+            <w:tcMar>
+              <w:left w:w="108" w:type="dxa"/>
+              <w:right w:w="108" w:type="dxa"/>
+            </w:tcMar>
+          </w:tcPr>
+          <w:p>
+            <w:pPr>
+              <w:spacing w:after="0" w:line="240" w:lineRule="auto"/>
+              <w:jc w:val="center"/>
+              <w:rPr>
+                <w:rFonts w:ascii="Calibri" w:eastAsia="Calibri" w:hAnsi="Calibri" w:cs="Calibri"/>
+                <w:sz w:val="28"/>
+                <w:szCs w:val="28"/>
+              </w:rPr>
+            </w:pPr>
+            <w:r>
+              <w:rPr>
+                <w:rFonts w:ascii="Calibri" w:eastAsia="Calibri" w:hAnsi="Calibri" w:cs="Calibri"/>
+                <w:sz w:val="28"/>
+                <w:szCs w:val="28"/>
+              </w:rPr>
+              <w:t>L/O</w:t>
             </w:r>
             <w:bookmarkStart w:id="0" w:name="_GoBack"/>
             <w:bookmarkEnd w:id="0"/>
-          </w:p>
-        </w:tc>
-        <w:tc>
-          <w:tcPr>
-            <w:tcW w:w="1524" w:type="dxa"/>
-            <w:tcBorders>
-              <w:top w:val="single" w:sz="4" w:space="0" w:color="000000"/>
-              <w:left w:val="single" w:sz="4" w:space="0" w:color="000000"/>
-              <w:bottom w:val="single" w:sz="4" w:space="0" w:color="000000"/>
-              <w:right w:val="single" w:sz="4" w:space="0" w:color="000000"/>
-            </w:tcBorders>
-            <w:shd w:val="clear" w:color="000000" w:fill="FFFFFF"/>
-            <w:tcMar>
-              <w:left w:w="108" w:type="dxa"/>
-              <w:right w:w="108" w:type="dxa"/>
-            </w:tcMar>
-          </w:tcPr>
-          <w:p>
-            <w:pPr>
-              <w:spacing w:after="0" w:line="240" w:lineRule="auto"/>
-              <w:jc w:val="center"/>
-              <w:rPr>
-                <w:rFonts w:ascii="Calibri" w:eastAsia="Calibri" w:hAnsi="Calibri" w:cs="Calibri"/>
-                <w:sz w:val="28"/>
-                <w:szCs w:val="28"/>
-              </w:rPr>
-            </w:pPr>
-          </w:p>
-        </w:tc>
-        <w:tc>
-          <w:tcPr>
-            <w:tcW w:w="795" w:type="dxa"/>
-            <w:tcBorders>
-              <w:top w:val="single" w:sz="4" w:space="0" w:color="000000"/>
-              <w:left w:val="single" w:sz="4" w:space="0" w:color="000000"/>
-              <w:bottom w:val="single" w:sz="4" w:space="0" w:color="000000"/>
-              <w:right w:val="single" w:sz="4" w:space="0" w:color="000000"/>
-            </w:tcBorders>
-            <w:shd w:val="clear" w:color="000000" w:fill="FFFFFF"/>
-            <w:tcMar>
-              <w:left w:w="108" w:type="dxa"/>
-              <w:right w:w="108" w:type="dxa"/>
-            </w:tcMar>
-          </w:tcPr>
-          <w:p>
-            <w:pPr>
-              <w:spacing w:after="0" w:line="240" w:lineRule="auto"/>
-              <w:jc w:val="center"/>
-              <w:rPr>
-                <w:rFonts w:ascii="Calibri" w:eastAsia="Calibri" w:hAnsi="Calibri" w:cs="Calibri"/>
-                <w:sz w:val="28"/>
-                <w:szCs w:val="28"/>
-              </w:rPr>
-            </w:pPr>
-            <w:r>
-              <w:rPr>
-                <w:rFonts w:ascii="Calibri" w:eastAsia="Calibri" w:hAnsi="Calibri" w:cs="Calibri"/>
-                <w:sz w:val="28"/>
-                <w:szCs w:val="28"/>
-              </w:rPr>
-              <w:t>GVT</w:t>
-            </w:r>
-          </w:p>
-        </w:tc>
-        <w:tc>
-          <w:tcPr>
-            <w:tcW w:w="1300" w:type="dxa"/>
-            <w:tcBorders>
-              <w:top w:val="single" w:sz="4" w:space="0" w:color="000000"/>
-              <w:left w:val="single" w:sz="4" w:space="0" w:color="000000"/>
-              <w:bottom w:val="single" w:sz="4" w:space="0" w:color="000000"/>
-              <w:right w:val="single" w:sz="4" w:space="0" w:color="000000"/>
-            </w:tcBorders>
-            <w:shd w:val="clear" w:color="000000" w:fill="FFFFFF"/>
-            <w:tcMar>
-              <w:left w:w="108" w:type="dxa"/>
-              <w:right w:w="108" w:type="dxa"/>
-            </w:tcMar>
-          </w:tcPr>
-          <w:p>
-            <w:pPr>
-              <w:spacing w:after="0" w:line="240" w:lineRule="auto"/>
-              <w:jc w:val="center"/>
-              <w:rPr>
-                <w:rFonts w:ascii="Calibri" w:eastAsia="Calibri" w:hAnsi="Calibri" w:cs="Calibri"/>
-                <w:sz w:val="28"/>
-                <w:szCs w:val="28"/>
-              </w:rPr>
-            </w:pPr>
-          </w:p>
-        </w:tc>
-      </w:tr>
-      <w:tr>
-        <w:tc>
-          <w:tcPr>
-            <w:tcW w:w="671" w:type="dxa"/>
-            <w:tcBorders>
-              <w:top w:val="single" w:sz="4" w:space="0" w:color="000000"/>
-              <w:left w:val="single" w:sz="4" w:space="0" w:color="000000"/>
-              <w:bottom w:val="single" w:sz="4" w:space="0" w:color="000000"/>
-              <w:right w:val="single" w:sz="4" w:space="0" w:color="000000"/>
-            </w:tcBorders>
-            <w:shd w:val="clear" w:color="000000" w:fill="FFFFFF"/>
-            <w:tcMar>
-              <w:left w:w="108" w:type="dxa"/>
-              <w:right w:w="108" w:type="dxa"/>
-            </w:tcMar>
-          </w:tcPr>
-          <w:p>
-            <w:pPr>
-              <w:spacing w:after="0" w:line="240" w:lineRule="auto"/>
-              <w:jc w:val="center"/>
-              <w:rPr>
-                <w:rFonts w:ascii="Calibri" w:eastAsia="Calibri" w:hAnsi="Calibri" w:cs="Calibri"/>
-                <w:sz w:val="28"/>
-                <w:szCs w:val="28"/>
-              </w:rPr>
-            </w:pPr>
-            <w:r>
-              <w:rPr>
-                <w:rFonts w:ascii="Calibri" w:eastAsia="Calibri" w:hAnsi="Calibri" w:cs="Calibri"/>
-                <w:sz w:val="28"/>
-                <w:szCs w:val="28"/>
-              </w:rPr>
-              <w:t>3</w:t>
-            </w:r>
-          </w:p>
-        </w:tc>
-        <w:tc>
-          <w:tcPr>
-            <w:tcW w:w="1604" w:type="dxa"/>
-            <w:tcBorders>
-              <w:top w:val="single" w:sz="4" w:space="0" w:color="000000"/>
-              <w:left w:val="single" w:sz="4" w:space="0" w:color="000000"/>
-              <w:bottom w:val="single" w:sz="4" w:space="0" w:color="000000"/>
-              <w:right w:val="single" w:sz="4" w:space="0" w:color="000000"/>
-            </w:tcBorders>
-            <w:shd w:val="clear" w:color="000000" w:fill="FFFFFF"/>
-            <w:tcMar>
-              <w:left w:w="108" w:type="dxa"/>
-              <w:right w:w="108" w:type="dxa"/>
-            </w:tcMar>
-          </w:tcPr>
-          <w:p>
-            <w:pPr>
-              <w:spacing w:after="0" w:line="240" w:lineRule="auto"/>
-              <w:jc w:val="center"/>
-              <w:rPr>
-                <w:rFonts w:ascii="Calibri" w:eastAsia="Calibri" w:hAnsi="Calibri" w:cs="Calibri"/>
-                <w:sz w:val="28"/>
-                <w:szCs w:val="28"/>
-              </w:rPr>
-            </w:pPr>
-            <w:r>
-              <w:rPr>
-                <w:rFonts w:ascii="Calibri" w:eastAsia="Calibri" w:hAnsi="Calibri" w:cs="Calibri"/>
-                <w:sz w:val="28"/>
-                <w:szCs w:val="28"/>
-              </w:rPr>
-              <w:t>11:00</w:t>
-            </w:r>
-          </w:p>
-        </w:tc>
-        <w:tc>
-          <w:tcPr>
-            <w:tcW w:w="1444" w:type="dxa"/>
-            <w:tcBorders>
-              <w:top w:val="single" w:sz="4" w:space="0" w:color="000000"/>
-              <w:left w:val="single" w:sz="4" w:space="0" w:color="000000"/>
-              <w:bottom w:val="single" w:sz="4" w:space="0" w:color="000000"/>
-              <w:right w:val="single" w:sz="4" w:space="0" w:color="000000"/>
-            </w:tcBorders>
-            <w:shd w:val="clear" w:color="000000" w:fill="FFFFFF"/>
-            <w:tcMar>
-              <w:left w:w="108" w:type="dxa"/>
-              <w:right w:w="108" w:type="dxa"/>
-            </w:tcMar>
-          </w:tcPr>
-          <w:p>
-            <w:pPr>
-              <w:spacing w:after="0" w:line="240" w:lineRule="auto"/>
-              <w:jc w:val="center"/>
-              <w:rPr>
-                <w:rFonts w:ascii="Calibri" w:eastAsia="Calibri" w:hAnsi="Calibri" w:cs="Calibri"/>
-                <w:sz w:val="28"/>
-                <w:szCs w:val="28"/>
-              </w:rPr>
-            </w:pPr>
-            <w:r>
-              <w:rPr>
-                <w:rFonts w:ascii="Calibri" w:eastAsia="Calibri" w:hAnsi="Calibri" w:cs="Calibri"/>
-                <w:sz w:val="28"/>
-                <w:szCs w:val="28"/>
-              </w:rPr>
-              <w:t>12:30</w:t>
-            </w:r>
-          </w:p>
-        </w:tc>
-        <w:tc>
-          <w:tcPr>
-            <w:tcW w:w="1842" w:type="dxa"/>
-            <w:tcBorders>
-              <w:top w:val="single" w:sz="4" w:space="0" w:color="000000"/>
-              <w:left w:val="single" w:sz="4" w:space="0" w:color="000000"/>
-              <w:bottom w:val="single" w:sz="4" w:space="0" w:color="000000"/>
-              <w:right w:val="single" w:sz="4" w:space="0" w:color="000000"/>
-            </w:tcBorders>
-            <w:shd w:val="clear" w:color="000000" w:fill="FFFFFF"/>
-            <w:tcMar>
-              <w:left w:w="108" w:type="dxa"/>
-              <w:right w:w="108" w:type="dxa"/>
-            </w:tcMar>
-          </w:tcPr>
-          <w:p>
-            <w:pPr>
-              <w:spacing w:after="0" w:line="240" w:lineRule="auto"/>
-              <w:jc w:val="center"/>
-              <w:rPr>
-                <w:rFonts w:ascii="Calibri" w:eastAsia="Calibri" w:hAnsi="Calibri" w:cs="Calibri"/>
-                <w:sz w:val="28"/>
-                <w:szCs w:val="28"/>
-              </w:rPr>
-            </w:pPr>
           </w:p>
         </w:tc>
         <w:tc>
@@ -8242,10 +8282,10 @@
         <w:szCs w:val="28"/>
       </w:rPr>
       <w:object w:dxaOrig="1188" w:dyaOrig="900">
-        <v:rect id="_x0000_i1025" style="width:54.75pt;height:37.5pt" o:ole="" o:preferrelative="t" stroked="f">
+        <v:rect id="_x0000_i1025" style="width:55.1pt;height:37.45pt" o:ole="" o:preferrelative="t" stroked="f">
           <v:imagedata r:id="rId1" o:title=""/>
         </v:rect>
-        <o:OLEObject Type="Embed" ProgID="StaticMetafile" ShapeID="_x0000_i1025" DrawAspect="Content" ObjectID="_1853933325" r:id="rId2"/>
+        <o:OLEObject Type="Embed" ProgID="StaticMetafile" ShapeID="_x0000_i1025" DrawAspect="Content" ObjectID="_1854015838" r:id="rId2"/>
       </w:object>
     </w:r>
     <w:r>
@@ -8283,7 +8323,7 @@
         <w:sz w:val="28"/>
         <w:szCs w:val="28"/>
       </w:rPr>
-      <w:t>20</w:t>
+      <w:t>21</w:t>
     </w:r>
     <w:r>
       <w:rPr>
@@ -8313,7 +8353,17 @@
         <w:sz w:val="28"/>
         <w:szCs w:val="28"/>
       </w:rPr>
-      <w:t>TUES</w:t>
+      <w:t>WEDN</w:t>
+    </w:r>
+    <w:r>
+      <w:rPr>
+        <w:rFonts w:cs="Times New Roman"/>
+        <w:b/>
+        <w:color w:val="000000" w:themeColor="text1"/>
+        <w:sz w:val="28"/>
+        <w:szCs w:val="28"/>
+      </w:rPr>
+      <w:t>ES</w:t>
     </w:r>
     <w:r>
       <w:rPr>

</xml_diff>

<commit_message>
Sync - 2026-10-20 18:17
</commit_message>
<xml_diff>
--- a/files/Daily_Helicopter_Schedule.docx
+++ b/files/Daily_Helicopter_Schedule.docx
@@ -608,8 +608,10 @@
                 <w:sz w:val="28"/>
                 <w:szCs w:val="28"/>
               </w:rPr>
-              <w:t>BLQ (D)</w:t>
-            </w:r>
+              <w:t xml:space="preserve"> BLQ1[D]</w:t>
+            </w:r>
+            <w:bookmarkStart w:id="0" w:name="_GoBack"/>
+            <w:bookmarkEnd w:id="0"/>
           </w:p>
         </w:tc>
         <w:tc>
@@ -4152,6 +4154,15 @@
                 <w:szCs w:val="28"/>
               </w:rPr>
             </w:pPr>
+            <w:r>
+              <w:rPr>
+                <w:rFonts w:ascii="Calibri" w:eastAsia="Calibri" w:hAnsi="Calibri" w:cs="Calibri"/>
+                <w:b/>
+                <w:sz w:val="28"/>
+                <w:szCs w:val="28"/>
+              </w:rPr>
+              <w:t>NA</w:t>
+            </w:r>
           </w:p>
         </w:tc>
         <w:tc>
@@ -7790,8 +7801,6 @@
               </w:rPr>
               <w:t>L/O</w:t>
             </w:r>
-            <w:bookmarkStart w:id="0" w:name="_GoBack"/>
-            <w:bookmarkEnd w:id="0"/>
           </w:p>
         </w:tc>
         <w:tc>
@@ -8282,10 +8291,10 @@
         <w:szCs w:val="28"/>
       </w:rPr>
       <w:object w:dxaOrig="1188" w:dyaOrig="900">
-        <v:rect id="_x0000_i1025" style="width:55.1pt;height:37.45pt" o:ole="" o:preferrelative="t" stroked="f">
+        <v:rect id="_x0000_i1025" style="width:55pt;height:37.3pt" o:ole="" o:preferrelative="t" stroked="f">
           <v:imagedata r:id="rId1" o:title=""/>
         </v:rect>
-        <o:OLEObject Type="Embed" ProgID="StaticMetafile" ShapeID="_x0000_i1025" DrawAspect="Content" ObjectID="_1854015838" r:id="rId2"/>
+        <o:OLEObject Type="Embed" ProgID="StaticMetafile" ShapeID="_x0000_i1025" DrawAspect="Content" ObjectID="_1854023532" r:id="rId2"/>
       </w:object>
     </w:r>
     <w:r>

</xml_diff>

<commit_message>
Sync - 2026-10-21 16:50
</commit_message>
<xml_diff>
--- a/files/Daily_Helicopter_Schedule.docx
+++ b/files/Daily_Helicopter_Schedule.docx
@@ -610,8 +610,6 @@
               </w:rPr>
               <w:t xml:space="preserve"> BLQ1[D]</w:t>
             </w:r>
-            <w:bookmarkStart w:id="0" w:name="_GoBack"/>
-            <w:bookmarkEnd w:id="0"/>
           </w:p>
         </w:tc>
         <w:tc>
@@ -3337,7 +3335,7 @@
                 <w:sz w:val="28"/>
                 <w:szCs w:val="28"/>
               </w:rPr>
-              <w:t>BLQ1</w:t>
+              <w:t>BLQ2</w:t>
             </w:r>
           </w:p>
         </w:tc>
@@ -3568,7 +3566,7 @@
                 <w:sz w:val="28"/>
                 <w:szCs w:val="28"/>
               </w:rPr>
-              <w:t>BLQ1</w:t>
+              <w:t>BLQ2</w:t>
             </w:r>
           </w:p>
         </w:tc>
@@ -4333,7 +4331,15 @@
                 <w:sz w:val="28"/>
                 <w:szCs w:val="28"/>
               </w:rPr>
-              <w:t xml:space="preserve"> NLM</w:t>
+              <w:t xml:space="preserve"> </w:t>
+            </w:r>
+            <w:r>
+              <w:rPr>
+                <w:rFonts w:ascii="Calibri" w:eastAsia="Calibri" w:hAnsi="Calibri" w:cs="Calibri"/>
+                <w:sz w:val="28"/>
+                <w:szCs w:val="28"/>
+              </w:rPr>
+              <w:t xml:space="preserve">HRA </w:t>
             </w:r>
           </w:p>
         </w:tc>
@@ -4797,7 +4803,7 @@
                 <w:sz w:val="28"/>
                 <w:szCs w:val="28"/>
               </w:rPr>
-              <w:t>SMRT</w:t>
+              <w:t>GAURAV</w:t>
             </w:r>
           </w:p>
         </w:tc>
@@ -5031,15 +5037,7 @@
                 <w:sz w:val="28"/>
                 <w:szCs w:val="28"/>
               </w:rPr>
-              <w:t xml:space="preserve"> </w:t>
-            </w:r>
-            <w:r>
-              <w:rPr>
-                <w:rFonts w:ascii="Calibri" w:eastAsia="Calibri" w:hAnsi="Calibri" w:cs="Calibri"/>
-                <w:sz w:val="28"/>
-                <w:szCs w:val="28"/>
-              </w:rPr>
-              <w:t>SHAKTI</w:t>
+              <w:t>TBD</w:t>
             </w:r>
           </w:p>
         </w:tc>
@@ -5330,15 +5328,7 @@
                 <w:sz w:val="28"/>
                 <w:szCs w:val="28"/>
               </w:rPr>
-              <w:t>B193</w:t>
-            </w:r>
-            <w:r>
-              <w:rPr>
-                <w:rFonts w:ascii="Calibri" w:eastAsia="Calibri" w:hAnsi="Calibri" w:cs="Calibri"/>
-                <w:sz w:val="28"/>
-                <w:szCs w:val="28"/>
-              </w:rPr>
-              <w:t xml:space="preserve"> </w:t>
+              <w:t>HRA</w:t>
             </w:r>
           </w:p>
         </w:tc>
@@ -5565,7 +5555,7 @@
                 <w:sz w:val="28"/>
                 <w:szCs w:val="28"/>
               </w:rPr>
-              <w:t>RATNA</w:t>
+              <w:t>ICW</w:t>
             </w:r>
           </w:p>
         </w:tc>
@@ -5792,7 +5782,7 @@
                 <w:sz w:val="28"/>
                 <w:szCs w:val="28"/>
               </w:rPr>
-              <w:t>SCA</w:t>
+              <w:t>SHQ</w:t>
             </w:r>
           </w:p>
         </w:tc>
@@ -6019,7 +6009,7 @@
                 <w:sz w:val="28"/>
                 <w:szCs w:val="28"/>
               </w:rPr>
-              <w:t>NLM</w:t>
+              <w:t>WIN</w:t>
             </w:r>
           </w:p>
         </w:tc>
@@ -6479,7 +6469,7 @@
                 <w:sz w:val="28"/>
                 <w:szCs w:val="28"/>
               </w:rPr>
-              <w:t>SHAKTI</w:t>
+              <w:t>ARMADA1</w:t>
             </w:r>
           </w:p>
         </w:tc>
@@ -7338,7 +7328,7 @@
                 <w:sz w:val="28"/>
                 <w:szCs w:val="28"/>
               </w:rPr>
-              <w:t>CHARU</w:t>
+              <w:t>TAPTI</w:t>
             </w:r>
           </w:p>
         </w:tc>
@@ -7568,7 +7558,7 @@
                 <w:sz w:val="28"/>
                 <w:szCs w:val="28"/>
               </w:rPr>
-              <w:t>J STAR</w:t>
+              <w:t>UDAY</w:t>
             </w:r>
           </w:p>
         </w:tc>
@@ -7799,7 +7789,7 @@
                 <w:sz w:val="28"/>
                 <w:szCs w:val="28"/>
               </w:rPr>
-              <w:t>L/O</w:t>
+              <w:t>J STAR</w:t>
             </w:r>
           </w:p>
         </w:tc>
@@ -8024,6 +8014,16 @@
                 <w:szCs w:val="28"/>
               </w:rPr>
             </w:pPr>
+            <w:r>
+              <w:rPr>
+                <w:rFonts w:ascii="Calibri" w:eastAsia="Calibri" w:hAnsi="Calibri" w:cs="Calibri"/>
+                <w:sz w:val="28"/>
+                <w:szCs w:val="28"/>
+              </w:rPr>
+              <w:t>CHARU</w:t>
+            </w:r>
+            <w:bookmarkStart w:id="0" w:name="_GoBack"/>
+            <w:bookmarkEnd w:id="0"/>
           </w:p>
         </w:tc>
         <w:tc>
@@ -8291,10 +8291,10 @@
         <w:szCs w:val="28"/>
       </w:rPr>
       <w:object w:dxaOrig="1188" w:dyaOrig="900">
-        <v:rect id="_x0000_i1025" style="width:55pt;height:37.3pt" o:ole="" o:preferrelative="t" stroked="f">
+        <v:rect id="_x0000_i1025" style="width:55.2pt;height:37.05pt" o:ole="" o:preferrelative="t" stroked="f">
           <v:imagedata r:id="rId1" o:title=""/>
         </v:rect>
-        <o:OLEObject Type="Embed" ProgID="StaticMetafile" ShapeID="_x0000_i1025" DrawAspect="Content" ObjectID="_1854023532" r:id="rId2"/>
+        <o:OLEObject Type="Embed" ProgID="StaticMetafile" ShapeID="_x0000_i1025" DrawAspect="Content" ObjectID="_1854105242" r:id="rId2"/>
       </w:object>
     </w:r>
     <w:r>
@@ -8332,7 +8332,7 @@
         <w:sz w:val="28"/>
         <w:szCs w:val="28"/>
       </w:rPr>
-      <w:t>21</w:t>
+      <w:t>22</w:t>
     </w:r>
     <w:r>
       <w:rPr>
@@ -8362,7 +8362,7 @@
         <w:sz w:val="28"/>
         <w:szCs w:val="28"/>
       </w:rPr>
-      <w:t>WEDN</w:t>
+      <w:t>THUR</w:t>
     </w:r>
     <w:r>
       <w:rPr>
@@ -8372,7 +8372,7 @@
         <w:sz w:val="28"/>
         <w:szCs w:val="28"/>
       </w:rPr>
-      <w:t>ES</w:t>
+      <w:t>S</w:t>
     </w:r>
     <w:r>
       <w:rPr>

</xml_diff>

<commit_message>
Sync - 2026-10-22 17:22
</commit_message>
<xml_diff>
--- a/files/Daily_Helicopter_Schedule.docx
+++ b/files/Daily_Helicopter_Schedule.docx
@@ -2,6 +2,17 @@
 <file path=word/document.xml><?xml version="1.0" encoding="utf-8"?>
 <w:document xmlns:wpc="http://schemas.microsoft.com/office/word/2010/wordprocessingCanvas" xmlns:mc="http://schemas.openxmlformats.org/markup-compatibility/2006" xmlns:o="urn:schemas-microsoft-com:office:office" xmlns:r="http://schemas.openxmlformats.org/officeDocument/2006/relationships" xmlns:m="http://schemas.openxmlformats.org/officeDocument/2006/math" xmlns:v="urn:schemas-microsoft-com:vml" xmlns:wp14="http://schemas.microsoft.com/office/word/2010/wordprocessingDrawing" xmlns:wp="http://schemas.openxmlformats.org/drawingml/2006/wordprocessingDrawing" xmlns:w10="urn:schemas-microsoft-com:office:word" xmlns:w="http://schemas.openxmlformats.org/wordprocessingml/2006/main" xmlns:w14="http://schemas.microsoft.com/office/word/2010/wordml" xmlns:w15="http://schemas.microsoft.com/office/word/2012/wordml" xmlns:wpg="http://schemas.microsoft.com/office/word/2010/wordprocessingGroup" xmlns:wpi="http://schemas.microsoft.com/office/word/2010/wordprocessingInk" xmlns:wne="http://schemas.microsoft.com/office/word/2006/wordml" xmlns:wps="http://schemas.microsoft.com/office/word/2010/wordprocessingShape" mc:Ignorable="w14 w15 wp14">
   <w:body>
+    <w:p>
+      <w:pPr>
+        <w:spacing w:after="0" w:line="240" w:lineRule="auto"/>
+        <w:ind w:left="-709"/>
+        <w:rPr>
+          <w:noProof/>
+          <w:sz w:val="28"/>
+          <w:szCs w:val="28"/>
+        </w:rPr>
+      </w:pPr>
+    </w:p>
     <w:p>
       <w:pPr>
         <w:spacing w:after="0" w:line="240" w:lineRule="auto"/>
@@ -12,6 +23,8 @@
           <w:szCs w:val="28"/>
         </w:rPr>
       </w:pPr>
+      <w:bookmarkStart w:id="0" w:name="_GoBack"/>
+      <w:bookmarkEnd w:id="0"/>
       <w:r>
         <w:rPr>
           <w:noProof/>
@@ -608,7 +621,7 @@
                 <w:sz w:val="28"/>
                 <w:szCs w:val="28"/>
               </w:rPr>
-              <w:t xml:space="preserve"> BLQ1[D]</w:t>
+              <w:t xml:space="preserve"> BLQ (D)</w:t>
             </w:r>
           </w:p>
         </w:tc>
@@ -1358,7 +1371,7 @@
                 <w:sz w:val="28"/>
                 <w:szCs w:val="28"/>
               </w:rPr>
-              <w:t>NF[D]</w:t>
+              <w:t>NF (D)</w:t>
             </w:r>
           </w:p>
         </w:tc>
@@ -1627,23 +1640,7 @@
                 <w:sz w:val="28"/>
                 <w:szCs w:val="28"/>
               </w:rPr>
-              <w:t>1</w:t>
-            </w:r>
-            <w:r>
-              <w:rPr>
-                <w:rFonts w:ascii="Calibri" w:eastAsia="Calibri" w:hAnsi="Calibri" w:cs="Calibri"/>
-                <w:sz w:val="28"/>
-                <w:szCs w:val="28"/>
-              </w:rPr>
-              <w:t>1:0</w:t>
-            </w:r>
-            <w:r>
-              <w:rPr>
-                <w:rFonts w:ascii="Calibri" w:eastAsia="Calibri" w:hAnsi="Calibri" w:cs="Calibri"/>
-                <w:sz w:val="28"/>
-                <w:szCs w:val="28"/>
-              </w:rPr>
-              <w:t>0</w:t>
+              <w:t>11:00</w:t>
             </w:r>
           </w:p>
         </w:tc>
@@ -1858,31 +1855,7 @@
                 <w:sz w:val="28"/>
                 <w:szCs w:val="28"/>
               </w:rPr>
-              <w:t>12</w:t>
-            </w:r>
-            <w:r>
-              <w:rPr>
-                <w:rFonts w:ascii="Calibri" w:eastAsia="Calibri" w:hAnsi="Calibri" w:cs="Calibri"/>
-                <w:sz w:val="28"/>
-                <w:szCs w:val="28"/>
-              </w:rPr>
-              <w:t>:</w:t>
-            </w:r>
-            <w:r>
-              <w:rPr>
-                <w:rFonts w:ascii="Calibri" w:eastAsia="Calibri" w:hAnsi="Calibri" w:cs="Calibri"/>
-                <w:sz w:val="28"/>
-                <w:szCs w:val="28"/>
-              </w:rPr>
-              <w:t>0</w:t>
-            </w:r>
-            <w:r>
-              <w:rPr>
-                <w:rFonts w:ascii="Calibri" w:eastAsia="Calibri" w:hAnsi="Calibri" w:cs="Calibri"/>
-                <w:sz w:val="28"/>
-                <w:szCs w:val="28"/>
-              </w:rPr>
-              <w:t>0</w:t>
+              <w:t>12:00</w:t>
             </w:r>
           </w:p>
         </w:tc>
@@ -1921,15 +1894,7 @@
                 <w:sz w:val="28"/>
                 <w:szCs w:val="28"/>
               </w:rPr>
-              <w:t>14:0</w:t>
-            </w:r>
-            <w:r>
-              <w:rPr>
-                <w:rFonts w:ascii="Calibri" w:eastAsia="Calibri" w:hAnsi="Calibri" w:cs="Calibri"/>
-                <w:sz w:val="28"/>
-                <w:szCs w:val="28"/>
-              </w:rPr>
-              <w:t>0</w:t>
+              <w:t>14:00</w:t>
             </w:r>
           </w:p>
         </w:tc>
@@ -1968,15 +1933,7 @@
                 <w:sz w:val="28"/>
                 <w:szCs w:val="28"/>
               </w:rPr>
-              <w:t>BLQ (N</w:t>
-            </w:r>
-            <w:r>
-              <w:rPr>
-                <w:rFonts w:ascii="Calibri" w:eastAsia="Calibri" w:hAnsi="Calibri" w:cs="Calibri"/>
-                <w:sz w:val="28"/>
-                <w:szCs w:val="28"/>
-              </w:rPr>
-              <w:t>)</w:t>
+              <w:t>BLQ (N)</w:t>
             </w:r>
           </w:p>
         </w:tc>
@@ -3335,7 +3292,7 @@
                 <w:sz w:val="28"/>
                 <w:szCs w:val="28"/>
               </w:rPr>
-              <w:t>BLQ2</w:t>
+              <w:t>BPB</w:t>
             </w:r>
           </w:p>
         </w:tc>
@@ -3566,7 +3523,7 @@
                 <w:sz w:val="28"/>
                 <w:szCs w:val="28"/>
               </w:rPr>
-              <w:t>BLQ2</w:t>
+              <w:t>BPB</w:t>
             </w:r>
           </w:p>
         </w:tc>
@@ -4331,15 +4288,7 @@
                 <w:sz w:val="28"/>
                 <w:szCs w:val="28"/>
               </w:rPr>
-              <w:t xml:space="preserve"> </w:t>
-            </w:r>
-            <w:r>
-              <w:rPr>
-                <w:rFonts w:ascii="Calibri" w:eastAsia="Calibri" w:hAnsi="Calibri" w:cs="Calibri"/>
-                <w:sz w:val="28"/>
-                <w:szCs w:val="28"/>
-              </w:rPr>
-              <w:t xml:space="preserve">HRA </w:t>
+              <w:t>MNW</w:t>
             </w:r>
           </w:p>
         </w:tc>
@@ -4803,7 +4752,7 @@
                 <w:sz w:val="28"/>
                 <w:szCs w:val="28"/>
               </w:rPr>
-              <w:t>GAURAV</w:t>
+              <w:t>SJOT</w:t>
             </w:r>
           </w:p>
         </w:tc>
@@ -5328,7 +5277,7 @@
                 <w:sz w:val="28"/>
                 <w:szCs w:val="28"/>
               </w:rPr>
-              <w:t>HRA</w:t>
+              <w:t>ICP</w:t>
             </w:r>
           </w:p>
         </w:tc>
@@ -5555,7 +5504,7 @@
                 <w:sz w:val="28"/>
                 <w:szCs w:val="28"/>
               </w:rPr>
-              <w:t>ICW</w:t>
+              <w:t>B193</w:t>
             </w:r>
           </w:p>
         </w:tc>
@@ -5782,7 +5731,7 @@
                 <w:sz w:val="28"/>
                 <w:szCs w:val="28"/>
               </w:rPr>
-              <w:t>SHQ</w:t>
+              <w:t>SLQ</w:t>
             </w:r>
           </w:p>
         </w:tc>
@@ -6009,7 +5958,7 @@
                 <w:sz w:val="28"/>
                 <w:szCs w:val="28"/>
               </w:rPr>
-              <w:t>WIN</w:t>
+              <w:t>SHQ</w:t>
             </w:r>
           </w:p>
         </w:tc>
@@ -6243,7 +6192,7 @@
                 <w:sz w:val="28"/>
                 <w:szCs w:val="28"/>
               </w:rPr>
-              <w:t>MNW</w:t>
+              <w:t>NQO</w:t>
             </w:r>
           </w:p>
         </w:tc>
@@ -6469,7 +6418,7 @@
                 <w:sz w:val="28"/>
                 <w:szCs w:val="28"/>
               </w:rPr>
-              <w:t>ARMADA1</w:t>
+              <w:t>VND2</w:t>
             </w:r>
           </w:p>
         </w:tc>
@@ -7328,7 +7277,7 @@
                 <w:sz w:val="28"/>
                 <w:szCs w:val="28"/>
               </w:rPr>
-              <w:t>TAPTI</w:t>
+              <w:t>CHRU</w:t>
             </w:r>
           </w:p>
         </w:tc>
@@ -7558,7 +7507,7 @@
                 <w:sz w:val="28"/>
                 <w:szCs w:val="28"/>
               </w:rPr>
-              <w:t>UDAY</w:t>
+              <w:t>SUDA</w:t>
             </w:r>
           </w:p>
         </w:tc>
@@ -7789,7 +7738,7 @@
                 <w:sz w:val="28"/>
                 <w:szCs w:val="28"/>
               </w:rPr>
-              <w:t>J STAR</w:t>
+              <w:t>SRAT</w:t>
             </w:r>
           </w:p>
         </w:tc>
@@ -8014,16 +7963,6 @@
                 <w:szCs w:val="28"/>
               </w:rPr>
             </w:pPr>
-            <w:r>
-              <w:rPr>
-                <w:rFonts w:ascii="Calibri" w:eastAsia="Calibri" w:hAnsi="Calibri" w:cs="Calibri"/>
-                <w:sz w:val="28"/>
-                <w:szCs w:val="28"/>
-              </w:rPr>
-              <w:t>CHARU</w:t>
-            </w:r>
-            <w:bookmarkStart w:id="0" w:name="_GoBack"/>
-            <w:bookmarkEnd w:id="0"/>
           </w:p>
         </w:tc>
         <w:tc>
@@ -8291,10 +8230,10 @@
         <w:szCs w:val="28"/>
       </w:rPr>
       <w:object w:dxaOrig="1188" w:dyaOrig="900">
-        <v:rect id="_x0000_i1025" style="width:55.2pt;height:37.05pt" o:ole="" o:preferrelative="t" stroked="f">
+        <v:rect id="_x0000_i1025" style="width:55.5pt;height:36.75pt" o:ole="" o:preferrelative="t" stroked="f">
           <v:imagedata r:id="rId1" o:title=""/>
         </v:rect>
-        <o:OLEObject Type="Embed" ProgID="StaticMetafile" ShapeID="_x0000_i1025" DrawAspect="Content" ObjectID="_1854105242" r:id="rId2"/>
+        <o:OLEObject Type="Embed" ProgID="StaticMetafile" ShapeID="_x0000_i1025" DrawAspect="Content" ObjectID="_1854194179" r:id="rId2"/>
       </w:object>
     </w:r>
     <w:r>
@@ -8332,7 +8271,17 @@
         <w:sz w:val="28"/>
         <w:szCs w:val="28"/>
       </w:rPr>
-      <w:t>22</w:t>
+      <w:t>2</w:t>
+    </w:r>
+    <w:r>
+      <w:rPr>
+        <w:rFonts w:cs="Times New Roman"/>
+        <w:b/>
+        <w:color w:val="000000" w:themeColor="text1"/>
+        <w:sz w:val="28"/>
+        <w:szCs w:val="28"/>
+      </w:rPr>
+      <w:t>3</w:t>
     </w:r>
     <w:r>
       <w:rPr>
@@ -8362,17 +8311,7 @@
         <w:sz w:val="28"/>
         <w:szCs w:val="28"/>
       </w:rPr>
-      <w:t>THUR</w:t>
-    </w:r>
-    <w:r>
-      <w:rPr>
-        <w:rFonts w:cs="Times New Roman"/>
-        <w:b/>
-        <w:color w:val="000000" w:themeColor="text1"/>
-        <w:sz w:val="28"/>
-        <w:szCs w:val="28"/>
-      </w:rPr>
-      <w:t>S</w:t>
+      <w:t>FRI</w:t>
     </w:r>
     <w:r>
       <w:rPr>

</xml_diff>

<commit_message>
Sync - 2026-10-23 17:55
</commit_message>
<xml_diff>
--- a/files/Daily_Helicopter_Schedule.docx
+++ b/files/Daily_Helicopter_Schedule.docx
@@ -23,8 +23,6 @@
           <w:szCs w:val="28"/>
         </w:rPr>
       </w:pPr>
-      <w:bookmarkStart w:id="0" w:name="_GoBack"/>
-      <w:bookmarkEnd w:id="0"/>
       <w:r>
         <w:rPr>
           <w:noProof/>
@@ -691,7 +689,7 @@
                 <w:sz w:val="28"/>
                 <w:szCs w:val="28"/>
               </w:rPr>
-              <w:t>HLT</w:t>
+              <w:t>HLV</w:t>
             </w:r>
           </w:p>
         </w:tc>
@@ -726,7 +724,7 @@
                 <w:sz w:val="28"/>
                 <w:szCs w:val="28"/>
               </w:rPr>
-              <w:t>05</w:t>
+              <w:t>10</w:t>
             </w:r>
           </w:p>
         </w:tc>
@@ -3292,7 +3290,15 @@
                 <w:sz w:val="28"/>
                 <w:szCs w:val="28"/>
               </w:rPr>
-              <w:t>BPB</w:t>
+              <w:t>NQO</w:t>
+            </w:r>
+            <w:r>
+              <w:rPr>
+                <w:rFonts w:ascii="Calibri" w:eastAsia="Calibri" w:hAnsi="Calibri" w:cs="Calibri"/>
+                <w:sz w:val="28"/>
+                <w:szCs w:val="28"/>
+              </w:rPr>
+              <w:t xml:space="preserve"> L/O</w:t>
             </w:r>
           </w:p>
         </w:tc>
@@ -3355,7 +3361,15 @@
                 <w:sz w:val="28"/>
                 <w:szCs w:val="28"/>
               </w:rPr>
-              <w:t>RRN</w:t>
+              <w:t>RR</w:t>
+            </w:r>
+            <w:r>
+              <w:rPr>
+                <w:rFonts w:ascii="Calibri" w:eastAsia="Calibri" w:hAnsi="Calibri" w:cs="Calibri"/>
+                <w:sz w:val="28"/>
+                <w:szCs w:val="28"/>
+              </w:rPr>
+              <w:t>L</w:t>
             </w:r>
           </w:p>
         </w:tc>
@@ -3520,10 +3534,11 @@
             <w:r>
               <w:rPr>
                 <w:rFonts w:ascii="Calibri" w:eastAsia="Calibri" w:hAnsi="Calibri" w:cs="Calibri"/>
-                <w:sz w:val="28"/>
-                <w:szCs w:val="28"/>
-              </w:rPr>
-              <w:t>BPB</w:t>
+                <w:b/>
+                <w:sz w:val="28"/>
+                <w:szCs w:val="28"/>
+              </w:rPr>
+              <w:t>NA</w:t>
             </w:r>
           </w:p>
         </w:tc>
@@ -3580,14 +3595,6 @@
                 <w:szCs w:val="28"/>
               </w:rPr>
             </w:pPr>
-            <w:r>
-              <w:rPr>
-                <w:rFonts w:ascii="Calibri" w:eastAsia="Calibri" w:hAnsi="Calibri" w:cs="Calibri"/>
-                <w:sz w:val="28"/>
-                <w:szCs w:val="28"/>
-              </w:rPr>
-              <w:t>RRN</w:t>
-            </w:r>
           </w:p>
         </w:tc>
         <w:tc>
@@ -4109,15 +4116,6 @@
                 <w:szCs w:val="28"/>
               </w:rPr>
             </w:pPr>
-            <w:r>
-              <w:rPr>
-                <w:rFonts w:ascii="Calibri" w:eastAsia="Calibri" w:hAnsi="Calibri" w:cs="Calibri"/>
-                <w:b/>
-                <w:sz w:val="28"/>
-                <w:szCs w:val="28"/>
-              </w:rPr>
-              <w:t>NA</w:t>
-            </w:r>
           </w:p>
         </w:tc>
         <w:tc>
@@ -4285,10 +4283,11 @@
             <w:r>
               <w:rPr>
                 <w:rFonts w:ascii="Calibri" w:eastAsia="Calibri" w:hAnsi="Calibri" w:cs="Calibri"/>
-                <w:sz w:val="28"/>
-                <w:szCs w:val="28"/>
-              </w:rPr>
-              <w:t>MNW</w:t>
+                <w:b/>
+                <w:sz w:val="28"/>
+                <w:szCs w:val="28"/>
+              </w:rPr>
+              <w:t>NA</w:t>
             </w:r>
           </w:p>
         </w:tc>
@@ -4344,14 +4343,6 @@
                 <w:szCs w:val="28"/>
               </w:rPr>
             </w:pPr>
-            <w:r>
-              <w:rPr>
-                <w:rFonts w:ascii="Calibri" w:eastAsia="Calibri" w:hAnsi="Calibri" w:cs="Calibri"/>
-                <w:sz w:val="28"/>
-                <w:szCs w:val="28"/>
-              </w:rPr>
-              <w:t>HLV</w:t>
-            </w:r>
           </w:p>
         </w:tc>
         <w:tc>
@@ -4749,10 +4740,11 @@
             <w:r>
               <w:rPr>
                 <w:rFonts w:ascii="Calibri" w:eastAsia="Calibri" w:hAnsi="Calibri" w:cs="Calibri"/>
-                <w:sz w:val="28"/>
-                <w:szCs w:val="28"/>
-              </w:rPr>
-              <w:t>SJOT</w:t>
+                <w:b/>
+                <w:sz w:val="28"/>
+                <w:szCs w:val="28"/>
+              </w:rPr>
+              <w:t>NA</w:t>
             </w:r>
           </w:p>
         </w:tc>
@@ -4808,14 +4800,6 @@
                 <w:szCs w:val="28"/>
               </w:rPr>
             </w:pPr>
-            <w:r>
-              <w:rPr>
-                <w:rFonts w:ascii="Calibri" w:eastAsia="Calibri" w:hAnsi="Calibri" w:cs="Calibri"/>
-                <w:sz w:val="28"/>
-                <w:szCs w:val="28"/>
-              </w:rPr>
-              <w:t>HLV</w:t>
-            </w:r>
           </w:p>
         </w:tc>
         <w:tc>
@@ -4983,10 +4967,11 @@
             <w:r>
               <w:rPr>
                 <w:rFonts w:ascii="Calibri" w:eastAsia="Calibri" w:hAnsi="Calibri" w:cs="Calibri"/>
-                <w:sz w:val="28"/>
-                <w:szCs w:val="28"/>
-              </w:rPr>
-              <w:t>TBD</w:t>
+                <w:b/>
+                <w:sz w:val="28"/>
+                <w:szCs w:val="28"/>
+              </w:rPr>
+              <w:t>NA</w:t>
             </w:r>
           </w:p>
         </w:tc>
@@ -5043,14 +5028,6 @@
                 <w:szCs w:val="28"/>
               </w:rPr>
             </w:pPr>
-            <w:r>
-              <w:rPr>
-                <w:rFonts w:ascii="Calibri" w:eastAsia="Calibri" w:hAnsi="Calibri" w:cs="Calibri"/>
-                <w:sz w:val="28"/>
-                <w:szCs w:val="28"/>
-              </w:rPr>
-              <w:t>HLV</w:t>
-            </w:r>
           </w:p>
         </w:tc>
         <w:tc>
@@ -5277,7 +5254,7 @@
                 <w:sz w:val="28"/>
                 <w:szCs w:val="28"/>
               </w:rPr>
-              <w:t>ICP</w:t>
+              <w:t>VND2</w:t>
             </w:r>
           </w:p>
         </w:tc>
@@ -5504,7 +5481,7 @@
                 <w:sz w:val="28"/>
                 <w:szCs w:val="28"/>
               </w:rPr>
-              <w:t>B193</w:t>
+              <w:t>SSAK</w:t>
             </w:r>
           </w:p>
         </w:tc>
@@ -5731,7 +5708,7 @@
                 <w:sz w:val="28"/>
                 <w:szCs w:val="28"/>
               </w:rPr>
-              <w:t>SLQ</w:t>
+              <w:t>JSUP</w:t>
             </w:r>
           </w:p>
         </w:tc>
@@ -5958,8 +5935,10 @@
                 <w:sz w:val="28"/>
                 <w:szCs w:val="28"/>
               </w:rPr>
-              <w:t>SHQ</w:t>
-            </w:r>
+              <w:t>AS2</w:t>
+            </w:r>
+            <w:bookmarkStart w:id="0" w:name="_GoBack"/>
+            <w:bookmarkEnd w:id="0"/>
           </w:p>
         </w:tc>
         <w:tc>
@@ -6192,7 +6171,15 @@
                 <w:sz w:val="28"/>
                 <w:szCs w:val="28"/>
               </w:rPr>
-              <w:t>NQO</w:t>
+              <w:t>JXLR+</w:t>
+            </w:r>
+            <w:r>
+              <w:rPr>
+                <w:rFonts w:ascii="Calibri" w:eastAsia="Calibri" w:hAnsi="Calibri" w:cs="Calibri"/>
+                <w:sz w:val="28"/>
+                <w:szCs w:val="28"/>
+              </w:rPr>
+              <w:t>SCHAL</w:t>
             </w:r>
           </w:p>
         </w:tc>
@@ -6418,7 +6405,7 @@
                 <w:sz w:val="28"/>
                 <w:szCs w:val="28"/>
               </w:rPr>
-              <w:t>VND2</w:t>
+              <w:t>JSUP</w:t>
             </w:r>
           </w:p>
         </w:tc>
@@ -6580,6 +6567,7 @@
           <w:sz w:val="28"/>
           <w:szCs w:val="28"/>
         </w:rPr>
+        <w:lastRenderedPageBreak/>
         <w:t xml:space="preserve">NOTE: </w:t>
       </w:r>
       <w:r>
@@ -6657,7 +6645,6 @@
           <w:sz w:val="28"/>
           <w:szCs w:val="28"/>
         </w:rPr>
-        <w:lastRenderedPageBreak/>
         <w:t>Also please check Crew boat schedule for Contract crew.</w:t>
       </w:r>
     </w:p>
@@ -7277,7 +7264,7 @@
                 <w:sz w:val="28"/>
                 <w:szCs w:val="28"/>
               </w:rPr>
-              <w:t>CHRU</w:t>
+              <w:t>SGAV</w:t>
             </w:r>
           </w:p>
         </w:tc>
@@ -7507,7 +7494,7 @@
                 <w:sz w:val="28"/>
                 <w:szCs w:val="28"/>
               </w:rPr>
-              <w:t>SUDA</w:t>
+              <w:t>CHRU</w:t>
             </w:r>
           </w:p>
         </w:tc>
@@ -7963,6 +7950,14 @@
                 <w:szCs w:val="28"/>
               </w:rPr>
             </w:pPr>
+            <w:r>
+              <w:rPr>
+                <w:rFonts w:ascii="Calibri" w:eastAsia="Calibri" w:hAnsi="Calibri" w:cs="Calibri"/>
+                <w:sz w:val="28"/>
+                <w:szCs w:val="28"/>
+              </w:rPr>
+              <w:t>JIND</w:t>
+            </w:r>
           </w:p>
         </w:tc>
         <w:tc>
@@ -8233,7 +8228,7 @@
         <v:rect id="_x0000_i1025" style="width:55.5pt;height:36.75pt" o:ole="" o:preferrelative="t" stroked="f">
           <v:imagedata r:id="rId1" o:title=""/>
         </v:rect>
-        <o:OLEObject Type="Embed" ProgID="StaticMetafile" ShapeID="_x0000_i1025" DrawAspect="Content" ObjectID="_1854194179" r:id="rId2"/>
+        <o:OLEObject Type="Embed" ProgID="StaticMetafile" ShapeID="_x0000_i1025" DrawAspect="Content" ObjectID="_1854282096" r:id="rId2"/>
       </w:object>
     </w:r>
     <w:r>
@@ -8281,7 +8276,7 @@
         <w:sz w:val="28"/>
         <w:szCs w:val="28"/>
       </w:rPr>
-      <w:t>3</w:t>
+      <w:t>4</w:t>
     </w:r>
     <w:r>
       <w:rPr>
@@ -8311,7 +8306,7 @@
         <w:sz w:val="28"/>
         <w:szCs w:val="28"/>
       </w:rPr>
-      <w:t>FRI</w:t>
+      <w:t>SATUR</w:t>
     </w:r>
     <w:r>
       <w:rPr>

</xml_diff>

<commit_message>
Sync - 2026-10-24 15:58
</commit_message>
<xml_diff>
--- a/files/Daily_Helicopter_Schedule.docx
+++ b/files/Daily_Helicopter_Schedule.docx
@@ -3290,15 +3290,7 @@
                 <w:sz w:val="28"/>
                 <w:szCs w:val="28"/>
               </w:rPr>
-              <w:t>NQO</w:t>
-            </w:r>
-            <w:r>
-              <w:rPr>
-                <w:rFonts w:ascii="Calibri" w:eastAsia="Calibri" w:hAnsi="Calibri" w:cs="Calibri"/>
-                <w:sz w:val="28"/>
-                <w:szCs w:val="28"/>
-              </w:rPr>
-              <w:t xml:space="preserve"> L/O</w:t>
+              <w:t>NA</w:t>
             </w:r>
           </w:p>
         </w:tc>
@@ -3355,22 +3347,6 @@
                 <w:szCs w:val="28"/>
               </w:rPr>
             </w:pPr>
-            <w:r>
-              <w:rPr>
-                <w:rFonts w:ascii="Calibri" w:eastAsia="Calibri" w:hAnsi="Calibri" w:cs="Calibri"/>
-                <w:sz w:val="28"/>
-                <w:szCs w:val="28"/>
-              </w:rPr>
-              <w:t>RR</w:t>
-            </w:r>
-            <w:r>
-              <w:rPr>
-                <w:rFonts w:ascii="Calibri" w:eastAsia="Calibri" w:hAnsi="Calibri" w:cs="Calibri"/>
-                <w:sz w:val="28"/>
-                <w:szCs w:val="28"/>
-              </w:rPr>
-              <w:t>L</w:t>
-            </w:r>
           </w:p>
         </w:tc>
         <w:tc>
@@ -4289,6 +4265,15 @@
               </w:rPr>
               <w:t>NA</w:t>
             </w:r>
+            <w:r>
+              <w:rPr>
+                <w:rFonts w:ascii="Calibri" w:eastAsia="Calibri" w:hAnsi="Calibri" w:cs="Calibri"/>
+                <w:b/>
+                <w:sz w:val="28"/>
+                <w:szCs w:val="28"/>
+              </w:rPr>
+              <w:t xml:space="preserve"> </w:t>
+            </w:r>
           </w:p>
         </w:tc>
         <w:tc>
@@ -4740,7 +4725,6 @@
             <w:r>
               <w:rPr>
                 <w:rFonts w:ascii="Calibri" w:eastAsia="Calibri" w:hAnsi="Calibri" w:cs="Calibri"/>
-                <w:b/>
                 <w:sz w:val="28"/>
                 <w:szCs w:val="28"/>
               </w:rPr>
@@ -4967,7 +4951,6 @@
             <w:r>
               <w:rPr>
                 <w:rFonts w:ascii="Calibri" w:eastAsia="Calibri" w:hAnsi="Calibri" w:cs="Calibri"/>
-                <w:b/>
                 <w:sz w:val="28"/>
                 <w:szCs w:val="28"/>
               </w:rPr>
@@ -5060,7 +5043,7 @@
       </w:tr>
       <w:tr>
         <w:trPr>
-          <w:trHeight w:val="250"/>
+          <w:trHeight w:val="267"/>
         </w:trPr>
         <w:tc>
           <w:tcPr>
@@ -5244,17 +5227,27 @@
               <w:jc w:val="center"/>
               <w:rPr>
                 <w:rFonts w:ascii="Calibri" w:eastAsia="Calibri" w:hAnsi="Calibri" w:cs="Calibri"/>
-                <w:sz w:val="28"/>
-                <w:szCs w:val="28"/>
-              </w:rPr>
-            </w:pPr>
-            <w:r>
-              <w:rPr>
-                <w:rFonts w:ascii="Calibri" w:eastAsia="Calibri" w:hAnsi="Calibri" w:cs="Calibri"/>
-                <w:sz w:val="28"/>
-                <w:szCs w:val="28"/>
-              </w:rPr>
-              <w:t>VND2</w:t>
+                <w:b/>
+                <w:sz w:val="28"/>
+                <w:szCs w:val="28"/>
+              </w:rPr>
+            </w:pPr>
+            <w:r>
+              <w:rPr>
+                <w:rFonts w:ascii="Calibri" w:eastAsia="Calibri" w:hAnsi="Calibri" w:cs="Calibri"/>
+                <w:b/>
+                <w:sz w:val="28"/>
+                <w:szCs w:val="28"/>
+              </w:rPr>
+              <w:t xml:space="preserve"> </w:t>
+            </w:r>
+            <w:r>
+              <w:rPr>
+                <w:rFonts w:ascii="Calibri" w:eastAsia="Calibri" w:hAnsi="Calibri" w:cs="Calibri"/>
+                <w:sz w:val="28"/>
+                <w:szCs w:val="28"/>
+              </w:rPr>
+              <w:t>VKDN2</w:t>
             </w:r>
           </w:p>
         </w:tc>
@@ -5481,7 +5474,7 @@
                 <w:sz w:val="28"/>
                 <w:szCs w:val="28"/>
               </w:rPr>
-              <w:t>SSAK</w:t>
+              <w:t>ARMADA1</w:t>
             </w:r>
           </w:p>
         </w:tc>
@@ -5708,7 +5701,15 @@
                 <w:sz w:val="28"/>
                 <w:szCs w:val="28"/>
               </w:rPr>
-              <w:t>JSUP</w:t>
+              <w:t>RATNA</w:t>
+            </w:r>
+            <w:r>
+              <w:rPr>
+                <w:rFonts w:ascii="Calibri" w:eastAsia="Calibri" w:hAnsi="Calibri" w:cs="Calibri"/>
+                <w:sz w:val="28"/>
+                <w:szCs w:val="28"/>
+              </w:rPr>
+              <w:t xml:space="preserve"> </w:t>
             </w:r>
           </w:p>
         </w:tc>
@@ -5925,20 +5926,19 @@
               <w:jc w:val="center"/>
               <w:rPr>
                 <w:rFonts w:ascii="Calibri" w:eastAsia="Calibri" w:hAnsi="Calibri" w:cs="Calibri"/>
-                <w:sz w:val="28"/>
-                <w:szCs w:val="28"/>
-              </w:rPr>
-            </w:pPr>
-            <w:r>
-              <w:rPr>
-                <w:rFonts w:ascii="Calibri" w:eastAsia="Calibri" w:hAnsi="Calibri" w:cs="Calibri"/>
-                <w:sz w:val="28"/>
-                <w:szCs w:val="28"/>
-              </w:rPr>
-              <w:t>AS2</w:t>
-            </w:r>
-            <w:bookmarkStart w:id="0" w:name="_GoBack"/>
-            <w:bookmarkEnd w:id="0"/>
+                <w:b/>
+                <w:sz w:val="28"/>
+                <w:szCs w:val="28"/>
+              </w:rPr>
+            </w:pPr>
+            <w:r>
+              <w:rPr>
+                <w:rFonts w:ascii="Calibri" w:eastAsia="Calibri" w:hAnsi="Calibri" w:cs="Calibri"/>
+                <w:sz w:val="28"/>
+                <w:szCs w:val="28"/>
+              </w:rPr>
+              <w:t>TRI-2</w:t>
+            </w:r>
           </w:p>
         </w:tc>
         <w:tc>
@@ -6171,15 +6171,7 @@
                 <w:sz w:val="28"/>
                 <w:szCs w:val="28"/>
               </w:rPr>
-              <w:t>JXLR+</w:t>
-            </w:r>
-            <w:r>
-              <w:rPr>
-                <w:rFonts w:ascii="Calibri" w:eastAsia="Calibri" w:hAnsi="Calibri" w:cs="Calibri"/>
-                <w:sz w:val="28"/>
-                <w:szCs w:val="28"/>
-              </w:rPr>
-              <w:t>SCHAL</w:t>
+              <w:t>J SUP</w:t>
             </w:r>
           </w:p>
         </w:tc>
@@ -6405,8 +6397,10 @@
                 <w:sz w:val="28"/>
                 <w:szCs w:val="28"/>
               </w:rPr>
-              <w:t>JSUP</w:t>
-            </w:r>
+              <w:t>ABAN4</w:t>
+            </w:r>
+            <w:bookmarkStart w:id="0" w:name="_GoBack"/>
+            <w:bookmarkEnd w:id="0"/>
           </w:p>
         </w:tc>
         <w:tc>
@@ -6543,7 +6537,7 @@
                 <w:sz w:val="28"/>
                 <w:szCs w:val="28"/>
               </w:rPr>
-              <w:t xml:space="preserve"> </w:t>
+              <w:t xml:space="preserve">, </w:t>
             </w:r>
           </w:p>
         </w:tc>
@@ -6567,7 +6561,6 @@
           <w:sz w:val="28"/>
           <w:szCs w:val="28"/>
         </w:rPr>
-        <w:lastRenderedPageBreak/>
         <w:t xml:space="preserve">NOTE: </w:t>
       </w:r>
       <w:r>
@@ -7264,7 +7257,7 @@
                 <w:sz w:val="28"/>
                 <w:szCs w:val="28"/>
               </w:rPr>
-              <w:t>SGAV</w:t>
+              <w:t>TAPTI[D]</w:t>
             </w:r>
           </w:p>
         </w:tc>
@@ -7488,14 +7481,6 @@
                 <w:szCs w:val="28"/>
               </w:rPr>
             </w:pPr>
-            <w:r>
-              <w:rPr>
-                <w:rFonts w:ascii="Calibri" w:eastAsia="Calibri" w:hAnsi="Calibri" w:cs="Calibri"/>
-                <w:sz w:val="28"/>
-                <w:szCs w:val="28"/>
-              </w:rPr>
-              <w:t>CHRU</w:t>
-            </w:r>
           </w:p>
         </w:tc>
         <w:tc>
@@ -7719,14 +7704,6 @@
                 <w:szCs w:val="28"/>
               </w:rPr>
             </w:pPr>
-            <w:r>
-              <w:rPr>
-                <w:rFonts w:ascii="Calibri" w:eastAsia="Calibri" w:hAnsi="Calibri" w:cs="Calibri"/>
-                <w:sz w:val="28"/>
-                <w:szCs w:val="28"/>
-              </w:rPr>
-              <w:t>SRAT</w:t>
-            </w:r>
           </w:p>
         </w:tc>
         <w:tc>
@@ -7950,14 +7927,6 @@
                 <w:szCs w:val="28"/>
               </w:rPr>
             </w:pPr>
-            <w:r>
-              <w:rPr>
-                <w:rFonts w:ascii="Calibri" w:eastAsia="Calibri" w:hAnsi="Calibri" w:cs="Calibri"/>
-                <w:sz w:val="28"/>
-                <w:szCs w:val="28"/>
-              </w:rPr>
-              <w:t>JIND</w:t>
-            </w:r>
           </w:p>
         </w:tc>
         <w:tc>
@@ -8225,10 +8194,10 @@
         <w:szCs w:val="28"/>
       </w:rPr>
       <w:object w:dxaOrig="1188" w:dyaOrig="900">
-        <v:rect id="_x0000_i1025" style="width:55.5pt;height:36.75pt" o:ole="" o:preferrelative="t" stroked="f">
+        <v:rect id="_x0000_i1025" style="width:55.45pt;height:36.7pt" o:ole="" o:preferrelative="t" stroked="f">
           <v:imagedata r:id="rId1" o:title=""/>
         </v:rect>
-        <o:OLEObject Type="Embed" ProgID="StaticMetafile" ShapeID="_x0000_i1025" DrawAspect="Content" ObjectID="_1854282096" r:id="rId2"/>
+        <o:OLEObject Type="Embed" ProgID="StaticMetafile" ShapeID="_x0000_i1025" DrawAspect="Content" ObjectID="_1854362019" r:id="rId2"/>
       </w:object>
     </w:r>
     <w:r>
@@ -8276,7 +8245,7 @@
         <w:sz w:val="28"/>
         <w:szCs w:val="28"/>
       </w:rPr>
-      <w:t>4</w:t>
+      <w:t>5</w:t>
     </w:r>
     <w:r>
       <w:rPr>
@@ -8306,7 +8275,7 @@
         <w:sz w:val="28"/>
         <w:szCs w:val="28"/>
       </w:rPr>
-      <w:t>SATUR</w:t>
+      <w:t>SUN</w:t>
     </w:r>
     <w:r>
       <w:rPr>

</xml_diff>

<commit_message>
Sync - 2026-10-25 16:01
</commit_message>
<xml_diff>
--- a/files/Daily_Helicopter_Schedule.docx
+++ b/files/Daily_Helicopter_Schedule.docx
@@ -654,7 +654,7 @@
                 <w:sz w:val="28"/>
                 <w:szCs w:val="28"/>
               </w:rPr>
-              <w:t>HELIGO 412</w:t>
+              <w:t>NA</w:t>
             </w:r>
           </w:p>
         </w:tc>
@@ -689,7 +689,7 @@
                 <w:sz w:val="28"/>
                 <w:szCs w:val="28"/>
               </w:rPr>
-              <w:t>HLV</w:t>
+              <w:t>NA</w:t>
             </w:r>
           </w:p>
         </w:tc>
@@ -724,7 +724,7 @@
                 <w:sz w:val="28"/>
                 <w:szCs w:val="28"/>
               </w:rPr>
-              <w:t>10</w:t>
+              <w:t>00</w:t>
             </w:r>
           </w:p>
         </w:tc>
@@ -4259,20 +4259,10 @@
             <w:r>
               <w:rPr>
                 <w:rFonts w:ascii="Calibri" w:eastAsia="Calibri" w:hAnsi="Calibri" w:cs="Calibri"/>
-                <w:b/>
-                <w:sz w:val="28"/>
-                <w:szCs w:val="28"/>
-              </w:rPr>
-              <w:t>NA</w:t>
-            </w:r>
-            <w:r>
-              <w:rPr>
-                <w:rFonts w:ascii="Calibri" w:eastAsia="Calibri" w:hAnsi="Calibri" w:cs="Calibri"/>
-                <w:b/>
-                <w:sz w:val="28"/>
-                <w:szCs w:val="28"/>
-              </w:rPr>
-              <w:t xml:space="preserve"> </w:t>
+                <w:sz w:val="28"/>
+                <w:szCs w:val="28"/>
+              </w:rPr>
+              <w:t>ARMADA2</w:t>
             </w:r>
           </w:p>
         </w:tc>
@@ -4728,8 +4718,10 @@
                 <w:sz w:val="28"/>
                 <w:szCs w:val="28"/>
               </w:rPr>
-              <w:t>NA</w:t>
-            </w:r>
+              <w:t>SHQ</w:t>
+            </w:r>
+            <w:bookmarkStart w:id="0" w:name="_GoBack"/>
+            <w:bookmarkEnd w:id="0"/>
           </w:p>
         </w:tc>
         <w:tc>
@@ -4944,13 +4936,15 @@
               <w:jc w:val="center"/>
               <w:rPr>
                 <w:rFonts w:ascii="Calibri" w:eastAsia="Calibri" w:hAnsi="Calibri" w:cs="Calibri"/>
-                <w:sz w:val="28"/>
-                <w:szCs w:val="28"/>
-              </w:rPr>
-            </w:pPr>
-            <w:r>
-              <w:rPr>
-                <w:rFonts w:ascii="Calibri" w:eastAsia="Calibri" w:hAnsi="Calibri" w:cs="Calibri"/>
+                <w:b/>
+                <w:sz w:val="28"/>
+                <w:szCs w:val="28"/>
+              </w:rPr>
+            </w:pPr>
+            <w:r>
+              <w:rPr>
+                <w:rFonts w:ascii="Calibri" w:eastAsia="Calibri" w:hAnsi="Calibri" w:cs="Calibri"/>
+                <w:b/>
                 <w:sz w:val="28"/>
                 <w:szCs w:val="28"/>
               </w:rPr>
@@ -5227,27 +5221,17 @@
               <w:jc w:val="center"/>
               <w:rPr>
                 <w:rFonts w:ascii="Calibri" w:eastAsia="Calibri" w:hAnsi="Calibri" w:cs="Calibri"/>
-                <w:b/>
-                <w:sz w:val="28"/>
-                <w:szCs w:val="28"/>
-              </w:rPr>
-            </w:pPr>
-            <w:r>
-              <w:rPr>
-                <w:rFonts w:ascii="Calibri" w:eastAsia="Calibri" w:hAnsi="Calibri" w:cs="Calibri"/>
-                <w:b/>
-                <w:sz w:val="28"/>
-                <w:szCs w:val="28"/>
-              </w:rPr>
-              <w:t xml:space="preserve"> </w:t>
-            </w:r>
-            <w:r>
-              <w:rPr>
-                <w:rFonts w:ascii="Calibri" w:eastAsia="Calibri" w:hAnsi="Calibri" w:cs="Calibri"/>
-                <w:sz w:val="28"/>
-                <w:szCs w:val="28"/>
-              </w:rPr>
-              <w:t>VKDN2</w:t>
+                <w:sz w:val="28"/>
+                <w:szCs w:val="28"/>
+              </w:rPr>
+            </w:pPr>
+            <w:r>
+              <w:rPr>
+                <w:rFonts w:ascii="Calibri" w:eastAsia="Calibri" w:hAnsi="Calibri" w:cs="Calibri"/>
+                <w:sz w:val="28"/>
+                <w:szCs w:val="28"/>
+              </w:rPr>
+              <w:t>BLQ1</w:t>
             </w:r>
           </w:p>
         </w:tc>
@@ -5474,7 +5458,7 @@
                 <w:sz w:val="28"/>
                 <w:szCs w:val="28"/>
               </w:rPr>
-              <w:t>ARMADA1</w:t>
+              <w:t>GAURAV</w:t>
             </w:r>
           </w:p>
         </w:tc>
@@ -5701,15 +5685,7 @@
                 <w:sz w:val="28"/>
                 <w:szCs w:val="28"/>
               </w:rPr>
-              <w:t>RATNA</w:t>
-            </w:r>
-            <w:r>
-              <w:rPr>
-                <w:rFonts w:ascii="Calibri" w:eastAsia="Calibri" w:hAnsi="Calibri" w:cs="Calibri"/>
-                <w:sz w:val="28"/>
-                <w:szCs w:val="28"/>
-              </w:rPr>
-              <w:t xml:space="preserve"> </w:t>
+              <w:t>SLQ</w:t>
             </w:r>
           </w:p>
         </w:tc>
@@ -5937,7 +5913,7 @@
                 <w:sz w:val="28"/>
                 <w:szCs w:val="28"/>
               </w:rPr>
-              <w:t>TRI-2</w:t>
+              <w:t>NQO</w:t>
             </w:r>
           </w:p>
         </w:tc>
@@ -6171,7 +6147,7 @@
                 <w:sz w:val="28"/>
                 <w:szCs w:val="28"/>
               </w:rPr>
-              <w:t>J SUP</w:t>
+              <w:t>SHAKTI</w:t>
             </w:r>
           </w:p>
         </w:tc>
@@ -6397,10 +6373,8 @@
                 <w:sz w:val="28"/>
                 <w:szCs w:val="28"/>
               </w:rPr>
-              <w:t>ABAN4</w:t>
-            </w:r>
-            <w:bookmarkStart w:id="0" w:name="_GoBack"/>
-            <w:bookmarkEnd w:id="0"/>
+              <w:t>WIN/MNW</w:t>
+            </w:r>
           </w:p>
         </w:tc>
         <w:tc>
@@ -6561,6 +6535,7 @@
           <w:sz w:val="28"/>
           <w:szCs w:val="28"/>
         </w:rPr>
+        <w:lastRenderedPageBreak/>
         <w:t xml:space="preserve">NOTE: </w:t>
       </w:r>
       <w:r>
@@ -7257,7 +7232,7 @@
                 <w:sz w:val="28"/>
                 <w:szCs w:val="28"/>
               </w:rPr>
-              <w:t>TAPTI[D]</w:t>
+              <w:t>TAPTI</w:t>
             </w:r>
           </w:p>
         </w:tc>
@@ -7481,6 +7456,14 @@
                 <w:szCs w:val="28"/>
               </w:rPr>
             </w:pPr>
+            <w:r>
+              <w:rPr>
+                <w:rFonts w:ascii="Calibri" w:eastAsia="Calibri" w:hAnsi="Calibri" w:cs="Calibri"/>
+                <w:sz w:val="28"/>
+                <w:szCs w:val="28"/>
+              </w:rPr>
+              <w:t>UDAY</w:t>
+            </w:r>
           </w:p>
         </w:tc>
         <w:tc>
@@ -7704,6 +7687,14 @@
                 <w:szCs w:val="28"/>
               </w:rPr>
             </w:pPr>
+            <w:r>
+              <w:rPr>
+                <w:rFonts w:ascii="Calibri" w:eastAsia="Calibri" w:hAnsi="Calibri" w:cs="Calibri"/>
+                <w:sz w:val="28"/>
+                <w:szCs w:val="28"/>
+              </w:rPr>
+              <w:t>L/O</w:t>
+            </w:r>
           </w:p>
         </w:tc>
         <w:tc>
@@ -8194,10 +8185,10 @@
         <w:szCs w:val="28"/>
       </w:rPr>
       <w:object w:dxaOrig="1188" w:dyaOrig="900">
-        <v:rect id="_x0000_i1025" style="width:55.45pt;height:36.7pt" o:ole="" o:preferrelative="t" stroked="f">
+        <v:rect id="_x0000_i1025" style="width:55.15pt;height:36.75pt" o:ole="" o:preferrelative="t" stroked="f">
           <v:imagedata r:id="rId1" o:title=""/>
         </v:rect>
-        <o:OLEObject Type="Embed" ProgID="StaticMetafile" ShapeID="_x0000_i1025" DrawAspect="Content" ObjectID="_1854362019" r:id="rId2"/>
+        <o:OLEObject Type="Embed" ProgID="StaticMetafile" ShapeID="_x0000_i1025" DrawAspect="Content" ObjectID="_1854447885" r:id="rId2"/>
       </w:object>
     </w:r>
     <w:r>
@@ -8245,7 +8236,7 @@
         <w:sz w:val="28"/>
         <w:szCs w:val="28"/>
       </w:rPr>
-      <w:t>5</w:t>
+      <w:t>6</w:t>
     </w:r>
     <w:r>
       <w:rPr>
@@ -8275,7 +8266,17 @@
         <w:sz w:val="28"/>
         <w:szCs w:val="28"/>
       </w:rPr>
-      <w:t>SUN</w:t>
+      <w:t>MO</w:t>
+    </w:r>
+    <w:r>
+      <w:rPr>
+        <w:rFonts w:cs="Times New Roman"/>
+        <w:b/>
+        <w:color w:val="000000" w:themeColor="text1"/>
+        <w:sz w:val="28"/>
+        <w:szCs w:val="28"/>
+      </w:rPr>
+      <w:t>N</w:t>
     </w:r>
     <w:r>
       <w:rPr>

</xml_diff>

<commit_message>
Sync - 2026-10-27 17:36
</commit_message>
<xml_diff>
--- a/files/Daily_Helicopter_Schedule.docx
+++ b/files/Daily_Helicopter_Schedule.docx
@@ -654,7 +654,7 @@
                 <w:sz w:val="28"/>
                 <w:szCs w:val="28"/>
               </w:rPr>
-              <w:t>GVHL 412</w:t>
+              <w:t>NA</w:t>
             </w:r>
           </w:p>
         </w:tc>
@@ -689,7 +689,7 @@
                 <w:sz w:val="28"/>
                 <w:szCs w:val="28"/>
               </w:rPr>
-              <w:t>RRI</w:t>
+              <w:t>NA</w:t>
             </w:r>
           </w:p>
         </w:tc>
@@ -724,10 +724,8 @@
                 <w:sz w:val="28"/>
                 <w:szCs w:val="28"/>
               </w:rPr>
-              <w:t>06</w:t>
-            </w:r>
-            <w:bookmarkStart w:id="0" w:name="_GoBack"/>
-            <w:bookmarkEnd w:id="0"/>
+              <w:t>00</w:t>
+            </w:r>
           </w:p>
         </w:tc>
       </w:tr>
@@ -1137,8 +1135,258 @@
                 <w:sz w:val="28"/>
                 <w:szCs w:val="28"/>
               </w:rPr>
-              <w:t xml:space="preserve">+ </w:t>
-            </w:r>
+              <w:t xml:space="preserve"> </w:t>
+            </w:r>
+          </w:p>
+        </w:tc>
+        <w:tc>
+          <w:tcPr>
+            <w:tcW w:w="1574" w:type="dxa"/>
+            <w:tcBorders>
+              <w:top w:val="single" w:sz="4" w:space="0" w:color="000000"/>
+              <w:left w:val="single" w:sz="4" w:space="0" w:color="000000"/>
+              <w:bottom w:val="single" w:sz="4" w:space="0" w:color="000000"/>
+              <w:right w:val="single" w:sz="4" w:space="0" w:color="000000"/>
+            </w:tcBorders>
+            <w:shd w:val="clear" w:color="000000" w:fill="FFFFFF"/>
+            <w:tcMar>
+              <w:left w:w="108" w:type="dxa"/>
+              <w:right w:w="108" w:type="dxa"/>
+            </w:tcMar>
+          </w:tcPr>
+          <w:p>
+            <w:pPr>
+              <w:spacing w:after="0" w:line="240" w:lineRule="auto"/>
+              <w:jc w:val="center"/>
+              <w:rPr>
+                <w:rFonts w:ascii="Calibri" w:eastAsia="Calibri" w:hAnsi="Calibri" w:cs="Calibri"/>
+                <w:sz w:val="28"/>
+                <w:szCs w:val="28"/>
+              </w:rPr>
+            </w:pPr>
+            <w:r>
+              <w:rPr>
+                <w:rFonts w:ascii="Calibri" w:eastAsia="Calibri" w:hAnsi="Calibri" w:cs="Calibri"/>
+                <w:sz w:val="28"/>
+                <w:szCs w:val="28"/>
+              </w:rPr>
+              <w:t>GVHL 169</w:t>
+            </w:r>
+          </w:p>
+        </w:tc>
+        <w:tc>
+          <w:tcPr>
+            <w:tcW w:w="1360" w:type="dxa"/>
+            <w:tcBorders>
+              <w:top w:val="single" w:sz="4" w:space="0" w:color="000000"/>
+              <w:left w:val="single" w:sz="4" w:space="0" w:color="000000"/>
+              <w:bottom w:val="single" w:sz="4" w:space="0" w:color="000000"/>
+              <w:right w:val="single" w:sz="4" w:space="0" w:color="000000"/>
+            </w:tcBorders>
+            <w:shd w:val="clear" w:color="000000" w:fill="FFFFFF"/>
+            <w:tcMar>
+              <w:left w:w="108" w:type="dxa"/>
+              <w:right w:w="108" w:type="dxa"/>
+            </w:tcMar>
+          </w:tcPr>
+          <w:p>
+            <w:pPr>
+              <w:spacing w:after="0" w:line="240" w:lineRule="auto"/>
+              <w:jc w:val="center"/>
+              <w:rPr>
+                <w:rFonts w:ascii="Calibri" w:eastAsia="Calibri" w:hAnsi="Calibri" w:cs="Calibri"/>
+                <w:sz w:val="28"/>
+                <w:szCs w:val="28"/>
+              </w:rPr>
+            </w:pPr>
+            <w:r>
+              <w:rPr>
+                <w:rFonts w:ascii="Calibri" w:eastAsia="Calibri" w:hAnsi="Calibri" w:cs="Calibri"/>
+                <w:sz w:val="28"/>
+                <w:szCs w:val="28"/>
+              </w:rPr>
+              <w:t>RRO</w:t>
+            </w:r>
+          </w:p>
+        </w:tc>
+        <w:tc>
+          <w:tcPr>
+            <w:tcW w:w="1335" w:type="dxa"/>
+            <w:tcBorders>
+              <w:top w:val="single" w:sz="4" w:space="0" w:color="000000"/>
+              <w:left w:val="single" w:sz="4" w:space="0" w:color="000000"/>
+              <w:bottom w:val="single" w:sz="4" w:space="0" w:color="000000"/>
+              <w:right w:val="single" w:sz="4" w:space="0" w:color="000000"/>
+            </w:tcBorders>
+            <w:shd w:val="clear" w:color="auto" w:fill="auto"/>
+            <w:tcMar>
+              <w:left w:w="108" w:type="dxa"/>
+              <w:right w:w="108" w:type="dxa"/>
+            </w:tcMar>
+          </w:tcPr>
+          <w:p>
+            <w:pPr>
+              <w:spacing w:after="0" w:line="240" w:lineRule="auto"/>
+              <w:jc w:val="center"/>
+              <w:rPr>
+                <w:rFonts w:ascii="Calibri" w:eastAsia="Calibri" w:hAnsi="Calibri" w:cs="Calibri"/>
+                <w:sz w:val="28"/>
+                <w:szCs w:val="28"/>
+              </w:rPr>
+            </w:pPr>
+            <w:r>
+              <w:rPr>
+                <w:rFonts w:ascii="Calibri" w:eastAsia="Calibri" w:hAnsi="Calibri" w:cs="Calibri"/>
+                <w:sz w:val="28"/>
+                <w:szCs w:val="28"/>
+              </w:rPr>
+              <w:t>05</w:t>
+            </w:r>
+          </w:p>
+        </w:tc>
+      </w:tr>
+      <w:tr>
+        <w:trPr>
+          <w:trHeight w:val="308"/>
+        </w:trPr>
+        <w:tc>
+          <w:tcPr>
+            <w:tcW w:w="735" w:type="dxa"/>
+            <w:tcBorders>
+              <w:top w:val="single" w:sz="4" w:space="0" w:color="000000"/>
+              <w:left w:val="single" w:sz="4" w:space="0" w:color="000000"/>
+              <w:bottom w:val="single" w:sz="4" w:space="0" w:color="000000"/>
+              <w:right w:val="single" w:sz="4" w:space="0" w:color="000000"/>
+            </w:tcBorders>
+            <w:shd w:val="clear" w:color="auto" w:fill="auto"/>
+            <w:tcMar>
+              <w:left w:w="108" w:type="dxa"/>
+              <w:right w:w="108" w:type="dxa"/>
+            </w:tcMar>
+          </w:tcPr>
+          <w:p>
+            <w:pPr>
+              <w:spacing w:after="0" w:line="240" w:lineRule="auto"/>
+              <w:jc w:val="center"/>
+              <w:rPr>
+                <w:rFonts w:ascii="Calibri" w:eastAsia="Calibri" w:hAnsi="Calibri" w:cs="Calibri"/>
+                <w:sz w:val="28"/>
+                <w:szCs w:val="28"/>
+              </w:rPr>
+            </w:pPr>
+            <w:r>
+              <w:rPr>
+                <w:rFonts w:ascii="Calibri" w:eastAsia="Calibri" w:hAnsi="Calibri" w:cs="Calibri"/>
+                <w:sz w:val="28"/>
+                <w:szCs w:val="28"/>
+              </w:rPr>
+              <w:t>4</w:t>
+            </w:r>
+          </w:p>
+        </w:tc>
+        <w:tc>
+          <w:tcPr>
+            <w:tcW w:w="1628" w:type="dxa"/>
+            <w:tcBorders>
+              <w:top w:val="single" w:sz="4" w:space="0" w:color="000000"/>
+              <w:left w:val="single" w:sz="4" w:space="0" w:color="000000"/>
+              <w:bottom w:val="single" w:sz="4" w:space="0" w:color="000000"/>
+              <w:right w:val="single" w:sz="4" w:space="0" w:color="000000"/>
+            </w:tcBorders>
+            <w:shd w:val="clear" w:color="auto" w:fill="auto"/>
+            <w:tcMar>
+              <w:left w:w="108" w:type="dxa"/>
+              <w:right w:w="108" w:type="dxa"/>
+            </w:tcMar>
+          </w:tcPr>
+          <w:p>
+            <w:pPr>
+              <w:spacing w:after="0" w:line="240" w:lineRule="auto"/>
+              <w:jc w:val="center"/>
+              <w:rPr>
+                <w:rFonts w:ascii="Calibri" w:eastAsia="Calibri" w:hAnsi="Calibri" w:cs="Calibri"/>
+                <w:sz w:val="28"/>
+                <w:szCs w:val="28"/>
+              </w:rPr>
+            </w:pPr>
+            <w:r>
+              <w:rPr>
+                <w:rFonts w:ascii="Calibri" w:eastAsia="Calibri" w:hAnsi="Calibri" w:cs="Calibri"/>
+                <w:sz w:val="28"/>
+                <w:szCs w:val="28"/>
+              </w:rPr>
+              <w:t>06:30</w:t>
+            </w:r>
+          </w:p>
+        </w:tc>
+        <w:tc>
+          <w:tcPr>
+            <w:tcW w:w="1480" w:type="dxa"/>
+            <w:tcBorders>
+              <w:top w:val="single" w:sz="4" w:space="0" w:color="000000"/>
+              <w:left w:val="single" w:sz="4" w:space="0" w:color="000000"/>
+              <w:bottom w:val="single" w:sz="4" w:space="0" w:color="000000"/>
+              <w:right w:val="single" w:sz="4" w:space="0" w:color="000000"/>
+            </w:tcBorders>
+            <w:shd w:val="clear" w:color="auto" w:fill="auto"/>
+            <w:tcMar>
+              <w:left w:w="108" w:type="dxa"/>
+              <w:right w:w="108" w:type="dxa"/>
+            </w:tcMar>
+          </w:tcPr>
+          <w:p>
+            <w:pPr>
+              <w:spacing w:after="0" w:line="240" w:lineRule="auto"/>
+              <w:jc w:val="center"/>
+              <w:rPr>
+                <w:rFonts w:ascii="Calibri" w:eastAsia="Calibri" w:hAnsi="Calibri" w:cs="Calibri"/>
+                <w:sz w:val="28"/>
+                <w:szCs w:val="28"/>
+              </w:rPr>
+            </w:pPr>
+            <w:r>
+              <w:rPr>
+                <w:rFonts w:ascii="Calibri" w:eastAsia="Calibri" w:hAnsi="Calibri" w:cs="Calibri"/>
+                <w:sz w:val="28"/>
+                <w:szCs w:val="28"/>
+              </w:rPr>
+              <w:t>08:1</w:t>
+            </w:r>
+            <w:r>
+              <w:rPr>
+                <w:rFonts w:ascii="Calibri" w:eastAsia="Calibri" w:hAnsi="Calibri" w:cs="Calibri"/>
+                <w:sz w:val="28"/>
+                <w:szCs w:val="28"/>
+              </w:rPr>
+              <w:t>5</w:t>
+            </w:r>
+          </w:p>
+        </w:tc>
+        <w:tc>
+          <w:tcPr>
+            <w:tcW w:w="2529" w:type="dxa"/>
+            <w:tcBorders>
+              <w:top w:val="single" w:sz="4" w:space="0" w:color="000000"/>
+              <w:left w:val="single" w:sz="4" w:space="0" w:color="000000"/>
+              <w:bottom w:val="single" w:sz="4" w:space="0" w:color="000000"/>
+              <w:right w:val="single" w:sz="4" w:space="0" w:color="000000"/>
+            </w:tcBorders>
+            <w:shd w:val="clear" w:color="auto" w:fill="auto"/>
+            <w:tcMar>
+              <w:left w:w="108" w:type="dxa"/>
+              <w:right w:w="108" w:type="dxa"/>
+            </w:tcMar>
+          </w:tcPr>
+          <w:p>
+            <w:pPr>
+              <w:spacing w:after="0" w:line="240" w:lineRule="auto"/>
+              <w:jc w:val="center"/>
+              <w:rPr>
+                <w:rFonts w:ascii="Calibri" w:eastAsia="Calibri" w:hAnsi="Calibri" w:cs="Calibri"/>
+                <w:sz w:val="28"/>
+                <w:szCs w:val="28"/>
+              </w:rPr>
+            </w:pPr>
             <w:r>
               <w:rPr>
                 <w:rFonts w:ascii="Calibri" w:eastAsia="Calibri" w:hAnsi="Calibri" w:cs="Calibri"/>
@@ -1180,7 +1428,7 @@
                 <w:sz w:val="28"/>
                 <w:szCs w:val="28"/>
               </w:rPr>
-              <w:t>GVHL 169</w:t>
+              <w:t>GVHL 412</w:t>
             </w:r>
           </w:p>
         </w:tc>
@@ -1215,7 +1463,7 @@
                 <w:sz w:val="28"/>
                 <w:szCs w:val="28"/>
               </w:rPr>
-              <w:t>RRO</w:t>
+              <w:t>RRI</w:t>
             </w:r>
           </w:p>
         </w:tc>
@@ -1250,7 +1498,7 @@
                 <w:sz w:val="28"/>
                 <w:szCs w:val="28"/>
               </w:rPr>
-              <w:t>05</w:t>
+              <w:t>06</w:t>
             </w:r>
           </w:p>
         </w:tc>
@@ -1709,14 +1957,6 @@
               </w:rPr>
               <w:t>BLQ (N)</w:t>
             </w:r>
-            <w:r>
-              <w:rPr>
-                <w:rFonts w:ascii="Calibri" w:eastAsia="Calibri" w:hAnsi="Calibri" w:cs="Calibri"/>
-                <w:sz w:val="28"/>
-                <w:szCs w:val="28"/>
-              </w:rPr>
-              <w:t xml:space="preserve"> via SRAT</w:t>
-            </w:r>
           </w:p>
         </w:tc>
         <w:tc>
@@ -4046,7 +4286,7 @@
                 <w:sz w:val="28"/>
                 <w:szCs w:val="28"/>
               </w:rPr>
-              <w:t>R10A+R13A+JTAN</w:t>
+              <w:t>B193</w:t>
             </w:r>
           </w:p>
         </w:tc>
@@ -4502,7 +4742,7 @@
                 <w:sz w:val="28"/>
                 <w:szCs w:val="28"/>
               </w:rPr>
-              <w:t>SJOT</w:t>
+              <w:t>MNW</w:t>
             </w:r>
           </w:p>
         </w:tc>
@@ -5013,7 +5253,7 @@
                 <w:sz w:val="28"/>
                 <w:szCs w:val="28"/>
               </w:rPr>
-              <w:t>HRA+NLM</w:t>
+              <w:t>SCA</w:t>
             </w:r>
           </w:p>
         </w:tc>
@@ -5240,7 +5480,7 @@
                 <w:sz w:val="28"/>
                 <w:szCs w:val="28"/>
               </w:rPr>
-              <w:t>SLQ</w:t>
+              <w:t>SRAT+SGAV</w:t>
             </w:r>
           </w:p>
         </w:tc>
@@ -5467,7 +5707,7 @@
                 <w:sz w:val="28"/>
                 <w:szCs w:val="28"/>
               </w:rPr>
-              <w:t>SHQ</w:t>
+              <w:t>NLM</w:t>
             </w:r>
           </w:p>
         </w:tc>
@@ -5928,7 +6168,7 @@
                 <w:sz w:val="28"/>
                 <w:szCs w:val="28"/>
               </w:rPr>
-              <w:t>NQO</w:t>
+              <w:t>SSAK</w:t>
             </w:r>
           </w:p>
         </w:tc>
@@ -6154,7 +6394,7 @@
                 <w:sz w:val="28"/>
                 <w:szCs w:val="28"/>
               </w:rPr>
-              <w:t>ICP</w:t>
+              <w:t>DEFOS</w:t>
             </w:r>
           </w:p>
         </w:tc>
@@ -7005,7 +7245,7 @@
                 <w:sz w:val="28"/>
                 <w:szCs w:val="28"/>
               </w:rPr>
-              <w:t>CHRU</w:t>
+              <w:t>SUDA</w:t>
             </w:r>
           </w:p>
         </w:tc>
@@ -7235,7 +7475,7 @@
                 <w:sz w:val="28"/>
                 <w:szCs w:val="28"/>
               </w:rPr>
-              <w:t>SUDA</w:t>
+              <w:t>CHRU</w:t>
             </w:r>
           </w:p>
         </w:tc>
@@ -7466,7 +7706,7 @@
                 <w:sz w:val="28"/>
                 <w:szCs w:val="28"/>
               </w:rPr>
-              <w:t>TCPP</w:t>
+              <w:t>JIND</w:t>
             </w:r>
           </w:p>
         </w:tc>
@@ -7699,6 +7939,8 @@
               </w:rPr>
               <w:t>SUDA</w:t>
             </w:r>
+            <w:bookmarkStart w:id="0" w:name="_GoBack"/>
+            <w:bookmarkEnd w:id="0"/>
           </w:p>
         </w:tc>
         <w:tc>
@@ -7969,7 +8211,7 @@
         <v:rect id="_x0000_i1025" style="width:54.75pt;height:36.75pt" o:ole="" o:preferrelative="t" stroked="f">
           <v:imagedata r:id="rId1" o:title=""/>
         </v:rect>
-        <o:OLEObject Type="Embed" ProgID="StaticMetafile" ShapeID="_x0000_i1025" DrawAspect="Content" ObjectID="_1854538982" r:id="rId2"/>
+        <o:OLEObject Type="Embed" ProgID="StaticMetafile" ShapeID="_x0000_i1025" DrawAspect="Content" ObjectID="_1854625113" r:id="rId2"/>
       </w:object>
     </w:r>
     <w:r>
@@ -8017,7 +8259,7 @@
         <w:sz w:val="28"/>
         <w:szCs w:val="28"/>
       </w:rPr>
-      <w:t>7</w:t>
+      <w:t>8</w:t>
     </w:r>
     <w:r>
       <w:rPr>
@@ -8047,7 +8289,7 @@
         <w:sz w:val="28"/>
         <w:szCs w:val="28"/>
       </w:rPr>
-      <w:t>TUES</w:t>
+      <w:t>WEDNES</w:t>
     </w:r>
     <w:r>
       <w:rPr>

</xml_diff>

<commit_message>
Sync - 2026-10-28 17:08
</commit_message>
<xml_diff>
--- a/files/Daily_Helicopter_Schedule.docx
+++ b/files/Daily_Helicopter_Schedule.docx
@@ -654,7 +654,7 @@
                 <w:sz w:val="28"/>
                 <w:szCs w:val="28"/>
               </w:rPr>
-              <w:t>NA</w:t>
+              <w:t>GVHL 169</w:t>
             </w:r>
           </w:p>
         </w:tc>
@@ -689,7 +689,7 @@
                 <w:sz w:val="28"/>
                 <w:szCs w:val="28"/>
               </w:rPr>
-              <w:t>NA</w:t>
+              <w:t>RRN</w:t>
             </w:r>
           </w:p>
         </w:tc>
@@ -724,7 +724,7 @@
                 <w:sz w:val="28"/>
                 <w:szCs w:val="28"/>
               </w:rPr>
-              <w:t>00</w:t>
+              <w:t>05</w:t>
             </w:r>
           </w:p>
         </w:tc>
@@ -1084,7 +1084,7 @@
                 <w:sz w:val="28"/>
                 <w:szCs w:val="28"/>
               </w:rPr>
-              <w:t>08:10</w:t>
+              <w:t>08:45</w:t>
             </w:r>
           </w:p>
         </w:tc>
@@ -1135,6 +1135,14 @@
                 <w:sz w:val="28"/>
                 <w:szCs w:val="28"/>
               </w:rPr>
+              <w:t>via NQO</w:t>
+            </w:r>
+            <w:r>
+              <w:rPr>
+                <w:rFonts w:ascii="Calibri" w:eastAsia="Calibri" w:hAnsi="Calibri" w:cs="Calibri"/>
+                <w:sz w:val="28"/>
+                <w:szCs w:val="28"/>
+              </w:rPr>
               <w:t xml:space="preserve"> </w:t>
             </w:r>
           </w:p>
@@ -1240,7 +1248,7 @@
                 <w:sz w:val="28"/>
                 <w:szCs w:val="28"/>
               </w:rPr>
-              <w:t>05</w:t>
+              <w:t>BAY 06</w:t>
             </w:r>
           </w:p>
         </w:tc>
@@ -1350,15 +1358,7 @@
                 <w:sz w:val="28"/>
                 <w:szCs w:val="28"/>
               </w:rPr>
-              <w:t>08:1</w:t>
-            </w:r>
-            <w:r>
-              <w:rPr>
-                <w:rFonts w:ascii="Calibri" w:eastAsia="Calibri" w:hAnsi="Calibri" w:cs="Calibri"/>
-                <w:sz w:val="28"/>
-                <w:szCs w:val="28"/>
-              </w:rPr>
-              <w:t>5</w:t>
+              <w:t>09:00</w:t>
             </w:r>
           </w:p>
         </w:tc>
@@ -1395,6 +1395,22 @@
               </w:rPr>
               <w:t>NF (D)</w:t>
             </w:r>
+            <w:r>
+              <w:rPr>
+                <w:rFonts w:ascii="Calibri" w:eastAsia="Calibri" w:hAnsi="Calibri" w:cs="Calibri"/>
+                <w:sz w:val="28"/>
+                <w:szCs w:val="28"/>
+              </w:rPr>
+              <w:t xml:space="preserve"> </w:t>
+            </w:r>
+            <w:r>
+              <w:rPr>
+                <w:rFonts w:ascii="Calibri" w:eastAsia="Calibri" w:hAnsi="Calibri" w:cs="Calibri"/>
+                <w:sz w:val="28"/>
+                <w:szCs w:val="28"/>
+              </w:rPr>
+              <w:t>via NQO</w:t>
+            </w:r>
           </w:p>
         </w:tc>
         <w:tc>
@@ -1498,7 +1514,7 @@
                 <w:sz w:val="28"/>
                 <w:szCs w:val="28"/>
               </w:rPr>
-              <w:t>06</w:t>
+              <w:t>BAY 07</w:t>
             </w:r>
           </w:p>
         </w:tc>
@@ -3534,7 +3550,6 @@
             <w:r>
               <w:rPr>
                 <w:rFonts w:ascii="Calibri" w:eastAsia="Calibri" w:hAnsi="Calibri" w:cs="Calibri"/>
-                <w:b/>
                 <w:sz w:val="28"/>
                 <w:szCs w:val="28"/>
               </w:rPr>
@@ -3770,7 +3785,6 @@
             <w:r>
               <w:rPr>
                 <w:rFonts w:ascii="Calibri" w:eastAsia="Calibri" w:hAnsi="Calibri" w:cs="Calibri"/>
-                <w:b/>
                 <w:sz w:val="28"/>
                 <w:szCs w:val="28"/>
               </w:rPr>
@@ -4251,7 +4265,7 @@
                 <w:sz w:val="28"/>
                 <w:szCs w:val="28"/>
               </w:rPr>
-              <w:t>09:15</w:t>
+              <w:t>09:00</w:t>
             </w:r>
           </w:p>
         </w:tc>
@@ -4286,7 +4300,15 @@
                 <w:sz w:val="28"/>
                 <w:szCs w:val="28"/>
               </w:rPr>
-              <w:t>B193</w:t>
+              <w:t>VIP STBY/</w:t>
+            </w:r>
+            <w:r>
+              <w:rPr>
+                <w:rFonts w:ascii="Calibri" w:eastAsia="Calibri" w:hAnsi="Calibri" w:cs="Calibri"/>
+                <w:sz w:val="28"/>
+                <w:szCs w:val="28"/>
+              </w:rPr>
+              <w:t>MNW</w:t>
             </w:r>
           </w:p>
         </w:tc>
@@ -4315,6 +4337,14 @@
                 <w:szCs w:val="28"/>
               </w:rPr>
             </w:pPr>
+            <w:r>
+              <w:rPr>
+                <w:rFonts w:ascii="Calibri" w:eastAsia="Calibri" w:hAnsi="Calibri" w:cs="Calibri"/>
+                <w:sz w:val="28"/>
+                <w:szCs w:val="28"/>
+              </w:rPr>
+              <w:t>BAY 09</w:t>
+            </w:r>
           </w:p>
         </w:tc>
         <w:tc>
@@ -4342,6 +4372,14 @@
                 <w:szCs w:val="28"/>
               </w:rPr>
             </w:pPr>
+            <w:r>
+              <w:rPr>
+                <w:rFonts w:ascii="Calibri" w:eastAsia="Calibri" w:hAnsi="Calibri" w:cs="Calibri"/>
+                <w:sz w:val="28"/>
+                <w:szCs w:val="28"/>
+              </w:rPr>
+              <w:t>HLV</w:t>
+            </w:r>
           </w:p>
         </w:tc>
         <w:tc>
@@ -4742,7 +4780,7 @@
                 <w:sz w:val="28"/>
                 <w:szCs w:val="28"/>
               </w:rPr>
-              <w:t>MNW</w:t>
+              <w:t>WIN</w:t>
             </w:r>
           </w:p>
         </w:tc>
@@ -4798,6 +4836,16 @@
                 <w:szCs w:val="28"/>
               </w:rPr>
             </w:pPr>
+            <w:r>
+              <w:rPr>
+                <w:rFonts w:ascii="Calibri" w:eastAsia="Calibri" w:hAnsi="Calibri" w:cs="Calibri"/>
+                <w:sz w:val="28"/>
+                <w:szCs w:val="28"/>
+              </w:rPr>
+              <w:t>HLV</w:t>
+            </w:r>
+            <w:bookmarkStart w:id="0" w:name="_GoBack"/>
+            <w:bookmarkEnd w:id="0"/>
           </w:p>
         </w:tc>
         <w:tc>
@@ -4958,19 +5006,17 @@
               <w:jc w:val="center"/>
               <w:rPr>
                 <w:rFonts w:ascii="Calibri" w:eastAsia="Calibri" w:hAnsi="Calibri" w:cs="Calibri"/>
-                <w:b/>
-                <w:sz w:val="28"/>
-                <w:szCs w:val="28"/>
-              </w:rPr>
-            </w:pPr>
-            <w:r>
-              <w:rPr>
-                <w:rFonts w:ascii="Calibri" w:eastAsia="Calibri" w:hAnsi="Calibri" w:cs="Calibri"/>
-                <w:b/>
-                <w:sz w:val="28"/>
-                <w:szCs w:val="28"/>
-              </w:rPr>
-              <w:t>NA</w:t>
+                <w:sz w:val="28"/>
+                <w:szCs w:val="28"/>
+              </w:rPr>
+            </w:pPr>
+            <w:r>
+              <w:rPr>
+                <w:rFonts w:ascii="Calibri" w:eastAsia="Calibri" w:hAnsi="Calibri" w:cs="Calibri"/>
+                <w:sz w:val="28"/>
+                <w:szCs w:val="28"/>
+              </w:rPr>
+              <w:t>HRA</w:t>
             </w:r>
           </w:p>
         </w:tc>
@@ -5253,7 +5299,7 @@
                 <w:sz w:val="28"/>
                 <w:szCs w:val="28"/>
               </w:rPr>
-              <w:t>SCA</w:t>
+              <w:t>ICW</w:t>
             </w:r>
           </w:p>
         </w:tc>
@@ -5445,7 +5491,7 @@
                 <w:sz w:val="28"/>
                 <w:szCs w:val="28"/>
               </w:rPr>
-              <w:t>09:20</w:t>
+              <w:t>08:45</w:t>
             </w:r>
           </w:p>
         </w:tc>
@@ -5480,7 +5526,7 @@
                 <w:sz w:val="28"/>
                 <w:szCs w:val="28"/>
               </w:rPr>
-              <w:t>SRAT+SGAV</w:t>
+              <w:t>GAURAV</w:t>
             </w:r>
           </w:p>
         </w:tc>
@@ -5707,7 +5753,7 @@
                 <w:sz w:val="28"/>
                 <w:szCs w:val="28"/>
               </w:rPr>
-              <w:t>NLM</w:t>
+              <w:t>HRA</w:t>
             </w:r>
           </w:p>
         </w:tc>
@@ -5934,7 +5980,7 @@
                 <w:sz w:val="28"/>
                 <w:szCs w:val="28"/>
               </w:rPr>
-              <w:t>BPA</w:t>
+              <w:t>ARMADA1</w:t>
             </w:r>
           </w:p>
         </w:tc>
@@ -6158,17 +6204,18 @@
               <w:jc w:val="center"/>
               <w:rPr>
                 <w:rFonts w:ascii="Calibri" w:eastAsia="Calibri" w:hAnsi="Calibri" w:cs="Calibri"/>
-                <w:sz w:val="28"/>
-                <w:szCs w:val="28"/>
-              </w:rPr>
-            </w:pPr>
-            <w:r>
-              <w:rPr>
-                <w:rFonts w:ascii="Calibri" w:eastAsia="Calibri" w:hAnsi="Calibri" w:cs="Calibri"/>
-                <w:sz w:val="28"/>
-                <w:szCs w:val="28"/>
-              </w:rPr>
-              <w:t>SSAK</w:t>
+                <w:b/>
+                <w:sz w:val="28"/>
+                <w:szCs w:val="28"/>
+              </w:rPr>
+            </w:pPr>
+            <w:r>
+              <w:rPr>
+                <w:rFonts w:ascii="Calibri" w:eastAsia="Calibri" w:hAnsi="Calibri" w:cs="Calibri"/>
+                <w:sz w:val="28"/>
+                <w:szCs w:val="28"/>
+              </w:rPr>
+              <w:t>BLQ2</w:t>
             </w:r>
           </w:p>
         </w:tc>
@@ -6394,7 +6441,7 @@
                 <w:sz w:val="28"/>
                 <w:szCs w:val="28"/>
               </w:rPr>
-              <w:t>DEFOS</w:t>
+              <w:t>SHQ</w:t>
             </w:r>
           </w:p>
         </w:tc>
@@ -6548,6 +6595,7 @@
           <w:sz w:val="28"/>
           <w:szCs w:val="28"/>
         </w:rPr>
+        <w:lastRenderedPageBreak/>
         <w:t xml:space="preserve">NOTE: </w:t>
       </w:r>
       <w:r>
@@ -6625,7 +6673,6 @@
           <w:sz w:val="28"/>
           <w:szCs w:val="28"/>
         </w:rPr>
-        <w:lastRenderedPageBreak/>
         <w:t>Also please check Crew boat schedule for Contract crew.</w:t>
       </w:r>
     </w:p>
@@ -7245,7 +7292,7 @@
                 <w:sz w:val="28"/>
                 <w:szCs w:val="28"/>
               </w:rPr>
-              <w:t>SUDA</w:t>
+              <w:t>UDAY</w:t>
             </w:r>
           </w:p>
         </w:tc>
@@ -7475,7 +7522,7 @@
                 <w:sz w:val="28"/>
                 <w:szCs w:val="28"/>
               </w:rPr>
-              <w:t>CHRU</w:t>
+              <w:t>TCPP</w:t>
             </w:r>
           </w:p>
         </w:tc>
@@ -7706,7 +7753,7 @@
                 <w:sz w:val="28"/>
                 <w:szCs w:val="28"/>
               </w:rPr>
-              <w:t>JIND</w:t>
+              <w:t>L/O</w:t>
             </w:r>
           </w:p>
         </w:tc>
@@ -7931,16 +7978,6 @@
                 <w:szCs w:val="28"/>
               </w:rPr>
             </w:pPr>
-            <w:r>
-              <w:rPr>
-                <w:rFonts w:ascii="Calibri" w:eastAsia="Calibri" w:hAnsi="Calibri" w:cs="Calibri"/>
-                <w:sz w:val="28"/>
-                <w:szCs w:val="28"/>
-              </w:rPr>
-              <w:t>SUDA</w:t>
-            </w:r>
-            <w:bookmarkStart w:id="0" w:name="_GoBack"/>
-            <w:bookmarkEnd w:id="0"/>
           </w:p>
         </w:tc>
         <w:tc>
@@ -8208,10 +8245,10 @@
         <w:szCs w:val="28"/>
       </w:rPr>
       <w:object w:dxaOrig="1188" w:dyaOrig="900">
-        <v:rect id="_x0000_i1025" style="width:54.75pt;height:36.75pt" o:ole="" o:preferrelative="t" stroked="f">
+        <v:rect id="_x0000_i1025" style="width:54.5pt;height:37.05pt" o:ole="" o:preferrelative="t" stroked="f">
           <v:imagedata r:id="rId1" o:title=""/>
         </v:rect>
-        <o:OLEObject Type="Embed" ProgID="StaticMetafile" ShapeID="_x0000_i1025" DrawAspect="Content" ObjectID="_1854625113" r:id="rId2"/>
+        <o:OLEObject Type="Embed" ProgID="StaticMetafile" ShapeID="_x0000_i1025" DrawAspect="Content" ObjectID="_1854710804" r:id="rId2"/>
       </w:object>
     </w:r>
     <w:r>
@@ -8259,7 +8296,7 @@
         <w:sz w:val="28"/>
         <w:szCs w:val="28"/>
       </w:rPr>
-      <w:t>8</w:t>
+      <w:t>9</w:t>
     </w:r>
     <w:r>
       <w:rPr>
@@ -8289,7 +8326,17 @@
         <w:sz w:val="28"/>
         <w:szCs w:val="28"/>
       </w:rPr>
-      <w:t>WEDNES</w:t>
+      <w:t>THUR</w:t>
+    </w:r>
+    <w:r>
+      <w:rPr>
+        <w:rFonts w:cs="Times New Roman"/>
+        <w:b/>
+        <w:color w:val="000000" w:themeColor="text1"/>
+        <w:sz w:val="28"/>
+        <w:szCs w:val="28"/>
+      </w:rPr>
+      <w:t>S</w:t>
     </w:r>
     <w:r>
       <w:rPr>

</xml_diff>

<commit_message>
Sync - 2026-10-28 17:39
</commit_message>
<xml_diff>
--- a/files/Daily_Helicopter_Schedule.docx
+++ b/files/Daily_Helicopter_Schedule.docx
@@ -1119,23 +1119,15 @@
                 <w:sz w:val="28"/>
                 <w:szCs w:val="28"/>
               </w:rPr>
-              <w:t>SF (D)</w:t>
-            </w:r>
-            <w:r>
-              <w:rPr>
-                <w:rFonts w:ascii="Calibri" w:eastAsia="Calibri" w:hAnsi="Calibri" w:cs="Calibri"/>
-                <w:sz w:val="28"/>
-                <w:szCs w:val="28"/>
-              </w:rPr>
-              <w:t xml:space="preserve"> </w:t>
-            </w:r>
-            <w:r>
-              <w:rPr>
-                <w:rFonts w:ascii="Calibri" w:eastAsia="Calibri" w:hAnsi="Calibri" w:cs="Calibri"/>
-                <w:sz w:val="28"/>
-                <w:szCs w:val="28"/>
-              </w:rPr>
-              <w:t>via NQO</w:t>
+              <w:t xml:space="preserve">VIP 1  </w:t>
+            </w:r>
+            <w:r>
+              <w:rPr>
+                <w:rFonts w:ascii="Calibri" w:eastAsia="Calibri" w:hAnsi="Calibri" w:cs="Calibri"/>
+                <w:sz w:val="28"/>
+                <w:szCs w:val="28"/>
+              </w:rPr>
+              <w:t xml:space="preserve"> NQO</w:t>
             </w:r>
             <w:r>
               <w:rPr>
@@ -1393,23 +1385,17 @@
                 <w:sz w:val="28"/>
                 <w:szCs w:val="28"/>
               </w:rPr>
-              <w:t>NF (D)</w:t>
-            </w:r>
-            <w:r>
-              <w:rPr>
-                <w:rFonts w:ascii="Calibri" w:eastAsia="Calibri" w:hAnsi="Calibri" w:cs="Calibri"/>
-                <w:sz w:val="28"/>
-                <w:szCs w:val="28"/>
-              </w:rPr>
-              <w:t xml:space="preserve"> </w:t>
-            </w:r>
-            <w:r>
-              <w:rPr>
-                <w:rFonts w:ascii="Calibri" w:eastAsia="Calibri" w:hAnsi="Calibri" w:cs="Calibri"/>
-                <w:sz w:val="28"/>
-                <w:szCs w:val="28"/>
-              </w:rPr>
-              <w:t>via NQO</w:t>
+              <w:t xml:space="preserve">VIP 2  </w:t>
+            </w:r>
+            <w:bookmarkStart w:id="0" w:name="_GoBack"/>
+            <w:bookmarkEnd w:id="0"/>
+            <w:r>
+              <w:rPr>
+                <w:rFonts w:ascii="Calibri" w:eastAsia="Calibri" w:hAnsi="Calibri" w:cs="Calibri"/>
+                <w:sz w:val="28"/>
+                <w:szCs w:val="28"/>
+              </w:rPr>
+              <w:t xml:space="preserve"> NQO</w:t>
             </w:r>
           </w:p>
         </w:tc>
@@ -4844,8 +4830,6 @@
               </w:rPr>
               <w:t>HLV</w:t>
             </w:r>
-            <w:bookmarkStart w:id="0" w:name="_GoBack"/>
-            <w:bookmarkEnd w:id="0"/>
           </w:p>
         </w:tc>
         <w:tc>
@@ -8245,10 +8229,10 @@
         <w:szCs w:val="28"/>
       </w:rPr>
       <w:object w:dxaOrig="1188" w:dyaOrig="900">
-        <v:rect id="_x0000_i1025" style="width:54.5pt;height:37.05pt" o:ole="" o:preferrelative="t" stroked="f">
+        <v:rect id="_x0000_i1025" style="width:54.55pt;height:37.15pt" o:ole="" o:preferrelative="t" stroked="f">
           <v:imagedata r:id="rId1" o:title=""/>
         </v:rect>
-        <o:OLEObject Type="Embed" ProgID="StaticMetafile" ShapeID="_x0000_i1025" DrawAspect="Content" ObjectID="_1854710804" r:id="rId2"/>
+        <o:OLEObject Type="Embed" ProgID="StaticMetafile" ShapeID="_x0000_i1025" DrawAspect="Content" ObjectID="_1854712642" r:id="rId2"/>
       </w:object>
     </w:r>
     <w:r>

</xml_diff>

<commit_message>
Sync - 2026-10-28 18:09
</commit_message>
<xml_diff>
--- a/files/Daily_Helicopter_Schedule.docx
+++ b/files/Daily_Helicopter_Schedule.docx
@@ -1387,8 +1387,6 @@
               </w:rPr>
               <w:t xml:space="preserve">VIP 2  </w:t>
             </w:r>
-            <w:bookmarkStart w:id="0" w:name="_GoBack"/>
-            <w:bookmarkEnd w:id="0"/>
             <w:r>
               <w:rPr>
                 <w:rFonts w:ascii="Calibri" w:eastAsia="Calibri" w:hAnsi="Calibri" w:cs="Calibri"/>
@@ -4766,7 +4764,7 @@
                 <w:sz w:val="28"/>
                 <w:szCs w:val="28"/>
               </w:rPr>
-              <w:t>WIN</w:t>
+              <w:t>TBD</w:t>
             </w:r>
           </w:p>
         </w:tc>
@@ -5000,8 +4998,10 @@
                 <w:sz w:val="28"/>
                 <w:szCs w:val="28"/>
               </w:rPr>
-              <w:t>HRA</w:t>
-            </w:r>
+              <w:t>NA</w:t>
+            </w:r>
+            <w:bookmarkStart w:id="0" w:name="_GoBack"/>
+            <w:bookmarkEnd w:id="0"/>
           </w:p>
         </w:tc>
         <w:tc>
@@ -5964,7 +5964,7 @@
                 <w:sz w:val="28"/>
                 <w:szCs w:val="28"/>
               </w:rPr>
-              <w:t>ARMADA1</w:t>
+              <w:t>WIN</w:t>
             </w:r>
           </w:p>
         </w:tc>
@@ -8229,10 +8229,10 @@
         <w:szCs w:val="28"/>
       </w:rPr>
       <w:object w:dxaOrig="1188" w:dyaOrig="900">
-        <v:rect id="_x0000_i1025" style="width:54.55pt;height:37.15pt" o:ole="" o:preferrelative="t" stroked="f">
+        <v:rect id="_x0000_i1025" style="width:54.35pt;height:37.4pt" o:ole="" o:preferrelative="t" stroked="f">
           <v:imagedata r:id="rId1" o:title=""/>
         </v:rect>
-        <o:OLEObject Type="Embed" ProgID="StaticMetafile" ShapeID="_x0000_i1025" DrawAspect="Content" ObjectID="_1854712642" r:id="rId2"/>
+        <o:OLEObject Type="Embed" ProgID="StaticMetafile" ShapeID="_x0000_i1025" DrawAspect="Content" ObjectID="_1854715543" r:id="rId2"/>
       </w:object>
     </w:r>
     <w:r>

</xml_diff>

<commit_message>
Sync - 2026-10-29 16:02
</commit_message>
<xml_diff>
--- a/files/Daily_Helicopter_Schedule.docx
+++ b/files/Daily_Helicopter_Schedule.docx
@@ -724,7 +724,7 @@
                 <w:sz w:val="28"/>
                 <w:szCs w:val="28"/>
               </w:rPr>
-              <w:t>05</w:t>
+              <w:t>08</w:t>
             </w:r>
           </w:p>
         </w:tc>
@@ -1119,23 +1119,7 @@
                 <w:sz w:val="28"/>
                 <w:szCs w:val="28"/>
               </w:rPr>
-              <w:t xml:space="preserve">VIP 1  </w:t>
-            </w:r>
-            <w:r>
-              <w:rPr>
-                <w:rFonts w:ascii="Calibri" w:eastAsia="Calibri" w:hAnsi="Calibri" w:cs="Calibri"/>
-                <w:sz w:val="28"/>
-                <w:szCs w:val="28"/>
-              </w:rPr>
-              <w:t xml:space="preserve"> NQO</w:t>
-            </w:r>
-            <w:r>
-              <w:rPr>
-                <w:rFonts w:ascii="Calibri" w:eastAsia="Calibri" w:hAnsi="Calibri" w:cs="Calibri"/>
-                <w:sz w:val="28"/>
-                <w:szCs w:val="28"/>
-              </w:rPr>
-              <w:t xml:space="preserve"> </w:t>
+              <w:t>SF[D]</w:t>
             </w:r>
           </w:p>
         </w:tc>
@@ -1240,7 +1224,7 @@
                 <w:sz w:val="28"/>
                 <w:szCs w:val="28"/>
               </w:rPr>
-              <w:t>BAY 06</w:t>
+              <w:t>05</w:t>
             </w:r>
           </w:p>
         </w:tc>
@@ -1385,15 +1369,7 @@
                 <w:sz w:val="28"/>
                 <w:szCs w:val="28"/>
               </w:rPr>
-              <w:t xml:space="preserve">VIP 2  </w:t>
-            </w:r>
-            <w:r>
-              <w:rPr>
-                <w:rFonts w:ascii="Calibri" w:eastAsia="Calibri" w:hAnsi="Calibri" w:cs="Calibri"/>
-                <w:sz w:val="28"/>
-                <w:szCs w:val="28"/>
-              </w:rPr>
-              <w:t xml:space="preserve"> NQO</w:t>
+              <w:t>NF[D]</w:t>
             </w:r>
           </w:p>
         </w:tc>
@@ -1463,7 +1439,7 @@
                 <w:sz w:val="28"/>
                 <w:szCs w:val="28"/>
               </w:rPr>
-              <w:t>RRI</w:t>
+              <w:t>GVT</w:t>
             </w:r>
           </w:p>
         </w:tc>
@@ -1498,7 +1474,7 @@
                 <w:sz w:val="28"/>
                 <w:szCs w:val="28"/>
               </w:rPr>
-              <w:t>BAY 07</w:t>
+              <w:t>07</w:t>
             </w:r>
           </w:p>
         </w:tc>
@@ -1732,7 +1708,7 @@
                 <w:sz w:val="28"/>
                 <w:szCs w:val="28"/>
               </w:rPr>
-              <w:t>NA</w:t>
+              <w:t>GVHL 412</w:t>
             </w:r>
           </w:p>
         </w:tc>
@@ -1767,7 +1743,7 @@
                 <w:sz w:val="28"/>
                 <w:szCs w:val="28"/>
               </w:rPr>
-              <w:t>NA</w:t>
+              <w:t>RRJ</w:t>
             </w:r>
           </w:p>
         </w:tc>
@@ -1802,7 +1778,7 @@
                 <w:sz w:val="28"/>
                 <w:szCs w:val="28"/>
               </w:rPr>
-              <w:t>00</w:t>
+              <w:t>07</w:t>
             </w:r>
           </w:p>
         </w:tc>
@@ -2539,7 +2515,7 @@
                 <w:sz w:val="28"/>
                 <w:szCs w:val="28"/>
               </w:rPr>
-              <w:t>RRJ</w:t>
+              <w:t>RRI</w:t>
             </w:r>
           </w:p>
         </w:tc>
@@ -3073,13 +3049,15 @@
               <w:jc w:val="center"/>
               <w:rPr>
                 <w:rFonts w:ascii="Calibri" w:eastAsia="Calibri" w:hAnsi="Calibri" w:cs="Calibri"/>
-                <w:sz w:val="28"/>
-                <w:szCs w:val="28"/>
-              </w:rPr>
-            </w:pPr>
-            <w:r>
-              <w:rPr>
-                <w:rFonts w:ascii="Calibri" w:eastAsia="Calibri" w:hAnsi="Calibri" w:cs="Calibri"/>
+                <w:b/>
+                <w:sz w:val="28"/>
+                <w:szCs w:val="28"/>
+              </w:rPr>
+            </w:pPr>
+            <w:r>
+              <w:rPr>
+                <w:rFonts w:ascii="Calibri" w:eastAsia="Calibri" w:hAnsi="Calibri" w:cs="Calibri"/>
+                <w:b/>
                 <w:sz w:val="28"/>
                 <w:szCs w:val="28"/>
               </w:rPr>
@@ -3140,6 +3118,14 @@
                 <w:szCs w:val="28"/>
               </w:rPr>
             </w:pPr>
+            <w:r>
+              <w:rPr>
+                <w:rFonts w:ascii="Calibri" w:eastAsia="Calibri" w:hAnsi="Calibri" w:cs="Calibri"/>
+                <w:sz w:val="28"/>
+                <w:szCs w:val="28"/>
+              </w:rPr>
+              <w:t>NA</w:t>
+            </w:r>
           </w:p>
         </w:tc>
         <w:tc>
@@ -3314,7 +3300,7 @@
                 <w:sz w:val="28"/>
                 <w:szCs w:val="28"/>
               </w:rPr>
-              <w:t>NA</w:t>
+              <w:t>BLQ2</w:t>
             </w:r>
           </w:p>
         </w:tc>
@@ -3339,7 +3325,6 @@
               <w:jc w:val="center"/>
               <w:rPr>
                 <w:rFonts w:ascii="Calibri" w:eastAsia="Calibri" w:hAnsi="Calibri" w:cs="Calibri"/>
-                <w:b/>
                 <w:sz w:val="28"/>
                 <w:szCs w:val="28"/>
               </w:rPr>
@@ -3371,6 +3356,14 @@
                 <w:szCs w:val="28"/>
               </w:rPr>
             </w:pPr>
+            <w:r>
+              <w:rPr>
+                <w:rFonts w:ascii="Calibri" w:eastAsia="Calibri" w:hAnsi="Calibri" w:cs="Calibri"/>
+                <w:sz w:val="28"/>
+                <w:szCs w:val="28"/>
+              </w:rPr>
+              <w:t>RRI</w:t>
+            </w:r>
           </w:p>
         </w:tc>
         <w:tc>
@@ -3527,13 +3520,15 @@
               <w:jc w:val="center"/>
               <w:rPr>
                 <w:rFonts w:ascii="Calibri" w:eastAsia="Calibri" w:hAnsi="Calibri" w:cs="Calibri"/>
-                <w:sz w:val="28"/>
-                <w:szCs w:val="28"/>
-              </w:rPr>
-            </w:pPr>
-            <w:r>
-              <w:rPr>
-                <w:rFonts w:ascii="Calibri" w:eastAsia="Calibri" w:hAnsi="Calibri" w:cs="Calibri"/>
+                <w:b/>
+                <w:sz w:val="28"/>
+                <w:szCs w:val="28"/>
+              </w:rPr>
+            </w:pPr>
+            <w:r>
+              <w:rPr>
+                <w:rFonts w:ascii="Calibri" w:eastAsia="Calibri" w:hAnsi="Calibri" w:cs="Calibri"/>
+                <w:b/>
                 <w:sz w:val="28"/>
                 <w:szCs w:val="28"/>
               </w:rPr>
@@ -3594,6 +3589,14 @@
                 <w:szCs w:val="28"/>
               </w:rPr>
             </w:pPr>
+            <w:r>
+              <w:rPr>
+                <w:rFonts w:ascii="Calibri" w:eastAsia="Calibri" w:hAnsi="Calibri" w:cs="Calibri"/>
+                <w:sz w:val="28"/>
+                <w:szCs w:val="28"/>
+              </w:rPr>
+              <w:t>NA</w:t>
+            </w:r>
           </w:p>
         </w:tc>
         <w:tc>
@@ -3762,13 +3765,15 @@
               <w:jc w:val="center"/>
               <w:rPr>
                 <w:rFonts w:ascii="Calibri" w:eastAsia="Calibri" w:hAnsi="Calibri" w:cs="Calibri"/>
-                <w:sz w:val="28"/>
-                <w:szCs w:val="28"/>
-              </w:rPr>
-            </w:pPr>
-            <w:r>
-              <w:rPr>
-                <w:rFonts w:ascii="Calibri" w:eastAsia="Calibri" w:hAnsi="Calibri" w:cs="Calibri"/>
+                <w:b/>
+                <w:sz w:val="28"/>
+                <w:szCs w:val="28"/>
+              </w:rPr>
+            </w:pPr>
+            <w:r>
+              <w:rPr>
+                <w:rFonts w:ascii="Calibri" w:eastAsia="Calibri" w:hAnsi="Calibri" w:cs="Calibri"/>
+                <w:b/>
                 <w:sz w:val="28"/>
                 <w:szCs w:val="28"/>
               </w:rPr>
@@ -3829,6 +3834,14 @@
                 <w:szCs w:val="28"/>
               </w:rPr>
             </w:pPr>
+            <w:r>
+              <w:rPr>
+                <w:rFonts w:ascii="Calibri" w:eastAsia="Calibri" w:hAnsi="Calibri" w:cs="Calibri"/>
+                <w:sz w:val="28"/>
+                <w:szCs w:val="28"/>
+              </w:rPr>
+              <w:t>NA</w:t>
+            </w:r>
           </w:p>
         </w:tc>
         <w:tc>
@@ -4249,8 +4262,10 @@
                 <w:sz w:val="28"/>
                 <w:szCs w:val="28"/>
               </w:rPr>
-              <w:t>09:00</w:t>
-            </w:r>
+              <w:t>09:15</w:t>
+            </w:r>
+            <w:bookmarkStart w:id="0" w:name="_GoBack"/>
+            <w:bookmarkEnd w:id="0"/>
           </w:p>
         </w:tc>
         <w:tc>
@@ -4284,15 +4299,7 @@
                 <w:sz w:val="28"/>
                 <w:szCs w:val="28"/>
               </w:rPr>
-              <w:t>VIP STBY/</w:t>
-            </w:r>
-            <w:r>
-              <w:rPr>
-                <w:rFonts w:ascii="Calibri" w:eastAsia="Calibri" w:hAnsi="Calibri" w:cs="Calibri"/>
-                <w:sz w:val="28"/>
-                <w:szCs w:val="28"/>
-              </w:rPr>
-              <w:t>MNW</w:t>
+              <w:t>B193</w:t>
             </w:r>
           </w:p>
         </w:tc>
@@ -4321,14 +4328,6 @@
                 <w:szCs w:val="28"/>
               </w:rPr>
             </w:pPr>
-            <w:r>
-              <w:rPr>
-                <w:rFonts w:ascii="Calibri" w:eastAsia="Calibri" w:hAnsi="Calibri" w:cs="Calibri"/>
-                <w:sz w:val="28"/>
-                <w:szCs w:val="28"/>
-              </w:rPr>
-              <w:t>BAY 09</w:t>
-            </w:r>
           </w:p>
         </w:tc>
         <w:tc>
@@ -4764,7 +4763,7 @@
                 <w:sz w:val="28"/>
                 <w:szCs w:val="28"/>
               </w:rPr>
-              <w:t>TBD</w:t>
+              <w:t>JYOTI</w:t>
             </w:r>
           </w:p>
         </w:tc>
@@ -4988,20 +4987,20 @@
               <w:jc w:val="center"/>
               <w:rPr>
                 <w:rFonts w:ascii="Calibri" w:eastAsia="Calibri" w:hAnsi="Calibri" w:cs="Calibri"/>
-                <w:sz w:val="28"/>
-                <w:szCs w:val="28"/>
-              </w:rPr>
-            </w:pPr>
-            <w:r>
-              <w:rPr>
-                <w:rFonts w:ascii="Calibri" w:eastAsia="Calibri" w:hAnsi="Calibri" w:cs="Calibri"/>
+                <w:b/>
+                <w:sz w:val="28"/>
+                <w:szCs w:val="28"/>
+              </w:rPr>
+            </w:pPr>
+            <w:r>
+              <w:rPr>
+                <w:rFonts w:ascii="Calibri" w:eastAsia="Calibri" w:hAnsi="Calibri" w:cs="Calibri"/>
+                <w:b/>
                 <w:sz w:val="28"/>
                 <w:szCs w:val="28"/>
               </w:rPr>
               <w:t>NA</w:t>
             </w:r>
-            <w:bookmarkStart w:id="0" w:name="_GoBack"/>
-            <w:bookmarkEnd w:id="0"/>
           </w:p>
         </w:tc>
         <w:tc>
@@ -5510,7 +5509,15 @@
                 <w:sz w:val="28"/>
                 <w:szCs w:val="28"/>
               </w:rPr>
-              <w:t>GAURAV</w:t>
+              <w:t xml:space="preserve"> </w:t>
+            </w:r>
+            <w:r>
+              <w:rPr>
+                <w:rFonts w:ascii="Calibri" w:eastAsia="Calibri" w:hAnsi="Calibri" w:cs="Calibri"/>
+                <w:sz w:val="28"/>
+                <w:szCs w:val="28"/>
+              </w:rPr>
+              <w:t>RATNA/GRV</w:t>
             </w:r>
           </w:p>
         </w:tc>
@@ -5737,7 +5744,7 @@
                 <w:sz w:val="28"/>
                 <w:szCs w:val="28"/>
               </w:rPr>
-              <w:t>HRA</w:t>
+              <w:t>SLQ</w:t>
             </w:r>
           </w:p>
         </w:tc>
@@ -5964,7 +5971,15 @@
                 <w:sz w:val="28"/>
                 <w:szCs w:val="28"/>
               </w:rPr>
-              <w:t>WIN</w:t>
+              <w:t xml:space="preserve"> </w:t>
+            </w:r>
+            <w:r>
+              <w:rPr>
+                <w:rFonts w:ascii="Calibri" w:eastAsia="Calibri" w:hAnsi="Calibri" w:cs="Calibri"/>
+                <w:sz w:val="28"/>
+                <w:szCs w:val="28"/>
+              </w:rPr>
+              <w:t>SHQ</w:t>
             </w:r>
           </w:p>
         </w:tc>
@@ -6199,7 +6214,7 @@
                 <w:sz w:val="28"/>
                 <w:szCs w:val="28"/>
               </w:rPr>
-              <w:t>BLQ2</w:t>
+              <w:t>MNW</w:t>
             </w:r>
           </w:p>
         </w:tc>
@@ -6425,7 +6440,7 @@
                 <w:sz w:val="28"/>
                 <w:szCs w:val="28"/>
               </w:rPr>
-              <w:t>SHQ</w:t>
+              <w:t>NQO</w:t>
             </w:r>
           </w:p>
         </w:tc>
@@ -7337,7 +7352,7 @@
                 <w:sz w:val="28"/>
                 <w:szCs w:val="28"/>
               </w:rPr>
-              <w:t>GVT</w:t>
+              <w:t>GVX</w:t>
             </w:r>
           </w:p>
         </w:tc>
@@ -7506,7 +7521,7 @@
                 <w:sz w:val="28"/>
                 <w:szCs w:val="28"/>
               </w:rPr>
-              <w:t>TCPP</w:t>
+              <w:t>RATNA</w:t>
             </w:r>
           </w:p>
         </w:tc>
@@ -7568,7 +7583,7 @@
                 <w:sz w:val="28"/>
                 <w:szCs w:val="28"/>
               </w:rPr>
-              <w:t>GVT</w:t>
+              <w:t>GVX</w:t>
             </w:r>
           </w:p>
         </w:tc>
@@ -7799,7 +7814,7 @@
                 <w:sz w:val="28"/>
                 <w:szCs w:val="28"/>
               </w:rPr>
-              <w:t>GVT</w:t>
+              <w:t>GVX</w:t>
             </w:r>
           </w:p>
         </w:tc>
@@ -8016,14 +8031,6 @@
                 <w:szCs w:val="28"/>
               </w:rPr>
             </w:pPr>
-            <w:r>
-              <w:rPr>
-                <w:rFonts w:ascii="Calibri" w:eastAsia="Calibri" w:hAnsi="Calibri" w:cs="Calibri"/>
-                <w:sz w:val="28"/>
-                <w:szCs w:val="28"/>
-              </w:rPr>
-              <w:t>GVT</w:t>
-            </w:r>
           </w:p>
         </w:tc>
         <w:tc>
@@ -8229,10 +8236,10 @@
         <w:szCs w:val="28"/>
       </w:rPr>
       <w:object w:dxaOrig="1188" w:dyaOrig="900">
-        <v:rect id="_x0000_i1025" style="width:54.35pt;height:37.4pt" o:ole="" o:preferrelative="t" stroked="f">
+        <v:rect id="_x0000_i1025" style="width:54.65pt;height:37.3pt" o:ole="" o:preferrelative="t" stroked="f">
           <v:imagedata r:id="rId1" o:title=""/>
         </v:rect>
-        <o:OLEObject Type="Embed" ProgID="StaticMetafile" ShapeID="_x0000_i1025" DrawAspect="Content" ObjectID="_1854715543" r:id="rId2"/>
+        <o:OLEObject Type="Embed" ProgID="StaticMetafile" ShapeID="_x0000_i1025" DrawAspect="Content" ObjectID="_1854794367" r:id="rId2"/>
       </w:object>
     </w:r>
     <w:r>
@@ -8270,17 +8277,7 @@
         <w:sz w:val="28"/>
         <w:szCs w:val="28"/>
       </w:rPr>
-      <w:t>2</w:t>
-    </w:r>
-    <w:r>
-      <w:rPr>
-        <w:rFonts w:cs="Times New Roman"/>
-        <w:b/>
-        <w:color w:val="000000" w:themeColor="text1"/>
-        <w:sz w:val="28"/>
-        <w:szCs w:val="28"/>
-      </w:rPr>
-      <w:t>9</w:t>
+      <w:t>30</w:t>
     </w:r>
     <w:r>
       <w:rPr>
@@ -8310,17 +8307,7 @@
         <w:sz w:val="28"/>
         <w:szCs w:val="28"/>
       </w:rPr>
-      <w:t>THUR</w:t>
-    </w:r>
-    <w:r>
-      <w:rPr>
-        <w:rFonts w:cs="Times New Roman"/>
-        <w:b/>
-        <w:color w:val="000000" w:themeColor="text1"/>
-        <w:sz w:val="28"/>
-        <w:szCs w:val="28"/>
-      </w:rPr>
-      <w:t>S</w:t>
+      <w:t>FRI</w:t>
     </w:r>
     <w:r>
       <w:rPr>

</xml_diff>

<commit_message>
Sync - 2026-10-30 17:35
</commit_message>
<xml_diff>
--- a/files/Daily_Helicopter_Schedule.docx
+++ b/files/Daily_Helicopter_Schedule.docx
@@ -1084,7 +1084,7 @@
                 <w:sz w:val="28"/>
                 <w:szCs w:val="28"/>
               </w:rPr>
-              <w:t>08:45</w:t>
+              <w:t>08:10</w:t>
             </w:r>
           </w:p>
         </w:tc>
@@ -1119,7 +1119,7 @@
                 <w:sz w:val="28"/>
                 <w:szCs w:val="28"/>
               </w:rPr>
-              <w:t>SF[D]</w:t>
+              <w:t>SF (D)</w:t>
             </w:r>
           </w:p>
         </w:tc>
@@ -1334,8 +1334,10 @@
                 <w:sz w:val="28"/>
                 <w:szCs w:val="28"/>
               </w:rPr>
-              <w:t>09:00</w:t>
-            </w:r>
+              <w:t>08:15</w:t>
+            </w:r>
+            <w:bookmarkStart w:id="0" w:name="_GoBack"/>
+            <w:bookmarkEnd w:id="0"/>
           </w:p>
         </w:tc>
         <w:tc>
@@ -1369,7 +1371,31 @@
                 <w:sz w:val="28"/>
                 <w:szCs w:val="28"/>
               </w:rPr>
-              <w:t>NF[D]</w:t>
+              <w:t>NF</w:t>
+            </w:r>
+            <w:r>
+              <w:rPr>
+                <w:rFonts w:ascii="Calibri" w:eastAsia="Calibri" w:hAnsi="Calibri" w:cs="Calibri"/>
+                <w:sz w:val="28"/>
+                <w:szCs w:val="28"/>
+              </w:rPr>
+              <w:t xml:space="preserve"> (</w:t>
+            </w:r>
+            <w:r>
+              <w:rPr>
+                <w:rFonts w:ascii="Calibri" w:eastAsia="Calibri" w:hAnsi="Calibri" w:cs="Calibri"/>
+                <w:sz w:val="28"/>
+                <w:szCs w:val="28"/>
+              </w:rPr>
+              <w:t>D</w:t>
+            </w:r>
+            <w:r>
+              <w:rPr>
+                <w:rFonts w:ascii="Calibri" w:eastAsia="Calibri" w:hAnsi="Calibri" w:cs="Calibri"/>
+                <w:sz w:val="28"/>
+                <w:szCs w:val="28"/>
+              </w:rPr>
+              <w:t>)</w:t>
             </w:r>
           </w:p>
         </w:tc>
@@ -3300,7 +3326,7 @@
                 <w:sz w:val="28"/>
                 <w:szCs w:val="28"/>
               </w:rPr>
-              <w:t>BLQ2</w:t>
+              <w:t>TBD</w:t>
             </w:r>
           </w:p>
         </w:tc>
@@ -3362,7 +3388,7 @@
                 <w:sz w:val="28"/>
                 <w:szCs w:val="28"/>
               </w:rPr>
-              <w:t>RRI</w:t>
+              <w:t>RRJ</w:t>
             </w:r>
           </w:p>
         </w:tc>
@@ -4264,8 +4290,6 @@
               </w:rPr>
               <w:t>09:15</w:t>
             </w:r>
-            <w:bookmarkStart w:id="0" w:name="_GoBack"/>
-            <w:bookmarkEnd w:id="0"/>
           </w:p>
         </w:tc>
         <w:tc>
@@ -4299,7 +4323,7 @@
                 <w:sz w:val="28"/>
                 <w:szCs w:val="28"/>
               </w:rPr>
-              <w:t>B193</w:t>
+              <w:t>AS1</w:t>
             </w:r>
           </w:p>
         </w:tc>
@@ -4763,7 +4787,7 @@
                 <w:sz w:val="28"/>
                 <w:szCs w:val="28"/>
               </w:rPr>
-              <w:t>JYOTI</w:t>
+              <w:t>SGAV</w:t>
             </w:r>
           </w:p>
         </w:tc>
@@ -5282,7 +5306,7 @@
                 <w:sz w:val="28"/>
                 <w:szCs w:val="28"/>
               </w:rPr>
-              <w:t>ICW</w:t>
+              <w:t>VND2</w:t>
             </w:r>
           </w:p>
         </w:tc>
@@ -5509,15 +5533,7 @@
                 <w:sz w:val="28"/>
                 <w:szCs w:val="28"/>
               </w:rPr>
-              <w:t xml:space="preserve"> </w:t>
-            </w:r>
-            <w:r>
-              <w:rPr>
-                <w:rFonts w:ascii="Calibri" w:eastAsia="Calibri" w:hAnsi="Calibri" w:cs="Calibri"/>
-                <w:sz w:val="28"/>
-                <w:szCs w:val="28"/>
-              </w:rPr>
-              <w:t>RATNA/GRV</w:t>
+              <w:t>AS2</w:t>
             </w:r>
           </w:p>
         </w:tc>
@@ -5744,7 +5760,7 @@
                 <w:sz w:val="28"/>
                 <w:szCs w:val="28"/>
               </w:rPr>
-              <w:t>SLQ</w:t>
+              <w:t>SSAK</w:t>
             </w:r>
           </w:p>
         </w:tc>
@@ -5971,15 +5987,7 @@
                 <w:sz w:val="28"/>
                 <w:szCs w:val="28"/>
               </w:rPr>
-              <w:t xml:space="preserve"> </w:t>
-            </w:r>
-            <w:r>
-              <w:rPr>
-                <w:rFonts w:ascii="Calibri" w:eastAsia="Calibri" w:hAnsi="Calibri" w:cs="Calibri"/>
-                <w:sz w:val="28"/>
-                <w:szCs w:val="28"/>
-              </w:rPr>
-              <w:t>SHQ</w:t>
+              <w:t>DVDR</w:t>
             </w:r>
           </w:p>
         </w:tc>
@@ -6203,18 +6211,17 @@
               <w:jc w:val="center"/>
               <w:rPr>
                 <w:rFonts w:ascii="Calibri" w:eastAsia="Calibri" w:hAnsi="Calibri" w:cs="Calibri"/>
-                <w:b/>
-                <w:sz w:val="28"/>
-                <w:szCs w:val="28"/>
-              </w:rPr>
-            </w:pPr>
-            <w:r>
-              <w:rPr>
-                <w:rFonts w:ascii="Calibri" w:eastAsia="Calibri" w:hAnsi="Calibri" w:cs="Calibri"/>
-                <w:sz w:val="28"/>
-                <w:szCs w:val="28"/>
-              </w:rPr>
-              <w:t>MNW</w:t>
+                <w:sz w:val="28"/>
+                <w:szCs w:val="28"/>
+              </w:rPr>
+            </w:pPr>
+            <w:r>
+              <w:rPr>
+                <w:rFonts w:ascii="Calibri" w:eastAsia="Calibri" w:hAnsi="Calibri" w:cs="Calibri"/>
+                <w:sz w:val="28"/>
+                <w:szCs w:val="28"/>
+              </w:rPr>
+              <w:t>ABN4</w:t>
             </w:r>
           </w:p>
         </w:tc>
@@ -6440,7 +6447,7 @@
                 <w:sz w:val="28"/>
                 <w:szCs w:val="28"/>
               </w:rPr>
-              <w:t>NQO</w:t>
+              <w:t>JSUP</w:t>
             </w:r>
           </w:p>
         </w:tc>
@@ -7291,7 +7298,7 @@
                 <w:sz w:val="28"/>
                 <w:szCs w:val="28"/>
               </w:rPr>
-              <w:t>UDAY</w:t>
+              <w:t>SRAT</w:t>
             </w:r>
           </w:p>
         </w:tc>
@@ -7521,7 +7528,7 @@
                 <w:sz w:val="28"/>
                 <w:szCs w:val="28"/>
               </w:rPr>
-              <w:t>RATNA</w:t>
+              <w:t>CHRU</w:t>
             </w:r>
           </w:p>
         </w:tc>
@@ -7752,7 +7759,7 @@
                 <w:sz w:val="28"/>
                 <w:szCs w:val="28"/>
               </w:rPr>
-              <w:t>L/O</w:t>
+              <w:t>TCPP CC+PROD</w:t>
             </w:r>
           </w:p>
         </w:tc>
@@ -8236,10 +8243,10 @@
         <w:szCs w:val="28"/>
       </w:rPr>
       <w:object w:dxaOrig="1188" w:dyaOrig="900">
-        <v:rect id="_x0000_i1025" style="width:54.65pt;height:37.3pt" o:ole="" o:preferrelative="t" stroked="f">
+        <v:rect id="_x0000_i1025" style="width:54.4pt;height:37.65pt" o:ole="" o:preferrelative="t" stroked="f">
           <v:imagedata r:id="rId1" o:title=""/>
         </v:rect>
-        <o:OLEObject Type="Embed" ProgID="StaticMetafile" ShapeID="_x0000_i1025" DrawAspect="Content" ObjectID="_1854794367" r:id="rId2"/>
+        <o:OLEObject Type="Embed" ProgID="StaticMetafile" ShapeID="_x0000_i1025" DrawAspect="Content" ObjectID="_1854884647" r:id="rId2"/>
       </w:object>
     </w:r>
     <w:r>
@@ -8277,7 +8284,7 @@
         <w:sz w:val="28"/>
         <w:szCs w:val="28"/>
       </w:rPr>
-      <w:t>30</w:t>
+      <w:t>31</w:t>
     </w:r>
     <w:r>
       <w:rPr>
@@ -8307,7 +8314,7 @@
         <w:sz w:val="28"/>
         <w:szCs w:val="28"/>
       </w:rPr>
-      <w:t>FRI</w:t>
+      <w:t>SATUR</w:t>
     </w:r>
     <w:r>
       <w:rPr>

</xml_diff>

<commit_message>
Sync - 2026-10-31 07:57
</commit_message>
<xml_diff>
--- a/files/Daily_Helicopter_Schedule.docx
+++ b/files/Daily_Helicopter_Schedule.docx
@@ -1336,8 +1336,6 @@
               </w:rPr>
               <w:t>08:15</w:t>
             </w:r>
-            <w:bookmarkStart w:id="0" w:name="_GoBack"/>
-            <w:bookmarkEnd w:id="0"/>
           </w:p>
         </w:tc>
         <w:tc>
@@ -1734,8 +1732,10 @@
                 <w:sz w:val="28"/>
                 <w:szCs w:val="28"/>
               </w:rPr>
-              <w:t>GVHL 412</w:t>
-            </w:r>
+              <w:t>NA</w:t>
+            </w:r>
+            <w:bookmarkStart w:id="0" w:name="_GoBack"/>
+            <w:bookmarkEnd w:id="0"/>
           </w:p>
         </w:tc>
         <w:tc>
@@ -1769,7 +1769,7 @@
                 <w:sz w:val="28"/>
                 <w:szCs w:val="28"/>
               </w:rPr>
-              <w:t>RRJ</w:t>
+              <w:t>NA</w:t>
             </w:r>
           </w:p>
         </w:tc>
@@ -1804,7 +1804,7 @@
                 <w:sz w:val="28"/>
                 <w:szCs w:val="28"/>
               </w:rPr>
-              <w:t>07</w:t>
+              <w:t>00</w:t>
             </w:r>
           </w:p>
         </w:tc>
@@ -8243,10 +8243,10 @@
         <w:szCs w:val="28"/>
       </w:rPr>
       <w:object w:dxaOrig="1188" w:dyaOrig="900">
-        <v:rect id="_x0000_i1025" style="width:54.4pt;height:37.65pt" o:ole="" o:preferrelative="t" stroked="f">
+        <v:rect id="_x0000_i1025" style="width:54.75pt;height:37.5pt" o:ole="" o:preferrelative="t" stroked="f">
           <v:imagedata r:id="rId1" o:title=""/>
         </v:rect>
-        <o:OLEObject Type="Embed" ProgID="StaticMetafile" ShapeID="_x0000_i1025" DrawAspect="Content" ObjectID="_1854884647" r:id="rId2"/>
+        <o:OLEObject Type="Embed" ProgID="StaticMetafile" ShapeID="_x0000_i1025" DrawAspect="Content" ObjectID="_1854937081" r:id="rId2"/>
       </w:object>
     </w:r>
     <w:r>

</xml_diff>

<commit_message>
Sync - 2026-10-31 17:28
</commit_message>
<xml_diff>
--- a/files/Daily_Helicopter_Schedule.docx
+++ b/files/Daily_Helicopter_Schedule.docx
@@ -654,7 +654,7 @@
                 <w:sz w:val="28"/>
                 <w:szCs w:val="28"/>
               </w:rPr>
-              <w:t>GVHL 169</w:t>
+              <w:t>GVHL 412</w:t>
             </w:r>
           </w:p>
         </w:tc>
@@ -689,7 +689,7 @@
                 <w:sz w:val="28"/>
                 <w:szCs w:val="28"/>
               </w:rPr>
-              <w:t>RRN</w:t>
+              <w:t>RRJ</w:t>
             </w:r>
           </w:p>
         </w:tc>
@@ -1662,7 +1662,23 @@
                 <w:sz w:val="28"/>
                 <w:szCs w:val="28"/>
               </w:rPr>
-              <w:t>11:00</w:t>
+              <w:t>1</w:t>
+            </w:r>
+            <w:r>
+              <w:rPr>
+                <w:rFonts w:ascii="Calibri" w:eastAsia="Calibri" w:hAnsi="Calibri" w:cs="Calibri"/>
+                <w:sz w:val="28"/>
+                <w:szCs w:val="28"/>
+              </w:rPr>
+              <w:t>0</w:t>
+            </w:r>
+            <w:r>
+              <w:rPr>
+                <w:rFonts w:ascii="Calibri" w:eastAsia="Calibri" w:hAnsi="Calibri" w:cs="Calibri"/>
+                <w:sz w:val="28"/>
+                <w:szCs w:val="28"/>
+              </w:rPr>
+              <w:t>:00</w:t>
             </w:r>
           </w:p>
         </w:tc>
@@ -1732,10 +1748,8 @@
                 <w:sz w:val="28"/>
                 <w:szCs w:val="28"/>
               </w:rPr>
-              <w:t>NA</w:t>
-            </w:r>
-            <w:bookmarkStart w:id="0" w:name="_GoBack"/>
-            <w:bookmarkEnd w:id="0"/>
+              <w:t>GVHL 169</w:t>
+            </w:r>
           </w:p>
         </w:tc>
         <w:tc>
@@ -1769,7 +1783,7 @@
                 <w:sz w:val="28"/>
                 <w:szCs w:val="28"/>
               </w:rPr>
-              <w:t>NA</w:t>
+              <w:t>RRN</w:t>
             </w:r>
           </w:p>
         </w:tc>
@@ -1804,7 +1818,15 @@
                 <w:sz w:val="28"/>
                 <w:szCs w:val="28"/>
               </w:rPr>
-              <w:t>00</w:t>
+              <w:t>0</w:t>
+            </w:r>
+            <w:r>
+              <w:rPr>
+                <w:rFonts w:ascii="Calibri" w:eastAsia="Calibri" w:hAnsi="Calibri" w:cs="Calibri"/>
+                <w:sz w:val="28"/>
+                <w:szCs w:val="28"/>
+              </w:rPr>
+              <w:t>5</w:t>
             </w:r>
           </w:p>
         </w:tc>
@@ -3323,10 +3345,11 @@
             <w:r>
               <w:rPr>
                 <w:rFonts w:ascii="Calibri" w:eastAsia="Calibri" w:hAnsi="Calibri" w:cs="Calibri"/>
-                <w:sz w:val="28"/>
-                <w:szCs w:val="28"/>
-              </w:rPr>
-              <w:t>TBD</w:t>
+                <w:b/>
+                <w:sz w:val="28"/>
+                <w:szCs w:val="28"/>
+              </w:rPr>
+              <w:t>NA</w:t>
             </w:r>
           </w:p>
         </w:tc>
@@ -3382,14 +3405,6 @@
                 <w:szCs w:val="28"/>
               </w:rPr>
             </w:pPr>
-            <w:r>
-              <w:rPr>
-                <w:rFonts w:ascii="Calibri" w:eastAsia="Calibri" w:hAnsi="Calibri" w:cs="Calibri"/>
-                <w:sz w:val="28"/>
-                <w:szCs w:val="28"/>
-              </w:rPr>
-              <w:t>RRJ</w:t>
-            </w:r>
           </w:p>
         </w:tc>
         <w:tc>
@@ -3449,6 +3464,14 @@
                 <w:szCs w:val="28"/>
               </w:rPr>
             </w:pPr>
+            <w:r>
+              <w:rPr>
+                <w:rFonts w:ascii="Calibri" w:eastAsia="Calibri" w:hAnsi="Calibri" w:cs="Calibri"/>
+                <w:sz w:val="28"/>
+                <w:szCs w:val="28"/>
+              </w:rPr>
+              <w:t>3</w:t>
+            </w:r>
           </w:p>
         </w:tc>
         <w:tc>
@@ -3682,14 +3705,6 @@
                 <w:szCs w:val="28"/>
               </w:rPr>
             </w:pPr>
-            <w:r>
-              <w:rPr>
-                <w:rFonts w:ascii="Calibri" w:eastAsia="Calibri" w:hAnsi="Calibri" w:cs="Calibri"/>
-                <w:sz w:val="28"/>
-                <w:szCs w:val="28"/>
-              </w:rPr>
-              <w:t>3</w:t>
-            </w:r>
           </w:p>
         </w:tc>
         <w:tc>
@@ -4787,7 +4802,7 @@
                 <w:sz w:val="28"/>
                 <w:szCs w:val="28"/>
               </w:rPr>
-              <w:t>SGAV</w:t>
+              <w:t>TBD</w:t>
             </w:r>
           </w:p>
         </w:tc>
@@ -5306,7 +5321,7 @@
                 <w:sz w:val="28"/>
                 <w:szCs w:val="28"/>
               </w:rPr>
-              <w:t>VND2</w:t>
+              <w:t>SRAT</w:t>
             </w:r>
           </w:p>
         </w:tc>
@@ -5533,7 +5548,7 @@
                 <w:sz w:val="28"/>
                 <w:szCs w:val="28"/>
               </w:rPr>
-              <w:t>AS2</w:t>
+              <w:t>VND2</w:t>
             </w:r>
           </w:p>
         </w:tc>
@@ -5760,7 +5775,7 @@
                 <w:sz w:val="28"/>
                 <w:szCs w:val="28"/>
               </w:rPr>
-              <w:t>SSAK</w:t>
+              <w:t>JSUP</w:t>
             </w:r>
           </w:p>
         </w:tc>
@@ -5987,7 +6002,7 @@
                 <w:sz w:val="28"/>
                 <w:szCs w:val="28"/>
               </w:rPr>
-              <w:t>DVDR</w:t>
+              <w:t>ABN4</w:t>
             </w:r>
           </w:p>
         </w:tc>
@@ -6221,7 +6236,7 @@
                 <w:sz w:val="28"/>
                 <w:szCs w:val="28"/>
               </w:rPr>
-              <w:t>ABN4</w:t>
+              <w:t>TBD</w:t>
             </w:r>
           </w:p>
         </w:tc>
@@ -6447,7 +6462,7 @@
                 <w:sz w:val="28"/>
                 <w:szCs w:val="28"/>
               </w:rPr>
-              <w:t>JSUP</w:t>
+              <w:t>TBD</w:t>
             </w:r>
           </w:p>
         </w:tc>
@@ -7292,14 +7307,6 @@
                 <w:szCs w:val="28"/>
               </w:rPr>
             </w:pPr>
-            <w:r>
-              <w:rPr>
-                <w:rFonts w:ascii="Calibri" w:eastAsia="Calibri" w:hAnsi="Calibri" w:cs="Calibri"/>
-                <w:sz w:val="28"/>
-                <w:szCs w:val="28"/>
-              </w:rPr>
-              <w:t>SRAT</w:t>
-            </w:r>
           </w:p>
         </w:tc>
         <w:tc>
@@ -7522,14 +7529,6 @@
                 <w:szCs w:val="28"/>
               </w:rPr>
             </w:pPr>
-            <w:r>
-              <w:rPr>
-                <w:rFonts w:ascii="Calibri" w:eastAsia="Calibri" w:hAnsi="Calibri" w:cs="Calibri"/>
-                <w:sz w:val="28"/>
-                <w:szCs w:val="28"/>
-              </w:rPr>
-              <w:t>CHRU</w:t>
-            </w:r>
           </w:p>
         </w:tc>
         <w:tc>
@@ -7753,14 +7752,6 @@
                 <w:szCs w:val="28"/>
               </w:rPr>
             </w:pPr>
-            <w:r>
-              <w:rPr>
-                <w:rFonts w:ascii="Calibri" w:eastAsia="Calibri" w:hAnsi="Calibri" w:cs="Calibri"/>
-                <w:sz w:val="28"/>
-                <w:szCs w:val="28"/>
-              </w:rPr>
-              <w:t>TCPP CC+PROD</w:t>
-            </w:r>
           </w:p>
         </w:tc>
         <w:tc>
@@ -8162,7 +8153,12 @@
       </w:pPr>
     </w:p>
     <w:sectPr>
-      <w:headerReference w:type="default" r:id="rId6"/>
+      <w:headerReference w:type="even" r:id="rId6"/>
+      <w:headerReference w:type="default" r:id="rId7"/>
+      <w:footerReference w:type="even" r:id="rId8"/>
+      <w:footerReference w:type="default" r:id="rId9"/>
+      <w:headerReference w:type="first" r:id="rId10"/>
+      <w:footerReference w:type="first" r:id="rId11"/>
       <w:pgSz w:w="11906" w:h="16838"/>
       <w:pgMar w:top="1" w:right="1440" w:bottom="1134" w:left="1134" w:header="708" w:footer="708" w:gutter="0"/>
       <w:cols w:space="708"/>
@@ -8197,6 +8193,36 @@
 </w:endnotes>
 </file>
 
+<file path=word/footer1.xml><?xml version="1.0" encoding="utf-8"?>
+<w:ftr xmlns:wpc="http://schemas.microsoft.com/office/word/2010/wordprocessingCanvas" xmlns:mc="http://schemas.openxmlformats.org/markup-compatibility/2006" xmlns:o="urn:schemas-microsoft-com:office:office" xmlns:r="http://schemas.openxmlformats.org/officeDocument/2006/relationships" xmlns:m="http://schemas.openxmlformats.org/officeDocument/2006/math" xmlns:v="urn:schemas-microsoft-com:vml" xmlns:wp14="http://schemas.microsoft.com/office/word/2010/wordprocessingDrawing" xmlns:wp="http://schemas.openxmlformats.org/drawingml/2006/wordprocessingDrawing" xmlns:w10="urn:schemas-microsoft-com:office:word" xmlns:w="http://schemas.openxmlformats.org/wordprocessingml/2006/main" xmlns:w14="http://schemas.microsoft.com/office/word/2010/wordml" xmlns:w15="http://schemas.microsoft.com/office/word/2012/wordml" xmlns:wpg="http://schemas.microsoft.com/office/word/2010/wordprocessingGroup" xmlns:wpi="http://schemas.microsoft.com/office/word/2010/wordprocessingInk" xmlns:wne="http://schemas.microsoft.com/office/word/2006/wordml" xmlns:wps="http://schemas.microsoft.com/office/word/2010/wordprocessingShape" mc:Ignorable="w14 w15 wp14">
+  <w:p>
+    <w:pPr>
+      <w:pStyle w:val="Footer"/>
+    </w:pPr>
+  </w:p>
+</w:ftr>
+</file>
+
+<file path=word/footer2.xml><?xml version="1.0" encoding="utf-8"?>
+<w:ftr xmlns:wpc="http://schemas.microsoft.com/office/word/2010/wordprocessingCanvas" xmlns:mc="http://schemas.openxmlformats.org/markup-compatibility/2006" xmlns:o="urn:schemas-microsoft-com:office:office" xmlns:r="http://schemas.openxmlformats.org/officeDocument/2006/relationships" xmlns:m="http://schemas.openxmlformats.org/officeDocument/2006/math" xmlns:v="urn:schemas-microsoft-com:vml" xmlns:wp14="http://schemas.microsoft.com/office/word/2010/wordprocessingDrawing" xmlns:wp="http://schemas.openxmlformats.org/drawingml/2006/wordprocessingDrawing" xmlns:w10="urn:schemas-microsoft-com:office:word" xmlns:w="http://schemas.openxmlformats.org/wordprocessingml/2006/main" xmlns:w14="http://schemas.microsoft.com/office/word/2010/wordml" xmlns:w15="http://schemas.microsoft.com/office/word/2012/wordml" xmlns:wpg="http://schemas.microsoft.com/office/word/2010/wordprocessingGroup" xmlns:wpi="http://schemas.microsoft.com/office/word/2010/wordprocessingInk" xmlns:wne="http://schemas.microsoft.com/office/word/2006/wordml" xmlns:wps="http://schemas.microsoft.com/office/word/2010/wordprocessingShape" mc:Ignorable="w14 w15 wp14">
+  <w:p>
+    <w:pPr>
+      <w:pStyle w:val="Footer"/>
+    </w:pPr>
+  </w:p>
+</w:ftr>
+</file>
+
+<file path=word/footer3.xml><?xml version="1.0" encoding="utf-8"?>
+<w:ftr xmlns:wpc="http://schemas.microsoft.com/office/word/2010/wordprocessingCanvas" xmlns:mc="http://schemas.openxmlformats.org/markup-compatibility/2006" xmlns:o="urn:schemas-microsoft-com:office:office" xmlns:r="http://schemas.openxmlformats.org/officeDocument/2006/relationships" xmlns:m="http://schemas.openxmlformats.org/officeDocument/2006/math" xmlns:v="urn:schemas-microsoft-com:vml" xmlns:wp14="http://schemas.microsoft.com/office/word/2010/wordprocessingDrawing" xmlns:wp="http://schemas.openxmlformats.org/drawingml/2006/wordprocessingDrawing" xmlns:w10="urn:schemas-microsoft-com:office:word" xmlns:w="http://schemas.openxmlformats.org/wordprocessingml/2006/main" xmlns:w14="http://schemas.microsoft.com/office/word/2010/wordml" xmlns:w15="http://schemas.microsoft.com/office/word/2012/wordml" xmlns:wpg="http://schemas.microsoft.com/office/word/2010/wordprocessingGroup" xmlns:wpi="http://schemas.microsoft.com/office/word/2010/wordprocessingInk" xmlns:wne="http://schemas.microsoft.com/office/word/2006/wordml" xmlns:wps="http://schemas.microsoft.com/office/word/2010/wordprocessingShape" mc:Ignorable="w14 w15 wp14">
+  <w:p>
+    <w:pPr>
+      <w:pStyle w:val="Footer"/>
+    </w:pPr>
+  </w:p>
+</w:ftr>
+</file>
+
 <file path=word/footnotes.xml><?xml version="1.0" encoding="utf-8"?>
 <w:footnotes xmlns:wpc="http://schemas.microsoft.com/office/word/2010/wordprocessingCanvas" xmlns:mc="http://schemas.openxmlformats.org/markup-compatibility/2006" xmlns:o="urn:schemas-microsoft-com:office:office" xmlns:r="http://schemas.openxmlformats.org/officeDocument/2006/relationships" xmlns:m="http://schemas.openxmlformats.org/officeDocument/2006/math" xmlns:v="urn:schemas-microsoft-com:vml" xmlns:wp14="http://schemas.microsoft.com/office/word/2010/wordprocessingDrawing" xmlns:wp="http://schemas.openxmlformats.org/drawingml/2006/wordprocessingDrawing" xmlns:w10="urn:schemas-microsoft-com:office:word" xmlns:w="http://schemas.openxmlformats.org/wordprocessingml/2006/main" xmlns:w14="http://schemas.microsoft.com/office/word/2010/wordml" xmlns:w15="http://schemas.microsoft.com/office/word/2012/wordml" xmlns:wpg="http://schemas.microsoft.com/office/word/2010/wordprocessingGroup" xmlns:wpi="http://schemas.microsoft.com/office/word/2010/wordprocessingInk" xmlns:wne="http://schemas.microsoft.com/office/word/2006/wordml" xmlns:wps="http://schemas.microsoft.com/office/word/2010/wordprocessingShape" mc:Ignorable="w14 w15 wp14">
   <w:footnote w:type="separator" w:id="-1">
@@ -8227,6 +8253,16 @@
   <w:p>
     <w:pPr>
       <w:pStyle w:val="Header"/>
+    </w:pPr>
+  </w:p>
+</w:hdr>
+</file>
+
+<file path=word/header2.xml><?xml version="1.0" encoding="utf-8"?>
+<w:hdr xmlns:wpc="http://schemas.microsoft.com/office/word/2010/wordprocessingCanvas" xmlns:mc="http://schemas.openxmlformats.org/markup-compatibility/2006" xmlns:o="urn:schemas-microsoft-com:office:office" xmlns:r="http://schemas.openxmlformats.org/officeDocument/2006/relationships" xmlns:m="http://schemas.openxmlformats.org/officeDocument/2006/math" xmlns:v="urn:schemas-microsoft-com:vml" xmlns:wp14="http://schemas.microsoft.com/office/word/2010/wordprocessingDrawing" xmlns:wp="http://schemas.openxmlformats.org/drawingml/2006/wordprocessingDrawing" xmlns:w10="urn:schemas-microsoft-com:office:word" xmlns:w="http://schemas.openxmlformats.org/wordprocessingml/2006/main" xmlns:w14="http://schemas.microsoft.com/office/word/2010/wordml" xmlns:w15="http://schemas.microsoft.com/office/word/2012/wordml" xmlns:wpg="http://schemas.microsoft.com/office/word/2010/wordprocessingGroup" xmlns:wpi="http://schemas.microsoft.com/office/word/2010/wordprocessingInk" xmlns:wne="http://schemas.microsoft.com/office/word/2006/wordml" xmlns:wps="http://schemas.microsoft.com/office/word/2010/wordprocessingShape" mc:Ignorable="w14 w15 wp14">
+  <w:p>
+    <w:pPr>
+      <w:pStyle w:val="Header"/>
       <w:ind w:left="-851"/>
       <w:jc w:val="center"/>
       <w:rPr>
@@ -8246,7 +8282,7 @@
         <v:rect id="_x0000_i1025" style="width:54.75pt;height:37.5pt" o:ole="" o:preferrelative="t" stroked="f">
           <v:imagedata r:id="rId1" o:title=""/>
         </v:rect>
-        <o:OLEObject Type="Embed" ProgID="StaticMetafile" ShapeID="_x0000_i1025" DrawAspect="Content" ObjectID="_1854937081" r:id="rId2"/>
+        <o:OLEObject Type="Embed" ProgID="StaticMetafile" ShapeID="_x0000_i1025" DrawAspect="Content" ObjectID="_1854969844" r:id="rId2"/>
       </w:object>
     </w:r>
     <w:r>
@@ -8284,7 +8320,7 @@
         <w:sz w:val="28"/>
         <w:szCs w:val="28"/>
       </w:rPr>
-      <w:t>31</w:t>
+      <w:t>0</w:t>
     </w:r>
     <w:r>
       <w:rPr>
@@ -8294,7 +8330,7 @@
         <w:sz w:val="28"/>
         <w:szCs w:val="28"/>
       </w:rPr>
-      <w:t>.10</w:t>
+      <w:t>1</w:t>
     </w:r>
     <w:r>
       <w:rPr>
@@ -8304,7 +8340,7 @@
         <w:sz w:val="28"/>
         <w:szCs w:val="28"/>
       </w:rPr>
-      <w:t>.2026 (</w:t>
+      <w:t>.1</w:t>
     </w:r>
     <w:r>
       <w:rPr>
@@ -8314,8 +8350,50 @@
         <w:sz w:val="28"/>
         <w:szCs w:val="28"/>
       </w:rPr>
-      <w:t>SATUR</w:t>
+      <w:t>1</w:t>
     </w:r>
+    <w:r>
+      <w:rPr>
+        <w:rFonts w:cs="Times New Roman"/>
+        <w:b/>
+        <w:color w:val="000000" w:themeColor="text1"/>
+        <w:sz w:val="28"/>
+        <w:szCs w:val="28"/>
+      </w:rPr>
+      <w:t xml:space="preserve">.2026 </w:t>
+    </w:r>
+    <w:r>
+      <w:rPr>
+        <w:rFonts w:cs="Times New Roman"/>
+        <w:b/>
+        <w:color w:val="000000" w:themeColor="text1"/>
+        <w:sz w:val="28"/>
+        <w:szCs w:val="28"/>
+      </w:rPr>
+      <w:t>(</w:t>
+    </w:r>
+    <w:r>
+      <w:rPr>
+        <w:rFonts w:cs="Times New Roman"/>
+        <w:b/>
+        <w:color w:val="000000" w:themeColor="text1"/>
+        <w:sz w:val="28"/>
+        <w:szCs w:val="28"/>
+      </w:rPr>
+      <w:t>S</w:t>
+    </w:r>
+    <w:r>
+      <w:rPr>
+        <w:rFonts w:cs="Times New Roman"/>
+        <w:b/>
+        <w:color w:val="000000" w:themeColor="text1"/>
+        <w:sz w:val="28"/>
+        <w:szCs w:val="28"/>
+      </w:rPr>
+      <w:t>UN</w:t>
+    </w:r>
+    <w:bookmarkStart w:id="0" w:name="_GoBack"/>
+    <w:bookmarkEnd w:id="0"/>
     <w:r>
       <w:rPr>
         <w:rFonts w:cs="Times New Roman"/>
@@ -8337,6 +8415,16 @@
       <w:t>)</w:t>
     </w:r>
   </w:p>
+  <w:p>
+    <w:pPr>
+      <w:pStyle w:val="Header"/>
+    </w:pPr>
+  </w:p>
+</w:hdr>
+</file>
+
+<file path=word/header3.xml><?xml version="1.0" encoding="utf-8"?>
+<w:hdr xmlns:wpc="http://schemas.microsoft.com/office/word/2010/wordprocessingCanvas" xmlns:mc="http://schemas.openxmlformats.org/markup-compatibility/2006" xmlns:o="urn:schemas-microsoft-com:office:office" xmlns:r="http://schemas.openxmlformats.org/officeDocument/2006/relationships" xmlns:m="http://schemas.openxmlformats.org/officeDocument/2006/math" xmlns:v="urn:schemas-microsoft-com:vml" xmlns:wp14="http://schemas.microsoft.com/office/word/2010/wordprocessingDrawing" xmlns:wp="http://schemas.openxmlformats.org/drawingml/2006/wordprocessingDrawing" xmlns:w10="urn:schemas-microsoft-com:office:word" xmlns:w="http://schemas.openxmlformats.org/wordprocessingml/2006/main" xmlns:w14="http://schemas.microsoft.com/office/word/2010/wordml" xmlns:w15="http://schemas.microsoft.com/office/word/2012/wordml" xmlns:wpg="http://schemas.microsoft.com/office/word/2010/wordprocessingGroup" xmlns:wpi="http://schemas.microsoft.com/office/word/2010/wordprocessingInk" xmlns:wne="http://schemas.microsoft.com/office/word/2006/wordml" xmlns:wps="http://schemas.microsoft.com/office/word/2010/wordprocessingShape" mc:Ignorable="w14 w15 wp14">
   <w:p>
     <w:pPr>
       <w:pStyle w:val="Header"/>

</xml_diff>